<commit_message>
Complete WP7 hardening and experimental Windows delivery
Verify portable caches and explicit source relocation; enforce generation and canonical export integrity; validate real FMX WebView2 preview and offline search. Add independent bundle validator, regression and pinned-reference evidence, source-based guides, and checksummed binary/source distributions. Record outstanding human acceptance gates and measured performance without claiming release acceptance.
</commit_message>
<xml_diff>
--- a/docs/guides/DPH_Engineering_Guide.docx
+++ b/docs/guides/DPH_Engineering_Guide.docx
@@ -628,7 +628,12 @@
     </w:p>
     <w:p>
       <w:r>
-        <w:t>Before each authorized phase, create the full D: pre-change backup and verify SHA256. Review intended Git changes, commit validated work and push both public and private remotes without force or history rewriting. Remove a stale zero-byte index lock only after verifying no Git process runs. WP7 must publish measured performance, portability, security and acceptance evidence. Independent first-time programmer acceptance and unknown historical business intent cannot be invented by automation.</w:t>
+        <w:t>Before each authorized phase, create the full D: pre-change backup and verify SHA256. Review intended Git changes, commit validated work and push both public and private remotes without force or history rewriting. Remove a stale zero-byte index lock only after verifying no Git process runs. WP7 records measured performance, portability, security and explicit acceptance evidence. Independent first-time programmer acceptance and unknown historical business intent cannot be invented by automation.</w:t>
+      </w:r>
+    </w:p>
+    <w:p>
+      <w:r>
+        <w:t>On the recorded Core i7-1165G7 host with eight logical processors and about 16 GB RAM, the pinned reference pipeline measured 82.6 seconds for full capture, 2.87 seconds for cached opening and 75.9 seconds for incremental reassessment. The message-pump maximum gap was 64 ms. Peak test-process working set was about 1.21 GiB, including repeated captures, JSON cloning and FMX/WebView2 tests. These are baseline measurements, not agreed hardware-independent budgets. Large syntax-cache fallback and conservative semantic recomputation explain the modest reassessment speedup. Formal acceptance retains independent complex-flow review, missing business/user content, AC-25 and performance-budget agreement as outstanding.</w:t>
       </w:r>
     </w:p>
     <w:p>
@@ -862,7 +867,7 @@
           <w:rFonts w:ascii="Consolas" w:hAnsi="Consolas"/>
           <w:sz w:val="16"/>
         </w:rPr>
-        <w:t>6bab01810016e0b5eef4d22b3152ec44f3af1a17f3b05685b6b710ef66a433a3</w:t>
+        <w:t>ba8df0c1f86f6ecddfa605438764e8dbe5a1dcc858e5a625c677c59a63f77bef</w:t>
       </w:r>
     </w:p>
     <w:p>
@@ -879,7 +884,7 @@
           <w:rFonts w:ascii="Consolas" w:hAnsi="Consolas"/>
           <w:sz w:val="16"/>
         </w:rPr>
-        <w:t>753b14650af70cf085e656172e20d3b33a1d3fbe520d10a22b528d521e25a1a0</w:t>
+        <w:t>4a725ef7f3f055e8092bb666d0b5bea6efa40e18f9d052595eb99583d963e122</w:t>
       </w:r>
     </w:p>
     <w:p>
@@ -896,7 +901,7 @@
           <w:rFonts w:ascii="Consolas" w:hAnsi="Consolas"/>
           <w:sz w:val="16"/>
         </w:rPr>
-        <w:t>213e1203e2d906b4aaed226b0739b45a1231384e78e4bbf1e5a5a4676910dd89</w:t>
+        <w:t>c3aa365fdc3fc34e5178a8676aeb2d113a4121f57966d7c734ab3375692d7d5e</w:t>
       </w:r>
     </w:p>
     <w:p>
@@ -930,7 +935,7 @@
           <w:rFonts w:ascii="Consolas" w:hAnsi="Consolas"/>
           <w:sz w:val="16"/>
         </w:rPr>
-        <w:t>43af9edc4f4ad9e0750696698fb306be5d784297644fe223ae7a9add8f84af11</w:t>
+        <w:t>f7eef8833ab8547d7308307f2b98120fa165865bb3143cf0d4fcad2c711acc4d</w:t>
       </w:r>
     </w:p>
     <w:p>
@@ -964,7 +969,7 @@
           <w:rFonts w:ascii="Consolas" w:hAnsi="Consolas"/>
           <w:sz w:val="16"/>
         </w:rPr>
-        <w:t>e2284ddbeee35f31df6f53eaff372bd334ebea64098d5547a6085daab0da80c4</w:t>
+        <w:t>36943dcb465a3e3a1a87ecb34053ceb5be8710c59cdd9bac1ba5af267cadb806</w:t>
       </w:r>
     </w:p>
     <w:p>
@@ -1015,7 +1020,7 @@
           <w:rFonts w:ascii="Consolas" w:hAnsi="Consolas"/>
           <w:sz w:val="16"/>
         </w:rPr>
-        <w:t>c5be6e7821b2b857f2d632ab711d72afba96ff777d19f4b072b406c0ccaa3187</w:t>
+        <w:t>8e9e7fcca3f0d7dc6d13c4cbd3538b8c89e5754f8561b176ca244258419bd6c6</w:t>
       </w:r>
     </w:p>
     <w:p>
@@ -1032,7 +1037,7 @@
           <w:rFonts w:ascii="Consolas" w:hAnsi="Consolas"/>
           <w:sz w:val="16"/>
         </w:rPr>
-        <w:t>56f86ff4ce7be48251b1ffe8297226e1beee217dbba64cfd0d7dbe1b1d6c4de6</w:t>
+        <w:t>26672ce9b236a79b3ed89a9b8ac534718f06f711d556c34929e271b9bf894f67</w:t>
       </w:r>
     </w:p>
     <w:p>

</xml_diff>

<commit_message>
Rework DPH learning, evidence explanations and screenshot handoff
</commit_message>
<xml_diff>
--- a/docs/guides/DPH_Engineering_Guide.docx
+++ b/docs/guides/DPH_Engineering_Guide.docx
@@ -25,7 +25,7 @@
     </w:p>
     <w:p>
       <w:r>
-        <w:t>Last changed 10 October 2026</w:t>
+        <w:t>Last changed 11 October 2026</w:t>
       </w:r>
     </w:p>
     <w:p>
@@ -83,6 +83,20 @@
         </w:tabs>
       </w:pPr>
       <w:r>
+        <w:t>Rework and acceptance status</w:t>
+      </w:r>
+      <w:r>
+        <w:tab/>
+        <w:t>3</w:t>
+      </w:r>
+    </w:p>
+    <w:p>
+      <w:pPr>
+        <w:tabs>
+          <w:tab w:val="right" w:leader="dot" w:pos="9360"/>
+        </w:tabs>
+      </w:pPr>
+      <w:r>
         <w:t>Build and deployment</w:t>
       </w:r>
       <w:r>
@@ -101,7 +115,7 @@
       </w:r>
       <w:r>
         <w:tab/>
-        <w:t>3</w:t>
+        <w:t>4</w:t>
       </w:r>
     </w:p>
     <w:p>
@@ -143,7 +157,7 @@
       </w:r>
       <w:r>
         <w:tab/>
-        <w:t>4</w:t>
+        <w:t>5</w:t>
       </w:r>
     </w:p>
     <w:p>
@@ -157,7 +171,7 @@
       </w:r>
       <w:r>
         <w:tab/>
-        <w:t>4</w:t>
+        <w:t>5</w:t>
       </w:r>
     </w:p>
     <w:p>
@@ -185,7 +199,7 @@
       </w:r>
       <w:r>
         <w:tab/>
-        <w:t>5</w:t>
+        <w:t>6</w:t>
       </w:r>
     </w:p>
     <w:p>
@@ -227,7 +241,7 @@
       </w:r>
       <w:r>
         <w:tab/>
-        <w:t>6</w:t>
+        <w:t>7</w:t>
       </w:r>
     </w:p>
     <w:p>
@@ -269,7 +283,7 @@
       </w:r>
       <w:r>
         <w:tab/>
-        <w:t>7</w:t>
+        <w:t>8</w:t>
       </w:r>
     </w:p>
     <w:p>
@@ -324,6 +338,29 @@
         <w:pStyle w:val="Heading1"/>
       </w:pPr>
       <w:r>
+        <w:t>Rework and acceptance status</w:t>
+      </w:r>
+    </w:p>
+    <w:p>
+      <w:r>
+        <w:t>The owner rejected the earlier WP7 delivery as inadequate for learning and handoff. The statement that implementation through WP7 was complete has been withdrawn. docs/Rework_Requirements_Audit.txt compares the original plan with the implemented product and outstanding work. Historical WP reports remain historical evidence, not acceptance of the reworked experience.</w:t>
+      </w:r>
+    </w:p>
+    <w:p>
+      <w:r>
+        <w:t>The rework adds a first-launch Getting started course, deterministic explanation engine, guided learning workspace, source-comment context, event traces, labeled and collapsed procedure-flow views, attributed screenshot imports and richer project-specific publication. Run tools/build-learning.cmd with an optional pinned reference database path for dedicated learning and real-WebView2 tests. The source-based first-time-programmer exercise still needs a human participant.</w:t>
+      </w:r>
+    </w:p>
+    <w:p>
+      <w:r>
+        <w:t>Affected-only semantic recomputation, broader external-definition interpretation and retention/continuity controls remain incomplete. Source safety, privacy, attribution and exact generation links are retained. Do not turn an automated pass count into a claim that every requirement or the human onboarding goal is finished.</w:t>
+      </w:r>
+    </w:p>
+    <w:p>
+      <w:pPr>
+        <w:pStyle w:val="Heading1"/>
+      </w:pPr>
+      <w:r>
         <w:t>Build and deployment</w:t>
       </w:r>
     </w:p>
@@ -339,7 +376,7 @@
     </w:p>
     <w:p>
       <w:r>
-        <w:t>The repository standard folders include bin, dcu, docs/guides, docs/pdf, export, help, images and icons, samples, source distributions and tools. Reference source and generated test databases remain ignored. Use the explicitly approved Python 3.13 executable for project tooling and the installed LibreOffice, never Microsoft Word.</w:t>
+        <w:t>The repository standard folders include bin, dcu, docs/guides, docs/pdf, export, help, images and icons, samples, source distributions and tools. Deploy help/index.html for first-launch education. Reference source and generated test databases remain ignored. Use the explicitly approved Python 3.13 executable for project tooling and the installed LibreOffice, never Microsoft Word.</w:t>
       </w:r>
     </w:p>
     <w:p>
@@ -577,7 +614,7 @@
     </w:p>
     <w:p>
       <w:r>
-        <w:t>DPH.Publish.Export writes a new destination outside source. The offline HTML uses encoded imported text, local search and styles, internal anchors, print CSS and a restrictive content security policy. The WebView2 navigation policy permits only the authorized local index and about:blank, with no arbitrary native bridge. Data does not supply executable markup.</w:t>
+        <w:t>DPH.Publish.Export writes a new destination outside source. The offline HTML uses encoded imported text, local search and styles, internal anchors, print CSS and a restrictive content security policy. The default WebView2 policy permits only the authorized local index and about:blank; publication explicitly enables hash-named object pages in its managed objects folder. Learning and help retain the index-only policy. There is no arbitrary native bridge. Data does not supply executable markup.</w:t>
       </w:r>
     </w:p>
     <w:p>
@@ -647,6 +684,23 @@
     <w:p>
       <w:r>
         <w:t>The following source files and resources define this guide. SHA256 values identify the inspected implementation. Rebuild the guides after validated changes and retain the associated acceptance evidence.</w:t>
+      </w:r>
+    </w:p>
+    <w:p>
+      <w:pPr>
+        <w:keepNext/>
+      </w:pPr>
+      <w:r>
+        <w:t>DPH.Analysis.Explanations.pas</w:t>
+      </w:r>
+    </w:p>
+    <w:p>
+      <w:r>
+        <w:rPr>
+          <w:rFonts w:ascii="Consolas" w:hAnsi="Consolas"/>
+          <w:sz w:val="16"/>
+        </w:rPr>
+        <w:t>c4e1ae7eebad50048fad16025f9aeb49884c94321cafef7b4ba5227a39aa3444</w:t>
       </w:r>
     </w:p>
     <w:p>
@@ -816,7 +870,7 @@
           <w:rFonts w:ascii="Consolas" w:hAnsi="Consolas"/>
           <w:sz w:val="16"/>
         </w:rPr>
-        <w:t>cad87d7a998ace018b3e57e430ce4737e2679adc378091782aefd07685c803a5</w:t>
+        <w:t>fc94776733a225a0c8bea34797ee35e0bc7160dac32fa268a92a83e6f0b8504f</w:t>
       </w:r>
     </w:p>
     <w:p>
@@ -867,7 +921,7 @@
           <w:rFonts w:ascii="Consolas" w:hAnsi="Consolas"/>
           <w:sz w:val="16"/>
         </w:rPr>
-        <w:t>ba8df0c1f86f6ecddfa605438764e8dbe5a1dcc858e5a625c677c59a63f77bef</w:t>
+        <w:t>e4bcf5a33bbed2cf2e9906aed11262bcb14ba9df295719e28dfbb1ad111ee0b6</w:t>
       </w:r>
     </w:p>
     <w:p>
@@ -884,7 +938,7 @@
           <w:rFonts w:ascii="Consolas" w:hAnsi="Consolas"/>
           <w:sz w:val="16"/>
         </w:rPr>
-        <w:t>4a725ef7f3f055e8092bb666d0b5bea6efa40e18f9d052595eb99583d963e122</w:t>
+        <w:t>7fde26fc5fb07cdae8ca6bf7aa398ca442121d6da9edafc0f602c9478504c5ff</w:t>
       </w:r>
     </w:p>
     <w:p>
@@ -901,7 +955,7 @@
           <w:rFonts w:ascii="Consolas" w:hAnsi="Consolas"/>
           <w:sz w:val="16"/>
         </w:rPr>
-        <w:t>c3aa365fdc3fc34e5178a8676aeb2d113a4121f57966d7c734ab3375692d7d5e</w:t>
+        <w:t>38f2800eb6b9337263a39a8b7aca47ae9bfae3bb79a0cd3e5be6f2a12aa4826f</w:t>
       </w:r>
     </w:p>
     <w:p>
@@ -935,7 +989,7 @@
           <w:rFonts w:ascii="Consolas" w:hAnsi="Consolas"/>
           <w:sz w:val="16"/>
         </w:rPr>
-        <w:t>f7eef8833ab8547d7308307f2b98120fa165865bb3143cf0d4fcad2c711acc4d</w:t>
+        <w:t>16648fd015ff3821f189f7985042522c6bc27c451943404df8d3a8ec19d514a9</w:t>
       </w:r>
     </w:p>
     <w:p>
@@ -969,7 +1023,7 @@
           <w:rFonts w:ascii="Consolas" w:hAnsi="Consolas"/>
           <w:sz w:val="16"/>
         </w:rPr>
-        <w:t>36943dcb465a3e3a1a87ecb34053ceb5be8710c59cdd9bac1ba5af267cadb806</w:t>
+        <w:t>2131deebd75572ca43ddfb5c578f1a331aea4367939fae6de7cf6582d95f3b49</w:t>
       </w:r>
     </w:p>
     <w:p>
@@ -986,7 +1040,7 @@
           <w:rFonts w:ascii="Consolas" w:hAnsi="Consolas"/>
           <w:sz w:val="16"/>
         </w:rPr>
-        <w:t>99b456e51f003453beb53892d419af0bd98b747a08062391e0a709ca803d78c7</w:t>
+        <w:t>7528712912d9c4f2f7f8b45f5a12c6427efb4ee789114671c3332d0bc8e5934e</w:t>
       </w:r>
     </w:p>
     <w:p>
@@ -1020,7 +1074,7 @@
           <w:rFonts w:ascii="Consolas" w:hAnsi="Consolas"/>
           <w:sz w:val="16"/>
         </w:rPr>
-        <w:t>8e9e7fcca3f0d7dc6d13c4cbd3538b8c89e5754f8561b176ca244258419bd6c6</w:t>
+        <w:t>7ec9fafef72a17711fb6bfb529fb662a76f49269409f7d1177048c418c7dbf8f</w:t>
       </w:r>
     </w:p>
     <w:p>
@@ -1037,7 +1091,7 @@
           <w:rFonts w:ascii="Consolas" w:hAnsi="Consolas"/>
           <w:sz w:val="16"/>
         </w:rPr>
-        <w:t>26672ce9b236a79b3ed89a9b8ac534718f06f711d556c34929e271b9bf894f67</w:t>
+        <w:t>783b9857ceb068bc06c1b6a2499755159af0c80cff1c1b96b968f25cdefa6889</w:t>
       </w:r>
     </w:p>
     <w:p>

</xml_diff>

<commit_message>
Fix maximized startup, labeled details pane and clipped UI text
</commit_message>
<xml_diff>
--- a/docs/guides/DPH_Engineering_Guide.docx
+++ b/docs/guides/DPH_Engineering_Guide.docx
@@ -665,7 +665,7 @@
     </w:p>
     <w:p>
       <w:r>
-        <w:t>Before each authorized phase, create the full D: pre-change backup and verify SHA256. Review intended Git changes, commit validated work and push both public and private remotes without force or history rewriting. Remove a stale zero-byte index lock only after verifying no Git process runs. WP7 records measured performance, portability, security and explicit acceptance evidence. Independent first-time programmer acceptance and unknown historical business intent cannot be invented by automation.</w:t>
+        <w:t>D: development backups are suspended at the owner's direction until explicitly resumed. Git remains enabled: review intended changes, commit validated work and push both public and private remotes without force or history rewriting. Remove a stale zero-byte index lock only after verifying no Git process runs. WP7 records measured performance, portability, security and explicit acceptance evidence. Independent first-time programmer acceptance and unknown historical business intent cannot be invented by automation.</w:t>
       </w:r>
     </w:p>
     <w:p>
@@ -1023,7 +1023,7 @@
           <w:rFonts w:ascii="Consolas" w:hAnsi="Consolas"/>
           <w:sz w:val="16"/>
         </w:rPr>
-        <w:t>2131deebd75572ca43ddfb5c578f1a331aea4367939fae6de7cf6582d95f3b49</w:t>
+        <w:t>110895d8ebbd59931db370fa191e366d911cb8a9851eb85bb1f2b3e4cb5cbc5e</w:t>
       </w:r>
     </w:p>
     <w:p>
@@ -1091,7 +1091,7 @@
           <w:rFonts w:ascii="Consolas" w:hAnsi="Consolas"/>
           <w:sz w:val="16"/>
         </w:rPr>
-        <w:t>783b9857ceb068bc06c1b6a2499755159af0c80cff1c1b96b968f25cdefa6889</w:t>
+        <w:t>641d2dd12553254273ba9384689ef5f55a28dfe3c5a50f61c3f7be63de24d6a4</w:t>
       </w:r>
     </w:p>
     <w:p>

</xml_diff>

<commit_message>
Reject self-analysis and default knowledge databases to Databases
</commit_message>
<xml_diff>
--- a/docs/guides/DPH_Engineering_Guide.docx
+++ b/docs/guides/DPH_Engineering_Guide.docx
@@ -550,6 +550,11 @@
     </w:p>
     <w:p>
       <w:r>
+        <w:t>OpenSelection queues a candidate without replacing the current database, source or workspace. PollTimer installs it only after the worker returns accepted captured evidence. The worker preflights source identity before creating a database; cached opens check captured XML ProjectGuid and Pascal program declarations before returning a view. Rejections retain the current workspace, and rejected startup caches show Getting started. Inventory identity also covers referenced project groups. DatabaseDialog.InitialDir is the design-time relative default; startup resolves it under the deployment root, creates that folder, and applies the same path to OpenCacheDialog. Distribution packaging copies only the Databases instructions, never its databases or views.</w:t>
+      </w:r>
+    </w:p>
+    <w:p>
+      <w:r>
         <w:t>Graph paint boxes draw bounded evidence data with palette and geometry values supplied by design-time style rectangles. Screen reconstruction draws approximate source-derived rectangles without creating components. Its gallery is bounded to 60 forms. Runtime styles, custom painting and inherited resources are not silently fabricated.</w:t>
       </w:r>
     </w:p>
@@ -887,7 +892,7 @@
           <w:rFonts w:ascii="Consolas" w:hAnsi="Consolas"/>
           <w:sz w:val="16"/>
         </w:rPr>
-        <w:t>b430015f92c1860234c0b6e75f3c0df67bd8f59803d7030be500260bd913f1fa</w:t>
+        <w:t>31d9ff9f79aa8697cefbc66e08cb963d17aa910e9ed05ab7c8901ee5b9ae1ce7</w:t>
       </w:r>
     </w:p>
     <w:p>
@@ -1023,7 +1028,7 @@
           <w:rFonts w:ascii="Consolas" w:hAnsi="Consolas"/>
           <w:sz w:val="16"/>
         </w:rPr>
-        <w:t>110895d8ebbd59931db370fa191e366d911cb8a9851eb85bb1f2b3e4cb5cbc5e</w:t>
+        <w:t>caa1012a20e072685bedf136541aae6c1316127b96b604541f33cc796b3467a3</w:t>
       </w:r>
     </w:p>
     <w:p>
@@ -1040,7 +1045,7 @@
           <w:rFonts w:ascii="Consolas" w:hAnsi="Consolas"/>
           <w:sz w:val="16"/>
         </w:rPr>
-        <w:t>7528712912d9c4f2f7f8b45f5a12c6427efb4ee789114671c3332d0bc8e5934e</w:t>
+        <w:t>4caaea4c68bf59566d0c5378f1834bb4cbf005228566b289056103793f292381</w:t>
       </w:r>
     </w:p>
     <w:p>
@@ -1074,7 +1079,7 @@
           <w:rFonts w:ascii="Consolas" w:hAnsi="Consolas"/>
           <w:sz w:val="16"/>
         </w:rPr>
-        <w:t>7ec9fafef72a17711fb6bfb529fb662a76f49269409f7d1177048c418c7dbf8f</w:t>
+        <w:t>ffd302794055c7d7aa00d33ac7f89a4fcab97a3b640188f6667293d64a827eee</w:t>
       </w:r>
     </w:p>
     <w:p>
@@ -1091,7 +1096,7 @@
           <w:rFonts w:ascii="Consolas" w:hAnsi="Consolas"/>
           <w:sz w:val="16"/>
         </w:rPr>
-        <w:t>641d2dd12553254273ba9384689ef5f55a28dfe3c5a50f61c3f7be63de24d6a4</w:t>
+        <w:t>3808077afa7553d968055e8b4470d2d6aadaf322b80a8f4cc2cd7fcac4ec9332</w:t>
       </w:r>
     </w:p>
     <w:p>

</xml_diff>

<commit_message>
Expand operating and engineering manuals with verified current workflows
</commit_message>
<xml_diff>
--- a/docs/guides/DPH_Engineering_Guide.docx
+++ b/docs/guides/DPH_Engineering_Guide.docx
@@ -64,6 +64,7 @@
     </w:p>
     <w:p>
       <w:pPr>
+        <w:spacing w:after="60"/>
         <w:tabs>
           <w:tab w:val="right" w:leader="dot" w:pos="9360"/>
         </w:tabs>
@@ -78,6 +79,7 @@
     </w:p>
     <w:p>
       <w:pPr>
+        <w:spacing w:after="60"/>
         <w:tabs>
           <w:tab w:val="right" w:leader="dot" w:pos="9360"/>
         </w:tabs>
@@ -92,6 +94,7 @@
     </w:p>
     <w:p>
       <w:pPr>
+        <w:spacing w:after="60"/>
         <w:tabs>
           <w:tab w:val="right" w:leader="dot" w:pos="9360"/>
         </w:tabs>
@@ -106,6 +109,7 @@
     </w:p>
     <w:p>
       <w:pPr>
+        <w:spacing w:after="60"/>
         <w:tabs>
           <w:tab w:val="right" w:leader="dot" w:pos="9360"/>
         </w:tabs>
@@ -120,6 +124,7 @@
     </w:p>
     <w:p>
       <w:pPr>
+        <w:spacing w:after="60"/>
         <w:tabs>
           <w:tab w:val="right" w:leader="dot" w:pos="9360"/>
         </w:tabs>
@@ -134,6 +139,7 @@
     </w:p>
     <w:p>
       <w:pPr>
+        <w:spacing w:after="60"/>
         <w:tabs>
           <w:tab w:val="right" w:leader="dot" w:pos="9360"/>
         </w:tabs>
@@ -148,6 +154,7 @@
     </w:p>
     <w:p>
       <w:pPr>
+        <w:spacing w:after="60"/>
         <w:tabs>
           <w:tab w:val="right" w:leader="dot" w:pos="9360"/>
         </w:tabs>
@@ -162,6 +169,7 @@
     </w:p>
     <w:p>
       <w:pPr>
+        <w:spacing w:after="60"/>
         <w:tabs>
           <w:tab w:val="right" w:leader="dot" w:pos="9360"/>
         </w:tabs>
@@ -176,6 +184,7 @@
     </w:p>
     <w:p>
       <w:pPr>
+        <w:spacing w:after="60"/>
         <w:tabs>
           <w:tab w:val="right" w:leader="dot" w:pos="9360"/>
         </w:tabs>
@@ -190,6 +199,7 @@
     </w:p>
     <w:p>
       <w:pPr>
+        <w:spacing w:after="60"/>
         <w:tabs>
           <w:tab w:val="right" w:leader="dot" w:pos="9360"/>
         </w:tabs>
@@ -204,6 +214,7 @@
     </w:p>
     <w:p>
       <w:pPr>
+        <w:spacing w:after="60"/>
         <w:tabs>
           <w:tab w:val="right" w:leader="dot" w:pos="9360"/>
         </w:tabs>
@@ -218,6 +229,7 @@
     </w:p>
     <w:p>
       <w:pPr>
+        <w:spacing w:after="60"/>
         <w:tabs>
           <w:tab w:val="right" w:leader="dot" w:pos="9360"/>
         </w:tabs>
@@ -232,6 +244,7 @@
     </w:p>
     <w:p>
       <w:pPr>
+        <w:spacing w:after="60"/>
         <w:tabs>
           <w:tab w:val="right" w:leader="dot" w:pos="9360"/>
         </w:tabs>
@@ -246,6 +259,7 @@
     </w:p>
     <w:p>
       <w:pPr>
+        <w:spacing w:after="60"/>
         <w:tabs>
           <w:tab w:val="right" w:leader="dot" w:pos="9360"/>
         </w:tabs>
@@ -260,6 +274,7 @@
     </w:p>
     <w:p>
       <w:pPr>
+        <w:spacing w:after="60"/>
         <w:tabs>
           <w:tab w:val="right" w:leader="dot" w:pos="9360"/>
         </w:tabs>
@@ -269,11 +284,12 @@
       </w:r>
       <w:r>
         <w:tab/>
-        <w:t>7</w:t>
+        <w:t>8</w:t>
       </w:r>
     </w:p>
     <w:p>
       <w:pPr>
+        <w:spacing w:after="60"/>
         <w:tabs>
           <w:tab w:val="right" w:leader="dot" w:pos="9360"/>
         </w:tabs>
@@ -288,6 +304,97 @@
     </w:p>
     <w:p>
       <w:pPr>
+        <w:spacing w:after="60"/>
+        <w:tabs>
+          <w:tab w:val="right" w:leader="dot" w:pos="9360"/>
+        </w:tabs>
+      </w:pPr>
+      <w:r>
+        <w:t>Current semantic cache and extended evidence</w:t>
+      </w:r>
+      <w:r>
+        <w:tab/>
+        <w:t>8</w:t>
+      </w:r>
+    </w:p>
+    <w:p>
+      <w:pPr>
+        <w:spacing w:after="60"/>
+        <w:tabs>
+          <w:tab w:val="right" w:leader="dot" w:pos="9360"/>
+        </w:tabs>
+      </w:pPr>
+      <w:r>
+        <w:t>Current schema and authored document contracts</w:t>
+      </w:r>
+      <w:r>
+        <w:tab/>
+        <w:t>9</w:t>
+      </w:r>
+    </w:p>
+    <w:p>
+      <w:pPr>
+        <w:spacing w:after="60"/>
+        <w:tabs>
+          <w:tab w:val="right" w:leader="dot" w:pos="9360"/>
+        </w:tabs>
+      </w:pPr>
+      <w:r>
+        <w:t>Native review and learning projections</w:t>
+      </w:r>
+      <w:r>
+        <w:tab/>
+        <w:t>9</w:t>
+      </w:r>
+    </w:p>
+    <w:p>
+      <w:pPr>
+        <w:spacing w:after="60"/>
+        <w:tabs>
+          <w:tab w:val="right" w:leader="dot" w:pos="9360"/>
+        </w:tabs>
+      </w:pPr>
+      <w:r>
+        <w:t>Saved observation persistence</w:t>
+      </w:r>
+      <w:r>
+        <w:tab/>
+        <w:t>9</w:t>
+      </w:r>
+    </w:p>
+    <w:p>
+      <w:pPr>
+        <w:spacing w:after="60"/>
+        <w:tabs>
+          <w:tab w:val="right" w:leader="dot" w:pos="9360"/>
+        </w:tabs>
+      </w:pPr>
+      <w:r>
+        <w:t>Regression commands and evidence</w:t>
+      </w:r>
+      <w:r>
+        <w:tab/>
+        <w:t>10</w:t>
+      </w:r>
+    </w:p>
+    <w:p>
+      <w:pPr>
+        <w:spacing w:after="60"/>
+        <w:tabs>
+          <w:tab w:val="right" w:leader="dot" w:pos="9360"/>
+        </w:tabs>
+      </w:pPr>
+      <w:r>
+        <w:t>Rebuild and inspect these manuals</w:t>
+      </w:r>
+      <w:r>
+        <w:tab/>
+        <w:t>10</w:t>
+      </w:r>
+    </w:p>
+    <w:p>
+      <w:pPr>
+        <w:spacing w:after="60"/>
         <w:tabs>
           <w:tab w:val="right" w:leader="dot" w:pos="9360"/>
         </w:tabs>
@@ -297,7 +404,7 @@
       </w:r>
       <w:r>
         <w:tab/>
-        <w:t>8</w:t>
+        <w:t>11</w:t>
       </w:r>
     </w:p>
     <w:p>
@@ -353,7 +460,7 @@
     </w:p>
     <w:p>
       <w:r>
-        <w:t>Affected-only semantic recomputation, broader external-definition interpretation and retention/continuity controls remain incomplete. Source safety, privacy, attribution and exact generation links are retained. Do not turn an automated pass count into a claim that every requirement or the human onboarding goal is finished.</w:t>
+        <w:t>The implementation tracker records expanded semantic reuse, resource interpretation and retention/continuity controls. Their documented bounds still apply. Source safety, privacy, attribution and exact generation links are retained. Do not turn an automated pass count into a claim that every requirement or the human onboarding goal is finished.</w:t>
       </w:r>
     </w:p>
     <w:p>
@@ -371,7 +478,7 @@
     </w:p>
     <w:p>
       <w:r>
-        <w:t>Deploy the executable, migrations 001_foundation.sql and 002_constraints.sql, and the architecture-matched WebView2Loader.dll. The reviewed Microsoft WebView2 SDK package is pinned to 1.0.4258.31; retain tools/WebView2/LICENSE.txt with binary redistribution. The browser loads the DLL by its absolute executable-folder path and activates Edge only when preview is requested. There is no intended IE fallback.</w:t>
+        <w:t>Deploy the executable, all seven immutable migration files, and the architecture-matched WebView2Loader.dll. The reviewed Microsoft WebView2 SDK package is pinned to 1.0.4258.31; retain tools/WebView2/LICENSE.txt with binary redistribution. The browser loads the DLL by its absolute executable-folder path and activates Edge only when preview is requested. There is no intended IE fallback.</w:t>
       </w:r>
     </w:p>
     <w:p>
@@ -412,7 +519,7 @@
     </w:p>
     <w:p>
       <w:r>
-        <w:t>DPH.Parse.Model defines IR schema 1, analyzer DPH-WP2-1, token and node limits, source ranges and diagnostics. Lexing preserves original tokens and conditional information. Preprocessing evaluates supported expressions, explicit defines and includes while retaining uncertainty for unknown branches. An unavailable compiler symbol is not automatically a false condition.</w:t>
+        <w:t>DPH.Parse.Model defines IR schema 1, analyzer DPH-WP2-5, token and node limits, source ranges and diagnostics. Lexing preserves original tokens and conditional information. Preprocessing evaluates supported expressions, explicit defines and includes while retaining uncertainty for unknown branches. An unavailable compiler symbol is not automatically a false condition.</w:t>
       </w:r>
     </w:p>
     <w:p>
@@ -435,7 +542,7 @@
     </w:p>
     <w:p>
       <w:r>
-        <w:t>DPH.Analysis.Model defines semantic schema 1 and analyzer DPH-WP3-1. Stable symbol keys contain qualified identity, signature and conditional variant. DPH.Analysis.Symbols unifies supported routine prototypes and bodies, resolves cross-unit declarations, typed receivers and suitable overloads, associates form events and records anonymous callbacks.</w:t>
+        <w:t>DPH.Analysis.Model defines semantic schema 1 and analyzer DPH-WP3-11. Stable symbol keys contain qualified identity, signature and conditional variant. DPH.Analysis.Symbols unifies supported routine prototypes and bodies, resolves cross-unit declarations, typed receivers and suitable overloads, associates form events and records anonymous callbacks.</w:t>
       </w:r>
     </w:p>
     <w:p>
@@ -481,7 +588,7 @@
     </w:p>
     <w:p>
       <w:r>
-        <w:t>Schema 2 is created through two checksum-verified migrations. Existing migration text is immutable. A newer incompatible schema is rejected safely. Failed upgrade DDL and ledger changes roll back, and an upgrade from an existing schema makes a recoverable pre-migration database backup. Interrupted running generations recover as failed, preserving the previous published head.</w:t>
+        <w:t>Schema 7 is created through seven checksum-verified migrations. Existing migration text is immutable. A newer incompatible schema is rejected safely. Failed upgrade DDL and ledger changes roll back, and an upgrade from an existing schema makes a recoverable pre-migration database backup. Interrupted running generations recover as failed, preserving the previous published head.</w:t>
       </w:r>
     </w:p>
     <w:p>
@@ -532,7 +639,7 @@
     </w:p>
     <w:p>
       <w:r>
-        <w:t>Workspace projections are managed JSON files in database.dphdb.views named by SHA256 and registered in artifacts. Cached opening verifies the managed path, size, checksum and generation. The default is detached until explicit source attachment. Connected checks compare manifest fingerprints and selection identity every ten seconds. Syntax cache reuse is bounded; semantic recomputation is currently conservative rather than a claim of a minimal incremental semantic solver.</w:t>
+        <w:t>Workspace projections are managed JSON files in database.dphdb.views named by SHA256 and registered in artifacts. Cached opening verifies the managed path, size, checksum and generation. Cached facts are delivered before automatic verification when the original source entry is available; unavailable source remains detached. Connected checks compare manifest fingerprints and selection identity every ten seconds. Syntax and routine semantic caches are bounded and binding-context aware; conservative postprocessing remains separate from reused routine facts.</w:t>
       </w:r>
     </w:p>
     <w:p>
@@ -545,7 +652,7 @@
     </w:p>
     <w:p>
       <w:r>
-        <w:t>DPH.UI.Main binds its published controls to the FMX resource. Explorer queries are paged at 250 rows; data filtering supports kind, text and qualified scope. History and bookmarks use canonical keys, with bookmarks reset on a new captured generation. Inspector output retains source metadata and serialized properties. Source memo navigation is permitted only after live hash validation.</w:t>
+        <w:t>DPH.UI.Main binds its published controls to the FMX resource. Explorer queries are paged at 250 rows; data filtering supports kind, text and qualified scope. History and bookmarks use canonical keys, with surviving same-project bookmarks retained across reassessment. Inspector output retains source metadata and serialized properties. Source memo navigation is permitted only after live hash validation.</w:t>
       </w:r>
     </w:p>
     <w:p>
@@ -619,7 +726,7 @@
     </w:p>
     <w:p>
       <w:r>
-        <w:t>DPH.Publish.Export writes a new destination outside source. The offline HTML uses encoded imported text, local search and styles, internal anchors, print CSS and a restrictive content security policy. The default WebView2 policy permits only the authorized local index and about:blank; publication explicitly enables hash-named object pages in its managed objects folder. Learning and help retain the index-only policy. There is no arbitrary native bridge. Data does not supply executable markup.</w:t>
+        <w:t>DPH.Publish.Export writes a new destination outside source. The offline HTML uses encoded imported text, local search and styles, internal anchors, print CSS and a restrictive content security policy. The default WebView2 policy permits only the authorized local index and about:blank; publication explicitly enables hash-named object pages in its managed objects folder. Help retains the index-only policy; learning explicitly permits content-hashed pages only inside its owned preview directory. There is no arbitrary native bridge. Data does not supply executable markup.</w:t>
       </w:r>
     </w:p>
     <w:p>
@@ -647,7 +754,7 @@
     </w:p>
     <w:p>
       <w:r>
-        <w:t>TDPHAtlasAdapter is deliberately unconfigured because the exact Atlas product, transport, licensing and confidentiality have not been selected. External providers require explicit consent. The current adapter throws before transmission, and tests use an offline mock. The offline GTranslate region is disabled, with local bilingual labels and sorting; do not activate network translation merely because a generic widget name appears in documentation.</w:t>
+        <w:t>The owner identified the local VCL2FMXConverterV7 DAT framework as the translation reference. At this manual revision, its integration is pending and TDPHAtlasAdapter remains unconfigured. External providers require explicit consent. The current adapter throws before transmission, and tests use an offline mock. The offline GTranslate region is disabled, with local bilingual labels and sorting; do not activate network translation merely because a generic widget name appears in documentation.</w:t>
       </w:r>
     </w:p>
     <w:p>
@@ -683,12 +790,167 @@
         <w:pStyle w:val="Heading1"/>
       </w:pPr>
       <w:r>
+        <w:t>Current semantic cache and extended evidence</w:t>
+      </w:r>
+    </w:p>
+    <w:p>
+      <w:r>
+        <w:t>The current analyzers are DPH-WP2-5 and DPH-WP3-11 with IR and semantic schema 1. Routine semantic cache reuse is bounded to 512 records and 32 MiB. Binding context hashes invalidate affected reuse. Synthetic startup and postprocessing occur after reusable routine facts, preserving their relationships to current identities. This is bounded evidence reuse; it is not a proof of an optimal incremental solver.</w:t>
+      </w:r>
+    </w:p>
+    <w:p>
+      <w:r>
+        <w:t>Supported extensions include typed aliases, inheritance and accessors, startup entry and unit phases, case/goto/with control flow, asynchronous operation handles and captures, cancellation and event waits, formal arguments and result producers, static SQL projection, output-writer lineage, lifetime and exception relationships, explicit test-call links, and qualified form navigation. Every relationship retains resolution, source range/hash and rule. Unsupported grammar, aliases and dynamic behavior remain diagnosed or qualified.</w:t>
+      </w:r>
+    </w:p>
+    <w:p>
+      <w:pPr>
+        <w:pStyle w:val="Heading1"/>
+      </w:pPr>
+      <w:r>
+        <w:t>Current schema and authored document contracts</w:t>
+      </w:r>
+    </w:p>
+    <w:p>
+      <w:r>
+        <w:t>Schema 7 uses checksum-verified migrations 001 through 007. document_section_versions associates immutable authored revisions with stable section ID, document kind, audience and source generation. knowledge_revision_links preserves ordinal, target kind/identity, captured generation, role and label. knowledge_questions preserves the exact deterministic question identity and captured JSON associated with a response record.</w:t>
+      </w:r>
+    </w:p>
+    <w:p>
+      <w:r>
+        <w:t>SaveKnowledge appends immutable text and link snapshots. Empty LinksJSON preserves the prior snapshot; an explicit JSON array replaces it. Entity, relationship and evidence targets remain tied to generation identities; screenshot targets reference managed artifacts; section targets pin an exact knowledge revision. Current reverse section references open review when their targets change. Verify rejects obsolete rich-link generations or target revisions.</w:t>
+      </w:r>
+    </w:p>
+    <w:p>
+      <w:r>
+        <w:t>Question identity hashes kind, entity key, range, source hash, prompt, rule and context fingerprint. Generation is retained separately, allowing unchanged evidence to keep its question identity across captures. An answer needs actual text after Answer. Only verified content with no pending task suppresses an exact question. Export converts question metadata to typed JSON before recursive redaction.</w:t>
+      </w:r>
+    </w:p>
+    <w:p>
+      <w:pPr>
+        <w:pStyle w:val="Heading1"/>
+      </w:pPr>
+      <w:r>
+        <w:t>Native review and learning projections</w:t>
+      </w:r>
+    </w:p>
+    <w:p>
+      <w:r>
+        <w:t>ReviewTasks provides bounded pending tasks, prior and current authored text, baseline/current configurations, affected object signatures, types, source hashes and relationship comparisons. A missing baseline is reported. Native controls invoke existing optimistic-revision and connected-source review checks; they do not create a separate approval authority.</w:t>
+      </w:r>
+    </w:p>
+    <w:p>
+      <w:r>
+        <w:t>RoutineLesson uses the routine CFG and an indexed outgoing-edge lookup. It explains source points, actual expressions and destination lines, with explicit loop, branch, early-return, cleanup and exceptional semantics. The same lesson is used by ObjectText and ObjectHTML; exported document prose and offline object pages therefore share its source interpretation. Its bounds are 60 points and eight outgoing paths per point.</w:t>
+      </w:r>
+    </w:p>
+    <w:p>
+      <w:r>
+        <w:t>Preview HTML files have immutable content-hashed names, tracked for cleanup. BrowserPolicy allows them only in the owned preview directory when explicitly enabled. This avoids rewriting a file held by WebView2. Arbitrary filenames and external navigation remain blocked. Native browser tests render the app pages; they do not execute the analyzed application.</w:t>
+      </w:r>
+    </w:p>
+    <w:p>
+      <w:pPr>
+        <w:pStyle w:val="Heading1"/>
+      </w:pPr>
+      <w:r>
+        <w:t>Saved observation persistence</w:t>
+      </w:r>
+    </w:p>
+    <w:p>
+      <w:r>
+        <w:t>ImportObservation accepts explicitly selected UTF-8 text extracts up to 256 KiB with named contributor and run context. It checks generation and optional entity existence, captures original byte SHA256 and linked file-revision SHA256, and stores content plus attribution in a managed hash-named JSON artifact of kind runtime_observation. No schema migration is needed for this artifact kind.</w:t>
+      </w:r>
+    </w:p>
+    <w:p>
+      <w:r>
+        <w:t>ObservationsJSON verifies managed identity, size, checksum and generation before returning the newest 50 records. The response owns the array until PollTimer transfers it to the form. LoadView clears old observation rows; historical records cannot navigate as current. Saved text stays in a native read-only memo rather than an executable browser surface.</w:t>
+      </w:r>
+    </w:p>
+    <w:p>
+      <w:r>
+        <w:t>ManagedArtifactPaths includes observations for explicit portable backup. Retention protects their associated captured views. Publication currently omits observations rather than automatically disclose potentially sensitive logs. Contributor claims do not set runtime_observed on static analysis or create an automated causal trace.</w:t>
+      </w:r>
+    </w:p>
+    <w:p>
+      <w:pPr>
+        <w:pStyle w:val="Heading1"/>
+      </w:pPr>
+      <w:r>
+        <w:t>Regression commands and evidence</w:t>
+      </w:r>
+    </w:p>
+    <w:p>
+      <w:r>
+        <w:t>Run commands from the project root in an elevated Command Prompt so RAD Studio can read its environment. tools\build-wp0.cmd builds the app and checks FMX bindings. tools\validate-completion-wp1.cmd serially builds app, catalog, lifecycle, workspace, knowledge, selection and startup tests, then removes recognized disposable fixture directories.</w:t>
+      </w:r>
+    </w:p>
+    <w:p>
+      <w:r>
+        <w:t>Run tools\build-wp1.cmd for 46 storage checks, tools\build-wp2.cmd no-report for discovery/resource checks, and tools\build-wp3.cmd to compile semantic tests. Then explicitly run bin\Win32\Debug\DPH.Tests.Semantics.exe "C:\New Delphi Projects\Delphi Project Handoff"; the build script alone does not run semantic assertions.</w:t>
+      </w:r>
+    </w:p>
+    <w:p>
+      <w:r>
+        <w:t>tools\build-learning.cmd exercises managed images, cached supplemental-evidence recovery, actual WebView2 rendering, source walkthroughs and collapsed CFGs. --no-ui isolates deterministic checks and is not native acceptance. tools\build-wp6.cmd checks canonical scope, redaction, link integrity, publication and translation protection. Use exact log files and current input hashes for claims; historical reports are not automatically refreshed acceptance.</w:t>
+      </w:r>
+    </w:p>
+    <w:p>
+      <w:r>
+        <w:t>A native-learning test once dereferenced an absent image array on a later background-verification response. It now checks the initial cached document/image response directly. Source attachment preserves supplemental-image warnings. Inspection disproved a proposed constructor race, and no worker thread-start change remains.</w:t>
+      </w:r>
+    </w:p>
+    <w:p>
+      <w:pPr>
+        <w:pStyle w:val="Heading1"/>
+      </w:pPr>
+      <w:r>
+        <w:t>Rebuild and inspect these manuals</w:t>
+      </w:r>
+    </w:p>
+    <w:p>
+      <w:r>
+        <w:t>tools\build-guides.py generates the two application manuals from maintained operating content and current implementation hashes. Use the approved Python executable C:\Users\marti\AppData\Local\Microsoft\WindowsApps\python.exe. tools\render-guides.ps1 renders with LibreOffice, populates cached page numbers in editable TOC fields, renders again and writes companion PDFs under docs\pdf.</w:t>
+      </w:r>
+    </w:p>
+    <w:p>
+      <w:r>
+        <w:t>Inspect every final page PNG under bin\guide-qa for clipping, broken headings, unreadable code and TOC page numbers before delivering a guide. Rendered PNGs are QA outputs, not a mock application UI. Actual included interface images are identified by their capture source and fixture; they do not establish runtime behavior of a selected project.</w:t>
+      </w:r>
+    </w:p>
+    <w:p>
+      <w:r>
+        <w:t>Regenerate manuals after later translation, handoff-contract or source-navigation changes. The source evidence appendix records inspected file hashes, while docs\guide-source-validation.json provides a machine-readable manifest. A successful generator run alone is not proof that the writing, current behavior or layout is correct.</w:t>
+      </w:r>
+    </w:p>
+    <w:p>
+      <w:pPr>
+        <w:pStyle w:val="Heading1"/>
+      </w:pPr>
+      <w:r>
         <w:t>Source and revision evidence</w:t>
       </w:r>
     </w:p>
     <w:p>
       <w:r>
         <w:t>The following source files and resources define this guide. SHA256 values identify the inspected implementation. Rebuild the guides after validated changes and retain the associated acceptance evidence.</w:t>
+      </w:r>
+    </w:p>
+    <w:p>
+      <w:pPr>
+        <w:keepNext/>
+      </w:pPr>
+      <w:r>
+        <w:t>DPH.Analysis.Async.pas</w:t>
+      </w:r>
+    </w:p>
+    <w:p>
+      <w:r>
+        <w:rPr>
+          <w:rFonts w:ascii="Consolas" w:hAnsi="Consolas"/>
+          <w:sz w:val="16"/>
+        </w:rPr>
+        <w:t>876a836f25b3d323ac4d6f635701fb4e8e97955fdff39c964368aa62f1a4c153</w:t>
       </w:r>
     </w:p>
     <w:p>
@@ -705,7 +967,7 @@
           <w:rFonts w:ascii="Consolas" w:hAnsi="Consolas"/>
           <w:sz w:val="16"/>
         </w:rPr>
-        <w:t>c4e1ae7eebad50048fad16025f9aeb49884c94321cafef7b4ba5227a39aa3444</w:t>
+        <w:t>be976f2199be2c8e86a0cf8be936d008aa83739cf116c3e81ca68bf3692fc8e7</w:t>
       </w:r>
     </w:p>
     <w:p>
@@ -722,7 +984,7 @@
           <w:rFonts w:ascii="Consolas" w:hAnsi="Consolas"/>
           <w:sz w:val="16"/>
         </w:rPr>
-        <w:t>7ae133ca49ea4461c3cfa5a2f659bb035acfa463d34668eac091f405eee0fbad</w:t>
+        <w:t>ee7610544411a64da399659f2af11e84408d285837a45205d610d2c37af8ef57</w:t>
       </w:r>
     </w:p>
     <w:p>
@@ -739,7 +1001,7 @@
           <w:rFonts w:ascii="Consolas" w:hAnsi="Consolas"/>
           <w:sz w:val="16"/>
         </w:rPr>
-        <w:t>63797e406476e2e527b8fd28b75bbccedbe0820657217457e0329252792bd417</w:t>
+        <w:t>67383aae374aabba6832526e9d373827a5133e4369a61eaad9cffef9f239ecdb</w:t>
       </w:r>
     </w:p>
     <w:p>
@@ -756,7 +1018,24 @@
           <w:rFonts w:ascii="Consolas" w:hAnsi="Consolas"/>
           <w:sz w:val="16"/>
         </w:rPr>
-        <w:t>5771a6e098cd57a17d6221474e0864785675b7240875ccc4e4f9ff284a92a6e6</w:t>
+        <w:t>08609c3df54250a8f6712e22e991f7ad8d444352e7103ba0959d2feba4a2b3c7</w:t>
+      </w:r>
+    </w:p>
+    <w:p>
+      <w:pPr>
+        <w:keepNext/>
+      </w:pPr>
+      <w:r>
+        <w:t>DPH.Analysis.SQL.pas</w:t>
+      </w:r>
+    </w:p>
+    <w:p>
+      <w:r>
+        <w:rPr>
+          <w:rFonts w:ascii="Consolas" w:hAnsi="Consolas"/>
+          <w:sz w:val="16"/>
+        </w:rPr>
+        <w:t>68ea587d47e2c7ebf660f85eed6b605f6076480ead3a461742b8290fec7a130e</w:t>
       </w:r>
     </w:p>
     <w:p>
@@ -773,7 +1052,7 @@
           <w:rFonts w:ascii="Consolas" w:hAnsi="Consolas"/>
           <w:sz w:val="16"/>
         </w:rPr>
-        <w:t>3af351398e978e521920fbbd33b8da9d35c1d129176b11437ef836231d0b9a31</w:t>
+        <w:t>a362f3a2b46bdc77883c129efd1c14192d6128ecb616f82915222df370d2d006</w:t>
       </w:r>
     </w:p>
     <w:p>
@@ -824,7 +1103,7 @@
           <w:rFonts w:ascii="Consolas" w:hAnsi="Consolas"/>
           <w:sz w:val="16"/>
         </w:rPr>
-        <w:t>5eb5afb595a879cde199cd029349890990cc58cefdea20e643447dca7bca4f4e</w:t>
+        <w:t>1bc634e14dbc4d2b2b94d566fcca9eae7911fd1299b70ef7378dcba577c80778</w:t>
       </w:r>
     </w:p>
     <w:p>
@@ -841,7 +1120,7 @@
           <w:rFonts w:ascii="Consolas" w:hAnsi="Consolas"/>
           <w:sz w:val="16"/>
         </w:rPr>
-        <w:t>e89e29fce1ece85d5a0ecafad0cf397f42d4797e9f12c997a6ffafe19e0db0c8</w:t>
+        <w:t>016adbe9ba24b90d457455722782cdbbc657233bd1a07ba1bcdcd77f3340587e</w:t>
       </w:r>
     </w:p>
     <w:p>
@@ -866,6 +1145,23 @@
         <w:keepNext/>
       </w:pPr>
       <w:r>
+        <w:t>DPH.Parse.Resources.pas</w:t>
+      </w:r>
+    </w:p>
+    <w:p>
+      <w:r>
+        <w:rPr>
+          <w:rFonts w:ascii="Consolas" w:hAnsi="Consolas"/>
+          <w:sz w:val="16"/>
+        </w:rPr>
+        <w:t>f63153edba8656b315956fdd8ccf52e45b1446d8192f9b84c96c153bf676258f</w:t>
+      </w:r>
+    </w:p>
+    <w:p>
+      <w:pPr>
+        <w:keepNext/>
+      </w:pPr>
+      <w:r>
         <w:t>DPH.Project.Analysis.pas</w:t>
       </w:r>
     </w:p>
@@ -875,7 +1171,7 @@
           <w:rFonts w:ascii="Consolas" w:hAnsi="Consolas"/>
           <w:sz w:val="16"/>
         </w:rPr>
-        <w:t>fc94776733a225a0c8bea34797ee35e0bc7160dac32fa268a92a83e6f0b8504f</w:t>
+        <w:t>5af3808df19a7c403b456342e45b9e2c8c63195368847b151f3c57ed461b5c2a</w:t>
       </w:r>
     </w:p>
     <w:p>
@@ -892,7 +1188,7 @@
           <w:rFonts w:ascii="Consolas" w:hAnsi="Consolas"/>
           <w:sz w:val="16"/>
         </w:rPr>
-        <w:t>31d9ff9f79aa8697cefbc66e08cb963d17aa910e9ed05ab7c8901ee5b9ae1ce7</w:t>
+        <w:t>061736891f0fab486996ff5d8132af1cf5e25a2f93a74fb3e03ad8fa04e2c266</w:t>
       </w:r>
     </w:p>
     <w:p>
@@ -909,7 +1205,7 @@
           <w:rFonts w:ascii="Consolas" w:hAnsi="Consolas"/>
           <w:sz w:val="16"/>
         </w:rPr>
-        <w:t>c2e1ff86fc0ee3435be23cb6fd07bd9df6d43c6954def70cca23f2edf62162cd</w:t>
+        <w:t>8efa444743f0e90831631df963f26a2542561efab63b26f1c5b41fff6b96994e</w:t>
       </w:r>
     </w:p>
     <w:p>
@@ -926,7 +1222,7 @@
           <w:rFonts w:ascii="Consolas" w:hAnsi="Consolas"/>
           <w:sz w:val="16"/>
         </w:rPr>
-        <w:t>e4bcf5a33bbed2cf2e9906aed11262bcb14ba9df295719e28dfbb1ad111ee0b6</w:t>
+        <w:t>74d2f36c879f1b7b55133241c3e1abc28ce113c4d9f581a5123be83f94d705ce</w:t>
       </w:r>
     </w:p>
     <w:p>
@@ -943,7 +1239,7 @@
           <w:rFonts w:ascii="Consolas" w:hAnsi="Consolas"/>
           <w:sz w:val="16"/>
         </w:rPr>
-        <w:t>7fde26fc5fb07cdae8ca6bf7aa398ca442121d6da9edafc0f602c9478504c5ff</w:t>
+        <w:t>137619355d6feb426ffd58ee677a500ac8ac02762ce2b5e31320fc0584763603</w:t>
       </w:r>
     </w:p>
     <w:p>
@@ -960,7 +1256,7 @@
           <w:rFonts w:ascii="Consolas" w:hAnsi="Consolas"/>
           <w:sz w:val="16"/>
         </w:rPr>
-        <w:t>38f2800eb6b9337263a39a8b7aca47ae9bfae3bb79a0cd3e5be6f2a12aa4826f</w:t>
+        <w:t>89932abdd16caf6a234c10a170c59761fc8df105325d12e864bf07e4cc932df4</w:t>
       </w:r>
     </w:p>
     <w:p>
@@ -985,6 +1281,23 @@
         <w:keepNext/>
       </w:pPr>
       <w:r>
+        <w:t>DPH.Storage.Backup.pas</w:t>
+      </w:r>
+    </w:p>
+    <w:p>
+      <w:r>
+        <w:rPr>
+          <w:rFonts w:ascii="Consolas" w:hAnsi="Consolas"/>
+          <w:sz w:val="16"/>
+        </w:rPr>
+        <w:t>78e8c8de8af5120f8ce453793f947c5e2918e51dafc66f9e129c964fe28697bc</w:t>
+      </w:r>
+    </w:p>
+    <w:p>
+      <w:pPr>
+        <w:keepNext/>
+      </w:pPr>
+      <w:r>
         <w:t>DPH.Storage.Database.pas</w:t>
       </w:r>
     </w:p>
@@ -994,7 +1307,7 @@
           <w:rFonts w:ascii="Consolas" w:hAnsi="Consolas"/>
           <w:sz w:val="16"/>
         </w:rPr>
-        <w:t>16648fd015ff3821f189f7985042522c6bc27c451943404df8d3a8ec19d514a9</w:t>
+        <w:t>92b465a1b9c385f4627a1273efe473394f6184090156438d48f9457d051afeff</w:t>
       </w:r>
     </w:p>
     <w:p>
@@ -1028,7 +1341,41 @@
           <w:rFonts w:ascii="Consolas" w:hAnsi="Consolas"/>
           <w:sz w:val="16"/>
         </w:rPr>
-        <w:t>caa1012a20e072685bedf136541aae6c1316127b96b604541f33cc796b3467a3</w:t>
+        <w:t>90db98cb36b9d6e1fc1c58a308971aa0d1d6f9a3a59d4dd77f397a9d04c3b1b6</w:t>
+      </w:r>
+    </w:p>
+    <w:p>
+      <w:pPr>
+        <w:keepNext/>
+      </w:pPr>
+      <w:r>
+        <w:t>DPH.Workspace.Catalog.pas</w:t>
+      </w:r>
+    </w:p>
+    <w:p>
+      <w:r>
+        <w:rPr>
+          <w:rFonts w:ascii="Consolas" w:hAnsi="Consolas"/>
+          <w:sz w:val="16"/>
+        </w:rPr>
+        <w:t>5fed34d1919dfd5b34216be36f92fc1764847a65d62112613b2a0e1d44a05940</w:t>
+      </w:r>
+    </w:p>
+    <w:p>
+      <w:pPr>
+        <w:keepNext/>
+      </w:pPr>
+      <w:r>
+        <w:t>DPH.Workspace.Graphs.pas</w:t>
+      </w:r>
+    </w:p>
+    <w:p>
+      <w:r>
+        <w:rPr>
+          <w:rFonts w:ascii="Consolas" w:hAnsi="Consolas"/>
+          <w:sz w:val="16"/>
+        </w:rPr>
+        <w:t>6fd8b84644df65a0746aaad3598dad9406fa2d55e637e1e30f2175cefd1be911</w:t>
       </w:r>
     </w:p>
     <w:p>
@@ -1045,7 +1392,7 @@
           <w:rFonts w:ascii="Consolas" w:hAnsi="Consolas"/>
           <w:sz w:val="16"/>
         </w:rPr>
-        <w:t>4caaea4c68bf59566d0c5378f1834bb4cbf005228566b289056103793f292381</w:t>
+        <w:t>c29fb1d8f45c7d96ab12a99540d26267e5d4d59c152dcf1913adb8c62843cb06</w:t>
       </w:r>
     </w:p>
     <w:p>
@@ -1079,7 +1426,7 @@
           <w:rFonts w:ascii="Consolas" w:hAnsi="Consolas"/>
           <w:sz w:val="16"/>
         </w:rPr>
-        <w:t>ffd302794055c7d7aa00d33ac7f89a4fcab97a3b640188f6667293d64a827eee</w:t>
+        <w:t>fed04c89fd5cf63f202002aee813b755a3ccf0349507659c34bbd5b0417ed1dd</w:t>
       </w:r>
     </w:p>
     <w:p>
@@ -1096,7 +1443,7 @@
           <w:rFonts w:ascii="Consolas" w:hAnsi="Consolas"/>
           <w:sz w:val="16"/>
         </w:rPr>
-        <w:t>3808077afa7553d968055e8b4470d2d6aadaf322b80a8f4cc2cd7fcac4ec9332</w:t>
+        <w:t>62e5e29c4c6fae0758cf6b42f37c1aaabf151cb40289994c4dfe4e5728638766</w:t>
       </w:r>
     </w:p>
     <w:p>
@@ -1113,7 +1460,7 @@
           <w:rFonts w:ascii="Consolas" w:hAnsi="Consolas"/>
           <w:sz w:val="16"/>
         </w:rPr>
-        <w:t>3a7069ba071bb567f4d61da03cca38db4a12b1c700bca885c7e2a46a52d71732</w:t>
+        <w:t>2b922d5561c2ab3e2b65590583f646e29fc12c8b5c36a08fe401a6ebed90d3f9</w:t>
       </w:r>
     </w:p>
     <w:p>
@@ -1130,7 +1477,7 @@
           <w:rFonts w:ascii="Consolas" w:hAnsi="Consolas"/>
           <w:sz w:val="16"/>
         </w:rPr>
-        <w:t>23428c608a2cee9b8e1bb343af3e201abbe3579e3e49bac25a3b773744701839</w:t>
+        <w:t>d42dec72fcdc84a25ca76f597d4f333da3db2e3388dbee5ca9ffb19f99718a85</w:t>
       </w:r>
     </w:p>
     <w:sectPr>

</xml_diff>

<commit_message>
Validate expanded DPH workflows and deliver current operating guides
</commit_message>
<xml_diff>
--- a/docs/guides/DPH_Engineering_Guide.docx
+++ b/docs/guides/DPH_Engineering_Guide.docx
@@ -400,6 +400,36 @@
         </w:tabs>
       </w:pPr>
       <w:r>
+        <w:t>Offline translation and localized publication</w:t>
+      </w:r>
+      <w:r>
+        <w:tab/>
+        <w:t>11</w:t>
+      </w:r>
+    </w:p>
+    <w:p>
+      <w:pPr>
+        <w:spacing w:after="60"/>
+        <w:tabs>
+          <w:tab w:val="right" w:leader="dot" w:pos="9360"/>
+        </w:tabs>
+      </w:pPr>
+      <w:r>
+        <w:t>Native validation and release evidence</w:t>
+      </w:r>
+      <w:r>
+        <w:tab/>
+        <w:t>11</w:t>
+      </w:r>
+    </w:p>
+    <w:p>
+      <w:pPr>
+        <w:spacing w:after="60"/>
+        <w:tabs>
+          <w:tab w:val="right" w:leader="dot" w:pos="9360"/>
+        </w:tabs>
+      </w:pPr>
+      <w:r>
         <w:t>Source and revision evidence</w:t>
       </w:r>
       <w:r>
@@ -478,7 +508,7 @@
     </w:p>
     <w:p>
       <w:r>
-        <w:t>Deploy the executable, all seven immutable migration files, and the architecture-matched WebView2Loader.dll. The reviewed Microsoft WebView2 SDK package is pinned to 1.0.4258.31; retain tools/WebView2/LICENSE.txt with binary redistribution. The browser loads the DLL by its absolute executable-folder path and activates Edge only when preview is requested. There is no intended IE fallback.</w:t>
+        <w:t>Deploy the executable, all eight immutable migration files, and the architecture-matched WebView2Loader.dll. The reviewed Microsoft WebView2 SDK package is pinned to 1.0.4258.31; retain tools/WebView2/LICENSE.txt with binary redistribution. The browser loads the DLL by its absolute executable-folder path and activates Edge only when preview is requested. There is no intended IE fallback.</w:t>
       </w:r>
     </w:p>
     <w:p>
@@ -588,7 +618,7 @@
     </w:p>
     <w:p>
       <w:r>
-        <w:t>Schema 7 is created through seven checksum-verified migrations. Existing migration text is immutable. A newer incompatible schema is rejected safely. Failed upgrade DDL and ledger changes roll back, and an upgrade from an existing schema makes a recoverable pre-migration database backup. Interrupted running generations recover as failed, preserving the previous published head.</w:t>
+        <w:t>Schema 8 is created through eight checksum-verified migrations. Existing migration text is immutable. A newer incompatible schema is rejected safely. Failed upgrade DDL and ledger changes roll back, and an upgrade from an existing schema makes a recoverable pre-migration database backup. Interrupted running generations recover as failed, preserving the previous published head.</w:t>
       </w:r>
     </w:p>
     <w:p>
@@ -754,7 +784,7 @@
     </w:p>
     <w:p>
       <w:r>
-        <w:t>The owner identified the local VCL2FMXConverterV7 DAT framework as the translation reference. At this manual revision, its integration is pending and TDPHAtlasAdapter remains unconfigured. External providers require explicit consent. The current adapter throws before transmission, and tests use an offline mock. The offline GTranslate region is disabled, with local bilingual labels and sorting; do not activate network translation merely because a generic widget name appears in documentation.</w:t>
+        <w:t>TDPHAtlasAdapter reads explicitly selected DAT JSON packs offline. The independent Apache-2.0 reader snapshot and license reside under dependencies\DelphiAppTranslation; VCL2FMX is unchanged and is not a build or runtime dependency. No network provider is configured. Tests exercise actual packs, persistent cache, terminology changes, source invalidation and exact-content named review. The offline GTranslate region is disabled, with local bilingual labels and sorting; do not activate network translation merely because a generic widget name appears in documentation.</w:t>
       </w:r>
     </w:p>
     <w:p>
@@ -782,7 +812,7 @@
     </w:p>
     <w:p>
       <w:r>
-        <w:t>On the recorded Core i7-1165G7 host with eight logical processors and about 16 GB RAM, the pinned reference pipeline measured 82.6 seconds for full capture, 2.87 seconds for cached opening and 75.9 seconds for incremental reassessment. The message-pump maximum gap was 64 ms. Peak test-process working set was about 1.21 GiB, including repeated captures, JSON cloning and FMX/WebView2 tests. These are baseline measurements, not agreed hardware-independent budgets. Large syntax-cache fallback and conservative semantic recomputation explain the modest reassessment speedup. Formal acceptance retains independent complex-flow review, missing business/user content, AC-25 and performance-budget agreement as outstanding.</w:t>
+        <w:t>In the historical pre-rework benchmark on the recorded Core i7-1165G7 host with eight logical processors and about 16 GB RAM, the pinned reference pipeline measured 82.6 seconds for full capture, 2.87 seconds for cached opening and 75.9 seconds for incremental reassessment. The message-pump maximum gap was 64 ms. Peak test-process working set was about 1.21 GiB, including repeated captures, JSON cloning and FMX/WebView2 tests. These are baseline measurements, not agreed hardware-independent budgets. Large syntax-cache fallback and conservative semantic recomputation explain the modest reassessment speedup. Formal acceptance retains independent complex-flow review, missing business/user content, AC-25 and performance-budget agreement as outstanding.</w:t>
       </w:r>
     </w:p>
     <w:p>
@@ -813,7 +843,7 @@
     </w:p>
     <w:p>
       <w:r>
-        <w:t>Schema 7 uses checksum-verified migrations 001 through 007. document_section_versions associates immutable authored revisions with stable section ID, document kind, audience and source generation. knowledge_revision_links preserves ordinal, target kind/identity, captured generation, role and label. knowledge_questions preserves the exact deterministic question identity and captured JSON associated with a response record.</w:t>
+        <w:t>Schema 8 uses checksum-verified migrations 001 through 008. document_section_versions associates immutable authored revisions with stable section ID, document kind, audience and source generation. knowledge_revision_links preserves ordinal, target kind/identity, captured generation, role and label. knowledge_questions preserves the exact deterministic question identity and captured JSON associated with a response record.</w:t>
       </w:r>
     </w:p>
     <w:p>
@@ -928,6 +958,62 @@
         <w:pStyle w:val="Heading1"/>
       </w:pPr>
       <w:r>
+        <w:t>Offline translation and localized publication</w:t>
+      </w:r>
+    </w:p>
+    <w:p>
+      <w:r>
+        <w:t>Migration 008 adds the persistent translation cache key and JSON record. Cache identity covers saved knowledge revision, requested locales, provider pack hash, source segments and terminology. SQL state overlays cached metadata so source invalidation remains authoritative after database reopen. Approval requires current source review, complete translated prose and a named reviewer; it never updates authoritative source text.</w:t>
+      </w:r>
+    </w:p>
+    <w:p>
+      <w:r>
+        <w:t>TDPHAtlasAdapter uses DAT.Runtime.LanguagePack plus its two copied core dependencies, original license and hashed snapshot provenance. Selected packs are bounded to 4 MiB, strictly UTF-8 and application scoped. Exact source phrase lookup and base-language fallback are explicit. Common code, SQL, paths and identifiers are protected during segmentation; unusual unmarked identifiers still need human review.</w:t>
+      </w:r>
+    </w:p>
+    <w:p>
+      <w:r>
+        <w:t>DPH-LEARNING-6 publication writes localization.json and, when a locale is requested, a hashed HTML page and Localized_Sections.docx. Verified exact-revision cache entries are eligible only while the canonical source section is reviewed and has no pending tasks. Redacted source bodies use source fallback. The supplementary document explicitly limits its scope to authored bodies.</w:t>
+      </w:r>
+    </w:p>
+    <w:p>
+      <w:r>
+        <w:t>Source navigation is separately opt-in. Only scoped captured text with matching source hashes is rendered as encoded, redacted HTML. Task masks use captured noncontainer ranges and original line starts. source-navigation.json records included line numbers and omission reasons. Validate checks scope, file identity, line order/counts, generations and disclosure metadata. No original source snapshot is shipped.</w:t>
+      </w:r>
+    </w:p>
+    <w:p>
+      <w:pPr>
+        <w:pStyle w:val="Heading1"/>
+      </w:pPr>
+      <w:r>
+        <w:t>Native validation and release evidence</w:t>
+      </w:r>
+    </w:p>
+    <w:p>
+      <w:r>
+        <w:t>The design-time Validate bundle controls dispatch validate_bundle to the worker before a database connection is required. The owner supplies an expected fingerprint independently. Stale rejection is default and historical inspection is an explicit qualification. Native reports distinguish integrity from human approval.</w:t>
+      </w:r>
+    </w:p>
+    <w:p>
+      <w:r>
+        <w:t>The Win32 project enables DCC_LargeAddressAware in its IDE project options. The hardening and learning harnesses use the equivalent PE flag. The expanded pinned corpus exposed an out-of-memory failure after repeated captures and native workspace loading under the former address limit. Keep memory measurements and actual large-corpus validation with this change; the linker flag does not make memory consumption unbounded or establish a release budget.</w:t>
+      </w:r>
+    </w:p>
+    <w:p>
+      <w:r>
+        <w:t>Run tools\validate-wp7.ps1 elevated for the pinned reference hardening suite and before/after hash proof. It reads the current schema constant rather than an obsolete hardcoded version. The suite measures full capture, cached open, reassessment, message-pump gaps and peak process working set on recorded hardware. Measurements require owner-agreed budgets before release acceptance.</w:t>
+      </w:r>
+    </w:p>
+    <w:p>
+      <w:r>
+        <w:t>The independent first-time programmer and source-review worksheet is docs\WP7_Maintenance_Exercise.txt. Preserve actual participant answers, source citations, uncertainty judgments, assistance, timings and defects. Do not substitute automated tests or prepared instructions for AC-25 or independent explanation review.</w:t>
+      </w:r>
+    </w:p>
+    <w:p>
+      <w:pPr>
+        <w:pStyle w:val="Heading1"/>
+      </w:pPr>
+      <w:r>
         <w:t>Source and revision evidence</w:t>
       </w:r>
     </w:p>
@@ -945,6 +1031,9 @@
       </w:r>
     </w:p>
     <w:p>
+      <w:pPr>
+        <w:spacing w:after="60"/>
+      </w:pPr>
       <w:r>
         <w:rPr>
           <w:rFonts w:ascii="Consolas" w:hAnsi="Consolas"/>
@@ -962,6 +1051,9 @@
       </w:r>
     </w:p>
     <w:p>
+      <w:pPr>
+        <w:spacing w:after="60"/>
+      </w:pPr>
       <w:r>
         <w:rPr>
           <w:rFonts w:ascii="Consolas" w:hAnsi="Consolas"/>
@@ -979,6 +1071,9 @@
       </w:r>
     </w:p>
     <w:p>
+      <w:pPr>
+        <w:spacing w:after="60"/>
+      </w:pPr>
       <w:r>
         <w:rPr>
           <w:rFonts w:ascii="Consolas" w:hAnsi="Consolas"/>
@@ -996,6 +1091,9 @@
       </w:r>
     </w:p>
     <w:p>
+      <w:pPr>
+        <w:spacing w:after="60"/>
+      </w:pPr>
       <w:r>
         <w:rPr>
           <w:rFonts w:ascii="Consolas" w:hAnsi="Consolas"/>
@@ -1013,6 +1111,9 @@
       </w:r>
     </w:p>
     <w:p>
+      <w:pPr>
+        <w:spacing w:after="60"/>
+      </w:pPr>
       <w:r>
         <w:rPr>
           <w:rFonts w:ascii="Consolas" w:hAnsi="Consolas"/>
@@ -1030,6 +1131,9 @@
       </w:r>
     </w:p>
     <w:p>
+      <w:pPr>
+        <w:spacing w:after="60"/>
+      </w:pPr>
       <w:r>
         <w:rPr>
           <w:rFonts w:ascii="Consolas" w:hAnsi="Consolas"/>
@@ -1047,6 +1151,9 @@
       </w:r>
     </w:p>
     <w:p>
+      <w:pPr>
+        <w:spacing w:after="60"/>
+      </w:pPr>
       <w:r>
         <w:rPr>
           <w:rFonts w:ascii="Consolas" w:hAnsi="Consolas"/>
@@ -1064,6 +1171,9 @@
       </w:r>
     </w:p>
     <w:p>
+      <w:pPr>
+        <w:spacing w:after="60"/>
+      </w:pPr>
       <w:r>
         <w:rPr>
           <w:rFonts w:ascii="Consolas" w:hAnsi="Consolas"/>
@@ -1081,6 +1191,9 @@
       </w:r>
     </w:p>
     <w:p>
+      <w:pPr>
+        <w:spacing w:after="60"/>
+      </w:pPr>
       <w:r>
         <w:rPr>
           <w:rFonts w:ascii="Consolas" w:hAnsi="Consolas"/>
@@ -1098,6 +1211,9 @@
       </w:r>
     </w:p>
     <w:p>
+      <w:pPr>
+        <w:spacing w:after="60"/>
+      </w:pPr>
       <w:r>
         <w:rPr>
           <w:rFonts w:ascii="Consolas" w:hAnsi="Consolas"/>
@@ -1115,6 +1231,9 @@
       </w:r>
     </w:p>
     <w:p>
+      <w:pPr>
+        <w:spacing w:after="60"/>
+      </w:pPr>
       <w:r>
         <w:rPr>
           <w:rFonts w:ascii="Consolas" w:hAnsi="Consolas"/>
@@ -1132,6 +1251,9 @@
       </w:r>
     </w:p>
     <w:p>
+      <w:pPr>
+        <w:spacing w:after="60"/>
+      </w:pPr>
       <w:r>
         <w:rPr>
           <w:rFonts w:ascii="Consolas" w:hAnsi="Consolas"/>
@@ -1149,6 +1271,9 @@
       </w:r>
     </w:p>
     <w:p>
+      <w:pPr>
+        <w:spacing w:after="60"/>
+      </w:pPr>
       <w:r>
         <w:rPr>
           <w:rFonts w:ascii="Consolas" w:hAnsi="Consolas"/>
@@ -1166,6 +1291,9 @@
       </w:r>
     </w:p>
     <w:p>
+      <w:pPr>
+        <w:spacing w:after="60"/>
+      </w:pPr>
       <w:r>
         <w:rPr>
           <w:rFonts w:ascii="Consolas" w:hAnsi="Consolas"/>
@@ -1183,6 +1311,9 @@
       </w:r>
     </w:p>
     <w:p>
+      <w:pPr>
+        <w:spacing w:after="60"/>
+      </w:pPr>
       <w:r>
         <w:rPr>
           <w:rFonts w:ascii="Consolas" w:hAnsi="Consolas"/>
@@ -1200,6 +1331,9 @@
       </w:r>
     </w:p>
     <w:p>
+      <w:pPr>
+        <w:spacing w:after="60"/>
+      </w:pPr>
       <w:r>
         <w:rPr>
           <w:rFonts w:ascii="Consolas" w:hAnsi="Consolas"/>
@@ -1217,6 +1351,9 @@
       </w:r>
     </w:p>
     <w:p>
+      <w:pPr>
+        <w:spacing w:after="60"/>
+      </w:pPr>
       <w:r>
         <w:rPr>
           <w:rFonts w:ascii="Consolas" w:hAnsi="Consolas"/>
@@ -1234,12 +1371,15 @@
       </w:r>
     </w:p>
     <w:p>
+      <w:pPr>
+        <w:spacing w:after="60"/>
+      </w:pPr>
       <w:r>
         <w:rPr>
           <w:rFonts w:ascii="Consolas" w:hAnsi="Consolas"/>
           <w:sz w:val="16"/>
         </w:rPr>
-        <w:t>137619355d6feb426ffd58ee677a500ac8ac02762ce2b5e31320fc0584763603</w:t>
+        <w:t>2de922c043eba74c1bbd9079373b23e9c33d1d534da6b48b084d6dca96cfd4fe</w:t>
       </w:r>
     </w:p>
     <w:p>
@@ -1251,12 +1391,15 @@
       </w:r>
     </w:p>
     <w:p>
+      <w:pPr>
+        <w:spacing w:after="60"/>
+      </w:pPr>
       <w:r>
         <w:rPr>
           <w:rFonts w:ascii="Consolas" w:hAnsi="Consolas"/>
           <w:sz w:val="16"/>
         </w:rPr>
-        <w:t>89932abdd16caf6a234c10a170c59761fc8df105325d12e864bf07e4cc932df4</w:t>
+        <w:t>396585941e2989ed400da1d038bef376fb3555b7cc58e7d64926ec770447aa90</w:t>
       </w:r>
     </w:p>
     <w:p>
@@ -1268,12 +1411,15 @@
       </w:r>
     </w:p>
     <w:p>
+      <w:pPr>
+        <w:spacing w:after="60"/>
+      </w:pPr>
       <w:r>
         <w:rPr>
           <w:rFonts w:ascii="Consolas" w:hAnsi="Consolas"/>
           <w:sz w:val="16"/>
         </w:rPr>
-        <w:t>d211794576a0e234d1aa8ac347d09f6a981e9590346204ef142608aa5aa400b2</w:t>
+        <w:t>978be4250a2332736f73cd4e56e85d5c2f0b0d3a6224a4db2f8f3b7b5f4cde20</w:t>
       </w:r>
     </w:p>
     <w:p>
@@ -1285,6 +1431,9 @@
       </w:r>
     </w:p>
     <w:p>
+      <w:pPr>
+        <w:spacing w:after="60"/>
+      </w:pPr>
       <w:r>
         <w:rPr>
           <w:rFonts w:ascii="Consolas" w:hAnsi="Consolas"/>
@@ -1302,12 +1451,15 @@
       </w:r>
     </w:p>
     <w:p>
+      <w:pPr>
+        <w:spacing w:after="60"/>
+      </w:pPr>
       <w:r>
         <w:rPr>
           <w:rFonts w:ascii="Consolas" w:hAnsi="Consolas"/>
           <w:sz w:val="16"/>
         </w:rPr>
-        <w:t>92b465a1b9c385f4627a1273efe473394f6184090156438d48f9457d051afeff</w:t>
+        <w:t>b05f869126267e7c0e3b27152b70c90a5f82f417180688982d8b8ffc59d305f1</w:t>
       </w:r>
     </w:p>
     <w:p>
@@ -1319,6 +1471,9 @@
       </w:r>
     </w:p>
     <w:p>
+      <w:pPr>
+        <w:spacing w:after="60"/>
+      </w:pPr>
       <w:r>
         <w:rPr>
           <w:rFonts w:ascii="Consolas" w:hAnsi="Consolas"/>
@@ -1336,12 +1491,15 @@
       </w:r>
     </w:p>
     <w:p>
+      <w:pPr>
+        <w:spacing w:after="60"/>
+      </w:pPr>
       <w:r>
         <w:rPr>
           <w:rFonts w:ascii="Consolas" w:hAnsi="Consolas"/>
           <w:sz w:val="16"/>
         </w:rPr>
-        <w:t>90db98cb36b9d6e1fc1c58a308971aa0d1d6f9a3a59d4dd77f397a9d04c3b1b6</w:t>
+        <w:t>26e8447174114031f562a85aad5b3928bc99f7fb1b8cb1ce910a725faf4c7b74</w:t>
       </w:r>
     </w:p>
     <w:p>
@@ -1353,6 +1511,9 @@
       </w:r>
     </w:p>
     <w:p>
+      <w:pPr>
+        <w:spacing w:after="60"/>
+      </w:pPr>
       <w:r>
         <w:rPr>
           <w:rFonts w:ascii="Consolas" w:hAnsi="Consolas"/>
@@ -1370,6 +1531,9 @@
       </w:r>
     </w:p>
     <w:p>
+      <w:pPr>
+        <w:spacing w:after="60"/>
+      </w:pPr>
       <w:r>
         <w:rPr>
           <w:rFonts w:ascii="Consolas" w:hAnsi="Consolas"/>
@@ -1387,6 +1551,9 @@
       </w:r>
     </w:p>
     <w:p>
+      <w:pPr>
+        <w:spacing w:after="60"/>
+      </w:pPr>
       <w:r>
         <w:rPr>
           <w:rFonts w:ascii="Consolas" w:hAnsi="Consolas"/>
@@ -1404,6 +1571,9 @@
       </w:r>
     </w:p>
     <w:p>
+      <w:pPr>
+        <w:spacing w:after="60"/>
+      </w:pPr>
       <w:r>
         <w:rPr>
           <w:rFonts w:ascii="Consolas" w:hAnsi="Consolas"/>
@@ -1421,12 +1591,15 @@
       </w:r>
     </w:p>
     <w:p>
+      <w:pPr>
+        <w:spacing w:after="60"/>
+      </w:pPr>
       <w:r>
         <w:rPr>
           <w:rFonts w:ascii="Consolas" w:hAnsi="Consolas"/>
           <w:sz w:val="16"/>
         </w:rPr>
-        <w:t>fed04c89fd5cf63f202002aee813b755a3ccf0349507659c34bbd5b0417ed1dd</w:t>
+        <w:t>4be99ff95017aa6afeca61bca566575b189637b3cdf9d62ae28086666f2039d6</w:t>
       </w:r>
     </w:p>
     <w:p>
@@ -1438,12 +1611,15 @@
       </w:r>
     </w:p>
     <w:p>
+      <w:pPr>
+        <w:spacing w:after="60"/>
+      </w:pPr>
       <w:r>
         <w:rPr>
           <w:rFonts w:ascii="Consolas" w:hAnsi="Consolas"/>
           <w:sz w:val="16"/>
         </w:rPr>
-        <w:t>62e5e29c4c6fae0758cf6b42f37c1aaabf151cb40289994c4dfe4e5728638766</w:t>
+        <w:t>14dc96efcf375dea3bc8a11e9d97005e2e632ef0b95eb93d9d599b1a8da7e35d</w:t>
       </w:r>
     </w:p>
     <w:p>
@@ -1455,6 +1631,9 @@
       </w:r>
     </w:p>
     <w:p>
+      <w:pPr>
+        <w:spacing w:after="60"/>
+      </w:pPr>
       <w:r>
         <w:rPr>
           <w:rFonts w:ascii="Consolas" w:hAnsi="Consolas"/>
@@ -1472,12 +1651,15 @@
       </w:r>
     </w:p>
     <w:p>
+      <w:pPr>
+        <w:spacing w:after="60"/>
+      </w:pPr>
       <w:r>
         <w:rPr>
           <w:rFonts w:ascii="Consolas" w:hAnsi="Consolas"/>
           <w:sz w:val="16"/>
         </w:rPr>
-        <w:t>d42dec72fcdc84a25ca76f597d4f333da3db2e3388dbee5ca9ffb19f99718a85</w:t>
+        <w:t>ecd4515cbc6a46e3d444d0af41aa7e3d3484f2d3d6f79a548891052ddd8efba7</w:t>
       </w:r>
     </w:p>
     <w:sectPr>

</xml_diff>

<commit_message>
Compare retained analysis revisions and publish redacted structured profiles
</commit_message>
<xml_diff>
--- a/docs/guides/DPH_Engineering_Guide.docx
+++ b/docs/guides/DPH_Engineering_Guide.docx
@@ -64,7 +64,7 @@
     </w:p>
     <w:p>
       <w:pPr>
-        <w:spacing w:after="60"/>
+        <w:spacing w:after="0" w:line="240" w:lineRule="auto"/>
         <w:tabs>
           <w:tab w:val="right" w:leader="dot" w:pos="9360"/>
         </w:tabs>
@@ -79,7 +79,7 @@
     </w:p>
     <w:p>
       <w:pPr>
-        <w:spacing w:after="60"/>
+        <w:spacing w:after="0" w:line="240" w:lineRule="auto"/>
         <w:tabs>
           <w:tab w:val="right" w:leader="dot" w:pos="9360"/>
         </w:tabs>
@@ -94,7 +94,7 @@
     </w:p>
     <w:p>
       <w:pPr>
-        <w:spacing w:after="60"/>
+        <w:spacing w:after="0" w:line="240" w:lineRule="auto"/>
         <w:tabs>
           <w:tab w:val="right" w:leader="dot" w:pos="9360"/>
         </w:tabs>
@@ -109,7 +109,7 @@
     </w:p>
     <w:p>
       <w:pPr>
-        <w:spacing w:after="60"/>
+        <w:spacing w:after="0" w:line="240" w:lineRule="auto"/>
         <w:tabs>
           <w:tab w:val="right" w:leader="dot" w:pos="9360"/>
         </w:tabs>
@@ -124,7 +124,7 @@
     </w:p>
     <w:p>
       <w:pPr>
-        <w:spacing w:after="60"/>
+        <w:spacing w:after="0" w:line="240" w:lineRule="auto"/>
         <w:tabs>
           <w:tab w:val="right" w:leader="dot" w:pos="9360"/>
         </w:tabs>
@@ -139,7 +139,7 @@
     </w:p>
     <w:p>
       <w:pPr>
-        <w:spacing w:after="60"/>
+        <w:spacing w:after="0" w:line="240" w:lineRule="auto"/>
         <w:tabs>
           <w:tab w:val="right" w:leader="dot" w:pos="9360"/>
         </w:tabs>
@@ -154,7 +154,7 @@
     </w:p>
     <w:p>
       <w:pPr>
-        <w:spacing w:after="60"/>
+        <w:spacing w:after="0" w:line="240" w:lineRule="auto"/>
         <w:tabs>
           <w:tab w:val="right" w:leader="dot" w:pos="9360"/>
         </w:tabs>
@@ -169,7 +169,7 @@
     </w:p>
     <w:p>
       <w:pPr>
-        <w:spacing w:after="60"/>
+        <w:spacing w:after="0" w:line="240" w:lineRule="auto"/>
         <w:tabs>
           <w:tab w:val="right" w:leader="dot" w:pos="9360"/>
         </w:tabs>
@@ -184,7 +184,7 @@
     </w:p>
     <w:p>
       <w:pPr>
-        <w:spacing w:after="60"/>
+        <w:spacing w:after="0" w:line="240" w:lineRule="auto"/>
         <w:tabs>
           <w:tab w:val="right" w:leader="dot" w:pos="9360"/>
         </w:tabs>
@@ -199,7 +199,7 @@
     </w:p>
     <w:p>
       <w:pPr>
-        <w:spacing w:after="60"/>
+        <w:spacing w:after="0" w:line="240" w:lineRule="auto"/>
         <w:tabs>
           <w:tab w:val="right" w:leader="dot" w:pos="9360"/>
         </w:tabs>
@@ -214,7 +214,7 @@
     </w:p>
     <w:p>
       <w:pPr>
-        <w:spacing w:after="60"/>
+        <w:spacing w:after="0" w:line="240" w:lineRule="auto"/>
         <w:tabs>
           <w:tab w:val="right" w:leader="dot" w:pos="9360"/>
         </w:tabs>
@@ -229,7 +229,7 @@
     </w:p>
     <w:p>
       <w:pPr>
-        <w:spacing w:after="60"/>
+        <w:spacing w:after="0" w:line="240" w:lineRule="auto"/>
         <w:tabs>
           <w:tab w:val="right" w:leader="dot" w:pos="9360"/>
         </w:tabs>
@@ -244,7 +244,7 @@
     </w:p>
     <w:p>
       <w:pPr>
-        <w:spacing w:after="60"/>
+        <w:spacing w:after="0" w:line="240" w:lineRule="auto"/>
         <w:tabs>
           <w:tab w:val="right" w:leader="dot" w:pos="9360"/>
         </w:tabs>
@@ -259,7 +259,7 @@
     </w:p>
     <w:p>
       <w:pPr>
-        <w:spacing w:after="60"/>
+        <w:spacing w:after="0" w:line="240" w:lineRule="auto"/>
         <w:tabs>
           <w:tab w:val="right" w:leader="dot" w:pos="9360"/>
         </w:tabs>
@@ -274,7 +274,7 @@
     </w:p>
     <w:p>
       <w:pPr>
-        <w:spacing w:after="60"/>
+        <w:spacing w:after="0" w:line="240" w:lineRule="auto"/>
         <w:tabs>
           <w:tab w:val="right" w:leader="dot" w:pos="9360"/>
         </w:tabs>
@@ -289,7 +289,7 @@
     </w:p>
     <w:p>
       <w:pPr>
-        <w:spacing w:after="60"/>
+        <w:spacing w:after="0" w:line="240" w:lineRule="auto"/>
         <w:tabs>
           <w:tab w:val="right" w:leader="dot" w:pos="9360"/>
         </w:tabs>
@@ -304,7 +304,7 @@
     </w:p>
     <w:p>
       <w:pPr>
-        <w:spacing w:after="60"/>
+        <w:spacing w:after="0" w:line="240" w:lineRule="auto"/>
         <w:tabs>
           <w:tab w:val="right" w:leader="dot" w:pos="9360"/>
         </w:tabs>
@@ -319,7 +319,7 @@
     </w:p>
     <w:p>
       <w:pPr>
-        <w:spacing w:after="60"/>
+        <w:spacing w:after="0" w:line="240" w:lineRule="auto"/>
         <w:tabs>
           <w:tab w:val="right" w:leader="dot" w:pos="9360"/>
         </w:tabs>
@@ -334,7 +334,7 @@
     </w:p>
     <w:p>
       <w:pPr>
-        <w:spacing w:after="60"/>
+        <w:spacing w:after="0" w:line="240" w:lineRule="auto"/>
         <w:tabs>
           <w:tab w:val="right" w:leader="dot" w:pos="9360"/>
         </w:tabs>
@@ -349,7 +349,7 @@
     </w:p>
     <w:p>
       <w:pPr>
-        <w:spacing w:after="60"/>
+        <w:spacing w:after="0" w:line="240" w:lineRule="auto"/>
         <w:tabs>
           <w:tab w:val="right" w:leader="dot" w:pos="9360"/>
         </w:tabs>
@@ -364,7 +364,7 @@
     </w:p>
     <w:p>
       <w:pPr>
-        <w:spacing w:after="60"/>
+        <w:spacing w:after="0" w:line="240" w:lineRule="auto"/>
         <w:tabs>
           <w:tab w:val="right" w:leader="dot" w:pos="9360"/>
         </w:tabs>
@@ -379,7 +379,7 @@
     </w:p>
     <w:p>
       <w:pPr>
-        <w:spacing w:after="60"/>
+        <w:spacing w:after="0" w:line="240" w:lineRule="auto"/>
         <w:tabs>
           <w:tab w:val="right" w:leader="dot" w:pos="9360"/>
         </w:tabs>
@@ -394,7 +394,7 @@
     </w:p>
     <w:p>
       <w:pPr>
-        <w:spacing w:after="60"/>
+        <w:spacing w:after="0" w:line="240" w:lineRule="auto"/>
         <w:tabs>
           <w:tab w:val="right" w:leader="dot" w:pos="9360"/>
         </w:tabs>
@@ -409,7 +409,7 @@
     </w:p>
     <w:p>
       <w:pPr>
-        <w:spacing w:after="60"/>
+        <w:spacing w:after="0" w:line="240" w:lineRule="auto"/>
         <w:tabs>
           <w:tab w:val="right" w:leader="dot" w:pos="9360"/>
         </w:tabs>
@@ -424,7 +424,37 @@
     </w:p>
     <w:p>
       <w:pPr>
-        <w:spacing w:after="60"/>
+        <w:spacing w:after="0" w:line="240" w:lineRule="auto"/>
+        <w:tabs>
+          <w:tab w:val="right" w:leader="dot" w:pos="9360"/>
+        </w:tabs>
+      </w:pPr>
+      <w:r>
+        <w:t>Structured project profile contract</w:t>
+      </w:r>
+      <w:r>
+        <w:tab/>
+        <w:t>11</w:t>
+      </w:r>
+    </w:p>
+    <w:p>
+      <w:pPr>
+        <w:spacing w:after="0" w:line="240" w:lineRule="auto"/>
+        <w:tabs>
+          <w:tab w:val="right" w:leader="dot" w:pos="9360"/>
+        </w:tabs>
+      </w:pPr>
+      <w:r>
+        <w:t>Quality analysis and revision comparison</w:t>
+      </w:r>
+      <w:r>
+        <w:tab/>
+        <w:t>12</w:t>
+      </w:r>
+    </w:p>
+    <w:p>
+      <w:pPr>
+        <w:spacing w:after="0" w:line="240" w:lineRule="auto"/>
         <w:tabs>
           <w:tab w:val="right" w:leader="dot" w:pos="9360"/>
         </w:tabs>
@@ -434,7 +464,7 @@
       </w:r>
       <w:r>
         <w:tab/>
-        <w:t>11</w:t>
+        <w:t>12</w:t>
       </w:r>
     </w:p>
     <w:p>
@@ -467,7 +497,7 @@
     </w:p>
     <w:p>
       <w:r>
-        <w:t>All application controls are serialized in DPH.UI.Main.fmx and editable in the IDE. List contents and paint-box geometry are data projections. No scanned component class is instantiated. Avoid adding runtime-only controls, Pascal class helpers or an alternative authoritative store without explicit authorization.</w:t>
+        <w:t>Application controls are serialized in DPH.UI.Main.fmx and DPH.UI.ProjectProfile.fmx and editable in the IDE. List contents and paint-box geometry are data projections. No scanned component class is instantiated. Avoid adding runtime-only controls, Pascal class helpers or an alternative authoritative store without explicit authorization.</w:t>
       </w:r>
     </w:p>
     <w:p>
@@ -508,7 +538,7 @@
     </w:p>
     <w:p>
       <w:r>
-        <w:t>Deploy the executable, all eight immutable migration files, and the architecture-matched WebView2Loader.dll. The reviewed Microsoft WebView2 SDK package is pinned to 1.0.4258.31; retain tools/WebView2/LICENSE.txt with binary redistribution. The browser loads the DLL by its absolute executable-folder path and activates Edge only when preview is requested. There is no intended IE fallback.</w:t>
+        <w:t>Deploy the executable, all nine immutable migration files, and the architecture-matched WebView2Loader.dll. The reviewed Microsoft WebView2 SDK package is pinned to 1.0.4258.31; retain tools/WebView2/LICENSE.txt with binary redistribution. The browser loads the DLL by its absolute executable-folder path and activates Edge only when preview is requested. There is no intended IE fallback.</w:t>
       </w:r>
     </w:p>
     <w:p>
@@ -618,7 +648,7 @@
     </w:p>
     <w:p>
       <w:r>
-        <w:t>Schema 8 is created through eight checksum-verified migrations. Existing migration text is immutable. A newer incompatible schema is rejected safely. Failed upgrade DDL and ledger changes roll back, and an upgrade from an existing schema makes a recoverable pre-migration database backup. Interrupted running generations recover as failed, preserving the previous published head.</w:t>
+        <w:t>Schema 9 is created through nine checksum-verified migrations. Existing migration text is immutable. A newer incompatible schema is rejected safely. Failed upgrade DDL and ledger changes roll back, and an upgrade from an existing schema makes a recoverable pre-migration database backup. Interrupted running generations recover as failed, preserving the previous published head.</w:t>
       </w:r>
     </w:p>
     <w:p>
@@ -843,7 +873,7 @@
     </w:p>
     <w:p>
       <w:r>
-        <w:t>Schema 8 uses checksum-verified migrations 001 through 008. document_section_versions associates immutable authored revisions with stable section ID, document kind, audience and source generation. knowledge_revision_links preserves ordinal, target kind/identity, captured generation, role and label. knowledge_questions preserves the exact deterministic question identity and captured JSON associated with a response record.</w:t>
+        <w:t>Schema 9 uses checksum-verified migrations 001 through 009. document_section_versions associates immutable authored revisions with stable section ID, document kind, audience and source generation. knowledge_revision_links preserves ordinal, target kind/identity, captured generation, role and label. knowledge_questions preserves the exact deterministic question identity and captured JSON associated with a response record.</w:t>
       </w:r>
     </w:p>
     <w:p>
@@ -973,7 +1003,7 @@
     </w:p>
     <w:p>
       <w:r>
-        <w:t>DPH-LEARNING-6 publication writes localization.json and, when a locale is requested, a hashed HTML page and Localized_Sections.docx. Verified exact-revision cache entries are eligible only while the canonical source section is reviewed and has no pending tasks. Redacted source bodies use source fallback. The supplementary document explicitly limits its scope to authored bodies.</w:t>
+        <w:t>DPH-LEARNING-7 publication writes localization.json and, when a locale is requested, a hashed HTML page and Localized_Sections.docx. Verified exact-revision cache entries are eligible only while the canonical source section is reviewed and has no pending tasks. Redacted source bodies use source fallback. The supplementary document explicitly limits its scope to authored bodies.</w:t>
       </w:r>
     </w:p>
     <w:p>
@@ -1014,6 +1044,52 @@
         <w:pStyle w:val="Heading1"/>
       </w:pPr>
       <w:r>
+        <w:t>Structured project profile contract</w:t>
+      </w:r>
+    </w:p>
+    <w:p>
+      <w:r>
+        <w:t>Migration 009 adds an object-valued structured_json field to append-only knowledge revisions. TDPHProjectProfile validates 15 known text fields, required purpose and attribution, per-field bounds and a 64 KiB record bound. SaveKnowledge enforces stable project scope, title, kind and generated body, prevents ordinary-record conversion, duplicate profiles and loss of typed data, and preserves structured fields during named review and continuity revisions. Publication decodes typed metadata before recursive redaction, including revision history.</w:t>
+      </w:r>
+    </w:p>
+    <w:p>
+      <w:r>
+        <w:t>DPH.UI.ProjectProfile.fmx defines every editor control at design time. Apply returns an attributed draft to the existing Knowledge save pipeline. It does not bypass unsaved-edit guards or automatically approve information. tests\DPH.Tests.Phase1.dpr verifies persistence, review, stale editors, history, field bounds and native form behavior; publishing regressions check canonical, HTML and DOCX inclusion.</w:t>
+      </w:r>
+    </w:p>
+    <w:p>
+      <w:pPr>
+        <w:pStyle w:val="Heading1"/>
+      </w:pPr>
+      <w:r>
+        <w:t>Quality analysis and revision comparison</w:t>
+      </w:r>
+    </w:p>
+    <w:p>
+      <w:r>
+        <w:t>DPH.Analysis.Quality emits DPH-QUALITY-1 evidence during workspace capture. Routine metrics, eligible token-body equality, conservative missing-inbound and disconnected-CFG findings, and iterative call-graph strongly connected components use captured inputs only. The worker invalidates an older connected cache without this analyzer version. All findings remain qualified candidates.</w:t>
+      </w:r>
+    </w:p>
+    <w:p>
+      <w:r>
+        <w:t>DPH.Workspace.Comparison compares two hash-verified retained captures from the same project database. It rejects differing selection and syntax or semantic analyzer contracts. Deterministic identity indexes distinguish file changes, symbol additions or removals, captured structure changes and file-only changes. Routine-local flow numbering avoids global node-number shifts. Results use filtered 200-row pages; individual structure displays are limited to 4000 characters with full-content structure hashes and explicit truncation.</w:t>
+      </w:r>
+    </w:p>
+    <w:p>
+      <w:r>
+        <w:t>Comparison runs on the existing background worker. It reads retained database artifacts rather than current selected source files. Native comparison controls and evidence panes are declared in DPH.UI.Main.fmx. tests\DPH.Tests.Comparison.dpr checks literal-expression changes, unchanged neighboring routines, flow-edge rewiring, identity changes, contract rejection, pages, native panes, worker loading and missing caches.</w:t>
+      </w:r>
+    </w:p>
+    <w:p>
+      <w:r>
+        <w:t>The Phase 1 traceability ledger preserves the supplied requirements and limitations. Source comparison remains partial until optional historical source retention supports actual source-text differences; captured structural comparison must never be described as reconstructing those bytes. Human business answers and independent first-time-user acceptance remain separate evidence.</w:t>
+      </w:r>
+    </w:p>
+    <w:p>
+      <w:pPr>
+        <w:pStyle w:val="Heading1"/>
+      </w:pPr>
+      <w:r>
         <w:t>Source and revision evidence</w:t>
       </w:r>
     </w:p>
@@ -1127,6 +1203,26 @@
         <w:keepNext/>
       </w:pPr>
       <w:r>
+        <w:t>DPH.Analysis.Quality.pas</w:t>
+      </w:r>
+    </w:p>
+    <w:p>
+      <w:pPr>
+        <w:spacing w:after="60"/>
+      </w:pPr>
+      <w:r>
+        <w:rPr>
+          <w:rFonts w:ascii="Consolas" w:hAnsi="Consolas"/>
+          <w:sz w:val="16"/>
+        </w:rPr>
+        <w:t>50196d33a8d15cfeb52528dde93a2bfdc22b153e2533830b08e3ac097e14fd82</w:t>
+      </w:r>
+    </w:p>
+    <w:p>
+      <w:pPr>
+        <w:keepNext/>
+      </w:pPr>
+      <w:r>
         <w:t>DPH.Analysis.SQL.pas</w:t>
       </w:r>
     </w:p>
@@ -1167,6 +1263,26 @@
         <w:keepNext/>
       </w:pPr>
       <w:r>
+        <w:t>DPH.Knowledge.ProjectProfile.pas</w:t>
+      </w:r>
+    </w:p>
+    <w:p>
+      <w:pPr>
+        <w:spacing w:after="60"/>
+      </w:pPr>
+      <w:r>
+        <w:rPr>
+          <w:rFonts w:ascii="Consolas" w:hAnsi="Consolas"/>
+          <w:sz w:val="16"/>
+        </w:rPr>
+        <w:t>e901a58b02c2aafe2cc21df4da7dced2807a9cc8840c325c72d9db64cedc44bd</w:t>
+      </w:r>
+    </w:p>
+    <w:p>
+      <w:pPr>
+        <w:keepNext/>
+      </w:pPr>
+      <w:r>
         <w:t>DPH.Parse.Forms.pas</w:t>
       </w:r>
     </w:p>
@@ -1399,7 +1515,7 @@
           <w:rFonts w:ascii="Consolas" w:hAnsi="Consolas"/>
           <w:sz w:val="16"/>
         </w:rPr>
-        <w:t>396585941e2989ed400da1d038bef376fb3555b7cc58e7d64926ec770447aa90</w:t>
+        <w:t>0735d735071144464f0d35d6a5886d4a3d6a04e09f7276f2d26306f8451797d0</w:t>
       </w:r>
     </w:p>
     <w:p>
@@ -1459,7 +1575,7 @@
           <w:rFonts w:ascii="Consolas" w:hAnsi="Consolas"/>
           <w:sz w:val="16"/>
         </w:rPr>
-        <w:t>b05f869126267e7c0e3b27152b70c90a5f82f417180688982d8b8ffc59d305f1</w:t>
+        <w:t>1eb84775bb84acd3d0fa4c437f1144ea615aaba29ce345dee45279d11f7d942c</w:t>
       </w:r>
     </w:p>
     <w:p>
@@ -1499,7 +1615,27 @@
           <w:rFonts w:ascii="Consolas" w:hAnsi="Consolas"/>
           <w:sz w:val="16"/>
         </w:rPr>
-        <w:t>26e8447174114031f562a85aad5b3928bc99f7fb1b8cb1ce910a725faf4c7b74</w:t>
+        <w:t>c920b3797237e058de777fd8c9142711be4a75157e5de95b087811e3b3e7484f</w:t>
+      </w:r>
+    </w:p>
+    <w:p>
+      <w:pPr>
+        <w:keepNext/>
+      </w:pPr>
+      <w:r>
+        <w:t>DPH.UI.ProjectProfile.pas</w:t>
+      </w:r>
+    </w:p>
+    <w:p>
+      <w:pPr>
+        <w:spacing w:after="60"/>
+      </w:pPr>
+      <w:r>
+        <w:rPr>
+          <w:rFonts w:ascii="Consolas" w:hAnsi="Consolas"/>
+          <w:sz w:val="16"/>
+        </w:rPr>
+        <w:t>f3fe7ed94987e956999e7449887cd8ca259f009b3d4ac934c1e8e09b8e9fab59</w:t>
       </w:r>
     </w:p>
     <w:p>
@@ -1527,6 +1663,26 @@
         <w:keepNext/>
       </w:pPr>
       <w:r>
+        <w:t>DPH.Workspace.Comparison.pas</w:t>
+      </w:r>
+    </w:p>
+    <w:p>
+      <w:pPr>
+        <w:spacing w:after="60"/>
+      </w:pPr>
+      <w:r>
+        <w:rPr>
+          <w:rFonts w:ascii="Consolas" w:hAnsi="Consolas"/>
+          <w:sz w:val="16"/>
+        </w:rPr>
+        <w:t>d4953d401b70fbe65b8b9b9fe387431cb7e2c84afc5dab5c9170deafe9ceacce</w:t>
+      </w:r>
+    </w:p>
+    <w:p>
+      <w:pPr>
+        <w:keepNext/>
+      </w:pPr>
+      <w:r>
         <w:t>DPH.Workspace.Graphs.pas</w:t>
       </w:r>
     </w:p>
@@ -1559,7 +1715,7 @@
           <w:rFonts w:ascii="Consolas" w:hAnsi="Consolas"/>
           <w:sz w:val="16"/>
         </w:rPr>
-        <w:t>c29fb1d8f45c7d96ab12a99540d26267e5d4d59c152dcf1913adb8c62843cb06</w:t>
+        <w:t>f18fa20929086773718f5bb6f13f70443a767db8295e6bb5dcbf6353168adb31</w:t>
       </w:r>
     </w:p>
     <w:p>
@@ -1599,7 +1755,7 @@
           <w:rFonts w:ascii="Consolas" w:hAnsi="Consolas"/>
           <w:sz w:val="16"/>
         </w:rPr>
-        <w:t>4be99ff95017aa6afeca61bca566575b189637b3cdf9d62ae28086666f2039d6</w:t>
+        <w:t>3818fff9f49e530546653f7ad39108a9ee83f79de69ead6306894ef8ddc1e2ab</w:t>
       </w:r>
     </w:p>
     <w:p>
@@ -1619,7 +1775,27 @@
           <w:rFonts w:ascii="Consolas" w:hAnsi="Consolas"/>
           <w:sz w:val="16"/>
         </w:rPr>
-        <w:t>14dc96efcf375dea3bc8a11e9d97005e2e632ef0b95eb93d9d599b1a8da7e35d</w:t>
+        <w:t>864963a1ea7745548365d16318359c7a4a807099e1d8f054ed098ca5440f3e24</w:t>
+      </w:r>
+    </w:p>
+    <w:p>
+      <w:pPr>
+        <w:keepNext/>
+      </w:pPr>
+      <w:r>
+        <w:t>DPH.UI.ProjectProfile.fmx</w:t>
+      </w:r>
+    </w:p>
+    <w:p>
+      <w:pPr>
+        <w:spacing w:after="60"/>
+      </w:pPr>
+      <w:r>
+        <w:rPr>
+          <w:rFonts w:ascii="Consolas" w:hAnsi="Consolas"/>
+          <w:sz w:val="16"/>
+        </w:rPr>
+        <w:t>62e7fef97972fdb29f1a878e70a99d8284b6f7d8cfbddb9f625bb535728c2142</w:t>
       </w:r>
     </w:p>
     <w:p>
@@ -1659,7 +1835,7 @@
           <w:rFonts w:ascii="Consolas" w:hAnsi="Consolas"/>
           <w:sz w:val="16"/>
         </w:rPr>
-        <w:t>ecd4515cbc6a46e3d444d0af41aa7e3d3484f2d3d6f79a548891052ddd8efba7</w:t>
+        <w:t>450da3418a6581ba50d250b9c7d7e7db1ac9ad0b6756a3a66182852c6df02a05</w:t>
       </w:r>
     </w:p>
     <w:sectPr>

</xml_diff>

<commit_message>
Inspect selected project-group members and declared output kinds with source evidence
</commit_message>
<xml_diff>
--- a/docs/guides/DPH_Engineering_Guide.docx
+++ b/docs/guides/DPH_Engineering_Guide.docx
@@ -1049,6 +1049,11 @@
     </w:p>
     <w:p>
       <w:r>
+        <w:t>TDPHWorkspaceView.ProjectMembers projects captured syntax files into a selected-scope catalog without filesystem discovery. DPH.UI.Main.fmx defines separate Known databases and Selected project subpages, with a native list and evidence memo. Program, library and package declarations retain source references; project properties and references retain captured values and child conditions. Parent conditions may apply even when a child has none recorded. tests\DPH.Tests.ProjectCatalog.dpr checks a selected group, missing referenced project, output kinds, settings, native selection and input immutability.</w:t>
+      </w:r>
+    </w:p>
+    <w:p>
+      <w:r>
         <w:t>Migration 009 adds an object-valued structured_json field to append-only knowledge revisions. TDPHProjectProfile validates 15 known text fields, required purpose and attribution, per-field bounds and a 64 KiB record bound. SaveKnowledge enforces stable project scope, title, kind and generated body, prevents ordinary-record conversion, duplicate profiles and loss of typed data, and preserves structured fields during named review and continuity revisions. Publication decodes typed metadata before recursive redaction, including revision history.</w:t>
       </w:r>
     </w:p>
@@ -1615,7 +1620,7 @@
           <w:rFonts w:ascii="Consolas" w:hAnsi="Consolas"/>
           <w:sz w:val="16"/>
         </w:rPr>
-        <w:t>c920b3797237e058de777fd8c9142711be4a75157e5de95b087811e3b3e7484f</w:t>
+        <w:t>c7d1b02548f4817015d87cc44a6dfba5616826b7a97eb2802e75a7384f1b0a61</w:t>
       </w:r>
     </w:p>
     <w:p>
@@ -1715,7 +1720,7 @@
           <w:rFonts w:ascii="Consolas" w:hAnsi="Consolas"/>
           <w:sz w:val="16"/>
         </w:rPr>
-        <w:t>f18fa20929086773718f5bb6f13f70443a767db8295e6bb5dcbf6353168adb31</w:t>
+        <w:t>03bbe5a9dc0943758be56898659bff9381ccb0707cf22a449e5c8e158a8b82bf</w:t>
       </w:r>
     </w:p>
     <w:p>
@@ -1775,7 +1780,7 @@
           <w:rFonts w:ascii="Consolas" w:hAnsi="Consolas"/>
           <w:sz w:val="16"/>
         </w:rPr>
-        <w:t>864963a1ea7745548365d16318359c7a4a807099e1d8f054ed098ca5440f3e24</w:t>
+        <w:t>134c4bcbe68b7056ea09b2e73696749bf4ab5e91a37287811f9d57d2e62fa3aa</w:t>
       </w:r>
     </w:p>
     <w:p>

</xml_diff>

<commit_message>
Implement project business glossary with revisioned review, search and shared publication
</commit_message>
<xml_diff>
--- a/docs/guides/DPH_Engineering_Guide.docx
+++ b/docs/guides/DPH_Engineering_Guide.docx
@@ -400,7 +400,7 @@
         </w:tabs>
       </w:pPr>
       <w:r>
-        <w:t>Offline translation and localized publication</w:t>
+        <w:t>Business glossary implementation and checks</w:t>
       </w:r>
       <w:r>
         <w:tab/>
@@ -415,7 +415,7 @@
         </w:tabs>
       </w:pPr>
       <w:r>
-        <w:t>Native validation and release evidence</w:t>
+        <w:t>Offline translation and localized publication</w:t>
       </w:r>
       <w:r>
         <w:tab/>
@@ -430,11 +430,11 @@
         </w:tabs>
       </w:pPr>
       <w:r>
-        <w:t>Structured project profile contract</w:t>
+        <w:t>Native validation and release evidence</w:t>
       </w:r>
       <w:r>
         <w:tab/>
-        <w:t>11</w:t>
+        <w:t>12</w:t>
       </w:r>
     </w:p>
     <w:p>
@@ -445,7 +445,7 @@
         </w:tabs>
       </w:pPr>
       <w:r>
-        <w:t>Quality analysis and revision comparison</w:t>
+        <w:t>Structured project profile contract</w:t>
       </w:r>
       <w:r>
         <w:tab/>
@@ -460,527 +460,580 @@
         </w:tabs>
       </w:pPr>
       <w:r>
-        <w:t>Source and revision evidence</w:t>
+        <w:t>Quality analysis and revision comparison</w:t>
       </w:r>
       <w:r>
         <w:tab/>
-        <w:t>12</w:t>
+        <w:t>13</w:t>
       </w:r>
     </w:p>
     <w:p>
-      <w:r>
-        <w:fldChar w:fldCharType="end"/>
+      <w:pPr>
+        <w:spacing w:after="0" w:line="240" w:lineRule="auto"/>
+        <w:tabs>
+          <w:tab w:val="right" w:leader="dot" w:pos="9360"/>
+        </w:tabs>
+      </w:pPr>
+      <w:r>
+        <w:t>Source and revision evidence</w:t>
+      </w:r>
+      <w:r>
+        <w:tab/>
+        <w:t>13</w:t>
       </w:r>
     </w:p>
     <w:p>
       <w:r>
-        <w:br w:type="page"/>
+        <w:fldChar w:fldCharType="end"/>
       </w:r>
     </w:p>
     <w:p>
-      <w:pPr>
-        <w:pStyle w:val="Heading1"/>
-      </w:pPr>
-      <w:r>
-        <w:t>Architecture and boundaries</w:t>
+      <w:r>
+        <w:br w:type="page"/>
       </w:r>
     </w:p>
     <w:p>
-      <w:r>
-        <w:t>DPH is an independent Delphi FMX application. It has no converter runtime or build dependency. The pinned VCL2FMXConverter v6.0.0 corpus is test input only, at commit e1fd10b2d3b06f2fc3f726b8eb7f234a54faf63d. No converter source was copied into the current analyzer. Preserve the original planning documents and global agents.md byte for byte.</w:t>
+      <w:pPr>
+        <w:pStyle w:val="Heading1"/>
+      </w:pPr>
+      <w:r>
+        <w:t>Architecture and boundaries</w:t>
       </w:r>
     </w:p>
     <w:p>
       <w:r>
-        <w:t>The pipeline is selected project, bounded inventory, read-only byte acquisition, lexical and conditional processing, Pascal and form IR, semantic relationships and control flow, revision-consistent SQLite capture, cached workspace projection, curated knowledge and derived publication. Contract data remains separate from FMX. Every unsupported construct or unavailable dependency must remain diagnosable rather than being promoted into false completeness.</w:t>
+        <w:t>DPH is an independent Delphi FMX application. It has no converter runtime or build dependency. The pinned VCL2FMXConverter v6.0.0 corpus is test input only, at commit e1fd10b2d3b06f2fc3f726b8eb7f234a54faf63d. No converter source was copied into the current analyzer. Preserve the original planning documents and global agents.md byte for byte.</w:t>
       </w:r>
     </w:p>
     <w:p>
       <w:r>
-        <w:t>Application controls are serialized in DPH.UI.Main.fmx and DPH.UI.ProjectProfile.fmx and editable in the IDE. List contents and paint-box geometry are data projections. No scanned component class is instantiated. Avoid adding runtime-only controls, Pascal class helpers or an alternative authoritative store without explicit authorization.</w:t>
+        <w:t>The pipeline is selected project, bounded inventory, read-only byte acquisition, lexical and conditional processing, Pascal and form IR, semantic relationships and control flow, revision-consistent SQLite capture, cached workspace projection, curated knowledge and derived publication. Contract data remains separate from FMX. Every unsupported construct or unavailable dependency must remain diagnosable rather than being promoted into false completeness.</w:t>
       </w:r>
     </w:p>
     <w:p>
-      <w:pPr>
-        <w:pStyle w:val="Heading1"/>
-      </w:pPr>
-      <w:r>
-        <w:t>Rework and acceptance status</w:t>
+      <w:r>
+        <w:t>Application controls are serialized in DPH.UI.Main.fmx, DPH.UI.ProjectProfile.fmx and DPH.UI.Glossary.fmx and editable in the IDE. List contents and paint-box geometry are data projections. No scanned component class is instantiated. Avoid adding runtime-only controls, Pascal class helpers or an alternative authoritative store without explicit authorization.</w:t>
       </w:r>
     </w:p>
     <w:p>
-      <w:r>
-        <w:t>The owner rejected the earlier WP7 delivery as inadequate for learning and handoff. The statement that implementation through WP7 was complete has been withdrawn. docs/Rework_Requirements_Audit.txt compares the original plan with the implemented product and outstanding work. Historical WP reports remain historical evidence, not acceptance of the reworked experience.</w:t>
+      <w:pPr>
+        <w:pStyle w:val="Heading1"/>
+      </w:pPr>
+      <w:r>
+        <w:t>Rework and acceptance status</w:t>
       </w:r>
     </w:p>
     <w:p>
       <w:r>
-        <w:t>The rework adds a first-launch Getting started course, deterministic explanation engine, guided learning workspace, source-comment context, event traces, labeled and collapsed procedure-flow views, attributed screenshot imports and richer project-specific publication. Run tools/build-learning.cmd with an optional pinned reference database path for dedicated learning and real-WebView2 tests. The source-based first-time-programmer exercise still needs a human participant.</w:t>
+        <w:t>The owner rejected the earlier WP7 delivery as inadequate for learning and handoff. The statement that implementation through WP7 was complete has been withdrawn. docs/Rework_Requirements_Audit.txt compares the original plan with the implemented product and outstanding work. Historical WP reports remain historical evidence, not acceptance of the reworked experience.</w:t>
       </w:r>
     </w:p>
     <w:p>
       <w:r>
-        <w:t>The implementation tracker records expanded semantic reuse, resource interpretation and retention/continuity controls. Their documented bounds still apply. Source safety, privacy, attribution and exact generation links are retained. Do not turn an automated pass count into a claim that every requirement or the human onboarding goal is finished.</w:t>
+        <w:t>The rework adds a first-launch Getting started course, deterministic explanation engine, guided learning workspace, source-comment context, event traces, labeled and collapsed procedure-flow views, attributed screenshot imports and richer project-specific publication. Run tools/build-learning.cmd with an optional pinned reference database path for dedicated learning and real-WebView2 tests. The source-based first-time-programmer exercise still needs a human participant.</w:t>
       </w:r>
     </w:p>
     <w:p>
-      <w:pPr>
-        <w:pStyle w:val="Heading1"/>
-      </w:pPr>
-      <w:r>
-        <w:t>Build and deployment</w:t>
+      <w:r>
+        <w:t>The implementation tracker records expanded semantic reuse, resource interpretation and retention/continuity controls. Their documented bounds still apply. Source safety, privacy, attribution and exact generation links are retained. Do not turn an automated pass count into a claim that every requirement or the human onboarding goal is finished.</w:t>
       </w:r>
     </w:p>
     <w:p>
-      <w:r>
-        <w:t>The installed compiler is RAD Studio 37.0.59082.6021. Load C:\Program Files (x86)\Embarcadero\Studio\37.0\bin\rsvars.bat before compiling. tools/build-wp0.cmd builds DelphiProjectHandoff.dproj with elevated MSBuild and runs the FMX resource smoke test. Output is bin/Win32/Debug, with DCUs in dcu/Win32/Debug. The initial executable target is Windows Win32.</w:t>
+      <w:pPr>
+        <w:pStyle w:val="Heading1"/>
+      </w:pPr>
+      <w:r>
+        <w:t>Build and deployment</w:t>
       </w:r>
     </w:p>
     <w:p>
       <w:r>
-        <w:t>Deploy the executable, all nine immutable migration files, and the architecture-matched WebView2Loader.dll. The reviewed Microsoft WebView2 SDK package is pinned to 1.0.4258.31; retain tools/WebView2/LICENSE.txt with binary redistribution. The browser loads the DLL by its absolute executable-folder path and activates Edge only when preview is requested. There is no intended IE fallback.</w:t>
+        <w:t>The installed compiler is RAD Studio 37.0.59082.6021. Load C:\Program Files (x86)\Embarcadero\Studio\37.0\bin\rsvars.bat before compiling. tools/build-wp0.cmd builds DelphiProjectHandoff.dproj with elevated MSBuild and runs the FMX resource smoke test. Output is bin/Win32/Debug, with DCUs in dcu/Win32/Debug. The initial executable target is Windows Win32.</w:t>
       </w:r>
     </w:p>
     <w:p>
       <w:r>
-        <w:t>The repository standard folders include bin, dcu, docs/guides, docs/pdf, export, help, images and icons, samples, source distributions and tools. Deploy help/index.html for first-launch education. Reference source and generated test databases remain ignored. Use the explicitly approved Python 3.13 executable for project tooling and the installed LibreOffice, never Microsoft Word.</w:t>
+        <w:t>Deploy the executable, all nine immutable migration files, and the architecture-matched WebView2Loader.dll. The reviewed Microsoft WebView2 SDK package is pinned to 1.0.4258.31; retain tools/WebView2/LICENSE.txt with binary redistribution. The browser loads the DLL by its absolute executable-folder path and activates Edge only when preview is requested. There is no intended IE fallback.</w:t>
       </w:r>
     </w:p>
     <w:p>
-      <w:pPr>
-        <w:pStyle w:val="Heading1"/>
-      </w:pPr>
-      <w:r>
-        <w:t>Input acquisition and project scope</w:t>
+      <w:r>
+        <w:t>The repository standard folders include bin, dcu, docs/guides, docs/pdf, export, help, images and icons, samples, source distributions and tools. Deploy help/index.html for first-launch education. Reference source and generated test databases remain ignored. Use the explicitly approved Python 3.13 executable for project tooling and the installed LibreOffice, never Microsoft Word.</w:t>
       </w:r>
     </w:p>
     <w:p>
-      <w:r>
-        <w:t>DPH.Project.Inventory follows the selected project, explicit references, uses clauses, include paths and approved external roots. Project XML is passive: targets and imported build scripts are not executed. Canonical paths are project relative and normalized; traversal, ambiguous macros, reparse paths, cycles and oversized acquisition are rejected or diagnosed. A repository-wide count of Pascal files is not the build scope.</w:t>
+      <w:pPr>
+        <w:pStyle w:val="Heading1"/>
+      </w:pPr>
+      <w:r>
+        <w:t>Input acquisition and project scope</w:t>
       </w:r>
     </w:p>
     <w:p>
       <w:r>
-        <w:t>DPH.Project.Source opens input read only, checks the final opened Windows handle path, captures bytes, records SHA256 and verifies decoding by round trip. Unicode byte offsets, line endings and explicit legacy encodings remain in the evidence contract. The maximum acquired source is 16 MiB. Binary forms are parsed as data; unsupported resources remain gaps.</w:t>
+        <w:t>DPH.Project.Inventory follows the selected project, explicit references, uses clauses, include paths and approved external roots. Project XML is passive: targets and imported build scripts are not executed. Canonical paths are project relative and normalized; traversal, ambiguous macros, reparse paths, cycles and oversized acquisition are rejected or diagnosed. A repository-wide count of Pascal files is not the build scope.</w:t>
       </w:r>
     </w:p>
     <w:p>
       <w:r>
-        <w:t>A source viewer must re-acquire the live file and match the captured hash before using a cached range. Externally referenced sources use their explicit canonical inventory identity. Never invent a neighboring source path from a cached filename or execute input to fill an analysis gap.</w:t>
+        <w:t>DPH.Project.Source opens input read only, checks the final opened Windows handle path, captures bytes, records SHA256 and verifies decoding by round trip. Unicode byte offsets, line endings and explicit legacy encodings remain in the evidence contract. The maximum acquired source is 16 MiB. Binary forms are parsed as data; unsupported resources remain gaps.</w:t>
       </w:r>
     </w:p>
     <w:p>
-      <w:pPr>
-        <w:pStyle w:val="Heading1"/>
-      </w:pPr>
-      <w:r>
-        <w:t>Syntax contracts and limits</w:t>
+      <w:r>
+        <w:t>A source viewer must re-acquire the live file and match the captured hash before using a cached range. Externally referenced sources use their explicit canonical inventory identity. Never invent a neighboring source path from a cached filename or execute input to fill an analysis gap.</w:t>
       </w:r>
     </w:p>
     <w:p>
-      <w:r>
-        <w:t>DPH.Parse.Model defines IR schema 1, analyzer DPH-WP2-5, token and node limits, source ranges and diagnostics. Lexing preserves original tokens and conditional information. Preprocessing evaluates supported expressions, explicit defines and includes while retaining uncertainty for unknown branches. An unavailable compiler symbol is not automatically a false condition.</w:t>
+      <w:pPr>
+        <w:pStyle w:val="Heading1"/>
+      </w:pPr>
+      <w:r>
+        <w:t>Syntax contracts and limits</w:t>
       </w:r>
     </w:p>
     <w:p>
       <w:r>
-        <w:t>The Pascal parser extracts declarations, routines, anonymous methods and supported statements into IR. Declaration and implementation occurrences remain distinguishable before semantic unification. The form parser accepts supported text and binary DFM/FMX structures without loading component packages. The inventory reads relevant project configuration and resources through bounded adapters.</w:t>
+        <w:t>DPH.Parse.Model defines IR schema 1, analyzer DPH-WP2-5, token and node limits, source ranges and diagnostics. Lexing preserves original tokens and conditional information. Preprocessing evaluates supported expressions, explicit defines and includes while retaining uncertainty for unknown branches. An unavailable compiler symbol is not automatically a false condition.</w:t>
       </w:r>
     </w:p>
     <w:p>
       <w:r>
-        <w:t>Current bounds include 250000 tokens, 100000 IR nodes, nesting 128 and 10000 diagnostics. Opaque assembler, malformed syntax and unsupported grammar are partial. Tests use exact golden IR, encoding edge cases, cyclic includes, passive malicious imports and changed source. Maintain source byte ranges and diagnostics when extending support.</w:t>
+        <w:t>The Pascal parser extracts declarations, routines, anonymous methods and supported statements into IR. Declaration and implementation occurrences remain distinguishable before semantic unification. The form parser accepts supported text and binary DFM/FMX structures without loading component packages. The inventory reads relevant project configuration and resources through bounded adapters.</w:t>
       </w:r>
     </w:p>
     <w:p>
-      <w:pPr>
-        <w:pStyle w:val="Heading1"/>
-      </w:pPr>
-      <w:r>
-        <w:t>Symbols and typed relationships</w:t>
+      <w:r>
+        <w:t>Current bounds include 250000 tokens, 100000 IR nodes, nesting 128 and 10000 diagnostics. Opaque assembler, malformed syntax and unsupported grammar are partial. Tests use exact golden IR, encoding edge cases, cyclic includes, passive malicious imports and changed source. Maintain source byte ranges and diagnostics when extending support.</w:t>
       </w:r>
     </w:p>
     <w:p>
-      <w:r>
-        <w:t>DPH.Analysis.Model defines semantic schema 1 and analyzer DPH-WP3-11. Stable symbol keys contain qualified identity, signature and conditional variant. DPH.Analysis.Symbols unifies supported routine prototypes and bodies, resolves cross-unit declarations, typed receivers and suitable overloads, associates form events and records anonymous callbacks.</w:t>
+      <w:pPr>
+        <w:pStyle w:val="Heading1"/>
+      </w:pPr>
+      <w:r>
+        <w:t>Symbols and typed relationships</w:t>
       </w:r>
     </w:p>
     <w:p>
       <w:r>
-        <w:t>Relationship certainty is confirmed_static, possible_dynamic, inferred, runtime_observed or unresolved. Passive scanning never claims runtime_observed. A uses dependency is not a call. Known lexical calls, serialized bindings and declared types carry derivation rules and source ranges. Recognized asynchronous API spelling can establish a possible scheduling relationship without proving execution order.</w:t>
+        <w:t>DPH.Analysis.Model defines semantic schema 1 and analyzer DPH-WP3-11. Stable symbol keys contain qualified identity, signature and conditional variant. DPH.Analysis.Symbols unifies supported routine prototypes and bodies, resolves cross-unit declarations, typed receivers and suitable overloads, associates form events and records anonymous callbacks.</w:t>
       </w:r>
     </w:p>
     <w:p>
       <w:r>
-        <w:t>Method pointers, unresolved receivers, dynamic dispatch, generated types and framework behavior must retain uncertainty. Basic reads, writes, callback assignment, static SQL spelling and report-model rendering are conservative analyses. Renames are distinct identities until continuity is reviewed; offsets alone must not reassign knowledge.</w:t>
+        <w:t>Relationship certainty is confirmed_static, possible_dynamic, inferred, runtime_observed or unresolved. Passive scanning never claims runtime_observed. A uses dependency is not a call. Known lexical calls, serialized bindings and declared types carry derivation rules and source ranges. Recognized asynchronous API spelling can establish a possible scheduling relationship without proving execution order.</w:t>
       </w:r>
     </w:p>
     <w:p>
-      <w:pPr>
-        <w:pStyle w:val="Heading1"/>
-      </w:pPr>
-      <w:r>
-        <w:t>Control flow and impact</w:t>
+      <w:r>
+        <w:t>Method pointers, unresolved receivers, dynamic dispatch, generated types and framework behavior must retain uncertainty. Basic reads, writes, callback assignment, static SQL spelling and report-model rendering are conservative analyses. Renames are distinct identities until continuity is reviewed; offsets alone must not reassign knowledge.</w:t>
       </w:r>
     </w:p>
     <w:p>
-      <w:r>
-        <w:t>DPH.Analysis.Flow builds per-routine control-flow nodes and typed edges for supported sequences, branches, loops, returns and exception/finally paths. Routine identity, source hash, range, node kind and expression remain available to inspectors and exports. Flow is bounded to 100000 nodes, 300000 edges and nesting 128.</w:t>
+      <w:pPr>
+        <w:pStyle w:val="Heading1"/>
+      </w:pPr>
+      <w:r>
+        <w:t>Control flow and impact</w:t>
       </w:r>
     </w:p>
     <w:p>
       <w:r>
-        <w:t>Impact traversal is possible reachability through supported relationships. Do not label it proved runtime impact. The UI bounds a displayed graph to 120 nodes and 960 edges, while the stored semantic graph is the fuller evidence model. Uncertain edges remain visually distinct. Unsupported flow does not become a fabricated successful path.</w:t>
+        <w:t>DPH.Analysis.Flow builds per-routine control-flow nodes and typed edges for supported sequences, branches, loops, returns and exception/finally paths. Routine identity, source hash, range, node kind and expression remain available to inspectors and exports. Flow is bounded to 100000 nodes, 300000 edges and nesting 128.</w:t>
       </w:r>
     </w:p>
     <w:p>
-      <w:pPr>
-        <w:pStyle w:val="Heading1"/>
-      </w:pPr>
-      <w:r>
-        <w:t>SQLite generations and durability</w:t>
+      <w:r>
+        <w:t>Impact traversal is possible reachability through supported relationships. Do not label it proved runtime impact. The UI bounds a displayed graph to 120 nodes and 960 edges, while the stored semantic graph is the fuller evidence model. Uncertain edges remain visually distinct. Unsupported flow does not become a fabricated successful path.</w:t>
       </w:r>
     </w:p>
     <w:p>
-      <w:r>
-        <w:t>TDPHKnowledgeStore owns one FireDAC SQLite connection on its creating thread and serializes writer access through a named mutex. Foreign keys and synchronous FULL are enabled. Default journal mode is DELETE; WAL is an explicit local-store option. Direct cross-thread writes are rejected. SQLite 3.42.0 with FTS5 was measured by the storage tests.</w:t>
+      <w:pPr>
+        <w:pStyle w:val="Heading1"/>
+      </w:pPr>
+      <w:r>
+        <w:t>SQLite generations and durability</w:t>
       </w:r>
     </w:p>
     <w:p>
       <w:r>
-        <w:t>Schema 9 is created through nine checksum-verified migrations. Existing migration text is immutable. A newer incompatible schema is rejected safely. Failed upgrade DDL and ledger changes roll back, and an upgrade from an existing schema makes a recoverable pre-migration database backup. Interrupted running generations recover as failed, preserving the previous published head.</w:t>
+        <w:t>TDPHKnowledgeStore owns one FireDAC SQLite connection on its creating thread and serializes writer access through a named mutex. Foreign keys and synchronous FULL are enabled. Default journal mode is DELETE; WAL is an explicit local-store option. Direct cross-thread writes are rejected. SQLite 3.42.0 with FTS5 was measured by the storage tests.</w:t>
       </w:r>
     </w:p>
     <w:p>
       <w:r>
-        <w:t>ObserveManifest records current fingerprints independently of the capture. BeginGeneration freezes configuration and manifest identity. Syntax and semantic facts are staged in transactions. Before publication, inputs and configuration are revalidated. Only a coherent complete generation becomes the current head. Partial, failed or superseded captures cannot clear the exact-input stale state or overwrite a prior current head.</w:t>
+        <w:t>Schema 9 is created through nine checksum-verified migrations. Existing migration text is immutable. A newer incompatible schema is rejected safely. Failed upgrade DDL and ledger changes roll back, and an upgrade from an existing schema makes a recoverable pre-migration database backup. Interrupted running generations recover as failed, preserving the previous published head.</w:t>
       </w:r>
     </w:p>
     <w:p>
-      <w:pPr>
-        <w:pStyle w:val="Heading1"/>
-      </w:pPr>
-      <w:r>
-        <w:t>Evidence and immutable history</w:t>
+      <w:r>
+        <w:t>ObserveManifest records current fingerprints independently of the capture. BeginGeneration freezes configuration and manifest identity. Syntax and semantic facts are staged in transactions. Before publication, inputs and configuration are revalidated. Only a coherent complete generation becomes the current head. Partial, failed or superseded captures cannot clear the exact-input stale state or overwrite a prior current head.</w:t>
       </w:r>
     </w:p>
     <w:p>
-      <w:r>
-        <w:t>Normalized tables include projects, configurations, source files, file revisions, generations, generation files, entities, entity versions, evidence, relationships, component properties, control-flow nodes and edges, knowledge records and revisions, links, review tasks, translations, artifacts, export jobs and audit events. Foreign keys tie evidence and relationships to their producing generation.</w:t>
+      <w:pPr>
+        <w:pStyle w:val="Heading1"/>
+      </w:pPr>
+      <w:r>
+        <w:t>Evidence and immutable history</w:t>
       </w:r>
     </w:p>
     <w:p>
       <w:r>
-        <w:t>Triggers prevent mutation of terminal generations, source revisions, captured facts, configurations and authored knowledge revisions. Evidence ranges must fit the captured source bytes and use the generation analyzer version. Historical file and entity identities cannot be changed casually. A missing source is retained as missing; its historical annotations survive.</w:t>
+        <w:t>Normalized tables include projects, configurations, source files, file revisions, generations, generation files, entities, entity versions, evidence, relationships, component properties, control-flow nodes and edges, knowledge records and revisions, links, review tasks, translations, artifacts, export jobs and audit events. Foreign keys tie evidence and relationships to their producing generation.</w:t>
       </w:r>
     </w:p>
     <w:p>
       <w:r>
-        <w:t>Modification detected, analysis stale, knowledge review needed, analysis failed and reassessment requested are separate persistent flags. A UI summary is a projection of these states, not a replacement for them. Parser success must not clear human review.</w:t>
+        <w:t>Triggers prevent mutation of terminal generations, source revisions, captured facts, configurations and authored knowledge revisions. Evidence ranges must fit the captured source bytes and use the generation analyzer version. Historical file and entity identities cannot be changed casually. A missing source is retained as missing; its historical annotations survive.</w:t>
       </w:r>
     </w:p>
     <w:p>
-      <w:pPr>
-        <w:pStyle w:val="Heading1"/>
-      </w:pPr>
-      <w:r>
-        <w:t>Background coordination and cached views</w:t>
+      <w:r>
+        <w:t>Modification detected, analysis stale, knowledge review needed, analysis failed and reassessment requested are separate persistent flags. A UI summary is a projection of these states, not a replacement for them. Parser success must not clear human review.</w:t>
       </w:r>
     </w:p>
     <w:p>
-      <w:r>
-        <w:t>DPH.Workspace.Worker is a persistent TThread with bounded request and response queues. It initializes COM for passive MSXML parsing, owns database operations in the worker, and retains analyzer instances across requests. FMX polls responses with a timer, avoiding queued closures that outlive the form.</w:t>
+      <w:pPr>
+        <w:pStyle w:val="Heading1"/>
+      </w:pPr>
+      <w:r>
+        <w:t>Background coordination and cached views</w:t>
       </w:r>
     </w:p>
     <w:p>
       <w:r>
-        <w:t>A stopped Delphi queue can report success while returning an empty item. Poll checks both the wait result and a non-nil response; shutdown tests guard against a destructor loop. Cancellation is checked between stages and marks a staged running generation failed when appropriate. It is not a promise of interruption inside every parser loop.</w:t>
+        <w:t>DPH.Workspace.Worker is a persistent TThread with bounded request and response queues. It initializes COM for passive MSXML parsing, owns database operations in the worker, and retains analyzer instances across requests. FMX polls responses with a timer, avoiding queued closures that outlive the form.</w:t>
       </w:r>
     </w:p>
     <w:p>
       <w:r>
-        <w:t>Workspace projections are managed JSON files in database.dphdb.views named by SHA256 and registered in artifacts. Cached opening verifies the managed path, size, checksum and generation. Cached facts are delivered before automatic verification when the original source entry is available; unavailable source remains detached. Connected checks compare manifest fingerprints and selection identity every ten seconds. Syntax and routine semantic caches are bounded and binding-context aware; conservative postprocessing remains separate from reused routine facts.</w:t>
+        <w:t>A stopped Delphi queue can report success while returning an empty item. Poll checks both the wait result and a non-nil response; shutdown tests guard against a destructor loop. Cancellation is checked between stages and marks a staged running generation failed when appropriate. It is not a promise of interruption inside every parser loop.</w:t>
       </w:r>
     </w:p>
     <w:p>
-      <w:pPr>
-        <w:pStyle w:val="Heading1"/>
-      </w:pPr>
-      <w:r>
-        <w:t>FMX navigation and visualization</w:t>
+      <w:r>
+        <w:t>Workspace projections are managed JSON files in database.dphdb.views named by SHA256 and registered in artifacts. Cached opening verifies the managed path, size, checksum and generation. Cached facts are delivered before automatic verification when the original source entry is available; unavailable source remains detached. Connected checks compare manifest fingerprints and selection identity every ten seconds. Syntax and routine semantic caches are bounded and binding-context aware; conservative postprocessing remains separate from reused routine facts.</w:t>
       </w:r>
     </w:p>
     <w:p>
-      <w:r>
-        <w:t>DPH.UI.Main binds its published controls to the FMX resource. Explorer queries are paged at 250 rows; data filtering supports kind, text and qualified scope. History and bookmarks use canonical keys, with surviving same-project bookmarks retained across reassessment. Inspector output retains source metadata and serialized properties. Source memo navigation is permitted only after live hash validation.</w:t>
+      <w:pPr>
+        <w:pStyle w:val="Heading1"/>
+      </w:pPr>
+      <w:r>
+        <w:t>FMX navigation and visualization</w:t>
       </w:r>
     </w:p>
     <w:p>
       <w:r>
-        <w:t>OpenSelection queues a candidate without replacing the current database, source or workspace. PollTimer installs it only after the worker returns accepted captured evidence. The worker preflights source identity before creating a database; cached opens check captured XML ProjectGuid and Pascal program declarations before returning a view. Rejections retain the current workspace, and rejected startup caches show Getting started. Inventory identity also covers referenced project groups. DatabaseDialog.InitialDir is the design-time relative default; startup resolves it under the deployment root, creates that folder, and applies the same path to OpenCacheDialog. Distribution packaging copies only the Databases instructions, never its databases or views.</w:t>
+        <w:t>DPH.UI.Main binds its published controls to the FMX resource. Explorer queries are paged at 250 rows; data filtering supports kind, text and qualified scope. History and bookmarks use canonical keys, with surviving same-project bookmarks retained across reassessment. Inspector output retains source metadata and serialized properties. Source memo navigation is permitted only after live hash validation.</w:t>
       </w:r>
     </w:p>
     <w:p>
       <w:r>
-        <w:t>Graph paint boxes draw bounded evidence data with palette and geometry values supplied by design-time style rectangles. Screen reconstruction draws approximate source-derived rectangles without creating components. Its gallery is bounded to 60 forms. Runtime styles, custom painting and inherited resources are not silently fabricated.</w:t>
+        <w:t>OpenSelection queues a candidate without replacing the current database, source or workspace. PollTimer installs it only after the worker returns accepted captured evidence. The worker preflights source identity before creating a database; cached opens check captured XML ProjectGuid and Pascal program declarations before returning a view. Rejections retain the current workspace, and rejected startup caches show Getting started. Inventory identity also covers referenced project groups. DatabaseDialog.InitialDir is the design-time relative default; startup resolves it under the deployment root, creates that folder, and applies the same path to OpenCacheDialog. Distribution packaging copies only the Databases instructions, never its databases or views.</w:t>
       </w:r>
     </w:p>
     <w:p>
       <w:r>
-        <w:t>Keep lifecycle and ownership explicit: the view owns its JSON document, UI arrays own their records, responses transfer document or knowledge ownership to the main form, and the worker frees unconsumed responses during shutdown. Guard unsaved authored text before changing projects or replacing editor state.</w:t>
+        <w:t>Graph paint boxes draw bounded evidence data with palette and geometry values supplied by design-time style rectangles. Screen reconstruction draws approximate source-derived rectangles without creating components. Its gallery is bounded to 60 forms. Runtime styles, custom painting and inherited resources are not silently fabricated.</w:t>
       </w:r>
     </w:p>
     <w:p>
-      <w:pPr>
-        <w:pStyle w:val="Heading1"/>
-      </w:pPr>
-      <w:r>
-        <w:t>Curated knowledge and review</w:t>
+      <w:r>
+        <w:t>Keep lifecycle and ownership explicit: the view owns its JSON document, UI arrays own their records, responses transfer document or knowledge ownership to the main form, and the worker frees unconsumed responses during shutdown. Guard unsaved authored text before changing projects or replacing editor state.</w:t>
       </w:r>
     </w:p>
     <w:p>
-      <w:r>
-        <w:t>SaveKnowledge requires title, body, a named author, a supported kind and a captured generation. Existing records require their expected revision and stable title/kind. Each edit appends a needs_review revision, preserves links and opens a pending task. Knowledge bodies are bounded to 1 MiB. Authored text is never regenerated from parser output.</w:t>
+      <w:pPr>
+        <w:pStyle w:val="Heading1"/>
+      </w:pPr>
+      <w:r>
+        <w:t>Curated knowledge and review</w:t>
       </w:r>
     </w:p>
     <w:p>
       <w:r>
-        <w:t>ReviewKnowledge requires the expected current revision, a named reviewer and a matching captured source/configuration. The connected worker observes current source before accepting a review. A missing linked entity cannot be verified under a replacement name. Verification, rejection or retirement appends a revision and records attribution; history remains append only.</w:t>
+        <w:t>SaveKnowledge requires title, body, a named author, a supported kind and a captured generation. Existing records require their expected revision and stable kind. Ordinary titles stay stable; structured glossary names can change while their identity and history remain intact. Each edit appends a needs_review revision, preserves links and opens a pending task. Knowledge bodies are bounded to 1 MiB. Authored text is never regenerated from parser output.</w:t>
       </w:r>
     </w:p>
     <w:p>
       <w:r>
-        <w:t>Manifest and configuration changes conservatively invalidate active knowledge, derived artifacts and translations. A partial static capture may support review of an attributable statement against available evidence, but its partial coverage remains visible. Local names are not authenticated enterprise identities. Human verification and automatic static derivation remain different evidence categories.</w:t>
+        <w:t>ReviewKnowledge requires the expected current revision, a named reviewer and a matching captured source/configuration. The connected worker observes current source before accepting a review. A missing linked entity cannot be verified under a replacement name. Verification, rejection or retirement appends a revision and records attribution; history remains append only.</w:t>
       </w:r>
     </w:p>
     <w:p>
-      <w:pPr>
-        <w:pStyle w:val="Heading1"/>
-      </w:pPr>
-      <w:r>
-        <w:t>Canonical publication and privacy</w:t>
+      <w:r>
+        <w:t>Manifest and configuration changes conservatively invalidate active knowledge, derived artifacts and translations. A partial static capture may support review of an attributable statement against available evidence, but its partial coverage remains visible. Local names are not authenticated enterprise identities. Human verification and automatic static derivation remain different evidence categories.</w:t>
       </w:r>
     </w:p>
     <w:p>
-      <w:r>
-        <w:t>DPH.Publish.Model constructs one versioned documentation model from a captured workspace and current curated knowledge. It carries generation, configuration, input/context fingerprints, detached/stale state, symbols, typed relationships, control flow, source references, human history, coverage and explicit unknowns. Full and task-scoped views share those facts.</w:t>
+      <w:pPr>
+        <w:pStyle w:val="Heading1"/>
+      </w:pPr>
+      <w:r>
+        <w:t>Canonical publication and privacy</w:t>
       </w:r>
     </w:p>
     <w:p>
       <w:r>
-        <w:t>Task scope selects the requested identities and complete direct incident context. It rejects missing or excluded seeds and rejects an oversized task rather than silently truncating a full export. External source roots and sensitive filename categories are excluded by default. Explicit relative prefix exclusions remove file-derived symbols and relationships. Source snapshots and generated AGENTS.md are absent by default.</w:t>
+        <w:t>DPH.Publish.Model constructs one versioned documentation model from a captured workspace and current curated knowledge. It carries generation, configuration, input/context fingerprints, detached/stale state, symbols, typed relationships, control flow, source references, human history, coverage and explicit unknowns. Full and task-scoped views share those facts.</w:t>
       </w:r>
     </w:p>
     <w:p>
       <w:r>
-        <w:t>Redaction recognizes common credential assignments, private keys, AWS access keys and JWT-shaped tokens throughout string data. It is defense in depth, not a guarantee that every project-specific secret format is recognizable. Require explicit exclusions and a disclosure review for sensitive content. No translation or AI provider is contacted by normal publishing.</w:t>
+        <w:t>Task scope selects the requested identities and complete direct incident context. It rejects missing or excluded seeds and rejects an oversized task rather than silently truncating a full export. External source roots and sensitive filename categories are excluded by default. Explicit relative prefix exclusions remove file-derived symbols and relationships. Source snapshots and generated AGENTS.md are absent by default.</w:t>
       </w:r>
     </w:p>
     <w:p>
-      <w:pPr>
-        <w:pStyle w:val="Heading1"/>
-      </w:pPr>
-      <w:r>
-        <w:t>HTML guides and bundle validation</w:t>
+      <w:r>
+        <w:t>Redaction recognizes common credential assignments, private keys, AWS access keys and JWT-shaped tokens throughout string data. It is defense in depth, not a guarantee that every project-specific secret format is recognizable. Require explicit exclusions and a disclosure review for sensitive content. No translation or AI provider is contacted by normal publishing.</w:t>
       </w:r>
     </w:p>
     <w:p>
-      <w:r>
-        <w:t>DPH.Publish.Export writes a new destination outside source. The offline HTML uses encoded imported text, local search and styles, internal anchors, print CSS and a restrictive content security policy. The default WebView2 policy permits only the authorized local index and about:blank; publication explicitly enables hash-named object pages in its managed objects folder. Help retains the index-only policy; learning explicitly permits content-hashed pages only inside its owned preview directory. There is no arbitrary native bridge. Data does not supply executable markup.</w:t>
+      <w:pPr>
+        <w:pStyle w:val="Heading1"/>
+      </w:pPr>
+      <w:r>
+        <w:t>HTML guides and bundle validation</w:t>
       </w:r>
     </w:p>
     <w:p>
       <w:r>
-        <w:t>JSONL indexes contain symbols, relationships, forms/events, data usage, configuration, flow nodes, knowledge and evidence references. Manifest and checksum files accompany canonical.json. The validator checks filenames, hashes, expected input fingerprint, canonical identity, source hash/range, generation and cross-reference integrity. A stale manifest is rejected by default. Unsigned hashes establish integrity relative to the index, not author authenticity.</w:t>
+        <w:t>DPH.Publish.Export writes a new destination outside source. The offline HTML uses encoded imported text, local search and styles, internal anchors, print CSS and a restrictive content security policy. The default WebView2 policy permits only the authorized local index and about:blank; publication explicitly enables hash-named object pages in its managed objects folder. Help retains the index-only policy; learning explicitly permits content-hashed pages only inside its owned preview directory. There is no arbitrary native bridge. Data does not supply executable markup.</w:t>
       </w:r>
     </w:p>
     <w:p>
       <w:r>
-        <w:t>Editable engineering and user DOCX guides derive from the same sections and evidence model. They include title, last changed capture identity and a changeable TOC field. LibreOffice provides companion PDFs; the project rendering tool verifies cached page numbers and renders page images for layout inspection. Missing business procedures stay explicitly absent rather than being invented.</w:t>
+        <w:t>JSONL indexes contain symbols, relationships, forms/events, data usage, configuration, flow nodes, knowledge and evidence references. Manifest and checksum files accompany canonical.json. The validator checks filenames, hashes, expected input fingerprint, canonical identity, source hash/range, generation and cross-reference integrity. A stale manifest is rejected by default. Unsigned hashes establish integrity relative to the index, not author authenticity.</w:t>
       </w:r>
     </w:p>
     <w:p>
-      <w:pPr>
-        <w:pStyle w:val="Heading1"/>
-      </w:pPr>
-      <w:r>
-        <w:t>Translation boundary</w:t>
+      <w:r>
+        <w:t>Editable engineering and user DOCX guides derive from the same sections and evidence model. They include title, last changed capture identity and a changeable TOC field. LibreOffice provides companion PDFs; the project rendering tool verifies cached page numbers and renders page images for layout inspection. Missing business procedures stay explicitly absent rather than being invented.</w:t>
       </w:r>
     </w:p>
     <w:p>
-      <w:r>
-        <w:t>IDPHTranslationProvider exposes provider identity, version, external status and prose translation. Protected segments retain identifiers, SQL, paths, hashes and protocol keys byte for byte. Cache keys include source content, revision, source/target locales and provider/version. Changed prose produces a fresh pending entry; named review applies to the exact cached translation.</w:t>
+      <w:pPr>
+        <w:pStyle w:val="Heading1"/>
+      </w:pPr>
+      <w:r>
+        <w:t>Translation boundary</w:t>
       </w:r>
     </w:p>
     <w:p>
       <w:r>
-        <w:t>TDPHAtlasAdapter reads explicitly selected DAT JSON packs offline. The independent Apache-2.0 reader snapshot and license reside under dependencies\DelphiAppTranslation; VCL2FMX is unchanged and is not a build or runtime dependency. No network provider is configured. Tests exercise actual packs, persistent cache, terminology changes, source invalidation and exact-content named review. The offline GTranslate region is disabled, with local bilingual labels and sorting; do not activate network translation merely because a generic widget name appears in documentation.</w:t>
+        <w:t>IDPHTranslationProvider exposes provider identity, version, external status and prose translation. Protected segments retain identifiers, SQL, paths, hashes and protocol keys byte for byte. Cache keys include source content, revision, source/target locales and provider/version. Changed prose produces a fresh pending entry; named review applies to the exact cached translation.</w:t>
       </w:r>
     </w:p>
     <w:p>
-      <w:pPr>
-        <w:pStyle w:val="Heading1"/>
-      </w:pPr>
-      <w:r>
-        <w:t>Verification and release discipline</w:t>
+      <w:r>
+        <w:t>TDPHAtlasAdapter reads explicitly selected DAT JSON packs offline. The independent Apache-2.0 reader snapshot and license reside under dependencies\DelphiAppTranslation; VCL2FMX is unchanged and is not a build or runtime dependency. No network provider is configured. Tests exercise actual packs, persistent cache, terminology changes, source invalidation and exact-content named review. The offline GTranslate region is disabled, with local bilingual labels and sorting; do not activate network translation merely because a generic widget name appears in documentation.</w:t>
       </w:r>
     </w:p>
     <w:p>
-      <w:r>
-        <w:t>Run the phase build/test scripts elevated with the installed toolchain. WP0 checks FMX resource ownership; WP1 checks storage, crash recovery and migrations; WP2 checks inventory, encoding, syntax and source safety; WP3 checks semantics and pinned reference traces; WP4 checks workspace/background behavior; WP5 checks immutable authored history and pending review; WP6 checks publication, exclusions, sanitization, hashes and translation protection.</w:t>
+      <w:pPr>
+        <w:pStyle w:val="Heading1"/>
+      </w:pPr>
+      <w:r>
+        <w:t>Verification and release discipline</w:t>
       </w:r>
     </w:p>
     <w:p>
       <w:r>
-        <w:t>Use exact input hashes before and after analysis, including failures. Preserve original reference and instruction files. Keep tests that demonstrate invariants rather than tests that merely mirror implementation. New source, validation failure or unresolved risk justifies another targeted test; a passing unchanged phase does not need endless repetition.</w:t>
+        <w:t>Run the phase build/test scripts elevated with the installed toolchain. WP0 checks FMX resource ownership; WP1 checks storage, crash recovery and migrations; WP2 checks inventory, encoding, syntax and source safety; WP3 checks semantics and pinned reference traces; WP4 checks workspace/background behavior; WP5 checks immutable authored history and pending review; WP6 checks publication, exclusions, sanitization, hashes and translation protection.</w:t>
       </w:r>
     </w:p>
     <w:p>
       <w:r>
-        <w:t>D: development backups are suspended at the owner's direction until explicitly resumed. Git remains enabled: review intended changes, commit validated work and push both public and private remotes without force or history rewriting. Remove a stale zero-byte index lock only after verifying no Git process runs. WP7 records measured performance, portability, security and explicit acceptance evidence. Independent first-time programmer acceptance and unknown historical business intent cannot be invented by automation.</w:t>
+        <w:t>Use exact input hashes before and after analysis, including failures. Preserve original reference and instruction files. Keep tests that demonstrate invariants rather than tests that merely mirror implementation. New source, validation failure or unresolved risk justifies another targeted test; a passing unchanged phase does not need endless repetition.</w:t>
       </w:r>
     </w:p>
     <w:p>
       <w:r>
-        <w:t>In the historical pre-rework benchmark on the recorded Core i7-1165G7 host with eight logical processors and about 16 GB RAM, the pinned reference pipeline measured 82.6 seconds for full capture, 2.87 seconds for cached opening and 75.9 seconds for incremental reassessment. The message-pump maximum gap was 64 ms. Peak test-process working set was about 1.21 GiB, including repeated captures, JSON cloning and FMX/WebView2 tests. These are baseline measurements, not agreed hardware-independent budgets. Large syntax-cache fallback and conservative semantic recomputation explain the modest reassessment speedup. Formal acceptance retains independent complex-flow review, missing business/user content, AC-25 and performance-budget agreement as outstanding.</w:t>
+        <w:t>H: development backups are enabled. Allow at least 60 seconds for this USB drive to wake before assessing availability. Git remains enabled: review intended changes, commit validated work and push both public and private remotes without force or history rewriting. Remove a stale zero-byte index lock only after verifying no Git process runs. WP7 records measured performance, portability, security and explicit acceptance evidence. Independent first-time programmer acceptance and unknown historical business intent cannot be invented by automation.</w:t>
       </w:r>
     </w:p>
     <w:p>
-      <w:pPr>
-        <w:pStyle w:val="Heading1"/>
-      </w:pPr>
-      <w:r>
-        <w:t>Current semantic cache and extended evidence</w:t>
+      <w:r>
+        <w:t>In the historical pre-rework benchmark on the recorded Core i7-1165G7 host with eight logical processors and about 16 GB RAM, the pinned reference pipeline measured 82.6 seconds for full capture, 2.87 seconds for cached opening and 75.9 seconds for incremental reassessment. The message-pump maximum gap was 64 ms. Peak test-process working set was about 1.21 GiB, including repeated captures, JSON cloning and FMX/WebView2 tests. These are baseline measurements, not agreed hardware-independent budgets. Large syntax-cache fallback and conservative semantic recomputation explain the modest reassessment speedup. Formal acceptance retains independent complex-flow review, missing business/user content, AC-25 and performance-budget agreement as outstanding.</w:t>
       </w:r>
     </w:p>
     <w:p>
-      <w:r>
-        <w:t>The current analyzers are DPH-WP2-5 and DPH-WP3-11 with IR and semantic schema 1. Routine semantic cache reuse is bounded to 512 records and 32 MiB. Binding context hashes invalidate affected reuse. Synthetic startup and postprocessing occur after reusable routine facts, preserving their relationships to current identities. This is bounded evidence reuse; it is not a proof of an optimal incremental solver.</w:t>
+      <w:pPr>
+        <w:pStyle w:val="Heading1"/>
+      </w:pPr>
+      <w:r>
+        <w:t>Current semantic cache and extended evidence</w:t>
       </w:r>
     </w:p>
     <w:p>
       <w:r>
-        <w:t>Supported extensions include typed aliases, inheritance and accessors, startup entry and unit phases, case/goto/with control flow, asynchronous operation handles and captures, cancellation and event waits, formal arguments and result producers, static SQL projection, output-writer lineage, lifetime and exception relationships, explicit test-call links, and qualified form navigation. Every relationship retains resolution, source range/hash and rule. Unsupported grammar, aliases and dynamic behavior remain diagnosed or qualified.</w:t>
+        <w:t>The current analyzers are DPH-WP2-5 and DPH-WP3-11 with IR and semantic schema 1. Routine semantic cache reuse is bounded to 512 records and 32 MiB. Binding context hashes invalidate affected reuse. Synthetic startup and postprocessing occur after reusable routine facts, preserving their relationships to current identities. This is bounded evidence reuse; it is not a proof of an optimal incremental solver.</w:t>
       </w:r>
     </w:p>
     <w:p>
-      <w:pPr>
-        <w:pStyle w:val="Heading1"/>
-      </w:pPr>
-      <w:r>
-        <w:t>Current schema and authored document contracts</w:t>
+      <w:r>
+        <w:t>Supported extensions include typed aliases, inheritance and accessors, startup entry and unit phases, case/goto/with control flow, asynchronous operation handles and captures, cancellation and event waits, formal arguments and result producers, static SQL projection, output-writer lineage, lifetime and exception relationships, explicit test-call links, and qualified form navigation. Every relationship retains resolution, source range/hash and rule. Unsupported grammar, aliases and dynamic behavior remain diagnosed or qualified.</w:t>
       </w:r>
     </w:p>
     <w:p>
-      <w:r>
-        <w:t>Schema 9 uses checksum-verified migrations 001 through 009. document_section_versions associates immutable authored revisions with stable section ID, document kind, audience and source generation. knowledge_revision_links preserves ordinal, target kind/identity, captured generation, role and label. knowledge_questions preserves the exact deterministic question identity and captured JSON associated with a response record.</w:t>
+      <w:pPr>
+        <w:pStyle w:val="Heading1"/>
+      </w:pPr>
+      <w:r>
+        <w:t>Current schema and authored document contracts</w:t>
       </w:r>
     </w:p>
     <w:p>
       <w:r>
-        <w:t>SaveKnowledge appends immutable text and link snapshots. Empty LinksJSON preserves the prior snapshot; an explicit JSON array replaces it. Entity, relationship and evidence targets remain tied to generation identities; screenshot targets reference managed artifacts; section targets pin an exact knowledge revision. Current reverse section references open review when their targets change. Verify rejects obsolete rich-link generations or target revisions.</w:t>
+        <w:t>Schema 9 uses checksum-verified migrations 001 through 009. document_section_versions associates immutable authored revisions with stable section ID, document kind, audience and source generation. knowledge_revision_links preserves ordinal, target kind/identity, captured generation, role and label. knowledge_questions preserves the exact deterministic question identity and captured JSON associated with a response record.</w:t>
       </w:r>
     </w:p>
     <w:p>
       <w:r>
-        <w:t>Question identity hashes kind, entity key, range, source hash, prompt, rule and context fingerprint. Generation is retained separately, allowing unchanged evidence to keep its question identity across captures. An answer needs actual text after Answer. Only verified content with no pending task suppresses an exact question. Export converts question metadata to typed JSON before recursive redaction.</w:t>
+        <w:t>SaveKnowledge appends immutable text and link snapshots. Empty LinksJSON preserves the prior snapshot; an explicit JSON array replaces it. Entity, relationship and evidence targets remain tied to generation identities; screenshot targets reference managed artifacts; section targets pin an exact knowledge revision. Current reverse section references open review when their targets change. Verify rejects obsolete rich-link generations or target revisions.</w:t>
       </w:r>
     </w:p>
     <w:p>
-      <w:pPr>
-        <w:pStyle w:val="Heading1"/>
-      </w:pPr>
-      <w:r>
-        <w:t>Native review and learning projections</w:t>
+      <w:r>
+        <w:t>Question identity hashes kind, entity key, range, source hash, prompt, rule and context fingerprint. Generation is retained separately, allowing unchanged evidence to keep its question identity across captures. An answer needs actual text after Answer. Only verified content with no pending task suppresses an exact question. Export converts question metadata to typed JSON before recursive redaction.</w:t>
       </w:r>
     </w:p>
     <w:p>
-      <w:r>
-        <w:t>ReviewTasks provides bounded pending tasks, prior and current authored text, baseline/current configurations, affected object signatures, types, source hashes and relationship comparisons. A missing baseline is reported. Native controls invoke existing optimistic-revision and connected-source review checks; they do not create a separate approval authority.</w:t>
+      <w:pPr>
+        <w:pStyle w:val="Heading1"/>
+      </w:pPr>
+      <w:r>
+        <w:t>Native review and learning projections</w:t>
       </w:r>
     </w:p>
     <w:p>
       <w:r>
-        <w:t>RoutineLesson uses the routine CFG and an indexed outgoing-edge lookup. It explains source points, actual expressions and destination lines, with explicit loop, branch, early-return, cleanup and exceptional semantics. The same lesson is used by ObjectText and ObjectHTML; exported document prose and offline object pages therefore share its source interpretation. Its bounds are 60 points and eight outgoing paths per point.</w:t>
+        <w:t>ReviewTasks provides bounded pending tasks, prior and current authored text, baseline/current configurations, affected object signatures, types, source hashes and relationship comparisons. A missing baseline is reported. Native controls invoke existing optimistic-revision and connected-source review checks; they do not create a separate approval authority.</w:t>
       </w:r>
     </w:p>
     <w:p>
       <w:r>
-        <w:t>Preview HTML files have immutable content-hashed names, tracked for cleanup. BrowserPolicy allows them only in the owned preview directory when explicitly enabled. This avoids rewriting a file held by WebView2. Arbitrary filenames and external navigation remain blocked. Native browser tests render the app pages; they do not execute the analyzed application.</w:t>
+        <w:t>RoutineLesson uses the routine CFG and an indexed outgoing-edge lookup. It explains source points, actual expressions and destination lines, with explicit loop, branch, early-return, cleanup and exceptional semantics. The same lesson is used by ObjectText and ObjectHTML; exported document prose and offline object pages therefore share its source interpretation. Its bounds are 60 points and eight outgoing paths per point.</w:t>
       </w:r>
     </w:p>
     <w:p>
-      <w:pPr>
-        <w:pStyle w:val="Heading1"/>
-      </w:pPr>
-      <w:r>
-        <w:t>Saved observation persistence</w:t>
+      <w:r>
+        <w:t>Preview HTML files have immutable content-hashed names, tracked for cleanup. BrowserPolicy allows them only in the owned preview directory when explicitly enabled. This avoids rewriting a file held by WebView2. Arbitrary filenames and external navigation remain blocked. Native browser tests render the app pages; they do not execute the analyzed application.</w:t>
       </w:r>
     </w:p>
     <w:p>
-      <w:r>
-        <w:t>ImportObservation accepts explicitly selected UTF-8 text extracts up to 256 KiB with named contributor and run context. It checks generation and optional entity existence, captures original byte SHA256 and linked file-revision SHA256, and stores content plus attribution in a managed hash-named JSON artifact of kind runtime_observation. No schema migration is needed for this artifact kind.</w:t>
+      <w:pPr>
+        <w:pStyle w:val="Heading1"/>
+      </w:pPr>
+      <w:r>
+        <w:t>Saved observation persistence</w:t>
       </w:r>
     </w:p>
     <w:p>
       <w:r>
-        <w:t>ObservationsJSON verifies managed identity, size, checksum and generation before returning the newest 50 records. The response owns the array until PollTimer transfers it to the form. LoadView clears old observation rows; historical records cannot navigate as current. Saved text stays in a native read-only memo rather than an executable browser surface.</w:t>
+        <w:t>ImportObservation accepts explicitly selected UTF-8 text extracts up to 256 KiB with named contributor and run context. It checks generation and optional entity existence, captures original byte SHA256 and linked file-revision SHA256, and stores content plus attribution in a managed hash-named JSON artifact of kind runtime_observation. No schema migration is needed for this artifact kind.</w:t>
       </w:r>
     </w:p>
     <w:p>
       <w:r>
-        <w:t>ManagedArtifactPaths includes observations for explicit portable backup. Retention protects their associated captured views. Publication currently omits observations rather than automatically disclose potentially sensitive logs. Contributor claims do not set runtime_observed on static analysis or create an automated causal trace.</w:t>
+        <w:t>ObservationsJSON verifies managed identity, size, checksum and generation before returning the newest 50 records. The response owns the array until PollTimer transfers it to the form. LoadView clears old observation rows; historical records cannot navigate as current. Saved text stays in a native read-only memo rather than an executable browser surface.</w:t>
       </w:r>
     </w:p>
     <w:p>
-      <w:pPr>
-        <w:pStyle w:val="Heading1"/>
-      </w:pPr>
-      <w:r>
-        <w:t>Regression commands and evidence</w:t>
+      <w:r>
+        <w:t>ManagedArtifactPaths includes observations for explicit portable backup. Retention protects their associated captured views. Publication currently omits observations rather than automatically disclose potentially sensitive logs. Contributor claims do not set runtime_observed on static analysis or create an automated causal trace.</w:t>
       </w:r>
     </w:p>
     <w:p>
-      <w:r>
-        <w:t>Run commands from the project root in an elevated Command Prompt so RAD Studio can read its environment. tools\build-wp0.cmd builds the app and checks FMX bindings. tools\validate-completion-wp1.cmd serially builds app, catalog, lifecycle, workspace, knowledge, selection and startup tests, then removes recognized disposable fixture directories.</w:t>
+      <w:pPr>
+        <w:pStyle w:val="Heading1"/>
+      </w:pPr>
+      <w:r>
+        <w:t>Regression commands and evidence</w:t>
       </w:r>
     </w:p>
     <w:p>
       <w:r>
-        <w:t>Run tools\build-wp1.cmd for 46 storage checks, tools\build-wp2.cmd no-report for discovery/resource checks, and tools\build-wp3.cmd to compile semantic tests. Then explicitly run bin\Win32\Debug\DPH.Tests.Semantics.exe "C:\New Delphi Projects\Delphi Project Handoff"; the build script alone does not run semantic assertions.</w:t>
+        <w:t>Run commands from the project root in an elevated Command Prompt so RAD Studio can read its environment. tools\build-wp0.cmd builds the app and checks FMX bindings. tools\validate-completion-wp1.cmd serially builds app, catalog, lifecycle, workspace, knowledge, selection and startup tests, then removes recognized disposable fixture directories.</w:t>
       </w:r>
     </w:p>
     <w:p>
       <w:r>
-        <w:t>tools\build-learning.cmd exercises managed images, cached supplemental-evidence recovery, actual WebView2 rendering, source walkthroughs and collapsed CFGs. --no-ui isolates deterministic checks and is not native acceptance. tools\build-wp6.cmd checks canonical scope, redaction, link integrity, publication and translation protection. Use exact log files and current input hashes for claims; historical reports are not automatically refreshed acceptance.</w:t>
+        <w:t>Run tools\build-wp1.cmd for 46 storage checks, tools\build-wp2.cmd no-report for discovery/resource checks, and tools\build-wp3.cmd to compile semantic tests. Then explicitly run bin\Win32\Debug\DPH.Tests.Semantics.exe "C:\New Delphi Projects\Delphi Project Handoff"; the build script alone does not run semantic assertions.</w:t>
       </w:r>
     </w:p>
     <w:p>
       <w:r>
-        <w:t>A native-learning test once dereferenced an absent image array on a later background-verification response. It now checks the initial cached document/image response directly. Source attachment preserves supplemental-image warnings. Inspection disproved a proposed constructor race, and no worker thread-start change remains.</w:t>
+        <w:t>tools\build-learning.cmd exercises managed images, cached supplemental-evidence recovery, actual WebView2 rendering, source walkthroughs and collapsed CFGs. --no-ui isolates deterministic checks and is not native acceptance. tools\build-wp6.cmd checks canonical scope, redaction, link integrity, publication and translation protection. Use exact log files and current input hashes for claims; historical reports are not automatically refreshed acceptance.</w:t>
       </w:r>
     </w:p>
     <w:p>
-      <w:pPr>
-        <w:pStyle w:val="Heading1"/>
-      </w:pPr>
-      <w:r>
-        <w:t>Rebuild and inspect these manuals</w:t>
+      <w:r>
+        <w:t>A native-learning test once dereferenced an absent image array on a later background-verification response. It now checks the initial cached document/image response directly. Source attachment preserves supplemental-image warnings. Inspection disproved a proposed constructor race, and no worker thread-start change remains.</w:t>
       </w:r>
     </w:p>
     <w:p>
-      <w:r>
-        <w:t>tools\build-guides.py generates the two application manuals from maintained operating content and current implementation hashes. Use the approved Python executable C:\Users\marti\AppData\Local\Microsoft\WindowsApps\python.exe. tools\render-guides.ps1 renders with LibreOffice, populates cached page numbers in editable TOC fields, renders again and writes companion PDFs under docs\pdf.</w:t>
+      <w:pPr>
+        <w:pStyle w:val="Heading1"/>
+      </w:pPr>
+      <w:r>
+        <w:t>Rebuild and inspect these manuals</w:t>
       </w:r>
     </w:p>
     <w:p>
       <w:r>
-        <w:t>Inspect every final page PNG under bin\guide-qa for clipping, broken headings, unreadable code and TOC page numbers before delivering a guide. Rendered PNGs are QA outputs, not a mock application UI. Actual included interface images are identified by their capture source and fixture; they do not establish runtime behavior of a selected project.</w:t>
+        <w:t>tools\build-guides.py generates the two application manuals from maintained operating content and current implementation hashes. Use the approved Python executable C:\Users\marti\AppData\Local\Microsoft\WindowsApps\python.exe. tools\render-guides.ps1 renders with LibreOffice, populates cached page numbers in editable TOC fields, renders again and writes companion PDFs under docs\pdf.</w:t>
       </w:r>
     </w:p>
     <w:p>
       <w:r>
+        <w:t>Inspect every final page PNG under bin\guide-qa for clipping, broken headings, unreadable code and TOC page numbers before delivering a guide. Rendered PNGs are QA outputs, not a mock application UI. Actual included interface images are identified by their capture source and fixture; they do not establish runtime behavior of a selected project.</w:t>
+      </w:r>
+    </w:p>
+    <w:p>
+      <w:r>
         <w:t>Regenerate manuals after later translation, handoff-contract or source-navigation changes. The source evidence appendix records inspected file hashes, while docs\guide-source-validation.json provides a machine-readable manifest. A successful generator run alone is not proof that the writing, current behavior or layout is correct.</w:t>
+      </w:r>
+    </w:p>
+    <w:p>
+      <w:pPr>
+        <w:pStyle w:val="Heading1"/>
+      </w:pPr>
+      <w:r>
+        <w:t>Business glossary implementation and checks</w:t>
+      </w:r>
+    </w:p>
+    <w:p>
+      <w:r>
+        <w:t>DPH.Knowledge.Glossary validates a business_glossary structured record with term, aliases, definition, examples and relevance/evidence context. Names normalize case and repeated whitespace. Terms/aliases are bounded to 128 characters, 32 aliases per term, definitions/examples to 16384 characters, context to 4096 characters and the record to 64 KiB. Unknown fields, duplicate fields and non-text aliases are rejected.</w:t>
+      </w:r>
+    </w:p>
+    <w:p>
+      <w:r>
+        <w:t>The existing migration 009 structured_json column stores the exact term fields on each immutable knowledge revision; no new migration is needed. SaveKnowledge enforces glossary kind, user document and all-reader audience, generated body agreement, project-local name uniqueness, type preservation and optimistic revision checks. Glossary titles can change while the knowledge ID and prior structured revisions remain intact. Retired records continue reserving their current names.</w:t>
+      </w:r>
+    </w:p>
+    <w:p>
+      <w:r>
+        <w:t>DPH.UI.Glossary.fmx defines every term editor control for the IDE/Object Inspector. DPH.UI.Main.fmx defines the glossary list, filter, detail memo and commands. Apply prepares a draft in the existing Knowledge pipeline. The modal editor retains a cloned saved revision so a background refresh cannot invalidate its input pointer. Current source links, explicit review, search and stale-source tracking use existing repository contracts.</w:t>
+      </w:r>
+    </w:p>
+    <w:p>
+      <w:r>
+        <w:t>DPH-LEARNING-8 publication emits a dedicated HTML glossary index and indexes/glossary.jsonl from the canonical knowledge records. Both user and engineering DOCX use those same records. Validate compares the glossary JSONL with the canonical glossary subset; recomputing the artifact hash cannot conceal divergent content. Older publication versions remain readable under their prior contract.</w:t>
+      </w:r>
+    </w:p>
+    <w:p>
+      <w:r>
+        <w:t>From an elevated Command Prompt run cd /d "C:\New Delphi Projects\Delphi Project Handoff", then tools\build-glossary.cmd. The suite uses the fixed ignored bin\glossary-validation directory and controlled fixtures. It checks field validation, normalized conflicts, persistence, rename, immutable revisions, stale edits/reviews, isolation, source-linked invalidation, search, publication agreement/exclusions/tampering and IDE-designed native form workflows at normal/minimum sizes. Native images are FMX PaintTo renders of actual instantiated controls; they are not screenshots of the analyzed target application.</w:t>
+      </w:r>
+    </w:p>
+    <w:p>
+      <w:r>
+        <w:t>Build the application with tools\build-wp0.cmd. Run tools\build-wp5.cmd for the existing knowledge/link/review regressions and tools\build-wp6.cmd for publishing/translation regressions. A FAIL or nonzero exit means the corresponding check failed. See docs\phase1-glossary-validation.json and the glossary completion note for actual current run evidence.</w:t>
       </w:r>
     </w:p>
     <w:p>
@@ -1268,6 +1321,26 @@
         <w:keepNext/>
       </w:pPr>
       <w:r>
+        <w:t>DPH.Knowledge.Glossary.pas</w:t>
+      </w:r>
+    </w:p>
+    <w:p>
+      <w:pPr>
+        <w:spacing w:after="60"/>
+      </w:pPr>
+      <w:r>
+        <w:rPr>
+          <w:rFonts w:ascii="Consolas" w:hAnsi="Consolas"/>
+          <w:sz w:val="16"/>
+        </w:rPr>
+        <w:t>9c50a06ccf405f786526e206e5e84ea956604eeb42e1a84b9f91c31cced70dcb</w:t>
+      </w:r>
+    </w:p>
+    <w:p>
+      <w:pPr>
+        <w:keepNext/>
+      </w:pPr>
+      <w:r>
         <w:t>DPH.Knowledge.ProjectProfile.pas</w:t>
       </w:r>
     </w:p>
@@ -1500,7 +1573,7 @@
           <w:rFonts w:ascii="Consolas" w:hAnsi="Consolas"/>
           <w:sz w:val="16"/>
         </w:rPr>
-        <w:t>2de922c043eba74c1bbd9079373b23e9c33d1d534da6b48b084d6dca96cfd4fe</w:t>
+        <w:t>0a36aa00c6c9591521d53977e2a4985b4cb390dfa79c7dcbc337c74ff306c39e</w:t>
       </w:r>
     </w:p>
     <w:p>
@@ -1520,7 +1593,7 @@
           <w:rFonts w:ascii="Consolas" w:hAnsi="Consolas"/>
           <w:sz w:val="16"/>
         </w:rPr>
-        <w:t>0735d735071144464f0d35d6a5886d4a3d6a04e09f7276f2d26306f8451797d0</w:t>
+        <w:t>924538cea0f766a19094f0fd41ff4381094e905f1a2e7db9474e3b6437bad292</w:t>
       </w:r>
     </w:p>
     <w:p>
@@ -1580,7 +1653,7 @@
           <w:rFonts w:ascii="Consolas" w:hAnsi="Consolas"/>
           <w:sz w:val="16"/>
         </w:rPr>
-        <w:t>1eb84775bb84acd3d0fa4c437f1144ea615aaba29ce345dee45279d11f7d942c</w:t>
+        <w:t>28e17f8ddf7196406c1ef3ba3ce4e98959764660d90cec0ae7abd249d0043b33</w:t>
       </w:r>
     </w:p>
     <w:p>
@@ -1608,7 +1681,7 @@
         <w:keepNext/>
       </w:pPr>
       <w:r>
-        <w:t>DPH.UI.Main.pas</w:t>
+        <w:t>DPH.UI.Glossary.pas</w:t>
       </w:r>
     </w:p>
     <w:p>
@@ -1620,7 +1693,27 @@
           <w:rFonts w:ascii="Consolas" w:hAnsi="Consolas"/>
           <w:sz w:val="16"/>
         </w:rPr>
-        <w:t>c7d1b02548f4817015d87cc44a6dfba5616826b7a97eb2802e75a7384f1b0a61</w:t>
+        <w:t>fb15295b29a9bbb9caa05cea723e737c81b2418a271f59fb6071dbffe37f8741</w:t>
+      </w:r>
+    </w:p>
+    <w:p>
+      <w:pPr>
+        <w:keepNext/>
+      </w:pPr>
+      <w:r>
+        <w:t>DPH.UI.Main.pas</w:t>
+      </w:r>
+    </w:p>
+    <w:p>
+      <w:pPr>
+        <w:spacing w:after="60"/>
+      </w:pPr>
+      <w:r>
+        <w:rPr>
+          <w:rFonts w:ascii="Consolas" w:hAnsi="Consolas"/>
+          <w:sz w:val="16"/>
+        </w:rPr>
+        <w:t>f4495d86b4a6390e3cf24f645d73ad8f69e5fe03af79aab9e5fdadcb78caa345</w:t>
       </w:r>
     </w:p>
     <w:p>
@@ -1780,7 +1873,7 @@
           <w:rFonts w:ascii="Consolas" w:hAnsi="Consolas"/>
           <w:sz w:val="16"/>
         </w:rPr>
-        <w:t>134c4bcbe68b7056ea09b2e73696749bf4ab5e91a37287811f9d57d2e62fa3aa</w:t>
+        <w:t>6212567a7d5b8c1cd18a4f5b2ca0bb99c0deac95db5723ec633f1413f5b5206b</w:t>
       </w:r>
     </w:p>
     <w:p>
@@ -1808,6 +1901,26 @@
         <w:keepNext/>
       </w:pPr>
       <w:r>
+        <w:t>DPH.UI.Glossary.fmx</w:t>
+      </w:r>
+    </w:p>
+    <w:p>
+      <w:pPr>
+        <w:spacing w:after="60"/>
+      </w:pPr>
+      <w:r>
+        <w:rPr>
+          <w:rFonts w:ascii="Consolas" w:hAnsi="Consolas"/>
+          <w:sz w:val="16"/>
+        </w:rPr>
+        <w:t>3334c41ac643daa3596f1a5c9cb8fb65c3447daf77cf00006d6a0ca7a9d517d5</w:t>
+      </w:r>
+    </w:p>
+    <w:p>
+      <w:pPr>
+        <w:keepNext/>
+      </w:pPr>
+      <w:r>
         <w:t>DelphiProjectHandoff.dpr</w:t>
       </w:r>
     </w:p>
@@ -1840,7 +1953,7 @@
           <w:rFonts w:ascii="Consolas" w:hAnsi="Consolas"/>
           <w:sz w:val="16"/>
         </w:rPr>
-        <w:t>450da3418a6581ba50d250b9c7d7e7db1ac9ad0b6756a3a66182852c6df02a05</w:t>
+        <w:t>717637f3a1d07f33e0902beb1da0d2765ba420ccbe5383db9c5bab082ee16977</w:t>
       </w:r>
     </w:p>
     <w:sectPr>

</xml_diff>

<commit_message>
Implement keyboard shortcut and sibling focus-order inspector for requirement 04.13
</commit_message>
<xml_diff>
--- a/docs/guides/DPH_Engineering_Guide.docx
+++ b/docs/guides/DPH_Engineering_Guide.docx
@@ -475,7 +475,7 @@
         </w:tabs>
       </w:pPr>
       <w:r>
-        <w:t>Source and revision evidence</w:t>
+        <w:t>Keyboard inspector implementation and validation</w:t>
       </w:r>
       <w:r>
         <w:tab/>
@@ -483,664 +483,702 @@
       </w:r>
     </w:p>
     <w:p>
-      <w:r>
-        <w:fldChar w:fldCharType="end"/>
+      <w:pPr>
+        <w:spacing w:after="0" w:line="240" w:lineRule="auto"/>
+        <w:tabs>
+          <w:tab w:val="right" w:leader="dot" w:pos="9360"/>
+        </w:tabs>
+      </w:pPr>
+      <w:r>
+        <w:t>Source and revision evidence</w:t>
+      </w:r>
+      <w:r>
+        <w:tab/>
+        <w:t>14</w:t>
       </w:r>
     </w:p>
     <w:p>
       <w:r>
-        <w:br w:type="page"/>
+        <w:fldChar w:fldCharType="end"/>
       </w:r>
     </w:p>
     <w:p>
-      <w:pPr>
-        <w:pStyle w:val="Heading1"/>
-      </w:pPr>
-      <w:r>
-        <w:t>Architecture and boundaries</w:t>
+      <w:r>
+        <w:br w:type="page"/>
       </w:r>
     </w:p>
     <w:p>
-      <w:r>
-        <w:t>DPH is an independent Delphi FMX application. It has no converter runtime or build dependency. The pinned VCL2FMXConverter v6.0.0 corpus is test input only, at commit e1fd10b2d3b06f2fc3f726b8eb7f234a54faf63d. No converter source was copied into the current analyzer. Preserve the original planning documents and global agents.md byte for byte.</w:t>
+      <w:pPr>
+        <w:pStyle w:val="Heading1"/>
+      </w:pPr>
+      <w:r>
+        <w:t>Architecture and boundaries</w:t>
       </w:r>
     </w:p>
     <w:p>
       <w:r>
-        <w:t>The pipeline is selected project, bounded inventory, read-only byte acquisition, lexical and conditional processing, Pascal and form IR, semantic relationships and control flow, revision-consistent SQLite capture, cached workspace projection, curated knowledge and derived publication. Contract data remains separate from FMX. Every unsupported construct or unavailable dependency must remain diagnosable rather than being promoted into false completeness.</w:t>
+        <w:t>DPH is an independent Delphi FMX application. It has no converter runtime or build dependency. The pinned VCL2FMXConverter v6.0.0 corpus is test input only, at commit e1fd10b2d3b06f2fc3f726b8eb7f234a54faf63d. No converter source was copied into the current analyzer. Preserve the original planning documents and global agents.md byte for byte.</w:t>
       </w:r>
     </w:p>
     <w:p>
       <w:r>
-        <w:t>Application controls are serialized in DPH.UI.Main.fmx, DPH.UI.ProjectProfile.fmx and DPH.UI.Glossary.fmx and editable in the IDE. List contents and paint-box geometry are data projections. No scanned component class is instantiated. Avoid adding runtime-only controls, Pascal class helpers or an alternative authoritative store without explicit authorization.</w:t>
+        <w:t>The pipeline is selected project, bounded inventory, read-only byte acquisition, lexical and conditional processing, Pascal and form IR, semantic relationships and control flow, revision-consistent SQLite capture, cached workspace projection, curated knowledge and derived publication. Contract data remains separate from FMX. Every unsupported construct or unavailable dependency must remain diagnosable rather than being promoted into false completeness.</w:t>
       </w:r>
     </w:p>
     <w:p>
-      <w:pPr>
-        <w:pStyle w:val="Heading1"/>
-      </w:pPr>
-      <w:r>
-        <w:t>Rework and acceptance status</w:t>
+      <w:r>
+        <w:t>Application controls are serialized in DPH.UI.Main.fmx, DPH.UI.ProjectProfile.fmx and DPH.UI.Glossary.fmx and editable in the IDE. List contents and paint-box geometry are data projections. No scanned component class is instantiated. Avoid adding runtime-only controls, Pascal class helpers or an alternative authoritative store without explicit authorization.</w:t>
       </w:r>
     </w:p>
     <w:p>
-      <w:r>
-        <w:t>The owner rejected the earlier WP7 delivery as inadequate for learning and handoff. The statement that implementation through WP7 was complete has been withdrawn. docs/Rework_Requirements_Audit.txt compares the original plan with the implemented product and outstanding work. Historical WP reports remain historical evidence, not acceptance of the reworked experience.</w:t>
+      <w:pPr>
+        <w:pStyle w:val="Heading1"/>
+      </w:pPr>
+      <w:r>
+        <w:t>Rework and acceptance status</w:t>
       </w:r>
     </w:p>
     <w:p>
       <w:r>
-        <w:t>The rework adds a first-launch Getting started course, deterministic explanation engine, guided learning workspace, source-comment context, event traces, labeled and collapsed procedure-flow views, attributed screenshot imports and richer project-specific publication. Run tools/build-learning.cmd with an optional pinned reference database path for dedicated learning and real-WebView2 tests. The source-based first-time-programmer exercise still needs a human participant.</w:t>
+        <w:t>The owner rejected the earlier WP7 delivery as inadequate for learning and handoff. The statement that implementation through WP7 was complete has been withdrawn. docs/Rework_Requirements_Audit.txt compares the original plan with the implemented product and outstanding work. Historical WP reports remain historical evidence, not acceptance of the reworked experience.</w:t>
       </w:r>
     </w:p>
     <w:p>
       <w:r>
-        <w:t>The implementation tracker records expanded semantic reuse, resource interpretation and retention/continuity controls. Their documented bounds still apply. Source safety, privacy, attribution and exact generation links are retained. Do not turn an automated pass count into a claim that every requirement or the human onboarding goal is finished.</w:t>
+        <w:t>The rework adds a first-launch Getting started course, deterministic explanation engine, guided learning workspace, source-comment context, event traces, labeled and collapsed procedure-flow views, attributed screenshot imports and richer project-specific publication. Run tools/build-learning.cmd with an optional pinned reference database path for dedicated learning and real-WebView2 tests. The source-based first-time-programmer exercise still needs a human participant.</w:t>
       </w:r>
     </w:p>
     <w:p>
-      <w:pPr>
-        <w:pStyle w:val="Heading1"/>
-      </w:pPr>
-      <w:r>
-        <w:t>Build and deployment</w:t>
+      <w:r>
+        <w:t>The implementation tracker records expanded semantic reuse, resource interpretation and retention/continuity controls. Their documented bounds still apply. Source safety, privacy, attribution and exact generation links are retained. Do not turn an automated pass count into a claim that every requirement or the human onboarding goal is finished.</w:t>
       </w:r>
     </w:p>
     <w:p>
-      <w:r>
-        <w:t>The installed compiler is RAD Studio 37.0.59082.6021. Load C:\Program Files (x86)\Embarcadero\Studio\37.0\bin\rsvars.bat before compiling. tools/build-wp0.cmd builds DelphiProjectHandoff.dproj with elevated MSBuild and runs the FMX resource smoke test. Output is bin/Win32/Debug, with DCUs in dcu/Win32/Debug. The initial executable target is Windows Win32.</w:t>
+      <w:pPr>
+        <w:pStyle w:val="Heading1"/>
+      </w:pPr>
+      <w:r>
+        <w:t>Build and deployment</w:t>
       </w:r>
     </w:p>
     <w:p>
       <w:r>
-        <w:t>Deploy the executable, all nine immutable migration files, and the architecture-matched WebView2Loader.dll. The reviewed Microsoft WebView2 SDK package is pinned to 1.0.4258.31; retain tools/WebView2/LICENSE.txt with binary redistribution. The browser loads the DLL by its absolute executable-folder path and activates Edge only when preview is requested. There is no intended IE fallback.</w:t>
+        <w:t>The installed compiler is RAD Studio 37.0.59082.6021. Load C:\Program Files (x86)\Embarcadero\Studio\37.0\bin\rsvars.bat before compiling. tools/build-wp0.cmd builds DelphiProjectHandoff.dproj with elevated MSBuild and runs the FMX resource smoke test. Output is bin/Win32/Debug, with DCUs in dcu/Win32/Debug. The initial executable target is Windows Win32.</w:t>
       </w:r>
     </w:p>
     <w:p>
       <w:r>
-        <w:t>The repository standard folders include bin, dcu, docs/guides, docs/pdf, export, help, images and icons, samples, source distributions and tools. Deploy help/index.html for first-launch education. Reference source and generated test databases remain ignored. Use the explicitly approved Python 3.13 executable for project tooling and the installed LibreOffice, never Microsoft Word.</w:t>
+        <w:t>Deploy the executable, all nine immutable migration files, and the architecture-matched WebView2Loader.dll. The reviewed Microsoft WebView2 SDK package is pinned to 1.0.4258.31; retain tools/WebView2/LICENSE.txt with binary redistribution. The browser loads the DLL by its absolute executable-folder path and activates Edge only when preview is requested. There is no intended IE fallback.</w:t>
       </w:r>
     </w:p>
     <w:p>
-      <w:pPr>
-        <w:pStyle w:val="Heading1"/>
-      </w:pPr>
-      <w:r>
-        <w:t>Input acquisition and project scope</w:t>
+      <w:r>
+        <w:t>The repository standard folders include bin, dcu, docs/guides, docs/pdf, export, help, images and icons, samples, source distributions and tools. Deploy help/index.html for first-launch education. Reference source and generated test databases remain ignored. Use the explicitly approved Python 3.13 executable for project tooling and the installed LibreOffice, never Microsoft Word.</w:t>
       </w:r>
     </w:p>
     <w:p>
-      <w:r>
-        <w:t>DPH.Project.Inventory follows the selected project, explicit references, uses clauses, include paths and approved external roots. Project XML is passive: targets and imported build scripts are not executed. Canonical paths are project relative and normalized; traversal, ambiguous macros, reparse paths, cycles and oversized acquisition are rejected or diagnosed. A repository-wide count of Pascal files is not the build scope.</w:t>
+      <w:pPr>
+        <w:pStyle w:val="Heading1"/>
+      </w:pPr>
+      <w:r>
+        <w:t>Input acquisition and project scope</w:t>
       </w:r>
     </w:p>
     <w:p>
       <w:r>
-        <w:t>DPH.Project.Source opens input read only, checks the final opened Windows handle path, captures bytes, records SHA256 and verifies decoding by round trip. Unicode byte offsets, line endings and explicit legacy encodings remain in the evidence contract. The maximum acquired source is 16 MiB. Binary forms are parsed as data; unsupported resources remain gaps.</w:t>
+        <w:t>DPH.Project.Inventory follows the selected project, explicit references, uses clauses, include paths and approved external roots. Project XML is passive: targets and imported build scripts are not executed. Canonical paths are project relative and normalized; traversal, ambiguous macros, reparse paths, cycles and oversized acquisition are rejected or diagnosed. A repository-wide count of Pascal files is not the build scope.</w:t>
       </w:r>
     </w:p>
     <w:p>
       <w:r>
-        <w:t>A source viewer must re-acquire the live file and match the captured hash before using a cached range. Externally referenced sources use their explicit canonical inventory identity. Never invent a neighboring source path from a cached filename or execute input to fill an analysis gap.</w:t>
+        <w:t>DPH.Project.Source opens input read only, checks the final opened Windows handle path, captures bytes, records SHA256 and verifies decoding by round trip. Unicode byte offsets, line endings and explicit legacy encodings remain in the evidence contract. The maximum acquired source is 16 MiB. Binary forms are parsed as data; unsupported resources remain gaps.</w:t>
       </w:r>
     </w:p>
     <w:p>
-      <w:pPr>
-        <w:pStyle w:val="Heading1"/>
-      </w:pPr>
-      <w:r>
-        <w:t>Syntax contracts and limits</w:t>
+      <w:r>
+        <w:t>A source viewer must re-acquire the live file and match the captured hash before using a cached range. Externally referenced sources use their explicit canonical inventory identity. Never invent a neighboring source path from a cached filename or execute input to fill an analysis gap.</w:t>
       </w:r>
     </w:p>
     <w:p>
-      <w:r>
-        <w:t>DPH.Parse.Model defines IR schema 1, analyzer DPH-WP2-5, token and node limits, source ranges and diagnostics. Lexing preserves original tokens and conditional information. Preprocessing evaluates supported expressions, explicit defines and includes while retaining uncertainty for unknown branches. An unavailable compiler symbol is not automatically a false condition.</w:t>
+      <w:pPr>
+        <w:pStyle w:val="Heading1"/>
+      </w:pPr>
+      <w:r>
+        <w:t>Syntax contracts and limits</w:t>
       </w:r>
     </w:p>
     <w:p>
       <w:r>
-        <w:t>The Pascal parser extracts declarations, routines, anonymous methods and supported statements into IR. Declaration and implementation occurrences remain distinguishable before semantic unification. The form parser accepts supported text and binary DFM/FMX structures without loading component packages. The inventory reads relevant project configuration and resources through bounded adapters.</w:t>
+        <w:t>DPH.Parse.Model defines IR schema 1, analyzer DPH-WP2-5, token and node limits, source ranges and diagnostics. Lexing preserves original tokens and conditional information. Preprocessing evaluates supported expressions, explicit defines and includes while retaining uncertainty for unknown branches. An unavailable compiler symbol is not automatically a false condition.</w:t>
       </w:r>
     </w:p>
     <w:p>
       <w:r>
-        <w:t>Current bounds include 250000 tokens, 100000 IR nodes, nesting 128 and 10000 diagnostics. Opaque assembler, malformed syntax and unsupported grammar are partial. Tests use exact golden IR, encoding edge cases, cyclic includes, passive malicious imports and changed source. Maintain source byte ranges and diagnostics when extending support.</w:t>
+        <w:t>The Pascal parser extracts declarations, routines, anonymous methods and supported statements into IR. Declaration and implementation occurrences remain distinguishable before semantic unification. The form parser accepts supported text and binary DFM/FMX structures without loading component packages. The inventory reads relevant project configuration and resources through bounded adapters.</w:t>
       </w:r>
     </w:p>
     <w:p>
-      <w:pPr>
-        <w:pStyle w:val="Heading1"/>
-      </w:pPr>
-      <w:r>
-        <w:t>Symbols and typed relationships</w:t>
+      <w:r>
+        <w:t>Current bounds include 250000 tokens, 100000 IR nodes, nesting 128 and 10000 diagnostics. Opaque assembler, malformed syntax and unsupported grammar are partial. Tests use exact golden IR, encoding edge cases, cyclic includes, passive malicious imports and changed source. Maintain source byte ranges and diagnostics when extending support.</w:t>
       </w:r>
     </w:p>
     <w:p>
-      <w:r>
-        <w:t>DPH.Analysis.Model defines semantic schema 1 and analyzer DPH-WP3-11. Stable symbol keys contain qualified identity, signature and conditional variant. DPH.Analysis.Symbols unifies supported routine prototypes and bodies, resolves cross-unit declarations, typed receivers and suitable overloads, associates form events and records anonymous callbacks.</w:t>
+      <w:pPr>
+        <w:pStyle w:val="Heading1"/>
+      </w:pPr>
+      <w:r>
+        <w:t>Symbols and typed relationships</w:t>
       </w:r>
     </w:p>
     <w:p>
       <w:r>
-        <w:t>Relationship certainty is confirmed_static, possible_dynamic, inferred, runtime_observed or unresolved. Passive scanning never claims runtime_observed. A uses dependency is not a call. Known lexical calls, serialized bindings and declared types carry derivation rules and source ranges. Recognized asynchronous API spelling can establish a possible scheduling relationship without proving execution order.</w:t>
+        <w:t>DPH.Analysis.Model defines semantic schema 1 and analyzer DPH-WP3-11. Stable symbol keys contain qualified identity, signature and conditional variant. DPH.Analysis.Symbols unifies supported routine prototypes and bodies, resolves cross-unit declarations, typed receivers and suitable overloads, associates form events and records anonymous callbacks.</w:t>
       </w:r>
     </w:p>
     <w:p>
       <w:r>
-        <w:t>Method pointers, unresolved receivers, dynamic dispatch, generated types and framework behavior must retain uncertainty. Basic reads, writes, callback assignment, static SQL spelling and report-model rendering are conservative analyses. Renames are distinct identities until continuity is reviewed; offsets alone must not reassign knowledge.</w:t>
+        <w:t>Relationship certainty is confirmed_static, possible_dynamic, inferred, runtime_observed or unresolved. Passive scanning never claims runtime_observed. A uses dependency is not a call. Known lexical calls, serialized bindings and declared types carry derivation rules and source ranges. Recognized asynchronous API spelling can establish a possible scheduling relationship without proving execution order.</w:t>
       </w:r>
     </w:p>
     <w:p>
-      <w:pPr>
-        <w:pStyle w:val="Heading1"/>
-      </w:pPr>
-      <w:r>
-        <w:t>Control flow and impact</w:t>
+      <w:r>
+        <w:t>Method pointers, unresolved receivers, dynamic dispatch, generated types and framework behavior must retain uncertainty. Basic reads, writes, callback assignment, static SQL spelling and report-model rendering are conservative analyses. Renames are distinct identities until continuity is reviewed; offsets alone must not reassign knowledge.</w:t>
       </w:r>
     </w:p>
     <w:p>
-      <w:r>
-        <w:t>DPH.Analysis.Flow builds per-routine control-flow nodes and typed edges for supported sequences, branches, loops, returns and exception/finally paths. Routine identity, source hash, range, node kind and expression remain available to inspectors and exports. Flow is bounded to 100000 nodes, 300000 edges and nesting 128.</w:t>
+      <w:pPr>
+        <w:pStyle w:val="Heading1"/>
+      </w:pPr>
+      <w:r>
+        <w:t>Control flow and impact</w:t>
       </w:r>
     </w:p>
     <w:p>
       <w:r>
-        <w:t>Impact traversal is possible reachability through supported relationships. Do not label it proved runtime impact. The UI bounds a displayed graph to 120 nodes and 960 edges, while the stored semantic graph is the fuller evidence model. Uncertain edges remain visually distinct. Unsupported flow does not become a fabricated successful path.</w:t>
+        <w:t>DPH.Analysis.Flow builds per-routine control-flow nodes and typed edges for supported sequences, branches, loops, returns and exception/finally paths. Routine identity, source hash, range, node kind and expression remain available to inspectors and exports. Flow is bounded to 100000 nodes, 300000 edges and nesting 128.</w:t>
       </w:r>
     </w:p>
     <w:p>
-      <w:pPr>
-        <w:pStyle w:val="Heading1"/>
-      </w:pPr>
-      <w:r>
-        <w:t>SQLite generations and durability</w:t>
+      <w:r>
+        <w:t>Impact traversal is possible reachability through supported relationships. Do not label it proved runtime impact. The UI bounds a displayed graph to 120 nodes and 960 edges, while the stored semantic graph is the fuller evidence model. Uncertain edges remain visually distinct. Unsupported flow does not become a fabricated successful path.</w:t>
       </w:r>
     </w:p>
     <w:p>
-      <w:r>
-        <w:t>TDPHKnowledgeStore owns one FireDAC SQLite connection on its creating thread and serializes writer access through a named mutex. Foreign keys and synchronous FULL are enabled. Default journal mode is DELETE; WAL is an explicit local-store option. Direct cross-thread writes are rejected. SQLite 3.42.0 with FTS5 was measured by the storage tests.</w:t>
+      <w:pPr>
+        <w:pStyle w:val="Heading1"/>
+      </w:pPr>
+      <w:r>
+        <w:t>SQLite generations and durability</w:t>
       </w:r>
     </w:p>
     <w:p>
       <w:r>
-        <w:t>Schema 9 is created through nine checksum-verified migrations. Existing migration text is immutable. A newer incompatible schema is rejected safely. Failed upgrade DDL and ledger changes roll back, and an upgrade from an existing schema makes a recoverable pre-migration database backup. Interrupted running generations recover as failed, preserving the previous published head.</w:t>
+        <w:t>TDPHKnowledgeStore owns one FireDAC SQLite connection on its creating thread and serializes writer access through a named mutex. Foreign keys and synchronous FULL are enabled. Default journal mode is DELETE; WAL is an explicit local-store option. Direct cross-thread writes are rejected. SQLite 3.42.0 with FTS5 was measured by the storage tests.</w:t>
       </w:r>
     </w:p>
     <w:p>
       <w:r>
-        <w:t>ObserveManifest records current fingerprints independently of the capture. BeginGeneration freezes configuration and manifest identity. Syntax and semantic facts are staged in transactions. Before publication, inputs and configuration are revalidated. Only a coherent complete generation becomes the current head. Partial, failed or superseded captures cannot clear the exact-input stale state or overwrite a prior current head.</w:t>
+        <w:t>Schema 9 is created through nine checksum-verified migrations. Existing migration text is immutable. A newer incompatible schema is rejected safely. Failed upgrade DDL and ledger changes roll back, and an upgrade from an existing schema makes a recoverable pre-migration database backup. Interrupted running generations recover as failed, preserving the previous published head.</w:t>
       </w:r>
     </w:p>
     <w:p>
-      <w:pPr>
-        <w:pStyle w:val="Heading1"/>
-      </w:pPr>
-      <w:r>
-        <w:t>Evidence and immutable history</w:t>
+      <w:r>
+        <w:t>ObserveManifest records current fingerprints independently of the capture. BeginGeneration freezes configuration and manifest identity. Syntax and semantic facts are staged in transactions. Before publication, inputs and configuration are revalidated. Only a coherent complete generation becomes the current head. Partial, failed or superseded captures cannot clear the exact-input stale state or overwrite a prior current head.</w:t>
       </w:r>
     </w:p>
     <w:p>
-      <w:r>
-        <w:t>Normalized tables include projects, configurations, source files, file revisions, generations, generation files, entities, entity versions, evidence, relationships, component properties, control-flow nodes and edges, knowledge records and revisions, links, review tasks, translations, artifacts, export jobs and audit events. Foreign keys tie evidence and relationships to their producing generation.</w:t>
+      <w:pPr>
+        <w:pStyle w:val="Heading1"/>
+      </w:pPr>
+      <w:r>
+        <w:t>Evidence and immutable history</w:t>
       </w:r>
     </w:p>
     <w:p>
       <w:r>
-        <w:t>Triggers prevent mutation of terminal generations, source revisions, captured facts, configurations and authored knowledge revisions. Evidence ranges must fit the captured source bytes and use the generation analyzer version. Historical file and entity identities cannot be changed casually. A missing source is retained as missing; its historical annotations survive.</w:t>
+        <w:t>Normalized tables include projects, configurations, source files, file revisions, generations, generation files, entities, entity versions, evidence, relationships, component properties, control-flow nodes and edges, knowledge records and revisions, links, review tasks, translations, artifacts, export jobs and audit events. Foreign keys tie evidence and relationships to their producing generation.</w:t>
       </w:r>
     </w:p>
     <w:p>
       <w:r>
-        <w:t>Modification detected, analysis stale, knowledge review needed, analysis failed and reassessment requested are separate persistent flags. A UI summary is a projection of these states, not a replacement for them. Parser success must not clear human review.</w:t>
+        <w:t>Triggers prevent mutation of terminal generations, source revisions, captured facts, configurations and authored knowledge revisions. Evidence ranges must fit the captured source bytes and use the generation analyzer version. Historical file and entity identities cannot be changed casually. A missing source is retained as missing; its historical annotations survive.</w:t>
       </w:r>
     </w:p>
     <w:p>
-      <w:pPr>
-        <w:pStyle w:val="Heading1"/>
-      </w:pPr>
-      <w:r>
-        <w:t>Background coordination and cached views</w:t>
+      <w:r>
+        <w:t>Modification detected, analysis stale, knowledge review needed, analysis failed and reassessment requested are separate persistent flags. A UI summary is a projection of these states, not a replacement for them. Parser success must not clear human review.</w:t>
       </w:r>
     </w:p>
     <w:p>
-      <w:r>
-        <w:t>DPH.Workspace.Worker is a persistent TThread with bounded request and response queues. It initializes COM for passive MSXML parsing, owns database operations in the worker, and retains analyzer instances across requests. FMX polls responses with a timer, avoiding queued closures that outlive the form.</w:t>
+      <w:pPr>
+        <w:pStyle w:val="Heading1"/>
+      </w:pPr>
+      <w:r>
+        <w:t>Background coordination and cached views</w:t>
       </w:r>
     </w:p>
     <w:p>
       <w:r>
-        <w:t>A stopped Delphi queue can report success while returning an empty item. Poll checks both the wait result and a non-nil response; shutdown tests guard against a destructor loop. Cancellation is checked between stages and marks a staged running generation failed when appropriate. It is not a promise of interruption inside every parser loop.</w:t>
+        <w:t>DPH.Workspace.Worker is a persistent TThread with bounded request and response queues. It initializes COM for passive MSXML parsing, owns database operations in the worker, and retains analyzer instances across requests. FMX polls responses with a timer, avoiding queued closures that outlive the form.</w:t>
       </w:r>
     </w:p>
     <w:p>
       <w:r>
-        <w:t>Workspace projections are managed JSON files in database.dphdb.views named by SHA256 and registered in artifacts. Cached opening verifies the managed path, size, checksum and generation. Cached facts are delivered before automatic verification when the original source entry is available; unavailable source remains detached. Connected checks compare manifest fingerprints and selection identity every ten seconds. Syntax and routine semantic caches are bounded and binding-context aware; conservative postprocessing remains separate from reused routine facts.</w:t>
+        <w:t>A stopped Delphi queue can report success while returning an empty item. Poll checks both the wait result and a non-nil response; shutdown tests guard against a destructor loop. Cancellation is checked between stages and marks a staged running generation failed when appropriate. It is not a promise of interruption inside every parser loop.</w:t>
       </w:r>
     </w:p>
     <w:p>
-      <w:pPr>
-        <w:pStyle w:val="Heading1"/>
-      </w:pPr>
-      <w:r>
-        <w:t>FMX navigation and visualization</w:t>
+      <w:r>
+        <w:t>Workspace projections are managed JSON files in database.dphdb.views named by SHA256 and registered in artifacts. Cached opening verifies the managed path, size, checksum and generation. Cached facts are delivered before automatic verification when the original source entry is available; unavailable source remains detached. Connected checks compare manifest fingerprints and selection identity every ten seconds. Syntax and routine semantic caches are bounded and binding-context aware; conservative postprocessing remains separate from reused routine facts.</w:t>
       </w:r>
     </w:p>
     <w:p>
-      <w:r>
-        <w:t>DPH.UI.Main binds its published controls to the FMX resource. Explorer queries are paged at 250 rows; data filtering supports kind, text and qualified scope. History and bookmarks use canonical keys, with surviving same-project bookmarks retained across reassessment. Inspector output retains source metadata and serialized properties. Source memo navigation is permitted only after live hash validation.</w:t>
+      <w:pPr>
+        <w:pStyle w:val="Heading1"/>
+      </w:pPr>
+      <w:r>
+        <w:t>FMX navigation and visualization</w:t>
       </w:r>
     </w:p>
     <w:p>
       <w:r>
-        <w:t>OpenSelection queues a candidate without replacing the current database, source or workspace. PollTimer installs it only after the worker returns accepted captured evidence. The worker preflights source identity before creating a database; cached opens check captured XML ProjectGuid and Pascal program declarations before returning a view. Rejections retain the current workspace, and rejected startup caches show Getting started. Inventory identity also covers referenced project groups. DatabaseDialog.InitialDir is the design-time relative default; startup resolves it under the deployment root, creates that folder, and applies the same path to OpenCacheDialog. Distribution packaging copies only the Databases instructions, never its databases or views.</w:t>
+        <w:t>DPH.UI.Main binds its published controls to the FMX resource. Explorer queries are paged at 250 rows; data filtering supports kind, text and qualified scope. History and bookmarks use canonical keys, with surviving same-project bookmarks retained across reassessment. Inspector output retains source metadata and serialized properties. Source memo navigation is permitted only after live hash validation.</w:t>
       </w:r>
     </w:p>
     <w:p>
       <w:r>
-        <w:t>Graph paint boxes draw bounded evidence data with palette and geometry values supplied by design-time style rectangles. Screen reconstruction draws approximate source-derived rectangles without creating components. Its gallery is bounded to 60 forms. Runtime styles, custom painting and inherited resources are not silently fabricated.</w:t>
+        <w:t>OpenSelection queues a candidate without replacing the current database, source or workspace. PollTimer installs it only after the worker returns accepted captured evidence. The worker preflights source identity before creating a database; cached opens check captured XML ProjectGuid and Pascal program declarations before returning a view. Rejections retain the current workspace, and rejected startup caches show Getting started. Inventory identity also covers referenced project groups. DatabaseDialog.InitialDir is the design-time relative default; startup resolves it under the deployment root, creates that folder, and applies the same path to OpenCacheDialog. Distribution packaging copies only the Databases instructions, never its databases or views.</w:t>
       </w:r>
     </w:p>
     <w:p>
       <w:r>
-        <w:t>Keep lifecycle and ownership explicit: the view owns its JSON document, UI arrays own their records, responses transfer document or knowledge ownership to the main form, and the worker frees unconsumed responses during shutdown. Guard unsaved authored text before changing projects or replacing editor state.</w:t>
+        <w:t>Graph paint boxes draw bounded evidence data with palette and geometry values supplied by design-time style rectangles. Screen reconstruction draws approximate source-derived rectangles without creating components. Its gallery is bounded to 60 forms. Runtime styles, custom painting and inherited resources are not silently fabricated.</w:t>
       </w:r>
     </w:p>
     <w:p>
-      <w:pPr>
-        <w:pStyle w:val="Heading1"/>
-      </w:pPr>
-      <w:r>
-        <w:t>Curated knowledge and review</w:t>
+      <w:r>
+        <w:t>Keep lifecycle and ownership explicit: the view owns its JSON document, UI arrays own their records, responses transfer document or knowledge ownership to the main form, and the worker frees unconsumed responses during shutdown. Guard unsaved authored text before changing projects or replacing editor state.</w:t>
       </w:r>
     </w:p>
     <w:p>
-      <w:r>
-        <w:t>SaveKnowledge requires title, body, a named author, a supported kind and a captured generation. Existing records require their expected revision and stable kind. Ordinary titles stay stable; structured glossary names can change while their identity and history remain intact. Each edit appends a needs_review revision, preserves links and opens a pending task. Knowledge bodies are bounded to 1 MiB. Authored text is never regenerated from parser output.</w:t>
+      <w:pPr>
+        <w:pStyle w:val="Heading1"/>
+      </w:pPr>
+      <w:r>
+        <w:t>Curated knowledge and review</w:t>
       </w:r>
     </w:p>
     <w:p>
       <w:r>
-        <w:t>ReviewKnowledge requires the expected current revision, a named reviewer and a matching captured source/configuration. The connected worker observes current source before accepting a review. A missing linked entity cannot be verified under a replacement name. Verification, rejection or retirement appends a revision and records attribution; history remains append only.</w:t>
+        <w:t>SaveKnowledge requires title, body, a named author, a supported kind and a captured generation. Existing records require their expected revision and stable kind. Ordinary titles stay stable; structured glossary names can change while their identity and history remain intact. Each edit appends a needs_review revision, preserves links and opens a pending task. Knowledge bodies are bounded to 1 MiB. Authored text is never regenerated from parser output.</w:t>
       </w:r>
     </w:p>
     <w:p>
       <w:r>
-        <w:t>Manifest and configuration changes conservatively invalidate active knowledge, derived artifacts and translations. A partial static capture may support review of an attributable statement against available evidence, but its partial coverage remains visible. Local names are not authenticated enterprise identities. Human verification and automatic static derivation remain different evidence categories.</w:t>
+        <w:t>ReviewKnowledge requires the expected current revision, a named reviewer and a matching captured source/configuration. The connected worker observes current source before accepting a review. A missing linked entity cannot be verified under a replacement name. Verification, rejection or retirement appends a revision and records attribution; history remains append only.</w:t>
       </w:r>
     </w:p>
     <w:p>
-      <w:pPr>
-        <w:pStyle w:val="Heading1"/>
-      </w:pPr>
-      <w:r>
-        <w:t>Canonical publication and privacy</w:t>
+      <w:r>
+        <w:t>Manifest and configuration changes conservatively invalidate active knowledge, derived artifacts and translations. A partial static capture may support review of an attributable statement against available evidence, but its partial coverage remains visible. Local names are not authenticated enterprise identities. Human verification and automatic static derivation remain different evidence categories.</w:t>
       </w:r>
     </w:p>
     <w:p>
-      <w:r>
-        <w:t>DPH.Publish.Model constructs one versioned documentation model from a captured workspace and current curated knowledge. It carries generation, configuration, input/context fingerprints, detached/stale state, symbols, typed relationships, control flow, source references, human history, coverage and explicit unknowns. Full and task-scoped views share those facts.</w:t>
+      <w:pPr>
+        <w:pStyle w:val="Heading1"/>
+      </w:pPr>
+      <w:r>
+        <w:t>Canonical publication and privacy</w:t>
       </w:r>
     </w:p>
     <w:p>
       <w:r>
-        <w:t>Task scope selects the requested identities and complete direct incident context. It rejects missing or excluded seeds and rejects an oversized task rather than silently truncating a full export. External source roots and sensitive filename categories are excluded by default. Explicit relative prefix exclusions remove file-derived symbols and relationships. Source snapshots and generated AGENTS.md are absent by default.</w:t>
+        <w:t>DPH.Publish.Model constructs one versioned documentation model from a captured workspace and current curated knowledge. It carries generation, configuration, input/context fingerprints, detached/stale state, symbols, typed relationships, control flow, source references, human history, coverage and explicit unknowns. Full and task-scoped views share those facts.</w:t>
       </w:r>
     </w:p>
     <w:p>
       <w:r>
-        <w:t>Redaction recognizes common credential assignments, private keys, AWS access keys and JWT-shaped tokens throughout string data. It is defense in depth, not a guarantee that every project-specific secret format is recognizable. Require explicit exclusions and a disclosure review for sensitive content. No translation or AI provider is contacted by normal publishing.</w:t>
+        <w:t>Task scope selects the requested identities and complete direct incident context. It rejects missing or excluded seeds and rejects an oversized task rather than silently truncating a full export. External source roots and sensitive filename categories are excluded by default. Explicit relative prefix exclusions remove file-derived symbols and relationships. Source snapshots and generated AGENTS.md are absent by default.</w:t>
       </w:r>
     </w:p>
     <w:p>
-      <w:pPr>
-        <w:pStyle w:val="Heading1"/>
-      </w:pPr>
-      <w:r>
-        <w:t>HTML guides and bundle validation</w:t>
+      <w:r>
+        <w:t>Redaction recognizes common credential assignments, private keys, AWS access keys and JWT-shaped tokens throughout string data. It is defense in depth, not a guarantee that every project-specific secret format is recognizable. Require explicit exclusions and a disclosure review for sensitive content. No translation or AI provider is contacted by normal publishing.</w:t>
       </w:r>
     </w:p>
     <w:p>
-      <w:r>
-        <w:t>DPH.Publish.Export writes a new destination outside source. The offline HTML uses encoded imported text, local search and styles, internal anchors, print CSS and a restrictive content security policy. The default WebView2 policy permits only the authorized local index and about:blank; publication explicitly enables hash-named object pages in its managed objects folder. Help retains the index-only policy; learning explicitly permits content-hashed pages only inside its owned preview directory. There is no arbitrary native bridge. Data does not supply executable markup.</w:t>
+      <w:pPr>
+        <w:pStyle w:val="Heading1"/>
+      </w:pPr>
+      <w:r>
+        <w:t>HTML guides and bundle validation</w:t>
       </w:r>
     </w:p>
     <w:p>
       <w:r>
-        <w:t>JSONL indexes contain symbols, relationships, forms/events, data usage, configuration, flow nodes, knowledge and evidence references. Manifest and checksum files accompany canonical.json. The validator checks filenames, hashes, expected input fingerprint, canonical identity, source hash/range, generation and cross-reference integrity. A stale manifest is rejected by default. Unsigned hashes establish integrity relative to the index, not author authenticity.</w:t>
+        <w:t>DPH.Publish.Export writes a new destination outside source. The offline HTML uses encoded imported text, local search and styles, internal anchors, print CSS and a restrictive content security policy. The default WebView2 policy permits only the authorized local index and about:blank; publication explicitly enables hash-named object pages in its managed objects folder. Help retains the index-only policy; learning explicitly permits content-hashed pages only inside its owned preview directory. There is no arbitrary native bridge. Data does not supply executable markup.</w:t>
       </w:r>
     </w:p>
     <w:p>
       <w:r>
-        <w:t>Editable engineering and user DOCX guides derive from the same sections and evidence model. They include title, last changed capture identity and a changeable TOC field. LibreOffice provides companion PDFs; the project rendering tool verifies cached page numbers and renders page images for layout inspection. Missing business procedures stay explicitly absent rather than being invented.</w:t>
+        <w:t>JSONL indexes contain symbols, relationships, forms/events, data usage, configuration, flow nodes, knowledge and evidence references. Manifest and checksum files accompany canonical.json. The validator checks filenames, hashes, expected input fingerprint, canonical identity, source hash/range, generation and cross-reference integrity. A stale manifest is rejected by default. Unsigned hashes establish integrity relative to the index, not author authenticity.</w:t>
       </w:r>
     </w:p>
     <w:p>
-      <w:pPr>
-        <w:pStyle w:val="Heading1"/>
-      </w:pPr>
-      <w:r>
-        <w:t>Translation boundary</w:t>
+      <w:r>
+        <w:t>Editable engineering and user DOCX guides derive from the same sections and evidence model. They include title, last changed capture identity and a changeable TOC field. LibreOffice provides companion PDFs; the project rendering tool verifies cached page numbers and renders page images for layout inspection. Missing business procedures stay explicitly absent rather than being invented.</w:t>
       </w:r>
     </w:p>
     <w:p>
-      <w:r>
-        <w:t>IDPHTranslationProvider exposes provider identity, version, external status and prose translation. Protected segments retain identifiers, SQL, paths, hashes and protocol keys byte for byte. Cache keys include source content, revision, source/target locales and provider/version. Changed prose produces a fresh pending entry; named review applies to the exact cached translation.</w:t>
+      <w:pPr>
+        <w:pStyle w:val="Heading1"/>
+      </w:pPr>
+      <w:r>
+        <w:t>Translation boundary</w:t>
       </w:r>
     </w:p>
     <w:p>
       <w:r>
-        <w:t>TDPHAtlasAdapter reads explicitly selected DAT JSON packs offline. The independent Apache-2.0 reader snapshot and license reside under dependencies\DelphiAppTranslation; VCL2FMX is unchanged and is not a build or runtime dependency. No network provider is configured. Tests exercise actual packs, persistent cache, terminology changes, source invalidation and exact-content named review. The offline GTranslate region is disabled, with local bilingual labels and sorting; do not activate network translation merely because a generic widget name appears in documentation.</w:t>
+        <w:t>IDPHTranslationProvider exposes provider identity, version, external status and prose translation. Protected segments retain identifiers, SQL, paths, hashes and protocol keys byte for byte. Cache keys include source content, revision, source/target locales and provider/version. Changed prose produces a fresh pending entry; named review applies to the exact cached translation.</w:t>
       </w:r>
     </w:p>
     <w:p>
-      <w:pPr>
-        <w:pStyle w:val="Heading1"/>
-      </w:pPr>
-      <w:r>
-        <w:t>Verification and release discipline</w:t>
+      <w:r>
+        <w:t>TDPHAtlasAdapter reads explicitly selected DAT JSON packs offline. The independent Apache-2.0 reader snapshot and license reside under dependencies\DelphiAppTranslation; VCL2FMX is unchanged and is not a build or runtime dependency. No network provider is configured. Tests exercise actual packs, persistent cache, terminology changes, source invalidation and exact-content named review. The offline GTranslate region is disabled, with local bilingual labels and sorting; do not activate network translation merely because a generic widget name appears in documentation.</w:t>
       </w:r>
     </w:p>
     <w:p>
-      <w:r>
-        <w:t>Run the phase build/test scripts elevated with the installed toolchain. WP0 checks FMX resource ownership; WP1 checks storage, crash recovery and migrations; WP2 checks inventory, encoding, syntax and source safety; WP3 checks semantics and pinned reference traces; WP4 checks workspace/background behavior; WP5 checks immutable authored history and pending review; WP6 checks publication, exclusions, sanitization, hashes and translation protection.</w:t>
+      <w:pPr>
+        <w:pStyle w:val="Heading1"/>
+      </w:pPr>
+      <w:r>
+        <w:t>Verification and release discipline</w:t>
       </w:r>
     </w:p>
     <w:p>
       <w:r>
-        <w:t>Use exact input hashes before and after analysis, including failures. Preserve original reference and instruction files. Keep tests that demonstrate invariants rather than tests that merely mirror implementation. New source, validation failure or unresolved risk justifies another targeted test; a passing unchanged phase does not need endless repetition.</w:t>
+        <w:t>Run the phase build/test scripts elevated with the installed toolchain. WP0 checks FMX resource ownership; WP1 checks storage, crash recovery and migrations; WP2 checks inventory, encoding, syntax and source safety; WP3 checks semantics and pinned reference traces; WP4 checks workspace/background behavior; WP5 checks immutable authored history and pending review; WP6 checks publication, exclusions, sanitization, hashes and translation protection.</w:t>
       </w:r>
     </w:p>
     <w:p>
       <w:r>
-        <w:t>H: development backups are enabled. Allow at least 60 seconds for this USB drive to wake before assessing availability. Git remains enabled: review intended changes, commit validated work and push both public and private remotes without force or history rewriting. Remove a stale zero-byte index lock only after verifying no Git process runs. WP7 records measured performance, portability, security and explicit acceptance evidence. Independent first-time programmer acceptance and unknown historical business intent cannot be invented by automation.</w:t>
+        <w:t>Use exact input hashes before and after analysis, including failures. Preserve original reference and instruction files. Keep tests that demonstrate invariants rather than tests that merely mirror implementation. New source, validation failure or unresolved risk justifies another targeted test; a passing unchanged phase does not need endless repetition.</w:t>
       </w:r>
     </w:p>
     <w:p>
       <w:r>
-        <w:t>In the historical pre-rework benchmark on the recorded Core i7-1165G7 host with eight logical processors and about 16 GB RAM, the pinned reference pipeline measured 82.6 seconds for full capture, 2.87 seconds for cached opening and 75.9 seconds for incremental reassessment. The message-pump maximum gap was 64 ms. Peak test-process working set was about 1.21 GiB, including repeated captures, JSON cloning and FMX/WebView2 tests. These are baseline measurements, not agreed hardware-independent budgets. Large syntax-cache fallback and conservative semantic recomputation explain the modest reassessment speedup. Formal acceptance retains independent complex-flow review, missing business/user content, AC-25 and performance-budget agreement as outstanding.</w:t>
+        <w:t>H: development backups are enabled. Allow at least 60 seconds for this USB drive to wake before assessing availability. Git remains enabled: review intended changes, commit validated work and push both public and private remotes without force or history rewriting. Remove a stale zero-byte index lock only after verifying no Git process runs. WP7 records measured performance, portability, security and explicit acceptance evidence. Independent first-time programmer acceptance and unknown historical business intent cannot be invented by automation.</w:t>
       </w:r>
     </w:p>
     <w:p>
-      <w:pPr>
-        <w:pStyle w:val="Heading1"/>
-      </w:pPr>
-      <w:r>
-        <w:t>Current semantic cache and extended evidence</w:t>
+      <w:r>
+        <w:t>In the historical pre-rework benchmark on the recorded Core i7-1165G7 host with eight logical processors and about 16 GB RAM, the pinned reference pipeline measured 82.6 seconds for full capture, 2.87 seconds for cached opening and 75.9 seconds for incremental reassessment. The message-pump maximum gap was 64 ms. Peak test-process working set was about 1.21 GiB, including repeated captures, JSON cloning and FMX/WebView2 tests. These are baseline measurements, not agreed hardware-independent budgets. Large syntax-cache fallback and conservative semantic recomputation explain the modest reassessment speedup. Formal acceptance retains independent complex-flow review, missing business/user content, AC-25 and performance-budget agreement as outstanding.</w:t>
       </w:r>
     </w:p>
     <w:p>
-      <w:r>
-        <w:t>The current analyzers are DPH-WP2-5 and DPH-WP3-11 with IR and semantic schema 1. Routine semantic cache reuse is bounded to 512 records and 32 MiB. Binding context hashes invalidate affected reuse. Synthetic startup and postprocessing occur after reusable routine facts, preserving their relationships to current identities. This is bounded evidence reuse; it is not a proof of an optimal incremental solver.</w:t>
+      <w:pPr>
+        <w:pStyle w:val="Heading1"/>
+      </w:pPr>
+      <w:r>
+        <w:t>Current semantic cache and extended evidence</w:t>
       </w:r>
     </w:p>
     <w:p>
       <w:r>
-        <w:t>Supported extensions include typed aliases, inheritance and accessors, startup entry and unit phases, case/goto/with control flow, asynchronous operation handles and captures, cancellation and event waits, formal arguments and result producers, static SQL projection, output-writer lineage, lifetime and exception relationships, explicit test-call links, and qualified form navigation. Every relationship retains resolution, source range/hash and rule. Unsupported grammar, aliases and dynamic behavior remain diagnosed or qualified.</w:t>
+        <w:t>The current analyzers are DPH-WP2-5 and DPH-WP3-11 with IR and semantic schema 1. Routine semantic cache reuse is bounded to 512 records and 32 MiB. Binding context hashes invalidate affected reuse. Synthetic startup and postprocessing occur after reusable routine facts, preserving their relationships to current identities. This is bounded evidence reuse; it is not a proof of an optimal incremental solver.</w:t>
       </w:r>
     </w:p>
     <w:p>
-      <w:pPr>
-        <w:pStyle w:val="Heading1"/>
-      </w:pPr>
-      <w:r>
-        <w:t>Current schema and authored document contracts</w:t>
+      <w:r>
+        <w:t>Supported extensions include typed aliases, inheritance and accessors, startup entry and unit phases, case/goto/with control flow, asynchronous operation handles and captures, cancellation and event waits, formal arguments and result producers, static SQL projection, output-writer lineage, lifetime and exception relationships, explicit test-call links, and qualified form navigation. Every relationship retains resolution, source range/hash and rule. Unsupported grammar, aliases and dynamic behavior remain diagnosed or qualified.</w:t>
       </w:r>
     </w:p>
     <w:p>
-      <w:r>
-        <w:t>Schema 9 uses checksum-verified migrations 001 through 009. document_section_versions associates immutable authored revisions with stable section ID, document kind, audience and source generation. knowledge_revision_links preserves ordinal, target kind/identity, captured generation, role and label. knowledge_questions preserves the exact deterministic question identity and captured JSON associated with a response record.</w:t>
+      <w:pPr>
+        <w:pStyle w:val="Heading1"/>
+      </w:pPr>
+      <w:r>
+        <w:t>Current schema and authored document contracts</w:t>
       </w:r>
     </w:p>
     <w:p>
       <w:r>
-        <w:t>SaveKnowledge appends immutable text and link snapshots. Empty LinksJSON preserves the prior snapshot; an explicit JSON array replaces it. Entity, relationship and evidence targets remain tied to generation identities; screenshot targets reference managed artifacts; section targets pin an exact knowledge revision. Current reverse section references open review when their targets change. Verify rejects obsolete rich-link generations or target revisions.</w:t>
+        <w:t>Schema 9 uses checksum-verified migrations 001 through 009. document_section_versions associates immutable authored revisions with stable section ID, document kind, audience and source generation. knowledge_revision_links preserves ordinal, target kind/identity, captured generation, role and label. knowledge_questions preserves the exact deterministic question identity and captured JSON associated with a response record.</w:t>
       </w:r>
     </w:p>
     <w:p>
       <w:r>
-        <w:t>Question identity hashes kind, entity key, range, source hash, prompt, rule and context fingerprint. Generation is retained separately, allowing unchanged evidence to keep its question identity across captures. An answer needs actual text after Answer. Only verified content with no pending task suppresses an exact question. Export converts question metadata to typed JSON before recursive redaction.</w:t>
+        <w:t>SaveKnowledge appends immutable text and link snapshots. Empty LinksJSON preserves the prior snapshot; an explicit JSON array replaces it. Entity, relationship and evidence targets remain tied to generation identities; screenshot targets reference managed artifacts; section targets pin an exact knowledge revision. Current reverse section references open review when their targets change. Verify rejects obsolete rich-link generations or target revisions.</w:t>
       </w:r>
     </w:p>
     <w:p>
-      <w:pPr>
-        <w:pStyle w:val="Heading1"/>
-      </w:pPr>
-      <w:r>
-        <w:t>Native review and learning projections</w:t>
+      <w:r>
+        <w:t>Question identity hashes kind, entity key, range, source hash, prompt, rule and context fingerprint. Generation is retained separately, allowing unchanged evidence to keep its question identity across captures. An answer needs actual text after Answer. Only verified content with no pending task suppresses an exact question. Export converts question metadata to typed JSON before recursive redaction.</w:t>
       </w:r>
     </w:p>
     <w:p>
-      <w:r>
-        <w:t>ReviewTasks provides bounded pending tasks, prior and current authored text, baseline/current configurations, affected object signatures, types, source hashes and relationship comparisons. A missing baseline is reported. Native controls invoke existing optimistic-revision and connected-source review checks; they do not create a separate approval authority.</w:t>
+      <w:pPr>
+        <w:pStyle w:val="Heading1"/>
+      </w:pPr>
+      <w:r>
+        <w:t>Native review and learning projections</w:t>
       </w:r>
     </w:p>
     <w:p>
       <w:r>
-        <w:t>RoutineLesson uses the routine CFG and an indexed outgoing-edge lookup. It explains source points, actual expressions and destination lines, with explicit loop, branch, early-return, cleanup and exceptional semantics. The same lesson is used by ObjectText and ObjectHTML; exported document prose and offline object pages therefore share its source interpretation. Its bounds are 60 points and eight outgoing paths per point.</w:t>
+        <w:t>ReviewTasks provides bounded pending tasks, prior and current authored text, baseline/current configurations, affected object signatures, types, source hashes and relationship comparisons. A missing baseline is reported. Native controls invoke existing optimistic-revision and connected-source review checks; they do not create a separate approval authority.</w:t>
       </w:r>
     </w:p>
     <w:p>
       <w:r>
-        <w:t>Preview HTML files have immutable content-hashed names, tracked for cleanup. BrowserPolicy allows them only in the owned preview directory when explicitly enabled. This avoids rewriting a file held by WebView2. Arbitrary filenames and external navigation remain blocked. Native browser tests render the app pages; they do not execute the analyzed application.</w:t>
+        <w:t>RoutineLesson uses the routine CFG and an indexed outgoing-edge lookup. It explains source points, actual expressions and destination lines, with explicit loop, branch, early-return, cleanup and exceptional semantics. The same lesson is used by ObjectText and ObjectHTML; exported document prose and offline object pages therefore share its source interpretation. Its bounds are 60 points and eight outgoing paths per point.</w:t>
       </w:r>
     </w:p>
     <w:p>
-      <w:pPr>
-        <w:pStyle w:val="Heading1"/>
-      </w:pPr>
-      <w:r>
-        <w:t>Saved observation persistence</w:t>
+      <w:r>
+        <w:t>Preview HTML files have immutable content-hashed names, tracked for cleanup. BrowserPolicy allows them only in the owned preview directory when explicitly enabled. This avoids rewriting a file held by WebView2. Arbitrary filenames and external navigation remain blocked. Native browser tests render the app pages; they do not execute the analyzed application.</w:t>
       </w:r>
     </w:p>
     <w:p>
-      <w:r>
-        <w:t>ImportObservation accepts explicitly selected UTF-8 text extracts up to 256 KiB with named contributor and run context. It checks generation and optional entity existence, captures original byte SHA256 and linked file-revision SHA256, and stores content plus attribution in a managed hash-named JSON artifact of kind runtime_observation. No schema migration is needed for this artifact kind.</w:t>
+      <w:pPr>
+        <w:pStyle w:val="Heading1"/>
+      </w:pPr>
+      <w:r>
+        <w:t>Saved observation persistence</w:t>
       </w:r>
     </w:p>
     <w:p>
       <w:r>
-        <w:t>ObservationsJSON verifies managed identity, size, checksum and generation before returning the newest 50 records. The response owns the array until PollTimer transfers it to the form. LoadView clears old observation rows; historical records cannot navigate as current. Saved text stays in a native read-only memo rather than an executable browser surface.</w:t>
+        <w:t>ImportObservation accepts explicitly selected UTF-8 text extracts up to 256 KiB with named contributor and run context. It checks generation and optional entity existence, captures original byte SHA256 and linked file-revision SHA256, and stores content plus attribution in a managed hash-named JSON artifact of kind runtime_observation. No schema migration is needed for this artifact kind.</w:t>
       </w:r>
     </w:p>
     <w:p>
       <w:r>
-        <w:t>ManagedArtifactPaths includes observations for explicit portable backup. Retention protects their associated captured views. Publication currently omits observations rather than automatically disclose potentially sensitive logs. Contributor claims do not set runtime_observed on static analysis or create an automated causal trace.</w:t>
+        <w:t>ObservationsJSON verifies managed identity, size, checksum and generation before returning the newest 50 records. The response owns the array until PollTimer transfers it to the form. LoadView clears old observation rows; historical records cannot navigate as current. Saved text stays in a native read-only memo rather than an executable browser surface.</w:t>
       </w:r>
     </w:p>
     <w:p>
-      <w:pPr>
-        <w:pStyle w:val="Heading1"/>
-      </w:pPr>
-      <w:r>
-        <w:t>Regression commands and evidence</w:t>
+      <w:r>
+        <w:t>ManagedArtifactPaths includes observations for explicit portable backup. Retention protects their associated captured views. Publication currently omits observations rather than automatically disclose potentially sensitive logs. Contributor claims do not set runtime_observed on static analysis or create an automated causal trace.</w:t>
       </w:r>
     </w:p>
     <w:p>
-      <w:r>
-        <w:t>Run commands from the project root in an elevated Command Prompt so RAD Studio can read its environment. tools\build-wp0.cmd builds the app and checks FMX bindings. tools\validate-completion-wp1.cmd serially builds app, catalog, lifecycle, workspace, knowledge, selection and startup tests, then removes recognized disposable fixture directories.</w:t>
+      <w:pPr>
+        <w:pStyle w:val="Heading1"/>
+      </w:pPr>
+      <w:r>
+        <w:t>Regression commands and evidence</w:t>
       </w:r>
     </w:p>
     <w:p>
       <w:r>
-        <w:t>Run tools\build-wp1.cmd for 46 storage checks, tools\build-wp2.cmd no-report for discovery/resource checks, and tools\build-wp3.cmd to compile semantic tests. Then explicitly run bin\Win32\Debug\DPH.Tests.Semantics.exe "C:\New Delphi Projects\Delphi Project Handoff"; the build script alone does not run semantic assertions.</w:t>
+        <w:t>Run commands from the project root in an elevated Command Prompt so RAD Studio can read its environment. tools\build-wp0.cmd builds the app and checks FMX bindings. tools\validate-completion-wp1.cmd serially builds app, catalog, lifecycle, workspace, knowledge, selection and startup tests, then removes recognized disposable fixture directories.</w:t>
       </w:r>
     </w:p>
     <w:p>
       <w:r>
-        <w:t>tools\build-learning.cmd exercises managed images, cached supplemental-evidence recovery, actual WebView2 rendering, source walkthroughs and collapsed CFGs. --no-ui isolates deterministic checks and is not native acceptance. tools\build-wp6.cmd checks canonical scope, redaction, link integrity, publication and translation protection. Use exact log files and current input hashes for claims; historical reports are not automatically refreshed acceptance.</w:t>
+        <w:t>Run tools\build-wp1.cmd for 46 storage checks, tools\build-wp2.cmd no-report for discovery/resource checks, and tools\build-wp3.cmd to compile semantic tests. Then explicitly run bin\Win32\Debug\DPH.Tests.Semantics.exe "C:\New Delphi Projects\Delphi Project Handoff"; the build script alone does not run semantic assertions.</w:t>
       </w:r>
     </w:p>
     <w:p>
       <w:r>
-        <w:t>A native-learning test once dereferenced an absent image array on a later background-verification response. It now checks the initial cached document/image response directly. Source attachment preserves supplemental-image warnings. Inspection disproved a proposed constructor race, and no worker thread-start change remains.</w:t>
+        <w:t>tools\build-learning.cmd exercises managed images, cached supplemental-evidence recovery, actual WebView2 rendering, source walkthroughs and collapsed CFGs. --no-ui isolates deterministic checks and is not native acceptance. tools\build-wp6.cmd checks canonical scope, redaction, link integrity, publication and translation protection. Use exact log files and current input hashes for claims; historical reports are not automatically refreshed acceptance.</w:t>
       </w:r>
     </w:p>
     <w:p>
-      <w:pPr>
-        <w:pStyle w:val="Heading1"/>
-      </w:pPr>
-      <w:r>
-        <w:t>Rebuild and inspect these manuals</w:t>
+      <w:r>
+        <w:t>A native-learning test once dereferenced an absent image array on a later background-verification response. It now checks the initial cached document/image response directly. Source attachment preserves supplemental-image warnings. Inspection disproved a proposed constructor race, and no worker thread-start change remains.</w:t>
       </w:r>
     </w:p>
     <w:p>
-      <w:r>
-        <w:t>tools\build-guides.py generates the two application manuals from maintained operating content and current implementation hashes. Use the approved Python executable C:\Users\marti\AppData\Local\Microsoft\WindowsApps\python.exe. tools\render-guides.ps1 renders with LibreOffice, populates cached page numbers in editable TOC fields, renders again and writes companion PDFs under docs\pdf.</w:t>
+      <w:pPr>
+        <w:pStyle w:val="Heading1"/>
+      </w:pPr>
+      <w:r>
+        <w:t>Rebuild and inspect these manuals</w:t>
       </w:r>
     </w:p>
     <w:p>
       <w:r>
-        <w:t>Inspect every final page PNG under bin\guide-qa for clipping, broken headings, unreadable code and TOC page numbers before delivering a guide. Rendered PNGs are QA outputs, not a mock application UI. Actual included interface images are identified by their capture source and fixture; they do not establish runtime behavior of a selected project.</w:t>
+        <w:t>tools\build-guides.py generates the two application manuals from maintained operating content and current implementation hashes. Use the approved Python executable C:\Users\marti\AppData\Local\Microsoft\WindowsApps\python.exe. tools\render-guides.ps1 renders with LibreOffice, populates cached page numbers in editable TOC fields, renders again and writes companion PDFs under docs\pdf.</w:t>
       </w:r>
     </w:p>
     <w:p>
       <w:r>
-        <w:t>Regenerate manuals after later translation, handoff-contract or source-navigation changes. The source evidence appendix records inspected file hashes, while docs\guide-source-validation.json provides a machine-readable manifest. A successful generator run alone is not proof that the writing, current behavior or layout is correct.</w:t>
+        <w:t>Inspect every final page PNG under bin\guide-qa for clipping, broken headings, unreadable code and TOC page numbers before delivering a guide. Rendered PNGs are QA outputs, not a mock application UI. Actual included interface images are identified by their capture source and fixture; they do not establish runtime behavior of a selected project.</w:t>
       </w:r>
     </w:p>
     <w:p>
-      <w:pPr>
-        <w:pStyle w:val="Heading1"/>
-      </w:pPr>
-      <w:r>
-        <w:t>Business glossary implementation and checks</w:t>
+      <w:r>
+        <w:t>Regenerate manuals after later translation, handoff-contract or source-navigation changes. The source evidence appendix records inspected file hashes, while docs\guide-source-validation.json provides a machine-readable manifest. A successful generator run alone is not proof that the writing, current behavior or layout is correct.</w:t>
       </w:r>
     </w:p>
     <w:p>
-      <w:r>
-        <w:t>DPH.Knowledge.Glossary validates a business_glossary structured record with term, aliases, definition, examples and relevance/evidence context. Names normalize case and repeated whitespace. Terms/aliases are bounded to 128 characters, 32 aliases per term, definitions/examples to 16384 characters, context to 4096 characters and the record to 64 KiB. Unknown fields, duplicate fields and non-text aliases are rejected.</w:t>
+      <w:pPr>
+        <w:pStyle w:val="Heading1"/>
+      </w:pPr>
+      <w:r>
+        <w:t>Business glossary implementation and checks</w:t>
       </w:r>
     </w:p>
     <w:p>
       <w:r>
-        <w:t>The existing migration 009 structured_json column stores the exact term fields on each immutable knowledge revision; no new migration is needed. SaveKnowledge enforces glossary kind, user document and all-reader audience, generated body agreement, project-local name uniqueness, type preservation and optimistic revision checks. Glossary titles can change while the knowledge ID and prior structured revisions remain intact. Retired records continue reserving their current names.</w:t>
+        <w:t>DPH.Knowledge.Glossary validates a business_glossary structured record with term, aliases, definition, examples and relevance/evidence context. Names normalize case and repeated whitespace. Terms/aliases are bounded to 128 characters, 32 aliases per term, definitions/examples to 16384 characters, context to 4096 characters and the record to 64 KiB. Unknown fields, duplicate fields and non-text aliases are rejected.</w:t>
       </w:r>
     </w:p>
     <w:p>
       <w:r>
-        <w:t>DPH.UI.Glossary.fmx defines every term editor control for the IDE/Object Inspector. DPH.UI.Main.fmx defines the glossary list, filter, detail memo and commands. Apply prepares a draft in the existing Knowledge pipeline. The modal editor retains a cloned saved revision so a background refresh cannot invalidate its input pointer. Current source links, explicit review, search and stale-source tracking use existing repository contracts.</w:t>
+        <w:t>The existing migration 009 structured_json column stores the exact term fields on each immutable knowledge revision; no new migration is needed. SaveKnowledge enforces glossary kind, user document and all-reader audience, generated body agreement, project-local name uniqueness, type preservation and optimistic revision checks. Glossary titles can change while the knowledge ID and prior structured revisions remain intact. Retired records continue reserving their current names.</w:t>
       </w:r>
     </w:p>
     <w:p>
       <w:r>
-        <w:t>DPH-LEARNING-8 publication emits a dedicated HTML glossary index and indexes/glossary.jsonl from the canonical knowledge records. Both user and engineering DOCX use those same records. Validate compares the glossary JSONL with the canonical glossary subset; recomputing the artifact hash cannot conceal divergent content. Older publication versions remain readable under their prior contract.</w:t>
+        <w:t>DPH.UI.Glossary.fmx defines every term editor control for the IDE/Object Inspector. DPH.UI.Main.fmx defines the glossary list, filter, detail memo and commands. Apply prepares a draft in the existing Knowledge pipeline. The modal editor retains a cloned saved revision so a background refresh cannot invalidate its input pointer. Current source links, explicit review, search and stale-source tracking use existing repository contracts.</w:t>
       </w:r>
     </w:p>
     <w:p>
       <w:r>
-        <w:t>From an elevated Command Prompt run cd /d "C:\New Delphi Projects\Delphi Project Handoff", then tools\build-glossary.cmd. The suite uses the fixed ignored bin\glossary-validation directory and controlled fixtures. It checks field validation, normalized conflicts, persistence, rename, immutable revisions, stale edits/reviews, isolation, source-linked invalidation, search, publication agreement/exclusions/tampering and IDE-designed native form workflows at normal/minimum sizes. Native images are FMX PaintTo renders of actual instantiated controls; they are not screenshots of the analyzed target application.</w:t>
+        <w:t>DPH-LEARNING-8 publication emits a dedicated HTML glossary index and indexes/glossary.jsonl from the canonical knowledge records. Both user and engineering DOCX use those same records. Validate compares the glossary JSONL with the canonical glossary subset; recomputing the artifact hash cannot conceal divergent content. Older publication versions remain readable under their prior contract.</w:t>
       </w:r>
     </w:p>
     <w:p>
       <w:r>
-        <w:t>Build the application with tools\build-wp0.cmd. Run tools\build-wp5.cmd for the existing knowledge/link/review regressions and tools\build-wp6.cmd for publishing/translation regressions. A FAIL or nonzero exit means the corresponding check failed. See docs\phase1-glossary-validation.json and the glossary completion note for actual current run evidence.</w:t>
+        <w:t>From an elevated Command Prompt run cd /d "C:\New Delphi Projects\Delphi Project Handoff", then tools\build-glossary.cmd. The suite uses the fixed ignored bin\glossary-validation directory and controlled fixtures. It checks field validation, normalized conflicts, persistence, rename, immutable revisions, stale edits/reviews, isolation, source-linked invalidation, search, publication agreement/exclusions/tampering and IDE-designed native form workflows at normal/minimum sizes. Native images are FMX PaintTo renders of actual instantiated controls; they are not screenshots of the analyzed target application.</w:t>
       </w:r>
     </w:p>
     <w:p>
-      <w:pPr>
-        <w:pStyle w:val="Heading1"/>
-      </w:pPr>
-      <w:r>
-        <w:t>Offline translation and localized publication</w:t>
+      <w:r>
+        <w:t>Build the application with tools\build-wp0.cmd. Run tools\build-wp5.cmd for the existing knowledge/link/review regressions and tools\build-wp6.cmd for publishing/translation regressions. A FAIL or nonzero exit means the corresponding check failed. See docs\phase1-glossary-validation.json and the glossary completion note for actual current run evidence.</w:t>
       </w:r>
     </w:p>
     <w:p>
-      <w:r>
-        <w:t>Migration 008 adds the persistent translation cache key and JSON record. Cache identity covers saved knowledge revision, requested locales, provider pack hash, source segments and terminology. SQL state overlays cached metadata so source invalidation remains authoritative after database reopen. Approval requires current source review, complete translated prose and a named reviewer; it never updates authoritative source text.</w:t>
+      <w:pPr>
+        <w:pStyle w:val="Heading1"/>
+      </w:pPr>
+      <w:r>
+        <w:t>Offline translation and localized publication</w:t>
       </w:r>
     </w:p>
     <w:p>
       <w:r>
-        <w:t>TDPHAtlasAdapter uses DAT.Runtime.LanguagePack plus its two copied core dependencies, original license and hashed snapshot provenance. Selected packs are bounded to 4 MiB, strictly UTF-8 and application scoped. Exact source phrase lookup and base-language fallback are explicit. Common code, SQL, paths and identifiers are protected during segmentation; unusual unmarked identifiers still need human review.</w:t>
+        <w:t>Migration 008 adds the persistent translation cache key and JSON record. Cache identity covers saved knowledge revision, requested locales, provider pack hash, source segments and terminology. SQL state overlays cached metadata so source invalidation remains authoritative after database reopen. Approval requires current source review, complete translated prose and a named reviewer; it never updates authoritative source text.</w:t>
       </w:r>
     </w:p>
     <w:p>
       <w:r>
-        <w:t>DPH-LEARNING-7 publication writes localization.json and, when a locale is requested, a hashed HTML page and Localized_Sections.docx. Verified exact-revision cache entries are eligible only while the canonical source section is reviewed and has no pending tasks. Redacted source bodies use source fallback. The supplementary document explicitly limits its scope to authored bodies.</w:t>
+        <w:t>TDPHAtlasAdapter uses DAT.Runtime.LanguagePack plus its two copied core dependencies, original license and hashed snapshot provenance. Selected packs are bounded to 4 MiB, strictly UTF-8 and application scoped. Exact source phrase lookup and base-language fallback are explicit. Common code, SQL, paths and identifiers are protected during segmentation; unusual unmarked identifiers still need human review.</w:t>
       </w:r>
     </w:p>
     <w:p>
       <w:r>
-        <w:t>Source navigation is separately opt-in. Only scoped captured text with matching source hashes is rendered as encoded, redacted HTML. Task masks use captured noncontainer ranges and original line starts. source-navigation.json records included line numbers and omission reasons. Validate checks scope, file identity, line order/counts, generations and disclosure metadata. No original source snapshot is shipped.</w:t>
+        <w:t>DPH-LEARNING-7 publication writes localization.json and, when a locale is requested, a hashed HTML page and Localized_Sections.docx. Verified exact-revision cache entries are eligible only while the canonical source section is reviewed and has no pending tasks. Redacted source bodies use source fallback. The supplementary document explicitly limits its scope to authored bodies.</w:t>
       </w:r>
     </w:p>
     <w:p>
-      <w:pPr>
-        <w:pStyle w:val="Heading1"/>
-      </w:pPr>
-      <w:r>
-        <w:t>Native validation and release evidence</w:t>
+      <w:r>
+        <w:t>Source navigation is separately opt-in. Only scoped captured text with matching source hashes is rendered as encoded, redacted HTML. Task masks use captured noncontainer ranges and original line starts. source-navigation.json records included line numbers and omission reasons. Validate checks scope, file identity, line order/counts, generations and disclosure metadata. No original source snapshot is shipped.</w:t>
       </w:r>
     </w:p>
     <w:p>
-      <w:r>
-        <w:t>The design-time Validate bundle controls dispatch validate_bundle to the worker before a database connection is required. The owner supplies an expected fingerprint independently. Stale rejection is default and historical inspection is an explicit qualification. Native reports distinguish integrity from human approval.</w:t>
+      <w:pPr>
+        <w:pStyle w:val="Heading1"/>
+      </w:pPr>
+      <w:r>
+        <w:t>Native validation and release evidence</w:t>
       </w:r>
     </w:p>
     <w:p>
       <w:r>
-        <w:t>The Win32 project enables DCC_LargeAddressAware in its IDE project options. The hardening and learning harnesses use the equivalent PE flag. The expanded pinned corpus exposed an out-of-memory failure after repeated captures and native workspace loading under the former address limit. Keep memory measurements and actual large-corpus validation with this change; the linker flag does not make memory consumption unbounded or establish a release budget.</w:t>
+        <w:t>The design-time Validate bundle controls dispatch validate_bundle to the worker before a database connection is required. The owner supplies an expected fingerprint independently. Stale rejection is default and historical inspection is an explicit qualification. Native reports distinguish integrity from human approval.</w:t>
       </w:r>
     </w:p>
     <w:p>
       <w:r>
-        <w:t>Run tools\validate-wp7.ps1 elevated for the pinned reference hardening suite and before/after hash proof. It reads the current schema constant rather than an obsolete hardcoded version. The suite measures full capture, cached open, reassessment, message-pump gaps and peak process working set on recorded hardware. Measurements require owner-agreed budgets before release acceptance.</w:t>
+        <w:t>The Win32 project enables DCC_LargeAddressAware in its IDE project options. The hardening and learning harnesses use the equivalent PE flag. The expanded pinned corpus exposed an out-of-memory failure after repeated captures and native workspace loading under the former address limit. Keep memory measurements and actual large-corpus validation with this change; the linker flag does not make memory consumption unbounded or establish a release budget.</w:t>
       </w:r>
     </w:p>
     <w:p>
       <w:r>
-        <w:t>The independent first-time programmer and source-review worksheet is docs\WP7_Maintenance_Exercise.txt. Preserve actual participant answers, source citations, uncertainty judgments, assistance, timings and defects. Do not substitute automated tests or prepared instructions for AC-25 or independent explanation review.</w:t>
+        <w:t>Run tools\validate-wp7.ps1 elevated for the pinned reference hardening suite and before/after hash proof. It reads the current schema constant rather than an obsolete hardcoded version. The suite measures full capture, cached open, reassessment, message-pump gaps and peak process working set on recorded hardware. Measurements require owner-agreed budgets before release acceptance.</w:t>
       </w:r>
     </w:p>
     <w:p>
-      <w:pPr>
-        <w:pStyle w:val="Heading1"/>
-      </w:pPr>
-      <w:r>
-        <w:t>Structured project profile contract</w:t>
+      <w:r>
+        <w:t>The independent first-time programmer and source-review worksheet is docs\WP7_Maintenance_Exercise.txt. Preserve actual participant answers, source citations, uncertainty judgments, assistance, timings and defects. Do not substitute automated tests or prepared instructions for AC-25 or independent explanation review.</w:t>
       </w:r>
     </w:p>
     <w:p>
-      <w:r>
-        <w:t>TDPHWorkspaceView.ProjectMembers projects captured syntax files into a selected-scope catalog without filesystem discovery. DPH.UI.Main.fmx defines separate Known databases and Selected project subpages, with a native list and evidence memo. Program, library and package declarations retain source references; project properties and references retain captured values and child conditions. Parent conditions may apply even when a child has none recorded. tests\DPH.Tests.ProjectCatalog.dpr checks a selected group, missing referenced project, output kinds, settings, native selection and input immutability.</w:t>
+      <w:pPr>
+        <w:pStyle w:val="Heading1"/>
+      </w:pPr>
+      <w:r>
+        <w:t>Structured project profile contract</w:t>
       </w:r>
     </w:p>
     <w:p>
       <w:r>
-        <w:t>Migration 009 adds an object-valued structured_json field to append-only knowledge revisions. TDPHProjectProfile validates 15 known text fields, required purpose and attribution, per-field bounds and a 64 KiB record bound. SaveKnowledge enforces stable project scope, title, kind and generated body, prevents ordinary-record conversion, duplicate profiles and loss of typed data, and preserves structured fields during named review and continuity revisions. Publication decodes typed metadata before recursive redaction, including revision history.</w:t>
+        <w:t>TDPHWorkspaceView.ProjectMembers projects captured syntax files into a selected-scope catalog without filesystem discovery. DPH.UI.Main.fmx defines separate Known databases and Selected project subpages, with a native list and evidence memo. Program, library and package declarations retain source references; project properties and references retain captured values and child conditions. Parent conditions may apply even when a child has none recorded. tests\DPH.Tests.ProjectCatalog.dpr checks a selected group, missing referenced project, output kinds, settings, native selection and input immutability.</w:t>
       </w:r>
     </w:p>
     <w:p>
       <w:r>
-        <w:t>DPH.UI.ProjectProfile.fmx defines every editor control at design time. Apply returns an attributed draft to the existing Knowledge save pipeline. It does not bypass unsaved-edit guards or automatically approve information. tests\DPH.Tests.Phase1.dpr verifies persistence, review, stale editors, history, field bounds and native form behavior; publishing regressions check canonical, HTML and DOCX inclusion.</w:t>
+        <w:t>Migration 009 adds an object-valued structured_json field to append-only knowledge revisions. TDPHProjectProfile validates 15 known text fields, required purpose and attribution, per-field bounds and a 64 KiB record bound. SaveKnowledge enforces stable project scope, title, kind and generated body, prevents ordinary-record conversion, duplicate profiles and loss of typed data, and preserves structured fields during named review and continuity revisions. Publication decodes typed metadata before recursive redaction, including revision history.</w:t>
       </w:r>
     </w:p>
     <w:p>
-      <w:pPr>
-        <w:pStyle w:val="Heading1"/>
-      </w:pPr>
-      <w:r>
-        <w:t>Quality analysis and revision comparison</w:t>
+      <w:r>
+        <w:t>DPH.UI.ProjectProfile.fmx defines every editor control at design time. Apply returns an attributed draft to the existing Knowledge save pipeline. It does not bypass unsaved-edit guards or automatically approve information. tests\DPH.Tests.Phase1.dpr verifies persistence, review, stale editors, history, field bounds and native form behavior; publishing regressions check canonical, HTML and DOCX inclusion.</w:t>
       </w:r>
     </w:p>
     <w:p>
-      <w:r>
-        <w:t>DPH.Analysis.Quality emits DPH-QUALITY-1 evidence during workspace capture. Routine metrics, eligible token-body equality, conservative missing-inbound and disconnected-CFG findings, and iterative call-graph strongly connected components use captured inputs only. The worker invalidates an older connected cache without this analyzer version. All findings remain qualified candidates.</w:t>
+      <w:pPr>
+        <w:pStyle w:val="Heading1"/>
+      </w:pPr>
+      <w:r>
+        <w:t>Quality analysis and revision comparison</w:t>
       </w:r>
     </w:p>
     <w:p>
       <w:r>
-        <w:t>DPH.Workspace.Comparison compares two hash-verified retained captures from the same project database. It rejects differing selection and syntax or semantic analyzer contracts. Deterministic identity indexes distinguish file changes, symbol additions or removals, captured structure changes and file-only changes. Routine-local flow numbering avoids global node-number shifts. Results use filtered 200-row pages; individual structure displays are limited to 4000 characters with full-content structure hashes and explicit truncation.</w:t>
+        <w:t>DPH.Analysis.Quality emits DPH-QUALITY-1 evidence during workspace capture. Routine metrics, eligible token-body equality, conservative missing-inbound and disconnected-CFG findings, and iterative call-graph strongly connected components use captured inputs only. The worker invalidates an older connected cache without this analyzer version. All findings remain qualified candidates.</w:t>
       </w:r>
     </w:p>
     <w:p>
       <w:r>
-        <w:t>Comparison runs on the existing background worker. It reads retained database artifacts rather than current selected source files. Native comparison controls and evidence panes are declared in DPH.UI.Main.fmx. tests\DPH.Tests.Comparison.dpr checks literal-expression changes, unchanged neighboring routines, flow-edge rewiring, identity changes, contract rejection, pages, native panes, worker loading and missing caches.</w:t>
+        <w:t>DPH.Workspace.Comparison compares two hash-verified retained captures from the same project database. It rejects differing selection and syntax or semantic analyzer contracts. Deterministic identity indexes distinguish file changes, symbol additions or removals, captured structure changes and file-only changes. Routine-local flow numbering avoids global node-number shifts. Results use filtered 200-row pages; individual structure displays are limited to 4000 characters with full-content structure hashes and explicit truncation.</w:t>
       </w:r>
     </w:p>
     <w:p>
       <w:r>
+        <w:t>Comparison runs on the existing background worker. It reads retained database artifacts rather than current selected source files. Native comparison controls and evidence panes are declared in DPH.UI.Main.fmx. tests\DPH.Tests.Comparison.dpr checks literal-expression changes, unchanged neighboring routines, flow-edge rewiring, identity changes, contract rejection, pages, native panes, worker loading and missing caches.</w:t>
+      </w:r>
+    </w:p>
+    <w:p>
+      <w:r>
         <w:t>The Phase 1 traceability ledger preserves the supplied requirements and limitations. Source comparison remains partial until optional historical source retention supports actual source-text differences; captured structural comparison must never be described as reconstructing those bytes. Human business answers and independent first-time-user acceptance remain separate evidence.</w:t>
+      </w:r>
+    </w:p>
+    <w:p>
+      <w:pPr>
+        <w:pStyle w:val="Heading1"/>
+      </w:pPr>
+      <w:r>
+        <w:t>Keyboard inspector implementation and validation</w:t>
+      </w:r>
+    </w:p>
+    <w:p>
+      <w:r>
+        <w:t>DPH.Workspace.Keyboard projects captured text and binary form IR into source-backed component records. A parent-property index avoids rescanning every node for every component. Rows retain generation, source SHA256, line and byte extents, original property values and explicit unknowns. Numeric shortcut conflicts normalize decimal and hexadecimal codes within each serialized form; sibling TabOrder conflicts stay parent-local. Unique local action declarations carry separate shortcut and source evidence; uncaptured custom, external or inherited actions remain unresolved.</w:t>
+      </w:r>
+    </w:p>
+    <w:p>
+      <w:r>
+        <w:t>DPH.UI.Main.fmx serializes every inspector control for the IDE and Object Inspector. The Keyboard and focus page filters readable evidence, sorts sibling TabOrder and uses 250-row pages. TDPHKeyboardInspector.ReadSource enforces matching generation, source identity, project containment, text availability and source hash before navigation. Binary forms expose byte evidence without applying it as text lines. No database migration or target execution is required.</w:t>
+      </w:r>
+    </w:p>
+    <w:p>
+      <w:r>
+        <w:t>Run tools\build-keyboard.cmd elevated for 55 checks covering actual DFM, FMX and binary parsing, action references, conflicts, unknown states, readable key names, source safeguards, pagination and instantiated FMX controls. The fixed bin/keyboard-validation fixture avoids new disposable test folders. Native PaintTo images in docs/phase1-keyboard-workspace.png and phase1-keyboard-compact.png are renders of running DPH controls, not target application screenshots. The suite checks the user catalog and selected fixture bytes remain unchanged. Runtime traversal and accessibility conformance require separate observed tests.</w:t>
       </w:r>
     </w:p>
     <w:p>
@@ -1713,7 +1751,7 @@
           <w:rFonts w:ascii="Consolas" w:hAnsi="Consolas"/>
           <w:sz w:val="16"/>
         </w:rPr>
-        <w:t>f4495d86b4a6390e3cf24f645d73ad8f69e5fe03af79aab9e5fdadcb78caa345</w:t>
+        <w:t>4c047871c06a68bfd3ce650a36ebd347010f43985ae9b5f40b83859222b67615</w:t>
       </w:r>
     </w:p>
     <w:p>
@@ -1801,6 +1839,26 @@
         <w:keepNext/>
       </w:pPr>
       <w:r>
+        <w:t>DPH.Workspace.Keyboard.pas</w:t>
+      </w:r>
+    </w:p>
+    <w:p>
+      <w:pPr>
+        <w:spacing w:after="60"/>
+      </w:pPr>
+      <w:r>
+        <w:rPr>
+          <w:rFonts w:ascii="Consolas" w:hAnsi="Consolas"/>
+          <w:sz w:val="16"/>
+        </w:rPr>
+        <w:t>90cd886ce1c00b911c25c7ebf437a7cbf2989a67169b41e43d35a5c666d3ef20</w:t>
+      </w:r>
+    </w:p>
+    <w:p>
+      <w:pPr>
+        <w:keepNext/>
+      </w:pPr>
+      <w:r>
         <w:t>DPH.Workspace.Model.pas</w:t>
       </w:r>
     </w:p>
@@ -1873,7 +1931,7 @@
           <w:rFonts w:ascii="Consolas" w:hAnsi="Consolas"/>
           <w:sz w:val="16"/>
         </w:rPr>
-        <w:t>6212567a7d5b8c1cd18a4f5b2ca0bb99c0deac95db5723ec633f1413f5b5206b</w:t>
+        <w:t>021365f90fb3a6d3aadac37f98a6b37a7f021dbfbfa6d79b474278ec9a1fe54c</w:t>
       </w:r>
     </w:p>
     <w:p>
@@ -1953,7 +2011,7 @@
           <w:rFonts w:ascii="Consolas" w:hAnsi="Consolas"/>
           <w:sz w:val="16"/>
         </w:rPr>
-        <w:t>717637f3a1d07f33e0902beb1da0d2765ba420ccbe5383db9c5bab082ee16977</w:t>
+        <w:t>a1237b831fb2d64dceb866fa1b32232c8b31b01f47fb631806fa4516db3272a2</w:t>
       </w:r>
     </w:p>
     <w:sectPr>

</xml_diff>

<commit_message>
Implement menu and toolbar command inventory for requirement 04.14
</commit_message>
<xml_diff>
--- a/docs/guides/DPH_Engineering_Guide.docx
+++ b/docs/guides/DPH_Engineering_Guide.docx
@@ -490,7 +490,7 @@
         </w:tabs>
       </w:pPr>
       <w:r>
-        <w:t>Source and revision evidence</w:t>
+        <w:t>Command inventory implementation and validation</w:t>
       </w:r>
       <w:r>
         <w:tab/>
@@ -498,687 +498,725 @@
       </w:r>
     </w:p>
     <w:p>
-      <w:r>
-        <w:fldChar w:fldCharType="end"/>
+      <w:pPr>
+        <w:spacing w:after="0" w:line="240" w:lineRule="auto"/>
+        <w:tabs>
+          <w:tab w:val="right" w:leader="dot" w:pos="9360"/>
+        </w:tabs>
+      </w:pPr>
+      <w:r>
+        <w:t>Source and revision evidence</w:t>
+      </w:r>
+      <w:r>
+        <w:tab/>
+        <w:t>14</w:t>
       </w:r>
     </w:p>
     <w:p>
       <w:r>
-        <w:br w:type="page"/>
+        <w:fldChar w:fldCharType="end"/>
       </w:r>
     </w:p>
     <w:p>
-      <w:pPr>
-        <w:pStyle w:val="Heading1"/>
-      </w:pPr>
-      <w:r>
-        <w:t>Architecture and boundaries</w:t>
+      <w:r>
+        <w:br w:type="page"/>
       </w:r>
     </w:p>
     <w:p>
-      <w:r>
-        <w:t>DPH is an independent Delphi FMX application. It has no converter runtime or build dependency. The pinned VCL2FMXConverter v6.0.0 corpus is test input only, at commit e1fd10b2d3b06f2fc3f726b8eb7f234a54faf63d. No converter source was copied into the current analyzer. Preserve the original planning documents and global agents.md byte for byte.</w:t>
+      <w:pPr>
+        <w:pStyle w:val="Heading1"/>
+      </w:pPr>
+      <w:r>
+        <w:t>Architecture and boundaries</w:t>
       </w:r>
     </w:p>
     <w:p>
       <w:r>
-        <w:t>The pipeline is selected project, bounded inventory, read-only byte acquisition, lexical and conditional processing, Pascal and form IR, semantic relationships and control flow, revision-consistent SQLite capture, cached workspace projection, curated knowledge and derived publication. Contract data remains separate from FMX. Every unsupported construct or unavailable dependency must remain diagnosable rather than being promoted into false completeness.</w:t>
+        <w:t>DPH is an independent Delphi FMX application. It has no converter runtime or build dependency. The pinned VCL2FMXConverter v6.0.0 corpus is test input only, at commit e1fd10b2d3b06f2fc3f726b8eb7f234a54faf63d. No converter source was copied into the current analyzer. Preserve the original planning documents and global agents.md byte for byte.</w:t>
       </w:r>
     </w:p>
     <w:p>
       <w:r>
-        <w:t>Application controls are serialized in DPH.UI.Main.fmx, DPH.UI.ProjectProfile.fmx and DPH.UI.Glossary.fmx and editable in the IDE. List contents and paint-box geometry are data projections. No scanned component class is instantiated. Avoid adding runtime-only controls, Pascal class helpers or an alternative authoritative store without explicit authorization.</w:t>
+        <w:t>The pipeline is selected project, bounded inventory, read-only byte acquisition, lexical and conditional processing, Pascal and form IR, semantic relationships and control flow, revision-consistent SQLite capture, cached workspace projection, curated knowledge and derived publication. Contract data remains separate from FMX. Every unsupported construct or unavailable dependency must remain diagnosable rather than being promoted into false completeness.</w:t>
       </w:r>
     </w:p>
     <w:p>
-      <w:pPr>
-        <w:pStyle w:val="Heading1"/>
-      </w:pPr>
-      <w:r>
-        <w:t>Rework and acceptance status</w:t>
+      <w:r>
+        <w:t>Application controls are serialized in DPH.UI.Main.fmx, DPH.UI.ProjectProfile.fmx and DPH.UI.Glossary.fmx and editable in the IDE. List contents and paint-box geometry are data projections. No scanned component class is instantiated. Avoid adding runtime-only controls, Pascal class helpers or an alternative authoritative store without explicit authorization.</w:t>
       </w:r>
     </w:p>
     <w:p>
-      <w:r>
-        <w:t>The owner rejected the earlier WP7 delivery as inadequate for learning and handoff. The statement that implementation through WP7 was complete has been withdrawn. docs/Rework_Requirements_Audit.txt compares the original plan with the implemented product and outstanding work. Historical WP reports remain historical evidence, not acceptance of the reworked experience.</w:t>
+      <w:pPr>
+        <w:pStyle w:val="Heading1"/>
+      </w:pPr>
+      <w:r>
+        <w:t>Rework and acceptance status</w:t>
       </w:r>
     </w:p>
     <w:p>
       <w:r>
-        <w:t>The rework adds a first-launch Getting started course, deterministic explanation engine, guided learning workspace, source-comment context, event traces, labeled and collapsed procedure-flow views, attributed screenshot imports and richer project-specific publication. Run tools/build-learning.cmd with an optional pinned reference database path for dedicated learning and real-WebView2 tests. The source-based first-time-programmer exercise still needs a human participant.</w:t>
+        <w:t>The owner rejected the earlier WP7 delivery as inadequate for learning and handoff. The statement that implementation through WP7 was complete has been withdrawn. docs/Rework_Requirements_Audit.txt compares the original plan with the implemented product and outstanding work. Historical WP reports remain historical evidence, not acceptance of the reworked experience.</w:t>
       </w:r>
     </w:p>
     <w:p>
       <w:r>
-        <w:t>The implementation tracker records expanded semantic reuse, resource interpretation and retention/continuity controls. Their documented bounds still apply. Source safety, privacy, attribution and exact generation links are retained. Do not turn an automated pass count into a claim that every requirement or the human onboarding goal is finished.</w:t>
+        <w:t>The rework adds a first-launch Getting started course, deterministic explanation engine, guided learning workspace, source-comment context, event traces, labeled and collapsed procedure-flow views, attributed screenshot imports and richer project-specific publication. Run tools/build-learning.cmd with an optional pinned reference database path for dedicated learning and real-WebView2 tests. The source-based first-time-programmer exercise still needs a human participant.</w:t>
       </w:r>
     </w:p>
     <w:p>
-      <w:pPr>
-        <w:pStyle w:val="Heading1"/>
-      </w:pPr>
-      <w:r>
-        <w:t>Build and deployment</w:t>
+      <w:r>
+        <w:t>The implementation tracker records expanded semantic reuse, resource interpretation and retention/continuity controls. Their documented bounds still apply. Source safety, privacy, attribution and exact generation links are retained. Do not turn an automated pass count into a claim that every requirement or the human onboarding goal is finished.</w:t>
       </w:r>
     </w:p>
     <w:p>
-      <w:r>
-        <w:t>The installed compiler is RAD Studio 37.0.59082.6021. Load C:\Program Files (x86)\Embarcadero\Studio\37.0\bin\rsvars.bat before compiling. tools/build-wp0.cmd builds DelphiProjectHandoff.dproj with elevated MSBuild and runs the FMX resource smoke test. Output is bin/Win32/Debug, with DCUs in dcu/Win32/Debug. The initial executable target is Windows Win32.</w:t>
+      <w:pPr>
+        <w:pStyle w:val="Heading1"/>
+      </w:pPr>
+      <w:r>
+        <w:t>Build and deployment</w:t>
       </w:r>
     </w:p>
     <w:p>
       <w:r>
-        <w:t>Deploy the executable, all nine immutable migration files, and the architecture-matched WebView2Loader.dll. The reviewed Microsoft WebView2 SDK package is pinned to 1.0.4258.31; retain tools/WebView2/LICENSE.txt with binary redistribution. The browser loads the DLL by its absolute executable-folder path and activates Edge only when preview is requested. There is no intended IE fallback.</w:t>
+        <w:t>The installed compiler is RAD Studio 37.0.59082.6021. Load C:\Program Files (x86)\Embarcadero\Studio\37.0\bin\rsvars.bat before compiling. tools/build-wp0.cmd builds DelphiProjectHandoff.dproj with elevated MSBuild and runs the FMX resource smoke test. Output is bin/Win32/Debug, with DCUs in dcu/Win32/Debug. The initial executable target is Windows Win32.</w:t>
       </w:r>
     </w:p>
     <w:p>
       <w:r>
-        <w:t>The repository standard folders include bin, dcu, docs/guides, docs/pdf, export, help, images and icons, samples, source distributions and tools. Deploy help/index.html for first-launch education. Reference source and generated test databases remain ignored. Use the explicitly approved Python 3.13 executable for project tooling and the installed LibreOffice, never Microsoft Word.</w:t>
+        <w:t>Deploy the executable, all nine immutable migration files, and the architecture-matched WebView2Loader.dll. The reviewed Microsoft WebView2 SDK package is pinned to 1.0.4258.31; retain tools/WebView2/LICENSE.txt with binary redistribution. The browser loads the DLL by its absolute executable-folder path and activates Edge only when preview is requested. There is no intended IE fallback.</w:t>
       </w:r>
     </w:p>
     <w:p>
-      <w:pPr>
-        <w:pStyle w:val="Heading1"/>
-      </w:pPr>
-      <w:r>
-        <w:t>Input acquisition and project scope</w:t>
+      <w:r>
+        <w:t>The repository standard folders include bin, dcu, docs/guides, docs/pdf, export, help, images and icons, samples, source distributions and tools. Deploy help/index.html for first-launch education. Reference source and generated test databases remain ignored. Use the explicitly approved Python 3.13 executable for project tooling and the installed LibreOffice, never Microsoft Word.</w:t>
       </w:r>
     </w:p>
     <w:p>
-      <w:r>
-        <w:t>DPH.Project.Inventory follows the selected project, explicit references, uses clauses, include paths and approved external roots. Project XML is passive: targets and imported build scripts are not executed. Canonical paths are project relative and normalized; traversal, ambiguous macros, reparse paths, cycles and oversized acquisition are rejected or diagnosed. A repository-wide count of Pascal files is not the build scope.</w:t>
+      <w:pPr>
+        <w:pStyle w:val="Heading1"/>
+      </w:pPr>
+      <w:r>
+        <w:t>Input acquisition and project scope</w:t>
       </w:r>
     </w:p>
     <w:p>
       <w:r>
-        <w:t>DPH.Project.Source opens input read only, checks the final opened Windows handle path, captures bytes, records SHA256 and verifies decoding by round trip. Unicode byte offsets, line endings and explicit legacy encodings remain in the evidence contract. The maximum acquired source is 16 MiB. Binary forms are parsed as data; unsupported resources remain gaps.</w:t>
+        <w:t>DPH.Project.Inventory follows the selected project, explicit references, uses clauses, include paths and approved external roots. Project XML is passive: targets and imported build scripts are not executed. Canonical paths are project relative and normalized; traversal, ambiguous macros, reparse paths, cycles and oversized acquisition are rejected or diagnosed. A repository-wide count of Pascal files is not the build scope.</w:t>
       </w:r>
     </w:p>
     <w:p>
       <w:r>
-        <w:t>A source viewer must re-acquire the live file and match the captured hash before using a cached range. Externally referenced sources use their explicit canonical inventory identity. Never invent a neighboring source path from a cached filename or execute input to fill an analysis gap.</w:t>
+        <w:t>DPH.Project.Source opens input read only, checks the final opened Windows handle path, captures bytes, records SHA256 and verifies decoding by round trip. Unicode byte offsets, line endings and explicit legacy encodings remain in the evidence contract. The maximum acquired source is 16 MiB. Binary forms are parsed as data; unsupported resources remain gaps.</w:t>
       </w:r>
     </w:p>
     <w:p>
-      <w:pPr>
-        <w:pStyle w:val="Heading1"/>
-      </w:pPr>
-      <w:r>
-        <w:t>Syntax contracts and limits</w:t>
+      <w:r>
+        <w:t>A source viewer must re-acquire the live file and match the captured hash before using a cached range. Externally referenced sources use their explicit canonical inventory identity. Never invent a neighboring source path from a cached filename or execute input to fill an analysis gap.</w:t>
       </w:r>
     </w:p>
     <w:p>
-      <w:r>
-        <w:t>DPH.Parse.Model defines IR schema 1, analyzer DPH-WP2-5, token and node limits, source ranges and diagnostics. Lexing preserves original tokens and conditional information. Preprocessing evaluates supported expressions, explicit defines and includes while retaining uncertainty for unknown branches. An unavailable compiler symbol is not automatically a false condition.</w:t>
+      <w:pPr>
+        <w:pStyle w:val="Heading1"/>
+      </w:pPr>
+      <w:r>
+        <w:t>Syntax contracts and limits</w:t>
       </w:r>
     </w:p>
     <w:p>
       <w:r>
-        <w:t>The Pascal parser extracts declarations, routines, anonymous methods and supported statements into IR. Declaration and implementation occurrences remain distinguishable before semantic unification. The form parser accepts supported text and binary DFM/FMX structures without loading component packages. The inventory reads relevant project configuration and resources through bounded adapters.</w:t>
+        <w:t>DPH.Parse.Model defines IR schema 1, analyzer DPH-WP2-5, token and node limits, source ranges and diagnostics. Lexing preserves original tokens and conditional information. Preprocessing evaluates supported expressions, explicit defines and includes while retaining uncertainty for unknown branches. An unavailable compiler symbol is not automatically a false condition.</w:t>
       </w:r>
     </w:p>
     <w:p>
       <w:r>
-        <w:t>Current bounds include 250000 tokens, 100000 IR nodes, nesting 128 and 10000 diagnostics. Opaque assembler, malformed syntax and unsupported grammar are partial. Tests use exact golden IR, encoding edge cases, cyclic includes, passive malicious imports and changed source. Maintain source byte ranges and diagnostics when extending support.</w:t>
+        <w:t>The Pascal parser extracts declarations, routines, anonymous methods and supported statements into IR. Declaration and implementation occurrences remain distinguishable before semantic unification. The form parser accepts supported text and binary DFM/FMX structures without loading component packages. The inventory reads relevant project configuration and resources through bounded adapters.</w:t>
       </w:r>
     </w:p>
     <w:p>
-      <w:pPr>
-        <w:pStyle w:val="Heading1"/>
-      </w:pPr>
-      <w:r>
-        <w:t>Symbols and typed relationships</w:t>
+      <w:r>
+        <w:t>Current bounds include 250000 tokens, 100000 IR nodes, nesting 128 and 10000 diagnostics. Opaque assembler, malformed syntax and unsupported grammar are partial. Tests use exact golden IR, encoding edge cases, cyclic includes, passive malicious imports and changed source. Maintain source byte ranges and diagnostics when extending support.</w:t>
       </w:r>
     </w:p>
     <w:p>
-      <w:r>
-        <w:t>DPH.Analysis.Model defines semantic schema 1 and analyzer DPH-WP3-11. Stable symbol keys contain qualified identity, signature and conditional variant. DPH.Analysis.Symbols unifies supported routine prototypes and bodies, resolves cross-unit declarations, typed receivers and suitable overloads, associates form events and records anonymous callbacks.</w:t>
+      <w:pPr>
+        <w:pStyle w:val="Heading1"/>
+      </w:pPr>
+      <w:r>
+        <w:t>Symbols and typed relationships</w:t>
       </w:r>
     </w:p>
     <w:p>
       <w:r>
-        <w:t>Relationship certainty is confirmed_static, possible_dynamic, inferred, runtime_observed or unresolved. Passive scanning never claims runtime_observed. A uses dependency is not a call. Known lexical calls, serialized bindings and declared types carry derivation rules and source ranges. Recognized asynchronous API spelling can establish a possible scheduling relationship without proving execution order.</w:t>
+        <w:t>DPH.Analysis.Model defines semantic schema 1 and analyzer DPH-WP3-11. Stable symbol keys contain qualified identity, signature and conditional variant. DPH.Analysis.Symbols unifies supported routine prototypes and bodies, resolves cross-unit declarations, typed receivers and suitable overloads, associates form events and records anonymous callbacks.</w:t>
       </w:r>
     </w:p>
     <w:p>
       <w:r>
-        <w:t>Method pointers, unresolved receivers, dynamic dispatch, generated types and framework behavior must retain uncertainty. Basic reads, writes, callback assignment, static SQL spelling and report-model rendering are conservative analyses. Renames are distinct identities until continuity is reviewed; offsets alone must not reassign knowledge.</w:t>
+        <w:t>Relationship certainty is confirmed_static, possible_dynamic, inferred, runtime_observed or unresolved. Passive scanning never claims runtime_observed. A uses dependency is not a call. Known lexical calls, serialized bindings and declared types carry derivation rules and source ranges. Recognized asynchronous API spelling can establish a possible scheduling relationship without proving execution order.</w:t>
       </w:r>
     </w:p>
     <w:p>
-      <w:pPr>
-        <w:pStyle w:val="Heading1"/>
-      </w:pPr>
-      <w:r>
-        <w:t>Control flow and impact</w:t>
+      <w:r>
+        <w:t>Method pointers, unresolved receivers, dynamic dispatch, generated types and framework behavior must retain uncertainty. Basic reads, writes, callback assignment, static SQL spelling and report-model rendering are conservative analyses. Renames are distinct identities until continuity is reviewed; offsets alone must not reassign knowledge.</w:t>
       </w:r>
     </w:p>
     <w:p>
-      <w:r>
-        <w:t>DPH.Analysis.Flow builds per-routine control-flow nodes and typed edges for supported sequences, branches, loops, returns and exception/finally paths. Routine identity, source hash, range, node kind and expression remain available to inspectors and exports. Flow is bounded to 100000 nodes, 300000 edges and nesting 128.</w:t>
+      <w:pPr>
+        <w:pStyle w:val="Heading1"/>
+      </w:pPr>
+      <w:r>
+        <w:t>Control flow and impact</w:t>
       </w:r>
     </w:p>
     <w:p>
       <w:r>
-        <w:t>Impact traversal is possible reachability through supported relationships. Do not label it proved runtime impact. The UI bounds a displayed graph to 120 nodes and 960 edges, while the stored semantic graph is the fuller evidence model. Uncertain edges remain visually distinct. Unsupported flow does not become a fabricated successful path.</w:t>
+        <w:t>DPH.Analysis.Flow builds per-routine control-flow nodes and typed edges for supported sequences, branches, loops, returns and exception/finally paths. Routine identity, source hash, range, node kind and expression remain available to inspectors and exports. Flow is bounded to 100000 nodes, 300000 edges and nesting 128.</w:t>
       </w:r>
     </w:p>
     <w:p>
-      <w:pPr>
-        <w:pStyle w:val="Heading1"/>
-      </w:pPr>
-      <w:r>
-        <w:t>SQLite generations and durability</w:t>
+      <w:r>
+        <w:t>Impact traversal is possible reachability through supported relationships. Do not label it proved runtime impact. The UI bounds a displayed graph to 120 nodes and 960 edges, while the stored semantic graph is the fuller evidence model. Uncertain edges remain visually distinct. Unsupported flow does not become a fabricated successful path.</w:t>
       </w:r>
     </w:p>
     <w:p>
-      <w:r>
-        <w:t>TDPHKnowledgeStore owns one FireDAC SQLite connection on its creating thread and serializes writer access through a named mutex. Foreign keys and synchronous FULL are enabled. Default journal mode is DELETE; WAL is an explicit local-store option. Direct cross-thread writes are rejected. SQLite 3.42.0 with FTS5 was measured by the storage tests.</w:t>
+      <w:pPr>
+        <w:pStyle w:val="Heading1"/>
+      </w:pPr>
+      <w:r>
+        <w:t>SQLite generations and durability</w:t>
       </w:r>
     </w:p>
     <w:p>
       <w:r>
-        <w:t>Schema 9 is created through nine checksum-verified migrations. Existing migration text is immutable. A newer incompatible schema is rejected safely. Failed upgrade DDL and ledger changes roll back, and an upgrade from an existing schema makes a recoverable pre-migration database backup. Interrupted running generations recover as failed, preserving the previous published head.</w:t>
+        <w:t>TDPHKnowledgeStore owns one FireDAC SQLite connection on its creating thread and serializes writer access through a named mutex. Foreign keys and synchronous FULL are enabled. Default journal mode is DELETE; WAL is an explicit local-store option. Direct cross-thread writes are rejected. SQLite 3.42.0 with FTS5 was measured by the storage tests.</w:t>
       </w:r>
     </w:p>
     <w:p>
       <w:r>
-        <w:t>ObserveManifest records current fingerprints independently of the capture. BeginGeneration freezes configuration and manifest identity. Syntax and semantic facts are staged in transactions. Before publication, inputs and configuration are revalidated. Only a coherent complete generation becomes the current head. Partial, failed or superseded captures cannot clear the exact-input stale state or overwrite a prior current head.</w:t>
+        <w:t>Schema 9 is created through nine checksum-verified migrations. Existing migration text is immutable. A newer incompatible schema is rejected safely. Failed upgrade DDL and ledger changes roll back, and an upgrade from an existing schema makes a recoverable pre-migration database backup. Interrupted running generations recover as failed, preserving the previous published head.</w:t>
       </w:r>
     </w:p>
     <w:p>
-      <w:pPr>
-        <w:pStyle w:val="Heading1"/>
-      </w:pPr>
-      <w:r>
-        <w:t>Evidence and immutable history</w:t>
+      <w:r>
+        <w:t>ObserveManifest records current fingerprints independently of the capture. BeginGeneration freezes configuration and manifest identity. Syntax and semantic facts are staged in transactions. Before publication, inputs and configuration are revalidated. Only a coherent complete generation becomes the current head. Partial, failed or superseded captures cannot clear the exact-input stale state or overwrite a prior current head.</w:t>
       </w:r>
     </w:p>
     <w:p>
-      <w:r>
-        <w:t>Normalized tables include projects, configurations, source files, file revisions, generations, generation files, entities, entity versions, evidence, relationships, component properties, control-flow nodes and edges, knowledge records and revisions, links, review tasks, translations, artifacts, export jobs and audit events. Foreign keys tie evidence and relationships to their producing generation.</w:t>
+      <w:pPr>
+        <w:pStyle w:val="Heading1"/>
+      </w:pPr>
+      <w:r>
+        <w:t>Evidence and immutable history</w:t>
       </w:r>
     </w:p>
     <w:p>
       <w:r>
-        <w:t>Triggers prevent mutation of terminal generations, source revisions, captured facts, configurations and authored knowledge revisions. Evidence ranges must fit the captured source bytes and use the generation analyzer version. Historical file and entity identities cannot be changed casually. A missing source is retained as missing; its historical annotations survive.</w:t>
+        <w:t>Normalized tables include projects, configurations, source files, file revisions, generations, generation files, entities, entity versions, evidence, relationships, component properties, control-flow nodes and edges, knowledge records and revisions, links, review tasks, translations, artifacts, export jobs and audit events. Foreign keys tie evidence and relationships to their producing generation.</w:t>
       </w:r>
     </w:p>
     <w:p>
       <w:r>
-        <w:t>Modification detected, analysis stale, knowledge review needed, analysis failed and reassessment requested are separate persistent flags. A UI summary is a projection of these states, not a replacement for them. Parser success must not clear human review.</w:t>
+        <w:t>Triggers prevent mutation of terminal generations, source revisions, captured facts, configurations and authored knowledge revisions. Evidence ranges must fit the captured source bytes and use the generation analyzer version. Historical file and entity identities cannot be changed casually. A missing source is retained as missing; its historical annotations survive.</w:t>
       </w:r>
     </w:p>
     <w:p>
-      <w:pPr>
-        <w:pStyle w:val="Heading1"/>
-      </w:pPr>
-      <w:r>
-        <w:t>Background coordination and cached views</w:t>
+      <w:r>
+        <w:t>Modification detected, analysis stale, knowledge review needed, analysis failed and reassessment requested are separate persistent flags. A UI summary is a projection of these states, not a replacement for them. Parser success must not clear human review.</w:t>
       </w:r>
     </w:p>
     <w:p>
-      <w:r>
-        <w:t>DPH.Workspace.Worker is a persistent TThread with bounded request and response queues. It initializes COM for passive MSXML parsing, owns database operations in the worker, and retains analyzer instances across requests. FMX polls responses with a timer, avoiding queued closures that outlive the form.</w:t>
+      <w:pPr>
+        <w:pStyle w:val="Heading1"/>
+      </w:pPr>
+      <w:r>
+        <w:t>Background coordination and cached views</w:t>
       </w:r>
     </w:p>
     <w:p>
       <w:r>
-        <w:t>A stopped Delphi queue can report success while returning an empty item. Poll checks both the wait result and a non-nil response; shutdown tests guard against a destructor loop. Cancellation is checked between stages and marks a staged running generation failed when appropriate. It is not a promise of interruption inside every parser loop.</w:t>
+        <w:t>DPH.Workspace.Worker is a persistent TThread with bounded request and response queues. It initializes COM for passive MSXML parsing, owns database operations in the worker, and retains analyzer instances across requests. FMX polls responses with a timer, avoiding queued closures that outlive the form.</w:t>
       </w:r>
     </w:p>
     <w:p>
       <w:r>
-        <w:t>Workspace projections are managed JSON files in database.dphdb.views named by SHA256 and registered in artifacts. Cached opening verifies the managed path, size, checksum and generation. Cached facts are delivered before automatic verification when the original source entry is available; unavailable source remains detached. Connected checks compare manifest fingerprints and selection identity every ten seconds. Syntax and routine semantic caches are bounded and binding-context aware; conservative postprocessing remains separate from reused routine facts.</w:t>
+        <w:t>A stopped Delphi queue can report success while returning an empty item. Poll checks both the wait result and a non-nil response; shutdown tests guard against a destructor loop. Cancellation is checked between stages and marks a staged running generation failed when appropriate. It is not a promise of interruption inside every parser loop.</w:t>
       </w:r>
     </w:p>
     <w:p>
-      <w:pPr>
-        <w:pStyle w:val="Heading1"/>
-      </w:pPr>
-      <w:r>
-        <w:t>FMX navigation and visualization</w:t>
+      <w:r>
+        <w:t>Workspace projections are managed JSON files in database.dphdb.views named by SHA256 and registered in artifacts. Cached opening verifies the managed path, size, checksum and generation. Cached facts are delivered before automatic verification when the original source entry is available; unavailable source remains detached. Connected checks compare manifest fingerprints and selection identity every ten seconds. Syntax and routine semantic caches are bounded and binding-context aware; conservative postprocessing remains separate from reused routine facts.</w:t>
       </w:r>
     </w:p>
     <w:p>
-      <w:r>
-        <w:t>DPH.UI.Main binds its published controls to the FMX resource. Explorer queries are paged at 250 rows; data filtering supports kind, text and qualified scope. History and bookmarks use canonical keys, with surviving same-project bookmarks retained across reassessment. Inspector output retains source metadata and serialized properties. Source memo navigation is permitted only after live hash validation.</w:t>
+      <w:pPr>
+        <w:pStyle w:val="Heading1"/>
+      </w:pPr>
+      <w:r>
+        <w:t>FMX navigation and visualization</w:t>
       </w:r>
     </w:p>
     <w:p>
       <w:r>
-        <w:t>OpenSelection queues a candidate without replacing the current database, source or workspace. PollTimer installs it only after the worker returns accepted captured evidence. The worker preflights source identity before creating a database; cached opens check captured XML ProjectGuid and Pascal program declarations before returning a view. Rejections retain the current workspace, and rejected startup caches show Getting started. Inventory identity also covers referenced project groups. DatabaseDialog.InitialDir is the design-time relative default; startup resolves it under the deployment root, creates that folder, and applies the same path to OpenCacheDialog. Distribution packaging copies only the Databases instructions, never its databases or views.</w:t>
+        <w:t>DPH.UI.Main binds its published controls to the FMX resource. Explorer queries are paged at 250 rows; data filtering supports kind, text and qualified scope. History and bookmarks use canonical keys, with surviving same-project bookmarks retained across reassessment. Inspector output retains source metadata and serialized properties. Source memo navigation is permitted only after live hash validation.</w:t>
       </w:r>
     </w:p>
     <w:p>
       <w:r>
-        <w:t>Graph paint boxes draw bounded evidence data with palette and geometry values supplied by design-time style rectangles. Screen reconstruction draws approximate source-derived rectangles without creating components. Its gallery is bounded to 60 forms. Runtime styles, custom painting and inherited resources are not silently fabricated.</w:t>
+        <w:t>OpenSelection queues a candidate without replacing the current database, source or workspace. PollTimer installs it only after the worker returns accepted captured evidence. The worker preflights source identity before creating a database; cached opens check captured XML ProjectGuid and Pascal program declarations before returning a view. Rejections retain the current workspace, and rejected startup caches show Getting started. Inventory identity also covers referenced project groups. DatabaseDialog.InitialDir is the design-time relative default; startup resolves it under the deployment root, creates that folder, and applies the same path to OpenCacheDialog. Distribution packaging copies only the Databases instructions, never its databases or views.</w:t>
       </w:r>
     </w:p>
     <w:p>
       <w:r>
-        <w:t>Keep lifecycle and ownership explicit: the view owns its JSON document, UI arrays own their records, responses transfer document or knowledge ownership to the main form, and the worker frees unconsumed responses during shutdown. Guard unsaved authored text before changing projects or replacing editor state.</w:t>
+        <w:t>Graph paint boxes draw bounded evidence data with palette and geometry values supplied by design-time style rectangles. Screen reconstruction draws approximate source-derived rectangles without creating components. Its gallery is bounded to 60 forms. Runtime styles, custom painting and inherited resources are not silently fabricated.</w:t>
       </w:r>
     </w:p>
     <w:p>
-      <w:pPr>
-        <w:pStyle w:val="Heading1"/>
-      </w:pPr>
-      <w:r>
-        <w:t>Curated knowledge and review</w:t>
+      <w:r>
+        <w:t>Keep lifecycle and ownership explicit: the view owns its JSON document, UI arrays own their records, responses transfer document or knowledge ownership to the main form, and the worker frees unconsumed responses during shutdown. Guard unsaved authored text before changing projects or replacing editor state.</w:t>
       </w:r>
     </w:p>
     <w:p>
-      <w:r>
-        <w:t>SaveKnowledge requires title, body, a named author, a supported kind and a captured generation. Existing records require their expected revision and stable kind. Ordinary titles stay stable; structured glossary names can change while their identity and history remain intact. Each edit appends a needs_review revision, preserves links and opens a pending task. Knowledge bodies are bounded to 1 MiB. Authored text is never regenerated from parser output.</w:t>
+      <w:pPr>
+        <w:pStyle w:val="Heading1"/>
+      </w:pPr>
+      <w:r>
+        <w:t>Curated knowledge and review</w:t>
       </w:r>
     </w:p>
     <w:p>
       <w:r>
-        <w:t>ReviewKnowledge requires the expected current revision, a named reviewer and a matching captured source/configuration. The connected worker observes current source before accepting a review. A missing linked entity cannot be verified under a replacement name. Verification, rejection or retirement appends a revision and records attribution; history remains append only.</w:t>
+        <w:t>SaveKnowledge requires title, body, a named author, a supported kind and a captured generation. Existing records require their expected revision and stable kind. Ordinary titles stay stable; structured glossary names can change while their identity and history remain intact. Each edit appends a needs_review revision, preserves links and opens a pending task. Knowledge bodies are bounded to 1 MiB. Authored text is never regenerated from parser output.</w:t>
       </w:r>
     </w:p>
     <w:p>
       <w:r>
-        <w:t>Manifest and configuration changes conservatively invalidate active knowledge, derived artifacts and translations. A partial static capture may support review of an attributable statement against available evidence, but its partial coverage remains visible. Local names are not authenticated enterprise identities. Human verification and automatic static derivation remain different evidence categories.</w:t>
+        <w:t>ReviewKnowledge requires the expected current revision, a named reviewer and a matching captured source/configuration. The connected worker observes current source before accepting a review. A missing linked entity cannot be verified under a replacement name. Verification, rejection or retirement appends a revision and records attribution; history remains append only.</w:t>
       </w:r>
     </w:p>
     <w:p>
-      <w:pPr>
-        <w:pStyle w:val="Heading1"/>
-      </w:pPr>
-      <w:r>
-        <w:t>Canonical publication and privacy</w:t>
+      <w:r>
+        <w:t>Manifest and configuration changes conservatively invalidate active knowledge, derived artifacts and translations. A partial static capture may support review of an attributable statement against available evidence, but its partial coverage remains visible. Local names are not authenticated enterprise identities. Human verification and automatic static derivation remain different evidence categories.</w:t>
       </w:r>
     </w:p>
     <w:p>
-      <w:r>
-        <w:t>DPH.Publish.Model constructs one versioned documentation model from a captured workspace and current curated knowledge. It carries generation, configuration, input/context fingerprints, detached/stale state, symbols, typed relationships, control flow, source references, human history, coverage and explicit unknowns. Full and task-scoped views share those facts.</w:t>
+      <w:pPr>
+        <w:pStyle w:val="Heading1"/>
+      </w:pPr>
+      <w:r>
+        <w:t>Canonical publication and privacy</w:t>
       </w:r>
     </w:p>
     <w:p>
       <w:r>
-        <w:t>Task scope selects the requested identities and complete direct incident context. It rejects missing or excluded seeds and rejects an oversized task rather than silently truncating a full export. External source roots and sensitive filename categories are excluded by default. Explicit relative prefix exclusions remove file-derived symbols and relationships. Source snapshots and generated AGENTS.md are absent by default.</w:t>
+        <w:t>DPH.Publish.Model constructs one versioned documentation model from a captured workspace and current curated knowledge. It carries generation, configuration, input/context fingerprints, detached/stale state, symbols, typed relationships, control flow, source references, human history, coverage and explicit unknowns. Full and task-scoped views share those facts.</w:t>
       </w:r>
     </w:p>
     <w:p>
       <w:r>
-        <w:t>Redaction recognizes common credential assignments, private keys, AWS access keys and JWT-shaped tokens throughout string data. It is defense in depth, not a guarantee that every project-specific secret format is recognizable. Require explicit exclusions and a disclosure review for sensitive content. No translation or AI provider is contacted by normal publishing.</w:t>
+        <w:t>Task scope selects the requested identities and complete direct incident context. It rejects missing or excluded seeds and rejects an oversized task rather than silently truncating a full export. External source roots and sensitive filename categories are excluded by default. Explicit relative prefix exclusions remove file-derived symbols and relationships. Source snapshots and generated AGENTS.md are absent by default.</w:t>
       </w:r>
     </w:p>
     <w:p>
-      <w:pPr>
-        <w:pStyle w:val="Heading1"/>
-      </w:pPr>
-      <w:r>
-        <w:t>HTML guides and bundle validation</w:t>
+      <w:r>
+        <w:t>Redaction recognizes common credential assignments, private keys, AWS access keys and JWT-shaped tokens throughout string data. It is defense in depth, not a guarantee that every project-specific secret format is recognizable. Require explicit exclusions and a disclosure review for sensitive content. No translation or AI provider is contacted by normal publishing.</w:t>
       </w:r>
     </w:p>
     <w:p>
-      <w:r>
-        <w:t>DPH.Publish.Export writes a new destination outside source. The offline HTML uses encoded imported text, local search and styles, internal anchors, print CSS and a restrictive content security policy. The default WebView2 policy permits only the authorized local index and about:blank; publication explicitly enables hash-named object pages in its managed objects folder. Help retains the index-only policy; learning explicitly permits content-hashed pages only inside its owned preview directory. There is no arbitrary native bridge. Data does not supply executable markup.</w:t>
+      <w:pPr>
+        <w:pStyle w:val="Heading1"/>
+      </w:pPr>
+      <w:r>
+        <w:t>HTML guides and bundle validation</w:t>
       </w:r>
     </w:p>
     <w:p>
       <w:r>
-        <w:t>JSONL indexes contain symbols, relationships, forms/events, data usage, configuration, flow nodes, knowledge and evidence references. Manifest and checksum files accompany canonical.json. The validator checks filenames, hashes, expected input fingerprint, canonical identity, source hash/range, generation and cross-reference integrity. A stale manifest is rejected by default. Unsigned hashes establish integrity relative to the index, not author authenticity.</w:t>
+        <w:t>DPH.Publish.Export writes a new destination outside source. The offline HTML uses encoded imported text, local search and styles, internal anchors, print CSS and a restrictive content security policy. The default WebView2 policy permits only the authorized local index and about:blank; publication explicitly enables hash-named object pages in its managed objects folder. Help retains the index-only policy; learning explicitly permits content-hashed pages only inside its owned preview directory. There is no arbitrary native bridge. Data does not supply executable markup.</w:t>
       </w:r>
     </w:p>
     <w:p>
       <w:r>
-        <w:t>Editable engineering and user DOCX guides derive from the same sections and evidence model. They include title, last changed capture identity and a changeable TOC field. LibreOffice provides companion PDFs; the project rendering tool verifies cached page numbers and renders page images for layout inspection. Missing business procedures stay explicitly absent rather than being invented.</w:t>
+        <w:t>JSONL indexes contain symbols, relationships, forms/events, data usage, configuration, flow nodes, knowledge and evidence references. Manifest and checksum files accompany canonical.json. The validator checks filenames, hashes, expected input fingerprint, canonical identity, source hash/range, generation and cross-reference integrity. A stale manifest is rejected by default. Unsigned hashes establish integrity relative to the index, not author authenticity.</w:t>
       </w:r>
     </w:p>
     <w:p>
-      <w:pPr>
-        <w:pStyle w:val="Heading1"/>
-      </w:pPr>
-      <w:r>
-        <w:t>Translation boundary</w:t>
+      <w:r>
+        <w:t>Editable engineering and user DOCX guides derive from the same sections and evidence model. They include title, last changed capture identity and a changeable TOC field. LibreOffice provides companion PDFs; the project rendering tool verifies cached page numbers and renders page images for layout inspection. Missing business procedures stay explicitly absent rather than being invented.</w:t>
       </w:r>
     </w:p>
     <w:p>
-      <w:r>
-        <w:t>IDPHTranslationProvider exposes provider identity, version, external status and prose translation. Protected segments retain identifiers, SQL, paths, hashes and protocol keys byte for byte. Cache keys include source content, revision, source/target locales and provider/version. Changed prose produces a fresh pending entry; named review applies to the exact cached translation.</w:t>
+      <w:pPr>
+        <w:pStyle w:val="Heading1"/>
+      </w:pPr>
+      <w:r>
+        <w:t>Translation boundary</w:t>
       </w:r>
     </w:p>
     <w:p>
       <w:r>
-        <w:t>TDPHAtlasAdapter reads explicitly selected DAT JSON packs offline. The independent Apache-2.0 reader snapshot and license reside under dependencies\DelphiAppTranslation; VCL2FMX is unchanged and is not a build or runtime dependency. No network provider is configured. Tests exercise actual packs, persistent cache, terminology changes, source invalidation and exact-content named review. The offline GTranslate region is disabled, with local bilingual labels and sorting; do not activate network translation merely because a generic widget name appears in documentation.</w:t>
+        <w:t>IDPHTranslationProvider exposes provider identity, version, external status and prose translation. Protected segments retain identifiers, SQL, paths, hashes and protocol keys byte for byte. Cache keys include source content, revision, source/target locales and provider/version. Changed prose produces a fresh pending entry; named review applies to the exact cached translation.</w:t>
       </w:r>
     </w:p>
     <w:p>
-      <w:pPr>
-        <w:pStyle w:val="Heading1"/>
-      </w:pPr>
-      <w:r>
-        <w:t>Verification and release discipline</w:t>
+      <w:r>
+        <w:t>TDPHAtlasAdapter reads explicitly selected DAT JSON packs offline. The independent Apache-2.0 reader snapshot and license reside under dependencies\DelphiAppTranslation; VCL2FMX is unchanged and is not a build or runtime dependency. No network provider is configured. Tests exercise actual packs, persistent cache, terminology changes, source invalidation and exact-content named review. The offline GTranslate region is disabled, with local bilingual labels and sorting; do not activate network translation merely because a generic widget name appears in documentation.</w:t>
       </w:r>
     </w:p>
     <w:p>
-      <w:r>
-        <w:t>Run the phase build/test scripts elevated with the installed toolchain. WP0 checks FMX resource ownership; WP1 checks storage, crash recovery and migrations; WP2 checks inventory, encoding, syntax and source safety; WP3 checks semantics and pinned reference traces; WP4 checks workspace/background behavior; WP5 checks immutable authored history and pending review; WP6 checks publication, exclusions, sanitization, hashes and translation protection.</w:t>
+      <w:pPr>
+        <w:pStyle w:val="Heading1"/>
+      </w:pPr>
+      <w:r>
+        <w:t>Verification and release discipline</w:t>
       </w:r>
     </w:p>
     <w:p>
       <w:r>
-        <w:t>Use exact input hashes before and after analysis, including failures. Preserve original reference and instruction files. Keep tests that demonstrate invariants rather than tests that merely mirror implementation. New source, validation failure or unresolved risk justifies another targeted test; a passing unchanged phase does not need endless repetition.</w:t>
+        <w:t>Run the phase build/test scripts elevated with the installed toolchain. WP0 checks FMX resource ownership; WP1 checks storage, crash recovery and migrations; WP2 checks inventory, encoding, syntax and source safety; WP3 checks semantics and pinned reference traces; WP4 checks workspace/background behavior; WP5 checks immutable authored history and pending review; WP6 checks publication, exclusions, sanitization, hashes and translation protection.</w:t>
       </w:r>
     </w:p>
     <w:p>
       <w:r>
-        <w:t>H: development backups are enabled. Allow at least 60 seconds for this USB drive to wake before assessing availability. Git remains enabled: review intended changes, commit validated work and push both public and private remotes without force or history rewriting. Remove a stale zero-byte index lock only after verifying no Git process runs. WP7 records measured performance, portability, security and explicit acceptance evidence. Independent first-time programmer acceptance and unknown historical business intent cannot be invented by automation.</w:t>
+        <w:t>Use exact input hashes before and after analysis, including failures. Preserve original reference and instruction files. Keep tests that demonstrate invariants rather than tests that merely mirror implementation. New source, validation failure or unresolved risk justifies another targeted test; a passing unchanged phase does not need endless repetition.</w:t>
       </w:r>
     </w:p>
     <w:p>
       <w:r>
-        <w:t>In the historical pre-rework benchmark on the recorded Core i7-1165G7 host with eight logical processors and about 16 GB RAM, the pinned reference pipeline measured 82.6 seconds for full capture, 2.87 seconds for cached opening and 75.9 seconds for incremental reassessment. The message-pump maximum gap was 64 ms. Peak test-process working set was about 1.21 GiB, including repeated captures, JSON cloning and FMX/WebView2 tests. These are baseline measurements, not agreed hardware-independent budgets. Large syntax-cache fallback and conservative semantic recomputation explain the modest reassessment speedup. Formal acceptance retains independent complex-flow review, missing business/user content, AC-25 and performance-budget agreement as outstanding.</w:t>
+        <w:t>H: development backups are enabled. Allow at least 60 seconds for this USB drive to wake before assessing availability. Git remains enabled: review intended changes, commit validated work and push both public and private remotes without force or history rewriting. Remove a stale zero-byte index lock only after verifying no Git process runs. WP7 records measured performance, portability, security and explicit acceptance evidence. Independent first-time programmer acceptance and unknown historical business intent cannot be invented by automation.</w:t>
       </w:r>
     </w:p>
     <w:p>
-      <w:pPr>
-        <w:pStyle w:val="Heading1"/>
-      </w:pPr>
-      <w:r>
-        <w:t>Current semantic cache and extended evidence</w:t>
+      <w:r>
+        <w:t>In the historical pre-rework benchmark on the recorded Core i7-1165G7 host with eight logical processors and about 16 GB RAM, the pinned reference pipeline measured 82.6 seconds for full capture, 2.87 seconds for cached opening and 75.9 seconds for incremental reassessment. The message-pump maximum gap was 64 ms. Peak test-process working set was about 1.21 GiB, including repeated captures, JSON cloning and FMX/WebView2 tests. These are baseline measurements, not agreed hardware-independent budgets. Large syntax-cache fallback and conservative semantic recomputation explain the modest reassessment speedup. Formal acceptance retains independent complex-flow review, missing business/user content, AC-25 and performance-budget agreement as outstanding.</w:t>
       </w:r>
     </w:p>
     <w:p>
-      <w:r>
-        <w:t>The current analyzers are DPH-WP2-5 and DPH-WP3-11 with IR and semantic schema 1. Routine semantic cache reuse is bounded to 512 records and 32 MiB. Binding context hashes invalidate affected reuse. Synthetic startup and postprocessing occur after reusable routine facts, preserving their relationships to current identities. This is bounded evidence reuse; it is not a proof of an optimal incremental solver.</w:t>
+      <w:pPr>
+        <w:pStyle w:val="Heading1"/>
+      </w:pPr>
+      <w:r>
+        <w:t>Current semantic cache and extended evidence</w:t>
       </w:r>
     </w:p>
     <w:p>
       <w:r>
-        <w:t>Supported extensions include typed aliases, inheritance and accessors, startup entry and unit phases, case/goto/with control flow, asynchronous operation handles and captures, cancellation and event waits, formal arguments and result producers, static SQL projection, output-writer lineage, lifetime and exception relationships, explicit test-call links, and qualified form navigation. Every relationship retains resolution, source range/hash and rule. Unsupported grammar, aliases and dynamic behavior remain diagnosed or qualified.</w:t>
+        <w:t>The current analyzers are DPH-WP2-5 and DPH-WP3-11 with IR and semantic schema 1. Routine semantic cache reuse is bounded to 512 records and 32 MiB. Binding context hashes invalidate affected reuse. Synthetic startup and postprocessing occur after reusable routine facts, preserving their relationships to current identities. This is bounded evidence reuse; it is not a proof of an optimal incremental solver.</w:t>
       </w:r>
     </w:p>
     <w:p>
-      <w:pPr>
-        <w:pStyle w:val="Heading1"/>
-      </w:pPr>
-      <w:r>
-        <w:t>Current schema and authored document contracts</w:t>
+      <w:r>
+        <w:t>Supported extensions include typed aliases, inheritance and accessors, startup entry and unit phases, case/goto/with control flow, asynchronous operation handles and captures, cancellation and event waits, formal arguments and result producers, static SQL projection, output-writer lineage, lifetime and exception relationships, explicit test-call links, and qualified form navigation. Every relationship retains resolution, source range/hash and rule. Unsupported grammar, aliases and dynamic behavior remain diagnosed or qualified.</w:t>
       </w:r>
     </w:p>
     <w:p>
-      <w:r>
-        <w:t>Schema 9 uses checksum-verified migrations 001 through 009. document_section_versions associates immutable authored revisions with stable section ID, document kind, audience and source generation. knowledge_revision_links preserves ordinal, target kind/identity, captured generation, role and label. knowledge_questions preserves the exact deterministic question identity and captured JSON associated with a response record.</w:t>
+      <w:pPr>
+        <w:pStyle w:val="Heading1"/>
+      </w:pPr>
+      <w:r>
+        <w:t>Current schema and authored document contracts</w:t>
       </w:r>
     </w:p>
     <w:p>
       <w:r>
-        <w:t>SaveKnowledge appends immutable text and link snapshots. Empty LinksJSON preserves the prior snapshot; an explicit JSON array replaces it. Entity, relationship and evidence targets remain tied to generation identities; screenshot targets reference managed artifacts; section targets pin an exact knowledge revision. Current reverse section references open review when their targets change. Verify rejects obsolete rich-link generations or target revisions.</w:t>
+        <w:t>Schema 9 uses checksum-verified migrations 001 through 009. document_section_versions associates immutable authored revisions with stable section ID, document kind, audience and source generation. knowledge_revision_links preserves ordinal, target kind/identity, captured generation, role and label. knowledge_questions preserves the exact deterministic question identity and captured JSON associated with a response record.</w:t>
       </w:r>
     </w:p>
     <w:p>
       <w:r>
-        <w:t>Question identity hashes kind, entity key, range, source hash, prompt, rule and context fingerprint. Generation is retained separately, allowing unchanged evidence to keep its question identity across captures. An answer needs actual text after Answer. Only verified content with no pending task suppresses an exact question. Export converts question metadata to typed JSON before recursive redaction.</w:t>
+        <w:t>SaveKnowledge appends immutable text and link snapshots. Empty LinksJSON preserves the prior snapshot; an explicit JSON array replaces it. Entity, relationship and evidence targets remain tied to generation identities; screenshot targets reference managed artifacts; section targets pin an exact knowledge revision. Current reverse section references open review when their targets change. Verify rejects obsolete rich-link generations or target revisions.</w:t>
       </w:r>
     </w:p>
     <w:p>
-      <w:pPr>
-        <w:pStyle w:val="Heading1"/>
-      </w:pPr>
-      <w:r>
-        <w:t>Native review and learning projections</w:t>
+      <w:r>
+        <w:t>Question identity hashes kind, entity key, range, source hash, prompt, rule and context fingerprint. Generation is retained separately, allowing unchanged evidence to keep its question identity across captures. An answer needs actual text after Answer. Only verified content with no pending task suppresses an exact question. Export converts question metadata to typed JSON before recursive redaction.</w:t>
       </w:r>
     </w:p>
     <w:p>
-      <w:r>
-        <w:t>ReviewTasks provides bounded pending tasks, prior and current authored text, baseline/current configurations, affected object signatures, types, source hashes and relationship comparisons. A missing baseline is reported. Native controls invoke existing optimistic-revision and connected-source review checks; they do not create a separate approval authority.</w:t>
+      <w:pPr>
+        <w:pStyle w:val="Heading1"/>
+      </w:pPr>
+      <w:r>
+        <w:t>Native review and learning projections</w:t>
       </w:r>
     </w:p>
     <w:p>
       <w:r>
-        <w:t>RoutineLesson uses the routine CFG and an indexed outgoing-edge lookup. It explains source points, actual expressions and destination lines, with explicit loop, branch, early-return, cleanup and exceptional semantics. The same lesson is used by ObjectText and ObjectHTML; exported document prose and offline object pages therefore share its source interpretation. Its bounds are 60 points and eight outgoing paths per point.</w:t>
+        <w:t>ReviewTasks provides bounded pending tasks, prior and current authored text, baseline/current configurations, affected object signatures, types, source hashes and relationship comparisons. A missing baseline is reported. Native controls invoke existing optimistic-revision and connected-source review checks; they do not create a separate approval authority.</w:t>
       </w:r>
     </w:p>
     <w:p>
       <w:r>
-        <w:t>Preview HTML files have immutable content-hashed names, tracked for cleanup. BrowserPolicy allows them only in the owned preview directory when explicitly enabled. This avoids rewriting a file held by WebView2. Arbitrary filenames and external navigation remain blocked. Native browser tests render the app pages; they do not execute the analyzed application.</w:t>
+        <w:t>RoutineLesson uses the routine CFG and an indexed outgoing-edge lookup. It explains source points, actual expressions and destination lines, with explicit loop, branch, early-return, cleanup and exceptional semantics. The same lesson is used by ObjectText and ObjectHTML; exported document prose and offline object pages therefore share its source interpretation. Its bounds are 60 points and eight outgoing paths per point.</w:t>
       </w:r>
     </w:p>
     <w:p>
-      <w:pPr>
-        <w:pStyle w:val="Heading1"/>
-      </w:pPr>
-      <w:r>
-        <w:t>Saved observation persistence</w:t>
+      <w:r>
+        <w:t>Preview HTML files have immutable content-hashed names, tracked for cleanup. BrowserPolicy allows them only in the owned preview directory when explicitly enabled. This avoids rewriting a file held by WebView2. Arbitrary filenames and external navigation remain blocked. Native browser tests render the app pages; they do not execute the analyzed application.</w:t>
       </w:r>
     </w:p>
     <w:p>
-      <w:r>
-        <w:t>ImportObservation accepts explicitly selected UTF-8 text extracts up to 256 KiB with named contributor and run context. It checks generation and optional entity existence, captures original byte SHA256 and linked file-revision SHA256, and stores content plus attribution in a managed hash-named JSON artifact of kind runtime_observation. No schema migration is needed for this artifact kind.</w:t>
+      <w:pPr>
+        <w:pStyle w:val="Heading1"/>
+      </w:pPr>
+      <w:r>
+        <w:t>Saved observation persistence</w:t>
       </w:r>
     </w:p>
     <w:p>
       <w:r>
-        <w:t>ObservationsJSON verifies managed identity, size, checksum and generation before returning the newest 50 records. The response owns the array until PollTimer transfers it to the form. LoadView clears old observation rows; historical records cannot navigate as current. Saved text stays in a native read-only memo rather than an executable browser surface.</w:t>
+        <w:t>ImportObservation accepts explicitly selected UTF-8 text extracts up to 256 KiB with named contributor and run context. It checks generation and optional entity existence, captures original byte SHA256 and linked file-revision SHA256, and stores content plus attribution in a managed hash-named JSON artifact of kind runtime_observation. No schema migration is needed for this artifact kind.</w:t>
       </w:r>
     </w:p>
     <w:p>
       <w:r>
-        <w:t>ManagedArtifactPaths includes observations for explicit portable backup. Retention protects their associated captured views. Publication currently omits observations rather than automatically disclose potentially sensitive logs. Contributor claims do not set runtime_observed on static analysis or create an automated causal trace.</w:t>
+        <w:t>ObservationsJSON verifies managed identity, size, checksum and generation before returning the newest 50 records. The response owns the array until PollTimer transfers it to the form. LoadView clears old observation rows; historical records cannot navigate as current. Saved text stays in a native read-only memo rather than an executable browser surface.</w:t>
       </w:r>
     </w:p>
     <w:p>
-      <w:pPr>
-        <w:pStyle w:val="Heading1"/>
-      </w:pPr>
-      <w:r>
-        <w:t>Regression commands and evidence</w:t>
+      <w:r>
+        <w:t>ManagedArtifactPaths includes observations for explicit portable backup. Retention protects their associated captured views. Publication currently omits observations rather than automatically disclose potentially sensitive logs. Contributor claims do not set runtime_observed on static analysis or create an automated causal trace.</w:t>
       </w:r>
     </w:p>
     <w:p>
-      <w:r>
-        <w:t>Run commands from the project root in an elevated Command Prompt so RAD Studio can read its environment. tools\build-wp0.cmd builds the app and checks FMX bindings. tools\validate-completion-wp1.cmd serially builds app, catalog, lifecycle, workspace, knowledge, selection and startup tests, then removes recognized disposable fixture directories.</w:t>
+      <w:pPr>
+        <w:pStyle w:val="Heading1"/>
+      </w:pPr>
+      <w:r>
+        <w:t>Regression commands and evidence</w:t>
       </w:r>
     </w:p>
     <w:p>
       <w:r>
-        <w:t>Run tools\build-wp1.cmd for 46 storage checks, tools\build-wp2.cmd no-report for discovery/resource checks, and tools\build-wp3.cmd to compile semantic tests. Then explicitly run bin\Win32\Debug\DPH.Tests.Semantics.exe "C:\New Delphi Projects\Delphi Project Handoff"; the build script alone does not run semantic assertions.</w:t>
+        <w:t>Run commands from the project root in an elevated Command Prompt so RAD Studio can read its environment. tools\build-wp0.cmd builds the app and checks FMX bindings. tools\validate-completion-wp1.cmd serially builds app, catalog, lifecycle, workspace, knowledge, selection and startup tests, then removes recognized disposable fixture directories.</w:t>
       </w:r>
     </w:p>
     <w:p>
       <w:r>
-        <w:t>tools\build-learning.cmd exercises managed images, cached supplemental-evidence recovery, actual WebView2 rendering, source walkthroughs and collapsed CFGs. --no-ui isolates deterministic checks and is not native acceptance. tools\build-wp6.cmd checks canonical scope, redaction, link integrity, publication and translation protection. Use exact log files and current input hashes for claims; historical reports are not automatically refreshed acceptance.</w:t>
+        <w:t>Run tools\build-wp1.cmd for 46 storage checks, tools\build-wp2.cmd no-report for discovery/resource checks, and tools\build-wp3.cmd to compile semantic tests. Then explicitly run bin\Win32\Debug\DPH.Tests.Semantics.exe "C:\New Delphi Projects\Delphi Project Handoff"; the build script alone does not run semantic assertions.</w:t>
       </w:r>
     </w:p>
     <w:p>
       <w:r>
-        <w:t>A native-learning test once dereferenced an absent image array on a later background-verification response. It now checks the initial cached document/image response directly. Source attachment preserves supplemental-image warnings. Inspection disproved a proposed constructor race, and no worker thread-start change remains.</w:t>
+        <w:t>tools\build-learning.cmd exercises managed images, cached supplemental-evidence recovery, actual WebView2 rendering, source walkthroughs and collapsed CFGs. --no-ui isolates deterministic checks and is not native acceptance. tools\build-wp6.cmd checks canonical scope, redaction, link integrity, publication and translation protection. Use exact log files and current input hashes for claims; historical reports are not automatically refreshed acceptance.</w:t>
       </w:r>
     </w:p>
     <w:p>
-      <w:pPr>
-        <w:pStyle w:val="Heading1"/>
-      </w:pPr>
-      <w:r>
-        <w:t>Rebuild and inspect these manuals</w:t>
+      <w:r>
+        <w:t>A native-learning test once dereferenced an absent image array on a later background-verification response. It now checks the initial cached document/image response directly. Source attachment preserves supplemental-image warnings. Inspection disproved a proposed constructor race, and no worker thread-start change remains.</w:t>
       </w:r>
     </w:p>
     <w:p>
-      <w:r>
-        <w:t>tools\build-guides.py generates the two application manuals from maintained operating content and current implementation hashes. Use the approved Python executable C:\Users\marti\AppData\Local\Microsoft\WindowsApps\python.exe. tools\render-guides.ps1 renders with LibreOffice, populates cached page numbers in editable TOC fields, renders again and writes companion PDFs under docs\pdf.</w:t>
+      <w:pPr>
+        <w:pStyle w:val="Heading1"/>
+      </w:pPr>
+      <w:r>
+        <w:t>Rebuild and inspect these manuals</w:t>
       </w:r>
     </w:p>
     <w:p>
       <w:r>
-        <w:t>Inspect every final page PNG under bin\guide-qa for clipping, broken headings, unreadable code and TOC page numbers before delivering a guide. Rendered PNGs are QA outputs, not a mock application UI. Actual included interface images are identified by their capture source and fixture; they do not establish runtime behavior of a selected project.</w:t>
+        <w:t>tools\build-guides.py generates the two application manuals from maintained operating content and current implementation hashes. Use the approved Python executable C:\Users\marti\AppData\Local\Microsoft\WindowsApps\python.exe. tools\render-guides.ps1 renders with LibreOffice, populates cached page numbers in editable TOC fields, renders again and writes companion PDFs under docs\pdf.</w:t>
       </w:r>
     </w:p>
     <w:p>
       <w:r>
-        <w:t>Regenerate manuals after later translation, handoff-contract or source-navigation changes. The source evidence appendix records inspected file hashes, while docs\guide-source-validation.json provides a machine-readable manifest. A successful generator run alone is not proof that the writing, current behavior or layout is correct.</w:t>
+        <w:t>Inspect every final page PNG under bin\guide-qa for clipping, broken headings, unreadable code and TOC page numbers before delivering a guide. Rendered PNGs are QA outputs, not a mock application UI. Actual included interface images are identified by their capture source and fixture; they do not establish runtime behavior of a selected project.</w:t>
       </w:r>
     </w:p>
     <w:p>
-      <w:pPr>
-        <w:pStyle w:val="Heading1"/>
-      </w:pPr>
-      <w:r>
-        <w:t>Business glossary implementation and checks</w:t>
+      <w:r>
+        <w:t>Regenerate manuals after later translation, handoff-contract or source-navigation changes. The source evidence appendix records inspected file hashes, while docs\guide-source-validation.json provides a machine-readable manifest. A successful generator run alone is not proof that the writing, current behavior or layout is correct.</w:t>
       </w:r>
     </w:p>
     <w:p>
-      <w:r>
-        <w:t>DPH.Knowledge.Glossary validates a business_glossary structured record with term, aliases, definition, examples and relevance/evidence context. Names normalize case and repeated whitespace. Terms/aliases are bounded to 128 characters, 32 aliases per term, definitions/examples to 16384 characters, context to 4096 characters and the record to 64 KiB. Unknown fields, duplicate fields and non-text aliases are rejected.</w:t>
+      <w:pPr>
+        <w:pStyle w:val="Heading1"/>
+      </w:pPr>
+      <w:r>
+        <w:t>Business glossary implementation and checks</w:t>
       </w:r>
     </w:p>
     <w:p>
       <w:r>
-        <w:t>The existing migration 009 structured_json column stores the exact term fields on each immutable knowledge revision; no new migration is needed. SaveKnowledge enforces glossary kind, user document and all-reader audience, generated body agreement, project-local name uniqueness, type preservation and optimistic revision checks. Glossary titles can change while the knowledge ID and prior structured revisions remain intact. Retired records continue reserving their current names.</w:t>
+        <w:t>DPH.Knowledge.Glossary validates a business_glossary structured record with term, aliases, definition, examples and relevance/evidence context. Names normalize case and repeated whitespace. Terms/aliases are bounded to 128 characters, 32 aliases per term, definitions/examples to 16384 characters, context to 4096 characters and the record to 64 KiB. Unknown fields, duplicate fields and non-text aliases are rejected.</w:t>
       </w:r>
     </w:p>
     <w:p>
       <w:r>
-        <w:t>DPH.UI.Glossary.fmx defines every term editor control for the IDE/Object Inspector. DPH.UI.Main.fmx defines the glossary list, filter, detail memo and commands. Apply prepares a draft in the existing Knowledge pipeline. The modal editor retains a cloned saved revision so a background refresh cannot invalidate its input pointer. Current source links, explicit review, search and stale-source tracking use existing repository contracts.</w:t>
+        <w:t>The existing migration 009 structured_json column stores the exact term fields on each immutable knowledge revision; no new migration is needed. SaveKnowledge enforces glossary kind, user document and all-reader audience, generated body agreement, project-local name uniqueness, type preservation and optimistic revision checks. Glossary titles can change while the knowledge ID and prior structured revisions remain intact. Retired records continue reserving their current names.</w:t>
       </w:r>
     </w:p>
     <w:p>
       <w:r>
-        <w:t>DPH-LEARNING-8 publication emits a dedicated HTML glossary index and indexes/glossary.jsonl from the canonical knowledge records. Both user and engineering DOCX use those same records. Validate compares the glossary JSONL with the canonical glossary subset; recomputing the artifact hash cannot conceal divergent content. Older publication versions remain readable under their prior contract.</w:t>
+        <w:t>DPH.UI.Glossary.fmx defines every term editor control for the IDE/Object Inspector. DPH.UI.Main.fmx defines the glossary list, filter, detail memo and commands. Apply prepares a draft in the existing Knowledge pipeline. The modal editor retains a cloned saved revision so a background refresh cannot invalidate its input pointer. Current source links, explicit review, search and stale-source tracking use existing repository contracts.</w:t>
       </w:r>
     </w:p>
     <w:p>
       <w:r>
-        <w:t>From an elevated Command Prompt run cd /d "C:\New Delphi Projects\Delphi Project Handoff", then tools\build-glossary.cmd. The suite uses the fixed ignored bin\glossary-validation directory and controlled fixtures. It checks field validation, normalized conflicts, persistence, rename, immutable revisions, stale edits/reviews, isolation, source-linked invalidation, search, publication agreement/exclusions/tampering and IDE-designed native form workflows at normal/minimum sizes. Native images are FMX PaintTo renders of actual instantiated controls; they are not screenshots of the analyzed target application.</w:t>
+        <w:t>DPH-LEARNING-8 publication emits a dedicated HTML glossary index and indexes/glossary.jsonl from the canonical knowledge records. Both user and engineering DOCX use those same records. Validate compares the glossary JSONL with the canonical glossary subset; recomputing the artifact hash cannot conceal divergent content. Older publication versions remain readable under their prior contract.</w:t>
       </w:r>
     </w:p>
     <w:p>
       <w:r>
-        <w:t>Build the application with tools\build-wp0.cmd. Run tools\build-wp5.cmd for the existing knowledge/link/review regressions and tools\build-wp6.cmd for publishing/translation regressions. A FAIL or nonzero exit means the corresponding check failed. See docs\phase1-glossary-validation.json and the glossary completion note for actual current run evidence.</w:t>
+        <w:t>From an elevated Command Prompt run cd /d "C:\New Delphi Projects\Delphi Project Handoff", then tools\build-glossary.cmd. The suite uses the fixed ignored bin\glossary-validation directory and controlled fixtures. It checks field validation, normalized conflicts, persistence, rename, immutable revisions, stale edits/reviews, isolation, source-linked invalidation, search, publication agreement/exclusions/tampering and IDE-designed native form workflows at normal/minimum sizes. Native images are FMX PaintTo renders of actual instantiated controls; they are not screenshots of the analyzed target application.</w:t>
       </w:r>
     </w:p>
     <w:p>
-      <w:pPr>
-        <w:pStyle w:val="Heading1"/>
-      </w:pPr>
-      <w:r>
-        <w:t>Offline translation and localized publication</w:t>
+      <w:r>
+        <w:t>Build the application with tools\build-wp0.cmd. Run tools\build-wp5.cmd for the existing knowledge/link/review regressions and tools\build-wp6.cmd for publishing/translation regressions. A FAIL or nonzero exit means the corresponding check failed. See docs\phase1-glossary-validation.json and the glossary completion note for actual current run evidence.</w:t>
       </w:r>
     </w:p>
     <w:p>
-      <w:r>
-        <w:t>Migration 008 adds the persistent translation cache key and JSON record. Cache identity covers saved knowledge revision, requested locales, provider pack hash, source segments and terminology. SQL state overlays cached metadata so source invalidation remains authoritative after database reopen. Approval requires current source review, complete translated prose and a named reviewer; it never updates authoritative source text.</w:t>
+      <w:pPr>
+        <w:pStyle w:val="Heading1"/>
+      </w:pPr>
+      <w:r>
+        <w:t>Offline translation and localized publication</w:t>
       </w:r>
     </w:p>
     <w:p>
       <w:r>
-        <w:t>TDPHAtlasAdapter uses DAT.Runtime.LanguagePack plus its two copied core dependencies, original license and hashed snapshot provenance. Selected packs are bounded to 4 MiB, strictly UTF-8 and application scoped. Exact source phrase lookup and base-language fallback are explicit. Common code, SQL, paths and identifiers are protected during segmentation; unusual unmarked identifiers still need human review.</w:t>
+        <w:t>Migration 008 adds the persistent translation cache key and JSON record. Cache identity covers saved knowledge revision, requested locales, provider pack hash, source segments and terminology. SQL state overlays cached metadata so source invalidation remains authoritative after database reopen. Approval requires current source review, complete translated prose and a named reviewer; it never updates authoritative source text.</w:t>
       </w:r>
     </w:p>
     <w:p>
       <w:r>
-        <w:t>DPH-LEARNING-7 publication writes localization.json and, when a locale is requested, a hashed HTML page and Localized_Sections.docx. Verified exact-revision cache entries are eligible only while the canonical source section is reviewed and has no pending tasks. Redacted source bodies use source fallback. The supplementary document explicitly limits its scope to authored bodies.</w:t>
+        <w:t>TDPHAtlasAdapter uses DAT.Runtime.LanguagePack plus its two copied core dependencies, original license and hashed snapshot provenance. Selected packs are bounded to 4 MiB, strictly UTF-8 and application scoped. Exact source phrase lookup and base-language fallback are explicit. Common code, SQL, paths and identifiers are protected during segmentation; unusual unmarked identifiers still need human review.</w:t>
       </w:r>
     </w:p>
     <w:p>
       <w:r>
-        <w:t>Source navigation is separately opt-in. Only scoped captured text with matching source hashes is rendered as encoded, redacted HTML. Task masks use captured noncontainer ranges and original line starts. source-navigation.json records included line numbers and omission reasons. Validate checks scope, file identity, line order/counts, generations and disclosure metadata. No original source snapshot is shipped.</w:t>
+        <w:t>DPH-LEARNING-7 publication writes localization.json and, when a locale is requested, a hashed HTML page and Localized_Sections.docx. Verified exact-revision cache entries are eligible only while the canonical source section is reviewed and has no pending tasks. Redacted source bodies use source fallback. The supplementary document explicitly limits its scope to authored bodies.</w:t>
       </w:r>
     </w:p>
     <w:p>
-      <w:pPr>
-        <w:pStyle w:val="Heading1"/>
-      </w:pPr>
-      <w:r>
-        <w:t>Native validation and release evidence</w:t>
+      <w:r>
+        <w:t>Source navigation is separately opt-in. Only scoped captured text with matching source hashes is rendered as encoded, redacted HTML. Task masks use captured noncontainer ranges and original line starts. source-navigation.json records included line numbers and omission reasons. Validate checks scope, file identity, line order/counts, generations and disclosure metadata. No original source snapshot is shipped.</w:t>
       </w:r>
     </w:p>
     <w:p>
-      <w:r>
-        <w:t>The design-time Validate bundle controls dispatch validate_bundle to the worker before a database connection is required. The owner supplies an expected fingerprint independently. Stale rejection is default and historical inspection is an explicit qualification. Native reports distinguish integrity from human approval.</w:t>
+      <w:pPr>
+        <w:pStyle w:val="Heading1"/>
+      </w:pPr>
+      <w:r>
+        <w:t>Native validation and release evidence</w:t>
       </w:r>
     </w:p>
     <w:p>
       <w:r>
-        <w:t>The Win32 project enables DCC_LargeAddressAware in its IDE project options. The hardening and learning harnesses use the equivalent PE flag. The expanded pinned corpus exposed an out-of-memory failure after repeated captures and native workspace loading under the former address limit. Keep memory measurements and actual large-corpus validation with this change; the linker flag does not make memory consumption unbounded or establish a release budget.</w:t>
+        <w:t>The design-time Validate bundle controls dispatch validate_bundle to the worker before a database connection is required. The owner supplies an expected fingerprint independently. Stale rejection is default and historical inspection is an explicit qualification. Native reports distinguish integrity from human approval.</w:t>
       </w:r>
     </w:p>
     <w:p>
       <w:r>
-        <w:t>Run tools\validate-wp7.ps1 elevated for the pinned reference hardening suite and before/after hash proof. It reads the current schema constant rather than an obsolete hardcoded version. The suite measures full capture, cached open, reassessment, message-pump gaps and peak process working set on recorded hardware. Measurements require owner-agreed budgets before release acceptance.</w:t>
+        <w:t>The Win32 project enables DCC_LargeAddressAware in its IDE project options. The hardening and learning harnesses use the equivalent PE flag. The expanded pinned corpus exposed an out-of-memory failure after repeated captures and native workspace loading under the former address limit. Keep memory measurements and actual large-corpus validation with this change; the linker flag does not make memory consumption unbounded or establish a release budget.</w:t>
       </w:r>
     </w:p>
     <w:p>
       <w:r>
-        <w:t>The independent first-time programmer and source-review worksheet is docs\WP7_Maintenance_Exercise.txt. Preserve actual participant answers, source citations, uncertainty judgments, assistance, timings and defects. Do not substitute automated tests or prepared instructions for AC-25 or independent explanation review.</w:t>
+        <w:t>Run tools\validate-wp7.ps1 elevated for the pinned reference hardening suite and before/after hash proof. It reads the current schema constant rather than an obsolete hardcoded version. The suite measures full capture, cached open, reassessment, message-pump gaps and peak process working set on recorded hardware. Measurements require owner-agreed budgets before release acceptance.</w:t>
       </w:r>
     </w:p>
     <w:p>
-      <w:pPr>
-        <w:pStyle w:val="Heading1"/>
-      </w:pPr>
-      <w:r>
-        <w:t>Structured project profile contract</w:t>
+      <w:r>
+        <w:t>The independent first-time programmer and source-review worksheet is docs\WP7_Maintenance_Exercise.txt. Preserve actual participant answers, source citations, uncertainty judgments, assistance, timings and defects. Do not substitute automated tests or prepared instructions for AC-25 or independent explanation review.</w:t>
       </w:r>
     </w:p>
     <w:p>
-      <w:r>
-        <w:t>TDPHWorkspaceView.ProjectMembers projects captured syntax files into a selected-scope catalog without filesystem discovery. DPH.UI.Main.fmx defines separate Known databases and Selected project subpages, with a native list and evidence memo. Program, library and package declarations retain source references; project properties and references retain captured values and child conditions. Parent conditions may apply even when a child has none recorded. tests\DPH.Tests.ProjectCatalog.dpr checks a selected group, missing referenced project, output kinds, settings, native selection and input immutability.</w:t>
+      <w:pPr>
+        <w:pStyle w:val="Heading1"/>
+      </w:pPr>
+      <w:r>
+        <w:t>Structured project profile contract</w:t>
       </w:r>
     </w:p>
     <w:p>
       <w:r>
-        <w:t>Migration 009 adds an object-valued structured_json field to append-only knowledge revisions. TDPHProjectProfile validates 15 known text fields, required purpose and attribution, per-field bounds and a 64 KiB record bound. SaveKnowledge enforces stable project scope, title, kind and generated body, prevents ordinary-record conversion, duplicate profiles and loss of typed data, and preserves structured fields during named review and continuity revisions. Publication decodes typed metadata before recursive redaction, including revision history.</w:t>
+        <w:t>TDPHWorkspaceView.ProjectMembers projects captured syntax files into a selected-scope catalog without filesystem discovery. DPH.UI.Main.fmx defines separate Known databases and Selected project subpages, with a native list and evidence memo. Program, library and package declarations retain source references; project properties and references retain captured values and child conditions. Parent conditions may apply even when a child has none recorded. tests\DPH.Tests.ProjectCatalog.dpr checks a selected group, missing referenced project, output kinds, settings, native selection and input immutability.</w:t>
       </w:r>
     </w:p>
     <w:p>
       <w:r>
-        <w:t>DPH.UI.ProjectProfile.fmx defines every editor control at design time. Apply returns an attributed draft to the existing Knowledge save pipeline. It does not bypass unsaved-edit guards or automatically approve information. tests\DPH.Tests.Phase1.dpr verifies persistence, review, stale editors, history, field bounds and native form behavior; publishing regressions check canonical, HTML and DOCX inclusion.</w:t>
+        <w:t>Migration 009 adds an object-valued structured_json field to append-only knowledge revisions. TDPHProjectProfile validates 15 known text fields, required purpose and attribution, per-field bounds and a 64 KiB record bound. SaveKnowledge enforces stable project scope, title, kind and generated body, prevents ordinary-record conversion, duplicate profiles and loss of typed data, and preserves structured fields during named review and continuity revisions. Publication decodes typed metadata before recursive redaction, including revision history.</w:t>
       </w:r>
     </w:p>
     <w:p>
-      <w:pPr>
-        <w:pStyle w:val="Heading1"/>
-      </w:pPr>
-      <w:r>
-        <w:t>Quality analysis and revision comparison</w:t>
+      <w:r>
+        <w:t>DPH.UI.ProjectProfile.fmx defines every editor control at design time. Apply returns an attributed draft to the existing Knowledge save pipeline. It does not bypass unsaved-edit guards or automatically approve information. tests\DPH.Tests.Phase1.dpr verifies persistence, review, stale editors, history, field bounds and native form behavior; publishing regressions check canonical, HTML and DOCX inclusion.</w:t>
       </w:r>
     </w:p>
     <w:p>
-      <w:r>
-        <w:t>DPH.Analysis.Quality emits DPH-QUALITY-1 evidence during workspace capture. Routine metrics, eligible token-body equality, conservative missing-inbound and disconnected-CFG findings, and iterative call-graph strongly connected components use captured inputs only. The worker invalidates an older connected cache without this analyzer version. All findings remain qualified candidates.</w:t>
+      <w:pPr>
+        <w:pStyle w:val="Heading1"/>
+      </w:pPr>
+      <w:r>
+        <w:t>Quality analysis and revision comparison</w:t>
       </w:r>
     </w:p>
     <w:p>
       <w:r>
-        <w:t>DPH.Workspace.Comparison compares two hash-verified retained captures from the same project database. It rejects differing selection and syntax or semantic analyzer contracts. Deterministic identity indexes distinguish file changes, symbol additions or removals, captured structure changes and file-only changes. Routine-local flow numbering avoids global node-number shifts. Results use filtered 200-row pages; individual structure displays are limited to 4000 characters with full-content structure hashes and explicit truncation.</w:t>
+        <w:t>DPH.Analysis.Quality emits DPH-QUALITY-1 evidence during workspace capture. Routine metrics, eligible token-body equality, conservative missing-inbound and disconnected-CFG findings, and iterative call-graph strongly connected components use captured inputs only. The worker invalidates an older connected cache without this analyzer version. All findings remain qualified candidates.</w:t>
       </w:r>
     </w:p>
     <w:p>
       <w:r>
-        <w:t>Comparison runs on the existing background worker. It reads retained database artifacts rather than current selected source files. Native comparison controls and evidence panes are declared in DPH.UI.Main.fmx. tests\DPH.Tests.Comparison.dpr checks literal-expression changes, unchanged neighboring routines, flow-edge rewiring, identity changes, contract rejection, pages, native panes, worker loading and missing caches.</w:t>
+        <w:t>DPH.Workspace.Comparison compares two hash-verified retained captures from the same project database. It rejects differing selection and syntax or semantic analyzer contracts. Deterministic identity indexes distinguish file changes, symbol additions or removals, captured structure changes and file-only changes. Routine-local flow numbering avoids global node-number shifts. Results use filtered 200-row pages; individual structure displays are limited to 4000 characters with full-content structure hashes and explicit truncation.</w:t>
       </w:r>
     </w:p>
     <w:p>
       <w:r>
-        <w:t>The Phase 1 traceability ledger preserves the supplied requirements and limitations. Source comparison remains partial until optional historical source retention supports actual source-text differences; captured structural comparison must never be described as reconstructing those bytes. Human business answers and independent first-time-user acceptance remain separate evidence.</w:t>
+        <w:t>Comparison runs on the existing background worker. It reads retained database artifacts rather than current selected source files. Native comparison controls and evidence panes are declared in DPH.UI.Main.fmx. tests\DPH.Tests.Comparison.dpr checks literal-expression changes, unchanged neighboring routines, flow-edge rewiring, identity changes, contract rejection, pages, native panes, worker loading and missing caches.</w:t>
       </w:r>
     </w:p>
     <w:p>
-      <w:pPr>
-        <w:pStyle w:val="Heading1"/>
-      </w:pPr>
-      <w:r>
-        <w:t>Keyboard inspector implementation and validation</w:t>
+      <w:r>
+        <w:t>The Phase 1 traceability ledger preserves the supplied requirements and limitations. Source comparison remains partial until optional historical source retention supports actual source-text differences; captured structural comparison must never be described as reconstructing those bytes. Human business answers and independent first-time-user acceptance remain separate evidence.</w:t>
       </w:r>
     </w:p>
     <w:p>
-      <w:r>
-        <w:t>DPH.Workspace.Keyboard projects captured text and binary form IR into source-backed component records. A parent-property index avoids rescanning every node for every component. Rows retain generation, source SHA256, line and byte extents, original property values and explicit unknowns. Numeric shortcut conflicts normalize decimal and hexadecimal codes within each serialized form; sibling TabOrder conflicts stay parent-local. Unique local action declarations carry separate shortcut and source evidence; uncaptured custom, external or inherited actions remain unresolved.</w:t>
+      <w:pPr>
+        <w:pStyle w:val="Heading1"/>
+      </w:pPr>
+      <w:r>
+        <w:t>Keyboard inspector implementation and validation</w:t>
       </w:r>
     </w:p>
     <w:p>
       <w:r>
-        <w:t>DPH.UI.Main.fmx serializes every inspector control for the IDE and Object Inspector. The Keyboard and focus page filters readable evidence, sorts sibling TabOrder and uses 250-row pages. TDPHKeyboardInspector.ReadSource enforces matching generation, source identity, project containment, text availability and source hash before navigation. Binary forms expose byte evidence without applying it as text lines. No database migration or target execution is required.</w:t>
+        <w:t>DPH.Workspace.Keyboard projects captured text and binary form IR into source-backed component records. A parent-property index avoids rescanning every node for every component. Rows retain generation, source SHA256, line and byte extents, original property values and explicit unknowns. Numeric shortcut conflicts normalize decimal and hexadecimal codes within each serialized form; sibling TabOrder conflicts stay parent-local. Unique local action declarations carry separate shortcut and source evidence; uncaptured custom, external or inherited actions remain unresolved.</w:t>
       </w:r>
     </w:p>
     <w:p>
       <w:r>
+        <w:t>DPH.UI.Main.fmx serializes every inspector control for the IDE and Object Inspector. The Keyboard and focus page filters readable evidence, sorts sibling TabOrder and uses 250-row pages. TDPHKeyboardInspector.ReadSource enforces matching generation, source identity, project containment, text availability and source hash before navigation. Binary forms expose byte evidence without applying it as text lines. No database migration or target execution is required.</w:t>
+      </w:r>
+    </w:p>
+    <w:p>
+      <w:r>
         <w:t>Run tools\build-keyboard.cmd elevated for 55 checks covering actual DFM, FMX and binary parsing, action references, conflicts, unknown states, readable key names, source safeguards, pagination and instantiated FMX controls. The fixed bin/keyboard-validation fixture avoids new disposable test folders. Native PaintTo images in docs/phase1-keyboard-workspace.png and phase1-keyboard-compact.png are renders of running DPH controls, not target application screenshots. The suite checks the user catalog and selected fixture bytes remain unchanged. Runtime traversal and accessibility conformance require separate observed tests.</w:t>
+      </w:r>
+    </w:p>
+    <w:p>
+      <w:pPr>
+        <w:pStyle w:val="Heading1"/>
+      </w:pPr>
+      <w:r>
+        <w:t>Command inventory implementation and validation</w:t>
+      </w:r>
+    </w:p>
+    <w:p>
+      <w:r>
+        <w:t>DPH.Workspace.Commands builds command records from captured component properties in DPH.Workspace.Keyboard. It indexes parent paths and form-local names, distinguishes duplicate or incompatible references, and joins event properties by exact source and byte location to confirmed static semantic binds relationships. Every handler retains its own identity, relation, target symbol, range and source fingerprint. Action handlers and shortcuts remain separate from component declarations. Uncaptured inheritance, custom classes, external names and runtime dispatch remain qualified.</w:t>
+      </w:r>
+    </w:p>
+    <w:p>
+      <w:r>
+        <w:t>DPH.UI.Main.fmx serializes the Menus and commands controls for IDE editing. The page provides kind and text filters, 250-row pagination, independent handler selection and Explain navigation. Command and action source commands reuse the keyboard inspector generation, hash and containment checks. Loading a replacement capture clears stale command rows. No database migration or target execution is required.</w:t>
+      </w:r>
+    </w:p>
+    <w:p>
+      <w:r>
+        <w:t>Run tools\build-commands.cmd elevated for 62 focused checks using actual text DFM, binary DFM, FMX and semantic fixtures, including action execute/update, own click and popup handlers, unresolved references, pagination and native control bindings. Fixtures reuse bin/commands-validation. Source bytes and the user catalog are checked unchanged. PaintTo renders in docs/phase1-commands-workspace.png and phase1-commands-compact.png show running DPH controls, not screenshots of the target app. The keyboard suite remains a required regression because both inspectors share captured properties.</w:t>
       </w:r>
     </w:p>
     <w:p>
@@ -1751,7 +1789,7 @@
           <w:rFonts w:ascii="Consolas" w:hAnsi="Consolas"/>
           <w:sz w:val="16"/>
         </w:rPr>
-        <w:t>4c047871c06a68bfd3ce650a36ebd347010f43985ae9b5f40b83859222b67615</w:t>
+        <w:t>956e597b27924091fd7d6acbfc8bc8eda62182a3a89e1be7ca3346126def441e</w:t>
       </w:r>
     </w:p>
     <w:p>
@@ -1799,6 +1837,26 @@
         <w:keepNext/>
       </w:pPr>
       <w:r>
+        <w:t>DPH.Workspace.Commands.pas</w:t>
+      </w:r>
+    </w:p>
+    <w:p>
+      <w:pPr>
+        <w:spacing w:after="60"/>
+      </w:pPr>
+      <w:r>
+        <w:rPr>
+          <w:rFonts w:ascii="Consolas" w:hAnsi="Consolas"/>
+          <w:sz w:val="16"/>
+        </w:rPr>
+        <w:t>9d737351356cf30b1f5bd6d2dee5c514bcafe16c6fcafe24be82b2f06c1a3d28</w:t>
+      </w:r>
+    </w:p>
+    <w:p>
+      <w:pPr>
+        <w:keepNext/>
+      </w:pPr>
+      <w:r>
         <w:t>DPH.Workspace.Comparison.pas</w:t>
       </w:r>
     </w:p>
@@ -1851,7 +1909,7 @@
           <w:rFonts w:ascii="Consolas" w:hAnsi="Consolas"/>
           <w:sz w:val="16"/>
         </w:rPr>
-        <w:t>90cd886ce1c00b911c25c7ebf437a7cbf2989a67169b41e43d35a5c666d3ef20</w:t>
+        <w:t>cdc6b41289cebbe37601be3306a9cbefed08928c2730e24747093ab0f48fbcc4</w:t>
       </w:r>
     </w:p>
     <w:p>
@@ -1931,7 +1989,7 @@
           <w:rFonts w:ascii="Consolas" w:hAnsi="Consolas"/>
           <w:sz w:val="16"/>
         </w:rPr>
-        <w:t>021365f90fb3a6d3aadac37f98a6b37a7f021dbfbfa6d79b474278ec9a1fe54c</w:t>
+        <w:t>a924181a6412caabab27a3d440680255c44ef93179d514eea15296252b00452b</w:t>
       </w:r>
     </w:p>
     <w:p>
@@ -2011,7 +2069,7 @@
           <w:rFonts w:ascii="Consolas" w:hAnsi="Consolas"/>
           <w:sz w:val="16"/>
         </w:rPr>
-        <w:t>a1237b831fb2d64dceb866fa1b32232c8b31b01f47fb631806fa4516db3272a2</w:t>
+        <w:t>c77e545e8d113edd5853664d50ffc62e0c34d6bf8e7f5de842465d87f00bbdf2</w:t>
       </w:r>
     </w:p>
     <w:sectPr>

</xml_diff>

<commit_message>
Implement dynamic control relationships and inspector for requirement 04.15
</commit_message>
<xml_diff>
--- a/docs/guides/DPH_Engineering_Guide.docx
+++ b/docs/guides/DPH_Engineering_Guide.docx
@@ -505,7 +505,7 @@
         </w:tabs>
       </w:pPr>
       <w:r>
-        <w:t>Source and revision evidence</w:t>
+        <w:t>Dynamic control relationships and validation</w:t>
       </w:r>
       <w:r>
         <w:tab/>
@@ -513,710 +513,748 @@
       </w:r>
     </w:p>
     <w:p>
-      <w:r>
-        <w:fldChar w:fldCharType="end"/>
+      <w:pPr>
+        <w:spacing w:after="0" w:line="240" w:lineRule="auto"/>
+        <w:tabs>
+          <w:tab w:val="right" w:leader="dot" w:pos="9360"/>
+        </w:tabs>
+      </w:pPr>
+      <w:r>
+        <w:t>Source and revision evidence</w:t>
+      </w:r>
+      <w:r>
+        <w:tab/>
+        <w:t>14</w:t>
       </w:r>
     </w:p>
     <w:p>
       <w:r>
-        <w:br w:type="page"/>
+        <w:fldChar w:fldCharType="end"/>
       </w:r>
     </w:p>
     <w:p>
-      <w:pPr>
-        <w:pStyle w:val="Heading1"/>
-      </w:pPr>
-      <w:r>
-        <w:t>Architecture and boundaries</w:t>
+      <w:r>
+        <w:br w:type="page"/>
       </w:r>
     </w:p>
     <w:p>
-      <w:r>
-        <w:t>DPH is an independent Delphi FMX application. It has no converter runtime or build dependency. The pinned VCL2FMXConverter v6.0.0 corpus is test input only, at commit e1fd10b2d3b06f2fc3f726b8eb7f234a54faf63d. No converter source was copied into the current analyzer. Preserve the original planning documents and global agents.md byte for byte.</w:t>
+      <w:pPr>
+        <w:pStyle w:val="Heading1"/>
+      </w:pPr>
+      <w:r>
+        <w:t>Architecture and boundaries</w:t>
       </w:r>
     </w:p>
     <w:p>
       <w:r>
-        <w:t>The pipeline is selected project, bounded inventory, read-only byte acquisition, lexical and conditional processing, Pascal and form IR, semantic relationships and control flow, revision-consistent SQLite capture, cached workspace projection, curated knowledge and derived publication. Contract data remains separate from FMX. Every unsupported construct or unavailable dependency must remain diagnosable rather than being promoted into false completeness.</w:t>
+        <w:t>DPH is an independent Delphi FMX application. It has no converter runtime or build dependency. The pinned VCL2FMXConverter v6.0.0 corpus is test input only, at commit e1fd10b2d3b06f2fc3f726b8eb7f234a54faf63d. No converter source was copied into the current analyzer. Preserve the original planning documents and global agents.md byte for byte.</w:t>
       </w:r>
     </w:p>
     <w:p>
       <w:r>
-        <w:t>Application controls are serialized in DPH.UI.Main.fmx, DPH.UI.ProjectProfile.fmx and DPH.UI.Glossary.fmx and editable in the IDE. List contents and paint-box geometry are data projections. No scanned component class is instantiated. Avoid adding runtime-only controls, Pascal class helpers or an alternative authoritative store without explicit authorization.</w:t>
+        <w:t>The pipeline is selected project, bounded inventory, read-only byte acquisition, lexical and conditional processing, Pascal and form IR, semantic relationships and control flow, revision-consistent SQLite capture, cached workspace projection, curated knowledge and derived publication. Contract data remains separate from FMX. Every unsupported construct or unavailable dependency must remain diagnosable rather than being promoted into false completeness.</w:t>
       </w:r>
     </w:p>
     <w:p>
-      <w:pPr>
-        <w:pStyle w:val="Heading1"/>
-      </w:pPr>
-      <w:r>
-        <w:t>Rework and acceptance status</w:t>
+      <w:r>
+        <w:t>Application controls are serialized in DPH.UI.Main.fmx, DPH.UI.ProjectProfile.fmx and DPH.UI.Glossary.fmx and editable in the IDE. List contents and paint-box geometry are data projections. No scanned component class is instantiated. Avoid adding runtime-only controls, Pascal class helpers or an alternative authoritative store without explicit authorization.</w:t>
       </w:r>
     </w:p>
     <w:p>
-      <w:r>
-        <w:t>The owner rejected the earlier WP7 delivery as inadequate for learning and handoff. The statement that implementation through WP7 was complete has been withdrawn. docs/Rework_Requirements_Audit.txt compares the original plan with the implemented product and outstanding work. Historical WP reports remain historical evidence, not acceptance of the reworked experience.</w:t>
+      <w:pPr>
+        <w:pStyle w:val="Heading1"/>
+      </w:pPr>
+      <w:r>
+        <w:t>Rework and acceptance status</w:t>
       </w:r>
     </w:p>
     <w:p>
       <w:r>
-        <w:t>The rework adds a first-launch Getting started course, deterministic explanation engine, guided learning workspace, source-comment context, event traces, labeled and collapsed procedure-flow views, attributed screenshot imports and richer project-specific publication. Run tools/build-learning.cmd with an optional pinned reference database path for dedicated learning and real-WebView2 tests. The source-based first-time-programmer exercise still needs a human participant.</w:t>
+        <w:t>The owner rejected the earlier WP7 delivery as inadequate for learning and handoff. The statement that implementation through WP7 was complete has been withdrawn. docs/Rework_Requirements_Audit.txt compares the original plan with the implemented product and outstanding work. Historical WP reports remain historical evidence, not acceptance of the reworked experience.</w:t>
       </w:r>
     </w:p>
     <w:p>
       <w:r>
-        <w:t>The implementation tracker records expanded semantic reuse, resource interpretation and retention/continuity controls. Their documented bounds still apply. Source safety, privacy, attribution and exact generation links are retained. Do not turn an automated pass count into a claim that every requirement or the human onboarding goal is finished.</w:t>
+        <w:t>The rework adds a first-launch Getting started course, deterministic explanation engine, guided learning workspace, source-comment context, event traces, labeled and collapsed procedure-flow views, attributed screenshot imports and richer project-specific publication. Run tools/build-learning.cmd with an optional pinned reference database path for dedicated learning and real-WebView2 tests. The source-based first-time-programmer exercise still needs a human participant.</w:t>
       </w:r>
     </w:p>
     <w:p>
-      <w:pPr>
-        <w:pStyle w:val="Heading1"/>
-      </w:pPr>
-      <w:r>
-        <w:t>Build and deployment</w:t>
+      <w:r>
+        <w:t>The implementation tracker records expanded semantic reuse, resource interpretation and retention/continuity controls. Their documented bounds still apply. Source safety, privacy, attribution and exact generation links are retained. Do not turn an automated pass count into a claim that every requirement or the human onboarding goal is finished.</w:t>
       </w:r>
     </w:p>
     <w:p>
-      <w:r>
-        <w:t>The installed compiler is RAD Studio 37.0.59082.6021. Load C:\Program Files (x86)\Embarcadero\Studio\37.0\bin\rsvars.bat before compiling. tools/build-wp0.cmd builds DelphiProjectHandoff.dproj with elevated MSBuild and runs the FMX resource smoke test. Output is bin/Win32/Debug, with DCUs in dcu/Win32/Debug. The initial executable target is Windows Win32.</w:t>
+      <w:pPr>
+        <w:pStyle w:val="Heading1"/>
+      </w:pPr>
+      <w:r>
+        <w:t>Build and deployment</w:t>
       </w:r>
     </w:p>
     <w:p>
       <w:r>
-        <w:t>Deploy the executable, all nine immutable migration files, and the architecture-matched WebView2Loader.dll. The reviewed Microsoft WebView2 SDK package is pinned to 1.0.4258.31; retain tools/WebView2/LICENSE.txt with binary redistribution. The browser loads the DLL by its absolute executable-folder path and activates Edge only when preview is requested. There is no intended IE fallback.</w:t>
+        <w:t>The installed compiler is RAD Studio 37.0.59082.6021. Load C:\Program Files (x86)\Embarcadero\Studio\37.0\bin\rsvars.bat before compiling. tools/build-wp0.cmd builds DelphiProjectHandoff.dproj with elevated MSBuild and runs the FMX resource smoke test. Output is bin/Win32/Debug, with DCUs in dcu/Win32/Debug. The initial executable target is Windows Win32.</w:t>
       </w:r>
     </w:p>
     <w:p>
       <w:r>
-        <w:t>The repository standard folders include bin, dcu, docs/guides, docs/pdf, export, help, images and icons, samples, source distributions and tools. Deploy help/index.html for first-launch education. Reference source and generated test databases remain ignored. Use the explicitly approved Python 3.13 executable for project tooling and the installed LibreOffice, never Microsoft Word.</w:t>
+        <w:t>Deploy the executable, all nine immutable migration files, and the architecture-matched WebView2Loader.dll. The reviewed Microsoft WebView2 SDK package is pinned to 1.0.4258.31; retain tools/WebView2/LICENSE.txt with binary redistribution. The browser loads the DLL by its absolute executable-folder path and activates Edge only when preview is requested. There is no intended IE fallback.</w:t>
       </w:r>
     </w:p>
     <w:p>
-      <w:pPr>
-        <w:pStyle w:val="Heading1"/>
-      </w:pPr>
-      <w:r>
-        <w:t>Input acquisition and project scope</w:t>
+      <w:r>
+        <w:t>The repository standard folders include bin, dcu, docs/guides, docs/pdf, export, help, images and icons, samples, source distributions and tools. Deploy help/index.html for first-launch education. Reference source and generated test databases remain ignored. Use the explicitly approved Python 3.13 executable for project tooling and the installed LibreOffice, never Microsoft Word.</w:t>
       </w:r>
     </w:p>
     <w:p>
-      <w:r>
-        <w:t>DPH.Project.Inventory follows the selected project, explicit references, uses clauses, include paths and approved external roots. Project XML is passive: targets and imported build scripts are not executed. Canonical paths are project relative and normalized; traversal, ambiguous macros, reparse paths, cycles and oversized acquisition are rejected or diagnosed. A repository-wide count of Pascal files is not the build scope.</w:t>
+      <w:pPr>
+        <w:pStyle w:val="Heading1"/>
+      </w:pPr>
+      <w:r>
+        <w:t>Input acquisition and project scope</w:t>
       </w:r>
     </w:p>
     <w:p>
       <w:r>
-        <w:t>DPH.Project.Source opens input read only, checks the final opened Windows handle path, captures bytes, records SHA256 and verifies decoding by round trip. Unicode byte offsets, line endings and explicit legacy encodings remain in the evidence contract. The maximum acquired source is 16 MiB. Binary forms are parsed as data; unsupported resources remain gaps.</w:t>
+        <w:t>DPH.Project.Inventory follows the selected project, explicit references, uses clauses, include paths and approved external roots. Project XML is passive: targets and imported build scripts are not executed. Canonical paths are project relative and normalized; traversal, ambiguous macros, reparse paths, cycles and oversized acquisition are rejected or diagnosed. A repository-wide count of Pascal files is not the build scope.</w:t>
       </w:r>
     </w:p>
     <w:p>
       <w:r>
-        <w:t>A source viewer must re-acquire the live file and match the captured hash before using a cached range. Externally referenced sources use their explicit canonical inventory identity. Never invent a neighboring source path from a cached filename or execute input to fill an analysis gap.</w:t>
+        <w:t>DPH.Project.Source opens input read only, checks the final opened Windows handle path, captures bytes, records SHA256 and verifies decoding by round trip. Unicode byte offsets, line endings and explicit legacy encodings remain in the evidence contract. The maximum acquired source is 16 MiB. Binary forms are parsed as data; unsupported resources remain gaps.</w:t>
       </w:r>
     </w:p>
     <w:p>
-      <w:pPr>
-        <w:pStyle w:val="Heading1"/>
-      </w:pPr>
-      <w:r>
-        <w:t>Syntax contracts and limits</w:t>
+      <w:r>
+        <w:t>A source viewer must re-acquire the live file and match the captured hash before using a cached range. Externally referenced sources use their explicit canonical inventory identity. Never invent a neighboring source path from a cached filename or execute input to fill an analysis gap.</w:t>
       </w:r>
     </w:p>
     <w:p>
-      <w:r>
-        <w:t>DPH.Parse.Model defines IR schema 1, analyzer DPH-WP2-5, token and node limits, source ranges and diagnostics. Lexing preserves original tokens and conditional information. Preprocessing evaluates supported expressions, explicit defines and includes while retaining uncertainty for unknown branches. An unavailable compiler symbol is not automatically a false condition.</w:t>
+      <w:pPr>
+        <w:pStyle w:val="Heading1"/>
+      </w:pPr>
+      <w:r>
+        <w:t>Syntax contracts and limits</w:t>
       </w:r>
     </w:p>
     <w:p>
       <w:r>
-        <w:t>The Pascal parser extracts declarations, routines, anonymous methods and supported statements into IR. Declaration and implementation occurrences remain distinguishable before semantic unification. The form parser accepts supported text and binary DFM/FMX structures without loading component packages. The inventory reads relevant project configuration and resources through bounded adapters.</w:t>
+        <w:t>DPH.Parse.Model defines IR schema 1, analyzer DPH-WP2-5, token and node limits, source ranges and diagnostics. Lexing preserves original tokens and conditional information. Preprocessing evaluates supported expressions, explicit defines and includes while retaining uncertainty for unknown branches. An unavailable compiler symbol is not automatically a false condition.</w:t>
       </w:r>
     </w:p>
     <w:p>
       <w:r>
-        <w:t>Current bounds include 250000 tokens, 100000 IR nodes, nesting 128 and 10000 diagnostics. Opaque assembler, malformed syntax and unsupported grammar are partial. Tests use exact golden IR, encoding edge cases, cyclic includes, passive malicious imports and changed source. Maintain source byte ranges and diagnostics when extending support.</w:t>
+        <w:t>The Pascal parser extracts declarations, routines, anonymous methods and supported statements into IR. Declaration and implementation occurrences remain distinguishable before semantic unification. The form parser accepts supported text and binary DFM/FMX structures without loading component packages. The inventory reads relevant project configuration and resources through bounded adapters.</w:t>
       </w:r>
     </w:p>
     <w:p>
-      <w:pPr>
-        <w:pStyle w:val="Heading1"/>
-      </w:pPr>
-      <w:r>
-        <w:t>Symbols and typed relationships</w:t>
+      <w:r>
+        <w:t>Current bounds include 250000 tokens, 100000 IR nodes, nesting 128 and 10000 diagnostics. Opaque assembler, malformed syntax and unsupported grammar are partial. Tests use exact golden IR, encoding edge cases, cyclic includes, passive malicious imports and changed source. Maintain source byte ranges and diagnostics when extending support.</w:t>
       </w:r>
     </w:p>
     <w:p>
-      <w:r>
-        <w:t>DPH.Analysis.Model defines semantic schema 1 and analyzer DPH-WP3-11. Stable symbol keys contain qualified identity, signature and conditional variant. DPH.Analysis.Symbols unifies supported routine prototypes and bodies, resolves cross-unit declarations, typed receivers and suitable overloads, associates form events and records anonymous callbacks.</w:t>
+      <w:pPr>
+        <w:pStyle w:val="Heading1"/>
+      </w:pPr>
+      <w:r>
+        <w:t>Symbols and typed relationships</w:t>
       </w:r>
     </w:p>
     <w:p>
       <w:r>
-        <w:t>Relationship certainty is confirmed_static, possible_dynamic, inferred, runtime_observed or unresolved. Passive scanning never claims runtime_observed. A uses dependency is not a call. Known lexical calls, serialized bindings and declared types carry derivation rules and source ranges. Recognized asynchronous API spelling can establish a possible scheduling relationship without proving execution order.</w:t>
+        <w:t>DPH.Analysis.Model defines semantic schema 1 and analyzer DPH-WP3-12. Stable symbol keys contain qualified identity, signature and conditional variant. DPH.Analysis.Symbols unifies supported routine prototypes and bodies, resolves cross-unit declarations, typed receivers and suitable overloads, associates form events and records anonymous callbacks.</w:t>
       </w:r>
     </w:p>
     <w:p>
       <w:r>
-        <w:t>Method pointers, unresolved receivers, dynamic dispatch, generated types and framework behavior must retain uncertainty. Basic reads, writes, callback assignment, static SQL spelling and report-model rendering are conservative analyses. Renames are distinct identities until continuity is reviewed; offsets alone must not reassign knowledge.</w:t>
+        <w:t>Relationship certainty is confirmed_static, possible_dynamic, inferred, runtime_observed or unresolved. Passive scanning never claims runtime_observed. A uses dependency is not a call. Known lexical calls, serialized bindings and declared types carry derivation rules and source ranges. Recognized asynchronous API spelling can establish a possible scheduling relationship without proving execution order.</w:t>
       </w:r>
     </w:p>
     <w:p>
-      <w:pPr>
-        <w:pStyle w:val="Heading1"/>
-      </w:pPr>
-      <w:r>
-        <w:t>Control flow and impact</w:t>
+      <w:r>
+        <w:t>Method pointers, unresolved receivers, dynamic dispatch, generated types and framework behavior must retain uncertainty. Basic reads, writes, callback assignment, static SQL spelling and report-model rendering are conservative analyses. Renames are distinct identities until continuity is reviewed; offsets alone must not reassign knowledge.</w:t>
       </w:r>
     </w:p>
     <w:p>
-      <w:r>
-        <w:t>DPH.Analysis.Flow builds per-routine control-flow nodes and typed edges for supported sequences, branches, loops, returns and exception/finally paths. Routine identity, source hash, range, node kind and expression remain available to inspectors and exports. Flow is bounded to 100000 nodes, 300000 edges and nesting 128.</w:t>
+      <w:pPr>
+        <w:pStyle w:val="Heading1"/>
+      </w:pPr>
+      <w:r>
+        <w:t>Control flow and impact</w:t>
       </w:r>
     </w:p>
     <w:p>
       <w:r>
-        <w:t>Impact traversal is possible reachability through supported relationships. Do not label it proved runtime impact. The UI bounds a displayed graph to 120 nodes and 960 edges, while the stored semantic graph is the fuller evidence model. Uncertain edges remain visually distinct. Unsupported flow does not become a fabricated successful path.</w:t>
+        <w:t>DPH.Analysis.Flow builds per-routine control-flow nodes and typed edges for supported sequences, branches, loops, returns and exception/finally paths. Routine identity, source hash, range, node kind and expression remain available to inspectors and exports. Flow is bounded to 100000 nodes, 300000 edges and nesting 128.</w:t>
       </w:r>
     </w:p>
     <w:p>
-      <w:pPr>
-        <w:pStyle w:val="Heading1"/>
-      </w:pPr>
-      <w:r>
-        <w:t>SQLite generations and durability</w:t>
+      <w:r>
+        <w:t>Impact traversal is possible reachability through supported relationships. Do not label it proved runtime impact. The UI bounds a displayed graph to 120 nodes and 960 edges, while the stored semantic graph is the fuller evidence model. Uncertain edges remain visually distinct. Unsupported flow does not become a fabricated successful path.</w:t>
       </w:r>
     </w:p>
     <w:p>
-      <w:r>
-        <w:t>TDPHKnowledgeStore owns one FireDAC SQLite connection on its creating thread and serializes writer access through a named mutex. Foreign keys and synchronous FULL are enabled. Default journal mode is DELETE; WAL is an explicit local-store option. Direct cross-thread writes are rejected. SQLite 3.42.0 with FTS5 was measured by the storage tests.</w:t>
+      <w:pPr>
+        <w:pStyle w:val="Heading1"/>
+      </w:pPr>
+      <w:r>
+        <w:t>SQLite generations and durability</w:t>
       </w:r>
     </w:p>
     <w:p>
       <w:r>
-        <w:t>Schema 9 is created through nine checksum-verified migrations. Existing migration text is immutable. A newer incompatible schema is rejected safely. Failed upgrade DDL and ledger changes roll back, and an upgrade from an existing schema makes a recoverable pre-migration database backup. Interrupted running generations recover as failed, preserving the previous published head.</w:t>
+        <w:t>TDPHKnowledgeStore owns one FireDAC SQLite connection on its creating thread and serializes writer access through a named mutex. Foreign keys and synchronous FULL are enabled. Default journal mode is DELETE; WAL is an explicit local-store option. Direct cross-thread writes are rejected. SQLite 3.42.0 with FTS5 was measured by the storage tests.</w:t>
       </w:r>
     </w:p>
     <w:p>
       <w:r>
-        <w:t>ObserveManifest records current fingerprints independently of the capture. BeginGeneration freezes configuration and manifest identity. Syntax and semantic facts are staged in transactions. Before publication, inputs and configuration are revalidated. Only a coherent complete generation becomes the current head. Partial, failed or superseded captures cannot clear the exact-input stale state or overwrite a prior current head.</w:t>
+        <w:t>Schema 9 is created through nine checksum-verified migrations. Existing migration text is immutable. A newer incompatible schema is rejected safely. Failed upgrade DDL and ledger changes roll back, and an upgrade from an existing schema makes a recoverable pre-migration database backup. Interrupted running generations recover as failed, preserving the previous published head.</w:t>
       </w:r>
     </w:p>
     <w:p>
-      <w:pPr>
-        <w:pStyle w:val="Heading1"/>
-      </w:pPr>
-      <w:r>
-        <w:t>Evidence and immutable history</w:t>
+      <w:r>
+        <w:t>ObserveManifest records current fingerprints independently of the capture. BeginGeneration freezes configuration and manifest identity. Syntax and semantic facts are staged in transactions. Before publication, inputs and configuration are revalidated. Only a coherent complete generation becomes the current head. Partial, failed or superseded captures cannot clear the exact-input stale state or overwrite a prior current head.</w:t>
       </w:r>
     </w:p>
     <w:p>
-      <w:r>
-        <w:t>Normalized tables include projects, configurations, source files, file revisions, generations, generation files, entities, entity versions, evidence, relationships, component properties, control-flow nodes and edges, knowledge records and revisions, links, review tasks, translations, artifacts, export jobs and audit events. Foreign keys tie evidence and relationships to their producing generation.</w:t>
+      <w:pPr>
+        <w:pStyle w:val="Heading1"/>
+      </w:pPr>
+      <w:r>
+        <w:t>Evidence and immutable history</w:t>
       </w:r>
     </w:p>
     <w:p>
       <w:r>
-        <w:t>Triggers prevent mutation of terminal generations, source revisions, captured facts, configurations and authored knowledge revisions. Evidence ranges must fit the captured source bytes and use the generation analyzer version. Historical file and entity identities cannot be changed casually. A missing source is retained as missing; its historical annotations survive.</w:t>
+        <w:t>Normalized tables include projects, configurations, source files, file revisions, generations, generation files, entities, entity versions, evidence, relationships, component properties, control-flow nodes and edges, knowledge records and revisions, links, review tasks, translations, artifacts, export jobs and audit events. Foreign keys tie evidence and relationships to their producing generation.</w:t>
       </w:r>
     </w:p>
     <w:p>
       <w:r>
-        <w:t>Modification detected, analysis stale, knowledge review needed, analysis failed and reassessment requested are separate persistent flags. A UI summary is a projection of these states, not a replacement for them. Parser success must not clear human review.</w:t>
+        <w:t>Triggers prevent mutation of terminal generations, source revisions, captured facts, configurations and authored knowledge revisions. Evidence ranges must fit the captured source bytes and use the generation analyzer version. Historical file and entity identities cannot be changed casually. A missing source is retained as missing; its historical annotations survive.</w:t>
       </w:r>
     </w:p>
     <w:p>
-      <w:pPr>
-        <w:pStyle w:val="Heading1"/>
-      </w:pPr>
-      <w:r>
-        <w:t>Background coordination and cached views</w:t>
+      <w:r>
+        <w:t>Modification detected, analysis stale, knowledge review needed, analysis failed and reassessment requested are separate persistent flags. A UI summary is a projection of these states, not a replacement for them. Parser success must not clear human review.</w:t>
       </w:r>
     </w:p>
     <w:p>
-      <w:r>
-        <w:t>DPH.Workspace.Worker is a persistent TThread with bounded request and response queues. It initializes COM for passive MSXML parsing, owns database operations in the worker, and retains analyzer instances across requests. FMX polls responses with a timer, avoiding queued closures that outlive the form.</w:t>
+      <w:pPr>
+        <w:pStyle w:val="Heading1"/>
+      </w:pPr>
+      <w:r>
+        <w:t>Background coordination and cached views</w:t>
       </w:r>
     </w:p>
     <w:p>
       <w:r>
-        <w:t>A stopped Delphi queue can report success while returning an empty item. Poll checks both the wait result and a non-nil response; shutdown tests guard against a destructor loop. Cancellation is checked between stages and marks a staged running generation failed when appropriate. It is not a promise of interruption inside every parser loop.</w:t>
+        <w:t>DPH.Workspace.Worker is a persistent TThread with bounded request and response queues. It initializes COM for passive MSXML parsing, owns database operations in the worker, and retains analyzer instances across requests. FMX polls responses with a timer, avoiding queued closures that outlive the form.</w:t>
       </w:r>
     </w:p>
     <w:p>
       <w:r>
-        <w:t>Workspace projections are managed JSON files in database.dphdb.views named by SHA256 and registered in artifacts. Cached opening verifies the managed path, size, checksum and generation. Cached facts are delivered before automatic verification when the original source entry is available; unavailable source remains detached. Connected checks compare manifest fingerprints and selection identity every ten seconds. Syntax and routine semantic caches are bounded and binding-context aware; conservative postprocessing remains separate from reused routine facts.</w:t>
+        <w:t>A stopped Delphi queue can report success while returning an empty item. Poll checks both the wait result and a non-nil response; shutdown tests guard against a destructor loop. Cancellation is checked between stages and marks a staged running generation failed when appropriate. It is not a promise of interruption inside every parser loop.</w:t>
       </w:r>
     </w:p>
     <w:p>
-      <w:pPr>
-        <w:pStyle w:val="Heading1"/>
-      </w:pPr>
-      <w:r>
-        <w:t>FMX navigation and visualization</w:t>
+      <w:r>
+        <w:t>Workspace projections are managed JSON files in database.dphdb.views named by SHA256 and registered in artifacts. Cached opening verifies the managed path, size, checksum and generation. Cached facts are delivered before automatic verification when the original source entry is available; unavailable source remains detached. Connected checks compare manifest fingerprints and selection identity every ten seconds. Syntax and routine semantic caches are bounded and binding-context aware; conservative postprocessing remains separate from reused routine facts.</w:t>
       </w:r>
     </w:p>
     <w:p>
-      <w:r>
-        <w:t>DPH.UI.Main binds its published controls to the FMX resource. Explorer queries are paged at 250 rows; data filtering supports kind, text and qualified scope. History and bookmarks use canonical keys, with surviving same-project bookmarks retained across reassessment. Inspector output retains source metadata and serialized properties. Source memo navigation is permitted only after live hash validation.</w:t>
+      <w:pPr>
+        <w:pStyle w:val="Heading1"/>
+      </w:pPr>
+      <w:r>
+        <w:t>FMX navigation and visualization</w:t>
       </w:r>
     </w:p>
     <w:p>
       <w:r>
-        <w:t>OpenSelection queues a candidate without replacing the current database, source or workspace. PollTimer installs it only after the worker returns accepted captured evidence. The worker preflights source identity before creating a database; cached opens check captured XML ProjectGuid and Pascal program declarations before returning a view. Rejections retain the current workspace, and rejected startup caches show Getting started. Inventory identity also covers referenced project groups. DatabaseDialog.InitialDir is the design-time relative default; startup resolves it under the deployment root, creates that folder, and applies the same path to OpenCacheDialog. Distribution packaging copies only the Databases instructions, never its databases or views.</w:t>
+        <w:t>DPH.UI.Main binds its published controls to the FMX resource. Explorer queries are paged at 250 rows; data filtering supports kind, text and qualified scope. History and bookmarks use canonical keys, with surviving same-project bookmarks retained across reassessment. Inspector output retains source metadata and serialized properties. Source memo navigation is permitted only after live hash validation.</w:t>
       </w:r>
     </w:p>
     <w:p>
       <w:r>
-        <w:t>Graph paint boxes draw bounded evidence data with palette and geometry values supplied by design-time style rectangles. Screen reconstruction draws approximate source-derived rectangles without creating components. Its gallery is bounded to 60 forms. Runtime styles, custom painting and inherited resources are not silently fabricated.</w:t>
+        <w:t>OpenSelection queues a candidate without replacing the current database, source or workspace. PollTimer installs it only after the worker returns accepted captured evidence. The worker preflights source identity before creating a database; cached opens check captured XML ProjectGuid and Pascal program declarations before returning a view. Rejections retain the current workspace, and rejected startup caches show Getting started. Inventory identity also covers referenced project groups. DatabaseDialog.InitialDir is the design-time relative default; startup resolves it under the deployment root, creates that folder, and applies the same path to OpenCacheDialog. Distribution packaging copies only the Databases instructions, never its databases or views.</w:t>
       </w:r>
     </w:p>
     <w:p>
       <w:r>
-        <w:t>Keep lifecycle and ownership explicit: the view owns its JSON document, UI arrays own their records, responses transfer document or knowledge ownership to the main form, and the worker frees unconsumed responses during shutdown. Guard unsaved authored text before changing projects or replacing editor state.</w:t>
+        <w:t>Graph paint boxes draw bounded evidence data with palette and geometry values supplied by design-time style rectangles. Screen reconstruction draws approximate source-derived rectangles without creating components. Its gallery is bounded to 60 forms. Runtime styles, custom painting and inherited resources are not silently fabricated.</w:t>
       </w:r>
     </w:p>
     <w:p>
-      <w:pPr>
-        <w:pStyle w:val="Heading1"/>
-      </w:pPr>
-      <w:r>
-        <w:t>Curated knowledge and review</w:t>
+      <w:r>
+        <w:t>Keep lifecycle and ownership explicit: the view owns its JSON document, UI arrays own their records, responses transfer document or knowledge ownership to the main form, and the worker frees unconsumed responses during shutdown. Guard unsaved authored text before changing projects or replacing editor state.</w:t>
       </w:r>
     </w:p>
     <w:p>
-      <w:r>
-        <w:t>SaveKnowledge requires title, body, a named author, a supported kind and a captured generation. Existing records require their expected revision and stable kind. Ordinary titles stay stable; structured glossary names can change while their identity and history remain intact. Each edit appends a needs_review revision, preserves links and opens a pending task. Knowledge bodies are bounded to 1 MiB. Authored text is never regenerated from parser output.</w:t>
+      <w:pPr>
+        <w:pStyle w:val="Heading1"/>
+      </w:pPr>
+      <w:r>
+        <w:t>Curated knowledge and review</w:t>
       </w:r>
     </w:p>
     <w:p>
       <w:r>
-        <w:t>ReviewKnowledge requires the expected current revision, a named reviewer and a matching captured source/configuration. The connected worker observes current source before accepting a review. A missing linked entity cannot be verified under a replacement name. Verification, rejection or retirement appends a revision and records attribution; history remains append only.</w:t>
+        <w:t>SaveKnowledge requires title, body, a named author, a supported kind and a captured generation. Existing records require their expected revision and stable kind. Ordinary titles stay stable; structured glossary names can change while their identity and history remain intact. Each edit appends a needs_review revision, preserves links and opens a pending task. Knowledge bodies are bounded to 1 MiB. Authored text is never regenerated from parser output.</w:t>
       </w:r>
     </w:p>
     <w:p>
       <w:r>
-        <w:t>Manifest and configuration changes conservatively invalidate active knowledge, derived artifacts and translations. A partial static capture may support review of an attributable statement against available evidence, but its partial coverage remains visible. Local names are not authenticated enterprise identities. Human verification and automatic static derivation remain different evidence categories.</w:t>
+        <w:t>ReviewKnowledge requires the expected current revision, a named reviewer and a matching captured source/configuration. The connected worker observes current source before accepting a review. A missing linked entity cannot be verified under a replacement name. Verification, rejection or retirement appends a revision and records attribution; history remains append only.</w:t>
       </w:r>
     </w:p>
     <w:p>
-      <w:pPr>
-        <w:pStyle w:val="Heading1"/>
-      </w:pPr>
-      <w:r>
-        <w:t>Canonical publication and privacy</w:t>
+      <w:r>
+        <w:t>Manifest and configuration changes conservatively invalidate active knowledge, derived artifacts and translations. A partial static capture may support review of an attributable statement against available evidence, but its partial coverage remains visible. Local names are not authenticated enterprise identities. Human verification and automatic static derivation remain different evidence categories.</w:t>
       </w:r>
     </w:p>
     <w:p>
-      <w:r>
-        <w:t>DPH.Publish.Model constructs one versioned documentation model from a captured workspace and current curated knowledge. It carries generation, configuration, input/context fingerprints, detached/stale state, symbols, typed relationships, control flow, source references, human history, coverage and explicit unknowns. Full and task-scoped views share those facts.</w:t>
+      <w:pPr>
+        <w:pStyle w:val="Heading1"/>
+      </w:pPr>
+      <w:r>
+        <w:t>Canonical publication and privacy</w:t>
       </w:r>
     </w:p>
     <w:p>
       <w:r>
-        <w:t>Task scope selects the requested identities and complete direct incident context. It rejects missing or excluded seeds and rejects an oversized task rather than silently truncating a full export. External source roots and sensitive filename categories are excluded by default. Explicit relative prefix exclusions remove file-derived symbols and relationships. Source snapshots and generated AGENTS.md are absent by default.</w:t>
+        <w:t>DPH.Publish.Model constructs one versioned documentation model from a captured workspace and current curated knowledge. It carries generation, configuration, input/context fingerprints, detached/stale state, symbols, typed relationships, control flow, source references, human history, coverage and explicit unknowns. Full and task-scoped views share those facts.</w:t>
       </w:r>
     </w:p>
     <w:p>
       <w:r>
-        <w:t>Redaction recognizes common credential assignments, private keys, AWS access keys and JWT-shaped tokens throughout string data. It is defense in depth, not a guarantee that every project-specific secret format is recognizable. Require explicit exclusions and a disclosure review for sensitive content. No translation or AI provider is contacted by normal publishing.</w:t>
+        <w:t>Task scope selects the requested identities and complete direct incident context. It rejects missing or excluded seeds and rejects an oversized task rather than silently truncating a full export. External source roots and sensitive filename categories are excluded by default. Explicit relative prefix exclusions remove file-derived symbols and relationships. Source snapshots and generated AGENTS.md are absent by default.</w:t>
       </w:r>
     </w:p>
     <w:p>
-      <w:pPr>
-        <w:pStyle w:val="Heading1"/>
-      </w:pPr>
-      <w:r>
-        <w:t>HTML guides and bundle validation</w:t>
+      <w:r>
+        <w:t>Redaction recognizes common credential assignments, private keys, AWS access keys and JWT-shaped tokens throughout string data. It is defense in depth, not a guarantee that every project-specific secret format is recognizable. Require explicit exclusions and a disclosure review for sensitive content. No translation or AI provider is contacted by normal publishing.</w:t>
       </w:r>
     </w:p>
     <w:p>
-      <w:r>
-        <w:t>DPH.Publish.Export writes a new destination outside source. The offline HTML uses encoded imported text, local search and styles, internal anchors, print CSS and a restrictive content security policy. The default WebView2 policy permits only the authorized local index and about:blank; publication explicitly enables hash-named object pages in its managed objects folder. Help retains the index-only policy; learning explicitly permits content-hashed pages only inside its owned preview directory. There is no arbitrary native bridge. Data does not supply executable markup.</w:t>
+      <w:pPr>
+        <w:pStyle w:val="Heading1"/>
+      </w:pPr>
+      <w:r>
+        <w:t>HTML guides and bundle validation</w:t>
       </w:r>
     </w:p>
     <w:p>
       <w:r>
-        <w:t>JSONL indexes contain symbols, relationships, forms/events, data usage, configuration, flow nodes, knowledge and evidence references. Manifest and checksum files accompany canonical.json. The validator checks filenames, hashes, expected input fingerprint, canonical identity, source hash/range, generation and cross-reference integrity. A stale manifest is rejected by default. Unsigned hashes establish integrity relative to the index, not author authenticity.</w:t>
+        <w:t>DPH.Publish.Export writes a new destination outside source. The offline HTML uses encoded imported text, local search and styles, internal anchors, print CSS and a restrictive content security policy. The default WebView2 policy permits only the authorized local index and about:blank; publication explicitly enables hash-named object pages in its managed objects folder. Help retains the index-only policy; learning explicitly permits content-hashed pages only inside its owned preview directory. There is no arbitrary native bridge. Data does not supply executable markup.</w:t>
       </w:r>
     </w:p>
     <w:p>
       <w:r>
-        <w:t>Editable engineering and user DOCX guides derive from the same sections and evidence model. They include title, last changed capture identity and a changeable TOC field. LibreOffice provides companion PDFs; the project rendering tool verifies cached page numbers and renders page images for layout inspection. Missing business procedures stay explicitly absent rather than being invented.</w:t>
+        <w:t>JSONL indexes contain symbols, relationships, forms/events, data usage, configuration, flow nodes, knowledge and evidence references. Manifest and checksum files accompany canonical.json. The validator checks filenames, hashes, expected input fingerprint, canonical identity, source hash/range, generation and cross-reference integrity. A stale manifest is rejected by default. Unsigned hashes establish integrity relative to the index, not author authenticity.</w:t>
       </w:r>
     </w:p>
     <w:p>
-      <w:pPr>
-        <w:pStyle w:val="Heading1"/>
-      </w:pPr>
-      <w:r>
-        <w:t>Translation boundary</w:t>
+      <w:r>
+        <w:t>Editable engineering and user DOCX guides derive from the same sections and evidence model. They include title, last changed capture identity and a changeable TOC field. LibreOffice provides companion PDFs; the project rendering tool verifies cached page numbers and renders page images for layout inspection. Missing business procedures stay explicitly absent rather than being invented.</w:t>
       </w:r>
     </w:p>
     <w:p>
-      <w:r>
-        <w:t>IDPHTranslationProvider exposes provider identity, version, external status and prose translation. Protected segments retain identifiers, SQL, paths, hashes and protocol keys byte for byte. Cache keys include source content, revision, source/target locales and provider/version. Changed prose produces a fresh pending entry; named review applies to the exact cached translation.</w:t>
+      <w:pPr>
+        <w:pStyle w:val="Heading1"/>
+      </w:pPr>
+      <w:r>
+        <w:t>Translation boundary</w:t>
       </w:r>
     </w:p>
     <w:p>
       <w:r>
-        <w:t>TDPHAtlasAdapter reads explicitly selected DAT JSON packs offline. The independent Apache-2.0 reader snapshot and license reside under dependencies\DelphiAppTranslation; VCL2FMX is unchanged and is not a build or runtime dependency. No network provider is configured. Tests exercise actual packs, persistent cache, terminology changes, source invalidation and exact-content named review. The offline GTranslate region is disabled, with local bilingual labels and sorting; do not activate network translation merely because a generic widget name appears in documentation.</w:t>
+        <w:t>IDPHTranslationProvider exposes provider identity, version, external status and prose translation. Protected segments retain identifiers, SQL, paths, hashes and protocol keys byte for byte. Cache keys include source content, revision, source/target locales and provider/version. Changed prose produces a fresh pending entry; named review applies to the exact cached translation.</w:t>
       </w:r>
     </w:p>
     <w:p>
-      <w:pPr>
-        <w:pStyle w:val="Heading1"/>
-      </w:pPr>
-      <w:r>
-        <w:t>Verification and release discipline</w:t>
+      <w:r>
+        <w:t>TDPHAtlasAdapter reads explicitly selected DAT JSON packs offline. The independent Apache-2.0 reader snapshot and license reside under dependencies\DelphiAppTranslation; VCL2FMX is unchanged and is not a build or runtime dependency. No network provider is configured. Tests exercise actual packs, persistent cache, terminology changes, source invalidation and exact-content named review. The offline GTranslate region is disabled, with local bilingual labels and sorting; do not activate network translation merely because a generic widget name appears in documentation.</w:t>
       </w:r>
     </w:p>
     <w:p>
-      <w:r>
-        <w:t>Run the phase build/test scripts elevated with the installed toolchain. WP0 checks FMX resource ownership; WP1 checks storage, crash recovery and migrations; WP2 checks inventory, encoding, syntax and source safety; WP3 checks semantics and pinned reference traces; WP4 checks workspace/background behavior; WP5 checks immutable authored history and pending review; WP6 checks publication, exclusions, sanitization, hashes and translation protection.</w:t>
+      <w:pPr>
+        <w:pStyle w:val="Heading1"/>
+      </w:pPr>
+      <w:r>
+        <w:t>Verification and release discipline</w:t>
       </w:r>
     </w:p>
     <w:p>
       <w:r>
-        <w:t>Use exact input hashes before and after analysis, including failures. Preserve original reference and instruction files. Keep tests that demonstrate invariants rather than tests that merely mirror implementation. New source, validation failure or unresolved risk justifies another targeted test; a passing unchanged phase does not need endless repetition.</w:t>
+        <w:t>Run the phase build/test scripts elevated with the installed toolchain. WP0 checks FMX resource ownership; WP1 checks storage, crash recovery and migrations; WP2 checks inventory, encoding, syntax and source safety; WP3 checks semantics and pinned reference traces; WP4 checks workspace/background behavior; WP5 checks immutable authored history and pending review; WP6 checks publication, exclusions, sanitization, hashes and translation protection.</w:t>
       </w:r>
     </w:p>
     <w:p>
       <w:r>
-        <w:t>H: development backups are enabled. Allow at least 60 seconds for this USB drive to wake before assessing availability. Git remains enabled: review intended changes, commit validated work and push both public and private remotes without force or history rewriting. Remove a stale zero-byte index lock only after verifying no Git process runs. WP7 records measured performance, portability, security and explicit acceptance evidence. Independent first-time programmer acceptance and unknown historical business intent cannot be invented by automation.</w:t>
+        <w:t>Use exact input hashes before and after analysis, including failures. Preserve original reference and instruction files. Keep tests that demonstrate invariants rather than tests that merely mirror implementation. New source, validation failure or unresolved risk justifies another targeted test; a passing unchanged phase does not need endless repetition.</w:t>
       </w:r>
     </w:p>
     <w:p>
       <w:r>
-        <w:t>In the historical pre-rework benchmark on the recorded Core i7-1165G7 host with eight logical processors and about 16 GB RAM, the pinned reference pipeline measured 82.6 seconds for full capture, 2.87 seconds for cached opening and 75.9 seconds for incremental reassessment. The message-pump maximum gap was 64 ms. Peak test-process working set was about 1.21 GiB, including repeated captures, JSON cloning and FMX/WebView2 tests. These are baseline measurements, not agreed hardware-independent budgets. Large syntax-cache fallback and conservative semantic recomputation explain the modest reassessment speedup. Formal acceptance retains independent complex-flow review, missing business/user content, AC-25 and performance-budget agreement as outstanding.</w:t>
+        <w:t>H: development backups are enabled. Allow at least 60 seconds for this USB drive to wake before assessing availability. Git remains enabled: review intended changes, commit validated work and push both public and private remotes without force or history rewriting. Remove a stale zero-byte index lock only after verifying no Git process runs. WP7 records measured performance, portability, security and explicit acceptance evidence. Independent first-time programmer acceptance and unknown historical business intent cannot be invented by automation.</w:t>
       </w:r>
     </w:p>
     <w:p>
-      <w:pPr>
-        <w:pStyle w:val="Heading1"/>
-      </w:pPr>
-      <w:r>
-        <w:t>Current semantic cache and extended evidence</w:t>
+      <w:r>
+        <w:t>In the historical pre-rework benchmark on the recorded Core i7-1165G7 host with eight logical processors and about 16 GB RAM, the pinned reference pipeline measured 82.6 seconds for full capture, 2.87 seconds for cached opening and 75.9 seconds for incremental reassessment. The message-pump maximum gap was 64 ms. Peak test-process working set was about 1.21 GiB, including repeated captures, JSON cloning and FMX/WebView2 tests. These are baseline measurements, not agreed hardware-independent budgets. Large syntax-cache fallback and conservative semantic recomputation explain the modest reassessment speedup. Formal acceptance retains independent complex-flow review, missing business/user content, AC-25 and performance-budget agreement as outstanding.</w:t>
       </w:r>
     </w:p>
     <w:p>
-      <w:r>
-        <w:t>The current analyzers are DPH-WP2-5 and DPH-WP3-11 with IR and semantic schema 1. Routine semantic cache reuse is bounded to 512 records and 32 MiB. Binding context hashes invalidate affected reuse. Synthetic startup and postprocessing occur after reusable routine facts, preserving their relationships to current identities. This is bounded evidence reuse; it is not a proof of an optimal incremental solver.</w:t>
+      <w:pPr>
+        <w:pStyle w:val="Heading1"/>
+      </w:pPr>
+      <w:r>
+        <w:t>Current semantic cache and extended evidence</w:t>
       </w:r>
     </w:p>
     <w:p>
       <w:r>
-        <w:t>Supported extensions include typed aliases, inheritance and accessors, startup entry and unit phases, case/goto/with control flow, asynchronous operation handles and captures, cancellation and event waits, formal arguments and result producers, static SQL projection, output-writer lineage, lifetime and exception relationships, explicit test-call links, and qualified form navigation. Every relationship retains resolution, source range/hash and rule. Unsupported grammar, aliases and dynamic behavior remain diagnosed or qualified.</w:t>
+        <w:t>The current analyzers are DPH-WP2-5 and DPH-WP3-12 with IR and semantic schema 1. Routine semantic cache reuse is bounded to 512 records and 32 MiB. Binding context hashes invalidate affected reuse. Synthetic startup and postprocessing occur after reusable routine facts, preserving their relationships to current identities. This is bounded evidence reuse; it is not a proof of an optimal incremental solver.</w:t>
       </w:r>
     </w:p>
     <w:p>
-      <w:pPr>
-        <w:pStyle w:val="Heading1"/>
-      </w:pPr>
-      <w:r>
-        <w:t>Current schema and authored document contracts</w:t>
+      <w:r>
+        <w:t>Supported extensions include typed aliases, inheritance and accessors, startup entry and unit phases, case/goto/with control flow, asynchronous operation handles and captures, cancellation and event waits, formal arguments and result producers, static SQL projection, output-writer lineage, lifetime and exception relationships, explicit test-call links, and qualified form navigation. Every relationship retains resolution, source range/hash and rule. Unsupported grammar, aliases and dynamic behavior remain diagnosed or qualified.</w:t>
       </w:r>
     </w:p>
     <w:p>
-      <w:r>
-        <w:t>Schema 9 uses checksum-verified migrations 001 through 009. document_section_versions associates immutable authored revisions with stable section ID, document kind, audience and source generation. knowledge_revision_links preserves ordinal, target kind/identity, captured generation, role and label. knowledge_questions preserves the exact deterministic question identity and captured JSON associated with a response record.</w:t>
+      <w:pPr>
+        <w:pStyle w:val="Heading1"/>
+      </w:pPr>
+      <w:r>
+        <w:t>Current schema and authored document contracts</w:t>
       </w:r>
     </w:p>
     <w:p>
       <w:r>
-        <w:t>SaveKnowledge appends immutable text and link snapshots. Empty LinksJSON preserves the prior snapshot; an explicit JSON array replaces it. Entity, relationship and evidence targets remain tied to generation identities; screenshot targets reference managed artifacts; section targets pin an exact knowledge revision. Current reverse section references open review when their targets change. Verify rejects obsolete rich-link generations or target revisions.</w:t>
+        <w:t>Schema 9 uses checksum-verified migrations 001 through 009. document_section_versions associates immutable authored revisions with stable section ID, document kind, audience and source generation. knowledge_revision_links preserves ordinal, target kind/identity, captured generation, role and label. knowledge_questions preserves the exact deterministic question identity and captured JSON associated with a response record.</w:t>
       </w:r>
     </w:p>
     <w:p>
       <w:r>
-        <w:t>Question identity hashes kind, entity key, range, source hash, prompt, rule and context fingerprint. Generation is retained separately, allowing unchanged evidence to keep its question identity across captures. An answer needs actual text after Answer. Only verified content with no pending task suppresses an exact question. Export converts question metadata to typed JSON before recursive redaction.</w:t>
+        <w:t>SaveKnowledge appends immutable text and link snapshots. Empty LinksJSON preserves the prior snapshot; an explicit JSON array replaces it. Entity, relationship and evidence targets remain tied to generation identities; screenshot targets reference managed artifacts; section targets pin an exact knowledge revision. Current reverse section references open review when their targets change. Verify rejects obsolete rich-link generations or target revisions.</w:t>
       </w:r>
     </w:p>
     <w:p>
-      <w:pPr>
-        <w:pStyle w:val="Heading1"/>
-      </w:pPr>
-      <w:r>
-        <w:t>Native review and learning projections</w:t>
+      <w:r>
+        <w:t>Question identity hashes kind, entity key, range, source hash, prompt, rule and context fingerprint. Generation is retained separately, allowing unchanged evidence to keep its question identity across captures. An answer needs actual text after Answer. Only verified content with no pending task suppresses an exact question. Export converts question metadata to typed JSON before recursive redaction.</w:t>
       </w:r>
     </w:p>
     <w:p>
-      <w:r>
-        <w:t>ReviewTasks provides bounded pending tasks, prior and current authored text, baseline/current configurations, affected object signatures, types, source hashes and relationship comparisons. A missing baseline is reported. Native controls invoke existing optimistic-revision and connected-source review checks; they do not create a separate approval authority.</w:t>
+      <w:pPr>
+        <w:pStyle w:val="Heading1"/>
+      </w:pPr>
+      <w:r>
+        <w:t>Native review and learning projections</w:t>
       </w:r>
     </w:p>
     <w:p>
       <w:r>
-        <w:t>RoutineLesson uses the routine CFG and an indexed outgoing-edge lookup. It explains source points, actual expressions and destination lines, with explicit loop, branch, early-return, cleanup and exceptional semantics. The same lesson is used by ObjectText and ObjectHTML; exported document prose and offline object pages therefore share its source interpretation. Its bounds are 60 points and eight outgoing paths per point.</w:t>
+        <w:t>ReviewTasks provides bounded pending tasks, prior and current authored text, baseline/current configurations, affected object signatures, types, source hashes and relationship comparisons. A missing baseline is reported. Native controls invoke existing optimistic-revision and connected-source review checks; they do not create a separate approval authority.</w:t>
       </w:r>
     </w:p>
     <w:p>
       <w:r>
-        <w:t>Preview HTML files have immutable content-hashed names, tracked for cleanup. BrowserPolicy allows them only in the owned preview directory when explicitly enabled. This avoids rewriting a file held by WebView2. Arbitrary filenames and external navigation remain blocked. Native browser tests render the app pages; they do not execute the analyzed application.</w:t>
+        <w:t>RoutineLesson uses the routine CFG and an indexed outgoing-edge lookup. It explains source points, actual expressions and destination lines, with explicit loop, branch, early-return, cleanup and exceptional semantics. The same lesson is used by ObjectText and ObjectHTML; exported document prose and offline object pages therefore share its source interpretation. Its bounds are 60 points and eight outgoing paths per point.</w:t>
       </w:r>
     </w:p>
     <w:p>
-      <w:pPr>
-        <w:pStyle w:val="Heading1"/>
-      </w:pPr>
-      <w:r>
-        <w:t>Saved observation persistence</w:t>
+      <w:r>
+        <w:t>Preview HTML files have immutable content-hashed names, tracked for cleanup. BrowserPolicy allows them only in the owned preview directory when explicitly enabled. This avoids rewriting a file held by WebView2. Arbitrary filenames and external navigation remain blocked. Native browser tests render the app pages; they do not execute the analyzed application.</w:t>
       </w:r>
     </w:p>
     <w:p>
-      <w:r>
-        <w:t>ImportObservation accepts explicitly selected UTF-8 text extracts up to 256 KiB with named contributor and run context. It checks generation and optional entity existence, captures original byte SHA256 and linked file-revision SHA256, and stores content plus attribution in a managed hash-named JSON artifact of kind runtime_observation. No schema migration is needed for this artifact kind.</w:t>
+      <w:pPr>
+        <w:pStyle w:val="Heading1"/>
+      </w:pPr>
+      <w:r>
+        <w:t>Saved observation persistence</w:t>
       </w:r>
     </w:p>
     <w:p>
       <w:r>
-        <w:t>ObservationsJSON verifies managed identity, size, checksum and generation before returning the newest 50 records. The response owns the array until PollTimer transfers it to the form. LoadView clears old observation rows; historical records cannot navigate as current. Saved text stays in a native read-only memo rather than an executable browser surface.</w:t>
+        <w:t>ImportObservation accepts explicitly selected UTF-8 text extracts up to 256 KiB with named contributor and run context. It checks generation and optional entity existence, captures original byte SHA256 and linked file-revision SHA256, and stores content plus attribution in a managed hash-named JSON artifact of kind runtime_observation. No schema migration is needed for this artifact kind.</w:t>
       </w:r>
     </w:p>
     <w:p>
       <w:r>
-        <w:t>ManagedArtifactPaths includes observations for explicit portable backup. Retention protects their associated captured views. Publication currently omits observations rather than automatically disclose potentially sensitive logs. Contributor claims do not set runtime_observed on static analysis or create an automated causal trace.</w:t>
+        <w:t>ObservationsJSON verifies managed identity, size, checksum and generation before returning the newest 50 records. The response owns the array until PollTimer transfers it to the form. LoadView clears old observation rows; historical records cannot navigate as current. Saved text stays in a native read-only memo rather than an executable browser surface.</w:t>
       </w:r>
     </w:p>
     <w:p>
-      <w:pPr>
-        <w:pStyle w:val="Heading1"/>
-      </w:pPr>
-      <w:r>
-        <w:t>Regression commands and evidence</w:t>
+      <w:r>
+        <w:t>ManagedArtifactPaths includes observations for explicit portable backup. Retention protects their associated captured views. Publication currently omits observations rather than automatically disclose potentially sensitive logs. Contributor claims do not set runtime_observed on static analysis or create an automated causal trace.</w:t>
       </w:r>
     </w:p>
     <w:p>
-      <w:r>
-        <w:t>Run commands from the project root in an elevated Command Prompt so RAD Studio can read its environment. tools\build-wp0.cmd builds the app and checks FMX bindings. tools\validate-completion-wp1.cmd serially builds app, catalog, lifecycle, workspace, knowledge, selection and startup tests, then removes recognized disposable fixture directories.</w:t>
+      <w:pPr>
+        <w:pStyle w:val="Heading1"/>
+      </w:pPr>
+      <w:r>
+        <w:t>Regression commands and evidence</w:t>
       </w:r>
     </w:p>
     <w:p>
       <w:r>
-        <w:t>Run tools\build-wp1.cmd for 46 storage checks, tools\build-wp2.cmd no-report for discovery/resource checks, and tools\build-wp3.cmd to compile semantic tests. Then explicitly run bin\Win32\Debug\DPH.Tests.Semantics.exe "C:\New Delphi Projects\Delphi Project Handoff"; the build script alone does not run semantic assertions.</w:t>
+        <w:t>Run commands from the project root in an elevated Command Prompt so RAD Studio can read its environment. tools\build-wp0.cmd builds the app and checks FMX bindings. tools\validate-completion-wp1.cmd serially builds app, catalog, lifecycle, workspace, knowledge, selection and startup tests, then removes recognized disposable fixture directories.</w:t>
       </w:r>
     </w:p>
     <w:p>
       <w:r>
-        <w:t>tools\build-learning.cmd exercises managed images, cached supplemental-evidence recovery, actual WebView2 rendering, source walkthroughs and collapsed CFGs. --no-ui isolates deterministic checks and is not native acceptance. tools\build-wp6.cmd checks canonical scope, redaction, link integrity, publication and translation protection. Use exact log files and current input hashes for claims; historical reports are not automatically refreshed acceptance.</w:t>
+        <w:t>Run tools\build-wp1.cmd for 46 storage checks, tools\build-wp2.cmd no-report for discovery/resource checks, and tools\build-wp3.cmd to compile semantic tests. Then explicitly run bin\Win32\Debug\DPH.Tests.Semantics.exe "C:\New Delphi Projects\Delphi Project Handoff"; the build script alone does not run semantic assertions.</w:t>
       </w:r>
     </w:p>
     <w:p>
       <w:r>
-        <w:t>A native-learning test once dereferenced an absent image array on a later background-verification response. It now checks the initial cached document/image response directly. Source attachment preserves supplemental-image warnings. Inspection disproved a proposed constructor race, and no worker thread-start change remains.</w:t>
+        <w:t>tools\build-learning.cmd exercises managed images, cached supplemental-evidence recovery, actual WebView2 rendering, source walkthroughs and collapsed CFGs. --no-ui isolates deterministic checks and is not native acceptance. tools\build-wp6.cmd checks canonical scope, redaction, link integrity, publication and translation protection. Use exact log files and current input hashes for claims; historical reports are not automatically refreshed acceptance.</w:t>
       </w:r>
     </w:p>
     <w:p>
-      <w:pPr>
-        <w:pStyle w:val="Heading1"/>
-      </w:pPr>
-      <w:r>
-        <w:t>Rebuild and inspect these manuals</w:t>
+      <w:r>
+        <w:t>A native-learning test once dereferenced an absent image array on a later background-verification response. It now checks the initial cached document/image response directly. Source attachment preserves supplemental-image warnings. Inspection disproved a proposed constructor race, and no worker thread-start change remains.</w:t>
       </w:r>
     </w:p>
     <w:p>
-      <w:r>
-        <w:t>tools\build-guides.py generates the two application manuals from maintained operating content and current implementation hashes. Use the approved Python executable C:\Users\marti\AppData\Local\Microsoft\WindowsApps\python.exe. tools\render-guides.ps1 renders with LibreOffice, populates cached page numbers in editable TOC fields, renders again and writes companion PDFs under docs\pdf.</w:t>
+      <w:pPr>
+        <w:pStyle w:val="Heading1"/>
+      </w:pPr>
+      <w:r>
+        <w:t>Rebuild and inspect these manuals</w:t>
       </w:r>
     </w:p>
     <w:p>
       <w:r>
-        <w:t>Inspect every final page PNG under bin\guide-qa for clipping, broken headings, unreadable code and TOC page numbers before delivering a guide. Rendered PNGs are QA outputs, not a mock application UI. Actual included interface images are identified by their capture source and fixture; they do not establish runtime behavior of a selected project.</w:t>
+        <w:t>tools\build-guides.py generates the two application manuals from maintained operating content and current implementation hashes. Use the approved Python executable C:\Users\marti\AppData\Local\Microsoft\WindowsApps\python.exe. tools\render-guides.ps1 renders with LibreOffice, populates cached page numbers in editable TOC fields, renders again and writes companion PDFs under docs\pdf.</w:t>
       </w:r>
     </w:p>
     <w:p>
       <w:r>
-        <w:t>Regenerate manuals after later translation, handoff-contract or source-navigation changes. The source evidence appendix records inspected file hashes, while docs\guide-source-validation.json provides a machine-readable manifest. A successful generator run alone is not proof that the writing, current behavior or layout is correct.</w:t>
+        <w:t>Inspect every final page PNG under bin\guide-qa for clipping, broken headings, unreadable code and TOC page numbers before delivering a guide. Rendered PNGs are QA outputs, not a mock application UI. Actual included interface images are identified by their capture source and fixture; they do not establish runtime behavior of a selected project.</w:t>
       </w:r>
     </w:p>
     <w:p>
-      <w:pPr>
-        <w:pStyle w:val="Heading1"/>
-      </w:pPr>
-      <w:r>
-        <w:t>Business glossary implementation and checks</w:t>
+      <w:r>
+        <w:t>Regenerate manuals after later translation, handoff-contract or source-navigation changes. The source evidence appendix records inspected file hashes, while docs\guide-source-validation.json provides a machine-readable manifest. A successful generator run alone is not proof that the writing, current behavior or layout is correct.</w:t>
       </w:r>
     </w:p>
     <w:p>
-      <w:r>
-        <w:t>DPH.Knowledge.Glossary validates a business_glossary structured record with term, aliases, definition, examples and relevance/evidence context. Names normalize case and repeated whitespace. Terms/aliases are bounded to 128 characters, 32 aliases per term, definitions/examples to 16384 characters, context to 4096 characters and the record to 64 KiB. Unknown fields, duplicate fields and non-text aliases are rejected.</w:t>
+      <w:pPr>
+        <w:pStyle w:val="Heading1"/>
+      </w:pPr>
+      <w:r>
+        <w:t>Business glossary implementation and checks</w:t>
       </w:r>
     </w:p>
     <w:p>
       <w:r>
-        <w:t>The existing migration 009 structured_json column stores the exact term fields on each immutable knowledge revision; no new migration is needed. SaveKnowledge enforces glossary kind, user document and all-reader audience, generated body agreement, project-local name uniqueness, type preservation and optimistic revision checks. Glossary titles can change while the knowledge ID and prior structured revisions remain intact. Retired records continue reserving their current names.</w:t>
+        <w:t>DPH.Knowledge.Glossary validates a business_glossary structured record with term, aliases, definition, examples and relevance/evidence context. Names normalize case and repeated whitespace. Terms/aliases are bounded to 128 characters, 32 aliases per term, definitions/examples to 16384 characters, context to 4096 characters and the record to 64 KiB. Unknown fields, duplicate fields and non-text aliases are rejected.</w:t>
       </w:r>
     </w:p>
     <w:p>
       <w:r>
-        <w:t>DPH.UI.Glossary.fmx defines every term editor control for the IDE/Object Inspector. DPH.UI.Main.fmx defines the glossary list, filter, detail memo and commands. Apply prepares a draft in the existing Knowledge pipeline. The modal editor retains a cloned saved revision so a background refresh cannot invalidate its input pointer. Current source links, explicit review, search and stale-source tracking use existing repository contracts.</w:t>
+        <w:t>The existing migration 009 structured_json column stores the exact term fields on each immutable knowledge revision; no new migration is needed. SaveKnowledge enforces glossary kind, user document and all-reader audience, generated body agreement, project-local name uniqueness, type preservation and optimistic revision checks. Glossary titles can change while the knowledge ID and prior structured revisions remain intact. Retired records continue reserving their current names.</w:t>
       </w:r>
     </w:p>
     <w:p>
       <w:r>
-        <w:t>DPH-LEARNING-8 publication emits a dedicated HTML glossary index and indexes/glossary.jsonl from the canonical knowledge records. Both user and engineering DOCX use those same records. Validate compares the glossary JSONL with the canonical glossary subset; recomputing the artifact hash cannot conceal divergent content. Older publication versions remain readable under their prior contract.</w:t>
+        <w:t>DPH.UI.Glossary.fmx defines every term editor control for the IDE/Object Inspector. DPH.UI.Main.fmx defines the glossary list, filter, detail memo and commands. Apply prepares a draft in the existing Knowledge pipeline. The modal editor retains a cloned saved revision so a background refresh cannot invalidate its input pointer. Current source links, explicit review, search and stale-source tracking use existing repository contracts.</w:t>
       </w:r>
     </w:p>
     <w:p>
       <w:r>
-        <w:t>From an elevated Command Prompt run cd /d "C:\New Delphi Projects\Delphi Project Handoff", then tools\build-glossary.cmd. The suite uses the fixed ignored bin\glossary-validation directory and controlled fixtures. It checks field validation, normalized conflicts, persistence, rename, immutable revisions, stale edits/reviews, isolation, source-linked invalidation, search, publication agreement/exclusions/tampering and IDE-designed native form workflows at normal/minimum sizes. Native images are FMX PaintTo renders of actual instantiated controls; they are not screenshots of the analyzed target application.</w:t>
+        <w:t>DPH-LEARNING-8 publication emits a dedicated HTML glossary index and indexes/glossary.jsonl from the canonical knowledge records. Both user and engineering DOCX use those same records. Validate compares the glossary JSONL with the canonical glossary subset; recomputing the artifact hash cannot conceal divergent content. Older publication versions remain readable under their prior contract.</w:t>
       </w:r>
     </w:p>
     <w:p>
       <w:r>
-        <w:t>Build the application with tools\build-wp0.cmd. Run tools\build-wp5.cmd for the existing knowledge/link/review regressions and tools\build-wp6.cmd for publishing/translation regressions. A FAIL or nonzero exit means the corresponding check failed. See docs\phase1-glossary-validation.json and the glossary completion note for actual current run evidence.</w:t>
+        <w:t>From an elevated Command Prompt run cd /d "C:\New Delphi Projects\Delphi Project Handoff", then tools\build-glossary.cmd. The suite uses the fixed ignored bin\glossary-validation directory and controlled fixtures. It checks field validation, normalized conflicts, persistence, rename, immutable revisions, stale edits/reviews, isolation, source-linked invalidation, search, publication agreement/exclusions/tampering and IDE-designed native form workflows at normal/minimum sizes. Native images are FMX PaintTo renders of actual instantiated controls; they are not screenshots of the analyzed target application.</w:t>
       </w:r>
     </w:p>
     <w:p>
-      <w:pPr>
-        <w:pStyle w:val="Heading1"/>
-      </w:pPr>
-      <w:r>
-        <w:t>Offline translation and localized publication</w:t>
+      <w:r>
+        <w:t>Build the application with tools\build-wp0.cmd. Run tools\build-wp5.cmd for the existing knowledge/link/review regressions and tools\build-wp6.cmd for publishing/translation regressions. A FAIL or nonzero exit means the corresponding check failed. See docs\phase1-glossary-validation.json and the glossary completion note for actual current run evidence.</w:t>
       </w:r>
     </w:p>
     <w:p>
-      <w:r>
-        <w:t>Migration 008 adds the persistent translation cache key and JSON record. Cache identity covers saved knowledge revision, requested locales, provider pack hash, source segments and terminology. SQL state overlays cached metadata so source invalidation remains authoritative after database reopen. Approval requires current source review, complete translated prose and a named reviewer; it never updates authoritative source text.</w:t>
+      <w:pPr>
+        <w:pStyle w:val="Heading1"/>
+      </w:pPr>
+      <w:r>
+        <w:t>Offline translation and localized publication</w:t>
       </w:r>
     </w:p>
     <w:p>
       <w:r>
-        <w:t>TDPHAtlasAdapter uses DAT.Runtime.LanguagePack plus its two copied core dependencies, original license and hashed snapshot provenance. Selected packs are bounded to 4 MiB, strictly UTF-8 and application scoped. Exact source phrase lookup and base-language fallback are explicit. Common code, SQL, paths and identifiers are protected during segmentation; unusual unmarked identifiers still need human review.</w:t>
+        <w:t>Migration 008 adds the persistent translation cache key and JSON record. Cache identity covers saved knowledge revision, requested locales, provider pack hash, source segments and terminology. SQL state overlays cached metadata so source invalidation remains authoritative after database reopen. Approval requires current source review, complete translated prose and a named reviewer; it never updates authoritative source text.</w:t>
       </w:r>
     </w:p>
     <w:p>
       <w:r>
-        <w:t>DPH-LEARNING-7 publication writes localization.json and, when a locale is requested, a hashed HTML page and Localized_Sections.docx. Verified exact-revision cache entries are eligible only while the canonical source section is reviewed and has no pending tasks. Redacted source bodies use source fallback. The supplementary document explicitly limits its scope to authored bodies.</w:t>
+        <w:t>TDPHAtlasAdapter uses DAT.Runtime.LanguagePack plus its two copied core dependencies, original license and hashed snapshot provenance. Selected packs are bounded to 4 MiB, strictly UTF-8 and application scoped. Exact source phrase lookup and base-language fallback are explicit. Common code, SQL, paths and identifiers are protected during segmentation; unusual unmarked identifiers still need human review.</w:t>
       </w:r>
     </w:p>
     <w:p>
       <w:r>
-        <w:t>Source navigation is separately opt-in. Only scoped captured text with matching source hashes is rendered as encoded, redacted HTML. Task masks use captured noncontainer ranges and original line starts. source-navigation.json records included line numbers and omission reasons. Validate checks scope, file identity, line order/counts, generations and disclosure metadata. No original source snapshot is shipped.</w:t>
+        <w:t>DPH-LEARNING-7 publication writes localization.json and, when a locale is requested, a hashed HTML page and Localized_Sections.docx. Verified exact-revision cache entries are eligible only while the canonical source section is reviewed and has no pending tasks. Redacted source bodies use source fallback. The supplementary document explicitly limits its scope to authored bodies.</w:t>
       </w:r>
     </w:p>
     <w:p>
-      <w:pPr>
-        <w:pStyle w:val="Heading1"/>
-      </w:pPr>
-      <w:r>
-        <w:t>Native validation and release evidence</w:t>
+      <w:r>
+        <w:t>Source navigation is separately opt-in. Only scoped captured text with matching source hashes is rendered as encoded, redacted HTML. Task masks use captured noncontainer ranges and original line starts. source-navigation.json records included line numbers and omission reasons. Validate checks scope, file identity, line order/counts, generations and disclosure metadata. No original source snapshot is shipped.</w:t>
       </w:r>
     </w:p>
     <w:p>
-      <w:r>
-        <w:t>The design-time Validate bundle controls dispatch validate_bundle to the worker before a database connection is required. The owner supplies an expected fingerprint independently. Stale rejection is default and historical inspection is an explicit qualification. Native reports distinguish integrity from human approval.</w:t>
+      <w:pPr>
+        <w:pStyle w:val="Heading1"/>
+      </w:pPr>
+      <w:r>
+        <w:t>Native validation and release evidence</w:t>
       </w:r>
     </w:p>
     <w:p>
       <w:r>
-        <w:t>The Win32 project enables DCC_LargeAddressAware in its IDE project options. The hardening and learning harnesses use the equivalent PE flag. The expanded pinned corpus exposed an out-of-memory failure after repeated captures and native workspace loading under the former address limit. Keep memory measurements and actual large-corpus validation with this change; the linker flag does not make memory consumption unbounded or establish a release budget.</w:t>
+        <w:t>The design-time Validate bundle controls dispatch validate_bundle to the worker before a database connection is required. The owner supplies an expected fingerprint independently. Stale rejection is default and historical inspection is an explicit qualification. Native reports distinguish integrity from human approval.</w:t>
       </w:r>
     </w:p>
     <w:p>
       <w:r>
-        <w:t>Run tools\validate-wp7.ps1 elevated for the pinned reference hardening suite and before/after hash proof. It reads the current schema constant rather than an obsolete hardcoded version. The suite measures full capture, cached open, reassessment, message-pump gaps and peak process working set on recorded hardware. Measurements require owner-agreed budgets before release acceptance.</w:t>
+        <w:t>The Win32 project enables DCC_LargeAddressAware in its IDE project options. The hardening and learning harnesses use the equivalent PE flag. The expanded pinned corpus exposed an out-of-memory failure after repeated captures and native workspace loading under the former address limit. Keep memory measurements and actual large-corpus validation with this change; the linker flag does not make memory consumption unbounded or establish a release budget.</w:t>
       </w:r>
     </w:p>
     <w:p>
       <w:r>
-        <w:t>The independent first-time programmer and source-review worksheet is docs\WP7_Maintenance_Exercise.txt. Preserve actual participant answers, source citations, uncertainty judgments, assistance, timings and defects. Do not substitute automated tests or prepared instructions for AC-25 or independent explanation review.</w:t>
+        <w:t>Run tools\validate-wp7.ps1 elevated for the pinned reference hardening suite and before/after hash proof. It reads the current schema constant rather than an obsolete hardcoded version. The suite measures full capture, cached open, reassessment, message-pump gaps and peak process working set on recorded hardware. Measurements require owner-agreed budgets before release acceptance.</w:t>
       </w:r>
     </w:p>
     <w:p>
-      <w:pPr>
-        <w:pStyle w:val="Heading1"/>
-      </w:pPr>
-      <w:r>
-        <w:t>Structured project profile contract</w:t>
+      <w:r>
+        <w:t>The independent first-time programmer and source-review worksheet is docs\WP7_Maintenance_Exercise.txt. Preserve actual participant answers, source citations, uncertainty judgments, assistance, timings and defects. Do not substitute automated tests or prepared instructions for AC-25 or independent explanation review.</w:t>
       </w:r>
     </w:p>
     <w:p>
-      <w:r>
-        <w:t>TDPHWorkspaceView.ProjectMembers projects captured syntax files into a selected-scope catalog without filesystem discovery. DPH.UI.Main.fmx defines separate Known databases and Selected project subpages, with a native list and evidence memo. Program, library and package declarations retain source references; project properties and references retain captured values and child conditions. Parent conditions may apply even when a child has none recorded. tests\DPH.Tests.ProjectCatalog.dpr checks a selected group, missing referenced project, output kinds, settings, native selection and input immutability.</w:t>
+      <w:pPr>
+        <w:pStyle w:val="Heading1"/>
+      </w:pPr>
+      <w:r>
+        <w:t>Structured project profile contract</w:t>
       </w:r>
     </w:p>
     <w:p>
       <w:r>
-        <w:t>Migration 009 adds an object-valued structured_json field to append-only knowledge revisions. TDPHProjectProfile validates 15 known text fields, required purpose and attribution, per-field bounds and a 64 KiB record bound. SaveKnowledge enforces stable project scope, title, kind and generated body, prevents ordinary-record conversion, duplicate profiles and loss of typed data, and preserves structured fields during named review and continuity revisions. Publication decodes typed metadata before recursive redaction, including revision history.</w:t>
+        <w:t>TDPHWorkspaceView.ProjectMembers projects captured syntax files into a selected-scope catalog without filesystem discovery. DPH.UI.Main.fmx defines separate Known databases and Selected project subpages, with a native list and evidence memo. Program, library and package declarations retain source references; project properties and references retain captured values and child conditions. Parent conditions may apply even when a child has none recorded. tests\DPH.Tests.ProjectCatalog.dpr checks a selected group, missing referenced project, output kinds, settings, native selection and input immutability.</w:t>
       </w:r>
     </w:p>
     <w:p>
       <w:r>
-        <w:t>DPH.UI.ProjectProfile.fmx defines every editor control at design time. Apply returns an attributed draft to the existing Knowledge save pipeline. It does not bypass unsaved-edit guards or automatically approve information. tests\DPH.Tests.Phase1.dpr verifies persistence, review, stale editors, history, field bounds and native form behavior; publishing regressions check canonical, HTML and DOCX inclusion.</w:t>
+        <w:t>Migration 009 adds an object-valued structured_json field to append-only knowledge revisions. TDPHProjectProfile validates 15 known text fields, required purpose and attribution, per-field bounds and a 64 KiB record bound. SaveKnowledge enforces stable project scope, title, kind and generated body, prevents ordinary-record conversion, duplicate profiles and loss of typed data, and preserves structured fields during named review and continuity revisions. Publication decodes typed metadata before recursive redaction, including revision history.</w:t>
       </w:r>
     </w:p>
     <w:p>
-      <w:pPr>
-        <w:pStyle w:val="Heading1"/>
-      </w:pPr>
-      <w:r>
-        <w:t>Quality analysis and revision comparison</w:t>
+      <w:r>
+        <w:t>DPH.UI.ProjectProfile.fmx defines every editor control at design time. Apply returns an attributed draft to the existing Knowledge save pipeline. It does not bypass unsaved-edit guards or automatically approve information. tests\DPH.Tests.Phase1.dpr verifies persistence, review, stale editors, history, field bounds and native form behavior; publishing regressions check canonical, HTML and DOCX inclusion.</w:t>
       </w:r>
     </w:p>
     <w:p>
-      <w:r>
-        <w:t>DPH.Analysis.Quality emits DPH-QUALITY-1 evidence during workspace capture. Routine metrics, eligible token-body equality, conservative missing-inbound and disconnected-CFG findings, and iterative call-graph strongly connected components use captured inputs only. The worker invalidates an older connected cache without this analyzer version. All findings remain qualified candidates.</w:t>
+      <w:pPr>
+        <w:pStyle w:val="Heading1"/>
+      </w:pPr>
+      <w:r>
+        <w:t>Quality analysis and revision comparison</w:t>
       </w:r>
     </w:p>
     <w:p>
       <w:r>
-        <w:t>DPH.Workspace.Comparison compares two hash-verified retained captures from the same project database. It rejects differing selection and syntax or semantic analyzer contracts. Deterministic identity indexes distinguish file changes, symbol additions or removals, captured structure changes and file-only changes. Routine-local flow numbering avoids global node-number shifts. Results use filtered 200-row pages; individual structure displays are limited to 4000 characters with full-content structure hashes and explicit truncation.</w:t>
+        <w:t>DPH.Analysis.Quality emits DPH-QUALITY-1 evidence during workspace capture. Routine metrics, eligible token-body equality, conservative missing-inbound and disconnected-CFG findings, and iterative call-graph strongly connected components use captured inputs only. The worker invalidates an older connected cache without this analyzer version. All findings remain qualified candidates.</w:t>
       </w:r>
     </w:p>
     <w:p>
       <w:r>
-        <w:t>Comparison runs on the existing background worker. It reads retained database artifacts rather than current selected source files. Native comparison controls and evidence panes are declared in DPH.UI.Main.fmx. tests\DPH.Tests.Comparison.dpr checks literal-expression changes, unchanged neighboring routines, flow-edge rewiring, identity changes, contract rejection, pages, native panes, worker loading and missing caches.</w:t>
+        <w:t>DPH.Workspace.Comparison compares two hash-verified retained captures from the same project database. It rejects differing selection and syntax or semantic analyzer contracts. Deterministic identity indexes distinguish file changes, symbol additions or removals, captured structure changes and file-only changes. Routine-local flow numbering avoids global node-number shifts. Results use filtered 200-row pages; individual structure displays are limited to 4000 characters with full-content structure hashes and explicit truncation.</w:t>
       </w:r>
     </w:p>
     <w:p>
       <w:r>
-        <w:t>The Phase 1 traceability ledger preserves the supplied requirements and limitations. Source comparison remains partial until optional historical source retention supports actual source-text differences; captured structural comparison must never be described as reconstructing those bytes. Human business answers and independent first-time-user acceptance remain separate evidence.</w:t>
+        <w:t>Comparison runs on the existing background worker. It reads retained database artifacts rather than current selected source files. Native comparison controls and evidence panes are declared in DPH.UI.Main.fmx. tests\DPH.Tests.Comparison.dpr checks literal-expression changes, unchanged neighboring routines, flow-edge rewiring, identity changes, contract rejection, pages, native panes, worker loading and missing caches.</w:t>
       </w:r>
     </w:p>
     <w:p>
-      <w:pPr>
-        <w:pStyle w:val="Heading1"/>
-      </w:pPr>
-      <w:r>
-        <w:t>Keyboard inspector implementation and validation</w:t>
+      <w:r>
+        <w:t>The Phase 1 traceability ledger preserves the supplied requirements and limitations. Source comparison remains partial until optional historical source retention supports actual source-text differences; captured structural comparison must never be described as reconstructing those bytes. Human business answers and independent first-time-user acceptance remain separate evidence.</w:t>
       </w:r>
     </w:p>
     <w:p>
-      <w:r>
-        <w:t>DPH.Workspace.Keyboard projects captured text and binary form IR into source-backed component records. A parent-property index avoids rescanning every node for every component. Rows retain generation, source SHA256, line and byte extents, original property values and explicit unknowns. Numeric shortcut conflicts normalize decimal and hexadecimal codes within each serialized form; sibling TabOrder conflicts stay parent-local. Unique local action declarations carry separate shortcut and source evidence; uncaptured custom, external or inherited actions remain unresolved.</w:t>
+      <w:pPr>
+        <w:pStyle w:val="Heading1"/>
+      </w:pPr>
+      <w:r>
+        <w:t>Keyboard inspector implementation and validation</w:t>
       </w:r>
     </w:p>
     <w:p>
       <w:r>
-        <w:t>DPH.UI.Main.fmx serializes every inspector control for the IDE and Object Inspector. The Keyboard and focus page filters readable evidence, sorts sibling TabOrder and uses 250-row pages. TDPHKeyboardInspector.ReadSource enforces matching generation, source identity, project containment, text availability and source hash before navigation. Binary forms expose byte evidence without applying it as text lines. No database migration or target execution is required.</w:t>
+        <w:t>DPH.Workspace.Keyboard projects captured text and binary form IR into source-backed component records. A parent-property index avoids rescanning every node for every component. Rows retain generation, source SHA256, line and byte extents, original property values and explicit unknowns. Numeric shortcut conflicts normalize decimal and hexadecimal codes within each serialized form; sibling TabOrder conflicts stay parent-local. Unique local action declarations carry separate shortcut and source evidence; uncaptured custom, external or inherited actions remain unresolved.</w:t>
       </w:r>
     </w:p>
     <w:p>
       <w:r>
-        <w:t>Run tools\build-keyboard.cmd elevated for 55 checks covering actual DFM, FMX and binary parsing, action references, conflicts, unknown states, readable key names, source safeguards, pagination and instantiated FMX controls. The fixed bin/keyboard-validation fixture avoids new disposable test folders. Native PaintTo images in docs/phase1-keyboard-workspace.png and phase1-keyboard-compact.png are renders of running DPH controls, not target application screenshots. The suite checks the user catalog and selected fixture bytes remain unchanged. Runtime traversal and accessibility conformance require separate observed tests.</w:t>
+        <w:t>DPH.UI.Main.fmx serializes every inspector control for the IDE and Object Inspector. The Keyboard and focus page filters readable evidence, sorts sibling TabOrder and uses 250-row pages. TDPHKeyboardInspector.ReadSource enforces matching generation, source identity, project containment, text availability and source hash before navigation. Binary forms expose byte evidence without applying it as text lines. No database migration or target execution is required.</w:t>
       </w:r>
     </w:p>
     <w:p>
-      <w:pPr>
-        <w:pStyle w:val="Heading1"/>
-      </w:pPr>
-      <w:r>
-        <w:t>Command inventory implementation and validation</w:t>
+      <w:r>
+        <w:t>Run tools\build-keyboard.cmd elevated for 55 checks covering actual DFM, FMX and binary parsing, action references, conflicts, unknown states, readable key names, source safeguards, pagination and instantiated FMX controls. The fixed bin/keyboard-validation fixture avoids new disposable test folders. Native PaintTo images in docs/phase1-keyboard-workspace.png and phase1-keyboard-compact.png are renders of running DPH controls, not target application screenshots. The suite checks the user catalog and selected fixture bytes remain unchanged. Runtime traversal and accessibility conformance require separate observed tests.</w:t>
       </w:r>
     </w:p>
     <w:p>
-      <w:r>
-        <w:t>DPH.Workspace.Commands builds command records from captured component properties in DPH.Workspace.Keyboard. It indexes parent paths and form-local names, distinguishes duplicate or incompatible references, and joins event properties by exact source and byte location to confirmed static semantic binds relationships. Every handler retains its own identity, relation, target symbol, range and source fingerprint. Action handlers and shortcuts remain separate from component declarations. Uncaptured inheritance, custom classes, external names and runtime dispatch remain qualified.</w:t>
+      <w:pPr>
+        <w:pStyle w:val="Heading1"/>
+      </w:pPr>
+      <w:r>
+        <w:t>Command inventory implementation and validation</w:t>
       </w:r>
     </w:p>
     <w:p>
       <w:r>
-        <w:t>DPH.UI.Main.fmx serializes the Menus and commands controls for IDE editing. The page provides kind and text filters, 250-row pagination, independent handler selection and Explain navigation. Command and action source commands reuse the keyboard inspector generation, hash and containment checks. Loading a replacement capture clears stale command rows. No database migration or target execution is required.</w:t>
+        <w:t>DPH.Workspace.Commands builds command records from captured component properties in DPH.Workspace.Keyboard. It indexes parent paths and form-local names, distinguishes duplicate or incompatible references, and joins event properties by exact source and byte location to confirmed static semantic binds relationships. Every handler retains its own identity, relation, target symbol, range and source fingerprint. Action handlers and shortcuts remain separate from component declarations. Uncaptured inheritance, custom classes, external names and runtime dispatch remain qualified.</w:t>
       </w:r>
     </w:p>
     <w:p>
       <w:r>
+        <w:t>DPH.UI.Main.fmx serializes the Menus and commands controls for IDE editing. The page provides kind and text filters, 250-row pagination, independent handler selection and Explain navigation. Command and action source commands reuse the keyboard inspector generation, hash and containment checks. Loading a replacement capture clears stale command rows. No database migration or target execution is required.</w:t>
+      </w:r>
+    </w:p>
+    <w:p>
+      <w:r>
         <w:t>Run tools\build-commands.cmd elevated for 62 focused checks using actual text DFM, binary DFM, FMX and semantic fixtures, including action execute/update, own click and popup handlers, unresolved references, pagination and native control bindings. Fixtures reuse bin/commands-validation. Source bytes and the user catalog are checked unchanged. PaintTo renders in docs/phase1-commands-workspace.png and phase1-commands-compact.png show running DPH controls, not screenshots of the target app. The keyboard suite remains a required regression because both inspectors share captured properties.</w:t>
+      </w:r>
+    </w:p>
+    <w:p>
+      <w:pPr>
+        <w:pStyle w:val="Heading1"/>
+      </w:pPr>
+      <w:r>
+        <w:t>Dynamic control relationships and validation</w:t>
+      </w:r>
+    </w:p>
+    <w:p>
+      <w:r>
+        <w:t>DPH.Analysis.Symbols captures constructor owner expressions and visual property assignments in reusable routine facts. VisualSites joins them to creation-site identities after cache reuse. Unique same-routine result handles support parent and event declaration references. Multiple constructors, intervening variable writes and assignments before construction prevent attribution and retain ambiguous evidence. Target declarations are inferred lexical references; no runtime binding or reaching-definition proof is claimed. DPHSemanticVersion is DPH-WP3-12 so older semantic captures are reassessed.</w:t>
+      </w:r>
+    </w:p>
+    <w:p>
+      <w:r>
+        <w:t>DPH.Workspace.DynamicControls indexes the new relationships and retains target symbols, source hashes, ranges, conditions and generation evidence. DPH.UI.Main.fmx serializes the filter, 250-row list, details, relationship selector and Explain controls for the IDE. Changing capture clears stale rows. Missing references disable Explain reference. Creation sites remain distinct from serialized form geometry and observed screenshot evidence. No database migration or runtime UI construction was introduced.</w:t>
+      </w:r>
+    </w:p>
+    <w:p>
+      <w:r>
+        <w:t>Run tools\build-dynamic-controls.cmd elevated for 51 focused checks, including owner/parent/event references, nil, reused and overwritten variables, pre-creation assignments, unresolved expressions, loop counts, exact fresh/cache equivalence, pagination and native form controls. Fixtures reuse bin/dynamic-validation. The 134-check semantic regression and 62-check command inventory regression pass, as does the actual app and FMX resource baseline. Historical phase evidence is preserved; current semantic evidence is docs/phase1-dynamic-semantics-regression.json. Native normal/compact PaintTo renders show running DPH controls, not target screenshots.</w:t>
       </w:r>
     </w:p>
     <w:p>
@@ -1309,7 +1347,7 @@
           <w:rFonts w:ascii="Consolas" w:hAnsi="Consolas"/>
           <w:sz w:val="16"/>
         </w:rPr>
-        <w:t>67383aae374aabba6832526e9d373827a5133e4369a61eaad9cffef9f239ecdb</w:t>
+        <w:t>98ecd089264555c80cd293fbd5cc70fb6c6d0549e788f3f50313f76653874d3c</w:t>
       </w:r>
     </w:p>
     <w:p>
@@ -1389,7 +1427,7 @@
           <w:rFonts w:ascii="Consolas" w:hAnsi="Consolas"/>
           <w:sz w:val="16"/>
         </w:rPr>
-        <w:t>a362f3a2b46bdc77883c129efd1c14192d6128ecb616f82915222df370d2d006</w:t>
+        <w:t>1da99806fa3a71afbfe4c58e8e1bb40041d308e32b42fd06f412723c79f7799b</w:t>
       </w:r>
     </w:p>
     <w:p>
@@ -1789,7 +1827,7 @@
           <w:rFonts w:ascii="Consolas" w:hAnsi="Consolas"/>
           <w:sz w:val="16"/>
         </w:rPr>
-        <w:t>956e597b27924091fd7d6acbfc8bc8eda62182a3a89e1be7ca3346126def441e</w:t>
+        <w:t>752100b4862ae04fe9ded675b00503408a50611131d4d16cef5b562252f4e5e0</w:t>
       </w:r>
     </w:p>
     <w:p>
@@ -1877,6 +1915,26 @@
         <w:keepNext/>
       </w:pPr>
       <w:r>
+        <w:t>DPH.Workspace.DynamicControls.pas</w:t>
+      </w:r>
+    </w:p>
+    <w:p>
+      <w:pPr>
+        <w:spacing w:after="60"/>
+      </w:pPr>
+      <w:r>
+        <w:rPr>
+          <w:rFonts w:ascii="Consolas" w:hAnsi="Consolas"/>
+          <w:sz w:val="16"/>
+        </w:rPr>
+        <w:t>abd5350eab05058b885b95e0c947a1badd54eba33877cbe9a448cac194db25ed</w:t>
+      </w:r>
+    </w:p>
+    <w:p>
+      <w:pPr>
+        <w:keepNext/>
+      </w:pPr>
+      <w:r>
         <w:t>DPH.Workspace.Graphs.pas</w:t>
       </w:r>
     </w:p>
@@ -1989,7 +2047,7 @@
           <w:rFonts w:ascii="Consolas" w:hAnsi="Consolas"/>
           <w:sz w:val="16"/>
         </w:rPr>
-        <w:t>a924181a6412caabab27a3d440680255c44ef93179d514eea15296252b00452b</w:t>
+        <w:t>dc8422d60872f852d3a9f5bcc186fcd9a8c373c7872f11798028e20ba7b3fb35</w:t>
       </w:r>
     </w:p>
     <w:p>
@@ -2069,7 +2127,7 @@
           <w:rFonts w:ascii="Consolas" w:hAnsi="Consolas"/>
           <w:sz w:val="16"/>
         </w:rPr>
-        <w:t>c77e545e8d113edd5853664d50ffc62e0c34d6bf8e7f5de842465d87f00bbdf2</w:t>
+        <w:t>8b9a2ca58594c21eeae0d9dda4018f2453a4383f93d3270358a94c74962f979e</w:t>
       </w:r>
     </w:p>
     <w:sectPr>

</xml_diff>

<commit_message>
Implement responsive layout explanations for requirement 04.16
</commit_message>
<xml_diff>
--- a/docs/guides/DPH_Engineering_Guide.docx
+++ b/docs/guides/DPH_Engineering_Guide.docx
@@ -520,7 +520,7 @@
         </w:tabs>
       </w:pPr>
       <w:r>
-        <w:t>Source and revision evidence</w:t>
+        <w:t>Layout rule explanations and validation</w:t>
       </w:r>
       <w:r>
         <w:tab/>
@@ -528,733 +528,776 @@
       </w:r>
     </w:p>
     <w:p>
-      <w:r>
-        <w:fldChar w:fldCharType="end"/>
+      <w:pPr>
+        <w:spacing w:after="0" w:line="240" w:lineRule="auto"/>
+        <w:tabs>
+          <w:tab w:val="right" w:leader="dot" w:pos="9360"/>
+        </w:tabs>
+      </w:pPr>
+      <w:r>
+        <w:t>Source and revision evidence</w:t>
+      </w:r>
+      <w:r>
+        <w:tab/>
+        <w:t>15</w:t>
       </w:r>
     </w:p>
     <w:p>
       <w:r>
-        <w:br w:type="page"/>
+        <w:fldChar w:fldCharType="end"/>
       </w:r>
     </w:p>
     <w:p>
-      <w:pPr>
-        <w:pStyle w:val="Heading1"/>
-      </w:pPr>
-      <w:r>
-        <w:t>Architecture and boundaries</w:t>
+      <w:r>
+        <w:br w:type="page"/>
       </w:r>
     </w:p>
     <w:p>
-      <w:r>
-        <w:t>DPH is an independent Delphi FMX application. It has no converter runtime or build dependency. The pinned VCL2FMXConverter v6.0.0 corpus is test input only, at commit e1fd10b2d3b06f2fc3f726b8eb7f234a54faf63d. No converter source was copied into the current analyzer. Preserve the original planning documents and global agents.md byte for byte.</w:t>
+      <w:pPr>
+        <w:pStyle w:val="Heading1"/>
+      </w:pPr>
+      <w:r>
+        <w:t>Architecture and boundaries</w:t>
       </w:r>
     </w:p>
     <w:p>
       <w:r>
-        <w:t>The pipeline is selected project, bounded inventory, read-only byte acquisition, lexical and conditional processing, Pascal and form IR, semantic relationships and control flow, revision-consistent SQLite capture, cached workspace projection, curated knowledge and derived publication. Contract data remains separate from FMX. Every unsupported construct or unavailable dependency must remain diagnosable rather than being promoted into false completeness.</w:t>
+        <w:t>DPH is an independent Delphi FMX application. It has no converter runtime or build dependency. The pinned VCL2FMXConverter v6.0.0 corpus is test input only, at commit e1fd10b2d3b06f2fc3f726b8eb7f234a54faf63d. No converter source was copied into the current analyzer. Preserve the original planning documents and global agents.md byte for byte.</w:t>
       </w:r>
     </w:p>
     <w:p>
       <w:r>
-        <w:t>Application controls are serialized in DPH.UI.Main.fmx, DPH.UI.ProjectProfile.fmx and DPH.UI.Glossary.fmx and editable in the IDE. List contents and paint-box geometry are data projections. No scanned component class is instantiated. Avoid adding runtime-only controls, Pascal class helpers or an alternative authoritative store without explicit authorization.</w:t>
+        <w:t>The pipeline is selected project, bounded inventory, read-only byte acquisition, lexical and conditional processing, Pascal and form IR, semantic relationships and control flow, revision-consistent SQLite capture, cached workspace projection, curated knowledge and derived publication. Contract data remains separate from FMX. Every unsupported construct or unavailable dependency must remain diagnosable rather than being promoted into false completeness.</w:t>
       </w:r>
     </w:p>
     <w:p>
-      <w:pPr>
-        <w:pStyle w:val="Heading1"/>
-      </w:pPr>
-      <w:r>
-        <w:t>Rework and acceptance status</w:t>
+      <w:r>
+        <w:t>Application controls are serialized in DPH.UI.Main.fmx, DPH.UI.ProjectProfile.fmx and DPH.UI.Glossary.fmx and editable in the IDE. List contents and paint-box geometry are data projections. No scanned component class is instantiated. Avoid adding runtime-only controls, Pascal class helpers or an alternative authoritative store without explicit authorization.</w:t>
       </w:r>
     </w:p>
     <w:p>
-      <w:r>
-        <w:t>The owner rejected the earlier WP7 delivery as inadequate for learning and handoff. The statement that implementation through WP7 was complete has been withdrawn. docs/Rework_Requirements_Audit.txt compares the original plan with the implemented product and outstanding work. Historical WP reports remain historical evidence, not acceptance of the reworked experience.</w:t>
+      <w:pPr>
+        <w:pStyle w:val="Heading1"/>
+      </w:pPr>
+      <w:r>
+        <w:t>Rework and acceptance status</w:t>
       </w:r>
     </w:p>
     <w:p>
       <w:r>
-        <w:t>The rework adds a first-launch Getting started course, deterministic explanation engine, guided learning workspace, source-comment context, event traces, labeled and collapsed procedure-flow views, attributed screenshot imports and richer project-specific publication. Run tools/build-learning.cmd with an optional pinned reference database path for dedicated learning and real-WebView2 tests. The source-based first-time-programmer exercise still needs a human participant.</w:t>
+        <w:t>The owner rejected the earlier WP7 delivery as inadequate for learning and handoff. The statement that implementation through WP7 was complete has been withdrawn. docs/Rework_Requirements_Audit.txt compares the original plan with the implemented product and outstanding work. Historical WP reports remain historical evidence, not acceptance of the reworked experience.</w:t>
       </w:r>
     </w:p>
     <w:p>
       <w:r>
-        <w:t>The implementation tracker records expanded semantic reuse, resource interpretation and retention/continuity controls. Their documented bounds still apply. Source safety, privacy, attribution and exact generation links are retained. Do not turn an automated pass count into a claim that every requirement or the human onboarding goal is finished.</w:t>
+        <w:t>The rework adds a first-launch Getting started course, deterministic explanation engine, guided learning workspace, source-comment context, event traces, labeled and collapsed procedure-flow views, attributed screenshot imports and richer project-specific publication. Run tools/build-learning.cmd with an optional pinned reference database path for dedicated learning and real-WebView2 tests. The source-based first-time-programmer exercise still needs a human participant.</w:t>
       </w:r>
     </w:p>
     <w:p>
-      <w:pPr>
-        <w:pStyle w:val="Heading1"/>
-      </w:pPr>
-      <w:r>
-        <w:t>Build and deployment</w:t>
+      <w:r>
+        <w:t>The implementation tracker records expanded semantic reuse, resource interpretation and retention/continuity controls. Their documented bounds still apply. Source safety, privacy, attribution and exact generation links are retained. Do not turn an automated pass count into a claim that every requirement or the human onboarding goal is finished.</w:t>
       </w:r>
     </w:p>
     <w:p>
-      <w:r>
-        <w:t>The installed compiler is RAD Studio 37.0.59082.6021. Load C:\Program Files (x86)\Embarcadero\Studio\37.0\bin\rsvars.bat before compiling. tools/build-wp0.cmd builds DelphiProjectHandoff.dproj with elevated MSBuild and runs the FMX resource smoke test. Output is bin/Win32/Debug, with DCUs in dcu/Win32/Debug. The initial executable target is Windows Win32.</w:t>
+      <w:pPr>
+        <w:pStyle w:val="Heading1"/>
+      </w:pPr>
+      <w:r>
+        <w:t>Build and deployment</w:t>
       </w:r>
     </w:p>
     <w:p>
       <w:r>
-        <w:t>Deploy the executable, all nine immutable migration files, and the architecture-matched WebView2Loader.dll. The reviewed Microsoft WebView2 SDK package is pinned to 1.0.4258.31; retain tools/WebView2/LICENSE.txt with binary redistribution. The browser loads the DLL by its absolute executable-folder path and activates Edge only when preview is requested. There is no intended IE fallback.</w:t>
+        <w:t>The installed compiler is RAD Studio 37.0.59082.6021. Load C:\Program Files (x86)\Embarcadero\Studio\37.0\bin\rsvars.bat before compiling. tools/build-wp0.cmd builds DelphiProjectHandoff.dproj with elevated MSBuild and runs the FMX resource smoke test. Output is bin/Win32/Debug, with DCUs in dcu/Win32/Debug. The initial executable target is Windows Win32.</w:t>
       </w:r>
     </w:p>
     <w:p>
       <w:r>
-        <w:t>The repository standard folders include bin, dcu, docs/guides, docs/pdf, export, help, images and icons, samples, source distributions and tools. Deploy help/index.html for first-launch education. Reference source and generated test databases remain ignored. Use the explicitly approved Python 3.13 executable for project tooling and the installed LibreOffice, never Microsoft Word.</w:t>
+        <w:t>Deploy the executable, all nine immutable migration files, and the architecture-matched WebView2Loader.dll. The reviewed Microsoft WebView2 SDK package is pinned to 1.0.4258.31; retain tools/WebView2/LICENSE.txt with binary redistribution. The browser loads the DLL by its absolute executable-folder path and activates Edge only when preview is requested. There is no intended IE fallback.</w:t>
       </w:r>
     </w:p>
     <w:p>
-      <w:pPr>
-        <w:pStyle w:val="Heading1"/>
-      </w:pPr>
-      <w:r>
-        <w:t>Input acquisition and project scope</w:t>
+      <w:r>
+        <w:t>The repository standard folders include bin, dcu, docs/guides, docs/pdf, export, help, images and icons, samples, source distributions and tools. Deploy help/index.html for first-launch education. Reference source and generated test databases remain ignored. Use the explicitly approved Python 3.13 executable for project tooling and the installed LibreOffice, never Microsoft Word.</w:t>
       </w:r>
     </w:p>
     <w:p>
-      <w:r>
-        <w:t>DPH.Project.Inventory follows the selected project, explicit references, uses clauses, include paths and approved external roots. Project XML is passive: targets and imported build scripts are not executed. Canonical paths are project relative and normalized; traversal, ambiguous macros, reparse paths, cycles and oversized acquisition are rejected or diagnosed. A repository-wide count of Pascal files is not the build scope.</w:t>
+      <w:pPr>
+        <w:pStyle w:val="Heading1"/>
+      </w:pPr>
+      <w:r>
+        <w:t>Input acquisition and project scope</w:t>
       </w:r>
     </w:p>
     <w:p>
       <w:r>
-        <w:t>DPH.Project.Source opens input read only, checks the final opened Windows handle path, captures bytes, records SHA256 and verifies decoding by round trip. Unicode byte offsets, line endings and explicit legacy encodings remain in the evidence contract. The maximum acquired source is 16 MiB. Binary forms are parsed as data; unsupported resources remain gaps.</w:t>
+        <w:t>DPH.Project.Inventory follows the selected project, explicit references, uses clauses, include paths and approved external roots. Project XML is passive: targets and imported build scripts are not executed. Canonical paths are project relative and normalized; traversal, ambiguous macros, reparse paths, cycles and oversized acquisition are rejected or diagnosed. A repository-wide count of Pascal files is not the build scope.</w:t>
       </w:r>
     </w:p>
     <w:p>
       <w:r>
-        <w:t>A source viewer must re-acquire the live file and match the captured hash before using a cached range. Externally referenced sources use their explicit canonical inventory identity. Never invent a neighboring source path from a cached filename or execute input to fill an analysis gap.</w:t>
+        <w:t>DPH.Project.Source opens input read only, checks the final opened Windows handle path, captures bytes, records SHA256 and verifies decoding by round trip. Unicode byte offsets, line endings and explicit legacy encodings remain in the evidence contract. The maximum acquired source is 16 MiB. Binary forms are parsed as data; unsupported resources remain gaps.</w:t>
       </w:r>
     </w:p>
     <w:p>
-      <w:pPr>
-        <w:pStyle w:val="Heading1"/>
-      </w:pPr>
-      <w:r>
-        <w:t>Syntax contracts and limits</w:t>
+      <w:r>
+        <w:t>A source viewer must re-acquire the live file and match the captured hash before using a cached range. Externally referenced sources use their explicit canonical inventory identity. Never invent a neighboring source path from a cached filename or execute input to fill an analysis gap.</w:t>
       </w:r>
     </w:p>
     <w:p>
-      <w:r>
-        <w:t>DPH.Parse.Model defines IR schema 1, analyzer DPH-WP2-5, token and node limits, source ranges and diagnostics. Lexing preserves original tokens and conditional information. Preprocessing evaluates supported expressions, explicit defines and includes while retaining uncertainty for unknown branches. An unavailable compiler symbol is not automatically a false condition.</w:t>
+      <w:pPr>
+        <w:pStyle w:val="Heading1"/>
+      </w:pPr>
+      <w:r>
+        <w:t>Syntax contracts and limits</w:t>
       </w:r>
     </w:p>
     <w:p>
       <w:r>
-        <w:t>The Pascal parser extracts declarations, routines, anonymous methods and supported statements into IR. Declaration and implementation occurrences remain distinguishable before semantic unification. The form parser accepts supported text and binary DFM/FMX structures without loading component packages. The inventory reads relevant project configuration and resources through bounded adapters.</w:t>
+        <w:t>DPH.Parse.Model defines IR schema 1, analyzer DPH-WP2-5, token and node limits, source ranges and diagnostics. Lexing preserves original tokens and conditional information. Preprocessing evaluates supported expressions, explicit defines and includes while retaining uncertainty for unknown branches. An unavailable compiler symbol is not automatically a false condition.</w:t>
       </w:r>
     </w:p>
     <w:p>
       <w:r>
-        <w:t>Current bounds include 250000 tokens, 100000 IR nodes, nesting 128 and 10000 diagnostics. Opaque assembler, malformed syntax and unsupported grammar are partial. Tests use exact golden IR, encoding edge cases, cyclic includes, passive malicious imports and changed source. Maintain source byte ranges and diagnostics when extending support.</w:t>
+        <w:t>The Pascal parser extracts declarations, routines, anonymous methods and supported statements into IR. Declaration and implementation occurrences remain distinguishable before semantic unification. The form parser accepts supported text and binary DFM/FMX structures without loading component packages. The inventory reads relevant project configuration and resources through bounded adapters.</w:t>
       </w:r>
     </w:p>
     <w:p>
-      <w:pPr>
-        <w:pStyle w:val="Heading1"/>
-      </w:pPr>
-      <w:r>
-        <w:t>Symbols and typed relationships</w:t>
+      <w:r>
+        <w:t>Current bounds include 250000 tokens, 100000 IR nodes, nesting 128 and 10000 diagnostics. Opaque assembler, malformed syntax and unsupported grammar are partial. Tests use exact golden IR, encoding edge cases, cyclic includes, passive malicious imports and changed source. Maintain source byte ranges and diagnostics when extending support.</w:t>
       </w:r>
     </w:p>
     <w:p>
-      <w:r>
-        <w:t>DPH.Analysis.Model defines semantic schema 1 and analyzer DPH-WP3-12. Stable symbol keys contain qualified identity, signature and conditional variant. DPH.Analysis.Symbols unifies supported routine prototypes and bodies, resolves cross-unit declarations, typed receivers and suitable overloads, associates form events and records anonymous callbacks.</w:t>
+      <w:pPr>
+        <w:pStyle w:val="Heading1"/>
+      </w:pPr>
+      <w:r>
+        <w:t>Symbols and typed relationships</w:t>
       </w:r>
     </w:p>
     <w:p>
       <w:r>
-        <w:t>Relationship certainty is confirmed_static, possible_dynamic, inferred, runtime_observed or unresolved. Passive scanning never claims runtime_observed. A uses dependency is not a call. Known lexical calls, serialized bindings and declared types carry derivation rules and source ranges. Recognized asynchronous API spelling can establish a possible scheduling relationship without proving execution order.</w:t>
+        <w:t>DPH.Analysis.Model defines semantic schema 1 and analyzer DPH-WP3-12. Stable symbol keys contain qualified identity, signature and conditional variant. DPH.Analysis.Symbols unifies supported routine prototypes and bodies, resolves cross-unit declarations, typed receivers and suitable overloads, associates form events and records anonymous callbacks.</w:t>
       </w:r>
     </w:p>
     <w:p>
       <w:r>
-        <w:t>Method pointers, unresolved receivers, dynamic dispatch, generated types and framework behavior must retain uncertainty. Basic reads, writes, callback assignment, static SQL spelling and report-model rendering are conservative analyses. Renames are distinct identities until continuity is reviewed; offsets alone must not reassign knowledge.</w:t>
+        <w:t>Relationship certainty is confirmed_static, possible_dynamic, inferred, runtime_observed or unresolved. Passive scanning never claims runtime_observed. A uses dependency is not a call. Known lexical calls, serialized bindings and declared types carry derivation rules and source ranges. Recognized asynchronous API spelling can establish a possible scheduling relationship without proving execution order.</w:t>
       </w:r>
     </w:p>
     <w:p>
-      <w:pPr>
-        <w:pStyle w:val="Heading1"/>
-      </w:pPr>
-      <w:r>
-        <w:t>Control flow and impact</w:t>
+      <w:r>
+        <w:t>Method pointers, unresolved receivers, dynamic dispatch, generated types and framework behavior must retain uncertainty. Basic reads, writes, callback assignment, static SQL spelling and report-model rendering are conservative analyses. Renames are distinct identities until continuity is reviewed; offsets alone must not reassign knowledge.</w:t>
       </w:r>
     </w:p>
     <w:p>
-      <w:r>
-        <w:t>DPH.Analysis.Flow builds per-routine control-flow nodes and typed edges for supported sequences, branches, loops, returns and exception/finally paths. Routine identity, source hash, range, node kind and expression remain available to inspectors and exports. Flow is bounded to 100000 nodes, 300000 edges and nesting 128.</w:t>
+      <w:pPr>
+        <w:pStyle w:val="Heading1"/>
+      </w:pPr>
+      <w:r>
+        <w:t>Control flow and impact</w:t>
       </w:r>
     </w:p>
     <w:p>
       <w:r>
-        <w:t>Impact traversal is possible reachability through supported relationships. Do not label it proved runtime impact. The UI bounds a displayed graph to 120 nodes and 960 edges, while the stored semantic graph is the fuller evidence model. Uncertain edges remain visually distinct. Unsupported flow does not become a fabricated successful path.</w:t>
+        <w:t>DPH.Analysis.Flow builds per-routine control-flow nodes and typed edges for supported sequences, branches, loops, returns and exception/finally paths. Routine identity, source hash, range, node kind and expression remain available to inspectors and exports. Flow is bounded to 100000 nodes, 300000 edges and nesting 128.</w:t>
       </w:r>
     </w:p>
     <w:p>
-      <w:pPr>
-        <w:pStyle w:val="Heading1"/>
-      </w:pPr>
-      <w:r>
-        <w:t>SQLite generations and durability</w:t>
+      <w:r>
+        <w:t>Impact traversal is possible reachability through supported relationships. Do not label it proved runtime impact. The UI bounds a displayed graph to 120 nodes and 960 edges, while the stored semantic graph is the fuller evidence model. Uncertain edges remain visually distinct. Unsupported flow does not become a fabricated successful path.</w:t>
       </w:r>
     </w:p>
     <w:p>
-      <w:r>
-        <w:t>TDPHKnowledgeStore owns one FireDAC SQLite connection on its creating thread and serializes writer access through a named mutex. Foreign keys and synchronous FULL are enabled. Default journal mode is DELETE; WAL is an explicit local-store option. Direct cross-thread writes are rejected. SQLite 3.42.0 with FTS5 was measured by the storage tests.</w:t>
+      <w:pPr>
+        <w:pStyle w:val="Heading1"/>
+      </w:pPr>
+      <w:r>
+        <w:t>SQLite generations and durability</w:t>
       </w:r>
     </w:p>
     <w:p>
       <w:r>
-        <w:t>Schema 9 is created through nine checksum-verified migrations. Existing migration text is immutable. A newer incompatible schema is rejected safely. Failed upgrade DDL and ledger changes roll back, and an upgrade from an existing schema makes a recoverable pre-migration database backup. Interrupted running generations recover as failed, preserving the previous published head.</w:t>
+        <w:t>TDPHKnowledgeStore owns one FireDAC SQLite connection on its creating thread and serializes writer access through a named mutex. Foreign keys and synchronous FULL are enabled. Default journal mode is DELETE; WAL is an explicit local-store option. Direct cross-thread writes are rejected. SQLite 3.42.0 with FTS5 was measured by the storage tests.</w:t>
       </w:r>
     </w:p>
     <w:p>
       <w:r>
-        <w:t>ObserveManifest records current fingerprints independently of the capture. BeginGeneration freezes configuration and manifest identity. Syntax and semantic facts are staged in transactions. Before publication, inputs and configuration are revalidated. Only a coherent complete generation becomes the current head. Partial, failed or superseded captures cannot clear the exact-input stale state or overwrite a prior current head.</w:t>
+        <w:t>Schema 9 is created through nine checksum-verified migrations. Existing migration text is immutable. A newer incompatible schema is rejected safely. Failed upgrade DDL and ledger changes roll back, and an upgrade from an existing schema makes a recoverable pre-migration database backup. Interrupted running generations recover as failed, preserving the previous published head.</w:t>
       </w:r>
     </w:p>
     <w:p>
-      <w:pPr>
-        <w:pStyle w:val="Heading1"/>
-      </w:pPr>
-      <w:r>
-        <w:t>Evidence and immutable history</w:t>
+      <w:r>
+        <w:t>ObserveManifest records current fingerprints independently of the capture. BeginGeneration freezes configuration and manifest identity. Syntax and semantic facts are staged in transactions. Before publication, inputs and configuration are revalidated. Only a coherent complete generation becomes the current head. Partial, failed or superseded captures cannot clear the exact-input stale state or overwrite a prior current head.</w:t>
       </w:r>
     </w:p>
     <w:p>
-      <w:r>
-        <w:t>Normalized tables include projects, configurations, source files, file revisions, generations, generation files, entities, entity versions, evidence, relationships, component properties, control-flow nodes and edges, knowledge records and revisions, links, review tasks, translations, artifacts, export jobs and audit events. Foreign keys tie evidence and relationships to their producing generation.</w:t>
+      <w:pPr>
+        <w:pStyle w:val="Heading1"/>
+      </w:pPr>
+      <w:r>
+        <w:t>Evidence and immutable history</w:t>
       </w:r>
     </w:p>
     <w:p>
       <w:r>
-        <w:t>Triggers prevent mutation of terminal generations, source revisions, captured facts, configurations and authored knowledge revisions. Evidence ranges must fit the captured source bytes and use the generation analyzer version. Historical file and entity identities cannot be changed casually. A missing source is retained as missing; its historical annotations survive.</w:t>
+        <w:t>Normalized tables include projects, configurations, source files, file revisions, generations, generation files, entities, entity versions, evidence, relationships, component properties, control-flow nodes and edges, knowledge records and revisions, links, review tasks, translations, artifacts, export jobs and audit events. Foreign keys tie evidence and relationships to their producing generation.</w:t>
       </w:r>
     </w:p>
     <w:p>
       <w:r>
-        <w:t>Modification detected, analysis stale, knowledge review needed, analysis failed and reassessment requested are separate persistent flags. A UI summary is a projection of these states, not a replacement for them. Parser success must not clear human review.</w:t>
+        <w:t>Triggers prevent mutation of terminal generations, source revisions, captured facts, configurations and authored knowledge revisions. Evidence ranges must fit the captured source bytes and use the generation analyzer version. Historical file and entity identities cannot be changed casually. A missing source is retained as missing; its historical annotations survive.</w:t>
       </w:r>
     </w:p>
     <w:p>
-      <w:pPr>
-        <w:pStyle w:val="Heading1"/>
-      </w:pPr>
-      <w:r>
-        <w:t>Background coordination and cached views</w:t>
+      <w:r>
+        <w:t>Modification detected, analysis stale, knowledge review needed, analysis failed and reassessment requested are separate persistent flags. A UI summary is a projection of these states, not a replacement for them. Parser success must not clear human review.</w:t>
       </w:r>
     </w:p>
     <w:p>
-      <w:r>
-        <w:t>DPH.Workspace.Worker is a persistent TThread with bounded request and response queues. It initializes COM for passive MSXML parsing, owns database operations in the worker, and retains analyzer instances across requests. FMX polls responses with a timer, avoiding queued closures that outlive the form.</w:t>
+      <w:pPr>
+        <w:pStyle w:val="Heading1"/>
+      </w:pPr>
+      <w:r>
+        <w:t>Background coordination and cached views</w:t>
       </w:r>
     </w:p>
     <w:p>
       <w:r>
-        <w:t>A stopped Delphi queue can report success while returning an empty item. Poll checks both the wait result and a non-nil response; shutdown tests guard against a destructor loop. Cancellation is checked between stages and marks a staged running generation failed when appropriate. It is not a promise of interruption inside every parser loop.</w:t>
+        <w:t>DPH.Workspace.Worker is a persistent TThread with bounded request and response queues. It initializes COM for passive MSXML parsing, owns database operations in the worker, and retains analyzer instances across requests. FMX polls responses with a timer, avoiding queued closures that outlive the form.</w:t>
       </w:r>
     </w:p>
     <w:p>
       <w:r>
-        <w:t>Workspace projections are managed JSON files in database.dphdb.views named by SHA256 and registered in artifacts. Cached opening verifies the managed path, size, checksum and generation. Cached facts are delivered before automatic verification when the original source entry is available; unavailable source remains detached. Connected checks compare manifest fingerprints and selection identity every ten seconds. Syntax and routine semantic caches are bounded and binding-context aware; conservative postprocessing remains separate from reused routine facts.</w:t>
+        <w:t>A stopped Delphi queue can report success while returning an empty item. Poll checks both the wait result and a non-nil response; shutdown tests guard against a destructor loop. Cancellation is checked between stages and marks a staged running generation failed when appropriate. It is not a promise of interruption inside every parser loop.</w:t>
       </w:r>
     </w:p>
     <w:p>
-      <w:pPr>
-        <w:pStyle w:val="Heading1"/>
-      </w:pPr>
-      <w:r>
-        <w:t>FMX navigation and visualization</w:t>
+      <w:r>
+        <w:t>Workspace projections are managed JSON files in database.dphdb.views named by SHA256 and registered in artifacts. Cached opening verifies the managed path, size, checksum and generation. Cached facts are delivered before automatic verification when the original source entry is available; unavailable source remains detached. Connected checks compare manifest fingerprints and selection identity every ten seconds. Syntax and routine semantic caches are bounded and binding-context aware; conservative postprocessing remains separate from reused routine facts.</w:t>
       </w:r>
     </w:p>
     <w:p>
-      <w:r>
-        <w:t>DPH.UI.Main binds its published controls to the FMX resource. Explorer queries are paged at 250 rows; data filtering supports kind, text and qualified scope. History and bookmarks use canonical keys, with surviving same-project bookmarks retained across reassessment. Inspector output retains source metadata and serialized properties. Source memo navigation is permitted only after live hash validation.</w:t>
+      <w:pPr>
+        <w:pStyle w:val="Heading1"/>
+      </w:pPr>
+      <w:r>
+        <w:t>FMX navigation and visualization</w:t>
       </w:r>
     </w:p>
     <w:p>
       <w:r>
-        <w:t>OpenSelection queues a candidate without replacing the current database, source or workspace. PollTimer installs it only after the worker returns accepted captured evidence. The worker preflights source identity before creating a database; cached opens check captured XML ProjectGuid and Pascal program declarations before returning a view. Rejections retain the current workspace, and rejected startup caches show Getting started. Inventory identity also covers referenced project groups. DatabaseDialog.InitialDir is the design-time relative default; startup resolves it under the deployment root, creates that folder, and applies the same path to OpenCacheDialog. Distribution packaging copies only the Databases instructions, never its databases or views.</w:t>
+        <w:t>DPH.UI.Main binds its published controls to the FMX resource. Explorer queries are paged at 250 rows; data filtering supports kind, text and qualified scope. History and bookmarks use canonical keys, with surviving same-project bookmarks retained across reassessment. Inspector output retains source metadata and serialized properties. Source memo navigation is permitted only after live hash validation.</w:t>
       </w:r>
     </w:p>
     <w:p>
       <w:r>
-        <w:t>Graph paint boxes draw bounded evidence data with palette and geometry values supplied by design-time style rectangles. Screen reconstruction draws approximate source-derived rectangles without creating components. Its gallery is bounded to 60 forms. Runtime styles, custom painting and inherited resources are not silently fabricated.</w:t>
+        <w:t>OpenSelection queues a candidate without replacing the current database, source or workspace. PollTimer installs it only after the worker returns accepted captured evidence. The worker preflights source identity before creating a database; cached opens check captured XML ProjectGuid and Pascal program declarations before returning a view. Rejections retain the current workspace, and rejected startup caches show Getting started. Inventory identity also covers referenced project groups. DatabaseDialog.InitialDir is the design-time relative default; startup resolves it under the deployment root, creates that folder, and applies the same path to OpenCacheDialog. Distribution packaging copies only the Databases instructions, never its databases or views.</w:t>
       </w:r>
     </w:p>
     <w:p>
       <w:r>
-        <w:t>Keep lifecycle and ownership explicit: the view owns its JSON document, UI arrays own their records, responses transfer document or knowledge ownership to the main form, and the worker frees unconsumed responses during shutdown. Guard unsaved authored text before changing projects or replacing editor state.</w:t>
+        <w:t>Graph paint boxes draw bounded evidence data with palette and geometry values supplied by design-time style rectangles. Screen reconstruction draws approximate source-derived rectangles without creating components. Its gallery is bounded to 60 forms. Runtime styles, custom painting and inherited resources are not silently fabricated.</w:t>
       </w:r>
     </w:p>
     <w:p>
-      <w:pPr>
-        <w:pStyle w:val="Heading1"/>
-      </w:pPr>
-      <w:r>
-        <w:t>Curated knowledge and review</w:t>
+      <w:r>
+        <w:t>Keep lifecycle and ownership explicit: the view owns its JSON document, UI arrays own their records, responses transfer document or knowledge ownership to the main form, and the worker frees unconsumed responses during shutdown. Guard unsaved authored text before changing projects or replacing editor state.</w:t>
       </w:r>
     </w:p>
     <w:p>
-      <w:r>
-        <w:t>SaveKnowledge requires title, body, a named author, a supported kind and a captured generation. Existing records require their expected revision and stable kind. Ordinary titles stay stable; structured glossary names can change while their identity and history remain intact. Each edit appends a needs_review revision, preserves links and opens a pending task. Knowledge bodies are bounded to 1 MiB. Authored text is never regenerated from parser output.</w:t>
+      <w:pPr>
+        <w:pStyle w:val="Heading1"/>
+      </w:pPr>
+      <w:r>
+        <w:t>Curated knowledge and review</w:t>
       </w:r>
     </w:p>
     <w:p>
       <w:r>
-        <w:t>ReviewKnowledge requires the expected current revision, a named reviewer and a matching captured source/configuration. The connected worker observes current source before accepting a review. A missing linked entity cannot be verified under a replacement name. Verification, rejection or retirement appends a revision and records attribution; history remains append only.</w:t>
+        <w:t>SaveKnowledge requires title, body, a named author, a supported kind and a captured generation. Existing records require their expected revision and stable kind. Ordinary titles stay stable; structured glossary names can change while their identity and history remain intact. Each edit appends a needs_review revision, preserves links and opens a pending task. Knowledge bodies are bounded to 1 MiB. Authored text is never regenerated from parser output.</w:t>
       </w:r>
     </w:p>
     <w:p>
       <w:r>
-        <w:t>Manifest and configuration changes conservatively invalidate active knowledge, derived artifacts and translations. A partial static capture may support review of an attributable statement against available evidence, but its partial coverage remains visible. Local names are not authenticated enterprise identities. Human verification and automatic static derivation remain different evidence categories.</w:t>
+        <w:t>ReviewKnowledge requires the expected current revision, a named reviewer and a matching captured source/configuration. The connected worker observes current source before accepting a review. A missing linked entity cannot be verified under a replacement name. Verification, rejection or retirement appends a revision and records attribution; history remains append only.</w:t>
       </w:r>
     </w:p>
     <w:p>
-      <w:pPr>
-        <w:pStyle w:val="Heading1"/>
-      </w:pPr>
-      <w:r>
-        <w:t>Canonical publication and privacy</w:t>
+      <w:r>
+        <w:t>Manifest and configuration changes conservatively invalidate active knowledge, derived artifacts and translations. A partial static capture may support review of an attributable statement against available evidence, but its partial coverage remains visible. Local names are not authenticated enterprise identities. Human verification and automatic static derivation remain different evidence categories.</w:t>
       </w:r>
     </w:p>
     <w:p>
-      <w:r>
-        <w:t>DPH.Publish.Model constructs one versioned documentation model from a captured workspace and current curated knowledge. It carries generation, configuration, input/context fingerprints, detached/stale state, symbols, typed relationships, control flow, source references, human history, coverage and explicit unknowns. Full and task-scoped views share those facts.</w:t>
+      <w:pPr>
+        <w:pStyle w:val="Heading1"/>
+      </w:pPr>
+      <w:r>
+        <w:t>Canonical publication and privacy</w:t>
       </w:r>
     </w:p>
     <w:p>
       <w:r>
-        <w:t>Task scope selects the requested identities and complete direct incident context. It rejects missing or excluded seeds and rejects an oversized task rather than silently truncating a full export. External source roots and sensitive filename categories are excluded by default. Explicit relative prefix exclusions remove file-derived symbols and relationships. Source snapshots and generated AGENTS.md are absent by default.</w:t>
+        <w:t>DPH.Publish.Model constructs one versioned documentation model from a captured workspace and current curated knowledge. It carries generation, configuration, input/context fingerprints, detached/stale state, symbols, typed relationships, control flow, source references, human history, coverage and explicit unknowns. Full and task-scoped views share those facts.</w:t>
       </w:r>
     </w:p>
     <w:p>
       <w:r>
-        <w:t>Redaction recognizes common credential assignments, private keys, AWS access keys and JWT-shaped tokens throughout string data. It is defense in depth, not a guarantee that every project-specific secret format is recognizable. Require explicit exclusions and a disclosure review for sensitive content. No translation or AI provider is contacted by normal publishing.</w:t>
+        <w:t>Task scope selects the requested identities and complete direct incident context. It rejects missing or excluded seeds and rejects an oversized task rather than silently truncating a full export. External source roots and sensitive filename categories are excluded by default. Explicit relative prefix exclusions remove file-derived symbols and relationships. Source snapshots and generated AGENTS.md are absent by default.</w:t>
       </w:r>
     </w:p>
     <w:p>
-      <w:pPr>
-        <w:pStyle w:val="Heading1"/>
-      </w:pPr>
-      <w:r>
-        <w:t>HTML guides and bundle validation</w:t>
+      <w:r>
+        <w:t>Redaction recognizes common credential assignments, private keys, AWS access keys and JWT-shaped tokens throughout string data. It is defense in depth, not a guarantee that every project-specific secret format is recognizable. Require explicit exclusions and a disclosure review for sensitive content. No translation or AI provider is contacted by normal publishing.</w:t>
       </w:r>
     </w:p>
     <w:p>
-      <w:r>
-        <w:t>DPH.Publish.Export writes a new destination outside source. The offline HTML uses encoded imported text, local search and styles, internal anchors, print CSS and a restrictive content security policy. The default WebView2 policy permits only the authorized local index and about:blank; publication explicitly enables hash-named object pages in its managed objects folder. Help retains the index-only policy; learning explicitly permits content-hashed pages only inside its owned preview directory. There is no arbitrary native bridge. Data does not supply executable markup.</w:t>
+      <w:pPr>
+        <w:pStyle w:val="Heading1"/>
+      </w:pPr>
+      <w:r>
+        <w:t>HTML guides and bundle validation</w:t>
       </w:r>
     </w:p>
     <w:p>
       <w:r>
-        <w:t>JSONL indexes contain symbols, relationships, forms/events, data usage, configuration, flow nodes, knowledge and evidence references. Manifest and checksum files accompany canonical.json. The validator checks filenames, hashes, expected input fingerprint, canonical identity, source hash/range, generation and cross-reference integrity. A stale manifest is rejected by default. Unsigned hashes establish integrity relative to the index, not author authenticity.</w:t>
+        <w:t>DPH.Publish.Export writes a new destination outside source. The offline HTML uses encoded imported text, local search and styles, internal anchors, print CSS and a restrictive content security policy. The default WebView2 policy permits only the authorized local index and about:blank; publication explicitly enables hash-named object pages in its managed objects folder. Help retains the index-only policy; learning explicitly permits content-hashed pages only inside its owned preview directory. There is no arbitrary native bridge. Data does not supply executable markup.</w:t>
       </w:r>
     </w:p>
     <w:p>
       <w:r>
-        <w:t>Editable engineering and user DOCX guides derive from the same sections and evidence model. They include title, last changed capture identity and a changeable TOC field. LibreOffice provides companion PDFs; the project rendering tool verifies cached page numbers and renders page images for layout inspection. Missing business procedures stay explicitly absent rather than being invented.</w:t>
+        <w:t>JSONL indexes contain symbols, relationships, forms/events, data usage, configuration, flow nodes, knowledge and evidence references. Manifest and checksum files accompany canonical.json. The validator checks filenames, hashes, expected input fingerprint, canonical identity, source hash/range, generation and cross-reference integrity. A stale manifest is rejected by default. Unsigned hashes establish integrity relative to the index, not author authenticity.</w:t>
       </w:r>
     </w:p>
     <w:p>
-      <w:pPr>
-        <w:pStyle w:val="Heading1"/>
-      </w:pPr>
-      <w:r>
-        <w:t>Translation boundary</w:t>
+      <w:r>
+        <w:t>Editable engineering and user DOCX guides derive from the same sections and evidence model. They include title, last changed capture identity and a changeable TOC field. LibreOffice provides companion PDFs; the project rendering tool verifies cached page numbers and renders page images for layout inspection. Missing business procedures stay explicitly absent rather than being invented.</w:t>
       </w:r>
     </w:p>
     <w:p>
-      <w:r>
-        <w:t>IDPHTranslationProvider exposes provider identity, version, external status and prose translation. Protected segments retain identifiers, SQL, paths, hashes and protocol keys byte for byte. Cache keys include source content, revision, source/target locales and provider/version. Changed prose produces a fresh pending entry; named review applies to the exact cached translation.</w:t>
+      <w:pPr>
+        <w:pStyle w:val="Heading1"/>
+      </w:pPr>
+      <w:r>
+        <w:t>Translation boundary</w:t>
       </w:r>
     </w:p>
     <w:p>
       <w:r>
-        <w:t>TDPHAtlasAdapter reads explicitly selected DAT JSON packs offline. The independent Apache-2.0 reader snapshot and license reside under dependencies\DelphiAppTranslation; VCL2FMX is unchanged and is not a build or runtime dependency. No network provider is configured. Tests exercise actual packs, persistent cache, terminology changes, source invalidation and exact-content named review. The offline GTranslate region is disabled, with local bilingual labels and sorting; do not activate network translation merely because a generic widget name appears in documentation.</w:t>
+        <w:t>IDPHTranslationProvider exposes provider identity, version, external status and prose translation. Protected segments retain identifiers, SQL, paths, hashes and protocol keys byte for byte. Cache keys include source content, revision, source/target locales and provider/version. Changed prose produces a fresh pending entry; named review applies to the exact cached translation.</w:t>
       </w:r>
     </w:p>
     <w:p>
-      <w:pPr>
-        <w:pStyle w:val="Heading1"/>
-      </w:pPr>
-      <w:r>
-        <w:t>Verification and release discipline</w:t>
+      <w:r>
+        <w:t>TDPHAtlasAdapter reads explicitly selected DAT JSON packs offline. The independent Apache-2.0 reader snapshot and license reside under dependencies\DelphiAppTranslation; VCL2FMX is unchanged and is not a build or runtime dependency. No network provider is configured. Tests exercise actual packs, persistent cache, terminology changes, source invalidation and exact-content named review. The offline GTranslate region is disabled, with local bilingual labels and sorting; do not activate network translation merely because a generic widget name appears in documentation.</w:t>
       </w:r>
     </w:p>
     <w:p>
-      <w:r>
-        <w:t>Run the phase build/test scripts elevated with the installed toolchain. WP0 checks FMX resource ownership; WP1 checks storage, crash recovery and migrations; WP2 checks inventory, encoding, syntax and source safety; WP3 checks semantics and pinned reference traces; WP4 checks workspace/background behavior; WP5 checks immutable authored history and pending review; WP6 checks publication, exclusions, sanitization, hashes and translation protection.</w:t>
+      <w:pPr>
+        <w:pStyle w:val="Heading1"/>
+      </w:pPr>
+      <w:r>
+        <w:t>Verification and release discipline</w:t>
       </w:r>
     </w:p>
     <w:p>
       <w:r>
-        <w:t>Use exact input hashes before and after analysis, including failures. Preserve original reference and instruction files. Keep tests that demonstrate invariants rather than tests that merely mirror implementation. New source, validation failure or unresolved risk justifies another targeted test; a passing unchanged phase does not need endless repetition.</w:t>
+        <w:t>Run the phase build/test scripts elevated with the installed toolchain. WP0 checks FMX resource ownership; WP1 checks storage, crash recovery and migrations; WP2 checks inventory, encoding, syntax and source safety; WP3 checks semantics and pinned reference traces; WP4 checks workspace/background behavior; WP5 checks immutable authored history and pending review; WP6 checks publication, exclusions, sanitization, hashes and translation protection.</w:t>
       </w:r>
     </w:p>
     <w:p>
       <w:r>
-        <w:t>H: development backups are enabled. Allow at least 60 seconds for this USB drive to wake before assessing availability. Git remains enabled: review intended changes, commit validated work and push both public and private remotes without force or history rewriting. Remove a stale zero-byte index lock only after verifying no Git process runs. WP7 records measured performance, portability, security and explicit acceptance evidence. Independent first-time programmer acceptance and unknown historical business intent cannot be invented by automation.</w:t>
+        <w:t>Use exact input hashes before and after analysis, including failures. Preserve original reference and instruction files. Keep tests that demonstrate invariants rather than tests that merely mirror implementation. New source, validation failure or unresolved risk justifies another targeted test; a passing unchanged phase does not need endless repetition.</w:t>
       </w:r>
     </w:p>
     <w:p>
       <w:r>
-        <w:t>In the historical pre-rework benchmark on the recorded Core i7-1165G7 host with eight logical processors and about 16 GB RAM, the pinned reference pipeline measured 82.6 seconds for full capture, 2.87 seconds for cached opening and 75.9 seconds for incremental reassessment. The message-pump maximum gap was 64 ms. Peak test-process working set was about 1.21 GiB, including repeated captures, JSON cloning and FMX/WebView2 tests. These are baseline measurements, not agreed hardware-independent budgets. Large syntax-cache fallback and conservative semantic recomputation explain the modest reassessment speedup. Formal acceptance retains independent complex-flow review, missing business/user content, AC-25 and performance-budget agreement as outstanding.</w:t>
+        <w:t>H: development backups are enabled. Allow at least 60 seconds for this USB drive to wake before assessing availability. Git remains enabled: review intended changes, commit validated work and push both public and private remotes without force or history rewriting. Remove a stale zero-byte index lock only after verifying no Git process runs. WP7 records measured performance, portability, security and explicit acceptance evidence. Independent first-time programmer acceptance and unknown historical business intent cannot be invented by automation.</w:t>
       </w:r>
     </w:p>
     <w:p>
-      <w:pPr>
-        <w:pStyle w:val="Heading1"/>
-      </w:pPr>
-      <w:r>
-        <w:t>Current semantic cache and extended evidence</w:t>
+      <w:r>
+        <w:t>In the historical pre-rework benchmark on the recorded Core i7-1165G7 host with eight logical processors and about 16 GB RAM, the pinned reference pipeline measured 82.6 seconds for full capture, 2.87 seconds for cached opening and 75.9 seconds for incremental reassessment. The message-pump maximum gap was 64 ms. Peak test-process working set was about 1.21 GiB, including repeated captures, JSON cloning and FMX/WebView2 tests. These are baseline measurements, not agreed hardware-independent budgets. Large syntax-cache fallback and conservative semantic recomputation explain the modest reassessment speedup. Formal acceptance retains independent complex-flow review, missing business/user content, AC-25 and performance-budget agreement as outstanding.</w:t>
       </w:r>
     </w:p>
     <w:p>
-      <w:r>
-        <w:t>The current analyzers are DPH-WP2-5 and DPH-WP3-12 with IR and semantic schema 1. Routine semantic cache reuse is bounded to 512 records and 32 MiB. Binding context hashes invalidate affected reuse. Synthetic startup and postprocessing occur after reusable routine facts, preserving their relationships to current identities. This is bounded evidence reuse; it is not a proof of an optimal incremental solver.</w:t>
+      <w:pPr>
+        <w:pStyle w:val="Heading1"/>
+      </w:pPr>
+      <w:r>
+        <w:t>Current semantic cache and extended evidence</w:t>
       </w:r>
     </w:p>
     <w:p>
       <w:r>
-        <w:t>Supported extensions include typed aliases, inheritance and accessors, startup entry and unit phases, case/goto/with control flow, asynchronous operation handles and captures, cancellation and event waits, formal arguments and result producers, static SQL projection, output-writer lineage, lifetime and exception relationships, explicit test-call links, and qualified form navigation. Every relationship retains resolution, source range/hash and rule. Unsupported grammar, aliases and dynamic behavior remain diagnosed or qualified.</w:t>
+        <w:t>The current analyzers are DPH-WP2-5 and DPH-WP3-12 with IR and semantic schema 1. Routine semantic cache reuse is bounded to 512 records and 32 MiB. Binding context hashes invalidate affected reuse. Synthetic startup and postprocessing occur after reusable routine facts, preserving their relationships to current identities. This is bounded evidence reuse; it is not a proof of an optimal incremental solver.</w:t>
       </w:r>
     </w:p>
     <w:p>
-      <w:pPr>
-        <w:pStyle w:val="Heading1"/>
-      </w:pPr>
-      <w:r>
-        <w:t>Current schema and authored document contracts</w:t>
+      <w:r>
+        <w:t>Supported extensions include typed aliases, inheritance and accessors, startup entry and unit phases, case/goto/with control flow, asynchronous operation handles and captures, cancellation and event waits, formal arguments and result producers, static SQL projection, output-writer lineage, lifetime and exception relationships, explicit test-call links, and qualified form navigation. Every relationship retains resolution, source range/hash and rule. Unsupported grammar, aliases and dynamic behavior remain diagnosed or qualified.</w:t>
       </w:r>
     </w:p>
     <w:p>
-      <w:r>
-        <w:t>Schema 9 uses checksum-verified migrations 001 through 009. document_section_versions associates immutable authored revisions with stable section ID, document kind, audience and source generation. knowledge_revision_links preserves ordinal, target kind/identity, captured generation, role and label. knowledge_questions preserves the exact deterministic question identity and captured JSON associated with a response record.</w:t>
+      <w:pPr>
+        <w:pStyle w:val="Heading1"/>
+      </w:pPr>
+      <w:r>
+        <w:t>Current schema and authored document contracts</w:t>
       </w:r>
     </w:p>
     <w:p>
       <w:r>
-        <w:t>SaveKnowledge appends immutable text and link snapshots. Empty LinksJSON preserves the prior snapshot; an explicit JSON array replaces it. Entity, relationship and evidence targets remain tied to generation identities; screenshot targets reference managed artifacts; section targets pin an exact knowledge revision. Current reverse section references open review when their targets change. Verify rejects obsolete rich-link generations or target revisions.</w:t>
+        <w:t>Schema 9 uses checksum-verified migrations 001 through 009. document_section_versions associates immutable authored revisions with stable section ID, document kind, audience and source generation. knowledge_revision_links preserves ordinal, target kind/identity, captured generation, role and label. knowledge_questions preserves the exact deterministic question identity and captured JSON associated with a response record.</w:t>
       </w:r>
     </w:p>
     <w:p>
       <w:r>
-        <w:t>Question identity hashes kind, entity key, range, source hash, prompt, rule and context fingerprint. Generation is retained separately, allowing unchanged evidence to keep its question identity across captures. An answer needs actual text after Answer. Only verified content with no pending task suppresses an exact question. Export converts question metadata to typed JSON before recursive redaction.</w:t>
+        <w:t>SaveKnowledge appends immutable text and link snapshots. Empty LinksJSON preserves the prior snapshot; an explicit JSON array replaces it. Entity, relationship and evidence targets remain tied to generation identities; screenshot targets reference managed artifacts; section targets pin an exact knowledge revision. Current reverse section references open review when their targets change. Verify rejects obsolete rich-link generations or target revisions.</w:t>
       </w:r>
     </w:p>
     <w:p>
-      <w:pPr>
-        <w:pStyle w:val="Heading1"/>
-      </w:pPr>
-      <w:r>
-        <w:t>Native review and learning projections</w:t>
+      <w:r>
+        <w:t>Question identity hashes kind, entity key, range, source hash, prompt, rule and context fingerprint. Generation is retained separately, allowing unchanged evidence to keep its question identity across captures. An answer needs actual text after Answer. Only verified content with no pending task suppresses an exact question. Export converts question metadata to typed JSON before recursive redaction.</w:t>
       </w:r>
     </w:p>
     <w:p>
-      <w:r>
-        <w:t>ReviewTasks provides bounded pending tasks, prior and current authored text, baseline/current configurations, affected object signatures, types, source hashes and relationship comparisons. A missing baseline is reported. Native controls invoke existing optimistic-revision and connected-source review checks; they do not create a separate approval authority.</w:t>
+      <w:pPr>
+        <w:pStyle w:val="Heading1"/>
+      </w:pPr>
+      <w:r>
+        <w:t>Native review and learning projections</w:t>
       </w:r>
     </w:p>
     <w:p>
       <w:r>
-        <w:t>RoutineLesson uses the routine CFG and an indexed outgoing-edge lookup. It explains source points, actual expressions and destination lines, with explicit loop, branch, early-return, cleanup and exceptional semantics. The same lesson is used by ObjectText and ObjectHTML; exported document prose and offline object pages therefore share its source interpretation. Its bounds are 60 points and eight outgoing paths per point.</w:t>
+        <w:t>ReviewTasks provides bounded pending tasks, prior and current authored text, baseline/current configurations, affected object signatures, types, source hashes and relationship comparisons. A missing baseline is reported. Native controls invoke existing optimistic-revision and connected-source review checks; they do not create a separate approval authority.</w:t>
       </w:r>
     </w:p>
     <w:p>
       <w:r>
-        <w:t>Preview HTML files have immutable content-hashed names, tracked for cleanup. BrowserPolicy allows them only in the owned preview directory when explicitly enabled. This avoids rewriting a file held by WebView2. Arbitrary filenames and external navigation remain blocked. Native browser tests render the app pages; they do not execute the analyzed application.</w:t>
+        <w:t>RoutineLesson uses the routine CFG and an indexed outgoing-edge lookup. It explains source points, actual expressions and destination lines, with explicit loop, branch, early-return, cleanup and exceptional semantics. The same lesson is used by ObjectText and ObjectHTML; exported document prose and offline object pages therefore share its source interpretation. Its bounds are 60 points and eight outgoing paths per point.</w:t>
       </w:r>
     </w:p>
     <w:p>
-      <w:pPr>
-        <w:pStyle w:val="Heading1"/>
-      </w:pPr>
-      <w:r>
-        <w:t>Saved observation persistence</w:t>
+      <w:r>
+        <w:t>Preview HTML files have immutable content-hashed names, tracked for cleanup. BrowserPolicy allows them only in the owned preview directory when explicitly enabled. This avoids rewriting a file held by WebView2. Arbitrary filenames and external navigation remain blocked. Native browser tests render the app pages; they do not execute the analyzed application.</w:t>
       </w:r>
     </w:p>
     <w:p>
-      <w:r>
-        <w:t>ImportObservation accepts explicitly selected UTF-8 text extracts up to 256 KiB with named contributor and run context. It checks generation and optional entity existence, captures original byte SHA256 and linked file-revision SHA256, and stores content plus attribution in a managed hash-named JSON artifact of kind runtime_observation. No schema migration is needed for this artifact kind.</w:t>
+      <w:pPr>
+        <w:pStyle w:val="Heading1"/>
+      </w:pPr>
+      <w:r>
+        <w:t>Saved observation persistence</w:t>
       </w:r>
     </w:p>
     <w:p>
       <w:r>
-        <w:t>ObservationsJSON verifies managed identity, size, checksum and generation before returning the newest 50 records. The response owns the array until PollTimer transfers it to the form. LoadView clears old observation rows; historical records cannot navigate as current. Saved text stays in a native read-only memo rather than an executable browser surface.</w:t>
+        <w:t>ImportObservation accepts explicitly selected UTF-8 text extracts up to 256 KiB with named contributor and run context. It checks generation and optional entity existence, captures original byte SHA256 and linked file-revision SHA256, and stores content plus attribution in a managed hash-named JSON artifact of kind runtime_observation. No schema migration is needed for this artifact kind.</w:t>
       </w:r>
     </w:p>
     <w:p>
       <w:r>
-        <w:t>ManagedArtifactPaths includes observations for explicit portable backup. Retention protects their associated captured views. Publication currently omits observations rather than automatically disclose potentially sensitive logs. Contributor claims do not set runtime_observed on static analysis or create an automated causal trace.</w:t>
+        <w:t>ObservationsJSON verifies managed identity, size, checksum and generation before returning the newest 50 records. The response owns the array until PollTimer transfers it to the form. LoadView clears old observation rows; historical records cannot navigate as current. Saved text stays in a native read-only memo rather than an executable browser surface.</w:t>
       </w:r>
     </w:p>
     <w:p>
-      <w:pPr>
-        <w:pStyle w:val="Heading1"/>
-      </w:pPr>
-      <w:r>
-        <w:t>Regression commands and evidence</w:t>
+      <w:r>
+        <w:t>ManagedArtifactPaths includes observations for explicit portable backup. Retention protects their associated captured views. Publication currently omits observations rather than automatically disclose potentially sensitive logs. Contributor claims do not set runtime_observed on static analysis or create an automated causal trace.</w:t>
       </w:r>
     </w:p>
     <w:p>
-      <w:r>
-        <w:t>Run commands from the project root in an elevated Command Prompt so RAD Studio can read its environment. tools\build-wp0.cmd builds the app and checks FMX bindings. tools\validate-completion-wp1.cmd serially builds app, catalog, lifecycle, workspace, knowledge, selection and startup tests, then removes recognized disposable fixture directories.</w:t>
+      <w:pPr>
+        <w:pStyle w:val="Heading1"/>
+      </w:pPr>
+      <w:r>
+        <w:t>Regression commands and evidence</w:t>
       </w:r>
     </w:p>
     <w:p>
       <w:r>
-        <w:t>Run tools\build-wp1.cmd for 46 storage checks, tools\build-wp2.cmd no-report for discovery/resource checks, and tools\build-wp3.cmd to compile semantic tests. Then explicitly run bin\Win32\Debug\DPH.Tests.Semantics.exe "C:\New Delphi Projects\Delphi Project Handoff"; the build script alone does not run semantic assertions.</w:t>
+        <w:t>Run commands from the project root in an elevated Command Prompt so RAD Studio can read its environment. tools\build-wp0.cmd builds the app and checks FMX bindings. tools\validate-completion-wp1.cmd serially builds app, catalog, lifecycle, workspace, knowledge, selection and startup tests, then removes recognized disposable fixture directories.</w:t>
       </w:r>
     </w:p>
     <w:p>
       <w:r>
-        <w:t>tools\build-learning.cmd exercises managed images, cached supplemental-evidence recovery, actual WebView2 rendering, source walkthroughs and collapsed CFGs. --no-ui isolates deterministic checks and is not native acceptance. tools\build-wp6.cmd checks canonical scope, redaction, link integrity, publication and translation protection. Use exact log files and current input hashes for claims; historical reports are not automatically refreshed acceptance.</w:t>
+        <w:t>Run tools\build-wp1.cmd for 46 storage checks, tools\build-wp2.cmd no-report for discovery/resource checks, and tools\build-wp3.cmd to compile semantic tests. Then explicitly run bin\Win32\Debug\DPH.Tests.Semantics.exe "C:\New Delphi Projects\Delphi Project Handoff"; the build script alone does not run semantic assertions.</w:t>
       </w:r>
     </w:p>
     <w:p>
       <w:r>
-        <w:t>A native-learning test once dereferenced an absent image array on a later background-verification response. It now checks the initial cached document/image response directly. Source attachment preserves supplemental-image warnings. Inspection disproved a proposed constructor race, and no worker thread-start change remains.</w:t>
+        <w:t>tools\build-learning.cmd exercises managed images, cached supplemental-evidence recovery, actual WebView2 rendering, source walkthroughs and collapsed CFGs. --no-ui isolates deterministic checks and is not native acceptance. tools\build-wp6.cmd checks canonical scope, redaction, link integrity, publication and translation protection. Use exact log files and current input hashes for claims; historical reports are not automatically refreshed acceptance.</w:t>
       </w:r>
     </w:p>
     <w:p>
-      <w:pPr>
-        <w:pStyle w:val="Heading1"/>
-      </w:pPr>
-      <w:r>
-        <w:t>Rebuild and inspect these manuals</w:t>
+      <w:r>
+        <w:t>A native-learning test once dereferenced an absent image array on a later background-verification response. It now checks the initial cached document/image response directly. Source attachment preserves supplemental-image warnings. Inspection disproved a proposed constructor race, and no worker thread-start change remains.</w:t>
       </w:r>
     </w:p>
     <w:p>
-      <w:r>
-        <w:t>tools\build-guides.py generates the two application manuals from maintained operating content and current implementation hashes. Use the approved Python executable C:\Users\marti\AppData\Local\Microsoft\WindowsApps\python.exe. tools\render-guides.ps1 renders with LibreOffice, populates cached page numbers in editable TOC fields, renders again and writes companion PDFs under docs\pdf.</w:t>
+      <w:pPr>
+        <w:pStyle w:val="Heading1"/>
+      </w:pPr>
+      <w:r>
+        <w:t>Rebuild and inspect these manuals</w:t>
       </w:r>
     </w:p>
     <w:p>
       <w:r>
-        <w:t>Inspect every final page PNG under bin\guide-qa for clipping, broken headings, unreadable code and TOC page numbers before delivering a guide. Rendered PNGs are QA outputs, not a mock application UI. Actual included interface images are identified by their capture source and fixture; they do not establish runtime behavior of a selected project.</w:t>
+        <w:t>tools\build-guides.py generates the two application manuals from maintained operating content and current implementation hashes. Use the approved Python executable C:\Users\marti\AppData\Local\Microsoft\WindowsApps\python.exe. tools\render-guides.ps1 renders with LibreOffice, populates cached page numbers in editable TOC fields, renders again and writes companion PDFs under docs\pdf.</w:t>
       </w:r>
     </w:p>
     <w:p>
       <w:r>
-        <w:t>Regenerate manuals after later translation, handoff-contract or source-navigation changes. The source evidence appendix records inspected file hashes, while docs\guide-source-validation.json provides a machine-readable manifest. A successful generator run alone is not proof that the writing, current behavior or layout is correct.</w:t>
+        <w:t>Inspect every final page PNG under bin\guide-qa for clipping, broken headings, unreadable code and TOC page numbers before delivering a guide. Rendered PNGs are QA outputs, not a mock application UI. Actual included interface images are identified by their capture source and fixture; they do not establish runtime behavior of a selected project.</w:t>
       </w:r>
     </w:p>
     <w:p>
-      <w:pPr>
-        <w:pStyle w:val="Heading1"/>
-      </w:pPr>
-      <w:r>
-        <w:t>Business glossary implementation and checks</w:t>
+      <w:r>
+        <w:t>Regenerate manuals after later translation, handoff-contract or source-navigation changes. The source evidence appendix records inspected file hashes, while docs\guide-source-validation.json provides a machine-readable manifest. A successful generator run alone is not proof that the writing, current behavior or layout is correct.</w:t>
       </w:r>
     </w:p>
     <w:p>
-      <w:r>
-        <w:t>DPH.Knowledge.Glossary validates a business_glossary structured record with term, aliases, definition, examples and relevance/evidence context. Names normalize case and repeated whitespace. Terms/aliases are bounded to 128 characters, 32 aliases per term, definitions/examples to 16384 characters, context to 4096 characters and the record to 64 KiB. Unknown fields, duplicate fields and non-text aliases are rejected.</w:t>
+      <w:pPr>
+        <w:pStyle w:val="Heading1"/>
+      </w:pPr>
+      <w:r>
+        <w:t>Business glossary implementation and checks</w:t>
       </w:r>
     </w:p>
     <w:p>
       <w:r>
-        <w:t>The existing migration 009 structured_json column stores the exact term fields on each immutable knowledge revision; no new migration is needed. SaveKnowledge enforces glossary kind, user document and all-reader audience, generated body agreement, project-local name uniqueness, type preservation and optimistic revision checks. Glossary titles can change while the knowledge ID and prior structured revisions remain intact. Retired records continue reserving their current names.</w:t>
+        <w:t>DPH.Knowledge.Glossary validates a business_glossary structured record with term, aliases, definition, examples and relevance/evidence context. Names normalize case and repeated whitespace. Terms/aliases are bounded to 128 characters, 32 aliases per term, definitions/examples to 16384 characters, context to 4096 characters and the record to 64 KiB. Unknown fields, duplicate fields and non-text aliases are rejected.</w:t>
       </w:r>
     </w:p>
     <w:p>
       <w:r>
-        <w:t>DPH.UI.Glossary.fmx defines every term editor control for the IDE/Object Inspector. DPH.UI.Main.fmx defines the glossary list, filter, detail memo and commands. Apply prepares a draft in the existing Knowledge pipeline. The modal editor retains a cloned saved revision so a background refresh cannot invalidate its input pointer. Current source links, explicit review, search and stale-source tracking use existing repository contracts.</w:t>
+        <w:t>The existing migration 009 structured_json column stores the exact term fields on each immutable knowledge revision; no new migration is needed. SaveKnowledge enforces glossary kind, user document and all-reader audience, generated body agreement, project-local name uniqueness, type preservation and optimistic revision checks. Glossary titles can change while the knowledge ID and prior structured revisions remain intact. Retired records continue reserving their current names.</w:t>
       </w:r>
     </w:p>
     <w:p>
       <w:r>
-        <w:t>DPH-LEARNING-8 publication emits a dedicated HTML glossary index and indexes/glossary.jsonl from the canonical knowledge records. Both user and engineering DOCX use those same records. Validate compares the glossary JSONL with the canonical glossary subset; recomputing the artifact hash cannot conceal divergent content. Older publication versions remain readable under their prior contract.</w:t>
+        <w:t>DPH.UI.Glossary.fmx defines every term editor control for the IDE/Object Inspector. DPH.UI.Main.fmx defines the glossary list, filter, detail memo and commands. Apply prepares a draft in the existing Knowledge pipeline. The modal editor retains a cloned saved revision so a background refresh cannot invalidate its input pointer. Current source links, explicit review, search and stale-source tracking use existing repository contracts.</w:t>
       </w:r>
     </w:p>
     <w:p>
       <w:r>
-        <w:t>From an elevated Command Prompt run cd /d "C:\New Delphi Projects\Delphi Project Handoff", then tools\build-glossary.cmd. The suite uses the fixed ignored bin\glossary-validation directory and controlled fixtures. It checks field validation, normalized conflicts, persistence, rename, immutable revisions, stale edits/reviews, isolation, source-linked invalidation, search, publication agreement/exclusions/tampering and IDE-designed native form workflows at normal/minimum sizes. Native images are FMX PaintTo renders of actual instantiated controls; they are not screenshots of the analyzed target application.</w:t>
+        <w:t>DPH-LEARNING-8 publication emits a dedicated HTML glossary index and indexes/glossary.jsonl from the canonical knowledge records. Both user and engineering DOCX use those same records. Validate compares the glossary JSONL with the canonical glossary subset; recomputing the artifact hash cannot conceal divergent content. Older publication versions remain readable under their prior contract.</w:t>
       </w:r>
     </w:p>
     <w:p>
       <w:r>
-        <w:t>Build the application with tools\build-wp0.cmd. Run tools\build-wp5.cmd for the existing knowledge/link/review regressions and tools\build-wp6.cmd for publishing/translation regressions. A FAIL or nonzero exit means the corresponding check failed. See docs\phase1-glossary-validation.json and the glossary completion note for actual current run evidence.</w:t>
+        <w:t>From an elevated Command Prompt run cd /d "C:\New Delphi Projects\Delphi Project Handoff", then tools\build-glossary.cmd. The suite uses the fixed ignored bin\glossary-validation directory and controlled fixtures. It checks field validation, normalized conflicts, persistence, rename, immutable revisions, stale edits/reviews, isolation, source-linked invalidation, search, publication agreement/exclusions/tampering and IDE-designed native form workflows at normal/minimum sizes. Native images are FMX PaintTo renders of actual instantiated controls; they are not screenshots of the analyzed target application.</w:t>
       </w:r>
     </w:p>
     <w:p>
-      <w:pPr>
-        <w:pStyle w:val="Heading1"/>
-      </w:pPr>
-      <w:r>
-        <w:t>Offline translation and localized publication</w:t>
+      <w:r>
+        <w:t>Build the application with tools\build-wp0.cmd. Run tools\build-wp5.cmd for the existing knowledge/link/review regressions and tools\build-wp6.cmd for publishing/translation regressions. A FAIL or nonzero exit means the corresponding check failed. See docs\phase1-glossary-validation.json and the glossary completion note for actual current run evidence.</w:t>
       </w:r>
     </w:p>
     <w:p>
-      <w:r>
-        <w:t>Migration 008 adds the persistent translation cache key and JSON record. Cache identity covers saved knowledge revision, requested locales, provider pack hash, source segments and terminology. SQL state overlays cached metadata so source invalidation remains authoritative after database reopen. Approval requires current source review, complete translated prose and a named reviewer; it never updates authoritative source text.</w:t>
+      <w:pPr>
+        <w:pStyle w:val="Heading1"/>
+      </w:pPr>
+      <w:r>
+        <w:t>Offline translation and localized publication</w:t>
       </w:r>
     </w:p>
     <w:p>
       <w:r>
-        <w:t>TDPHAtlasAdapter uses DAT.Runtime.LanguagePack plus its two copied core dependencies, original license and hashed snapshot provenance. Selected packs are bounded to 4 MiB, strictly UTF-8 and application scoped. Exact source phrase lookup and base-language fallback are explicit. Common code, SQL, paths and identifiers are protected during segmentation; unusual unmarked identifiers still need human review.</w:t>
+        <w:t>Migration 008 adds the persistent translation cache key and JSON record. Cache identity covers saved knowledge revision, requested locales, provider pack hash, source segments and terminology. SQL state overlays cached metadata so source invalidation remains authoritative after database reopen. Approval requires current source review, complete translated prose and a named reviewer; it never updates authoritative source text.</w:t>
       </w:r>
     </w:p>
     <w:p>
       <w:r>
-        <w:t>DPH-LEARNING-7 publication writes localization.json and, when a locale is requested, a hashed HTML page and Localized_Sections.docx. Verified exact-revision cache entries are eligible only while the canonical source section is reviewed and has no pending tasks. Redacted source bodies use source fallback. The supplementary document explicitly limits its scope to authored bodies.</w:t>
+        <w:t>TDPHAtlasAdapter uses DAT.Runtime.LanguagePack plus its two copied core dependencies, original license and hashed snapshot provenance. Selected packs are bounded to 4 MiB, strictly UTF-8 and application scoped. Exact source phrase lookup and base-language fallback are explicit. Common code, SQL, paths and identifiers are protected during segmentation; unusual unmarked identifiers still need human review.</w:t>
       </w:r>
     </w:p>
     <w:p>
       <w:r>
-        <w:t>Source navigation is separately opt-in. Only scoped captured text with matching source hashes is rendered as encoded, redacted HTML. Task masks use captured noncontainer ranges and original line starts. source-navigation.json records included line numbers and omission reasons. Validate checks scope, file identity, line order/counts, generations and disclosure metadata. No original source snapshot is shipped.</w:t>
+        <w:t>DPH-LEARNING-7 publication writes localization.json and, when a locale is requested, a hashed HTML page and Localized_Sections.docx. Verified exact-revision cache entries are eligible only while the canonical source section is reviewed and has no pending tasks. Redacted source bodies use source fallback. The supplementary document explicitly limits its scope to authored bodies.</w:t>
       </w:r>
     </w:p>
     <w:p>
-      <w:pPr>
-        <w:pStyle w:val="Heading1"/>
-      </w:pPr>
-      <w:r>
-        <w:t>Native validation and release evidence</w:t>
+      <w:r>
+        <w:t>Source navigation is separately opt-in. Only scoped captured text with matching source hashes is rendered as encoded, redacted HTML. Task masks use captured noncontainer ranges and original line starts. source-navigation.json records included line numbers and omission reasons. Validate checks scope, file identity, line order/counts, generations and disclosure metadata. No original source snapshot is shipped.</w:t>
       </w:r>
     </w:p>
     <w:p>
-      <w:r>
-        <w:t>The design-time Validate bundle controls dispatch validate_bundle to the worker before a database connection is required. The owner supplies an expected fingerprint independently. Stale rejection is default and historical inspection is an explicit qualification. Native reports distinguish integrity from human approval.</w:t>
+      <w:pPr>
+        <w:pStyle w:val="Heading1"/>
+      </w:pPr>
+      <w:r>
+        <w:t>Native validation and release evidence</w:t>
       </w:r>
     </w:p>
     <w:p>
       <w:r>
-        <w:t>The Win32 project enables DCC_LargeAddressAware in its IDE project options. The hardening and learning harnesses use the equivalent PE flag. The expanded pinned corpus exposed an out-of-memory failure after repeated captures and native workspace loading under the former address limit. Keep memory measurements and actual large-corpus validation with this change; the linker flag does not make memory consumption unbounded or establish a release budget.</w:t>
+        <w:t>The design-time Validate bundle controls dispatch validate_bundle to the worker before a database connection is required. The owner supplies an expected fingerprint independently. Stale rejection is default and historical inspection is an explicit qualification. Native reports distinguish integrity from human approval.</w:t>
       </w:r>
     </w:p>
     <w:p>
       <w:r>
-        <w:t>Run tools\validate-wp7.ps1 elevated for the pinned reference hardening suite and before/after hash proof. It reads the current schema constant rather than an obsolete hardcoded version. The suite measures full capture, cached open, reassessment, message-pump gaps and peak process working set on recorded hardware. Measurements require owner-agreed budgets before release acceptance.</w:t>
+        <w:t>The Win32 project enables DCC_LargeAddressAware in its IDE project options. The hardening and learning harnesses use the equivalent PE flag. The expanded pinned corpus exposed an out-of-memory failure after repeated captures and native workspace loading under the former address limit. Keep memory measurements and actual large-corpus validation with this change; the linker flag does not make memory consumption unbounded or establish a release budget.</w:t>
       </w:r>
     </w:p>
     <w:p>
       <w:r>
-        <w:t>The independent first-time programmer and source-review worksheet is docs\WP7_Maintenance_Exercise.txt. Preserve actual participant answers, source citations, uncertainty judgments, assistance, timings and defects. Do not substitute automated tests or prepared instructions for AC-25 or independent explanation review.</w:t>
+        <w:t>Run tools\validate-wp7.ps1 elevated for the pinned reference hardening suite and before/after hash proof. It reads the current schema constant rather than an obsolete hardcoded version. The suite measures full capture, cached open, reassessment, message-pump gaps and peak process working set on recorded hardware. Measurements require owner-agreed budgets before release acceptance.</w:t>
       </w:r>
     </w:p>
     <w:p>
-      <w:pPr>
-        <w:pStyle w:val="Heading1"/>
-      </w:pPr>
-      <w:r>
-        <w:t>Structured project profile contract</w:t>
+      <w:r>
+        <w:t>The independent first-time programmer and source-review worksheet is docs\WP7_Maintenance_Exercise.txt. Preserve actual participant answers, source citations, uncertainty judgments, assistance, timings and defects. Do not substitute automated tests or prepared instructions for AC-25 or independent explanation review.</w:t>
       </w:r>
     </w:p>
     <w:p>
-      <w:r>
-        <w:t>TDPHWorkspaceView.ProjectMembers projects captured syntax files into a selected-scope catalog without filesystem discovery. DPH.UI.Main.fmx defines separate Known databases and Selected project subpages, with a native list and evidence memo. Program, library and package declarations retain source references; project properties and references retain captured values and child conditions. Parent conditions may apply even when a child has none recorded. tests\DPH.Tests.ProjectCatalog.dpr checks a selected group, missing referenced project, output kinds, settings, native selection and input immutability.</w:t>
+      <w:pPr>
+        <w:pStyle w:val="Heading1"/>
+      </w:pPr>
+      <w:r>
+        <w:t>Structured project profile contract</w:t>
       </w:r>
     </w:p>
     <w:p>
       <w:r>
-        <w:t>Migration 009 adds an object-valued structured_json field to append-only knowledge revisions. TDPHProjectProfile validates 15 known text fields, required purpose and attribution, per-field bounds and a 64 KiB record bound. SaveKnowledge enforces stable project scope, title, kind and generated body, prevents ordinary-record conversion, duplicate profiles and loss of typed data, and preserves structured fields during named review and continuity revisions. Publication decodes typed metadata before recursive redaction, including revision history.</w:t>
+        <w:t>TDPHWorkspaceView.ProjectMembers projects captured syntax files into a selected-scope catalog without filesystem discovery. DPH.UI.Main.fmx defines separate Known databases and Selected project subpages, with a native list and evidence memo. Program, library and package declarations retain source references; project properties and references retain captured values and child conditions. Parent conditions may apply even when a child has none recorded. tests\DPH.Tests.ProjectCatalog.dpr checks a selected group, missing referenced project, output kinds, settings, native selection and input immutability.</w:t>
       </w:r>
     </w:p>
     <w:p>
       <w:r>
-        <w:t>DPH.UI.ProjectProfile.fmx defines every editor control at design time. Apply returns an attributed draft to the existing Knowledge save pipeline. It does not bypass unsaved-edit guards or automatically approve information. tests\DPH.Tests.Phase1.dpr verifies persistence, review, stale editors, history, field bounds and native form behavior; publishing regressions check canonical, HTML and DOCX inclusion.</w:t>
+        <w:t>Migration 009 adds an object-valued structured_json field to append-only knowledge revisions. TDPHProjectProfile validates 15 known text fields, required purpose and attribution, per-field bounds and a 64 KiB record bound. SaveKnowledge enforces stable project scope, title, kind and generated body, prevents ordinary-record conversion, duplicate profiles and loss of typed data, and preserves structured fields during named review and continuity revisions. Publication decodes typed metadata before recursive redaction, including revision history.</w:t>
       </w:r>
     </w:p>
     <w:p>
-      <w:pPr>
-        <w:pStyle w:val="Heading1"/>
-      </w:pPr>
-      <w:r>
-        <w:t>Quality analysis and revision comparison</w:t>
+      <w:r>
+        <w:t>DPH.UI.ProjectProfile.fmx defines every editor control at design time. Apply returns an attributed draft to the existing Knowledge save pipeline. It does not bypass unsaved-edit guards or automatically approve information. tests\DPH.Tests.Phase1.dpr verifies persistence, review, stale editors, history, field bounds and native form behavior; publishing regressions check canonical, HTML and DOCX inclusion.</w:t>
       </w:r>
     </w:p>
     <w:p>
-      <w:r>
-        <w:t>DPH.Analysis.Quality emits DPH-QUALITY-1 evidence during workspace capture. Routine metrics, eligible token-body equality, conservative missing-inbound and disconnected-CFG findings, and iterative call-graph strongly connected components use captured inputs only. The worker invalidates an older connected cache without this analyzer version. All findings remain qualified candidates.</w:t>
+      <w:pPr>
+        <w:pStyle w:val="Heading1"/>
+      </w:pPr>
+      <w:r>
+        <w:t>Quality analysis and revision comparison</w:t>
       </w:r>
     </w:p>
     <w:p>
       <w:r>
-        <w:t>DPH.Workspace.Comparison compares two hash-verified retained captures from the same project database. It rejects differing selection and syntax or semantic analyzer contracts. Deterministic identity indexes distinguish file changes, symbol additions or removals, captured structure changes and file-only changes. Routine-local flow numbering avoids global node-number shifts. Results use filtered 200-row pages; individual structure displays are limited to 4000 characters with full-content structure hashes and explicit truncation.</w:t>
+        <w:t>DPH.Analysis.Quality emits DPH-QUALITY-1 evidence during workspace capture. Routine metrics, eligible token-body equality, conservative missing-inbound and disconnected-CFG findings, and iterative call-graph strongly connected components use captured inputs only. The worker invalidates an older connected cache without this analyzer version. All findings remain qualified candidates.</w:t>
       </w:r>
     </w:p>
     <w:p>
       <w:r>
-        <w:t>Comparison runs on the existing background worker. It reads retained database artifacts rather than current selected source files. Native comparison controls and evidence panes are declared in DPH.UI.Main.fmx. tests\DPH.Tests.Comparison.dpr checks literal-expression changes, unchanged neighboring routines, flow-edge rewiring, identity changes, contract rejection, pages, native panes, worker loading and missing caches.</w:t>
+        <w:t>DPH.Workspace.Comparison compares two hash-verified retained captures from the same project database. It rejects differing selection and syntax or semantic analyzer contracts. Deterministic identity indexes distinguish file changes, symbol additions or removals, captured structure changes and file-only changes. Routine-local flow numbering avoids global node-number shifts. Results use filtered 200-row pages; individual structure displays are limited to 4000 characters with full-content structure hashes and explicit truncation.</w:t>
       </w:r>
     </w:p>
     <w:p>
       <w:r>
-        <w:t>The Phase 1 traceability ledger preserves the supplied requirements and limitations. Source comparison remains partial until optional historical source retention supports actual source-text differences; captured structural comparison must never be described as reconstructing those bytes. Human business answers and independent first-time-user acceptance remain separate evidence.</w:t>
+        <w:t>Comparison runs on the existing background worker. It reads retained database artifacts rather than current selected source files. Native comparison controls and evidence panes are declared in DPH.UI.Main.fmx. tests\DPH.Tests.Comparison.dpr checks literal-expression changes, unchanged neighboring routines, flow-edge rewiring, identity changes, contract rejection, pages, native panes, worker loading and missing caches.</w:t>
       </w:r>
     </w:p>
     <w:p>
-      <w:pPr>
-        <w:pStyle w:val="Heading1"/>
-      </w:pPr>
-      <w:r>
-        <w:t>Keyboard inspector implementation and validation</w:t>
+      <w:r>
+        <w:t>The Phase 1 traceability ledger preserves the supplied requirements and limitations. Source comparison remains partial until optional historical source retention supports actual source-text differences; captured structural comparison must never be described as reconstructing those bytes. Human business answers and independent first-time-user acceptance remain separate evidence.</w:t>
       </w:r>
     </w:p>
     <w:p>
-      <w:r>
-        <w:t>DPH.Workspace.Keyboard projects captured text and binary form IR into source-backed component records. A parent-property index avoids rescanning every node for every component. Rows retain generation, source SHA256, line and byte extents, original property values and explicit unknowns. Numeric shortcut conflicts normalize decimal and hexadecimal codes within each serialized form; sibling TabOrder conflicts stay parent-local. Unique local action declarations carry separate shortcut and source evidence; uncaptured custom, external or inherited actions remain unresolved.</w:t>
+      <w:pPr>
+        <w:pStyle w:val="Heading1"/>
+      </w:pPr>
+      <w:r>
+        <w:t>Keyboard inspector implementation and validation</w:t>
       </w:r>
     </w:p>
     <w:p>
       <w:r>
-        <w:t>DPH.UI.Main.fmx serializes every inspector control for the IDE and Object Inspector. The Keyboard and focus page filters readable evidence, sorts sibling TabOrder and uses 250-row pages. TDPHKeyboardInspector.ReadSource enforces matching generation, source identity, project containment, text availability and source hash before navigation. Binary forms expose byte evidence without applying it as text lines. No database migration or target execution is required.</w:t>
+        <w:t>DPH.Workspace.Keyboard projects captured text and binary form IR into source-backed component records. A parent-property index avoids rescanning every node for every component. Rows retain generation, source SHA256, line and byte extents, original property values and explicit unknowns. Numeric shortcut conflicts normalize decimal and hexadecimal codes within each serialized form; sibling TabOrder conflicts stay parent-local. Unique local action declarations carry separate shortcut and source evidence; uncaptured custom, external or inherited actions remain unresolved.</w:t>
       </w:r>
     </w:p>
     <w:p>
       <w:r>
-        <w:t>Run tools\build-keyboard.cmd elevated for 55 checks covering actual DFM, FMX and binary parsing, action references, conflicts, unknown states, readable key names, source safeguards, pagination and instantiated FMX controls. The fixed bin/keyboard-validation fixture avoids new disposable test folders. Native PaintTo images in docs/phase1-keyboard-workspace.png and phase1-keyboard-compact.png are renders of running DPH controls, not target application screenshots. The suite checks the user catalog and selected fixture bytes remain unchanged. Runtime traversal and accessibility conformance require separate observed tests.</w:t>
+        <w:t>DPH.UI.Main.fmx serializes every inspector control for the IDE and Object Inspector. The Keyboard and focus page filters readable evidence, sorts sibling TabOrder and uses 250-row pages. TDPHKeyboardInspector.ReadSource enforces matching generation, source identity, project containment, text availability and source hash before navigation. Binary forms expose byte evidence without applying it as text lines. No database migration or target execution is required.</w:t>
       </w:r>
     </w:p>
     <w:p>
-      <w:pPr>
-        <w:pStyle w:val="Heading1"/>
-      </w:pPr>
-      <w:r>
-        <w:t>Command inventory implementation and validation</w:t>
+      <w:r>
+        <w:t>Run tools\build-keyboard.cmd elevated for 55 checks covering actual DFM, FMX and binary parsing, action references, conflicts, unknown states, readable key names, source safeguards, pagination and instantiated FMX controls. The fixed bin/keyboard-validation fixture avoids new disposable test folders. Native PaintTo images in docs/phase1-keyboard-workspace.png and phase1-keyboard-compact.png are renders of running DPH controls, not target application screenshots. The suite checks the user catalog and selected fixture bytes remain unchanged. Runtime traversal and accessibility conformance require separate observed tests.</w:t>
       </w:r>
     </w:p>
     <w:p>
-      <w:r>
-        <w:t>DPH.Workspace.Commands builds command records from captured component properties in DPH.Workspace.Keyboard. It indexes parent paths and form-local names, distinguishes duplicate or incompatible references, and joins event properties by exact source and byte location to confirmed static semantic binds relationships. Every handler retains its own identity, relation, target symbol, range and source fingerprint. Action handlers and shortcuts remain separate from component declarations. Uncaptured inheritance, custom classes, external names and runtime dispatch remain qualified.</w:t>
+      <w:pPr>
+        <w:pStyle w:val="Heading1"/>
+      </w:pPr>
+      <w:r>
+        <w:t>Command inventory implementation and validation</w:t>
       </w:r>
     </w:p>
     <w:p>
       <w:r>
-        <w:t>DPH.UI.Main.fmx serializes the Menus and commands controls for IDE editing. The page provides kind and text filters, 250-row pagination, independent handler selection and Explain navigation. Command and action source commands reuse the keyboard inspector generation, hash and containment checks. Loading a replacement capture clears stale command rows. No database migration or target execution is required.</w:t>
+        <w:t>DPH.Workspace.Commands builds command records from captured component properties in DPH.Workspace.Keyboard. It indexes parent paths and form-local names, distinguishes duplicate or incompatible references, and joins event properties by exact source and byte location to confirmed static semantic binds relationships. Every handler retains its own identity, relation, target symbol, range and source fingerprint. Action handlers and shortcuts remain separate from component declarations. Uncaptured inheritance, custom classes, external names and runtime dispatch remain qualified.</w:t>
       </w:r>
     </w:p>
     <w:p>
       <w:r>
-        <w:t>Run tools\build-commands.cmd elevated for 62 focused checks using actual text DFM, binary DFM, FMX and semantic fixtures, including action execute/update, own click and popup handlers, unresolved references, pagination and native control bindings. Fixtures reuse bin/commands-validation. Source bytes and the user catalog are checked unchanged. PaintTo renders in docs/phase1-commands-workspace.png and phase1-commands-compact.png show running DPH controls, not screenshots of the target app. The keyboard suite remains a required regression because both inspectors share captured properties.</w:t>
+        <w:t>DPH.UI.Main.fmx serializes the Menus and commands controls for IDE editing. The page provides kind and text filters, 250-row pagination, independent handler selection and Explain navigation. Command and action source commands reuse the keyboard inspector generation, hash and containment checks. Loading a replacement capture clears stale command rows. No database migration or target execution is required.</w:t>
       </w:r>
     </w:p>
     <w:p>
-      <w:pPr>
-        <w:pStyle w:val="Heading1"/>
-      </w:pPr>
-      <w:r>
-        <w:t>Dynamic control relationships and validation</w:t>
+      <w:r>
+        <w:t>Run tools\build-commands.cmd elevated for 62 focused checks using actual text DFM, binary DFM, FMX and semantic fixtures, including action execute/update, own click and popup handlers, unresolved references, pagination and native control bindings. Fixtures reuse bin/commands-validation. Source bytes and the user catalog are checked unchanged. PaintTo renders in docs/phase1-commands-workspace.png and phase1-commands-compact.png show running DPH controls, not screenshots of the target app. The keyboard suite remains a required regression because both inspectors share captured properties.</w:t>
       </w:r>
     </w:p>
     <w:p>
-      <w:r>
-        <w:t>DPH.Analysis.Symbols captures constructor owner expressions and visual property assignments in reusable routine facts. VisualSites joins them to creation-site identities after cache reuse. Unique same-routine result handles support parent and event declaration references. Multiple constructors, intervening variable writes and assignments before construction prevent attribution and retain ambiguous evidence. Target declarations are inferred lexical references; no runtime binding or reaching-definition proof is claimed. DPHSemanticVersion is DPH-WP3-12 so older semantic captures are reassessed.</w:t>
+      <w:pPr>
+        <w:pStyle w:val="Heading1"/>
+      </w:pPr>
+      <w:r>
+        <w:t>Dynamic control relationships and validation</w:t>
       </w:r>
     </w:p>
     <w:p>
       <w:r>
-        <w:t>DPH.Workspace.DynamicControls indexes the new relationships and retains target symbols, source hashes, ranges, conditions and generation evidence. DPH.UI.Main.fmx serializes the filter, 250-row list, details, relationship selector and Explain controls for the IDE. Changing capture clears stale rows. Missing references disable Explain reference. Creation sites remain distinct from serialized form geometry and observed screenshot evidence. No database migration or runtime UI construction was introduced.</w:t>
+        <w:t>DPH.Analysis.Symbols captures constructor owner expressions and visual property assignments in reusable routine facts. VisualSites joins them to creation-site identities after cache reuse. Unique same-routine result handles support parent and event declaration references. Multiple constructors, intervening variable writes and assignments before construction prevent attribution and retain ambiguous evidence. Target declarations are inferred lexical references; no runtime binding or reaching-definition proof is claimed. DPHSemanticVersion is DPH-WP3-12 so older semantic captures are reassessed.</w:t>
       </w:r>
     </w:p>
     <w:p>
       <w:r>
+        <w:t>DPH.Workspace.DynamicControls indexes the new relationships and retains target symbols, source hashes, ranges, conditions and generation evidence. DPH.UI.Main.fmx serializes the filter, 250-row list, details, relationship selector and Explain controls for the IDE. Changing capture clears stale rows. Missing references disable Explain reference. Creation sites remain distinct from serialized form geometry and observed screenshot evidence. No database migration or runtime UI construction was introduced.</w:t>
+      </w:r>
+    </w:p>
+    <w:p>
+      <w:r>
         <w:t>Run tools\build-dynamic-controls.cmd elevated for 51 focused checks, including owner/parent/event references, nil, reused and overwritten variables, pre-creation assignments, unresolved expressions, loop counts, exact fresh/cache equivalence, pagination and native form controls. Fixtures reuse bin/dynamic-validation. The 134-check semantic regression and 62-check command inventory regression pass, as does the actual app and FMX resource baseline. Historical phase evidence is preserved; current semantic evidence is docs/phase1-dynamic-semantics-regression.json. Native normal/compact PaintTo renders show running DPH controls, not target screenshots.</w:t>
+      </w:r>
+    </w:p>
+    <w:p>
+      <w:pPr>
+        <w:pStyle w:val="Heading1"/>
+      </w:pPr>
+      <w:r>
+        <w:t>Layout rule explanations and validation</w:t>
+      </w:r>
+    </w:p>
+    <w:p>
+      <w:r>
+        <w:t>DPH.Workspace.Keyboard retains captured layout properties from reusable form IR. DPH.Workspace.LayoutRules indexes serialized parents and their properties, preserving source ranges and fingerprints. Describe explains VCL and FMX alignment modes, exact anchor tokens, geometry, spacing, constraints, autosizing, wrapping, DPI and resize handlers. Missing values and inheritance are qualified rather than filled with assumed defaults. Contradictory captured minimum and maximum constraints produce a review candidate.</w:t>
+      </w:r>
+    </w:p>
+    <w:p>
+      <w:r>
+        <w:t>Educational numeric examples require explicit recognized anchors and Align=None on an ordinary child with a captured parent. Opposing edges change size by the parent delta; trailing edges change position; leading edges preserve position. Unanchored axes, active or unknown alignment, inherited and root objects suppress unsupported calculations. These are basic rule examples and never an evaluation of the VCL or FMX layout engine or final runtime geometry.</w:t>
+      </w:r>
+    </w:p>
+    <w:p>
+      <w:r>
+        <w:t>DPH.UI.Main.fmx serializes every new page control for IDE editing. The page provides full-text filtering, 250-row pagination, validated positive or negative deltas, source verification, a horizontal command bar and a resizable scrollable detail area. Replacing a capture clears stale rows. No target classes are instantiated and no database migration or analyzer-version change is needed.</w:t>
+      </w:r>
+    </w:p>
+    <w:p>
+      <w:r>
+        <w:t>Run tools\build-layout-rules.cmd elevated for 56 focused checks using real text DFM, binary DFM and FMX parsing and native form controls. Tests cover growth and shrinking, active alignment, inherited and missing rules, unknown anchors, constraints, parent properties, navigation guards, pagination, invalid and overflowing input and normal and compact layouts. Fixtures reuse bin/layout-validation. The shared keyboard suite passes 55 checks and dynamic controls passes 51. The actual application and FMX baseline pass. Native PaintTo renders show DPH controls rather than target screenshots.</w:t>
       </w:r>
     </w:p>
     <w:p>
@@ -1827,7 +1870,7 @@
           <w:rFonts w:ascii="Consolas" w:hAnsi="Consolas"/>
           <w:sz w:val="16"/>
         </w:rPr>
-        <w:t>752100b4862ae04fe9ded675b00503408a50611131d4d16cef5b562252f4e5e0</w:t>
+        <w:t>f947529798b4d22eff8cea2df02aa865e0ebcdff6ff6fb2b09811700ab0a8b90</w:t>
       </w:r>
     </w:p>
     <w:p>
@@ -1967,7 +2010,27 @@
           <w:rFonts w:ascii="Consolas" w:hAnsi="Consolas"/>
           <w:sz w:val="16"/>
         </w:rPr>
-        <w:t>cdc6b41289cebbe37601be3306a9cbefed08928c2730e24747093ab0f48fbcc4</w:t>
+        <w:t>6e854d724e8360e3d5015d63077744636cf88f33eed5c9fcff175ef01e0f9923</w:t>
+      </w:r>
+    </w:p>
+    <w:p>
+      <w:pPr>
+        <w:keepNext/>
+      </w:pPr>
+      <w:r>
+        <w:t>DPH.Workspace.LayoutRules.pas</w:t>
+      </w:r>
+    </w:p>
+    <w:p>
+      <w:pPr>
+        <w:spacing w:after="60"/>
+      </w:pPr>
+      <w:r>
+        <w:rPr>
+          <w:rFonts w:ascii="Consolas" w:hAnsi="Consolas"/>
+          <w:sz w:val="16"/>
+        </w:rPr>
+        <w:t>02dcd1a040fc209a557281fe8150bd40a59291a18a08fa48d5e07065dbac1c49</w:t>
       </w:r>
     </w:p>
     <w:p>
@@ -2047,7 +2110,7 @@
           <w:rFonts w:ascii="Consolas" w:hAnsi="Consolas"/>
           <w:sz w:val="16"/>
         </w:rPr>
-        <w:t>dc8422d60872f852d3a9f5bcc186fcd9a8c373c7872f11798028e20ba7b3fb35</w:t>
+        <w:t>c91f72eb5c52378b73abe777e9af9656a1d168a965e7214737aa58d8f0111e49</w:t>
       </w:r>
     </w:p>
     <w:p>
@@ -2127,7 +2190,7 @@
           <w:rFonts w:ascii="Consolas" w:hAnsi="Consolas"/>
           <w:sz w:val="16"/>
         </w:rPr>
-        <w:t>8b9a2ca58594c21eeae0d9dda4018f2453a4383f93d3270358a94c74962f979e</w:t>
+        <w:t>42e5ab20a8b11f9764da478d0ea5147c616e75d1a03dd705d7af39c36f917d84</w:t>
       </w:r>
     </w:p>
     <w:sectPr>

</xml_diff>

<commit_message>
Implement component dependency records and inspector for requirement 04.17
</commit_message>
<xml_diff>
--- a/docs/guides/DPH_Engineering_Guide.docx
+++ b/docs/guides/DPH_Engineering_Guide.docx
@@ -52,13 +52,25 @@
       </w:r>
     </w:p>
     <w:p>
-      <w:r>
+      <w:pPr>
+        <w:spacing w:before="0" w:after="0" w:line="20" w:lineRule="exact"/>
+      </w:pPr>
+      <w:r>
+        <w:rPr>
+          <w:sz w:val="2"/>
+        </w:rPr>
         <w:fldChar w:fldCharType="begin"/>
         <w:instrText xml:space="preserve"> TOC \o "1-1" \h \z \u </w:instrText>
       </w:r>
     </w:p>
     <w:p>
-      <w:r>
+      <w:pPr>
+        <w:spacing w:before="0" w:after="0" w:line="20" w:lineRule="exact"/>
+      </w:pPr>
+      <w:r>
+        <w:rPr>
+          <w:sz w:val="2"/>
+        </w:rPr>
         <w:fldChar w:fldCharType="separate"/>
       </w:r>
     </w:p>
@@ -70,9 +82,15 @@
         </w:tabs>
       </w:pPr>
       <w:r>
+        <w:rPr>
+          <w:sz w:val="20"/>
+        </w:rPr>
         <w:t>Architecture and boundaries</w:t>
       </w:r>
       <w:r>
+        <w:rPr>
+          <w:sz w:val="20"/>
+        </w:rPr>
         <w:tab/>
         <w:t>3</w:t>
       </w:r>
@@ -85,9 +103,15 @@
         </w:tabs>
       </w:pPr>
       <w:r>
+        <w:rPr>
+          <w:sz w:val="20"/>
+        </w:rPr>
         <w:t>Rework and acceptance status</w:t>
       </w:r>
       <w:r>
+        <w:rPr>
+          <w:sz w:val="20"/>
+        </w:rPr>
         <w:tab/>
         <w:t>3</w:t>
       </w:r>
@@ -100,9 +124,15 @@
         </w:tabs>
       </w:pPr>
       <w:r>
+        <w:rPr>
+          <w:sz w:val="20"/>
+        </w:rPr>
         <w:t>Build and deployment</w:t>
       </w:r>
       <w:r>
+        <w:rPr>
+          <w:sz w:val="20"/>
+        </w:rPr>
         <w:tab/>
         <w:t>3</w:t>
       </w:r>
@@ -115,9 +145,15 @@
         </w:tabs>
       </w:pPr>
       <w:r>
+        <w:rPr>
+          <w:sz w:val="20"/>
+        </w:rPr>
         <w:t>Input acquisition and project scope</w:t>
       </w:r>
       <w:r>
+        <w:rPr>
+          <w:sz w:val="20"/>
+        </w:rPr>
         <w:tab/>
         <w:t>4</w:t>
       </w:r>
@@ -130,9 +166,15 @@
         </w:tabs>
       </w:pPr>
       <w:r>
+        <w:rPr>
+          <w:sz w:val="20"/>
+        </w:rPr>
         <w:t>Syntax contracts and limits</w:t>
       </w:r>
       <w:r>
+        <w:rPr>
+          <w:sz w:val="20"/>
+        </w:rPr>
         <w:tab/>
         <w:t>4</w:t>
       </w:r>
@@ -145,9 +187,15 @@
         </w:tabs>
       </w:pPr>
       <w:r>
+        <w:rPr>
+          <w:sz w:val="20"/>
+        </w:rPr>
         <w:t>Symbols and typed relationships</w:t>
       </w:r>
       <w:r>
+        <w:rPr>
+          <w:sz w:val="20"/>
+        </w:rPr>
         <w:tab/>
         <w:t>4</w:t>
       </w:r>
@@ -160,9 +208,15 @@
         </w:tabs>
       </w:pPr>
       <w:r>
+        <w:rPr>
+          <w:sz w:val="20"/>
+        </w:rPr>
         <w:t>Control flow and impact</w:t>
       </w:r>
       <w:r>
+        <w:rPr>
+          <w:sz w:val="20"/>
+        </w:rPr>
         <w:tab/>
         <w:t>5</w:t>
       </w:r>
@@ -175,9 +229,15 @@
         </w:tabs>
       </w:pPr>
       <w:r>
+        <w:rPr>
+          <w:sz w:val="20"/>
+        </w:rPr>
         <w:t>SQLite generations and durability</w:t>
       </w:r>
       <w:r>
+        <w:rPr>
+          <w:sz w:val="20"/>
+        </w:rPr>
         <w:tab/>
         <w:t>5</w:t>
       </w:r>
@@ -190,9 +250,15 @@
         </w:tabs>
       </w:pPr>
       <w:r>
+        <w:rPr>
+          <w:sz w:val="20"/>
+        </w:rPr>
         <w:t>Evidence and immutable history</w:t>
       </w:r>
       <w:r>
+        <w:rPr>
+          <w:sz w:val="20"/>
+        </w:rPr>
         <w:tab/>
         <w:t>5</w:t>
       </w:r>
@@ -205,9 +271,15 @@
         </w:tabs>
       </w:pPr>
       <w:r>
+        <w:rPr>
+          <w:sz w:val="20"/>
+        </w:rPr>
         <w:t>Background coordination and cached views</w:t>
       </w:r>
       <w:r>
+        <w:rPr>
+          <w:sz w:val="20"/>
+        </w:rPr>
         <w:tab/>
         <w:t>6</w:t>
       </w:r>
@@ -220,9 +292,15 @@
         </w:tabs>
       </w:pPr>
       <w:r>
+        <w:rPr>
+          <w:sz w:val="20"/>
+        </w:rPr>
         <w:t>FMX navigation and visualization</w:t>
       </w:r>
       <w:r>
+        <w:rPr>
+          <w:sz w:val="20"/>
+        </w:rPr>
         <w:tab/>
         <w:t>6</w:t>
       </w:r>
@@ -235,9 +313,15 @@
         </w:tabs>
       </w:pPr>
       <w:r>
+        <w:rPr>
+          <w:sz w:val="20"/>
+        </w:rPr>
         <w:t>Curated knowledge and review</w:t>
       </w:r>
       <w:r>
+        <w:rPr>
+          <w:sz w:val="20"/>
+        </w:rPr>
         <w:tab/>
         <w:t>6</w:t>
       </w:r>
@@ -250,9 +334,15 @@
         </w:tabs>
       </w:pPr>
       <w:r>
+        <w:rPr>
+          <w:sz w:val="20"/>
+        </w:rPr>
         <w:t>Canonical publication and privacy</w:t>
       </w:r>
       <w:r>
+        <w:rPr>
+          <w:sz w:val="20"/>
+        </w:rPr>
         <w:tab/>
         <w:t>7</w:t>
       </w:r>
@@ -265,9 +355,15 @@
         </w:tabs>
       </w:pPr>
       <w:r>
+        <w:rPr>
+          <w:sz w:val="20"/>
+        </w:rPr>
         <w:t>HTML guides and bundle validation</w:t>
       </w:r>
       <w:r>
+        <w:rPr>
+          <w:sz w:val="20"/>
+        </w:rPr>
         <w:tab/>
         <w:t>7</w:t>
       </w:r>
@@ -280,9 +376,15 @@
         </w:tabs>
       </w:pPr>
       <w:r>
+        <w:rPr>
+          <w:sz w:val="20"/>
+        </w:rPr>
         <w:t>Translation boundary</w:t>
       </w:r>
       <w:r>
+        <w:rPr>
+          <w:sz w:val="20"/>
+        </w:rPr>
         <w:tab/>
         <w:t>8</w:t>
       </w:r>
@@ -295,9 +397,15 @@
         </w:tabs>
       </w:pPr>
       <w:r>
+        <w:rPr>
+          <w:sz w:val="20"/>
+        </w:rPr>
         <w:t>Verification and release discipline</w:t>
       </w:r>
       <w:r>
+        <w:rPr>
+          <w:sz w:val="20"/>
+        </w:rPr>
         <w:tab/>
         <w:t>8</w:t>
       </w:r>
@@ -310,9 +418,15 @@
         </w:tabs>
       </w:pPr>
       <w:r>
+        <w:rPr>
+          <w:sz w:val="20"/>
+        </w:rPr>
         <w:t>Current semantic cache and extended evidence</w:t>
       </w:r>
       <w:r>
+        <w:rPr>
+          <w:sz w:val="20"/>
+        </w:rPr>
         <w:tab/>
         <w:t>8</w:t>
       </w:r>
@@ -325,9 +439,15 @@
         </w:tabs>
       </w:pPr>
       <w:r>
+        <w:rPr>
+          <w:sz w:val="20"/>
+        </w:rPr>
         <w:t>Current schema and authored document contracts</w:t>
       </w:r>
       <w:r>
+        <w:rPr>
+          <w:sz w:val="20"/>
+        </w:rPr>
         <w:tab/>
         <w:t>9</w:t>
       </w:r>
@@ -340,9 +460,15 @@
         </w:tabs>
       </w:pPr>
       <w:r>
+        <w:rPr>
+          <w:sz w:val="20"/>
+        </w:rPr>
         <w:t>Native review and learning projections</w:t>
       </w:r>
       <w:r>
+        <w:rPr>
+          <w:sz w:val="20"/>
+        </w:rPr>
         <w:tab/>
         <w:t>9</w:t>
       </w:r>
@@ -355,9 +481,15 @@
         </w:tabs>
       </w:pPr>
       <w:r>
+        <w:rPr>
+          <w:sz w:val="20"/>
+        </w:rPr>
         <w:t>Saved observation persistence</w:t>
       </w:r>
       <w:r>
+        <w:rPr>
+          <w:sz w:val="20"/>
+        </w:rPr>
         <w:tab/>
         <w:t>9</w:t>
       </w:r>
@@ -370,9 +502,15 @@
         </w:tabs>
       </w:pPr>
       <w:r>
+        <w:rPr>
+          <w:sz w:val="20"/>
+        </w:rPr>
         <w:t>Regression commands and evidence</w:t>
       </w:r>
       <w:r>
+        <w:rPr>
+          <w:sz w:val="20"/>
+        </w:rPr>
         <w:tab/>
         <w:t>10</w:t>
       </w:r>
@@ -385,9 +523,15 @@
         </w:tabs>
       </w:pPr>
       <w:r>
+        <w:rPr>
+          <w:sz w:val="20"/>
+        </w:rPr>
         <w:t>Rebuild and inspect these manuals</w:t>
       </w:r>
       <w:r>
+        <w:rPr>
+          <w:sz w:val="20"/>
+        </w:rPr>
         <w:tab/>
         <w:t>10</w:t>
       </w:r>
@@ -400,9 +544,15 @@
         </w:tabs>
       </w:pPr>
       <w:r>
+        <w:rPr>
+          <w:sz w:val="20"/>
+        </w:rPr>
         <w:t>Business glossary implementation and checks</w:t>
       </w:r>
       <w:r>
+        <w:rPr>
+          <w:sz w:val="20"/>
+        </w:rPr>
         <w:tab/>
         <w:t>11</w:t>
       </w:r>
@@ -415,9 +565,15 @@
         </w:tabs>
       </w:pPr>
       <w:r>
+        <w:rPr>
+          <w:sz w:val="20"/>
+        </w:rPr>
         <w:t>Offline translation and localized publication</w:t>
       </w:r>
       <w:r>
+        <w:rPr>
+          <w:sz w:val="20"/>
+        </w:rPr>
         <w:tab/>
         <w:t>11</w:t>
       </w:r>
@@ -430,9 +586,15 @@
         </w:tabs>
       </w:pPr>
       <w:r>
+        <w:rPr>
+          <w:sz w:val="20"/>
+        </w:rPr>
         <w:t>Native validation and release evidence</w:t>
       </w:r>
       <w:r>
+        <w:rPr>
+          <w:sz w:val="20"/>
+        </w:rPr>
         <w:tab/>
         <w:t>12</w:t>
       </w:r>
@@ -445,9 +607,15 @@
         </w:tabs>
       </w:pPr>
       <w:r>
+        <w:rPr>
+          <w:sz w:val="20"/>
+        </w:rPr>
         <w:t>Structured project profile contract</w:t>
       </w:r>
       <w:r>
+        <w:rPr>
+          <w:sz w:val="20"/>
+        </w:rPr>
         <w:tab/>
         <w:t>12</w:t>
       </w:r>
@@ -460,9 +628,15 @@
         </w:tabs>
       </w:pPr>
       <w:r>
+        <w:rPr>
+          <w:sz w:val="20"/>
+        </w:rPr>
         <w:t>Quality analysis and revision comparison</w:t>
       </w:r>
       <w:r>
+        <w:rPr>
+          <w:sz w:val="20"/>
+        </w:rPr>
         <w:tab/>
         <w:t>13</w:t>
       </w:r>
@@ -475,9 +649,15 @@
         </w:tabs>
       </w:pPr>
       <w:r>
+        <w:rPr>
+          <w:sz w:val="20"/>
+        </w:rPr>
         <w:t>Keyboard inspector implementation and validation</w:t>
       </w:r>
       <w:r>
+        <w:rPr>
+          <w:sz w:val="20"/>
+        </w:rPr>
         <w:tab/>
         <w:t>13</w:t>
       </w:r>
@@ -490,9 +670,15 @@
         </w:tabs>
       </w:pPr>
       <w:r>
+        <w:rPr>
+          <w:sz w:val="20"/>
+        </w:rPr>
         <w:t>Command inventory implementation and validation</w:t>
       </w:r>
       <w:r>
+        <w:rPr>
+          <w:sz w:val="20"/>
+        </w:rPr>
         <w:tab/>
         <w:t>14</w:t>
       </w:r>
@@ -505,9 +691,15 @@
         </w:tabs>
       </w:pPr>
       <w:r>
+        <w:rPr>
+          <w:sz w:val="20"/>
+        </w:rPr>
         <w:t>Dynamic control relationships and validation</w:t>
       </w:r>
       <w:r>
+        <w:rPr>
+          <w:sz w:val="20"/>
+        </w:rPr>
         <w:tab/>
         <w:t>14</w:t>
       </w:r>
@@ -520,9 +712,15 @@
         </w:tabs>
       </w:pPr>
       <w:r>
+        <w:rPr>
+          <w:sz w:val="20"/>
+        </w:rPr>
         <w:t>Layout rule explanations and validation</w:t>
       </w:r>
       <w:r>
+        <w:rPr>
+          <w:sz w:val="20"/>
+        </w:rPr>
         <w:tab/>
         <w:t>14</w:t>
       </w:r>
@@ -535,15 +733,48 @@
         </w:tabs>
       </w:pPr>
       <w:r>
-        <w:t>Source and revision evidence</w:t>
-      </w:r>
-      <w:r>
+        <w:rPr>
+          <w:sz w:val="20"/>
+        </w:rPr>
+        <w:t>Component dependencies and attributed metadata</w:t>
+      </w:r>
+      <w:r>
+        <w:rPr>
+          <w:sz w:val="20"/>
+        </w:rPr>
         <w:tab/>
         <w:t>15</w:t>
       </w:r>
     </w:p>
     <w:p>
-      <w:r>
+      <w:pPr>
+        <w:spacing w:after="0" w:line="240" w:lineRule="auto"/>
+        <w:tabs>
+          <w:tab w:val="right" w:leader="dot" w:pos="9360"/>
+        </w:tabs>
+      </w:pPr>
+      <w:r>
+        <w:rPr>
+          <w:sz w:val="20"/>
+        </w:rPr>
+        <w:t>Source and revision evidence</w:t>
+      </w:r>
+      <w:r>
+        <w:rPr>
+          <w:sz w:val="20"/>
+        </w:rPr>
+        <w:tab/>
+        <w:t>16</w:t>
+      </w:r>
+    </w:p>
+    <w:p>
+      <w:pPr>
+        <w:spacing w:before="0" w:after="0" w:line="20" w:lineRule="exact"/>
+      </w:pPr>
+      <w:r>
+        <w:rPr>
+          <w:sz w:val="2"/>
+        </w:rPr>
         <w:fldChar w:fldCharType="end"/>
       </w:r>
     </w:p>
@@ -1298,6 +1529,34 @@
     <w:p>
       <w:r>
         <w:t>Run tools\build-layout-rules.cmd elevated for 56 focused checks using real text DFM, binary DFM and FMX parsing and native form controls. Tests cover growth and shrinking, active alignment, inherited and missing rules, unknown anchors, constraints, parent properties, navigation guards, pagination, invalid and overflowing input and normal and compact layouts. Fixtures reuse bin/layout-validation. The shared keyboard suite passes 55 checks and dynamic controls passes 51. The actual application and FMX baseline pass. Native PaintTo renders show DPH controls rather than target screenshots.</w:t>
+      </w:r>
+    </w:p>
+    <w:p>
+      <w:pPr>
+        <w:pStyle w:val="Heading1"/>
+      </w:pPr>
+      <w:r>
+        <w:t>Component dependencies and attributed metadata</w:t>
+      </w:r>
+    </w:p>
+    <w:p>
+      <w:r>
+        <w:t>DPH.Workspace.ComponentDependencies indexes captured semantic class declarations by qualified and simple name, joins them to serialized component classes, and preserves declaration ranges, source hashes, conditions and generation context. Unique matches are inferred candidates rather than compiler binding proof. Ambiguous or absent matches remain explicit. Captured package declarations and unavailable inputs are context only; membership, installed versions and vendor origin are not inferred.</w:t>
+      </w:r>
+    </w:p>
+    <w:p>
+      <w:r>
+        <w:t>DPH.Knowledge.ComponentDependency validates bounded text fields for class identity, declaring unit, package/product, vendor, version/configuration, support and evidence. DPH.UI.ComponentDependency.fmx serializes the scrollable editor. The main page controls are serialized in DPH.UI.Main.fmx. Apply prepares a structured Knowledge draft; the existing worker saves it with attributed revision history. Storage enforces identity, canonical readable body, case-insensitive uniqueness, stale-edit protection and retention of structured fields. No schema migration or target component loading was added.</w:t>
+      </w:r>
+    </w:p>
+    <w:p>
+      <w:r>
+        <w:t>Saved dependency records participate in Knowledge search, engineering publication, evidence links and named review. Editing reopens review; retired class identities stay reserved. The native inspector refreshes saved metadata without changing source resolution, protects unsaved drafts, provides 250-row pagination, filtering, source guards and unique-candidate Explain navigation.</w:t>
+      </w:r>
+    </w:p>
+    <w:p>
+      <w:r>
+        <w:t>Run tools\build-component-dependencies.cmd elevated for the focused acceptance suite. It exercises real text/binary DFM and FMX parsing, unique/ambiguous/unresolved class candidates, captured packages and missing dependencies, SQLite reopen/history/review/search/publication, duplicate and stale edits, native editor round trips, navigation, pagination and compact layout. Fixtures reuse bin/component-dependencies-validation. Native PaintTo images show DPH controls rather than target screenshots. Shared Knowledge, glossary and layout regressions and the actual app/FMX baseline are also checked. See the current completion record for measured counts.</w:t>
       </w:r>
     </w:p>
     <w:p>
@@ -1478,6 +1737,26 @@
         <w:keepNext/>
       </w:pPr>
       <w:r>
+        <w:t>DPH.Knowledge.ComponentDependency.pas</w:t>
+      </w:r>
+    </w:p>
+    <w:p>
+      <w:pPr>
+        <w:spacing w:after="60"/>
+      </w:pPr>
+      <w:r>
+        <w:rPr>
+          <w:rFonts w:ascii="Consolas" w:hAnsi="Consolas"/>
+          <w:sz w:val="16"/>
+        </w:rPr>
+        <w:t>56bc1021fffa88f0a383a2a159b4c74328d735597f72c3ec279ef42ad2a2ccbe</w:t>
+      </w:r>
+    </w:p>
+    <w:p>
+      <w:pPr>
+        <w:keepNext/>
+      </w:pPr>
+      <w:r>
         <w:t>DPH.Knowledge.Glossary.pas</w:t>
       </w:r>
     </w:p>
@@ -1810,7 +2089,7 @@
           <w:rFonts w:ascii="Consolas" w:hAnsi="Consolas"/>
           <w:sz w:val="16"/>
         </w:rPr>
-        <w:t>28e17f8ddf7196406c1ef3ba3ce4e98959764660d90cec0ae7abd249d0043b33</w:t>
+        <w:t>1904d4f0adae6dc01e76dad3d8e3797613b5e3da49da194587cad68de30ed25e</w:t>
       </w:r>
     </w:p>
     <w:p>
@@ -1838,6 +2117,26 @@
         <w:keepNext/>
       </w:pPr>
       <w:r>
+        <w:t>DPH.UI.ComponentDependency.pas</w:t>
+      </w:r>
+    </w:p>
+    <w:p>
+      <w:pPr>
+        <w:spacing w:after="60"/>
+      </w:pPr>
+      <w:r>
+        <w:rPr>
+          <w:rFonts w:ascii="Consolas" w:hAnsi="Consolas"/>
+          <w:sz w:val="16"/>
+        </w:rPr>
+        <w:t>dc711088afbccd032f4511b9fe3da95b89640b505edb1868ee7b47c7e2a64682</w:t>
+      </w:r>
+    </w:p>
+    <w:p>
+      <w:pPr>
+        <w:keepNext/>
+      </w:pPr>
+      <w:r>
         <w:t>DPH.UI.Glossary.pas</w:t>
       </w:r>
     </w:p>
@@ -1870,7 +2169,7 @@
           <w:rFonts w:ascii="Consolas" w:hAnsi="Consolas"/>
           <w:sz w:val="16"/>
         </w:rPr>
-        <w:t>f947529798b4d22eff8cea2df02aa865e0ebcdff6ff6fb2b09811700ab0a8b90</w:t>
+        <w:t>5192c72930649deabd242c2dc0ad86479d014d7ec60f5bf0829c91040ef036df</w:t>
       </w:r>
     </w:p>
     <w:p>
@@ -1958,6 +2257,26 @@
         <w:keepNext/>
       </w:pPr>
       <w:r>
+        <w:t>DPH.Workspace.ComponentDependencies.pas</w:t>
+      </w:r>
+    </w:p>
+    <w:p>
+      <w:pPr>
+        <w:spacing w:after="60"/>
+      </w:pPr>
+      <w:r>
+        <w:rPr>
+          <w:rFonts w:ascii="Consolas" w:hAnsi="Consolas"/>
+          <w:sz w:val="16"/>
+        </w:rPr>
+        <w:t>7d57eb7884d6e521414379a24ce9e64aa2816beca6de650b86828a16fc33af2b</w:t>
+      </w:r>
+    </w:p>
+    <w:p>
+      <w:pPr>
+        <w:keepNext/>
+      </w:pPr>
+      <w:r>
         <w:t>DPH.Workspace.DynamicControls.pas</w:t>
       </w:r>
     </w:p>
@@ -2110,7 +2429,7 @@
           <w:rFonts w:ascii="Consolas" w:hAnsi="Consolas"/>
           <w:sz w:val="16"/>
         </w:rPr>
-        <w:t>c91f72eb5c52378b73abe777e9af9656a1d168a965e7214737aa58d8f0111e49</w:t>
+        <w:t>e76c41e654e8ab13fc38044808c7d64512d98a441c841a78d5f8ebc2c20c373c</w:t>
       </w:r>
     </w:p>
     <w:p>
@@ -2158,6 +2477,26 @@
         <w:keepNext/>
       </w:pPr>
       <w:r>
+        <w:t>DPH.UI.ComponentDependency.fmx</w:t>
+      </w:r>
+    </w:p>
+    <w:p>
+      <w:pPr>
+        <w:spacing w:after="60"/>
+      </w:pPr>
+      <w:r>
+        <w:rPr>
+          <w:rFonts w:ascii="Consolas" w:hAnsi="Consolas"/>
+          <w:sz w:val="16"/>
+        </w:rPr>
+        <w:t>3b604fcf033e37ebda4aa6968e1a9e6ffe11bf40416fac5fbdd39fa2599d7862</w:t>
+      </w:r>
+    </w:p>
+    <w:p>
+      <w:pPr>
+        <w:keepNext/>
+      </w:pPr>
+      <w:r>
         <w:t>DelphiProjectHandoff.dpr</w:t>
       </w:r>
     </w:p>
@@ -2190,7 +2529,7 @@
           <w:rFonts w:ascii="Consolas" w:hAnsi="Consolas"/>
           <w:sz w:val="16"/>
         </w:rPr>
-        <w:t>42e5ab20a8b11f9764da478d0ea5147c616e75d1a03dd705d7af39c36f917d84</w:t>
+        <w:t>0d0bd4c51bac9da250e52a8e9bef4baffb2bd4ab7107ac302337a1a7da673b4d</w:t>
       </w:r>
     </w:p>
     <w:sectPr>

</xml_diff>

<commit_message>
Implement form inheritance and embedded frame origins for requirement 04.18
</commit_message>
<xml_diff>
--- a/docs/guides/DPH_Engineering_Guide.docx
+++ b/docs/guides/DPH_Engineering_Guide.docx
@@ -757,7 +757,7 @@
         <w:rPr>
           <w:sz w:val="20"/>
         </w:rPr>
-        <w:t>Source and revision evidence</w:t>
+        <w:t>Resolve form inheritance and frame overlays</w:t>
       </w:r>
       <w:r>
         <w:rPr>
@@ -769,6 +769,27 @@
     </w:p>
     <w:p>
       <w:pPr>
+        <w:spacing w:after="0" w:line="240" w:lineRule="auto"/>
+        <w:tabs>
+          <w:tab w:val="right" w:leader="dot" w:pos="9360"/>
+        </w:tabs>
+      </w:pPr>
+      <w:r>
+        <w:rPr>
+          <w:sz w:val="20"/>
+        </w:rPr>
+        <w:t>Source and revision evidence</w:t>
+      </w:r>
+      <w:r>
+        <w:rPr>
+          <w:sz w:val="20"/>
+        </w:rPr>
+        <w:tab/>
+        <w:t>16</w:t>
+      </w:r>
+    </w:p>
+    <w:p>
+      <w:pPr>
         <w:spacing w:before="0" w:after="0" w:line="20" w:lineRule="exact"/>
       </w:pPr>
       <w:r>
@@ -1564,6 +1585,34 @@
         <w:pStyle w:val="Heading1"/>
       </w:pPr>
       <w:r>
+        <w:t>Resolve form inheritance and frame overlays</w:t>
+      </w:r>
+    </w:p>
+    <w:p>
+      <w:r>
+        <w:t>DPH.Workspace.FormInheritance resolves an inherited root through its matching Pascal class and captured ancestor relationship to one captured base form. Class-to-form lookup uses the matching Pascal file stem and serialized root class. Qualified frame names disambiguate duplicate simple names. Custom resource mappings and aliases may remain unresolved. Conditional ancestry is not silently selected.</w:t>
+      </w:r>
+    </w:p>
+    <w:p>
+      <w:r>
+        <w:t>The resolver copies base trees, matches inherited children by parent-local name and class, appends local property histories and expands inline frames independently. Root renaming preserves base children. Properties and events retain exact source/hash/range, condition and generation origins. Collection bodies retain serialized history but collection-item merging is explicitly unresolved. Missing bases, duplicate matches, partial forms, incompatible/orphan overlays and cycles are diagnosed.</w:t>
+      </w:r>
+    </w:p>
+    <w:p>
+      <w:r>
+        <w:t>The IDE-editable main FMX page provides filter, 250-row pagination, an origin selector, source navigation and a scrollable explanation. Origin source uses the existing generation/fingerprint/root/text checks. Capture replacement clears borrowed rows and origin pointers. No storage schema changes, target instantiation or runtime UI construction were introduced. Existing form-design and other inspector qualifications remain in effect.</w:t>
+      </w:r>
+    </w:p>
+    <w:p>
+      <w:r>
+        <w:t>Run tools\build-form-inheritance.cmd elevated. Controlled fixtures reuse bin/form-inheritance-validation and exercise actual text/binary DFM and FMX parsing, three-level form inheritance, inherited and separately overridden frames, qualified ambiguity, event nil, conditional/missing ancestry, cycles, provenance, cache equivalence, source safeguards and native compact layout. Work is bounded to 64 levels, 200000 component visits and 100000 output rows; gaps are capped at 10000 per selected form. Exceeded work/output bounds reject the overlay operation explicitly. Native PaintTo renders show DPH controls, not target screenshots.</w:t>
+      </w:r>
+    </w:p>
+    <w:p>
+      <w:pPr>
+        <w:pStyle w:val="Heading1"/>
+      </w:pPr>
+      <w:r>
         <w:t>Source and revision evidence</w:t>
       </w:r>
     </w:p>
@@ -1575,8 +1624,12 @@
     <w:p>
       <w:pPr>
         <w:keepNext/>
-      </w:pPr>
-      <w:r>
+        <w:spacing w:after="0"/>
+      </w:pPr>
+      <w:r>
+        <w:rPr>
+          <w:sz w:val="18"/>
+        </w:rPr>
         <w:t>DPH.Analysis.Async.pas</w:t>
       </w:r>
     </w:p>
@@ -1595,8 +1648,12 @@
     <w:p>
       <w:pPr>
         <w:keepNext/>
-      </w:pPr>
-      <w:r>
+        <w:spacing w:after="0"/>
+      </w:pPr>
+      <w:r>
+        <w:rPr>
+          <w:sz w:val="18"/>
+        </w:rPr>
         <w:t>DPH.Analysis.Explanations.pas</w:t>
       </w:r>
     </w:p>
@@ -1615,8 +1672,12 @@
     <w:p>
       <w:pPr>
         <w:keepNext/>
-      </w:pPr>
-      <w:r>
+        <w:spacing w:after="0"/>
+      </w:pPr>
+      <w:r>
+        <w:rPr>
+          <w:sz w:val="18"/>
+        </w:rPr>
         <w:t>DPH.Analysis.Flow.pas</w:t>
       </w:r>
     </w:p>
@@ -1635,8 +1696,12 @@
     <w:p>
       <w:pPr>
         <w:keepNext/>
-      </w:pPr>
-      <w:r>
+        <w:spacing w:after="0"/>
+      </w:pPr>
+      <w:r>
+        <w:rPr>
+          <w:sz w:val="18"/>
+        </w:rPr>
         <w:t>DPH.Analysis.Model.pas</w:t>
       </w:r>
     </w:p>
@@ -1655,8 +1720,12 @@
     <w:p>
       <w:pPr>
         <w:keepNext/>
-      </w:pPr>
-      <w:r>
+        <w:spacing w:after="0"/>
+      </w:pPr>
+      <w:r>
+        <w:rPr>
+          <w:sz w:val="18"/>
+        </w:rPr>
         <w:t>DPH.Analysis.Persistence.pas</w:t>
       </w:r>
     </w:p>
@@ -1675,8 +1744,12 @@
     <w:p>
       <w:pPr>
         <w:keepNext/>
-      </w:pPr>
-      <w:r>
+        <w:spacing w:after="0"/>
+      </w:pPr>
+      <w:r>
+        <w:rPr>
+          <w:sz w:val="18"/>
+        </w:rPr>
         <w:t>DPH.Analysis.Quality.pas</w:t>
       </w:r>
     </w:p>
@@ -1695,8 +1768,12 @@
     <w:p>
       <w:pPr>
         <w:keepNext/>
-      </w:pPr>
-      <w:r>
+        <w:spacing w:after="0"/>
+      </w:pPr>
+      <w:r>
+        <w:rPr>
+          <w:sz w:val="18"/>
+        </w:rPr>
         <w:t>DPH.Analysis.SQL.pas</w:t>
       </w:r>
     </w:p>
@@ -1715,8 +1792,12 @@
     <w:p>
       <w:pPr>
         <w:keepNext/>
-      </w:pPr>
-      <w:r>
+        <w:spacing w:after="0"/>
+      </w:pPr>
+      <w:r>
+        <w:rPr>
+          <w:sz w:val="18"/>
+        </w:rPr>
         <w:t>DPH.Analysis.Symbols.pas</w:t>
       </w:r>
     </w:p>
@@ -1735,8 +1816,12 @@
     <w:p>
       <w:pPr>
         <w:keepNext/>
-      </w:pPr>
-      <w:r>
+        <w:spacing w:after="0"/>
+      </w:pPr>
+      <w:r>
+        <w:rPr>
+          <w:sz w:val="18"/>
+        </w:rPr>
         <w:t>DPH.Knowledge.ComponentDependency.pas</w:t>
       </w:r>
     </w:p>
@@ -1755,8 +1840,12 @@
     <w:p>
       <w:pPr>
         <w:keepNext/>
-      </w:pPr>
-      <w:r>
+        <w:spacing w:after="0"/>
+      </w:pPr>
+      <w:r>
+        <w:rPr>
+          <w:sz w:val="18"/>
+        </w:rPr>
         <w:t>DPH.Knowledge.Glossary.pas</w:t>
       </w:r>
     </w:p>
@@ -1775,8 +1864,12 @@
     <w:p>
       <w:pPr>
         <w:keepNext/>
-      </w:pPr>
-      <w:r>
+        <w:spacing w:after="0"/>
+      </w:pPr>
+      <w:r>
+        <w:rPr>
+          <w:sz w:val="18"/>
+        </w:rPr>
         <w:t>DPH.Knowledge.ProjectProfile.pas</w:t>
       </w:r>
     </w:p>
@@ -1795,8 +1888,12 @@
     <w:p>
       <w:pPr>
         <w:keepNext/>
-      </w:pPr>
-      <w:r>
+        <w:spacing w:after="0"/>
+      </w:pPr>
+      <w:r>
+        <w:rPr>
+          <w:sz w:val="18"/>
+        </w:rPr>
         <w:t>DPH.Parse.Forms.pas</w:t>
       </w:r>
     </w:p>
@@ -1815,8 +1912,12 @@
     <w:p>
       <w:pPr>
         <w:keepNext/>
-      </w:pPr>
-      <w:r>
+        <w:spacing w:after="0"/>
+      </w:pPr>
+      <w:r>
+        <w:rPr>
+          <w:sz w:val="18"/>
+        </w:rPr>
         <w:t>DPH.Parse.Lexer.pas</w:t>
       </w:r>
     </w:p>
@@ -1835,8 +1936,12 @@
     <w:p>
       <w:pPr>
         <w:keepNext/>
-      </w:pPr>
-      <w:r>
+        <w:spacing w:after="0"/>
+      </w:pPr>
+      <w:r>
+        <w:rPr>
+          <w:sz w:val="18"/>
+        </w:rPr>
         <w:t>DPH.Parse.Model.pas</w:t>
       </w:r>
     </w:p>
@@ -1855,8 +1960,12 @@
     <w:p>
       <w:pPr>
         <w:keepNext/>
-      </w:pPr>
-      <w:r>
+        <w:spacing w:after="0"/>
+      </w:pPr>
+      <w:r>
+        <w:rPr>
+          <w:sz w:val="18"/>
+        </w:rPr>
         <w:t>DPH.Parse.Pascal.pas</w:t>
       </w:r>
     </w:p>
@@ -1875,8 +1984,12 @@
     <w:p>
       <w:pPr>
         <w:keepNext/>
-      </w:pPr>
-      <w:r>
+        <w:spacing w:after="0"/>
+      </w:pPr>
+      <w:r>
+        <w:rPr>
+          <w:sz w:val="18"/>
+        </w:rPr>
         <w:t>DPH.Parse.Preprocessor.pas</w:t>
       </w:r>
     </w:p>
@@ -1895,8 +2008,12 @@
     <w:p>
       <w:pPr>
         <w:keepNext/>
-      </w:pPr>
-      <w:r>
+        <w:spacing w:after="0"/>
+      </w:pPr>
+      <w:r>
+        <w:rPr>
+          <w:sz w:val="18"/>
+        </w:rPr>
         <w:t>DPH.Parse.Resources.pas</w:t>
       </w:r>
     </w:p>
@@ -1915,8 +2032,12 @@
     <w:p>
       <w:pPr>
         <w:keepNext/>
-      </w:pPr>
-      <w:r>
+        <w:spacing w:after="0"/>
+      </w:pPr>
+      <w:r>
+        <w:rPr>
+          <w:sz w:val="18"/>
+        </w:rPr>
         <w:t>DPH.Project.Analysis.pas</w:t>
       </w:r>
     </w:p>
@@ -1935,8 +2056,12 @@
     <w:p>
       <w:pPr>
         <w:keepNext/>
-      </w:pPr>
-      <w:r>
+        <w:spacing w:after="0"/>
+      </w:pPr>
+      <w:r>
+        <w:rPr>
+          <w:sz w:val="18"/>
+        </w:rPr>
         <w:t>DPH.Project.Inventory.pas</w:t>
       </w:r>
     </w:p>
@@ -1955,8 +2080,12 @@
     <w:p>
       <w:pPr>
         <w:keepNext/>
-      </w:pPr>
-      <w:r>
+        <w:spacing w:after="0"/>
+      </w:pPr>
+      <w:r>
+        <w:rPr>
+          <w:sz w:val="18"/>
+        </w:rPr>
         <w:t>DPH.Project.Source.pas</w:t>
       </w:r>
     </w:p>
@@ -1975,8 +2104,12 @@
     <w:p>
       <w:pPr>
         <w:keepNext/>
-      </w:pPr>
-      <w:r>
+        <w:spacing w:after="0"/>
+      </w:pPr>
+      <w:r>
+        <w:rPr>
+          <w:sz w:val="18"/>
+        </w:rPr>
         <w:t>DPH.Publish.BrowserPolicy.pas</w:t>
       </w:r>
     </w:p>
@@ -1995,8 +2128,12 @@
     <w:p>
       <w:pPr>
         <w:keepNext/>
-      </w:pPr>
-      <w:r>
+        <w:spacing w:after="0"/>
+      </w:pPr>
+      <w:r>
+        <w:rPr>
+          <w:sz w:val="18"/>
+        </w:rPr>
         <w:t>DPH.Publish.Export.pas</w:t>
       </w:r>
     </w:p>
@@ -2015,8 +2152,12 @@
     <w:p>
       <w:pPr>
         <w:keepNext/>
-      </w:pPr>
-      <w:r>
+        <w:spacing w:after="0"/>
+      </w:pPr>
+      <w:r>
+        <w:rPr>
+          <w:sz w:val="18"/>
+        </w:rPr>
         <w:t>DPH.Publish.Model.pas</w:t>
       </w:r>
     </w:p>
@@ -2035,8 +2176,12 @@
     <w:p>
       <w:pPr>
         <w:keepNext/>
-      </w:pPr>
-      <w:r>
+        <w:spacing w:after="0"/>
+      </w:pPr>
+      <w:r>
+        <w:rPr>
+          <w:sz w:val="18"/>
+        </w:rPr>
         <w:t>DPH.Publish.Translation.pas</w:t>
       </w:r>
     </w:p>
@@ -2055,8 +2200,12 @@
     <w:p>
       <w:pPr>
         <w:keepNext/>
-      </w:pPr>
-      <w:r>
+        <w:spacing w:after="0"/>
+      </w:pPr>
+      <w:r>
+        <w:rPr>
+          <w:sz w:val="18"/>
+        </w:rPr>
         <w:t>DPH.Storage.Backup.pas</w:t>
       </w:r>
     </w:p>
@@ -2075,8 +2224,12 @@
     <w:p>
       <w:pPr>
         <w:keepNext/>
-      </w:pPr>
-      <w:r>
+        <w:spacing w:after="0"/>
+      </w:pPr>
+      <w:r>
+        <w:rPr>
+          <w:sz w:val="18"/>
+        </w:rPr>
         <w:t>DPH.Storage.Database.pas</w:t>
       </w:r>
     </w:p>
@@ -2095,8 +2248,12 @@
     <w:p>
       <w:pPr>
         <w:keepNext/>
-      </w:pPr>
-      <w:r>
+        <w:spacing w:after="0"/>
+      </w:pPr>
+      <w:r>
+        <w:rPr>
+          <w:sz w:val="18"/>
+        </w:rPr>
         <w:t>DPH.Storage.Types.pas</w:t>
       </w:r>
     </w:p>
@@ -2115,8 +2272,12 @@
     <w:p>
       <w:pPr>
         <w:keepNext/>
-      </w:pPr>
-      <w:r>
+        <w:spacing w:after="0"/>
+      </w:pPr>
+      <w:r>
+        <w:rPr>
+          <w:sz w:val="18"/>
+        </w:rPr>
         <w:t>DPH.UI.ComponentDependency.pas</w:t>
       </w:r>
     </w:p>
@@ -2135,8 +2296,12 @@
     <w:p>
       <w:pPr>
         <w:keepNext/>
-      </w:pPr>
-      <w:r>
+        <w:spacing w:after="0"/>
+      </w:pPr>
+      <w:r>
+        <w:rPr>
+          <w:sz w:val="18"/>
+        </w:rPr>
         <w:t>DPH.UI.Glossary.pas</w:t>
       </w:r>
     </w:p>
@@ -2155,8 +2320,12 @@
     <w:p>
       <w:pPr>
         <w:keepNext/>
-      </w:pPr>
-      <w:r>
+        <w:spacing w:after="0"/>
+      </w:pPr>
+      <w:r>
+        <w:rPr>
+          <w:sz w:val="18"/>
+        </w:rPr>
         <w:t>DPH.UI.Main.pas</w:t>
       </w:r>
     </w:p>
@@ -2169,14 +2338,18 @@
           <w:rFonts w:ascii="Consolas" w:hAnsi="Consolas"/>
           <w:sz w:val="16"/>
         </w:rPr>
-        <w:t>5192c72930649deabd242c2dc0ad86479d014d7ec60f5bf0829c91040ef036df</w:t>
+        <w:t>52243ad5ff4b5e2d0f605c22fd3effca369072f3541239c8aad9b1fbccb1362b</w:t>
       </w:r>
     </w:p>
     <w:p>
       <w:pPr>
         <w:keepNext/>
-      </w:pPr>
-      <w:r>
+        <w:spacing w:after="0"/>
+      </w:pPr>
+      <w:r>
+        <w:rPr>
+          <w:sz w:val="18"/>
+        </w:rPr>
         <w:t>DPH.UI.ProjectProfile.pas</w:t>
       </w:r>
     </w:p>
@@ -2195,8 +2368,12 @@
     <w:p>
       <w:pPr>
         <w:keepNext/>
-      </w:pPr>
-      <w:r>
+        <w:spacing w:after="0"/>
+      </w:pPr>
+      <w:r>
+        <w:rPr>
+          <w:sz w:val="18"/>
+        </w:rPr>
         <w:t>DPH.Workspace.Catalog.pas</w:t>
       </w:r>
     </w:p>
@@ -2215,8 +2392,12 @@
     <w:p>
       <w:pPr>
         <w:keepNext/>
-      </w:pPr>
-      <w:r>
+        <w:spacing w:after="0"/>
+      </w:pPr>
+      <w:r>
+        <w:rPr>
+          <w:sz w:val="18"/>
+        </w:rPr>
         <w:t>DPH.Workspace.Commands.pas</w:t>
       </w:r>
     </w:p>
@@ -2235,8 +2416,12 @@
     <w:p>
       <w:pPr>
         <w:keepNext/>
-      </w:pPr>
-      <w:r>
+        <w:spacing w:after="0"/>
+      </w:pPr>
+      <w:r>
+        <w:rPr>
+          <w:sz w:val="18"/>
+        </w:rPr>
         <w:t>DPH.Workspace.Comparison.pas</w:t>
       </w:r>
     </w:p>
@@ -2255,8 +2440,12 @@
     <w:p>
       <w:pPr>
         <w:keepNext/>
-      </w:pPr>
-      <w:r>
+        <w:spacing w:after="0"/>
+      </w:pPr>
+      <w:r>
+        <w:rPr>
+          <w:sz w:val="18"/>
+        </w:rPr>
         <w:t>DPH.Workspace.ComponentDependencies.pas</w:t>
       </w:r>
     </w:p>
@@ -2275,8 +2464,12 @@
     <w:p>
       <w:pPr>
         <w:keepNext/>
-      </w:pPr>
-      <w:r>
+        <w:spacing w:after="0"/>
+      </w:pPr>
+      <w:r>
+        <w:rPr>
+          <w:sz w:val="18"/>
+        </w:rPr>
         <w:t>DPH.Workspace.DynamicControls.pas</w:t>
       </w:r>
     </w:p>
@@ -2295,8 +2488,36 @@
     <w:p>
       <w:pPr>
         <w:keepNext/>
-      </w:pPr>
-      <w:r>
+        <w:spacing w:after="0"/>
+      </w:pPr>
+      <w:r>
+        <w:rPr>
+          <w:sz w:val="18"/>
+        </w:rPr>
+        <w:t>DPH.Workspace.FormInheritance.pas</w:t>
+      </w:r>
+    </w:p>
+    <w:p>
+      <w:pPr>
+        <w:spacing w:after="60"/>
+      </w:pPr>
+      <w:r>
+        <w:rPr>
+          <w:rFonts w:ascii="Consolas" w:hAnsi="Consolas"/>
+          <w:sz w:val="16"/>
+        </w:rPr>
+        <w:t>b771383670720f9503454dc17f7d5e72ddd986a642fc526bc6aeeab6122129f8</w:t>
+      </w:r>
+    </w:p>
+    <w:p>
+      <w:pPr>
+        <w:keepNext/>
+        <w:spacing w:after="0"/>
+      </w:pPr>
+      <w:r>
+        <w:rPr>
+          <w:sz w:val="18"/>
+        </w:rPr>
         <w:t>DPH.Workspace.Graphs.pas</w:t>
       </w:r>
     </w:p>
@@ -2315,8 +2536,12 @@
     <w:p>
       <w:pPr>
         <w:keepNext/>
-      </w:pPr>
-      <w:r>
+        <w:spacing w:after="0"/>
+      </w:pPr>
+      <w:r>
+        <w:rPr>
+          <w:sz w:val="18"/>
+        </w:rPr>
         <w:t>DPH.Workspace.Keyboard.pas</w:t>
       </w:r>
     </w:p>
@@ -2335,8 +2560,12 @@
     <w:p>
       <w:pPr>
         <w:keepNext/>
-      </w:pPr>
-      <w:r>
+        <w:spacing w:after="0"/>
+      </w:pPr>
+      <w:r>
+        <w:rPr>
+          <w:sz w:val="18"/>
+        </w:rPr>
         <w:t>DPH.Workspace.LayoutRules.pas</w:t>
       </w:r>
     </w:p>
@@ -2355,8 +2584,12 @@
     <w:p>
       <w:pPr>
         <w:keepNext/>
-      </w:pPr>
-      <w:r>
+        <w:spacing w:after="0"/>
+      </w:pPr>
+      <w:r>
+        <w:rPr>
+          <w:sz w:val="18"/>
+        </w:rPr>
         <w:t>DPH.Workspace.Model.pas</w:t>
       </w:r>
     </w:p>
@@ -2375,8 +2608,12 @@
     <w:p>
       <w:pPr>
         <w:keepNext/>
-      </w:pPr>
-      <w:r>
+        <w:spacing w:after="0"/>
+      </w:pPr>
+      <w:r>
+        <w:rPr>
+          <w:sz w:val="18"/>
+        </w:rPr>
         <w:t>DPH.Workspace.Screen.pas</w:t>
       </w:r>
     </w:p>
@@ -2395,8 +2632,12 @@
     <w:p>
       <w:pPr>
         <w:keepNext/>
-      </w:pPr>
-      <w:r>
+        <w:spacing w:after="0"/>
+      </w:pPr>
+      <w:r>
+        <w:rPr>
+          <w:sz w:val="18"/>
+        </w:rPr>
         <w:t>DPH.Workspace.Worker.pas</w:t>
       </w:r>
     </w:p>
@@ -2415,8 +2656,12 @@
     <w:p>
       <w:pPr>
         <w:keepNext/>
-      </w:pPr>
-      <w:r>
+        <w:spacing w:after="0"/>
+      </w:pPr>
+      <w:r>
+        <w:rPr>
+          <w:sz w:val="18"/>
+        </w:rPr>
         <w:t>DPH.UI.Main.fmx</w:t>
       </w:r>
     </w:p>
@@ -2429,14 +2674,18 @@
           <w:rFonts w:ascii="Consolas" w:hAnsi="Consolas"/>
           <w:sz w:val="16"/>
         </w:rPr>
-        <w:t>e76c41e654e8ab13fc38044808c7d64512d98a441c841a78d5f8ebc2c20c373c</w:t>
+        <w:t>b9d6a25843541b0ae0d359ae40426d6a47b423758759c25a093921294ab18e90</w:t>
       </w:r>
     </w:p>
     <w:p>
       <w:pPr>
         <w:keepNext/>
-      </w:pPr>
-      <w:r>
+        <w:spacing w:after="0"/>
+      </w:pPr>
+      <w:r>
+        <w:rPr>
+          <w:sz w:val="18"/>
+        </w:rPr>
         <w:t>DPH.UI.ProjectProfile.fmx</w:t>
       </w:r>
     </w:p>
@@ -2455,8 +2704,12 @@
     <w:p>
       <w:pPr>
         <w:keepNext/>
-      </w:pPr>
-      <w:r>
+        <w:spacing w:after="0"/>
+      </w:pPr>
+      <w:r>
+        <w:rPr>
+          <w:sz w:val="18"/>
+        </w:rPr>
         <w:t>DPH.UI.Glossary.fmx</w:t>
       </w:r>
     </w:p>
@@ -2475,8 +2728,12 @@
     <w:p>
       <w:pPr>
         <w:keepNext/>
-      </w:pPr>
-      <w:r>
+        <w:spacing w:after="0"/>
+      </w:pPr>
+      <w:r>
+        <w:rPr>
+          <w:sz w:val="18"/>
+        </w:rPr>
         <w:t>DPH.UI.ComponentDependency.fmx</w:t>
       </w:r>
     </w:p>
@@ -2495,8 +2752,12 @@
     <w:p>
       <w:pPr>
         <w:keepNext/>
-      </w:pPr>
-      <w:r>
+        <w:spacing w:after="0"/>
+      </w:pPr>
+      <w:r>
+        <w:rPr>
+          <w:sz w:val="18"/>
+        </w:rPr>
         <w:t>DelphiProjectHandoff.dpr</w:t>
       </w:r>
     </w:p>
@@ -2515,8 +2776,12 @@
     <w:p>
       <w:pPr>
         <w:keepNext/>
-      </w:pPr>
-      <w:r>
+        <w:spacing w:after="0"/>
+      </w:pPr>
+      <w:r>
+        <w:rPr>
+          <w:sz w:val="18"/>
+        </w:rPr>
         <w:t>DelphiProjectHandoff.dproj</w:t>
       </w:r>
     </w:p>
@@ -2529,7 +2794,7 @@
           <w:rFonts w:ascii="Consolas" w:hAnsi="Consolas"/>
           <w:sz w:val="16"/>
         </w:rPr>
-        <w:t>0d0bd4c51bac9da250e52a8e9bef4baffb2bd4ab7107ac302337a1a7da673b4d</w:t>
+        <w:t>cb4511ddd11ddfdec7c99d7442f267eeff1026befab5994fceeecc56deb0bb95</w:t>
       </w:r>
     </w:p>
     <w:sectPr>

</xml_diff>

<commit_message>
Implement attributed action and business purpose records (04.19)
</commit_message>
<xml_diff>
--- a/docs/guides/DPH_Engineering_Guide.docx
+++ b/docs/guides/DPH_Engineering_Guide.docx
@@ -778,7 +778,7 @@
         <w:rPr>
           <w:sz w:val="20"/>
         </w:rPr>
-        <w:t>Source and revision evidence</w:t>
+        <w:t>Store attributed action purpose mappings</w:t>
       </w:r>
       <w:r>
         <w:rPr>
@@ -790,6 +790,27 @@
     </w:p>
     <w:p>
       <w:pPr>
+        <w:spacing w:after="0" w:line="240" w:lineRule="auto"/>
+        <w:tabs>
+          <w:tab w:val="right" w:leader="dot" w:pos="9360"/>
+        </w:tabs>
+      </w:pPr>
+      <w:r>
+        <w:rPr>
+          <w:sz w:val="20"/>
+        </w:rPr>
+        <w:t>Source and revision evidence</w:t>
+      </w:r>
+      <w:r>
+        <w:rPr>
+          <w:sz w:val="20"/>
+        </w:rPr>
+        <w:tab/>
+        <w:t>17</w:t>
+      </w:r>
+    </w:p>
+    <w:p>
+      <w:pPr>
         <w:spacing w:before="0" w:after="0" w:line="20" w:lineRule="exact"/>
       </w:pPr>
       <w:r>
@@ -1613,6 +1634,34 @@
         <w:pStyle w:val="Heading1"/>
       </w:pPr>
       <w:r>
+        <w:t>Store attributed action purpose mappings</w:t>
+      </w:r>
+    </w:p>
+    <w:p>
+      <w:r>
+        <w:t>DPH.Workspace.ActionPurposes derives candidate targets from the captured source path and parent-local component path. A case-insensitive SHA256 identity is stable across parser node-number changes. Duplicate paths remain ambiguous and disable Edit and Explain. A unique captured component range supplies its semantic object key; no runtime action or business intent is inferred. Project tasks use a GUID identity and no object link. Unmatched saved UI targets remain historical or unresolved.</w:t>
+      </w:r>
+    </w:p>
+    <w:p>
+      <w:r>
+        <w:t>DPH.Knowledge.ActionPurpose validates twelve bounded string fields, requires the name, purpose, steps, outcome and evidence, and derives the readable Knowledge body. DPH.Storage.Database preserves the record type, stable target identity, object scope, user_help kind, user document and user audience. Duplicate target records are refused, including retired identities. Ordinary Knowledge editing cannot discard structured fields; stale saves and reviews retain the existing concurrency protections.</w:t>
+      </w:r>
+    </w:p>
+    <w:p>
+      <w:r>
+        <w:t>DPH.UI.ActionPurpose.fmx and the Action purposes tab in DPH.UI.Main.fmx serialize every native control for IDE editing. Apply prepares the existing Knowledge draft and preserves its exact evidence links; Save persists it. Named review appends a revision; subsequent edits reopen review. Search and publication use the same attributed Knowledge record. Existing storage migrations suffice; no new schema or runtime UI construction is required.</w:t>
+      </w:r>
+    </w:p>
+    <w:p>
+      <w:r>
+        <w:t>Run tools/build-action-purposes.cmd elevated for parser, binary DFM, FMX, identity and ambiguity checks, database persistence, duplicate and stale protection, named review, history, search, exported bundle validation, HTML and user DOCX text, native editor Apply/Cancel, task drafts, filtering, pagination and compact layout. Fixtures reuse bin/action-purposes-validation. Native PaintTo images show real DPH controls; they are not screenshots of the analyzed application.</w:t>
+      </w:r>
+    </w:p>
+    <w:p>
+      <w:pPr>
+        <w:pStyle w:val="Heading1"/>
+      </w:pPr>
+      <w:r>
         <w:t>Source and revision evidence</w:t>
       </w:r>
     </w:p>
@@ -1635,7 +1684,7 @@
     </w:p>
     <w:p>
       <w:pPr>
-        <w:spacing w:after="60"/>
+        <w:spacing w:after="20"/>
       </w:pPr>
       <w:r>
         <w:rPr>
@@ -1659,7 +1708,7 @@
     </w:p>
     <w:p>
       <w:pPr>
-        <w:spacing w:after="60"/>
+        <w:spacing w:after="20"/>
       </w:pPr>
       <w:r>
         <w:rPr>
@@ -1683,7 +1732,7 @@
     </w:p>
     <w:p>
       <w:pPr>
-        <w:spacing w:after="60"/>
+        <w:spacing w:after="20"/>
       </w:pPr>
       <w:r>
         <w:rPr>
@@ -1707,7 +1756,7 @@
     </w:p>
     <w:p>
       <w:pPr>
-        <w:spacing w:after="60"/>
+        <w:spacing w:after="20"/>
       </w:pPr>
       <w:r>
         <w:rPr>
@@ -1731,7 +1780,7 @@
     </w:p>
     <w:p>
       <w:pPr>
-        <w:spacing w:after="60"/>
+        <w:spacing w:after="20"/>
       </w:pPr>
       <w:r>
         <w:rPr>
@@ -1755,7 +1804,7 @@
     </w:p>
     <w:p>
       <w:pPr>
-        <w:spacing w:after="60"/>
+        <w:spacing w:after="20"/>
       </w:pPr>
       <w:r>
         <w:rPr>
@@ -1779,7 +1828,7 @@
     </w:p>
     <w:p>
       <w:pPr>
-        <w:spacing w:after="60"/>
+        <w:spacing w:after="20"/>
       </w:pPr>
       <w:r>
         <w:rPr>
@@ -1803,7 +1852,7 @@
     </w:p>
     <w:p>
       <w:pPr>
-        <w:spacing w:after="60"/>
+        <w:spacing w:after="20"/>
       </w:pPr>
       <w:r>
         <w:rPr>
@@ -1822,12 +1871,36 @@
         <w:rPr>
           <w:sz w:val="18"/>
         </w:rPr>
+        <w:t>DPH.Knowledge.ActionPurpose.pas</w:t>
+      </w:r>
+    </w:p>
+    <w:p>
+      <w:pPr>
+        <w:spacing w:after="20"/>
+      </w:pPr>
+      <w:r>
+        <w:rPr>
+          <w:rFonts w:ascii="Consolas" w:hAnsi="Consolas"/>
+          <w:sz w:val="16"/>
+        </w:rPr>
+        <w:t>bd548e1d5bbb886d3d3f2b5ba59d1cd86144a92877eba20596f956582740573f</w:t>
+      </w:r>
+    </w:p>
+    <w:p>
+      <w:pPr>
+        <w:keepNext/>
+        <w:spacing w:after="0"/>
+      </w:pPr>
+      <w:r>
+        <w:rPr>
+          <w:sz w:val="18"/>
+        </w:rPr>
         <w:t>DPH.Knowledge.ComponentDependency.pas</w:t>
       </w:r>
     </w:p>
     <w:p>
       <w:pPr>
-        <w:spacing w:after="60"/>
+        <w:spacing w:after="20"/>
       </w:pPr>
       <w:r>
         <w:rPr>
@@ -1851,7 +1924,7 @@
     </w:p>
     <w:p>
       <w:pPr>
-        <w:spacing w:after="60"/>
+        <w:spacing w:after="20"/>
       </w:pPr>
       <w:r>
         <w:rPr>
@@ -1875,7 +1948,7 @@
     </w:p>
     <w:p>
       <w:pPr>
-        <w:spacing w:after="60"/>
+        <w:spacing w:after="20"/>
       </w:pPr>
       <w:r>
         <w:rPr>
@@ -1899,7 +1972,7 @@
     </w:p>
     <w:p>
       <w:pPr>
-        <w:spacing w:after="60"/>
+        <w:spacing w:after="20"/>
       </w:pPr>
       <w:r>
         <w:rPr>
@@ -1923,7 +1996,7 @@
     </w:p>
     <w:p>
       <w:pPr>
-        <w:spacing w:after="60"/>
+        <w:spacing w:after="20"/>
       </w:pPr>
       <w:r>
         <w:rPr>
@@ -1947,7 +2020,7 @@
     </w:p>
     <w:p>
       <w:pPr>
-        <w:spacing w:after="60"/>
+        <w:spacing w:after="20"/>
       </w:pPr>
       <w:r>
         <w:rPr>
@@ -1971,7 +2044,7 @@
     </w:p>
     <w:p>
       <w:pPr>
-        <w:spacing w:after="60"/>
+        <w:spacing w:after="20"/>
       </w:pPr>
       <w:r>
         <w:rPr>
@@ -1995,7 +2068,7 @@
     </w:p>
     <w:p>
       <w:pPr>
-        <w:spacing w:after="60"/>
+        <w:spacing w:after="20"/>
       </w:pPr>
       <w:r>
         <w:rPr>
@@ -2019,7 +2092,7 @@
     </w:p>
     <w:p>
       <w:pPr>
-        <w:spacing w:after="60"/>
+        <w:spacing w:after="20"/>
       </w:pPr>
       <w:r>
         <w:rPr>
@@ -2043,7 +2116,7 @@
     </w:p>
     <w:p>
       <w:pPr>
-        <w:spacing w:after="60"/>
+        <w:spacing w:after="20"/>
       </w:pPr>
       <w:r>
         <w:rPr>
@@ -2067,7 +2140,7 @@
     </w:p>
     <w:p>
       <w:pPr>
-        <w:spacing w:after="60"/>
+        <w:spacing w:after="20"/>
       </w:pPr>
       <w:r>
         <w:rPr>
@@ -2091,7 +2164,7 @@
     </w:p>
     <w:p>
       <w:pPr>
-        <w:spacing w:after="60"/>
+        <w:spacing w:after="20"/>
       </w:pPr>
       <w:r>
         <w:rPr>
@@ -2115,7 +2188,7 @@
     </w:p>
     <w:p>
       <w:pPr>
-        <w:spacing w:after="60"/>
+        <w:spacing w:after="20"/>
       </w:pPr>
       <w:r>
         <w:rPr>
@@ -2139,7 +2212,7 @@
     </w:p>
     <w:p>
       <w:pPr>
-        <w:spacing w:after="60"/>
+        <w:spacing w:after="20"/>
       </w:pPr>
       <w:r>
         <w:rPr>
@@ -2163,7 +2236,7 @@
     </w:p>
     <w:p>
       <w:pPr>
-        <w:spacing w:after="60"/>
+        <w:spacing w:after="20"/>
       </w:pPr>
       <w:r>
         <w:rPr>
@@ -2187,7 +2260,7 @@
     </w:p>
     <w:p>
       <w:pPr>
-        <w:spacing w:after="60"/>
+        <w:spacing w:after="20"/>
       </w:pPr>
       <w:r>
         <w:rPr>
@@ -2211,7 +2284,7 @@
     </w:p>
     <w:p>
       <w:pPr>
-        <w:spacing w:after="60"/>
+        <w:spacing w:after="20"/>
       </w:pPr>
       <w:r>
         <w:rPr>
@@ -2235,14 +2308,14 @@
     </w:p>
     <w:p>
       <w:pPr>
-        <w:spacing w:after="60"/>
+        <w:spacing w:after="20"/>
       </w:pPr>
       <w:r>
         <w:rPr>
           <w:rFonts w:ascii="Consolas" w:hAnsi="Consolas"/>
           <w:sz w:val="16"/>
         </w:rPr>
-        <w:t>1904d4f0adae6dc01e76dad3d8e3797613b5e3da49da194587cad68de30ed25e</w:t>
+        <w:t>62acdcbefdae51057f277c072c7d820798295da4b99f79a0705df25028389118</w:t>
       </w:r>
     </w:p>
     <w:p>
@@ -2259,7 +2332,7 @@
     </w:p>
     <w:p>
       <w:pPr>
-        <w:spacing w:after="60"/>
+        <w:spacing w:after="20"/>
       </w:pPr>
       <w:r>
         <w:rPr>
@@ -2278,12 +2351,36 @@
         <w:rPr>
           <w:sz w:val="18"/>
         </w:rPr>
+        <w:t>DPH.UI.ActionPurpose.pas</w:t>
+      </w:r>
+    </w:p>
+    <w:p>
+      <w:pPr>
+        <w:spacing w:after="20"/>
+      </w:pPr>
+      <w:r>
+        <w:rPr>
+          <w:rFonts w:ascii="Consolas" w:hAnsi="Consolas"/>
+          <w:sz w:val="16"/>
+        </w:rPr>
+        <w:t>6016874bdc24964ce2371431d77babc68f03a50f045e8d20e222e4989bcbf79d</w:t>
+      </w:r>
+    </w:p>
+    <w:p>
+      <w:pPr>
+        <w:keepNext/>
+        <w:spacing w:after="0"/>
+      </w:pPr>
+      <w:r>
+        <w:rPr>
+          <w:sz w:val="18"/>
+        </w:rPr>
         <w:t>DPH.UI.ComponentDependency.pas</w:t>
       </w:r>
     </w:p>
     <w:p>
       <w:pPr>
-        <w:spacing w:after="60"/>
+        <w:spacing w:after="20"/>
       </w:pPr>
       <w:r>
         <w:rPr>
@@ -2307,7 +2404,7 @@
     </w:p>
     <w:p>
       <w:pPr>
-        <w:spacing w:after="60"/>
+        <w:spacing w:after="20"/>
       </w:pPr>
       <w:r>
         <w:rPr>
@@ -2331,14 +2428,14 @@
     </w:p>
     <w:p>
       <w:pPr>
-        <w:spacing w:after="60"/>
+        <w:spacing w:after="20"/>
       </w:pPr>
       <w:r>
         <w:rPr>
           <w:rFonts w:ascii="Consolas" w:hAnsi="Consolas"/>
           <w:sz w:val="16"/>
         </w:rPr>
-        <w:t>52243ad5ff4b5e2d0f605c22fd3effca369072f3541239c8aad9b1fbccb1362b</w:t>
+        <w:t>4d591bea9ea684acbd96826d0a69363e3700b7c3c414daca8cf59684b74a51a1</w:t>
       </w:r>
     </w:p>
     <w:p>
@@ -2355,7 +2452,7 @@
     </w:p>
     <w:p>
       <w:pPr>
-        <w:spacing w:after="60"/>
+        <w:spacing w:after="20"/>
       </w:pPr>
       <w:r>
         <w:rPr>
@@ -2374,12 +2471,36 @@
         <w:rPr>
           <w:sz w:val="18"/>
         </w:rPr>
+        <w:t>DPH.Workspace.ActionPurposes.pas</w:t>
+      </w:r>
+    </w:p>
+    <w:p>
+      <w:pPr>
+        <w:spacing w:after="20"/>
+      </w:pPr>
+      <w:r>
+        <w:rPr>
+          <w:rFonts w:ascii="Consolas" w:hAnsi="Consolas"/>
+          <w:sz w:val="16"/>
+        </w:rPr>
+        <w:t>e720b935f3d9f38f07348bead5f21c9c9e3ec89ad102f4dae0c6e902c0a101e4</w:t>
+      </w:r>
+    </w:p>
+    <w:p>
+      <w:pPr>
+        <w:keepNext/>
+        <w:spacing w:after="0"/>
+      </w:pPr>
+      <w:r>
+        <w:rPr>
+          <w:sz w:val="18"/>
+        </w:rPr>
         <w:t>DPH.Workspace.Catalog.pas</w:t>
       </w:r>
     </w:p>
     <w:p>
       <w:pPr>
-        <w:spacing w:after="60"/>
+        <w:spacing w:after="20"/>
       </w:pPr>
       <w:r>
         <w:rPr>
@@ -2403,7 +2524,7 @@
     </w:p>
     <w:p>
       <w:pPr>
-        <w:spacing w:after="60"/>
+        <w:spacing w:after="20"/>
       </w:pPr>
       <w:r>
         <w:rPr>
@@ -2427,7 +2548,7 @@
     </w:p>
     <w:p>
       <w:pPr>
-        <w:spacing w:after="60"/>
+        <w:spacing w:after="20"/>
       </w:pPr>
       <w:r>
         <w:rPr>
@@ -2451,7 +2572,7 @@
     </w:p>
     <w:p>
       <w:pPr>
-        <w:spacing w:after="60"/>
+        <w:spacing w:after="20"/>
       </w:pPr>
       <w:r>
         <w:rPr>
@@ -2475,7 +2596,7 @@
     </w:p>
     <w:p>
       <w:pPr>
-        <w:spacing w:after="60"/>
+        <w:spacing w:after="20"/>
       </w:pPr>
       <w:r>
         <w:rPr>
@@ -2499,7 +2620,7 @@
     </w:p>
     <w:p>
       <w:pPr>
-        <w:spacing w:after="60"/>
+        <w:spacing w:after="20"/>
       </w:pPr>
       <w:r>
         <w:rPr>
@@ -2523,7 +2644,7 @@
     </w:p>
     <w:p>
       <w:pPr>
-        <w:spacing w:after="60"/>
+        <w:spacing w:after="20"/>
       </w:pPr>
       <w:r>
         <w:rPr>
@@ -2547,7 +2668,7 @@
     </w:p>
     <w:p>
       <w:pPr>
-        <w:spacing w:after="60"/>
+        <w:spacing w:after="20"/>
       </w:pPr>
       <w:r>
         <w:rPr>
@@ -2571,7 +2692,7 @@
     </w:p>
     <w:p>
       <w:pPr>
-        <w:spacing w:after="60"/>
+        <w:spacing w:after="20"/>
       </w:pPr>
       <w:r>
         <w:rPr>
@@ -2595,7 +2716,7 @@
     </w:p>
     <w:p>
       <w:pPr>
-        <w:spacing w:after="60"/>
+        <w:spacing w:after="20"/>
       </w:pPr>
       <w:r>
         <w:rPr>
@@ -2619,7 +2740,7 @@
     </w:p>
     <w:p>
       <w:pPr>
-        <w:spacing w:after="60"/>
+        <w:spacing w:after="20"/>
       </w:pPr>
       <w:r>
         <w:rPr>
@@ -2643,7 +2764,7 @@
     </w:p>
     <w:p>
       <w:pPr>
-        <w:spacing w:after="60"/>
+        <w:spacing w:after="20"/>
       </w:pPr>
       <w:r>
         <w:rPr>
@@ -2667,14 +2788,14 @@
     </w:p>
     <w:p>
       <w:pPr>
-        <w:spacing w:after="60"/>
+        <w:spacing w:after="20"/>
       </w:pPr>
       <w:r>
         <w:rPr>
           <w:rFonts w:ascii="Consolas" w:hAnsi="Consolas"/>
           <w:sz w:val="16"/>
         </w:rPr>
-        <w:t>b9d6a25843541b0ae0d359ae40426d6a47b423758759c25a093921294ab18e90</w:t>
+        <w:t>4d7d953c654ca15dc9529e17ca2a1bc6461a79dc972ad062ab7dc22c1f8742f4</w:t>
       </w:r>
     </w:p>
     <w:p>
@@ -2691,7 +2812,7 @@
     </w:p>
     <w:p>
       <w:pPr>
-        <w:spacing w:after="60"/>
+        <w:spacing w:after="20"/>
       </w:pPr>
       <w:r>
         <w:rPr>
@@ -2715,7 +2836,7 @@
     </w:p>
     <w:p>
       <w:pPr>
-        <w:spacing w:after="60"/>
+        <w:spacing w:after="20"/>
       </w:pPr>
       <w:r>
         <w:rPr>
@@ -2739,7 +2860,7 @@
     </w:p>
     <w:p>
       <w:pPr>
-        <w:spacing w:after="60"/>
+        <w:spacing w:after="20"/>
       </w:pPr>
       <w:r>
         <w:rPr>
@@ -2758,12 +2879,36 @@
         <w:rPr>
           <w:sz w:val="18"/>
         </w:rPr>
+        <w:t>DPH.UI.ActionPurpose.fmx</w:t>
+      </w:r>
+    </w:p>
+    <w:p>
+      <w:pPr>
+        <w:spacing w:after="20"/>
+      </w:pPr>
+      <w:r>
+        <w:rPr>
+          <w:rFonts w:ascii="Consolas" w:hAnsi="Consolas"/>
+          <w:sz w:val="16"/>
+        </w:rPr>
+        <w:t>9eb57da0310277432db54c9a80d8d03be09aa6163acd8895f04fa21f176f8e15</w:t>
+      </w:r>
+    </w:p>
+    <w:p>
+      <w:pPr>
+        <w:keepNext/>
+        <w:spacing w:after="0"/>
+      </w:pPr>
+      <w:r>
+        <w:rPr>
+          <w:sz w:val="18"/>
+        </w:rPr>
         <w:t>DelphiProjectHandoff.dpr</w:t>
       </w:r>
     </w:p>
     <w:p>
       <w:pPr>
-        <w:spacing w:after="60"/>
+        <w:spacing w:after="20"/>
       </w:pPr>
       <w:r>
         <w:rPr>
@@ -2787,14 +2932,14 @@
     </w:p>
     <w:p>
       <w:pPr>
-        <w:spacing w:after="60"/>
+        <w:spacing w:after="20"/>
       </w:pPr>
       <w:r>
         <w:rPr>
           <w:rFonts w:ascii="Consolas" w:hAnsi="Consolas"/>
           <w:sz w:val="16"/>
         </w:rPr>
-        <w:t>cb4511ddd11ddfdec7c99d7442f267eeff1026befab5994fceeecc56deb0bb95</w:t>
+        <w:t>6e5013d9f91305e49f1317918c1b36f91782c85a25352eccd025ea66ecfc7dd8</w:t>
       </w:r>
     </w:p>
     <w:sectPr>

</xml_diff>

<commit_message>
Implement requirement 04.20 screen history and visual comparisons
</commit_message>
<xml_diff>
--- a/docs/guides/DPH_Engineering_Guide.docx
+++ b/docs/guides/DPH_Engineering_Guide.docx
@@ -799,7 +799,7 @@
         <w:rPr>
           <w:sz w:val="20"/>
         </w:rPr>
-        <w:t>Source and revision evidence</w:t>
+        <w:t>Compare attributed screen evidence and captured layouts</w:t>
       </w:r>
       <w:r>
         <w:rPr>
@@ -811,6 +811,27 @@
     </w:p>
     <w:p>
       <w:pPr>
+        <w:spacing w:after="0" w:line="240" w:lineRule="auto"/>
+        <w:tabs>
+          <w:tab w:val="right" w:leader="dot" w:pos="9360"/>
+        </w:tabs>
+      </w:pPr>
+      <w:r>
+        <w:rPr>
+          <w:sz w:val="20"/>
+        </w:rPr>
+        <w:t>Source and revision evidence</w:t>
+      </w:r>
+      <w:r>
+        <w:rPr>
+          <w:sz w:val="20"/>
+        </w:rPr>
+        <w:tab/>
+        <w:t>17</w:t>
+      </w:r>
+    </w:p>
+    <w:p>
+      <w:pPr>
         <w:spacing w:before="0" w:after="0" w:line="20" w:lineRule="exact"/>
       </w:pPr>
       <w:r>
@@ -1655,6 +1676,34 @@
     <w:p>
       <w:r>
         <w:t>Run tools/build-action-purposes.cmd elevated for parser, binary DFM, FMX, identity and ambiguity checks, database persistence, duplicate and stale protection, named review, history, search, exported bundle validation, HTML and user DOCX text, native editor Apply/Cancel, task drafts, filtering, pagination and compact layout. Fixtures reuse bin/action-purposes-validation. Native PaintTo images show real DPH controls; they are not screenshots of the analyzed application.</w:t>
+      </w:r>
+    </w:p>
+    <w:p>
+      <w:pPr>
+        <w:pStyle w:val="Heading1"/>
+      </w:pPr>
+      <w:r>
+        <w:t>Compare attributed screen evidence and captured layouts</w:t>
+      </w:r>
+    </w:p>
+    <w:p>
+      <w:r>
+        <w:t>DPH.Workspace.ScreenHistory verifies managed PNG bytes against their saved image hashes, bounds each image and the union canvas to 16 million pixels with dimensions no greater than 8192 and encoded size no greater than 20 MiB, then decodes with the VCL PNG library on the worker. CPU bitmaps composite transparency on white and compare exact eight-bit RGB. No target form, class or executable is loaded. The report preserves image and metadata hashes, contributors, generation IDs, dimensions, counts and inclusive bounds; private managed paths are omitted.</w:t>
+      </w:r>
+    </w:p>
+    <w:p>
+      <w:r>
+        <w:t>The screen_history worker command resolves screenshot IDs through the existing checksum-validated store. Optional layout comparison loads each image generation from its retained workspace cache. Missing or incompatible layout evidence yields layout_gap without discarding verified images. Parent-local component paths match captured classes and sorted inspector properties; duplicate identities are refused. Source offsets alone do not count as a change. Comparison supports 5000 components per form; all changes remain in the paged list, while previews draw at most 300 rectangles per side.</w:t>
+      </w:r>
+    </w:p>
+    <w:p>
+      <w:r>
+        <w:t>DPH.UI.Main.fmx serializes the Screen history page, grid, image and paint controls, selectors, toolbar and details. Panels use client alignment in their grid cells. Source geometry is fitted on a common canvas in blue and orange. Request tokens plus the database identity prevent a late response from restoring evidence after a pair or path change. Processing and PNG comparison run in the existing worker; presentation uses FMX. No storage migration, runtime control construction or source mutation is required.</w:t>
+      </w:r>
+    </w:p>
+    <w:p>
+      <w:r>
+        <w:t>Run tools/build-screen-history.cmd elevated for 73 checks covering exact pixels/bounds, transparency, size changes, altered bytes, union limits, text and binary DFM, FMX, parser/selection incompatibility, persisted image attribution, missing retained captures, native Compare, late-response rejection, pagination/filtering, swap, visible geometry and compact layout. Fixtures reuse bin/screen-history-validation. The owner catalog is restored after exercising cached open. Native PaintTo renders show actual DPH controls; controlled synthetic images do not establish target-runtime observations.</w:t>
       </w:r>
     </w:p>
     <w:p>
@@ -2435,7 +2484,7 @@
           <w:rFonts w:ascii="Consolas" w:hAnsi="Consolas"/>
           <w:sz w:val="16"/>
         </w:rPr>
-        <w:t>4d591bea9ea684acbd96826d0a69363e3700b7c3c414daca8cf59684b74a51a1</w:t>
+        <w:t>b7927f288a7005afe44f58ee7107cf026a5681976137d1c69b3f93e0c70dce05</w:t>
       </w:r>
     </w:p>
     <w:p>
@@ -2759,7 +2808,7 @@
         <w:rPr>
           <w:sz w:val="18"/>
         </w:rPr>
-        <w:t>DPH.Workspace.Worker.pas</w:t>
+        <w:t>DPH.Workspace.ScreenHistory.pas</w:t>
       </w:r>
     </w:p>
     <w:p>
@@ -2771,7 +2820,31 @@
           <w:rFonts w:ascii="Consolas" w:hAnsi="Consolas"/>
           <w:sz w:val="16"/>
         </w:rPr>
-        <w:t>3818fff9f49e530546653f7ad39108a9ee83f79de69ead6306894ef8ddc1e2ab</w:t>
+        <w:t>bd05a76dcae7b4c872345021a56eab0b8b0108d954c1a5c35686321852082161</w:t>
+      </w:r>
+    </w:p>
+    <w:p>
+      <w:pPr>
+        <w:keepNext/>
+        <w:spacing w:after="0"/>
+      </w:pPr>
+      <w:r>
+        <w:rPr>
+          <w:sz w:val="18"/>
+        </w:rPr>
+        <w:t>DPH.Workspace.Worker.pas</w:t>
+      </w:r>
+    </w:p>
+    <w:p>
+      <w:pPr>
+        <w:spacing w:after="20"/>
+      </w:pPr>
+      <w:r>
+        <w:rPr>
+          <w:rFonts w:ascii="Consolas" w:hAnsi="Consolas"/>
+          <w:sz w:val="16"/>
+        </w:rPr>
+        <w:t>110d8d7326f50b3a12a99f30ed3adac1aabf3d408c62c2ce52478a6e19bca4fc</w:t>
       </w:r>
     </w:p>
     <w:p>
@@ -2795,7 +2868,7 @@
           <w:rFonts w:ascii="Consolas" w:hAnsi="Consolas"/>
           <w:sz w:val="16"/>
         </w:rPr>
-        <w:t>4d7d953c654ca15dc9529e17ca2a1bc6461a79dc972ad062ab7dc22c1f8742f4</w:t>
+        <w:t>e31910f431a73e1fc8fb872b8841a6ef8c51bf69cc522ab9748f1d2a5711846a</w:t>
       </w:r>
     </w:p>
     <w:p>
@@ -2939,7 +3012,7 @@
           <w:rFonts w:ascii="Consolas" w:hAnsi="Consolas"/>
           <w:sz w:val="16"/>
         </w:rPr>
-        <w:t>6e5013d9f91305e49f1317918c1b36f91782c85a25352eccd025ea66ecfc7dd8</w:t>
+        <w:t>f77424b469b0e054d8e711778066d4e46c1f4f330d4a27203b499ec08a222a6f</w:t>
       </w:r>
     </w:p>
     <w:sectPr>

</xml_diff>

<commit_message>
Implement requirement 05.01 database connection inventory
</commit_message>
<xml_diff>
--- a/docs/guides/DPH_Engineering_Guide.docx
+++ b/docs/guides/DPH_Engineering_Guide.docx
@@ -25,7 +25,7 @@
     </w:p>
     <w:p>
       <w:r>
-        <w:t>Last changed 11 October 2026</w:t>
+        <w:t>Last changed 12 October 2026</w:t>
       </w:r>
     </w:p>
     <w:p>
@@ -820,7 +820,7 @@
         <w:rPr>
           <w:sz w:val="20"/>
         </w:rPr>
-        <w:t>Source and revision evidence</w:t>
+        <w:t>Build a safe captured database connection inventory</w:t>
       </w:r>
       <w:r>
         <w:rPr>
@@ -832,6 +832,27 @@
     </w:p>
     <w:p>
       <w:pPr>
+        <w:spacing w:after="0" w:line="240" w:lineRule="auto"/>
+        <w:tabs>
+          <w:tab w:val="right" w:leader="dot" w:pos="9360"/>
+        </w:tabs>
+      </w:pPr>
+      <w:r>
+        <w:rPr>
+          <w:sz w:val="20"/>
+        </w:rPr>
+        <w:t>Source and revision evidence</w:t>
+      </w:r>
+      <w:r>
+        <w:rPr>
+          <w:sz w:val="20"/>
+        </w:rPr>
+        <w:tab/>
+        <w:t>18</w:t>
+      </w:r>
+    </w:p>
+    <w:p>
+      <w:pPr>
         <w:spacing w:before="0" w:after="0" w:line="20" w:lineRule="exact"/>
       </w:pPr>
       <w:r>
@@ -1704,6 +1725,39 @@
     <w:p>
       <w:r>
         <w:t>Run tools/build-screen-history.cmd elevated for 73 checks covering exact pixels/bounds, transparency, size changes, altered bytes, union limits, text and binary DFM, FMX, parser/selection incompatibility, persisted image attribution, missing retained captures, native Compare, late-response rejection, pagination/filtering, swap, visible geometry and compact layout. Fixtures reuse bin/screen-history-validation. The owner catalog is restored after exercising cached open. Native PaintTo renders show actual DPH controls; controlled synthetic images do not establish target-runtime observations.</w:t>
+      </w:r>
+    </w:p>
+    <w:p>
+      <w:pPr>
+        <w:pStyle w:val="Heading1"/>
+      </w:pPr>
+      <w:r>
+        <w:t>Build a safe captured database connection inventory</w:t>
+      </w:r>
+    </w:p>
+    <w:p>
+      <w:r>
+        <w:t>DPH.Workspace.DatabaseConnections projects captured text/binary DFM and FMX IR directly. A parent-property index joins database configuration and references to each candidate. An explicit class list covers common connection, dataset, data-source, transaction and session declarations; recognized property signals retain custom-class candidates without claiming vendor or runtime behavior. Existing component_field semantic relationships prevent duplicate Pascal field rows. Unmatched supported Pascal fields, variables and locals retain declaration evidence and unknown construction/configuration.</w:t>
+      </w:r>
+    </w:p>
+    <w:p>
+      <w:r>
+        <w:t>Resolution uses source-local root and parent paths, explicitly qualified cross-form paths, expected target roles and captured logical aliases. There is no global short-name guess. Duplicate targets remain ambiguous. Named ConnectionDefName references share a definition row with explicit unavailable contents. Each row retains generation, source hash and range; exact outgoing and reverse IDs drive native Follow reference navigation. Missing inherited values, runtime assignments, factories and external definitions remain unknown. A 10000-row bound prevents an unbounded inventory.</w:t>
+      </w:r>
+    </w:p>
+    <w:p>
+      <w:r>
+        <w:t>The projection never copies raw properties or source text into its configuration. Known parameter keys are retained with masked values; unknown keys use a generic label. Endpoints, credentials and entire connection strings remain masked. Only bounded identifiers for driver/protocol/dialect/charset/SSL, valid ports and explicit booleans are visible. Unsupported reference expressions are masked. Original captured source and caches are unchanged and may contain secrets; this feature is not a comprehensive secret-removal claim for the rest of DPH. No target driver, component class or database connection is created.</w:t>
+      </w:r>
+    </w:p>
+    <w:p>
+      <w:r>
+        <w:t>DPH.UI.Main.fmx serializes every page control for the IDE and Object Inspector: purpose, horizontally scrolling toolbar, kind/text filters, paging, link selector, Follow reference, resizable list, labeled memo and status. LoadView rebuilds the projection for the accepted generation; ClearWorkspace discards borrowed rows before releasing their owner. Follow selects the exact target page after clearing filters. Compact validation requires a visible evidence area. Existing storage schema and analyzer contracts suffice.</w:t>
+      </w:r>
+    </w:p>
+    <w:p>
+      <w:r>
+        <w:t>Run tools/build-database-connections.cmd elevated for 66 checks using real text/binary DFM, FMX and Pascal declarations, persisted/reopened captures, local/nested/cross-module links, aliases, duplicate and missing targets, sensitive canaries, validated settings, native paging/filtering/follow/empty states, capture replacement, compact layout and unchanged source/owner catalog. Fixtures reuse bin/database-connections-validation. Native PaintTo renders show DPH controls, not screenshots of an analyzed application. Regression evidence also covers 134 semantic/SQL and pinned-reference checks and 73 screen-history checks.</w:t>
       </w:r>
     </w:p>
     <w:p>
@@ -2484,7 +2538,7 @@
           <w:rFonts w:ascii="Consolas" w:hAnsi="Consolas"/>
           <w:sz w:val="16"/>
         </w:rPr>
-        <w:t>b7927f288a7005afe44f58ee7107cf026a5681976137d1c69b3f93e0c70dce05</w:t>
+        <w:t>3cf661d541014c2361d70c3deb1bac114e9497e4c17cc7067ab645f35c828657</w:t>
       </w:r>
     </w:p>
     <w:p>
@@ -2640,6 +2694,30 @@
         <w:rPr>
           <w:sz w:val="18"/>
         </w:rPr>
+        <w:t>DPH.Workspace.DatabaseConnections.pas</w:t>
+      </w:r>
+    </w:p>
+    <w:p>
+      <w:pPr>
+        <w:spacing w:after="20"/>
+      </w:pPr>
+      <w:r>
+        <w:rPr>
+          <w:rFonts w:ascii="Consolas" w:hAnsi="Consolas"/>
+          <w:sz w:val="16"/>
+        </w:rPr>
+        <w:t>f625da53905b2baa35d1fdd3e70dda27e5cea31592c8d4041ba3c23497bf07fb</w:t>
+      </w:r>
+    </w:p>
+    <w:p>
+      <w:pPr>
+        <w:keepNext/>
+        <w:spacing w:after="0"/>
+      </w:pPr>
+      <w:r>
+        <w:rPr>
+          <w:sz w:val="18"/>
+        </w:rPr>
         <w:t>DPH.Workspace.DynamicControls.pas</w:t>
       </w:r>
     </w:p>
@@ -2868,7 +2946,7 @@
           <w:rFonts w:ascii="Consolas" w:hAnsi="Consolas"/>
           <w:sz w:val="16"/>
         </w:rPr>
-        <w:t>e31910f431a73e1fc8fb872b8841a6ef8c51bf69cc522ab9748f1d2a5711846a</w:t>
+        <w:t>0e1775bdc525d84c3634eef68822d2d063007928adbede094fe9c9a1ee4435e4</w:t>
       </w:r>
     </w:p>
     <w:p>
@@ -3012,7 +3090,7 @@
           <w:rFonts w:ascii="Consolas" w:hAnsi="Consolas"/>
           <w:sz w:val="16"/>
         </w:rPr>
-        <w:t>f77424b469b0e054d8e711778066d4e46c1f4f330d4a27203b499ec08a222a6f</w:t>
+        <w:t>3fb8ad4686fdda0b48d22e81b8eb8e5affde8abfd465181e15f881d476293660</w:t>
       </w:r>
     </w:p>
     <w:sectPr>

</xml_diff>

<commit_message>
Implement requirement 05.02 database engine and version evidence
</commit_message>
<xml_diff>
--- a/docs/guides/DPH_Engineering_Guide.docx
+++ b/docs/guides/DPH_Engineering_Guide.docx
@@ -841,7 +841,7 @@
         <w:rPr>
           <w:sz w:val="20"/>
         </w:rPr>
-        <w:t>Source and revision evidence</w:t>
+        <w:t>Derive captured database engine and version evidence</w:t>
       </w:r>
       <w:r>
         <w:rPr>
@@ -853,6 +853,27 @@
     </w:p>
     <w:p>
       <w:pPr>
+        <w:spacing w:after="0" w:line="240" w:lineRule="auto"/>
+        <w:tabs>
+          <w:tab w:val="right" w:leader="dot" w:pos="9360"/>
+        </w:tabs>
+      </w:pPr>
+      <w:r>
+        <w:rPr>
+          <w:sz w:val="20"/>
+        </w:rPr>
+        <w:t>Source and revision evidence</w:t>
+      </w:r>
+      <w:r>
+        <w:rPr>
+          <w:sz w:val="20"/>
+        </w:rPr>
+        <w:tab/>
+        <w:t>19</w:t>
+      </w:r>
+    </w:p>
+    <w:p>
+      <w:pPr>
         <w:spacing w:before="0" w:after="0" w:line="20" w:lineRule="exact"/>
       </w:pPr>
       <w:r>
@@ -1758,6 +1779,39 @@
     <w:p>
       <w:r>
         <w:t>Run tools/build-database-connections.cmd elevated for 66 checks using real text/binary DFM, FMX and Pascal declarations, persisted/reopened captures, local/nested/cross-module links, aliases, duplicate and missing targets, sensitive canaries, validated settings, native paging/filtering/follow/empty states, capture replacement, compact layout and unchanged source/owner catalog. Fixtures reuse bin/database-connections-validation. Native PaintTo renders show DPH controls, not screenshots of an analyzed application. Regression evidence also covers 134 semantic/SQL and pinned-reference checks and 73 screen-history checks.</w:t>
+      </w:r>
+    </w:p>
+    <w:p>
+      <w:pPr>
+        <w:pStyle w:val="Heading1"/>
+      </w:pPr>
+      <w:r>
+        <w:t>Derive captured database engine and version evidence</w:t>
+      </w:r>
+    </w:p>
+    <w:p>
+      <w:r>
+        <w:t>TDPHDatabaseConnections.EvaluateEngines extends the existing bounded inventory. It maps recognized captured DriverID values only for TFDConnection declarations using the FireDAC driver contract; it does not infer engines from class families, SQL tokens, DLL names, ports or DPH internal SQLite. The mapping basis is Embarcadero Databases FireDAC documentation at https://docwiki.embarcadero.com/RADStudio/Sydney/en/Databases_(FireDAC). Supported IDs identify families, without deriving server release or compatibility. MySQL-compatible retains compatible-server uncertainty; unknown virtual drivers are not silently mapped.</w:t>
+      </w:r>
+    </w:p>
+    <w:p>
+      <w:r>
+        <w:t>Configuration permits bounded numeric ServerVersion, DatabaseVersion, ClientVersion and DriverVersion fields only. Server version aggregation preserves matching declarations, reports disagreement, and never promotes client or driver version evidence. Invalid values remain masked. Each engine fact carries its original source, line/range, source hash and captured generation. External definition contents, runtime overrides and live version measurements remain explicit unknowns. No driver or target database is opened.</w:t>
+      </w:r>
+    </w:p>
+    <w:p>
+      <w:r>
+        <w:t>A dictionary indexes existing row IDs. Three bounded passes propagate evidence through unique captured connection and dataset targets to datasets, transactions and data sources. Multiple target identities become conflicting; unresolved candidate paths suppress propagation. Original fact ownership remains on the connection even when a dependent row displays it. The existing storage and analyzer contracts suffice; persisted capture reopening deterministically rebuilds the same projection.</w:t>
+      </w:r>
+    </w:p>
+    <w:p>
+      <w:r>
+        <w:t>DPH.UI.Main.fmx retains IDE-editable controls and adds engine instructions and a concise evidence label. List rows summarize family and declared version. Details show engine results before qualifications, improving compact-window usability. The text filter searches evidence fields and safe configuration, excluding general boilerplate; navigation, pagination, capture replacement and credential masking continue to use the existing inventory.</w:t>
+      </w:r>
+    </w:p>
+    <w:p>
+      <w:r>
+        <w:t>Run tools/build-database-engines.cmd elevated for 66 focused checks covering all fourteen driver IDs, unknown and virtual drivers, conflicting engine/version declarations, client/server separation, unresolved and conflicting paths, text/binary DFM and FMX, persisted reopening, source hashes, sensitive canaries, native filtering/details and compact renders. Existing database inventory and screen-history suites add 139 regression checks. Actual app and FMX baseline build pass. Fixtures reuse bin/database-engines-validation; native PaintTo renders show DPH controls and controlled declarations, not observed target-runtime connections.</w:t>
       </w:r>
     </w:p>
     <w:p>
@@ -2538,7 +2592,7 @@
           <w:rFonts w:ascii="Consolas" w:hAnsi="Consolas"/>
           <w:sz w:val="16"/>
         </w:rPr>
-        <w:t>3cf661d541014c2361d70c3deb1bac114e9497e4c17cc7067ab645f35c828657</w:t>
+        <w:t>c016ecc76fb4b7a82b803fd7ebe3d41be2d38288f63b41586e4e2c318ce7c0f8</w:t>
       </w:r>
     </w:p>
     <w:p>
@@ -2706,7 +2760,7 @@
           <w:rFonts w:ascii="Consolas" w:hAnsi="Consolas"/>
           <w:sz w:val="16"/>
         </w:rPr>
-        <w:t>f625da53905b2baa35d1fdd3e70dda27e5cea31592c8d4041ba3c23497bf07fb</w:t>
+        <w:t>bf8db39796d0f041f6d3d253c1688950feb779e7cf2cd5925f1f8ba5483f638b</w:t>
       </w:r>
     </w:p>
     <w:p>
@@ -2946,7 +3000,7 @@
           <w:rFonts w:ascii="Consolas" w:hAnsi="Consolas"/>
           <w:sz w:val="16"/>
         </w:rPr>
-        <w:t>0e1775bdc525d84c3634eef68822d2d063007928adbede094fe9c9a1ee4435e4</w:t>
+        <w:t>809064f9e9497125340f5c25c2f1ee6d365f342b02b3e702a6400bfdd1fb8a23</w:t>
       </w:r>
     </w:p>
     <w:p>

</xml_diff>

<commit_message>
Implement captured tables views and schema inspector for requirement 05.03
</commit_message>
<xml_diff>
--- a/docs/guides/DPH_Engineering_Guide.docx
+++ b/docs/guides/DPH_Engineering_Guide.docx
@@ -862,7 +862,7 @@
         <w:rPr>
           <w:sz w:val="20"/>
         </w:rPr>
-        <w:t>Source and revision evidence</w:t>
+        <w:t>Inspect captured database schema evidence</w:t>
       </w:r>
       <w:r>
         <w:rPr>
@@ -874,6 +874,27 @@
     </w:p>
     <w:p>
       <w:pPr>
+        <w:spacing w:after="0" w:line="240" w:lineRule="auto"/>
+        <w:tabs>
+          <w:tab w:val="right" w:leader="dot" w:pos="9360"/>
+        </w:tabs>
+      </w:pPr>
+      <w:r>
+        <w:rPr>
+          <w:sz w:val="20"/>
+        </w:rPr>
+        <w:t>Source and revision evidence</w:t>
+      </w:r>
+      <w:r>
+        <w:rPr>
+          <w:sz w:val="20"/>
+        </w:rPr>
+        <w:tab/>
+        <w:t>19</w:t>
+      </w:r>
+    </w:p>
+    <w:p>
+      <w:pPr>
         <w:spacing w:before="0" w:after="0" w:line="20" w:lineRule="exact"/>
       </w:pPr>
       <w:r>
@@ -1812,6 +1833,39 @@
     <w:p>
       <w:r>
         <w:t>Run tools/build-database-engines.cmd elevated for 66 focused checks covering all fourteen driver IDs, unknown and virtual drivers, conflicting engine/version declarations, client/server separation, unresolved and conflicting paths, text/binary DFM and FMX, persisted reopening, source hashes, sensitive canaries, native filtering/details and compact renders. Existing database inventory and screen-history suites add 139 regression checks. Actual app and FMX baseline build pass. Fixtures reuse bin/database-engines-validation; native PaintTo renders show DPH controls and controlled declarations, not observed target-runtime connections.</w:t>
+      </w:r>
+    </w:p>
+    <w:p>
+      <w:pPr>
+        <w:pStyle w:val="Heading1"/>
+      </w:pPr>
+      <w:r>
+        <w:t>Inspect captured database schema evidence</w:t>
+      </w:r>
+    </w:p>
+    <w:p>
+      <w:r>
+        <w:t>DPH.Workspace.DatabaseSchema projects captured SQL resource IR and existing semantic SQL-table references without storage migrations or target execution. A bounded lexer separates comments, quoted identifiers and string literals, preserves statement-start lines, and recognizes supported CREATE TABLE, VIEW and SCHEMA headers. Qualified names retain quoted spelling; two- and three-part names yield qualifier-reference rows. PostgreSQL CREATE TABLE, CREATE VIEW and CREATE SCHEMA documentation provides header references, not a cross-dialect grammar guarantee. Unsupported headers, ALTER and other statements remain explicit gaps.</w:t>
+      </w:r>
+    </w:p>
+    <w:p>
+      <w:r>
+        <w:t>The lexer limits each resource to 2 MiB characters and 100000 tokens, nested comments to 16 levels and the inventory to 10000 rows. Malformed lexical resources yield a gap instead of partially promoted declarations. Definitions omit comment and string contents and bound display length. Parenthesis balance and recognized headers do not validate body grammar, type or constraint semantics. Whole-resource byte extents and precise statement-start lines are labeled separately. Existing inferred references retain captured semantic ranges and use original relationship labels for object names.</w:t>
+      </w:r>
+    </w:p>
+    <w:p>
+      <w:r>
+        <w:t>Exact kind and spelling index duplicate declarations projectwide; every captured definition remains visible and migration order remains unresolved. The inspector neither normalizes dialect-dependent identifiers nor selects an effective production definition. References stay distinct from declarations; schema qualifiers stay distinct from explicit schema declarations. Missing resources and unsupported constructs cannot establish an empty live schema.</w:t>
+      </w:r>
+    </w:p>
+    <w:p>
+      <w:r>
+        <w:t>DPH.UI.Main.fmx serializes the Database schema page, toolbar, filters, list, divider, labeled memo and source command for the IDE. Main owns the projection and borrows only visible rows, clearing them before capture replacement or destruction. Filtering and paging show 250 rows. Open source reuses TDPHKeyboardInspector.ReadSource for generation, containment, identity, decoding and SHA256 guards. No runtime controls or additional navigation helper are introduced.</w:t>
+      </w:r>
+    </w:p>
+    <w:p>
+      <w:r>
+        <w:t>Run tools/build-database-schema.cmd elevated. Focused checks cover declarations, qualified and quoted names, comments/literals, duplicate definitions, unsupported and malformed resources, bounds, inferred references, SQLite persistence, source guards, unchanged workspace/catalog/source, native filters, pagination, capture replacement and normal/compact PaintTo renders. Run existing engine regression and tools/build-wp0.cmd for app and serialized FMX binding. Fixed ignored bin/database-schema-validation holds controlled practice data. No target SQL, database driver or application is executed.</w:t>
       </w:r>
     </w:p>
     <w:p>
@@ -2592,7 +2646,7 @@
           <w:rFonts w:ascii="Consolas" w:hAnsi="Consolas"/>
           <w:sz w:val="16"/>
         </w:rPr>
-        <w:t>c016ecc76fb4b7a82b803fd7ebe3d41be2d38288f63b41586e4e2c318ce7c0f8</w:t>
+        <w:t>84bb553bb29207753c16c5d2eee2b88b33db319aa133252f3954f03938837536</w:t>
       </w:r>
     </w:p>
     <w:p>
@@ -2772,6 +2826,30 @@
         <w:rPr>
           <w:sz w:val="18"/>
         </w:rPr>
+        <w:t>DPH.Workspace.DatabaseSchema.pas</w:t>
+      </w:r>
+    </w:p>
+    <w:p>
+      <w:pPr>
+        <w:spacing w:after="20"/>
+      </w:pPr>
+      <w:r>
+        <w:rPr>
+          <w:rFonts w:ascii="Consolas" w:hAnsi="Consolas"/>
+          <w:sz w:val="16"/>
+        </w:rPr>
+        <w:t>f17d7404815bd32e70cc846e76853d1e3f3664e02bddd6d3c2eb104f6076cfed</w:t>
+      </w:r>
+    </w:p>
+    <w:p>
+      <w:pPr>
+        <w:keepNext/>
+        <w:spacing w:after="0"/>
+      </w:pPr>
+      <w:r>
+        <w:rPr>
+          <w:sz w:val="18"/>
+        </w:rPr>
         <w:t>DPH.Workspace.DynamicControls.pas</w:t>
       </w:r>
     </w:p>
@@ -3000,7 +3078,7 @@
           <w:rFonts w:ascii="Consolas" w:hAnsi="Consolas"/>
           <w:sz w:val="16"/>
         </w:rPr>
-        <w:t>809064f9e9497125340f5c25c2f1ee6d365f342b02b3e702a6400bfdd1fb8a23</w:t>
+        <w:t>fe13cc33e68d8eda5404c58cfcd2d81bbf8ecc74b89b2a540d0e2bc6e2c6d1bd</w:t>
       </w:r>
     </w:p>
     <w:p>
@@ -3144,7 +3222,7 @@
           <w:rFonts w:ascii="Consolas" w:hAnsi="Consolas"/>
           <w:sz w:val="16"/>
         </w:rPr>
-        <w:t>3fb8ad4686fdda0b48d22e81b8eb8e5affde8abfd465181e15f881d476293660</w:t>
+        <w:t>ebdbe1b5d16a07dd0a0222afb55c09337917ea27826df9daa4fb9b99fffa0a79</w:t>
       </w:r>
     </w:p>
     <w:sectPr>

</xml_diff>

<commit_message>
Implement captured column types defaults and constraints for requirement 05.04
</commit_message>
<xml_diff>
--- a/docs/guides/DPH_Engineering_Guide.docx
+++ b/docs/guides/DPH_Engineering_Guide.docx
@@ -883,7 +883,7 @@
         <w:rPr>
           <w:sz w:val="20"/>
         </w:rPr>
-        <w:t>Source and revision evidence</w:t>
+        <w:t>Extract captured column declarations and constraint text</w:t>
       </w:r>
       <w:r>
         <w:rPr>
@@ -895,6 +895,27 @@
     </w:p>
     <w:p>
       <w:pPr>
+        <w:spacing w:after="0" w:line="240" w:lineRule="auto"/>
+        <w:tabs>
+          <w:tab w:val="right" w:leader="dot" w:pos="9360"/>
+        </w:tabs>
+      </w:pPr>
+      <w:r>
+        <w:rPr>
+          <w:sz w:val="20"/>
+        </w:rPr>
+        <w:t>Source and revision evidence</w:t>
+      </w:r>
+      <w:r>
+        <w:rPr>
+          <w:sz w:val="20"/>
+        </w:rPr>
+        <w:tab/>
+        <w:t>20</w:t>
+      </w:r>
+    </w:p>
+    <w:p>
+      <w:pPr>
         <w:spacing w:before="0" w:after="0" w:line="20" w:lineRule="exact"/>
       </w:pPr>
       <w:r>
@@ -1866,6 +1887,39 @@
     <w:p>
       <w:r>
         <w:t>Run tools/build-database-schema.cmd elevated. Focused checks cover declarations, qualified and quoted names, comments/literals, duplicate definitions, unsupported and malformed resources, bounds, inferred references, SQLite persistence, source guards, unchanged workspace/catalog/source, native filters, pagination, capture replacement and normal/compact PaintTo renders. Run existing engine regression and tools/build-wp0.cmd for app and serialized FMX binding. Fixed ignored bin/database-schema-validation holds controlled practice data. No target SQL, database driver or application is executed.</w:t>
+      </w:r>
+    </w:p>
+    <w:p>
+      <w:pPr>
+        <w:pStyle w:val="Heading1"/>
+      </w:pPr>
+      <w:r>
+        <w:t>Extract captured column declarations and constraint text</w:t>
+      </w:r>
+    </w:p>
+    <w:p>
+      <w:r>
+        <w:t>TDPHDatabaseSchema.Inspect extends the existing resource-token projection. It splits CREATE TABLE body entries only at outer commas, retaining type precision, CHECK and default-function commas. Supported entries emit column rows with declared_type, nullability, default, constraints, table and declaration_id. Explicit table-level constraint entries emit captured constraint text rows. These facts describe captured syntax, not a validated live schema. PostgreSQL CREATE TABLE documentation supplies the reference structure; this bounded reader is not a full dialect grammar.</w:t>
+      </w:r>
+    </w:p>
+    <w:p>
+      <w:r>
+        <w:t>Type text accepts an identifier or qualified type, supported multiword suffixes, parenthesized parameters, time-zone qualifiers and array or unsigned suffixes. Clause extraction distinguishes DEFAULT NULL from explicit NULL, accepts bounded simple or parenthesized defaults, and captures supported named and inline constraints. String contents remain omitted. Token-aware formatting preserves quoted identifier spelling while presenting readable numeric and type evidence. Unsupported clauses, absent types, incomplete defaults, repeated defaults, conflicting NULL/NOT NULL and trailing empty entries remain gaps. A supported later entry does not inherit the preceding gap.</w:t>
+      </w:r>
+    </w:p>
+    <w:p>
+      <w:r>
+        <w:t>Each column and table-level constraint keeps a unique parent declaration ID plus original file, source SHA256, generation and entry-start line. Duplicate table declarations retain independent column facts instead of selecting an effective migration. Whole-resource byte extents remain explicitly labeled. Key relationships, domain/inheritance rules, expression evaluation, dialect validity and deployed enforcement are unverified. No analyzer schema migration, target driver connection or runtime control construction is introduced.</w:t>
+      </w:r>
+    </w:p>
+    <w:p>
+      <w:r>
+        <w:t>DPH.UI.Main.fmx adds column/constraint kinds and declared column/captured constraint states to existing Object Inspector editable selectors. Existing filter logic also searches declared type, explicit nullability and inline constraint text. Details lead with column type/nullability/default before long provenance explanations, improving compact-window use. Existing 250-row pages, capture replacement, labeled scrolling memo and guarded source navigation remain in use.</w:t>
+      </w:r>
+    </w:p>
+    <w:p>
+      <w:r>
+        <w:t>Run tools/build-database-columns.cmd elevated for 121 checks using actual controlled project/resource analysis, SQLite persisted reopening, native FMX filtering/details/paging and normal/compact PaintTo renders. Checks cover type precision, multiword and qualified/quoted types, defaults, NULL separation, named/inline/table constraint text, nested commas, unsupported entries, duplicate declaration ownership, literal canaries and unchanged source/catalog/workspace. Existing schema and engine suites add 123 regression checks. Actual application build and FMX baseline pass. Fixed ignored bin/database-columns-validation contains controlled practice data. No SQL or target application is executed.</w:t>
       </w:r>
     </w:p>
     <w:p>
@@ -2646,7 +2700,7 @@
           <w:rFonts w:ascii="Consolas" w:hAnsi="Consolas"/>
           <w:sz w:val="16"/>
         </w:rPr>
-        <w:t>84bb553bb29207753c16c5d2eee2b88b33db319aa133252f3954f03938837536</w:t>
+        <w:t>ee53e145dce65e0d58a8e4061547dcbb84f979ccb9f5723a8d243acb334d17f7</w:t>
       </w:r>
     </w:p>
     <w:p>
@@ -2838,7 +2892,7 @@
           <w:rFonts w:ascii="Consolas" w:hAnsi="Consolas"/>
           <w:sz w:val="16"/>
         </w:rPr>
-        <w:t>f17d7404815bd32e70cc846e76853d1e3f3664e02bddd6d3c2eb104f6076cfed</w:t>
+        <w:t>8e8e02ab9df85218f1664a13d90ffe189f18cb0d0365df3d253d1e9d4b6ff9cc</w:t>
       </w:r>
     </w:p>
     <w:p>
@@ -3078,7 +3132,7 @@
           <w:rFonts w:ascii="Consolas" w:hAnsi="Consolas"/>
           <w:sz w:val="16"/>
         </w:rPr>
-        <w:t>fe13cc33e68d8eda5404c58cfcd2d81bbf8ecc74b89b2a540d0e2bc6e2c6d1bd</w:t>
+        <w:t>a18895ef7fe86fa7bc3df2b15c7c8cb8f1930455b09a118ad99b9ddf943a7075</w:t>
       </w:r>
     </w:p>
     <w:p>

</xml_diff>

<commit_message>
Implement captured primary foreign and unique keys for requirement 05.05
</commit_message>
<xml_diff>
--- a/docs/guides/DPH_Engineering_Guide.docx
+++ b/docs/guides/DPH_Engineering_Guide.docx
@@ -904,7 +904,7 @@
         <w:rPr>
           <w:sz w:val="20"/>
         </w:rPr>
-        <w:t>Source and revision evidence</w:t>
+        <w:t>Resolve captured key membership and references</w:t>
       </w:r>
       <w:r>
         <w:rPr>
@@ -916,6 +916,27 @@
     </w:p>
     <w:p>
       <w:pPr>
+        <w:spacing w:after="0" w:line="240" w:lineRule="auto"/>
+        <w:tabs>
+          <w:tab w:val="right" w:leader="dot" w:pos="9360"/>
+        </w:tabs>
+      </w:pPr>
+      <w:r>
+        <w:rPr>
+          <w:sz w:val="20"/>
+        </w:rPr>
+        <w:t>Source and revision evidence</w:t>
+      </w:r>
+      <w:r>
+        <w:rPr>
+          <w:sz w:val="20"/>
+        </w:rPr>
+        <w:tab/>
+        <w:t>21</w:t>
+      </w:r>
+    </w:p>
+    <w:p>
+      <w:pPr>
         <w:spacing w:before="0" w:after="0" w:line="20" w:lineRule="exact"/>
       </w:pPr>
       <w:r>
@@ -1920,6 +1941,39 @@
     <w:p>
       <w:r>
         <w:t>Run tools/build-database-columns.cmd elevated for 121 checks using actual controlled project/resource analysis, SQLite persisted reopening, native FMX filtering/details/paging and normal/compact PaintTo renders. Checks cover type precision, multiword and qualified/quoted types, defaults, NULL separation, named/inline/table constraint text, nested commas, unsupported entries, duplicate declaration ownership, literal canaries and unchanged source/catalog/workspace. Existing schema and engine suites add 123 regression checks. Actual application build and FMX baseline pass. Fixed ignored bin/database-columns-validation contains controlled practice data. No SQL or target application is executed.</w:t>
+      </w:r>
+    </w:p>
+    <w:p>
+      <w:pPr>
+        <w:pStyle w:val="Heading1"/>
+      </w:pPr>
+      <w:r>
+        <w:t>Resolve captured key membership and references</w:t>
+      </w:r>
+    </w:p>
+    <w:p>
+      <w:r>
+        <w:t>TDPHDatabaseSchema.Inspect emits key rows from supported captured CREATE TABLE entries. Each row preserves key_kind, constraint_name, ordered members, reference_table, ordered reference_columns, referential_actions, table, declaration_id and sanitized definition. Existing file, SHA256, generation and entry-start line provenance remain attached. Inline clauses are collected during column parsing and promoted only after the complete column entry passes its supported grammar, preventing an unsupported later clause from leaking a partial key.</w:t>
+      </w:r>
+    </w:p>
+    <w:p>
+      <w:r>
+        <w:t>Table constraints accept an optional CONSTRAINT name and PRIMARY KEY, UNIQUE or FOREIGN KEY with nonempty identifier lists. Foreign keys accept a qualified referenced table, optional referenced column list and bounded ON DELETE or ON UPDATE actions. Repeated members, expressions, malformed lists, unknown actions and unsupported tails yield key gaps. CHECK remains captured constraint text. Inline reference actions outside the existing column subset remain column gaps. Token and row bounds remain unchanged. PostgreSQL constraint documentation supplies the reference syntax: https://www.postgresql.org/docs/18/ddl-constraints.html. This source reader does not implement that complete dialect.</w:t>
+      </w:r>
+    </w:p>
+    <w:p>
+      <w:r>
+        <w:t>ResolveKeys builds exact table and declaration-owned column indexes with multiplicity counts. Each key receives ordered links containing role, reference, position, state and target_id only for unique captured matches. The owning table link uses the exact parent ID. Referenced columns resolve only after a unique referenced table is found. Missing or ambiguous evidence never chooses a first or last declaration. Omitted referenced columns and arity mismatches receive explicit notes; multiple primary keys and duplicate names receive conflict flags. Relationship status describes evidence completeness only, not semantic validity, target eligibility or enforcement.</w:t>
+      </w:r>
+    </w:p>
+    <w:p>
+      <w:r>
+        <w:t>DPH.UI.Main.fmx serializes the key kind and declared key state plus a relationship selector and Follow relationship button in the horizontally scrolling schema toolbar. Main owns target ID strings separately from borrowed projection rows. Selection and capture replacement clear those strings. Follow resets filters, locates the exact target ID, computes its 250-row page and selects it. Existing source guards handle direct key navigation. No runtime controls, new storage migrations or SQL execution are introduced.</w:t>
+      </w:r>
+    </w:p>
+    <w:p>
+      <w:r>
+        <w:t>Run tools/build-database-keys.cmd elevated for captured resource and SQLite reopening tests, composite order, named and anonymous inline keys, self references, missing or ambiguous members and tables, omitted target columns, arity differences, repeated columns, duplicate primary keys and names, unsupported syntax, literal omission, guarded source reading and native filters and relationship navigation. The suite also retains prior schema and column checks. Run column and schema regressions and tools/build-wp0.cmd for the actual executable and FMX baseline. Practice data stays in fixed ignored bin/database-keys-validation.</w:t>
       </w:r>
     </w:p>
     <w:p>
@@ -2700,7 +2754,7 @@
           <w:rFonts w:ascii="Consolas" w:hAnsi="Consolas"/>
           <w:sz w:val="16"/>
         </w:rPr>
-        <w:t>ee53e145dce65e0d58a8e4061547dcbb84f979ccb9f5723a8d243acb334d17f7</w:t>
+        <w:t>c54761ca8b275df0b2964bedd17fd56daa4de5c15e2e78ef3065a19e5236d06f</w:t>
       </w:r>
     </w:p>
     <w:p>
@@ -2892,7 +2946,7 @@
           <w:rFonts w:ascii="Consolas" w:hAnsi="Consolas"/>
           <w:sz w:val="16"/>
         </w:rPr>
-        <w:t>8e8e02ab9df85218f1664a13d90ffe189f18cb0d0365df3d253d1e9d4b6ff9cc</w:t>
+        <w:t>54581b1b1ecd8978415c364ad69b4b649e3fa4feb6923dec4c00090c06aed519</w:t>
       </w:r>
     </w:p>
     <w:p>
@@ -3132,7 +3186,7 @@
           <w:rFonts w:ascii="Consolas" w:hAnsi="Consolas"/>
           <w:sz w:val="16"/>
         </w:rPr>
-        <w:t>a18895ef7fe86fa7bc3df2b15c7c8cb8f1930455b09a118ad99b9ddf943a7075</w:t>
+        <w:t>d73674b33701baf1cb4a16716876d117446dc554963a724590d4391638cd1759</w:t>
       </w:r>
     </w:p>
     <w:p>

</xml_diff>

<commit_message>
Implement captured index structures and evidence for requirement 05.06
</commit_message>
<xml_diff>
--- a/docs/guides/DPH_Engineering_Guide.docx
+++ b/docs/guides/DPH_Engineering_Guide.docx
@@ -925,7 +925,7 @@
         <w:rPr>
           <w:sz w:val="20"/>
         </w:rPr>
-        <w:t>Source and revision evidence</w:t>
+        <w:t>Capture index structures and SQL reference evidence</w:t>
       </w:r>
       <w:r>
         <w:rPr>
@@ -937,6 +937,27 @@
     </w:p>
     <w:p>
       <w:pPr>
+        <w:spacing w:after="0" w:line="240" w:lineRule="auto"/>
+        <w:tabs>
+          <w:tab w:val="right" w:leader="dot" w:pos="9360"/>
+        </w:tabs>
+      </w:pPr>
+      <w:r>
+        <w:rPr>
+          <w:sz w:val="20"/>
+        </w:rPr>
+        <w:t>Source and revision evidence</w:t>
+      </w:r>
+      <w:r>
+        <w:rPr>
+          <w:sz w:val="20"/>
+        </w:rPr>
+        <w:tab/>
+        <w:t>22</w:t>
+      </w:r>
+    </w:p>
+    <w:p>
+      <w:pPr>
         <w:spacing w:before="0" w:after="0" w:line="20" w:lineRule="exact"/>
       </w:pPr>
       <w:r>
@@ -1974,6 +1995,44 @@
     <w:p>
       <w:r>
         <w:t>Run tools/build-database-keys.cmd elevated for captured resource and SQLite reopening tests, composite order, named and anonymous inline keys, self references, missing or ambiguous members and tables, omitted target columns, arity differences, repeated columns, duplicate primary keys and names, unsupported syntax, literal omission, guarded source reading and native filters and relationship navigation. The suite also retains prior schema and column checks. Run column and schema regressions and tools/build-wp0.cmd for the actual executable and FMX baseline. Practice data stays in fixed ignored bin/database-keys-validation.</w:t>
+      </w:r>
+    </w:p>
+    <w:p>
+      <w:pPr>
+        <w:pStyle w:val="Heading1"/>
+      </w:pPr>
+      <w:r>
+        <w:t>Capture index structures and SQL reference evidence</w:t>
+      </w:r>
+    </w:p>
+    <w:p>
+      <w:r>
+        <w:t>TDPHDatabaseSchema.Inspect recognizes bounded CREATE INDEX declarations from already captured SQL resources. Supported headers retain explicit index names, optional UNIQUE, CLUSTERED or NONCLUSTERED, CONCURRENTLY, IF NOT EXISTS, ON ONLY and a qualified target table. Optional USING retains the declared method. The reference structure is PostgreSQL CREATE INDEX: https://www.postgresql.org/docs/18/sql-createindex.html. Clustering keywords also retain captured structure from the supported cross-dialect subset; DPH does not validate combinations against a selected database dialect.</w:t>
+      </w:r>
+    </w:p>
+    <w:p>
+      <w:r>
+        <w:t>Ordered members retain position, column when it is a plain identifier, sanitized expression text, explicit sort and null order. Parenthesized and simple function expressions remain unresolved dependencies. INCLUDE accepts distinct plain column identifiers. Optional unique null treatment, balanced WITH option text, TABLESPACE and balanced WHERE predicate text are retained without evaluation. Empty lists or expressions, malformed name/list structure, unsupported member options or clause tails, excessive nesting and unsupported predicate subqueries remain gaps. Existing lexical, resource-size, token and row bounds apply; index expression nesting is limited to 128.</w:t>
+      </w:r>
+    </w:p>
+    <w:p>
+      <w:r>
+        <w:t>The existing relationship projection indexes exact table names and declaration-owned columns, using multiplicity counts. Index links target only unique captured table/column evidence. Duplicate table targets, columns and same-table index names remain explicit ambiguities or conflicts. Index records retain source SHA256, generation, statement line, resource byte extent, exact name and table scope. Effective migration order and live schema remain unknown. No schema migration, driver connection, SQL execution or runtime UI construction is introduced.</w:t>
+      </w:r>
+    </w:p>
+    <w:p>
+      <w:r>
+        <w:t>A separate exact-name lookup groups existing supported SQL table-reference rows. Index records show total and displayed reference counts and link to those captured evidence rows, capped at 250 references per index and 10000 across the projection. These links are labeled index use unobserved. They do not imply column coverage, plan selection or measured benefit. Absent supported matches cannot establish an unused index; quoted names and case are not normalized across dialects.</w:t>
+      </w:r>
+    </w:p>
+    <w:p>
+      <w:r>
+        <w:t>DPH.UI.Main.fmx adds index and declared index to the existing Object Inspector editable selectors. Main reuses the relationship selector, exact-ID Follow relationship navigation, 250-row paging, capture lifecycle and source guards. Search includes target table, method, predicate, storage kind and options. Details lead with index facts and explain evidence limitations before an investigation of performance can be justified.</w:t>
+      </w:r>
+    </w:p>
+    <w:p>
+      <w:r>
+        <w:t>Run tools/build-database-indexes.cmd elevated for actual project/resource capture, ordered composite and expression members, uniqueness and optional structure, literal omission, missing or ambiguous target evidence, malformed/unsupported grammar, persisted SQLite reopening, unchanged source/catalog/workspace, guarded source reading and native filtering/follow/replacement/normal/compact renders. The suite retains prior schema, column and key checks. Run key and schema regressions and tools/build-wp0.cmd for the application and serialized FMX bindings. Controlled practice stays in fixed ignored bin/database-indexes-validation.</w:t>
       </w:r>
     </w:p>
     <w:p>
@@ -2754,7 +2813,7 @@
           <w:rFonts w:ascii="Consolas" w:hAnsi="Consolas"/>
           <w:sz w:val="16"/>
         </w:rPr>
-        <w:t>c54761ca8b275df0b2964bedd17fd56daa4de5c15e2e78ef3065a19e5236d06f</w:t>
+        <w:t>71af5c311ba8a82ef70108338f094999fdd45d41ffc810cb1712f8395c3a4e81</w:t>
       </w:r>
     </w:p>
     <w:p>
@@ -2946,7 +3005,7 @@
           <w:rFonts w:ascii="Consolas" w:hAnsi="Consolas"/>
           <w:sz w:val="16"/>
         </w:rPr>
-        <w:t>54581b1b1ecd8978415c364ad69b4b649e3fa4feb6923dec4c00090c06aed519</w:t>
+        <w:t>cea9b79f37b3e02f77c2b20b869d7d463708c91a7d4f6045da981397cc6b60af</w:t>
       </w:r>
     </w:p>
     <w:p>
@@ -3186,7 +3245,7 @@
           <w:rFonts w:ascii="Consolas" w:hAnsi="Consolas"/>
           <w:sz w:val="16"/>
         </w:rPr>
-        <w:t>d73674b33701baf1cb4a16716876d117446dc554963a724590d4391638cd1759</w:t>
+        <w:t>f365aa4db7923cf457d66ec56cd298b0b41871f21163787cef12321b4115be6b</w:t>
       </w:r>
     </w:p>
     <w:p>

</xml_diff>

<commit_message>
Implement captured stored objects and dependencies for requirement 05.07
</commit_message>
<xml_diff>
--- a/docs/guides/DPH_Engineering_Guide.docx
+++ b/docs/guides/DPH_Engineering_Guide.docx
@@ -946,7 +946,7 @@
         <w:rPr>
           <w:sz w:val="20"/>
         </w:rPr>
-        <w:t>Source and revision evidence</w:t>
+        <w:t>Capture stored-object definitions and dependencies</w:t>
       </w:r>
       <w:r>
         <w:rPr>
@@ -958,6 +958,27 @@
     </w:p>
     <w:p>
       <w:pPr>
+        <w:spacing w:after="0" w:line="240" w:lineRule="auto"/>
+        <w:tabs>
+          <w:tab w:val="right" w:leader="dot" w:pos="9360"/>
+        </w:tabs>
+      </w:pPr>
+      <w:r>
+        <w:rPr>
+          <w:sz w:val="20"/>
+        </w:rPr>
+        <w:t>Source and revision evidence</w:t>
+      </w:r>
+      <w:r>
+        <w:rPr>
+          <w:sz w:val="20"/>
+        </w:rPr>
+        <w:tab/>
+        <w:t>23</w:t>
+      </w:r>
+    </w:p>
+    <w:p>
+      <w:pPr>
         <w:spacing w:before="0" w:after="0" w:line="20" w:lineRule="exact"/>
       </w:pPr>
       <w:r>
@@ -968,13 +989,9 @@
       </w:r>
     </w:p>
     <w:p>
-      <w:r>
-        <w:br w:type="page"/>
-      </w:r>
-    </w:p>
-    <w:p>
       <w:pPr>
         <w:pStyle w:val="Heading1"/>
+        <w:pageBreakBefore/>
       </w:pPr>
       <w:r>
         <w:t>Architecture and boundaries</w:t>
@@ -2033,6 +2050,54 @@
     <w:p>
       <w:r>
         <w:t>Run tools/build-database-indexes.cmd elevated for actual project/resource capture, ordered composite and expression members, uniqueness and optional structure, literal omission, missing or ambiguous target evidence, malformed/unsupported grammar, persisted SQLite reopening, unchanged source/catalog/workspace, guarded source reading and native filtering/follow/replacement/normal/compact renders. The suite retains prior schema, column and key checks. Run key and schema regressions and tools/build-wp0.cmd for the application and serialized FMX bindings. Controlled practice stays in fixed ignored bin/database-indexes-validation.</w:t>
+      </w:r>
+    </w:p>
+    <w:p>
+      <w:pPr>
+        <w:pStyle w:val="Heading1"/>
+      </w:pPr>
+      <w:r>
+        <w:t>Capture stored-object definitions and dependencies</w:t>
+      </w:r>
+    </w:p>
+    <w:p>
+      <w:r>
+        <w:t>TDPHDatabaseSchema.Inspect projects supported stored-object declarations from existing captured SQL IR into procedure, function and trigger rows. CREATE, CREATE OR REPLACE and CREATE OR ALTER retain their header operation; PROC normalizes to procedure. Explicit qualified and quoted names are retained without dialect case folding. Named parenthesized parameters and supported TSQL @parameter lists retain order, modes, declared type, sanitized defaults and source lines. Scalar/qualified type structure, numeric precision, supported multiword types and array suffixes are captured; unsupported structures remain extraction gaps.</w:t>
+      </w:r>
+    </w:p>
+    <w:p>
+      <w:r>
+        <w:t>Inline BEGIN/END blocks retain internal semicolons and nested BEGIN/CASE structure, with a 128 nesting limit. Their internal DDL is never promoted to a top-level table declaration. An unterminated block holds the remaining resource as a gap. Standalone GO client batch separators preserve following declarations. Single-quoted and dollar-quoted SQL or PLPGSQL bodies are lexed again for sanitized display and supported dependency evidence; comments and literal values remain omitted. Other quoted-body languages, unsupported tails, unnamed parameters, table-valued return structure and custom terminator directives remain gaps. Capturing a supported header/body extent does not validate body grammar.</w:t>
+      </w:r>
+    </w:p>
+    <w:p>
+      <w:r>
+        <w:t>Trigger structure retains supported BEFORE/AFTER/INSTEAD OF timing, INSERT/UPDATE/DELETE/TRUNCATE event lists, ON table, optional FOR EACH ROW/STATEMENT and parenthesized WHEN text. Supported bodies are inline blocks or explicit zero-argument EXECUTE FUNCTION/PROCEDURE calls; the latter names a trigger function. Other trigger dialect arrangements or call arguments remain explicit extraction gaps. Body text and WHEN are unevaluated.</w:t>
+      </w:r>
+    </w:p>
+    <w:p>
+      <w:r>
+        <w:t>Dependency extraction records supported FROM/JOIN/UPDATE and INSERT INTO literal table names, CALL/EXEC and EXECUTE PROCEDURE targets, plus event tables and explicit trigger functions. It is textual evidence with exact source lines, not a complete semantic SQL dependency graph. CTE/WITH scope, dynamic execution and complex table expressions retain unresolved evidence. No alias, expression-function call or column binding is invented. Projection-wide limits are 1000 dependency entries per stored object and 10000 total, alongside existing 2 MiB resource, 100000-token and 10000-row limits. Body display is limited to approximately 16000 characters and definition display to approximately 8000.</w:t>
+      </w:r>
+    </w:p>
+    <w:p>
+      <w:r>
+        <w:t>ResolveStored builds multiplicity indexes for captured table/view names and kind-specific routine names. Unique exact name matches receive target IDs with binding explicitly unverified. Missing or ambiguous declarations and overloads receive states without targets. Duplicate definitions remain separate and effective migration order remains unknown. Stored rows carry resource SHA256, generation, statement line and resource byte extent; parameter/dependency lines refer to that same captured resource. The captured workspace, source files and owner catalog remain unchanged.</w:t>
+      </w:r>
+    </w:p>
+    <w:p>
+      <w:r>
+        <w:t>The IDE-editable Database schema selectors add procedure/function/trigger and declared stored object. Existing exact-ID Follow relationship, paging, labeled scrolling details and source hash/generation guards are reused. Search includes parameter JSON text, language, returns, trigger facts and sanitized body. No runtime controls, driver connections, server SQL execution or new helper unit are introduced.</w:t>
+      </w:r>
+    </w:p>
+    <w:p>
+      <w:r>
+        <w:t>Run tools/build-database-stored-objects.cmd elevated for actual project/resource capture, parameters/defaults/types, quoted bodies, triggers, nested blocks, explicit calls, missing/ambiguous targets, overloads, literal omission, limits, batch boundaries, persistence, unchanged source/catalog/workspace, source guards and native navigation/filter/replacement/normal/compact renders. Run index and schema regressions and tools/build-wp0.cmd for the actual application and FMX resource bindings. Controlled fixtures stay in fixed ignored bin/database-stored-objects-validation.</w:t>
+      </w:r>
+    </w:p>
+    <w:p>
+      <w:r>
+        <w:t>Primary syntax references: PostgreSQL CREATE FUNCTION https://www.postgresql.org/docs/18/sql-createfunction.html, CREATE TRIGGER https://www.postgresql.org/docs/18/sql-createtrigger.html and Microsoft CREATE PROCEDURE https://learn.microsoft.com/en-us/sql/t-sql/statements/create-procedure-transact-sql. The parser implements a bounded captured-evidence subset; these references do not imply full dialect validation or deployed behavior.</w:t>
       </w:r>
     </w:p>
     <w:p>
@@ -2813,7 +2878,7 @@
           <w:rFonts w:ascii="Consolas" w:hAnsi="Consolas"/>
           <w:sz w:val="16"/>
         </w:rPr>
-        <w:t>71af5c311ba8a82ef70108338f094999fdd45d41ffc810cb1712f8395c3a4e81</w:t>
+        <w:t>9a576f362f06f80bcab6254d181c42350e22c7407573a1f47a8c27b936c9c827</w:t>
       </w:r>
     </w:p>
     <w:p>
@@ -3005,7 +3070,7 @@
           <w:rFonts w:ascii="Consolas" w:hAnsi="Consolas"/>
           <w:sz w:val="16"/>
         </w:rPr>
-        <w:t>cea9b79f37b3e02f77c2b20b869d7d463708c91a7d4f6045da981397cc6b60af</w:t>
+        <w:t>56be73d4a73042c0da6a291cae9f9bf9c92c3cff742df6e5cfd9060c65f84153</w:t>
       </w:r>
     </w:p>
     <w:p>
@@ -3245,7 +3310,7 @@
           <w:rFonts w:ascii="Consolas" w:hAnsi="Consolas"/>
           <w:sz w:val="16"/>
         </w:rPr>
-        <w:t>f365aa4db7923cf457d66ec56cd298b0b41871f21163787cef12321b4115be6b</w:t>
+        <w:t>2c36bb792a460d81936923ff366f6d739f917f81aba9223f4990c82fdd2963b2</w:t>
       </w:r>
     </w:p>
     <w:p>

</xml_diff>

<commit_message>
Implement captured entity relationship diagrams for requirement 05.08
</commit_message>
<xml_diff>
--- a/docs/guides/DPH_Engineering_Guide.docx
+++ b/docs/guides/DPH_Engineering_Guide.docx
@@ -83,13 +83,13 @@
       </w:pPr>
       <w:r>
         <w:rPr>
-          <w:sz w:val="20"/>
+          <w:sz w:val="19"/>
         </w:rPr>
         <w:t>Architecture and boundaries</w:t>
       </w:r>
       <w:r>
         <w:rPr>
-          <w:sz w:val="20"/>
+          <w:sz w:val="19"/>
         </w:rPr>
         <w:tab/>
         <w:t>3</w:t>
@@ -104,13 +104,13 @@
       </w:pPr>
       <w:r>
         <w:rPr>
-          <w:sz w:val="20"/>
+          <w:sz w:val="19"/>
         </w:rPr>
         <w:t>Rework and acceptance status</w:t>
       </w:r>
       <w:r>
         <w:rPr>
-          <w:sz w:val="20"/>
+          <w:sz w:val="19"/>
         </w:rPr>
         <w:tab/>
         <w:t>3</w:t>
@@ -125,13 +125,13 @@
       </w:pPr>
       <w:r>
         <w:rPr>
-          <w:sz w:val="20"/>
+          <w:sz w:val="19"/>
         </w:rPr>
         <w:t>Build and deployment</w:t>
       </w:r>
       <w:r>
         <w:rPr>
-          <w:sz w:val="20"/>
+          <w:sz w:val="19"/>
         </w:rPr>
         <w:tab/>
         <w:t>3</w:t>
@@ -146,13 +146,13 @@
       </w:pPr>
       <w:r>
         <w:rPr>
-          <w:sz w:val="20"/>
+          <w:sz w:val="19"/>
         </w:rPr>
         <w:t>Input acquisition and project scope</w:t>
       </w:r>
       <w:r>
         <w:rPr>
-          <w:sz w:val="20"/>
+          <w:sz w:val="19"/>
         </w:rPr>
         <w:tab/>
         <w:t>4</w:t>
@@ -167,13 +167,13 @@
       </w:pPr>
       <w:r>
         <w:rPr>
-          <w:sz w:val="20"/>
+          <w:sz w:val="19"/>
         </w:rPr>
         <w:t>Syntax contracts and limits</w:t>
       </w:r>
       <w:r>
         <w:rPr>
-          <w:sz w:val="20"/>
+          <w:sz w:val="19"/>
         </w:rPr>
         <w:tab/>
         <w:t>4</w:t>
@@ -188,13 +188,13 @@
       </w:pPr>
       <w:r>
         <w:rPr>
-          <w:sz w:val="20"/>
+          <w:sz w:val="19"/>
         </w:rPr>
         <w:t>Symbols and typed relationships</w:t>
       </w:r>
       <w:r>
         <w:rPr>
-          <w:sz w:val="20"/>
+          <w:sz w:val="19"/>
         </w:rPr>
         <w:tab/>
         <w:t>4</w:t>
@@ -209,13 +209,13 @@
       </w:pPr>
       <w:r>
         <w:rPr>
-          <w:sz w:val="20"/>
+          <w:sz w:val="19"/>
         </w:rPr>
         <w:t>Control flow and impact</w:t>
       </w:r>
       <w:r>
         <w:rPr>
-          <w:sz w:val="20"/>
+          <w:sz w:val="19"/>
         </w:rPr>
         <w:tab/>
         <w:t>5</w:t>
@@ -230,13 +230,13 @@
       </w:pPr>
       <w:r>
         <w:rPr>
-          <w:sz w:val="20"/>
+          <w:sz w:val="19"/>
         </w:rPr>
         <w:t>SQLite generations and durability</w:t>
       </w:r>
       <w:r>
         <w:rPr>
-          <w:sz w:val="20"/>
+          <w:sz w:val="19"/>
         </w:rPr>
         <w:tab/>
         <w:t>5</w:t>
@@ -251,13 +251,13 @@
       </w:pPr>
       <w:r>
         <w:rPr>
-          <w:sz w:val="20"/>
+          <w:sz w:val="19"/>
         </w:rPr>
         <w:t>Evidence and immutable history</w:t>
       </w:r>
       <w:r>
         <w:rPr>
-          <w:sz w:val="20"/>
+          <w:sz w:val="19"/>
         </w:rPr>
         <w:tab/>
         <w:t>5</w:t>
@@ -272,13 +272,13 @@
       </w:pPr>
       <w:r>
         <w:rPr>
-          <w:sz w:val="20"/>
+          <w:sz w:val="19"/>
         </w:rPr>
         <w:t>Background coordination and cached views</w:t>
       </w:r>
       <w:r>
         <w:rPr>
-          <w:sz w:val="20"/>
+          <w:sz w:val="19"/>
         </w:rPr>
         <w:tab/>
         <w:t>6</w:t>
@@ -293,13 +293,13 @@
       </w:pPr>
       <w:r>
         <w:rPr>
-          <w:sz w:val="20"/>
+          <w:sz w:val="19"/>
         </w:rPr>
         <w:t>FMX navigation and visualization</w:t>
       </w:r>
       <w:r>
         <w:rPr>
-          <w:sz w:val="20"/>
+          <w:sz w:val="19"/>
         </w:rPr>
         <w:tab/>
         <w:t>6</w:t>
@@ -314,13 +314,13 @@
       </w:pPr>
       <w:r>
         <w:rPr>
-          <w:sz w:val="20"/>
+          <w:sz w:val="19"/>
         </w:rPr>
         <w:t>Curated knowledge and review</w:t>
       </w:r>
       <w:r>
         <w:rPr>
-          <w:sz w:val="20"/>
+          <w:sz w:val="19"/>
         </w:rPr>
         <w:tab/>
         <w:t>6</w:t>
@@ -335,13 +335,13 @@
       </w:pPr>
       <w:r>
         <w:rPr>
-          <w:sz w:val="20"/>
+          <w:sz w:val="19"/>
         </w:rPr>
         <w:t>Canonical publication and privacy</w:t>
       </w:r>
       <w:r>
         <w:rPr>
-          <w:sz w:val="20"/>
+          <w:sz w:val="19"/>
         </w:rPr>
         <w:tab/>
         <w:t>7</w:t>
@@ -356,13 +356,13 @@
       </w:pPr>
       <w:r>
         <w:rPr>
-          <w:sz w:val="20"/>
+          <w:sz w:val="19"/>
         </w:rPr>
         <w:t>HTML guides and bundle validation</w:t>
       </w:r>
       <w:r>
         <w:rPr>
-          <w:sz w:val="20"/>
+          <w:sz w:val="19"/>
         </w:rPr>
         <w:tab/>
         <w:t>7</w:t>
@@ -377,13 +377,13 @@
       </w:pPr>
       <w:r>
         <w:rPr>
-          <w:sz w:val="20"/>
+          <w:sz w:val="19"/>
         </w:rPr>
         <w:t>Translation boundary</w:t>
       </w:r>
       <w:r>
         <w:rPr>
-          <w:sz w:val="20"/>
+          <w:sz w:val="19"/>
         </w:rPr>
         <w:tab/>
         <w:t>8</w:t>
@@ -398,13 +398,13 @@
       </w:pPr>
       <w:r>
         <w:rPr>
-          <w:sz w:val="20"/>
+          <w:sz w:val="19"/>
         </w:rPr>
         <w:t>Verification and release discipline</w:t>
       </w:r>
       <w:r>
         <w:rPr>
-          <w:sz w:val="20"/>
+          <w:sz w:val="19"/>
         </w:rPr>
         <w:tab/>
         <w:t>8</w:t>
@@ -419,13 +419,13 @@
       </w:pPr>
       <w:r>
         <w:rPr>
-          <w:sz w:val="20"/>
+          <w:sz w:val="19"/>
         </w:rPr>
         <w:t>Current semantic cache and extended evidence</w:t>
       </w:r>
       <w:r>
         <w:rPr>
-          <w:sz w:val="20"/>
+          <w:sz w:val="19"/>
         </w:rPr>
         <w:tab/>
         <w:t>8</w:t>
@@ -440,13 +440,13 @@
       </w:pPr>
       <w:r>
         <w:rPr>
-          <w:sz w:val="20"/>
+          <w:sz w:val="19"/>
         </w:rPr>
         <w:t>Current schema and authored document contracts</w:t>
       </w:r>
       <w:r>
         <w:rPr>
-          <w:sz w:val="20"/>
+          <w:sz w:val="19"/>
         </w:rPr>
         <w:tab/>
         <w:t>9</w:t>
@@ -461,13 +461,13 @@
       </w:pPr>
       <w:r>
         <w:rPr>
-          <w:sz w:val="20"/>
+          <w:sz w:val="19"/>
         </w:rPr>
         <w:t>Native review and learning projections</w:t>
       </w:r>
       <w:r>
         <w:rPr>
-          <w:sz w:val="20"/>
+          <w:sz w:val="19"/>
         </w:rPr>
         <w:tab/>
         <w:t>9</w:t>
@@ -482,13 +482,13 @@
       </w:pPr>
       <w:r>
         <w:rPr>
-          <w:sz w:val="20"/>
+          <w:sz w:val="19"/>
         </w:rPr>
         <w:t>Saved observation persistence</w:t>
       </w:r>
       <w:r>
         <w:rPr>
-          <w:sz w:val="20"/>
+          <w:sz w:val="19"/>
         </w:rPr>
         <w:tab/>
         <w:t>9</w:t>
@@ -503,13 +503,13 @@
       </w:pPr>
       <w:r>
         <w:rPr>
-          <w:sz w:val="20"/>
+          <w:sz w:val="19"/>
         </w:rPr>
         <w:t>Regression commands and evidence</w:t>
       </w:r>
       <w:r>
         <w:rPr>
-          <w:sz w:val="20"/>
+          <w:sz w:val="19"/>
         </w:rPr>
         <w:tab/>
         <w:t>10</w:t>
@@ -524,13 +524,13 @@
       </w:pPr>
       <w:r>
         <w:rPr>
-          <w:sz w:val="20"/>
+          <w:sz w:val="19"/>
         </w:rPr>
         <w:t>Rebuild and inspect these manuals</w:t>
       </w:r>
       <w:r>
         <w:rPr>
-          <w:sz w:val="20"/>
+          <w:sz w:val="19"/>
         </w:rPr>
         <w:tab/>
         <w:t>10</w:t>
@@ -545,13 +545,13 @@
       </w:pPr>
       <w:r>
         <w:rPr>
-          <w:sz w:val="20"/>
+          <w:sz w:val="19"/>
         </w:rPr>
         <w:t>Business glossary implementation and checks</w:t>
       </w:r>
       <w:r>
         <w:rPr>
-          <w:sz w:val="20"/>
+          <w:sz w:val="19"/>
         </w:rPr>
         <w:tab/>
         <w:t>11</w:t>
@@ -566,13 +566,13 @@
       </w:pPr>
       <w:r>
         <w:rPr>
-          <w:sz w:val="20"/>
+          <w:sz w:val="19"/>
         </w:rPr>
         <w:t>Offline translation and localized publication</w:t>
       </w:r>
       <w:r>
         <w:rPr>
-          <w:sz w:val="20"/>
+          <w:sz w:val="19"/>
         </w:rPr>
         <w:tab/>
         <w:t>11</w:t>
@@ -587,13 +587,13 @@
       </w:pPr>
       <w:r>
         <w:rPr>
-          <w:sz w:val="20"/>
+          <w:sz w:val="19"/>
         </w:rPr>
         <w:t>Native validation and release evidence</w:t>
       </w:r>
       <w:r>
         <w:rPr>
-          <w:sz w:val="20"/>
+          <w:sz w:val="19"/>
         </w:rPr>
         <w:tab/>
         <w:t>12</w:t>
@@ -608,13 +608,13 @@
       </w:pPr>
       <w:r>
         <w:rPr>
-          <w:sz w:val="20"/>
+          <w:sz w:val="19"/>
         </w:rPr>
         <w:t>Structured project profile contract</w:t>
       </w:r>
       <w:r>
         <w:rPr>
-          <w:sz w:val="20"/>
+          <w:sz w:val="19"/>
         </w:rPr>
         <w:tab/>
         <w:t>12</w:t>
@@ -629,13 +629,13 @@
       </w:pPr>
       <w:r>
         <w:rPr>
-          <w:sz w:val="20"/>
+          <w:sz w:val="19"/>
         </w:rPr>
         <w:t>Quality analysis and revision comparison</w:t>
       </w:r>
       <w:r>
         <w:rPr>
-          <w:sz w:val="20"/>
+          <w:sz w:val="19"/>
         </w:rPr>
         <w:tab/>
         <w:t>13</w:t>
@@ -650,13 +650,13 @@
       </w:pPr>
       <w:r>
         <w:rPr>
-          <w:sz w:val="20"/>
+          <w:sz w:val="19"/>
         </w:rPr>
         <w:t>Keyboard inspector implementation and validation</w:t>
       </w:r>
       <w:r>
         <w:rPr>
-          <w:sz w:val="20"/>
+          <w:sz w:val="19"/>
         </w:rPr>
         <w:tab/>
         <w:t>13</w:t>
@@ -671,13 +671,13 @@
       </w:pPr>
       <w:r>
         <w:rPr>
-          <w:sz w:val="20"/>
+          <w:sz w:val="19"/>
         </w:rPr>
         <w:t>Command inventory implementation and validation</w:t>
       </w:r>
       <w:r>
         <w:rPr>
-          <w:sz w:val="20"/>
+          <w:sz w:val="19"/>
         </w:rPr>
         <w:tab/>
         <w:t>14</w:t>
@@ -692,13 +692,13 @@
       </w:pPr>
       <w:r>
         <w:rPr>
-          <w:sz w:val="20"/>
+          <w:sz w:val="19"/>
         </w:rPr>
         <w:t>Dynamic control relationships and validation</w:t>
       </w:r>
       <w:r>
         <w:rPr>
-          <w:sz w:val="20"/>
+          <w:sz w:val="19"/>
         </w:rPr>
         <w:tab/>
         <w:t>14</w:t>
@@ -713,13 +713,13 @@
       </w:pPr>
       <w:r>
         <w:rPr>
-          <w:sz w:val="20"/>
+          <w:sz w:val="19"/>
         </w:rPr>
         <w:t>Layout rule explanations and validation</w:t>
       </w:r>
       <w:r>
         <w:rPr>
-          <w:sz w:val="20"/>
+          <w:sz w:val="19"/>
         </w:rPr>
         <w:tab/>
         <w:t>14</w:t>
@@ -734,13 +734,13 @@
       </w:pPr>
       <w:r>
         <w:rPr>
-          <w:sz w:val="20"/>
+          <w:sz w:val="19"/>
         </w:rPr>
         <w:t>Component dependencies and attributed metadata</w:t>
       </w:r>
       <w:r>
         <w:rPr>
-          <w:sz w:val="20"/>
+          <w:sz w:val="19"/>
         </w:rPr>
         <w:tab/>
         <w:t>15</w:t>
@@ -755,13 +755,13 @@
       </w:pPr>
       <w:r>
         <w:rPr>
-          <w:sz w:val="20"/>
+          <w:sz w:val="19"/>
         </w:rPr>
         <w:t>Resolve form inheritance and frame overlays</w:t>
       </w:r>
       <w:r>
         <w:rPr>
-          <w:sz w:val="20"/>
+          <w:sz w:val="19"/>
         </w:rPr>
         <w:tab/>
         <w:t>16</w:t>
@@ -776,13 +776,13 @@
       </w:pPr>
       <w:r>
         <w:rPr>
-          <w:sz w:val="20"/>
+          <w:sz w:val="19"/>
         </w:rPr>
         <w:t>Store attributed action purpose mappings</w:t>
       </w:r>
       <w:r>
         <w:rPr>
-          <w:sz w:val="20"/>
+          <w:sz w:val="19"/>
         </w:rPr>
         <w:tab/>
         <w:t>16</w:t>
@@ -797,13 +797,13 @@
       </w:pPr>
       <w:r>
         <w:rPr>
-          <w:sz w:val="20"/>
+          <w:sz w:val="19"/>
         </w:rPr>
         <w:t>Compare attributed screen evidence and captured layouts</w:t>
       </w:r>
       <w:r>
         <w:rPr>
-          <w:sz w:val="20"/>
+          <w:sz w:val="19"/>
         </w:rPr>
         <w:tab/>
         <w:t>17</w:t>
@@ -818,13 +818,13 @@
       </w:pPr>
       <w:r>
         <w:rPr>
-          <w:sz w:val="20"/>
+          <w:sz w:val="19"/>
         </w:rPr>
         <w:t>Build a safe captured database connection inventory</w:t>
       </w:r>
       <w:r>
         <w:rPr>
-          <w:sz w:val="20"/>
+          <w:sz w:val="19"/>
         </w:rPr>
         <w:tab/>
         <w:t>17</w:t>
@@ -839,13 +839,13 @@
       </w:pPr>
       <w:r>
         <w:rPr>
-          <w:sz w:val="20"/>
+          <w:sz w:val="19"/>
         </w:rPr>
         <w:t>Derive captured database engine and version evidence</w:t>
       </w:r>
       <w:r>
         <w:rPr>
-          <w:sz w:val="20"/>
+          <w:sz w:val="19"/>
         </w:rPr>
         <w:tab/>
         <w:t>18</w:t>
@@ -860,13 +860,13 @@
       </w:pPr>
       <w:r>
         <w:rPr>
-          <w:sz w:val="20"/>
+          <w:sz w:val="19"/>
         </w:rPr>
         <w:t>Inspect captured database schema evidence</w:t>
       </w:r>
       <w:r>
         <w:rPr>
-          <w:sz w:val="20"/>
+          <w:sz w:val="19"/>
         </w:rPr>
         <w:tab/>
         <w:t>19</w:t>
@@ -881,13 +881,13 @@
       </w:pPr>
       <w:r>
         <w:rPr>
-          <w:sz w:val="20"/>
+          <w:sz w:val="19"/>
         </w:rPr>
         <w:t>Extract captured column declarations and constraint text</w:t>
       </w:r>
       <w:r>
         <w:rPr>
-          <w:sz w:val="20"/>
+          <w:sz w:val="19"/>
         </w:rPr>
         <w:tab/>
         <w:t>19</w:t>
@@ -902,13 +902,13 @@
       </w:pPr>
       <w:r>
         <w:rPr>
-          <w:sz w:val="20"/>
+          <w:sz w:val="19"/>
         </w:rPr>
         <w:t>Resolve captured key membership and references</w:t>
       </w:r>
       <w:r>
         <w:rPr>
-          <w:sz w:val="20"/>
+          <w:sz w:val="19"/>
         </w:rPr>
         <w:tab/>
         <w:t>20</w:t>
@@ -923,13 +923,13 @@
       </w:pPr>
       <w:r>
         <w:rPr>
-          <w:sz w:val="20"/>
+          <w:sz w:val="19"/>
         </w:rPr>
         <w:t>Capture index structures and SQL reference evidence</w:t>
       </w:r>
       <w:r>
         <w:rPr>
-          <w:sz w:val="20"/>
+          <w:sz w:val="19"/>
         </w:rPr>
         <w:tab/>
         <w:t>21</w:t>
@@ -944,13 +944,13 @@
       </w:pPr>
       <w:r>
         <w:rPr>
-          <w:sz w:val="20"/>
+          <w:sz w:val="19"/>
         </w:rPr>
         <w:t>Capture stored-object definitions and dependencies</w:t>
       </w:r>
       <w:r>
         <w:rPr>
-          <w:sz w:val="20"/>
+          <w:sz w:val="19"/>
         </w:rPr>
         <w:tab/>
         <w:t>22</w:t>
@@ -965,16 +965,37 @@
       </w:pPr>
       <w:r>
         <w:rPr>
-          <w:sz w:val="20"/>
+          <w:sz w:val="19"/>
         </w:rPr>
-        <w:t>Source and revision evidence</w:t>
+        <w:t>Project captured entity relationship metadata</w:t>
       </w:r>
       <w:r>
         <w:rPr>
-          <w:sz w:val="20"/>
+          <w:sz w:val="19"/>
         </w:rPr>
         <w:tab/>
         <w:t>23</w:t>
+      </w:r>
+    </w:p>
+    <w:p>
+      <w:pPr>
+        <w:spacing w:after="0" w:line="240" w:lineRule="auto"/>
+        <w:tabs>
+          <w:tab w:val="right" w:leader="dot" w:pos="9360"/>
+        </w:tabs>
+      </w:pPr>
+      <w:r>
+        <w:rPr>
+          <w:sz w:val="19"/>
+        </w:rPr>
+        <w:t>Source and revision evidence</w:t>
+      </w:r>
+      <w:r>
+        <w:rPr>
+          <w:sz w:val="19"/>
+        </w:rPr>
+        <w:tab/>
+        <w:t>24</w:t>
       </w:r>
     </w:p>
     <w:p>
@@ -2098,6 +2119,49 @@
     <w:p>
       <w:r>
         <w:t>Primary syntax references: PostgreSQL CREATE FUNCTION https://www.postgresql.org/docs/18/sql-createfunction.html, CREATE TRIGGER https://www.postgresql.org/docs/18/sql-createtrigger.html and Microsoft CREATE PROCEDURE https://learn.microsoft.com/en-us/sql/t-sql/statements/create-procedure-transact-sql. The parser implements a bounded captured-evidence subset; these references do not imply full dialect validation or deployed behavior.</w:t>
+      </w:r>
+    </w:p>
+    <w:p>
+      <w:pPr>
+        <w:pStyle w:val="Heading1"/>
+      </w:pPr>
+      <w:r>
+        <w:t>Project captured entity relationship metadata</w:t>
+      </w:r>
+    </w:p>
+    <w:p>
+      <w:r>
+        <w:t>TDPHDatabaseSchema.Diagram projects independent JSON from the existing captured schema inventory. Only declared table headers become nodes. IDs, exact ownership, source SHA256, generation and source ranges survive projection. Owned columns retain order, declared types, nullability and resolved local key membership badges. Duplicate badge kinds are condensed. No source, owner catalog or persisted workspace is changed.</w:t>
+      </w:r>
+    </w:p>
+    <w:p>
+      <w:r>
+        <w:t>Captured foreign keys become numbered edges with exact key, owner and referenced table IDs, ordered members and referenced columns, source provenance and relationship state. A solid blue line requires complete captured key links and both visible table endpoints. Unresolved captured links with available endpoints draw orange dashed lines. Missing targets receive no invented ID or ghost node. Relationships touching either visible endpoint remain in the evidence selector when the other endpoint is filtered or off page. Arrow direction runs from the referencing table to the referenced table; no crow-foot cardinality is inferred.</w:t>
+      </w:r>
+    </w:p>
+    <w:p>
+      <w:r>
+        <w:t>Focus uses the selected declaration ID and a one-hop incoming/outgoing neighbor set. It does not expand transitively. Text filtering applies after focus and stable inventory order is retained across pagination. Bounds require a nonnegative offset, 1 to 60 tables and 1 to 32 summarized columns; native page choices are 15, 30 and 60. The projection retains at most 120 related foreign keys with total and omitted counts. Duplicate names, owned gaps, unresolved keys, absent columns and truncated summaries mark node notes and orange card borders. Global qualification remains PARTIAL CAPTURED SCHEMA even for supported individual declarations.</w:t>
+      </w:r>
+    </w:p>
+    <w:p>
+      <w:r>
+        <w:t>DatabaseERTab and all command, scroll, memo and style controls are serialized in DPH.UI.Main.fmx for the IDE Object Inspector. The existing Main unit paints the data using a native canvas; it does not construct runtime controls or introduce a helper unit. Table size, header height, column row height, gutters, margins, fonts, colors and zoom controls are editable form properties. DatabaseERRect arranges stable table cards in a grid; orthogonal FK routes use outside-card gutters, arrowheads and selector numbers, including self links. The canvas resizes for content and magnification. Defaults summarize seven columns.</w:t>
+      </w:r>
+    </w:p>
+    <w:p>
+      <w:r>
+        <w:t>Table hit testing and FK selection retain exact evidence IDs. Open evidence clears schema filters and navigates to the correct 250-row inventory page. Focus accepts a selected table or the declaration owner of a column/key/gap. Capture loading rebuilds the projection and resets stale focus/evidence IDs; empty results explain recovery. Drawing and details scroll independently, commands scroll horizontally, and a serialized splitter adjusts evidence space. Open source remains subject to the existing generation/hash guards on the schema page.</w:t>
+      </w:r>
+    </w:p>
+    <w:p>
+      <w:r>
+        <w:t>Run tools/build-database-er.cmd elevated. The suite captures real project SQL resources and checks projection ownership, badge membership, provenance, stable order, limits, missing/duplicate/self targets, focus, filtering, paging, immutable source/catalog/workspace and SQLite reopening. Native tests exercise card selection, exact evidence navigation across pages, the serialized page selector, zoom, compact scrolling and capture replacement; screenshots include the full native canvas and actual window. Fixtures use the fixed ignored bin/database-er-validation folder. Run stored-object and key regressions and tools/build-wp0.cmd for the actual application/FMX resource baseline.</w:t>
+      </w:r>
+    </w:p>
+    <w:p>
+      <w:r>
+        <w:t>The visualization proves supported captured structure, not a live schema, SQL semantic validation or business meaning. Dialect validity, effective migration order, referenced uniqueness, type compatibility, cardinality and deployed enforcement remain unverified. Views and inferred usage references remain schema evidence rather than invented entities. Source gaps and display limits stay visible. No target SQL, target application or database server is executed.</w:t>
       </w:r>
     </w:p>
     <w:p>
@@ -2878,7 +2942,7 @@
           <w:rFonts w:ascii="Consolas" w:hAnsi="Consolas"/>
           <w:sz w:val="16"/>
         </w:rPr>
-        <w:t>9a576f362f06f80bcab6254d181c42350e22c7407573a1f47a8c27b936c9c827</w:t>
+        <w:t>135fa48981d11a58f8ca0ea0db327f915eb11ad6d15e888f93ad3a258c5b86f3</w:t>
       </w:r>
     </w:p>
     <w:p>
@@ -3070,7 +3134,7 @@
           <w:rFonts w:ascii="Consolas" w:hAnsi="Consolas"/>
           <w:sz w:val="16"/>
         </w:rPr>
-        <w:t>56be73d4a73042c0da6a291cae9f9bf9c92c3cff742df6e5cfd9060c65f84153</w:t>
+        <w:t>3d973d0f7307a1c24bbd2d1895ccdbcadee8f1d015d1cb3a9f71d5a9a3b92f2b</w:t>
       </w:r>
     </w:p>
     <w:p>
@@ -3310,7 +3374,7 @@
           <w:rFonts w:ascii="Consolas" w:hAnsi="Consolas"/>
           <w:sz w:val="16"/>
         </w:rPr>
-        <w:t>2c36bb792a460d81936923ff366f6d739f917f81aba9223f4990c82fdd2963b2</w:t>
+        <w:t>bb3dd3d492e5c81ff37c1e7613f3cf2feb63d3819b1e2bac9ffd667179746a97</w:t>
       </w:r>
     </w:p>
     <w:p>

</xml_diff>

<commit_message>
Implement attributed table and column dictionaries for requirement 05.09
</commit_message>
<xml_diff>
--- a/docs/guides/DPH_Engineering_Guide.docx
+++ b/docs/guides/DPH_Engineering_Guide.docx
@@ -988,7 +988,7 @@
         <w:rPr>
           <w:sz w:val="19"/>
         </w:rPr>
-        <w:t>Source and revision evidence</w:t>
+        <w:t>Maintain attributed schema dictionaries</w:t>
       </w:r>
       <w:r>
         <w:rPr>
@@ -1000,6 +1000,27 @@
     </w:p>
     <w:p>
       <w:pPr>
+        <w:spacing w:after="0" w:line="240" w:lineRule="auto"/>
+        <w:tabs>
+          <w:tab w:val="right" w:leader="dot" w:pos="9360"/>
+        </w:tabs>
+      </w:pPr>
+      <w:r>
+        <w:rPr>
+          <w:sz w:val="19"/>
+        </w:rPr>
+        <w:t>Source and revision evidence</w:t>
+      </w:r>
+      <w:r>
+        <w:rPr>
+          <w:sz w:val="19"/>
+        </w:rPr>
+        <w:tab/>
+        <w:t>25</w:t>
+      </w:r>
+    </w:p>
+    <w:p>
+      <w:pPr>
         <w:spacing w:before="0" w:after="0" w:line="20" w:lineRule="exact"/>
       </w:pPr>
       <w:r>
@@ -2162,6 +2183,44 @@
     <w:p>
       <w:r>
         <w:t>The visualization proves supported captured structure, not a live schema, SQL semantic validation or business meaning. Dialect validity, effective migration order, referenced uniqueness, type compatibility, cardinality and deployed enforcement remain unverified. Views and inferred usage references remain schema evidence rather than invented entities. Source gaps and display limits stay visible. No target SQL, target application or database server is executed.</w:t>
+      </w:r>
+    </w:p>
+    <w:p>
+      <w:pPr>
+        <w:pStyle w:val="Heading1"/>
+      </w:pPr>
+      <w:r>
+        <w:t>Maintain attributed schema dictionaries</w:t>
+      </w:r>
+    </w:p>
+    <w:p>
+      <w:r>
+        <w:t>TDPHDatabaseSchema provides NewDictionary, ValidateDictionary, DictionaryIdentity, DictionaryTitle, DictionaryBody and FindDictionary in the existing schema unit. A data_dictionary record contains fourteen bounded text fields. Its captured anchor retains the exact schema record ID, source SHA256, original capture generation, kind, name, owning table and statement line. Authored fields hold business definition, owner or steward, sensitivity/handling, evidence/unknowns and optional units/usage. Validation requires explicit content for the first four authored fields; Unknown is a legitimate attributed answer, not an inferred fact.</w:t>
+      </w:r>
+    </w:p>
+    <w:p>
+      <w:r>
+        <w:t>DPH.UI.DatabaseDictionary.pas and its FMX resource define a native structured editor. All labels, memo rows, dimensions, read-only states and Apply/Cancel controls are serialized and editable in the Object Inspector. Business fields appear first, captured identity below. DPH.UI.Main reuses the existing Knowledge draft/save flow, contributor, immutable revision history, optimistic revision checks, pending review and rejection/retirement commands. No new helper unit, runtime controls or database migration is introduced.</w:t>
+      </w:r>
+    </w:p>
+    <w:p>
+      <w:r>
+        <w:t>SaveKnowledge validates new anchors against the selected persisted workspace using the captured schema inventory. Forged object names or source lines are rejected. Scope, title, deterministic rendered body and target identity cannot be altered on an existing record. One dictionary per captured anchor is enforced, including retired records. Changes create a fresh needs_review revision. Contributor, editor and reviewer remain independent. Applying the native editor only prepares a draft and requires an explicit Save.</w:t>
+      </w:r>
+    </w:p>
+    <w:p>
+      <w:r>
+        <w:t>Database schema details show business meaning before captured technical facts. Its filter searches current authored dictionary bodies. Exact captured bytes are required for current lookup; old hash matches are reported as historical rather than moved onto a new source version. Unmatched historical records remain accessible in Knowledge. DPH.Publish.Model filters dictionary sections by included source files and matching SHA256, preserving existing publication redaction and attributed review state. Publisher version DPH-LEARNING-9 invalidates prior publication fingerprints.</w:t>
+      </w:r>
+    </w:p>
+    <w:p>
+      <w:r>
+        <w:t>Run tools/build-database-dictionary.cmd elevated. Its fixed ignored bin/database-dictionary-validation fixture captures real SQL resources, persists the workspace, checks required fields/types/bounds, forged/duplicate anchors, immutable identities, conflicting body rejection, contributor/review/revision history, stale review, table/column separation, historical lookup, export exclusions/hash mismatch, native serialized controls, modal Apply-to-draft flow, search, history navigation, compact renders and SQLite reopening. No selected application or SQL executes. Run ER, publishing and glossary regressions plus tools/build-wp0.cmd for the actual application and FMX baseline.</w:t>
+      </w:r>
+    </w:p>
+    <w:p>
+      <w:r>
+        <w:t>The editor implements an attributed dictionary workflow, not automatic knowledge of business meaning. Sensitivity is descriptive text, not an authorization mechanism. The captured schema remains partial and does not establish live deployment, SQL validity, migration order or business correctness. Human review and the source evidence must qualify every business assertion.</w:t>
       </w:r>
     </w:p>
     <w:p>
@@ -2750,7 +2809,7 @@
           <w:rFonts w:ascii="Consolas" w:hAnsi="Consolas"/>
           <w:sz w:val="16"/>
         </w:rPr>
-        <w:t>924538cea0f766a19094f0fd41ff4381094e905f1a2e7db9474e3b6437bad292</w:t>
+        <w:t>532727b11c1245adceaab9e43a6f16d4bce573cf1f31c148978a78457462039f</w:t>
       </w:r>
     </w:p>
     <w:p>
@@ -2822,7 +2881,7 @@
           <w:rFonts w:ascii="Consolas" w:hAnsi="Consolas"/>
           <w:sz w:val="16"/>
         </w:rPr>
-        <w:t>62acdcbefdae51057f277c072c7d820798295da4b99f79a0705df25028389118</w:t>
+        <w:t>88dd64242abb30706a448fe064978c22d641b9541ce67a2e55e40bacc045b005</w:t>
       </w:r>
     </w:p>
     <w:p>
@@ -2906,6 +2965,30 @@
         <w:rPr>
           <w:sz w:val="18"/>
         </w:rPr>
+        <w:t>DPH.UI.DatabaseDictionary.pas</w:t>
+      </w:r>
+    </w:p>
+    <w:p>
+      <w:pPr>
+        <w:spacing w:after="20"/>
+      </w:pPr>
+      <w:r>
+        <w:rPr>
+          <w:rFonts w:ascii="Consolas" w:hAnsi="Consolas"/>
+          <w:sz w:val="16"/>
+        </w:rPr>
+        <w:t>c55bc57ac98df6caa84f29c5b775b4915c8afaf3837859f3e197f8b1fffbf90b</w:t>
+      </w:r>
+    </w:p>
+    <w:p>
+      <w:pPr>
+        <w:keepNext/>
+        <w:spacing w:after="0"/>
+      </w:pPr>
+      <w:r>
+        <w:rPr>
+          <w:sz w:val="18"/>
+        </w:rPr>
         <w:t>DPH.UI.Glossary.pas</w:t>
       </w:r>
     </w:p>
@@ -2942,7 +3025,7 @@
           <w:rFonts w:ascii="Consolas" w:hAnsi="Consolas"/>
           <w:sz w:val="16"/>
         </w:rPr>
-        <w:t>135fa48981d11a58f8ca0ea0db327f915eb11ad6d15e888f93ad3a258c5b86f3</w:t>
+        <w:t>cc5b8ea9f5ef9bbb10a7eb55d17836d6a0b9511ddf269819f34a6ed28ec5c478</w:t>
       </w:r>
     </w:p>
     <w:p>
@@ -3134,7 +3217,7 @@
           <w:rFonts w:ascii="Consolas" w:hAnsi="Consolas"/>
           <w:sz w:val="16"/>
         </w:rPr>
-        <w:t>3d973d0f7307a1c24bbd2d1895ccdbcadee8f1d015d1cb3a9f71d5a9a3b92f2b</w:t>
+        <w:t>1ce7aecbca802acd814daf550d778378f4543ec7734fc4ff1ada7607fd458f04</w:t>
       </w:r>
     </w:p>
     <w:p>
@@ -3374,7 +3457,7 @@
           <w:rFonts w:ascii="Consolas" w:hAnsi="Consolas"/>
           <w:sz w:val="16"/>
         </w:rPr>
-        <w:t>bb3dd3d492e5c81ff37c1e7613f3cf2feb63d3819b1e2bac9ffd667179746a97</w:t>
+        <w:t>6cd643a2b380db20d59b250a0a02c0b4242e6ff8053ccbdb6db77f3970c42f1a</w:t>
       </w:r>
     </w:p>
     <w:p>
@@ -3482,6 +3565,30 @@
         <w:rPr>
           <w:sz w:val="18"/>
         </w:rPr>
+        <w:t>DPH.UI.DatabaseDictionary.fmx</w:t>
+      </w:r>
+    </w:p>
+    <w:p>
+      <w:pPr>
+        <w:spacing w:after="20"/>
+      </w:pPr>
+      <w:r>
+        <w:rPr>
+          <w:rFonts w:ascii="Consolas" w:hAnsi="Consolas"/>
+          <w:sz w:val="16"/>
+        </w:rPr>
+        <w:t>5b40f12073d093c4e0b7f708440dd125662dc8e76a0b3c3bf30a4c749c69484e</w:t>
+      </w:r>
+    </w:p>
+    <w:p>
+      <w:pPr>
+        <w:keepNext/>
+        <w:spacing w:after="0"/>
+      </w:pPr>
+      <w:r>
+        <w:rPr>
+          <w:sz w:val="18"/>
+        </w:rPr>
         <w:t>DelphiProjectHandoff.dpr</w:t>
       </w:r>
     </w:p>
@@ -3518,7 +3625,7 @@
           <w:rFonts w:ascii="Consolas" w:hAnsi="Consolas"/>
           <w:sz w:val="16"/>
         </w:rPr>
-        <w:t>ebdbe1b5d16a07dd0a0222afb55c09337917ea27826df9daa4fb9b99fffa0a79</w:t>
+        <w:t>fc131b87384bc80f6d391db9c015b7aaa41c098ff8b96d53abfcdb67ced18e8d</w:t>
       </w:r>
     </w:p>
     <w:sectPr>

</xml_diff>

<commit_message>
Implement captured dataset and persistent field bindings for requirement 05.11
</commit_message>
<xml_diff>
--- a/docs/guides/DPH_Engineering_Guide.docx
+++ b/docs/guides/DPH_Engineering_Guide.docx
@@ -1009,7 +1009,7 @@
         <w:rPr>
           <w:sz w:val="19"/>
         </w:rPr>
-        <w:t>Source and revision evidence</w:t>
+        <w:t>Resolve captured dataset and field bindings</w:t>
       </w:r>
       <w:r>
         <w:rPr>
@@ -1021,6 +1021,27 @@
     </w:p>
     <w:p>
       <w:pPr>
+        <w:spacing w:after="0" w:line="240" w:lineRule="auto"/>
+        <w:tabs>
+          <w:tab w:val="right" w:leader="dot" w:pos="9360"/>
+        </w:tabs>
+      </w:pPr>
+      <w:r>
+        <w:rPr>
+          <w:sz w:val="19"/>
+        </w:rPr>
+        <w:t>Source and revision evidence</w:t>
+      </w:r>
+      <w:r>
+        <w:rPr>
+          <w:sz w:val="19"/>
+        </w:rPr>
+        <w:tab/>
+        <w:t>26</w:t>
+      </w:r>
+    </w:p>
+    <w:p>
+      <w:pPr>
         <w:spacing w:before="0" w:after="0" w:line="20" w:lineRule="exact"/>
       </w:pPr>
       <w:r>
@@ -2221,6 +2242,39 @@
     <w:p>
       <w:r>
         <w:t>The editor implements an attributed dictionary workflow, not automatic knowledge of business meaning. Sensitivity is descriptive text, not an authorization mechanism. The captured schema remains partial and does not establish live deployment, SQL validity, migration order or business correctness. Human review and the source evidence must qualify every business assertion.</w:t>
+      </w:r>
+    </w:p>
+    <w:p>
+      <w:pPr>
+        <w:pStyle w:val="Heading1"/>
+      </w:pPr>
+      <w:r>
+        <w:t>Resolve captured dataset and field bindings</w:t>
+      </w:r>
+    </w:p>
+    <w:p>
+      <w:r>
+        <w:t>TDPHDatabaseConnections.Inspect extends the existing captured form inventory with known persistent TField classes, data-aware control property signals, TBindSourceDB and visual controls explicitly referenced by serialized binding Control properties. Only required reference/configuration metadata enters the projection; captions, credentials and connection values retain existing redaction. The source and persisted workspace remain unchanged.</w:t>
+      </w:r>
+    </w:p>
+    <w:p>
+      <w:r>
+        <w:t>Persistent field DataSet ownership is derived from its exact serialized parent path and resolved only to a unique dataset. Explicit LookupDataSet references remain distinct from ownership. ResolveFields indexes captured IDs and dataset-scoped case-insensitive FieldName values, then joins resolved control DataSource or BindSource, intermediary DataSet and persistent field identity. Multiple fields, incomplete or competing chains receive no target ID. Fields absent from captured declarations are not invented. Every property link retains its original property line and byte range; binary form evidence has byte positions rather than invented text lines.</w:t>
+      </w:r>
+    </w:p>
+    <w:p>
+      <w:r>
+        <w:t>The existing Follow reference workflow navigates outgoing and reverse references, resets filters and finds exact IDs across 250-row pages. Serialized kind choices add bound control, persistent field and binding control target. Binding explanations and field metadata appear before lengthy engine qualifications. No runtime controls, helper unit, target component loading or storage migration was introduced. Existing engine derivation remains unchanged.</w:t>
+      </w:r>
+    </w:p>
+    <w:p>
+      <w:r>
+        <w:t>The installed RAD Studio Data.Bind.Components source and official TLinkControlToField documentation establish the published DataSource, FieldName and Control contract. Data.Bind.DBScope supplies TBindSourceDB. Support describes serialized lexical candidates; it does not evaluate LiveBindings expressions or instantiate the target. General expression/factory/runtime/inherited behavior remains qualified rather than promoted to confirmed static binding.</w:t>
+      </w:r>
+    </w:p>
+    <w:p>
+      <w:r>
+        <w:t>Run tools/build-dataset-bindings.cmd elevated for 92 checks. Real text/binary DFM and FMX fixtures cover VCL and FMX field chains, parent ownership, reverse links, duplicate fields, missing/nil sources, lookup datasets, exact property evidence, native kind/text filters, follow navigation, compact layout, SQLite reopening and unchanged source/catalog. Connection and engine regressions each pass 66 checks. tools/build-wp0.cmd builds the actual application and verifies FMX resource bindings. Fixtures use fixed ignored bin/dataset-bindings-validation.</w:t>
       </w:r>
     </w:p>
     <w:p>
@@ -3193,7 +3247,7 @@
           <w:rFonts w:ascii="Consolas" w:hAnsi="Consolas"/>
           <w:sz w:val="16"/>
         </w:rPr>
-        <w:t>bf8db39796d0f041f6d3d253c1688950feb779e7cf2cd5925f1f8ba5483f638b</w:t>
+        <w:t>fa7a808b18614e2389536d5d4053656aba6fee2096f29abbf8868c56d4798866</w:t>
       </w:r>
     </w:p>
     <w:p>
@@ -3457,7 +3511,7 @@
           <w:rFonts w:ascii="Consolas" w:hAnsi="Consolas"/>
           <w:sz w:val="16"/>
         </w:rPr>
-        <w:t>6cd643a2b380db20d59b250a0a02c0b4242e6ff8053ccbdb6db77f3970c42f1a</w:t>
+        <w:t>3377a20f2e305a2e667438205d1698c4df79bdab35edb70649e0cae7f4db340c</w:t>
       </w:r>
     </w:p>
     <w:p>

</xml_diff>

<commit_message>
Implement captured database read and write operations for requirement 05.12
</commit_message>
<xml_diff>
--- a/docs/guides/DPH_Engineering_Guide.docx
+++ b/docs/guides/DPH_Engineering_Guide.docx
@@ -1030,7 +1030,7 @@
         <w:rPr>
           <w:sz w:val="19"/>
         </w:rPr>
-        <w:t>Source and revision evidence</w:t>
+        <w:t>Recognize captured database operation requests</w:t>
       </w:r>
       <w:r>
         <w:rPr>
@@ -1042,6 +1042,27 @@
     </w:p>
     <w:p>
       <w:pPr>
+        <w:spacing w:after="0" w:line="240" w:lineRule="auto"/>
+        <w:tabs>
+          <w:tab w:val="right" w:leader="dot" w:pos="9360"/>
+        </w:tabs>
+      </w:pPr>
+      <w:r>
+        <w:rPr>
+          <w:sz w:val="19"/>
+        </w:rPr>
+        <w:t>Source and revision evidence</w:t>
+      </w:r>
+      <w:r>
+        <w:rPr>
+          <w:sz w:val="19"/>
+        </w:rPr>
+        <w:tab/>
+        <w:t>26</w:t>
+      </w:r>
+    </w:p>
+    <w:p>
+      <w:pPr>
         <w:spacing w:before="0" w:after="0" w:line="20" w:lineRule="exact"/>
       </w:pPr>
       <w:r>
@@ -1177,7 +1198,7 @@
     </w:p>
     <w:p>
       <w:r>
-        <w:t>DPH.Analysis.Model defines semantic schema 1 and analyzer DPH-WP3-12. Stable symbol keys contain qualified identity, signature and conditional variant. DPH.Analysis.Symbols unifies supported routine prototypes and bodies, resolves cross-unit declarations, typed receivers and suitable overloads, associates form events and records anonymous callbacks.</w:t>
+        <w:t>DPH.Analysis.Model defines semantic schema 1 and analyzer DPH-WP3-13. Stable symbol keys contain qualified identity, signature and conditional variant. DPH.Analysis.Symbols unifies supported routine prototypes and bodies, resolves cross-unit declarations, typed receivers and suitable overloads, associates form events and records anonymous callbacks.</w:t>
       </w:r>
     </w:p>
     <w:p>
@@ -1430,7 +1451,7 @@
     </w:p>
     <w:p>
       <w:r>
-        <w:t>The current analyzers are DPH-WP2-5 and DPH-WP3-12 with IR and semantic schema 1. Routine semantic cache reuse is bounded to 512 records and 32 MiB. Binding context hashes invalidate affected reuse. Synthetic startup and postprocessing occur after reusable routine facts, preserving their relationships to current identities. This is bounded evidence reuse; it is not a proof of an optimal incremental solver.</w:t>
+        <w:t>The current analyzers are DPH-WP2-5 and DPH-WP3-13 with IR and semantic schema 1. Routine semantic cache reuse is bounded to 512 records and 32 MiB. Binding context hashes invalidate affected reuse. Synthetic startup and postprocessing occur after reusable routine facts, preserving their relationships to current identities. This is bounded evidence reuse; it is not a proof of an optimal incremental solver.</w:t>
       </w:r>
     </w:p>
     <w:p>
@@ -1759,7 +1780,7 @@
     </w:p>
     <w:p>
       <w:r>
-        <w:t>DPH.Analysis.Symbols captures constructor owner expressions and visual property assignments in reusable routine facts. VisualSites joins them to creation-site identities after cache reuse. Unique same-routine result handles support parent and event declaration references. Multiple constructors, intervening variable writes and assignments before construction prevent attribution and retain ambiguous evidence. Target declarations are inferred lexical references; no runtime binding or reaching-definition proof is claimed. DPHSemanticVersion is DPH-WP3-12 so older semantic captures are reassessed.</w:t>
+        <w:t>DPH.Analysis.Symbols captures constructor owner expressions and visual property assignments in reusable routine facts. VisualSites joins them to creation-site identities after cache reuse. Unique same-routine result handles support parent and event declaration references. Multiple constructors, intervening variable writes and assignments before construction prevent attribution and retain ambiguous evidence. Target declarations are inferred lexical references; no runtime binding or reaching-definition proof is claimed. DPHSemanticVersion is DPH-WP3-13 so older semantic captures are reassessed.</w:t>
       </w:r>
     </w:p>
     <w:p>
@@ -2275,6 +2296,34 @@
     <w:p>
       <w:r>
         <w:t>Run tools/build-dataset-bindings.cmd elevated for 92 checks. Real text/binary DFM and FMX fixtures cover VCL and FMX field chains, parent ownership, reverse links, duplicate fields, missing/nil sources, lookup datasets, exact property evidence, native kind/text filters, follow navigation, compact layout, SQLite reopening and unchanged source/catalog. Connection and engine regressions each pass 66 checks. tools/build-wp0.cmd builds the actual application and verifies FMX resource bindings. Fixtures use fixed ignored bin/dataset-bindings-validation.</w:t>
+      </w:r>
+    </w:p>
+    <w:p>
+      <w:pPr>
+        <w:pStyle w:val="Heading1"/>
+      </w:pPr>
+      <w:r>
+        <w:t>Recognize captured database operation requests</w:t>
+      </w:r>
+    </w:p>
+    <w:p>
+      <w:r>
+        <w:t>TDPHSemanticAnalyzer.RoutineFacts emits database_operation relations for recognized methods on declared framework datasets or captured descendants. Receiver resolution and imported framework identity are checked; a local class shadowing TFDQuery and ordinary Delete methods are excluded. Captured inheritance is bounded to 32 steps. Within-with calls, factories, aliases, indexed receivers, unsupported providers and runtime dispatch remain unproved. DPHSemanticVersion DPH-WP3-13 invalidates older semantic caches.</w:t>
+      </w:r>
+    </w:p>
+    <w:p>
+      <w:r>
+        <w:t>TDPHDatabaseConnections.AppendOperations projects API calls, static_sql and dynamic_sql relations into existing database inventory rows. It preserves generation, condition, source SHA256 and line/byte range. Semantic component_field relationships connect operation receivers to serialized components by exact source location; ambiguous locations never choose an arbitrary target. Recognized custom dataset declarations receive their own navigable receiver row. SQL literal values are omitted. Single lexical CRUD families can be retained for complex SQL without inventing table or column bindings; dynamic or mixed batches remain unknown.</w:t>
+      </w:r>
+    </w:p>
+    <w:p>
+      <w:r>
+        <w:t>Effects distinguish record-buffer preparation, posting, cached-update application, deletion requests, SQL configuration and execution requests. Engine evidence follows captured receiver references. The database operation kind filter and Source button are serialized in DPH.UI.Main.fmx. Existing pagination, reverse references and source hash guards are reused. No helper unit, runtime control, storage migration, target execution or driver loading is introduced.</w:t>
+      </w:r>
+    </w:p>
+    <w:p>
+      <w:r>
+        <w:t>Run tools/build-database-operations.cmd elevated for 232 checks using the actual analyzer, persisted/reopened SQLite workspace and native FMX form. Fixtures cover CRUD requests, local/custom datasets, framework-name shadowing, SQL joins and mixed/dynamic SQL, operation effects, exact receiver/source identity, redaction, reverse navigation, detached-source refusal, compact layout and unchanged source/catalog. Binding regression passes 92, engine regression 66 and semantic regression 134 checks. tools/build-wp0.cmd builds the real application and verifies its FMX resource. Fixtures stay in fixed ignored bin/database-operations-validation.</w:t>
       </w:r>
     </w:p>
     <w:p>
@@ -2383,7 +2432,7 @@
           <w:rFonts w:ascii="Consolas" w:hAnsi="Consolas"/>
           <w:sz w:val="16"/>
         </w:rPr>
-        <w:t>98ecd089264555c80cd293fbd5cc70fb6c6d0549e788f3f50313f76653874d3c</w:t>
+        <w:t>a37176e806b6270c88879df9e80c7a0108aeede8a2138428fca4dd07724a01a7</w:t>
       </w:r>
     </w:p>
     <w:p>
@@ -2479,7 +2528,7 @@
           <w:rFonts w:ascii="Consolas" w:hAnsi="Consolas"/>
           <w:sz w:val="16"/>
         </w:rPr>
-        <w:t>1da99806fa3a71afbfe4c58e8e1bb40041d308e32b42fd06f412723c79f7799b</w:t>
+        <w:t>7d6e617e3459b5846c711cd93a37d516116b73e5b76695404f83ec0ac1874447</w:t>
       </w:r>
     </w:p>
     <w:p>
@@ -3079,7 +3128,7 @@
           <w:rFonts w:ascii="Consolas" w:hAnsi="Consolas"/>
           <w:sz w:val="16"/>
         </w:rPr>
-        <w:t>cc5b8ea9f5ef9bbb10a7eb55d17836d6a0b9511ddf269819f34a6ed28ec5c478</w:t>
+        <w:t>54a2cbd7b10571e67676a2ef06b13996801b13f5f42e7fce7825f8522a9488bd</w:t>
       </w:r>
     </w:p>
     <w:p>
@@ -3247,7 +3296,7 @@
           <w:rFonts w:ascii="Consolas" w:hAnsi="Consolas"/>
           <w:sz w:val="16"/>
         </w:rPr>
-        <w:t>fa7a808b18614e2389536d5d4053656aba6fee2096f29abbf8868c56d4798866</w:t>
+        <w:t>d318d45a13775018ea583c4f6067728c2c4f52f076bb243afd995c5702ecfb24</w:t>
       </w:r>
     </w:p>
     <w:p>
@@ -3511,7 +3560,7 @@
           <w:rFonts w:ascii="Consolas" w:hAnsi="Consolas"/>
           <w:sz w:val="16"/>
         </w:rPr>
-        <w:t>3377a20f2e305a2e667438205d1698c4df79bdab35edb70649e0cae7f4db340c</w:t>
+        <w:t>938875db260dbc71005b2a57c5ef75b625d1781df304e71acecb9f7d99489c68</w:t>
       </w:r>
     </w:p>
     <w:p>

</xml_diff>

<commit_message>
Implement transaction boundaries and rollback paths for requirement 05.13
</commit_message>
<xml_diff>
--- a/docs/guides/DPH_Engineering_Guide.docx
+++ b/docs/guides/DPH_Engineering_Guide.docx
@@ -1051,7 +1051,7 @@
         <w:rPr>
           <w:sz w:val="19"/>
         </w:rPr>
-        <w:t>Source and revision evidence</w:t>
+        <w:t>Trace captured transaction boundaries</w:t>
       </w:r>
       <w:r>
         <w:rPr>
@@ -1063,6 +1063,27 @@
     </w:p>
     <w:p>
       <w:pPr>
+        <w:spacing w:after="0" w:line="240" w:lineRule="auto"/>
+        <w:tabs>
+          <w:tab w:val="right" w:leader="dot" w:pos="9360"/>
+        </w:tabs>
+      </w:pPr>
+      <w:r>
+        <w:rPr>
+          <w:sz w:val="19"/>
+        </w:rPr>
+        <w:t>Source and revision evidence</w:t>
+      </w:r>
+      <w:r>
+        <w:rPr>
+          <w:sz w:val="19"/>
+        </w:rPr>
+        <w:tab/>
+        <w:t>27</w:t>
+      </w:r>
+    </w:p>
+    <w:p>
+      <w:pPr>
         <w:spacing w:before="0" w:after="0" w:line="20" w:lineRule="exact"/>
       </w:pPr>
       <w:r>
@@ -1198,7 +1219,7 @@
     </w:p>
     <w:p>
       <w:r>
-        <w:t>DPH.Analysis.Model defines semantic schema 1 and analyzer DPH-WP3-13. Stable symbol keys contain qualified identity, signature and conditional variant. DPH.Analysis.Symbols unifies supported routine prototypes and bodies, resolves cross-unit declarations, typed receivers and suitable overloads, associates form events and records anonymous callbacks.</w:t>
+        <w:t>DPH.Analysis.Model defines semantic schema 1 and analyzer DPH-WP3-14. Stable symbol keys contain qualified identity, signature and conditional variant. DPH.Analysis.Symbols unifies supported routine prototypes and bodies, resolves cross-unit declarations, typed receivers and suitable overloads, associates form events and records anonymous callbacks.</w:t>
       </w:r>
     </w:p>
     <w:p>
@@ -1451,7 +1472,7 @@
     </w:p>
     <w:p>
       <w:r>
-        <w:t>The current analyzers are DPH-WP2-5 and DPH-WP3-13 with IR and semantic schema 1. Routine semantic cache reuse is bounded to 512 records and 32 MiB. Binding context hashes invalidate affected reuse. Synthetic startup and postprocessing occur after reusable routine facts, preserving their relationships to current identities. This is bounded evidence reuse; it is not a proof of an optimal incremental solver.</w:t>
+        <w:t>The current analyzers are DPH-WP2-5 and DPH-WP3-14 with IR and semantic schema 1. Routine semantic cache reuse is bounded to 512 records and 32 MiB. Binding context hashes invalidate affected reuse. Synthetic startup and postprocessing occur after reusable routine facts, preserving their relationships to current identities. This is bounded evidence reuse; it is not a proof of an optimal incremental solver.</w:t>
       </w:r>
     </w:p>
     <w:p>
@@ -1780,7 +1801,7 @@
     </w:p>
     <w:p>
       <w:r>
-        <w:t>DPH.Analysis.Symbols captures constructor owner expressions and visual property assignments in reusable routine facts. VisualSites joins them to creation-site identities after cache reuse. Unique same-routine result handles support parent and event declaration references. Multiple constructors, intervening variable writes and assignments before construction prevent attribution and retain ambiguous evidence. Target declarations are inferred lexical references; no runtime binding or reaching-definition proof is claimed. DPHSemanticVersion is DPH-WP3-13 so older semantic captures are reassessed.</w:t>
+        <w:t>DPH.Analysis.Symbols captures constructor owner expressions and visual property assignments in reusable routine facts. VisualSites joins them to creation-site identities after cache reuse. Unique same-routine result handles support parent and event declaration references. Multiple constructors, intervening variable writes and assignments before construction prevent attribution and retain ambiguous evidence. Target declarations are inferred lexical references; no runtime binding or reaching-definition proof is claimed. DPHSemanticVersion is DPH-WP3-14 so older semantic captures are reassessed.</w:t>
       </w:r>
     </w:p>
     <w:p>
@@ -2308,7 +2329,7 @@
     </w:p>
     <w:p>
       <w:r>
-        <w:t>TDPHSemanticAnalyzer.RoutineFacts emits database_operation relations for recognized methods on declared framework datasets or captured descendants. Receiver resolution and imported framework identity are checked; a local class shadowing TFDQuery and ordinary Delete methods are excluded. Captured inheritance is bounded to 32 steps. Within-with calls, factories, aliases, indexed receivers, unsupported providers and runtime dispatch remain unproved. DPHSemanticVersion DPH-WP3-13 invalidates older semantic caches.</w:t>
+        <w:t>TDPHSemanticAnalyzer.RoutineFacts emits database_operation relations for recognized methods on declared framework datasets or captured descendants. Receiver resolution and imported framework identity are checked; a local class shadowing TFDQuery and ordinary Delete methods are excluded. Captured inheritance is bounded to 32 steps. Within-with calls, factories, aliases, indexed receivers, unsupported providers and runtime dispatch remain unproved. DPHSemanticVersion DPH-WP3-14 invalidates older semantic caches.</w:t>
       </w:r>
     </w:p>
     <w:p>
@@ -2324,6 +2345,34 @@
     <w:p>
       <w:r>
         <w:t>Run tools/build-database-operations.cmd elevated for 232 checks using the actual analyzer, persisted/reopened SQLite workspace and native FMX form. Fixtures cover CRUD requests, local/custom datasets, framework-name shadowing, SQL joins and mixed/dynamic SQL, operation effects, exact receiver/source identity, redaction, reverse navigation, detached-source refusal, compact layout and unchanged source/catalog. Binding regression passes 92, engine regression 66 and semantic regression 134 checks. tools/build-wp0.cmd builds the real application and verifies its FMX resource. Fixtures stay in fixed ignored bin/database-operations-validation.</w:t>
+      </w:r>
+    </w:p>
+    <w:p>
+      <w:pPr>
+        <w:pStyle w:val="Heading1"/>
+      </w:pPr>
+      <w:r>
+        <w:t>Trace captured transaction boundaries</w:t>
+      </w:r>
+    </w:p>
+    <w:p>
+      <w:r>
+        <w:t>DPHSemanticVersion DPH-WP3-14 invalidates older captures. RoutineFacts emits database_transaction relations for recognized FireDAC, ADO, dbExpress, BDE and IBX transaction APIs on declared imported framework types or captured descendants. IsDatabaseType shares the existing bounded ancestry and framework-name shadow checks with dataset operation recognition. The API list is provider-specific; ordinary methods and local classes sharing framework names are excluded. Parameter values and savepoint names do not enter the inventory. No target class, SQL or server is loaded or executed.</w:t>
+      </w:r>
+    </w:p>
+    <w:p>
+      <w:r>
+        <w:t>AttachTransactionPaths projects existing captured flow_nodes and flow_edges without evaluating expressions. Each boundary maps to the smallest containing statement range in the same routine and source. Separate finalizer copies retain their different pending transfers. Bounded traversal stops at the next boundary on the same declared semantic receiver or a normal/exception exit. Exception and conditional/loop flags stay separate. Multiple transaction calls in one expression receive no invented ordering. Receiver aliases and interprocedural transactions remain unproved.</w:t>
+      </w:r>
+    </w:p>
+    <w:p>
+      <w:r>
+        <w:t>Indexes group nodes by routine, outgoing edges by node and transaction boundaries by their statement. Limits are 10000 candidate CFG nodes per routine, 5000 states and 64 routes per boundary, and 1000000 states per inventory. Missing or bounded flow remains explicit. Routes expose node IDs and traversed edge-kind sets for comparison with the underlying CFG; they are not execution traces or path-feasibility proofs. Existing reference navigation links receivers, next boundaries and their reverse references. Controls remain serialized and IDE editable in DPH.UI.Main.fmx.</w:t>
+      </w:r>
+    </w:p>
+    <w:p>
+      <w:r>
+        <w:t>Calls immediately after try, except and finally now retain their no-parentheses statement-call recognition. Run tools/build-database-transactions.cmd elevated for 402 checks using actual analysis, persisted/reopened SQLite and native FMX controls. Fixtures cover normal/error commit and rollback paths, finalizers, conditional alternatives, missing boundaries, distinct receivers, retaining/savepoint variants, five framework families, captured descendants, local name shadows, unordered expressions, absent CFG, redaction, native navigation, compact layout and unchanged source/catalog. Regression suites cover 232 operation, 92 binding, 66 engine and 134 semantic checks. tools/build-wp0.cmd builds the actual application and checks the FMX resource. Tests reuse fixed ignored bin/database-transactions-validation.</w:t>
       </w:r>
     </w:p>
     <w:p>
@@ -2432,7 +2481,7 @@
           <w:rFonts w:ascii="Consolas" w:hAnsi="Consolas"/>
           <w:sz w:val="16"/>
         </w:rPr>
-        <w:t>a37176e806b6270c88879df9e80c7a0108aeede8a2138428fca4dd07724a01a7</w:t>
+        <w:t>3d70d3c202205366af62510c6a4984d03af95a05332297a6e85ee25190455b67</w:t>
       </w:r>
     </w:p>
     <w:p>
@@ -2528,7 +2577,7 @@
           <w:rFonts w:ascii="Consolas" w:hAnsi="Consolas"/>
           <w:sz w:val="16"/>
         </w:rPr>
-        <w:t>7d6e617e3459b5846c711cd93a37d516116b73e5b76695404f83ec0ac1874447</w:t>
+        <w:t>47c187a32ad1a040760bd9459e843d9c6fa7ced7b4ea5843280d2680127cc047</w:t>
       </w:r>
     </w:p>
     <w:p>
@@ -3296,7 +3345,7 @@
           <w:rFonts w:ascii="Consolas" w:hAnsi="Consolas"/>
           <w:sz w:val="16"/>
         </w:rPr>
-        <w:t>d318d45a13775018ea583c4f6067728c2c4f52f076bb243afd995c5702ecfb24</w:t>
+        <w:t>424137052f7b22f79f0d338613e73e668dc017d1c1f7dd6999e95c90b514ade2</w:t>
       </w:r>
     </w:p>
     <w:p>
@@ -3560,7 +3609,7 @@
           <w:rFonts w:ascii="Consolas" w:hAnsi="Consolas"/>
           <w:sz w:val="16"/>
         </w:rPr>
-        <w:t>938875db260dbc71005b2a57c5ef75b625d1781df304e71acecb9f7d99489c68</w:t>
+        <w:t>1f2494856ed8e4101ea6789e8aea774a916c05cafc57f383065f17b9e752b091</w:t>
       </w:r>
     </w:p>
     <w:p>

</xml_diff>

<commit_message>
Implement validation and transformation evidence for requirement 05.14
</commit_message>
<xml_diff>
--- a/docs/guides/DPH_Engineering_Guide.docx
+++ b/docs/guides/DPH_Engineering_Guide.docx
@@ -1072,7 +1072,7 @@
         <w:rPr>
           <w:sz w:val="19"/>
         </w:rPr>
-        <w:t>Source and revision evidence</w:t>
+        <w:t>Capture field validation and transformation evidence</w:t>
       </w:r>
       <w:r>
         <w:rPr>
@@ -1084,6 +1084,27 @@
     </w:p>
     <w:p>
       <w:pPr>
+        <w:spacing w:after="0" w:line="240" w:lineRule="auto"/>
+        <w:tabs>
+          <w:tab w:val="right" w:leader="dot" w:pos="9360"/>
+        </w:tabs>
+      </w:pPr>
+      <w:r>
+        <w:rPr>
+          <w:sz w:val="19"/>
+        </w:rPr>
+        <w:t>Source and revision evidence</w:t>
+      </w:r>
+      <w:r>
+        <w:rPr>
+          <w:sz w:val="19"/>
+        </w:rPr>
+        <w:tab/>
+        <w:t>27</w:t>
+      </w:r>
+    </w:p>
+    <w:p>
+      <w:pPr>
         <w:spacing w:before="0" w:after="0" w:line="20" w:lineRule="exact"/>
       </w:pPr>
       <w:r>
@@ -1196,7 +1217,7 @@
     </w:p>
     <w:p>
       <w:r>
-        <w:t>DPH.Parse.Model defines IR schema 1, analyzer DPH-WP2-5, token and node limits, source ranges and diagnostics. Lexing preserves original tokens and conditional information. Preprocessing evaluates supported expressions, explicit defines and includes while retaining uncertainty for unknown branches. An unavailable compiler symbol is not automatically a false condition.</w:t>
+        <w:t>DPH.Parse.Model defines IR schema 1, analyzer DPH-WP2-6, token and node limits, source ranges and diagnostics. Lexing preserves original tokens and conditional information. Preprocessing evaluates supported expressions, explicit defines and includes while retaining uncertainty for unknown branches. An unavailable compiler symbol is not automatically a false condition.</w:t>
       </w:r>
     </w:p>
     <w:p>
@@ -1219,7 +1240,7 @@
     </w:p>
     <w:p>
       <w:r>
-        <w:t>DPH.Analysis.Model defines semantic schema 1 and analyzer DPH-WP3-14. Stable symbol keys contain qualified identity, signature and conditional variant. DPH.Analysis.Symbols unifies supported routine prototypes and bodies, resolves cross-unit declarations, typed receivers and suitable overloads, associates form events and records anonymous callbacks.</w:t>
+        <w:t>DPH.Analysis.Model defines semantic schema 1 and analyzer DPH-WP3-15. Stable symbol keys contain qualified identity, signature and conditional variant. DPH.Analysis.Symbols unifies supported routine prototypes and bodies, resolves cross-unit declarations, typed receivers and suitable overloads, associates form events and records anonymous callbacks.</w:t>
       </w:r>
     </w:p>
     <w:p>
@@ -1472,7 +1493,7 @@
     </w:p>
     <w:p>
       <w:r>
-        <w:t>The current analyzers are DPH-WP2-5 and DPH-WP3-14 with IR and semantic schema 1. Routine semantic cache reuse is bounded to 512 records and 32 MiB. Binding context hashes invalidate affected reuse. Synthetic startup and postprocessing occur after reusable routine facts, preserving their relationships to current identities. This is bounded evidence reuse; it is not a proof of an optimal incremental solver.</w:t>
+        <w:t>The current analyzers are DPH-WP2-6 and DPH-WP3-15 with IR and semantic schema 1. Routine semantic cache reuse is bounded to 512 records and 32 MiB. Binding context hashes invalidate affected reuse. Synthetic startup and postprocessing occur after reusable routine facts, preserving their relationships to current identities. This is bounded evidence reuse; it is not a proof of an optimal incremental solver.</w:t>
       </w:r>
     </w:p>
     <w:p>
@@ -1801,7 +1822,7 @@
     </w:p>
     <w:p>
       <w:r>
-        <w:t>DPH.Analysis.Symbols captures constructor owner expressions and visual property assignments in reusable routine facts. VisualSites joins them to creation-site identities after cache reuse. Unique same-routine result handles support parent and event declaration references. Multiple constructors, intervening variable writes and assignments before construction prevent attribution and retain ambiguous evidence. Target declarations are inferred lexical references; no runtime binding or reaching-definition proof is claimed. DPHSemanticVersion is DPH-WP3-14 so older semantic captures are reassessed.</w:t>
+        <w:t>DPH.Analysis.Symbols captures constructor owner expressions and visual property assignments in reusable routine facts. VisualSites joins them to creation-site identities after cache reuse. Unique same-routine result handles support parent and event declaration references. Multiple constructors, intervening variable writes and assignments before construction prevent attribution and retain ambiguous evidence. Target declarations are inferred lexical references; no runtime binding or reaching-definition proof is claimed. DPHSemanticVersion is DPH-WP3-15 so older semantic captures are reassessed.</w:t>
       </w:r>
     </w:p>
     <w:p>
@@ -2329,7 +2350,7 @@
     </w:p>
     <w:p>
       <w:r>
-        <w:t>TDPHSemanticAnalyzer.RoutineFacts emits database_operation relations for recognized methods on declared framework datasets or captured descendants. Receiver resolution and imported framework identity are checked; a local class shadowing TFDQuery and ordinary Delete methods are excluded. Captured inheritance is bounded to 32 steps. Within-with calls, factories, aliases, indexed receivers, unsupported providers and runtime dispatch remain unproved. DPHSemanticVersion DPH-WP3-14 invalidates older semantic caches.</w:t>
+        <w:t>TDPHSemanticAnalyzer.RoutineFacts emits database_operation relations for recognized methods on declared framework datasets or captured descendants. Receiver resolution and imported framework identity are checked; a local class shadowing TFDQuery and ordinary Delete methods are excluded. Captured inheritance is bounded to 32 steps. Within-with calls, factories, aliases, indexed receivers, unsupported providers and runtime dispatch remain unproved. DPHSemanticVersion DPH-WP3-15 invalidates older semantic caches.</w:t>
       </w:r>
     </w:p>
     <w:p>
@@ -2357,7 +2378,7 @@
     </w:p>
     <w:p>
       <w:r>
-        <w:t>DPHSemanticVersion DPH-WP3-14 invalidates older captures. RoutineFacts emits database_transaction relations for recognized FireDAC, ADO, dbExpress, BDE and IBX transaction APIs on declared imported framework types or captured descendants. IsDatabaseType shares the existing bounded ancestry and framework-name shadow checks with dataset operation recognition. The API list is provider-specific; ordinary methods and local classes sharing framework names are excluded. Parameter values and savepoint names do not enter the inventory. No target class, SQL or server is loaded or executed.</w:t>
+        <w:t>DPHSemanticVersion DPH-WP3-15 invalidates older captures. RoutineFacts emits database_transaction relations for recognized FireDAC, ADO, dbExpress, BDE and IBX transaction APIs on declared imported framework types or captured descendants. IsDatabaseType shares the existing bounded ancestry and framework-name shadow checks with dataset operation recognition. The API list is provider-specific; ordinary methods and local classes sharing framework names are excluded. Parameter values and savepoint names do not enter the inventory. No target class, SQL or server is loaded or executed.</w:t>
       </w:r>
     </w:p>
     <w:p>
@@ -2373,6 +2394,29 @@
     <w:p>
       <w:r>
         <w:t>Calls immediately after try, except and finally now retain their no-parentheses statement-call recognition. Run tools/build-database-transactions.cmd elevated for 402 checks using actual analysis, persisted/reopened SQLite and native FMX controls. Fixtures cover normal/error commit and rollback paths, finalizers, conditional alternatives, missing boundaries, distinct receivers, retaining/savepoint variants, five framework families, captured descendants, local name shadows, unordered expressions, absent CFG, redaction, native navigation, compact layout and unchanged source/catalog. Regression suites cover 232 operation, 92 binding, 66 engine and 134 semantic checks. tools/build-wp0.cmd builds the actual application and checks the FMX resource. Tests reuse fixed ignored bin/database-transactions-validation.</w:t>
+      </w:r>
+    </w:p>
+    <w:p>
+      <w:pPr>
+        <w:pStyle w:val="Heading1"/>
+      </w:pPr>
+      <w:r>
+        <w:t>Capture field validation and transformation evidence</w:t>
+      </w:r>
+    </w:p>
+    <w:p>
+      <w:r>
+        <w:t>DPH-WP2-6 recognizes serialized BeforePost, BeforeInsert, BeforeEdit, BeforeDelete, BeforeCancel and BeforeOpen as event bindings in both text and binary forms. Existing own-form method resolution supplies handler relations; DPH-WP3-15 invalidates older semantic captures. Existing On-prefixed events retain their previous behavior. Missing or ambiguous method targets remain unresolved.</w:t>
+      </w:r>
+    </w:p>
+    <w:p>
+      <w:r>
+        <w:t>AppendDataRules in DPH.Workspace.DatabaseConnections indexes captured symbols, event bindings and routine CFG nodes. It projects persistent-field constraints, recognized field/dataset/input hooks and bounded handler statements. A transformation requires two direct expressions in the matching Pascal statement IR, rather than a semicolon heuristic. Conditions, raises and early exits remain distinct. Repeated finally copies are deduplicated by source location and context. Statement input/output links use captured lexical reads/writes within expression ranges, not reaching-definition or runtime-value claims. Literal strings, comments and character codes are omitted; supported custom/default expressions retain their structure without evaluation.</w:t>
+      </w:r>
+    </w:p>
+    <w:p>
+      <w:r>
+        <w:t>The combined inventory is bounded to 10000 rows; truncation is explicit in the model and native status. Source, SHA256, generation, context, handler, input/output and reverse references retain exact captured identity. Native data rule and rule declaration filters are serialized in the FMX resource. No new UI controls, helper unit, migration, target instance, driver or server execution is introduced. tools/build-data-rules.cmd checks real parser output, persisted/reopened captures, constraints, predicates, transformation inputs/outputs, missing handlers/syntax, semicolons in call literals, redaction, inventory limits, native navigation and normal/compact layouts. Explicit directions are in docs/guides/Data_Rules_Run_and_Test.txt.</w:t>
       </w:r>
     </w:p>
     <w:p>
@@ -2481,7 +2525,7 @@
           <w:rFonts w:ascii="Consolas" w:hAnsi="Consolas"/>
           <w:sz w:val="16"/>
         </w:rPr>
-        <w:t>3d70d3c202205366af62510c6a4984d03af95a05332297a6e85ee25190455b67</w:t>
+        <w:t>93d7e969508ff4862a98f7e4d7b6cb690cf741792d5a0e4dbac9f012bc8c5035</w:t>
       </w:r>
     </w:p>
     <w:p>
@@ -2697,7 +2741,7 @@
           <w:rFonts w:ascii="Consolas" w:hAnsi="Consolas"/>
           <w:sz w:val="16"/>
         </w:rPr>
-        <w:t>8b0a82186f7831bd1c27bf377409ac6e49b77c228666e6087fca8758c85d4cc7</w:t>
+        <w:t>3cf7d49afd859e2d2749cb30e5fdd76120eaf05ef5223e8fb8bf6eb1a7fcd66c</w:t>
       </w:r>
     </w:p>
     <w:p>
@@ -2745,7 +2789,7 @@
           <w:rFonts w:ascii="Consolas" w:hAnsi="Consolas"/>
           <w:sz w:val="16"/>
         </w:rPr>
-        <w:t>1bc634e14dbc4d2b2b94d566fcca9eae7911fd1299b70ef7378dcba577c80778</w:t>
+        <w:t>bdecd758070044593a6a19bfd53b35f9a23286e2542194313222cdfee51d6557</w:t>
       </w:r>
     </w:p>
     <w:p>
@@ -3177,7 +3221,7 @@
           <w:rFonts w:ascii="Consolas" w:hAnsi="Consolas"/>
           <w:sz w:val="16"/>
         </w:rPr>
-        <w:t>54a2cbd7b10571e67676a2ef06b13996801b13f5f42e7fce7825f8522a9488bd</w:t>
+        <w:t>3ae9464703c174d8e35c492b01cdbda6c84986c1921397e5a8a78fb2f5cef5d9</w:t>
       </w:r>
     </w:p>
     <w:p>
@@ -3345,7 +3389,7 @@
           <w:rFonts w:ascii="Consolas" w:hAnsi="Consolas"/>
           <w:sz w:val="16"/>
         </w:rPr>
-        <w:t>424137052f7b22f79f0d338613e73e668dc017d1c1f7dd6999e95c90b514ade2</w:t>
+        <w:t>7e24e0ef35ce20eed33186704327a075d5087023dc0d4be2790589854c5ebbeb</w:t>
       </w:r>
     </w:p>
     <w:p>
@@ -3609,7 +3653,7 @@
           <w:rFonts w:ascii="Consolas" w:hAnsi="Consolas"/>
           <w:sz w:val="16"/>
         </w:rPr>
-        <w:t>1f2494856ed8e4101ea6789e8aea774a916c05cafc57f383065f17b9e752b091</w:t>
+        <w:t>ca8d6fa10b1e0f6dd8c802e7308ee6479259353d39e1b940e7e2d7f962c55282</w:t>
       </w:r>
     </w:p>
     <w:p>

</xml_diff>

<commit_message>
Implement scoped data lineage and evidence navigation for requirement 05.15
</commit_message>
<xml_diff>
--- a/docs/guides/DPH_Engineering_Guide.docx
+++ b/docs/guides/DPH_Engineering_Guide.docx
@@ -1093,7 +1093,7 @@
         <w:rPr>
           <w:sz w:val="19"/>
         </w:rPr>
-        <w:t>Source and revision evidence</w:t>
+        <w:t>Connect source evidence into scoped lineage</w:t>
       </w:r>
       <w:r>
         <w:rPr>
@@ -1105,6 +1105,27 @@
     </w:p>
     <w:p>
       <w:pPr>
+        <w:spacing w:after="0" w:line="240" w:lineRule="auto"/>
+        <w:tabs>
+          <w:tab w:val="right" w:leader="dot" w:pos="9360"/>
+        </w:tabs>
+      </w:pPr>
+      <w:r>
+        <w:rPr>
+          <w:sz w:val="19"/>
+        </w:rPr>
+        <w:t>Source and revision evidence</w:t>
+      </w:r>
+      <w:r>
+        <w:rPr>
+          <w:sz w:val="19"/>
+        </w:rPr>
+        <w:tab/>
+        <w:t>28</w:t>
+      </w:r>
+    </w:p>
+    <w:p>
+      <w:pPr>
         <w:spacing w:before="0" w:after="0" w:line="20" w:lineRule="exact"/>
       </w:pPr>
       <w:r>
@@ -2417,6 +2438,34 @@
     <w:p>
       <w:r>
         <w:t>The combined inventory is bounded to 10000 rows; truncation is explicit in the model and native status. Source, SHA256, generation, context, handler, input/output and reverse references retain exact captured identity. Native data rule and rule declaration filters are serialized in the FMX resource. No new UI controls, helper unit, migration, target instance, driver or server execution is introduced. tools/build-data-rules.cmd checks real parser output, persisted/reopened captures, constraints, predicates, transformation inputs/outputs, missing handlers/syntax, semicolons in call literals, redaction, inventory limits, native navigation and normal/compact layouts. Explicit directions are in docs/guides/Data_Rules_Run_and_Test.txt.</w:t>
+      </w:r>
+    </w:p>
+    <w:p>
+      <w:pPr>
+        <w:pStyle w:val="Heading1"/>
+      </w:pPr>
+      <w:r>
+        <w:t>Connect source evidence into scoped lineage</w:t>
+      </w:r>
+    </w:p>
+    <w:p>
+      <w:r>
+        <w:t>TDPHDatabaseConnections.Lineage projects the captured workspace and database inventory without modifying either. Exact component_field source locations map semantic receivers to serialized inventory identity only when unique. Existing rule declarations retain their identity. Directed derives_from relations connect input candidates to dependent declarations and file output artifacts. Lexical rule inputs and outputs connect through the captured rule. Serialized bindings, handler context, reads/writes, rendering requests and database operation routines remain labeled context rather than reaching-definition evidence.</w:t>
+      </w:r>
+    </w:p>
+    <w:p>
+      <w:r>
+        <w:t>The projection indexes at most 50000 symbols and 100000 deduplicated edges, then performs bounded adjacency traversal. Each returned node retains its parent hop, kind, source, SHA256 and capture generation. Edges retain original range, source hash, condition, category and qualification. Both direction traversal includes context; Inputs and Destinations exclude broad procedure context and respect dependency direction. Cycles are deduplicated. Returned limits are 200 nodes, 800 edges and 12 hops. Missing targets, missing dataset declarations, unresolved handlers, scoped connection boundaries and limits remain explicit. Runtime values, aliases, server effects and final success remain unverified.</w:t>
+      </w:r>
+    </w:p>
+    <w:p>
+      <w:r>
+        <w:t>ResolveFields now treats any captured data-source chain without a dataset target as incomplete, including the case where another source chain resolves. It no longer invents a persistent-field target from the remaining valid branch. Existing exact-role and ambiguity checks remain in force. No analyzer version or schema migration is needed because lineage projects existing captures; older captures without a recognized event or relation still require Full reassessment.</w:t>
+      </w:r>
+    </w:p>
+    <w:p>
+      <w:r>
+        <w:t>The direction selector, Trace lineage and Lineage diagram buttons and Data lineage graph choice are serialized in DPH.UI.Main.fmx. Main form navigation reuses the inventory and explanation pages; graph grouping is disabled for lineage. GraphHTML renders the same evidence JSON with selectable nodes and unresolved breaks. Existing browser allowlisting and source hash guards remain in force. Tests use actual parsing, persisted and reopened SQLite captures, directional assignment chains, cyclic assignments, controlled file-writer evidence, redaction, incomplete bindings, trace limits and native FMX navigation/layout. No selected target, SQL, driver or production server is executed. Build with tools/build-data-lineage.cmd.</w:t>
       </w:r>
     </w:p>
     <w:p>
@@ -2477,7 +2526,7 @@
           <w:rFonts w:ascii="Consolas" w:hAnsi="Consolas"/>
           <w:sz w:val="16"/>
         </w:rPr>
-        <w:t>be976f2199be2c8e86a0cf8be936d008aa83739cf116c3e81ca68bf3692fc8e7</w:t>
+        <w:t>43244ca3544edffabbf8a52af92a5f8081794894db0fd88fdd67fd1dbab560fb</w:t>
       </w:r>
     </w:p>
     <w:p>
@@ -3221,7 +3270,7 @@
           <w:rFonts w:ascii="Consolas" w:hAnsi="Consolas"/>
           <w:sz w:val="16"/>
         </w:rPr>
-        <w:t>3ae9464703c174d8e35c492b01cdbda6c84986c1921397e5a8a78fb2f5cef5d9</w:t>
+        <w:t>42619d012e2ccaebf90496b7bd09ae76338da444dd5ee23e96b90fb09b19ca00</w:t>
       </w:r>
     </w:p>
     <w:p>
@@ -3389,7 +3438,7 @@
           <w:rFonts w:ascii="Consolas" w:hAnsi="Consolas"/>
           <w:sz w:val="16"/>
         </w:rPr>
-        <w:t>7e24e0ef35ce20eed33186704327a075d5087023dc0d4be2790589854c5ebbeb</w:t>
+        <w:t>37fecd28b258661a57eb1ff955a2bf1f22757508b3925b98daedc0d6b789e1ce</w:t>
       </w:r>
     </w:p>
     <w:p>
@@ -3653,7 +3702,7 @@
           <w:rFonts w:ascii="Consolas" w:hAnsi="Consolas"/>
           <w:sz w:val="16"/>
         </w:rPr>
-        <w:t>ca8d6fa10b1e0f6dd8c802e7308ee6479259353d39e1b940e7e2d7f962c55282</w:t>
+        <w:t>92d2b4b10d9bba5cb86fdc67fcc98c0ad269bb3cc94198fb32d235cf7d0c3417</w:t>
       </w:r>
     </w:p>
     <w:p>

</xml_diff>

<commit_message>
Implement captured migration and schema-version history for requirement 05.16
</commit_message>
<xml_diff>
--- a/docs/guides/DPH_Engineering_Guide.docx
+++ b/docs/guides/DPH_Engineering_Guide.docx
@@ -1114,7 +1114,7 @@
         <w:rPr>
           <w:sz w:val="19"/>
         </w:rPr>
-        <w:t>Source and revision evidence</w:t>
+        <w:t>Project captured migration and version evidence</w:t>
       </w:r>
       <w:r>
         <w:rPr>
@@ -1126,6 +1126,27 @@
     </w:p>
     <w:p>
       <w:pPr>
+        <w:spacing w:after="0" w:line="240" w:lineRule="auto"/>
+        <w:tabs>
+          <w:tab w:val="right" w:leader="dot" w:pos="9360"/>
+        </w:tabs>
+      </w:pPr>
+      <w:r>
+        <w:rPr>
+          <w:sz w:val="19"/>
+        </w:rPr>
+        <w:t>Source and revision evidence</w:t>
+      </w:r>
+      <w:r>
+        <w:rPr>
+          <w:sz w:val="19"/>
+        </w:rPr>
+        <w:tab/>
+        <w:t>29</w:t>
+      </w:r>
+    </w:p>
+    <w:p>
+      <w:pPr>
         <w:spacing w:before="0" w:after="0" w:line="20" w:lineRule="exact"/>
       </w:pPr>
       <w:r>
@@ -2466,6 +2487,34 @@
     <w:p>
       <w:r>
         <w:t>The direction selector, Trace lineage and Lineage diagram buttons and Data lineage graph choice are serialized in DPH.UI.Main.fmx. Main form navigation reuses the inventory and explanation pages; graph grouping is disabled for lineage. GraphHTML renders the same evidence JSON with selectable nodes and unresolved breaks. Existing browser allowlisting and source hash guards remain in force. Tests use actual parsing, persisted and reopened SQLite captures, directional assignment chains, cyclic assignments, controlled file-writer evidence, redaction, incomplete bindings, trace limits and native FMX navigation/layout. No selected target, SQL, driver or production server is executed. Build with tools/build-data-lineage.cmd.</w:t>
+      </w:r>
+    </w:p>
+    <w:p>
+      <w:pPr>
+        <w:pStyle w:val="Heading1"/>
+      </w:pPr>
+      <w:r>
+        <w:t>Project captured migration and version evidence</w:t>
+      </w:r>
+    </w:p>
+    <w:p>
+      <w:r>
+        <w:t>TDPHDatabaseSchema.Inspect appends migration evidence after ordinary schema identities and links are resolved. Existing schema IDs remain stable. Each captured readable SQL resource becomes a migration candidate; unavailable literal SQL loader targets become migration gaps citing the Pascal loader range and fingerprint. The existing bounded project inventory discovers referenced files only. No unrelated directory scan, migration runner, target database or target application executes.</w:t>
+      </w:r>
+    </w:p>
+    <w:p>
+      <w:r>
+        <w:t>Leading numeric filenames are order candidates scoped to the captured source directory. Leading zeros normalize only for conflict detection; original filename digits remain visible. Captured loader configures relationships retain their source, line, fingerprint and enumeration label. Neither filename nor lexical-loader order becomes deployment precedence. Schema evidence links retain exact row IDs and are limited to 250 per script, with total and omission counts.</w:t>
+      </w:r>
+    </w:p>
+    <w:p>
+      <w:r>
+        <w:t>The existing SQL lexer separates comments and literal contents. Supported top-level PRAGMA user_version assignments capture nonnegative 32-bit integer values through equals or parentheses and preserve explicit schema qualifiers. Queries, engine schema_version counters, unsupported expressions, nested procedure blocks and comments cannot become application-version assignments. Multiple assignments remain ordered evidence rather than a selected final version. SQLite reference: https://www.sqlite.org/pragma.html#pragma_user_version. Supported verification request spelling captures integrity_check, quick_check and foreign_key_check without execution or invented results.</w:t>
+      </w:r>
+    </w:p>
+    <w:p>
+      <w:r>
+        <w:t>Existing SQL bounds are 2 MiB characters, 100000 tokens and 10000 combined schema rows. Migration detail bounds are 250 displayed version assignments, 8000 characters of verification requests and 1000 loader entries, with explicit truncation. IDE-editable kind/state selectors, paging, evidence memo, source guards and relationship navigation are reused. The focused tools/build-schema-history.cmd suite exercises actual parsing, persisted reopening, numeric-prefix conflicts, missing sources, version/counter distinctions, nested blocks, redaction, limits, native filters and navigation. Shared schema, ER, stored-object and lineage regressions verify the same projection remains compatible.</w:t>
       </w:r>
     </w:p>
     <w:p>
@@ -3270,7 +3319,7 @@
           <w:rFonts w:ascii="Consolas" w:hAnsi="Consolas"/>
           <w:sz w:val="16"/>
         </w:rPr>
-        <w:t>42619d012e2ccaebf90496b7bd09ae76338da444dd5ee23e96b90fb09b19ca00</w:t>
+        <w:t>1e3d29f890b3827ff1bb9f7156df8d3420b1b67d7812e9bac3ccad31e0cf0937</w:t>
       </w:r>
     </w:p>
     <w:p>
@@ -3462,7 +3511,7 @@
           <w:rFonts w:ascii="Consolas" w:hAnsi="Consolas"/>
           <w:sz w:val="16"/>
         </w:rPr>
-        <w:t>1ce7aecbca802acd814daf550d778378f4543ec7734fc4ff1ada7607fd458f04</w:t>
+        <w:t>988548013d7465e7a95b4b1729c0fec5938f5d866afda932bfeab22639160bda</w:t>
       </w:r>
     </w:p>
     <w:p>
@@ -3702,7 +3751,7 @@
           <w:rFonts w:ascii="Consolas" w:hAnsi="Consolas"/>
           <w:sz w:val="16"/>
         </w:rPr>
-        <w:t>92d2b4b10d9bba5cb86fdc67fcc98c0ad269bb3cc94198fb32d235cf7d0c3417</w:t>
+        <w:t>3a8b8550832a79f1514ec5dcd898e939b11f6bfd7b769af477e4e38d88411905</w:t>
       </w:r>
     </w:p>
     <w:p>

</xml_diff>

<commit_message>
Implement captured file formats and attributed contracts for requirement 05.17
</commit_message>
<xml_diff>
--- a/docs/guides/DPH_Engineering_Guide.docx
+++ b/docs/guides/DPH_Engineering_Guide.docx
@@ -83,16 +83,16 @@
       </w:pPr>
       <w:r>
         <w:rPr>
-          <w:sz w:val="19"/>
+          <w:sz w:val="22"/>
         </w:rPr>
         <w:t>Architecture and boundaries</w:t>
       </w:r>
       <w:r>
         <w:rPr>
-          <w:sz w:val="19"/>
+          <w:sz w:val="22"/>
         </w:rPr>
         <w:tab/>
-        <w:t>3</w:t>
+        <w:t>4</w:t>
       </w:r>
     </w:p>
     <w:p>
@@ -104,16 +104,16 @@
       </w:pPr>
       <w:r>
         <w:rPr>
-          <w:sz w:val="19"/>
+          <w:sz w:val="22"/>
         </w:rPr>
         <w:t>Rework and acceptance status</w:t>
       </w:r>
       <w:r>
         <w:rPr>
-          <w:sz w:val="19"/>
+          <w:sz w:val="22"/>
         </w:rPr>
         <w:tab/>
-        <w:t>3</w:t>
+        <w:t>4</w:t>
       </w:r>
     </w:p>
     <w:p>
@@ -125,16 +125,16 @@
       </w:pPr>
       <w:r>
         <w:rPr>
-          <w:sz w:val="19"/>
+          <w:sz w:val="22"/>
         </w:rPr>
         <w:t>Build and deployment</w:t>
       </w:r>
       <w:r>
         <w:rPr>
-          <w:sz w:val="19"/>
+          <w:sz w:val="22"/>
         </w:rPr>
         <w:tab/>
-        <w:t>3</w:t>
+        <w:t>4</w:t>
       </w:r>
     </w:p>
     <w:p>
@@ -146,16 +146,16 @@
       </w:pPr>
       <w:r>
         <w:rPr>
-          <w:sz w:val="19"/>
+          <w:sz w:val="22"/>
         </w:rPr>
         <w:t>Input acquisition and project scope</w:t>
       </w:r>
       <w:r>
         <w:rPr>
-          <w:sz w:val="19"/>
+          <w:sz w:val="22"/>
         </w:rPr>
         <w:tab/>
-        <w:t>4</w:t>
+        <w:t>5</w:t>
       </w:r>
     </w:p>
     <w:p>
@@ -167,16 +167,16 @@
       </w:pPr>
       <w:r>
         <w:rPr>
-          <w:sz w:val="19"/>
+          <w:sz w:val="22"/>
         </w:rPr>
         <w:t>Syntax contracts and limits</w:t>
       </w:r>
       <w:r>
         <w:rPr>
-          <w:sz w:val="19"/>
+          <w:sz w:val="22"/>
         </w:rPr>
         <w:tab/>
-        <w:t>4</w:t>
+        <w:t>5</w:t>
       </w:r>
     </w:p>
     <w:p>
@@ -188,16 +188,16 @@
       </w:pPr>
       <w:r>
         <w:rPr>
-          <w:sz w:val="19"/>
+          <w:sz w:val="22"/>
         </w:rPr>
         <w:t>Symbols and typed relationships</w:t>
       </w:r>
       <w:r>
         <w:rPr>
-          <w:sz w:val="19"/>
+          <w:sz w:val="22"/>
         </w:rPr>
         <w:tab/>
-        <w:t>4</w:t>
+        <w:t>5</w:t>
       </w:r>
     </w:p>
     <w:p>
@@ -209,16 +209,16 @@
       </w:pPr>
       <w:r>
         <w:rPr>
-          <w:sz w:val="19"/>
+          <w:sz w:val="22"/>
         </w:rPr>
         <w:t>Control flow and impact</w:t>
       </w:r>
       <w:r>
         <w:rPr>
-          <w:sz w:val="19"/>
+          <w:sz w:val="22"/>
         </w:rPr>
         <w:tab/>
-        <w:t>5</w:t>
+        <w:t>6</w:t>
       </w:r>
     </w:p>
     <w:p>
@@ -230,16 +230,16 @@
       </w:pPr>
       <w:r>
         <w:rPr>
-          <w:sz w:val="19"/>
+          <w:sz w:val="22"/>
         </w:rPr>
         <w:t>SQLite generations and durability</w:t>
       </w:r>
       <w:r>
         <w:rPr>
-          <w:sz w:val="19"/>
+          <w:sz w:val="22"/>
         </w:rPr>
         <w:tab/>
-        <w:t>5</w:t>
+        <w:t>6</w:t>
       </w:r>
     </w:p>
     <w:p>
@@ -251,16 +251,16 @@
       </w:pPr>
       <w:r>
         <w:rPr>
-          <w:sz w:val="19"/>
+          <w:sz w:val="22"/>
         </w:rPr>
         <w:t>Evidence and immutable history</w:t>
       </w:r>
       <w:r>
         <w:rPr>
-          <w:sz w:val="19"/>
+          <w:sz w:val="22"/>
         </w:rPr>
         <w:tab/>
-        <w:t>5</w:t>
+        <w:t>6</w:t>
       </w:r>
     </w:p>
     <w:p>
@@ -272,16 +272,16 @@
       </w:pPr>
       <w:r>
         <w:rPr>
-          <w:sz w:val="19"/>
+          <w:sz w:val="22"/>
         </w:rPr>
         <w:t>Background coordination and cached views</w:t>
       </w:r>
       <w:r>
         <w:rPr>
-          <w:sz w:val="19"/>
+          <w:sz w:val="22"/>
         </w:rPr>
         <w:tab/>
-        <w:t>6</w:t>
+        <w:t>7</w:t>
       </w:r>
     </w:p>
     <w:p>
@@ -293,16 +293,16 @@
       </w:pPr>
       <w:r>
         <w:rPr>
-          <w:sz w:val="19"/>
+          <w:sz w:val="22"/>
         </w:rPr>
         <w:t>FMX navigation and visualization</w:t>
       </w:r>
       <w:r>
         <w:rPr>
-          <w:sz w:val="19"/>
+          <w:sz w:val="22"/>
         </w:rPr>
         <w:tab/>
-        <w:t>6</w:t>
+        <w:t>7</w:t>
       </w:r>
     </w:p>
     <w:p>
@@ -314,16 +314,16 @@
       </w:pPr>
       <w:r>
         <w:rPr>
-          <w:sz w:val="19"/>
+          <w:sz w:val="22"/>
         </w:rPr>
         <w:t>Curated knowledge and review</w:t>
       </w:r>
       <w:r>
         <w:rPr>
-          <w:sz w:val="19"/>
+          <w:sz w:val="22"/>
         </w:rPr>
         <w:tab/>
-        <w:t>6</w:t>
+        <w:t>7</w:t>
       </w:r>
     </w:p>
     <w:p>
@@ -335,16 +335,16 @@
       </w:pPr>
       <w:r>
         <w:rPr>
-          <w:sz w:val="19"/>
+          <w:sz w:val="22"/>
         </w:rPr>
         <w:t>Canonical publication and privacy</w:t>
       </w:r>
       <w:r>
         <w:rPr>
-          <w:sz w:val="19"/>
+          <w:sz w:val="22"/>
         </w:rPr>
         <w:tab/>
-        <w:t>7</w:t>
+        <w:t>8</w:t>
       </w:r>
     </w:p>
     <w:p>
@@ -356,16 +356,16 @@
       </w:pPr>
       <w:r>
         <w:rPr>
-          <w:sz w:val="19"/>
+          <w:sz w:val="22"/>
         </w:rPr>
         <w:t>HTML guides and bundle validation</w:t>
       </w:r>
       <w:r>
         <w:rPr>
-          <w:sz w:val="19"/>
+          <w:sz w:val="22"/>
         </w:rPr>
         <w:tab/>
-        <w:t>7</w:t>
+        <w:t>8</w:t>
       </w:r>
     </w:p>
     <w:p>
@@ -377,16 +377,16 @@
       </w:pPr>
       <w:r>
         <w:rPr>
-          <w:sz w:val="19"/>
+          <w:sz w:val="22"/>
         </w:rPr>
         <w:t>Translation boundary</w:t>
       </w:r>
       <w:r>
         <w:rPr>
-          <w:sz w:val="19"/>
+          <w:sz w:val="22"/>
         </w:rPr>
         <w:tab/>
-        <w:t>8</w:t>
+        <w:t>9</w:t>
       </w:r>
     </w:p>
     <w:p>
@@ -398,16 +398,16 @@
       </w:pPr>
       <w:r>
         <w:rPr>
-          <w:sz w:val="19"/>
+          <w:sz w:val="22"/>
         </w:rPr>
         <w:t>Verification and release discipline</w:t>
       </w:r>
       <w:r>
         <w:rPr>
-          <w:sz w:val="19"/>
+          <w:sz w:val="22"/>
         </w:rPr>
         <w:tab/>
-        <w:t>8</w:t>
+        <w:t>9</w:t>
       </w:r>
     </w:p>
     <w:p>
@@ -419,16 +419,16 @@
       </w:pPr>
       <w:r>
         <w:rPr>
-          <w:sz w:val="19"/>
+          <w:sz w:val="22"/>
         </w:rPr>
         <w:t>Current semantic cache and extended evidence</w:t>
       </w:r>
       <w:r>
         <w:rPr>
-          <w:sz w:val="19"/>
+          <w:sz w:val="22"/>
         </w:rPr>
         <w:tab/>
-        <w:t>8</w:t>
+        <w:t>9</w:t>
       </w:r>
     </w:p>
     <w:p>
@@ -440,16 +440,16 @@
       </w:pPr>
       <w:r>
         <w:rPr>
-          <w:sz w:val="19"/>
+          <w:sz w:val="22"/>
         </w:rPr>
         <w:t>Current schema and authored document contracts</w:t>
       </w:r>
       <w:r>
         <w:rPr>
-          <w:sz w:val="19"/>
+          <w:sz w:val="22"/>
         </w:rPr>
         <w:tab/>
-        <w:t>9</w:t>
+        <w:t>10</w:t>
       </w:r>
     </w:p>
     <w:p>
@@ -461,16 +461,16 @@
       </w:pPr>
       <w:r>
         <w:rPr>
-          <w:sz w:val="19"/>
+          <w:sz w:val="22"/>
         </w:rPr>
         <w:t>Native review and learning projections</w:t>
       </w:r>
       <w:r>
         <w:rPr>
-          <w:sz w:val="19"/>
+          <w:sz w:val="22"/>
         </w:rPr>
         <w:tab/>
-        <w:t>9</w:t>
+        <w:t>10</w:t>
       </w:r>
     </w:p>
     <w:p>
@@ -482,16 +482,16 @@
       </w:pPr>
       <w:r>
         <w:rPr>
-          <w:sz w:val="19"/>
+          <w:sz w:val="22"/>
         </w:rPr>
         <w:t>Saved observation persistence</w:t>
       </w:r>
       <w:r>
         <w:rPr>
-          <w:sz w:val="19"/>
+          <w:sz w:val="22"/>
         </w:rPr>
         <w:tab/>
-        <w:t>9</w:t>
+        <w:t>10</w:t>
       </w:r>
     </w:p>
     <w:p>
@@ -503,16 +503,16 @@
       </w:pPr>
       <w:r>
         <w:rPr>
-          <w:sz w:val="19"/>
+          <w:sz w:val="22"/>
         </w:rPr>
         <w:t>Regression commands and evidence</w:t>
       </w:r>
       <w:r>
         <w:rPr>
-          <w:sz w:val="19"/>
+          <w:sz w:val="22"/>
         </w:rPr>
         <w:tab/>
-        <w:t>10</w:t>
+        <w:t>11</w:t>
       </w:r>
     </w:p>
     <w:p>
@@ -524,16 +524,16 @@
       </w:pPr>
       <w:r>
         <w:rPr>
-          <w:sz w:val="19"/>
+          <w:sz w:val="22"/>
         </w:rPr>
         <w:t>Rebuild and inspect these manuals</w:t>
       </w:r>
       <w:r>
         <w:rPr>
-          <w:sz w:val="19"/>
+          <w:sz w:val="22"/>
         </w:rPr>
         <w:tab/>
-        <w:t>10</w:t>
+        <w:t>11</w:t>
       </w:r>
     </w:p>
     <w:p>
@@ -545,16 +545,16 @@
       </w:pPr>
       <w:r>
         <w:rPr>
-          <w:sz w:val="19"/>
+          <w:sz w:val="22"/>
         </w:rPr>
         <w:t>Business glossary implementation and checks</w:t>
       </w:r>
       <w:r>
         <w:rPr>
-          <w:sz w:val="19"/>
+          <w:sz w:val="22"/>
         </w:rPr>
         <w:tab/>
-        <w:t>11</w:t>
+        <w:t>12</w:t>
       </w:r>
     </w:p>
     <w:p>
@@ -566,16 +566,16 @@
       </w:pPr>
       <w:r>
         <w:rPr>
-          <w:sz w:val="19"/>
+          <w:sz w:val="22"/>
         </w:rPr>
         <w:t>Offline translation and localized publication</w:t>
       </w:r>
       <w:r>
         <w:rPr>
-          <w:sz w:val="19"/>
+          <w:sz w:val="22"/>
         </w:rPr>
         <w:tab/>
-        <w:t>11</w:t>
+        <w:t>12</w:t>
       </w:r>
     </w:p>
     <w:p>
@@ -587,16 +587,16 @@
       </w:pPr>
       <w:r>
         <w:rPr>
-          <w:sz w:val="19"/>
+          <w:sz w:val="22"/>
         </w:rPr>
         <w:t>Native validation and release evidence</w:t>
       </w:r>
       <w:r>
         <w:rPr>
-          <w:sz w:val="19"/>
+          <w:sz w:val="22"/>
         </w:rPr>
         <w:tab/>
-        <w:t>12</w:t>
+        <w:t>13</w:t>
       </w:r>
     </w:p>
     <w:p>
@@ -608,16 +608,16 @@
       </w:pPr>
       <w:r>
         <w:rPr>
-          <w:sz w:val="19"/>
+          <w:sz w:val="22"/>
         </w:rPr>
         <w:t>Structured project profile contract</w:t>
       </w:r>
       <w:r>
         <w:rPr>
-          <w:sz w:val="19"/>
+          <w:sz w:val="22"/>
         </w:rPr>
         <w:tab/>
-        <w:t>12</w:t>
+        <w:t>13</w:t>
       </w:r>
     </w:p>
     <w:p>
@@ -629,16 +629,16 @@
       </w:pPr>
       <w:r>
         <w:rPr>
-          <w:sz w:val="19"/>
+          <w:sz w:val="22"/>
         </w:rPr>
         <w:t>Quality analysis and revision comparison</w:t>
       </w:r>
       <w:r>
         <w:rPr>
-          <w:sz w:val="19"/>
+          <w:sz w:val="22"/>
         </w:rPr>
         <w:tab/>
-        <w:t>13</w:t>
+        <w:t>14</w:t>
       </w:r>
     </w:p>
     <w:p>
@@ -650,20 +650,21 @@
       </w:pPr>
       <w:r>
         <w:rPr>
-          <w:sz w:val="19"/>
+          <w:sz w:val="22"/>
         </w:rPr>
         <w:t>Keyboard inspector implementation and validation</w:t>
       </w:r>
       <w:r>
         <w:rPr>
-          <w:sz w:val="19"/>
+          <w:sz w:val="22"/>
         </w:rPr>
         <w:tab/>
-        <w:t>13</w:t>
-      </w:r>
-    </w:p>
-    <w:p>
-      <w:pPr>
+        <w:t>14</w:t>
+      </w:r>
+    </w:p>
+    <w:p>
+      <w:pPr>
+        <w:pageBreakBefore/>
         <w:spacing w:after="0" w:line="240" w:lineRule="auto"/>
         <w:tabs>
           <w:tab w:val="right" w:leader="dot" w:pos="9360"/>
@@ -671,16 +672,16 @@
       </w:pPr>
       <w:r>
         <w:rPr>
-          <w:sz w:val="19"/>
+          <w:sz w:val="22"/>
         </w:rPr>
         <w:t>Command inventory implementation and validation</w:t>
       </w:r>
       <w:r>
         <w:rPr>
-          <w:sz w:val="19"/>
+          <w:sz w:val="22"/>
         </w:rPr>
         <w:tab/>
-        <w:t>14</w:t>
+        <w:t>15</w:t>
       </w:r>
     </w:p>
     <w:p>
@@ -692,16 +693,16 @@
       </w:pPr>
       <w:r>
         <w:rPr>
-          <w:sz w:val="19"/>
+          <w:sz w:val="22"/>
         </w:rPr>
         <w:t>Dynamic control relationships and validation</w:t>
       </w:r>
       <w:r>
         <w:rPr>
-          <w:sz w:val="19"/>
+          <w:sz w:val="22"/>
         </w:rPr>
         <w:tab/>
-        <w:t>14</w:t>
+        <w:t>15</w:t>
       </w:r>
     </w:p>
     <w:p>
@@ -713,16 +714,16 @@
       </w:pPr>
       <w:r>
         <w:rPr>
-          <w:sz w:val="19"/>
+          <w:sz w:val="22"/>
         </w:rPr>
         <w:t>Layout rule explanations and validation</w:t>
       </w:r>
       <w:r>
         <w:rPr>
-          <w:sz w:val="19"/>
+          <w:sz w:val="22"/>
         </w:rPr>
         <w:tab/>
-        <w:t>14</w:t>
+        <w:t>15</w:t>
       </w:r>
     </w:p>
     <w:p>
@@ -734,16 +735,16 @@
       </w:pPr>
       <w:r>
         <w:rPr>
-          <w:sz w:val="19"/>
+          <w:sz w:val="22"/>
         </w:rPr>
         <w:t>Component dependencies and attributed metadata</w:t>
       </w:r>
       <w:r>
         <w:rPr>
-          <w:sz w:val="19"/>
+          <w:sz w:val="22"/>
         </w:rPr>
         <w:tab/>
-        <w:t>15</w:t>
+        <w:t>16</w:t>
       </w:r>
     </w:p>
     <w:p>
@@ -755,16 +756,16 @@
       </w:pPr>
       <w:r>
         <w:rPr>
-          <w:sz w:val="19"/>
+          <w:sz w:val="22"/>
         </w:rPr>
         <w:t>Resolve form inheritance and frame overlays</w:t>
       </w:r>
       <w:r>
         <w:rPr>
-          <w:sz w:val="19"/>
+          <w:sz w:val="22"/>
         </w:rPr>
         <w:tab/>
-        <w:t>16</w:t>
+        <w:t>17</w:t>
       </w:r>
     </w:p>
     <w:p>
@@ -776,16 +777,16 @@
       </w:pPr>
       <w:r>
         <w:rPr>
-          <w:sz w:val="19"/>
+          <w:sz w:val="22"/>
         </w:rPr>
         <w:t>Store attributed action purpose mappings</w:t>
       </w:r>
       <w:r>
         <w:rPr>
-          <w:sz w:val="19"/>
+          <w:sz w:val="22"/>
         </w:rPr>
         <w:tab/>
-        <w:t>16</w:t>
+        <w:t>17</w:t>
       </w:r>
     </w:p>
     <w:p>
@@ -797,16 +798,16 @@
       </w:pPr>
       <w:r>
         <w:rPr>
-          <w:sz w:val="19"/>
+          <w:sz w:val="22"/>
         </w:rPr>
         <w:t>Compare attributed screen evidence and captured layouts</w:t>
       </w:r>
       <w:r>
         <w:rPr>
-          <w:sz w:val="19"/>
+          <w:sz w:val="22"/>
         </w:rPr>
         <w:tab/>
-        <w:t>17</w:t>
+        <w:t>18</w:t>
       </w:r>
     </w:p>
     <w:p>
@@ -818,16 +819,16 @@
       </w:pPr>
       <w:r>
         <w:rPr>
-          <w:sz w:val="19"/>
+          <w:sz w:val="22"/>
         </w:rPr>
         <w:t>Build a safe captured database connection inventory</w:t>
       </w:r>
       <w:r>
         <w:rPr>
-          <w:sz w:val="19"/>
+          <w:sz w:val="22"/>
         </w:rPr>
         <w:tab/>
-        <w:t>17</w:t>
+        <w:t>18</w:t>
       </w:r>
     </w:p>
     <w:p>
@@ -839,16 +840,16 @@
       </w:pPr>
       <w:r>
         <w:rPr>
-          <w:sz w:val="19"/>
+          <w:sz w:val="22"/>
         </w:rPr>
         <w:t>Derive captured database engine and version evidence</w:t>
       </w:r>
       <w:r>
         <w:rPr>
-          <w:sz w:val="19"/>
+          <w:sz w:val="22"/>
         </w:rPr>
         <w:tab/>
-        <w:t>18</w:t>
+        <w:t>19</w:t>
       </w:r>
     </w:p>
     <w:p>
@@ -860,16 +861,16 @@
       </w:pPr>
       <w:r>
         <w:rPr>
-          <w:sz w:val="19"/>
+          <w:sz w:val="22"/>
         </w:rPr>
         <w:t>Inspect captured database schema evidence</w:t>
       </w:r>
       <w:r>
         <w:rPr>
-          <w:sz w:val="19"/>
+          <w:sz w:val="22"/>
         </w:rPr>
         <w:tab/>
-        <w:t>19</w:t>
+        <w:t>20</w:t>
       </w:r>
     </w:p>
     <w:p>
@@ -881,16 +882,16 @@
       </w:pPr>
       <w:r>
         <w:rPr>
-          <w:sz w:val="19"/>
+          <w:sz w:val="22"/>
         </w:rPr>
         <w:t>Extract captured column declarations and constraint text</w:t>
       </w:r>
       <w:r>
         <w:rPr>
-          <w:sz w:val="19"/>
+          <w:sz w:val="22"/>
         </w:rPr>
         <w:tab/>
-        <w:t>19</w:t>
+        <w:t>20</w:t>
       </w:r>
     </w:p>
     <w:p>
@@ -902,16 +903,16 @@
       </w:pPr>
       <w:r>
         <w:rPr>
-          <w:sz w:val="19"/>
+          <w:sz w:val="22"/>
         </w:rPr>
         <w:t>Resolve captured key membership and references</w:t>
       </w:r>
       <w:r>
         <w:rPr>
-          <w:sz w:val="19"/>
+          <w:sz w:val="22"/>
         </w:rPr>
         <w:tab/>
-        <w:t>20</w:t>
+        <w:t>21</w:t>
       </w:r>
     </w:p>
     <w:p>
@@ -923,16 +924,16 @@
       </w:pPr>
       <w:r>
         <w:rPr>
-          <w:sz w:val="19"/>
+          <w:sz w:val="22"/>
         </w:rPr>
         <w:t>Capture index structures and SQL reference evidence</w:t>
       </w:r>
       <w:r>
         <w:rPr>
-          <w:sz w:val="19"/>
+          <w:sz w:val="22"/>
         </w:rPr>
         <w:tab/>
-        <w:t>21</w:t>
+        <w:t>22</w:t>
       </w:r>
     </w:p>
     <w:p>
@@ -944,16 +945,16 @@
       </w:pPr>
       <w:r>
         <w:rPr>
-          <w:sz w:val="19"/>
+          <w:sz w:val="22"/>
         </w:rPr>
         <w:t>Capture stored-object definitions and dependencies</w:t>
       </w:r>
       <w:r>
         <w:rPr>
-          <w:sz w:val="19"/>
+          <w:sz w:val="22"/>
         </w:rPr>
         <w:tab/>
-        <w:t>22</w:t>
+        <w:t>23</w:t>
       </w:r>
     </w:p>
     <w:p>
@@ -965,16 +966,16 @@
       </w:pPr>
       <w:r>
         <w:rPr>
-          <w:sz w:val="19"/>
+          <w:sz w:val="22"/>
         </w:rPr>
         <w:t>Project captured entity relationship metadata</w:t>
       </w:r>
       <w:r>
         <w:rPr>
-          <w:sz w:val="19"/>
+          <w:sz w:val="22"/>
         </w:rPr>
         <w:tab/>
-        <w:t>23</w:t>
+        <w:t>24</w:t>
       </w:r>
     </w:p>
     <w:p>
@@ -986,16 +987,16 @@
       </w:pPr>
       <w:r>
         <w:rPr>
-          <w:sz w:val="19"/>
+          <w:sz w:val="22"/>
         </w:rPr>
         <w:t>Maintain attributed schema dictionaries</w:t>
       </w:r>
       <w:r>
         <w:rPr>
-          <w:sz w:val="19"/>
+          <w:sz w:val="22"/>
         </w:rPr>
         <w:tab/>
-        <w:t>24</w:t>
+        <w:t>25</w:t>
       </w:r>
     </w:p>
     <w:p>
@@ -1007,16 +1008,16 @@
       </w:pPr>
       <w:r>
         <w:rPr>
-          <w:sz w:val="19"/>
+          <w:sz w:val="22"/>
         </w:rPr>
         <w:t>Resolve captured dataset and field bindings</w:t>
       </w:r>
       <w:r>
         <w:rPr>
-          <w:sz w:val="19"/>
+          <w:sz w:val="22"/>
         </w:rPr>
         <w:tab/>
-        <w:t>25</w:t>
+        <w:t>26</w:t>
       </w:r>
     </w:p>
     <w:p>
@@ -1028,16 +1029,16 @@
       </w:pPr>
       <w:r>
         <w:rPr>
-          <w:sz w:val="19"/>
+          <w:sz w:val="22"/>
         </w:rPr>
         <w:t>Recognize captured database operation requests</w:t>
       </w:r>
       <w:r>
         <w:rPr>
-          <w:sz w:val="19"/>
+          <w:sz w:val="22"/>
         </w:rPr>
         <w:tab/>
-        <w:t>26</w:t>
+        <w:t>27</w:t>
       </w:r>
     </w:p>
     <w:p>
@@ -1049,16 +1050,16 @@
       </w:pPr>
       <w:r>
         <w:rPr>
-          <w:sz w:val="19"/>
+          <w:sz w:val="22"/>
         </w:rPr>
         <w:t>Trace captured transaction boundaries</w:t>
       </w:r>
       <w:r>
         <w:rPr>
-          <w:sz w:val="19"/>
+          <w:sz w:val="22"/>
         </w:rPr>
         <w:tab/>
-        <w:t>26</w:t>
+        <w:t>27</w:t>
       </w:r>
     </w:p>
     <w:p>
@@ -1070,16 +1071,16 @@
       </w:pPr>
       <w:r>
         <w:rPr>
-          <w:sz w:val="19"/>
+          <w:sz w:val="22"/>
         </w:rPr>
         <w:t>Capture field validation and transformation evidence</w:t>
       </w:r>
       <w:r>
         <w:rPr>
-          <w:sz w:val="19"/>
+          <w:sz w:val="22"/>
         </w:rPr>
         <w:tab/>
-        <w:t>27</w:t>
+        <w:t>28</w:t>
       </w:r>
     </w:p>
     <w:p>
@@ -1091,16 +1092,16 @@
       </w:pPr>
       <w:r>
         <w:rPr>
-          <w:sz w:val="19"/>
+          <w:sz w:val="22"/>
         </w:rPr>
         <w:t>Connect source evidence into scoped lineage</w:t>
       </w:r>
       <w:r>
         <w:rPr>
-          <w:sz w:val="19"/>
+          <w:sz w:val="22"/>
         </w:rPr>
         <w:tab/>
-        <w:t>27</w:t>
+        <w:t>28</w:t>
       </w:r>
     </w:p>
     <w:p>
@@ -1112,16 +1113,16 @@
       </w:pPr>
       <w:r>
         <w:rPr>
-          <w:sz w:val="19"/>
+          <w:sz w:val="22"/>
         </w:rPr>
         <w:t>Project captured migration and version evidence</w:t>
       </w:r>
       <w:r>
         <w:rPr>
-          <w:sz w:val="19"/>
+          <w:sz w:val="22"/>
         </w:rPr>
         <w:tab/>
-        <w:t>28</w:t>
+        <w:t>29</w:t>
       </w:r>
     </w:p>
     <w:p>
@@ -1133,16 +1134,37 @@
       </w:pPr>
       <w:r>
         <w:rPr>
-          <w:sz w:val="19"/>
+          <w:sz w:val="22"/>
+        </w:rPr>
+        <w:t>Project captured file formats and contracts</w:t>
+      </w:r>
+      <w:r>
+        <w:rPr>
+          <w:sz w:val="22"/>
+        </w:rPr>
+        <w:tab/>
+        <w:t>30</w:t>
+      </w:r>
+    </w:p>
+    <w:p>
+      <w:pPr>
+        <w:spacing w:after="0" w:line="240" w:lineRule="auto"/>
+        <w:tabs>
+          <w:tab w:val="right" w:leader="dot" w:pos="9360"/>
+        </w:tabs>
+      </w:pPr>
+      <w:r>
+        <w:rPr>
+          <w:sz w:val="22"/>
         </w:rPr>
         <w:t>Source and revision evidence</w:t>
       </w:r>
       <w:r>
         <w:rPr>
-          <w:sz w:val="19"/>
+          <w:sz w:val="22"/>
         </w:rPr>
         <w:tab/>
-        <w:t>29</w:t>
+        <w:t>30</w:t>
       </w:r>
     </w:p>
     <w:p>
@@ -2515,6 +2537,34 @@
     <w:p>
       <w:r>
         <w:t>Existing SQL bounds are 2 MiB characters, 100000 tokens and 10000 combined schema rows. Migration detail bounds are 250 displayed version assignments, 8000 characters of verification requests and 1000 loader entries, with explicit truncation. IDE-editable kind/state selectors, paging, evidence memo, source guards and relationship navigation are reused. The focused tools/build-schema-history.cmd suite exercises actual parsing, persisted reopening, numeric-prefix conflicts, missing sources, version/counter distinctions, nested blocks, redaction, limits, native filters and navigation. Shared schema, ER, stored-object and lineage regressions verify the same projection remains compatible.</w:t>
+      </w:r>
+    </w:p>
+    <w:p>
+      <w:pPr>
+        <w:pStyle w:val="Heading1"/>
+      </w:pPr>
+      <w:r>
+        <w:t>Project captured file formats and contracts</w:t>
+      </w:r>
+    </w:p>
+    <w:p>
+      <w:r>
+        <w:t>TDPHWorkspaceView.FileFormats projects existing IR and semantic captures without a schema or analyzer change. Supported captured JSON, XML and INI resources show member shapes while omitting scalar values. Member names are bounded and unsafe names are omitted. Each resource shows at most 250 members and an explicit total/limit. The combined inventory is capped at 10000 rows with visible truncation.</w:t>
+      </w:r>
+    </w:p>
+    <w:p>
+      <w:r>
+        <w:t>Outer expression tokens identify dotted ReadAllText/Bytes/Lines, WriteAllText/Bytes/Lines, LoadFromFile and SaveToFile spellings. Quoted strings remain single tokens and comments do not become APIs. A supported literal first argument contributes only a safe filename extension. Explicit TEncoding argument spellings remain candidates; byte APIs remain binary candidates. Enclosing captured routine identity provides a producer or consumer link. Evidence retains source hash, generation and enclosing expression range; custom receivers and runtime dispatch are unverified.</w:t>
+      </w:r>
+    </w:p>
+    <w:p>
+      <w:r>
+        <w:t>DPH.UI.Main and its serialized FMX resource provide kind/text filters, 250-row paging, labeled evidence, guarded source opening, routine explanation and contract drafts. No runtime controls, helper unit or target execution is introduced. Deterministic contract titles include the exact row and source hash. Existing attributed Knowledge storage supplies immutable revision history and separate review. A contract draft includes encoding/BOM, schema and required fields, producer/consumer mappings, validation, compatibility, verification and remaining unknowns.</w:t>
+      </w:r>
+    </w:p>
+    <w:p>
+      <w:r>
+        <w:t>Run tools/build-file-formats.cmd elevated for the focused actual-parser, persistence and native FMX checks. It uses fixed ignored bin/file-formats-validation fixtures and verifies redaction, routine identity, explicit encoding candidates, resource/transfer distinctions, large shapes, paging, saved contracts, source-change and detached-source refusal, compact layout and unchanged captured source/catalog. Shared schema-history, lineage, Knowledge and publishing regressions and tools/build-wp0.cmd validate integration. Candidate evidence and authored contracts do not establish a formal schema, runtime transfer success or deployed compatibility.</w:t>
       </w:r>
     </w:p>
     <w:p>
@@ -3319,7 +3369,7 @@
           <w:rFonts w:ascii="Consolas" w:hAnsi="Consolas"/>
           <w:sz w:val="16"/>
         </w:rPr>
-        <w:t>1e3d29f890b3827ff1bb9f7156df8d3420b1b67d7812e9bac3ccad31e0cf0937</w:t>
+        <w:t>f1f248e67d51cc4b4047c684491bcf2c275fa2abc5e785139ca7e4dc25eb20e9</w:t>
       </w:r>
     </w:p>
     <w:p>
@@ -3655,7 +3705,7 @@
           <w:rFonts w:ascii="Consolas" w:hAnsi="Consolas"/>
           <w:sz w:val="16"/>
         </w:rPr>
-        <w:t>03bbe5a9dc0943758be56898659bff9381ccb0707cf22a449e5c8e158a8b82bf</w:t>
+        <w:t>74cf89748b06e15b73637e74ea57f1162b7fd1b31ce48522783cb6ae9893a4d8</w:t>
       </w:r>
     </w:p>
     <w:p>
@@ -3751,7 +3801,7 @@
           <w:rFonts w:ascii="Consolas" w:hAnsi="Consolas"/>
           <w:sz w:val="16"/>
         </w:rPr>
-        <w:t>3a8b8550832a79f1514ec5dcd898e939b11f6bfd7b769af477e4e38d88411905</w:t>
+        <w:t>03c3afd6487178ea008b05f78673fc0ca83f2d12fc7304efb815299c16e5beb6</w:t>
       </w:r>
     </w:p>
     <w:p>

</xml_diff>

<commit_message>
Add attributed target data retention policies for requirement 05.18
</commit_message>
<xml_diff>
--- a/docs/guides/DPH_Engineering_Guide.docx
+++ b/docs/guides/DPH_Engineering_Guide.docx
@@ -1157,7 +1157,7 @@
         <w:rPr>
           <w:sz w:val="22"/>
         </w:rPr>
-        <w:t>Source and revision evidence</w:t>
+        <w:t>Maintain attributed target retention requirements</w:t>
       </w:r>
       <w:r>
         <w:rPr>
@@ -1169,6 +1169,27 @@
     </w:p>
     <w:p>
       <w:pPr>
+        <w:spacing w:after="0" w:line="240" w:lineRule="auto"/>
+        <w:tabs>
+          <w:tab w:val="right" w:leader="dot" w:pos="9360"/>
+        </w:tabs>
+      </w:pPr>
+      <w:r>
+        <w:rPr>
+          <w:sz w:val="22"/>
+        </w:rPr>
+        <w:t>Source and revision evidence</w:t>
+      </w:r>
+      <w:r>
+        <w:rPr>
+          <w:sz w:val="22"/>
+        </w:rPr>
+        <w:tab/>
+        <w:t>31</w:t>
+      </w:r>
+    </w:p>
+    <w:p>
+      <w:pPr>
         <w:spacing w:before="0" w:after="0" w:line="20" w:lineRule="exact"/>
       </w:pPr>
       <w:r>
@@ -2565,6 +2586,34 @@
     <w:p>
       <w:r>
         <w:t>Run tools/build-file-formats.cmd elevated for the focused actual-parser, persistence and native FMX checks. It uses fixed ignored bin/file-formats-validation fixtures and verifies redaction, routine identity, explicit encoding candidates, resource/transfer distinctions, large shapes, paging, saved contracts, source-change and detached-source refusal, compact layout and unchanged captured source/catalog. Shared schema-history, lineage, Knowledge and publishing regressions and tools/build-wp0.cmd validate integration. Candidate evidence and authored contracts do not establish a formal schema, runtime transfer success or deployed compatibility.</w:t>
+      </w:r>
+    </w:p>
+    <w:p>
+      <w:pPr>
+        <w:pStyle w:val="Heading1"/>
+      </w:pPr>
+      <w:r>
+        <w:t>Maintain attributed target retention requirements</w:t>
+      </w:r>
+    </w:p>
+    <w:p>
+      <w:r>
+        <w:t>Requirement 05.18 is an attributed manual-capture workflow. TDPHWorkspaceView provides the target-policy template, typed-record recognition, metadata validation and readable evidence. Native DataRetention controls in DPH.UI.Main.fmx provide state/text filtering, bounded 250-row pages, labeled scrollable details, draft preparation and existing Knowledge/link navigation. Controls remain editable in the IDE. No helper unit, analyzer pass or storage migration is introduced.</w:t>
+      </w:r>
+    </w:p>
+    <w:p>
+      <w:r>
+        <w:t>Structured metadata contains record_type data_retention and a stable GUID policy_id. The existing attributed body remains editable; identity and kind stay protected. TDPHKnowledgeStore.SaveKnowledge validates metadata, rejects the default title, anonymous authors, removed heading, wrong business-rule/maintenance/maintainer scope, duplicate identities, identity changes and discarded structured metadata. Existing optimistic revisions, named review, immutable history and exact rich links remain authoritative. Unknown fields are deliberately permitted and visibly unresolved; policy prose is human evidence, not an inferred legal rule.</w:t>
+      </w:r>
+    </w:p>
+    <w:p>
+      <w:r>
+        <w:t>The register distinguishes original contributor from current revision editor and shows the named reviewer and explicit link count. Existing Knowledge links support captured semantic routines, evidence and exact procedure-section revisions. Publication includes these requirements and typed identities in maintenance/all-reader handoffs through existing audience and redaction rules. No source application, SQL, deletion or archive job executes. DPH snapshot controls are distinct from the selected application's retention requirements.</w:t>
+      </w:r>
+    </w:p>
+    <w:p>
+      <w:r>
+        <w:t>Run tools/build-data-retention.cmd elevated. The focused suite uses a real parsed controlled Retention.dpr capture, persisted attributed policies, metadata rejection cases, immutable review/edit history, routine and procedure links, canonical/HTML export and complete bundle validation, native paging/filtering, draft guards and compact rendering. Knowledge, publishing and file-format regressions and tools/build-wp0.cmd cover shared paths. Controlled outputs remain under ignored bin/data-retention-validation; no owner project source or catalog is modified.</w:t>
       </w:r>
     </w:p>
     <w:p>
@@ -3225,7 +3274,7 @@
           <w:rFonts w:ascii="Consolas" w:hAnsi="Consolas"/>
           <w:sz w:val="16"/>
         </w:rPr>
-        <w:t>88dd64242abb30706a448fe064978c22d641b9541ce67a2e55e40bacc045b005</w:t>
+        <w:t>323e07e2255dc9c0780c42aaab2fea8cfdb03143a82eb1ec628eb9f8b8d0312e</w:t>
       </w:r>
     </w:p>
     <w:p>
@@ -3369,7 +3418,7 @@
           <w:rFonts w:ascii="Consolas" w:hAnsi="Consolas"/>
           <w:sz w:val="16"/>
         </w:rPr>
-        <w:t>f1f248e67d51cc4b4047c684491bcf2c275fa2abc5e785139ca7e4dc25eb20e9</w:t>
+        <w:t>95803c5ffa1cb7cb42a619ac78bb8cc74766ddda1be32a448b14b2d5e4963c46</w:t>
       </w:r>
     </w:p>
     <w:p>
@@ -3705,7 +3754,7 @@
           <w:rFonts w:ascii="Consolas" w:hAnsi="Consolas"/>
           <w:sz w:val="16"/>
         </w:rPr>
-        <w:t>74cf89748b06e15b73637e74ea57f1162b7fd1b31ce48522783cb6ae9893a4d8</w:t>
+        <w:t>e53b536fb48bc324aff44773dc77e56dfd79298323d294f938586e729e50dc79</w:t>
       </w:r>
     </w:p>
     <w:p>
@@ -3801,7 +3850,7 @@
           <w:rFonts w:ascii="Consolas" w:hAnsi="Consolas"/>
           <w:sz w:val="16"/>
         </w:rPr>
-        <w:t>03c3afd6487178ea008b05f78673fc0ca83f2d12fc7304efb815299c16e5beb6</w:t>
+        <w:t>ec537909d3115a294a09d0bf2efc4b2af06e75d806aff2edfb07da72c95b89c6</w:t>
       </w:r>
     </w:p>
     <w:p>

</xml_diff>

<commit_message>
Add target data quality rules and attributed check reports for requirement 05.19
</commit_message>
<xml_diff>
--- a/docs/guides/DPH_Engineering_Guide.docx
+++ b/docs/guides/DPH_Engineering_Guide.docx
@@ -1178,7 +1178,7 @@
         <w:rPr>
           <w:sz w:val="22"/>
         </w:rPr>
-        <w:t>Source and revision evidence</w:t>
+        <w:t>Maintain target data quality evidence and report imports</w:t>
       </w:r>
       <w:r>
         <w:rPr>
@@ -1190,6 +1190,27 @@
     </w:p>
     <w:p>
       <w:pPr>
+        <w:spacing w:after="0" w:line="240" w:lineRule="auto"/>
+        <w:tabs>
+          <w:tab w:val="right" w:leader="dot" w:pos="9360"/>
+        </w:tabs>
+      </w:pPr>
+      <w:r>
+        <w:rPr>
+          <w:sz w:val="22"/>
+        </w:rPr>
+        <w:t>Source and revision evidence</w:t>
+      </w:r>
+      <w:r>
+        <w:rPr>
+          <w:sz w:val="22"/>
+        </w:rPr>
+        <w:tab/>
+        <w:t>32</w:t>
+      </w:r>
+    </w:p>
+    <w:p>
+      <w:pPr>
         <w:spacing w:before="0" w:after="0" w:line="20" w:lineRule="exact"/>
       </w:pPr>
       <w:r>
@@ -2614,6 +2635,34 @@
     <w:p>
       <w:r>
         <w:t>Run tools/build-data-retention.cmd elevated. The focused suite uses a real parsed controlled Retention.dpr capture, persisted attributed policies, metadata rejection cases, immutable review/edit history, routine and procedure links, canonical/HTML export and complete bundle validation, native paging/filtering, draft guards and compact rendering. Knowledge, publishing and file-format regressions and tools/build-wp0.cmd cover shared paths. Controlled outputs remain under ignored bin/data-retention-validation; no owner project source or catalog is modified.</w:t>
+      </w:r>
+    </w:p>
+    <w:p>
+      <w:pPr>
+        <w:pStyle w:val="Heading1"/>
+      </w:pPr>
+      <w:r>
+        <w:t>Maintain target data quality evidence and report imports</w:t>
+      </w:r>
+    </w:p>
+    <w:p>
+      <w:r>
+        <w:t>TDPHWorkspaceView provides NewDataQualityRule, typed record recognition, metadata validation and attributed details in the existing model unit. Stable record_type data_quality and GUID rule_id identify each rule or imported report. Native controls are serialized in DPH.UI.Main.fmx for IDE editing: state/text filters, 250-row pages, command bars, contributor/context inputs, labeled evidence, New/Open, implementation links and import. Main guards unsaved Knowledge drafts and reuses existing revision, review and rich-link workflows. No helper unit, storage migration or target execution is introduced.</w:t>
+      </w:r>
+    </w:p>
+    <w:p>
+      <w:r>
+        <w:t>TDPHKnowledgeStore.SaveKnowledge validates quality identity, heading, business-rule kind and project maintenance/maintainer scope, rejects placeholder titles, duplicate identities, changed identities and discarded structured metadata. The body remains editable and exact prior revisions remain in history. ImportDataQualityReport reads only explicitly selected .txt/.log/.json files, checks both before/after read sizes at 32 KiB, requires round-trip UTF-8 and rejects empty/NUL text. It hashes the original bytes and saves literal text with contributor, context, UTC, generation and an explicit unverified-claim qualification through SaveKnowledge.</w:t>
+      </w:r>
+    </w:p>
+    <w:p>
+      <w:r>
+        <w:t>The import_data_quality worker command opens the selected store using its actual source root, imports on the existing background writer and returns saved Knowledge. Report imports do not execute a parser for report commands, SQL, scripts or target code. Publication uses the normal maintenance scope and escapes report markup in HTML; imported measurements remain unverified even when hash-consistent. Exact section links associate rule, operator procedure and imported report revisions; entity/evidence links preserve captured implementation references. DPH storage integrity and selected-data quality remain distinct.</w:t>
+      </w:r>
+    </w:p>
+    <w:p>
+      <w:r>
+        <w:t>Run tools/build-data-quality.cmd elevated for real parsing/persistence, identity and invalid-save cases, immutable review/edit history, implementation/procedure/result links, native filtering/paging/draft guards, compact rendering, UTF-8/size/NUL rejection, report hashes, literal HTML, full handoff validation, unchanged source/catalog and actual background import. The worker test releases the test writer before opening the background writer. Knowledge, publishing, retention and actual application/FMX regressions cover shared paths. Fixed ignored bin/data-quality-validation holds controlled fixtures.</w:t>
       </w:r>
     </w:p>
     <w:p>
@@ -3274,7 +3323,7 @@
           <w:rFonts w:ascii="Consolas" w:hAnsi="Consolas"/>
           <w:sz w:val="16"/>
         </w:rPr>
-        <w:t>323e07e2255dc9c0780c42aaab2fea8cfdb03143a82eb1ec628eb9f8b8d0312e</w:t>
+        <w:t>19a2c54d28475de14fc6419deb149cdc7df2d4503077049a542fe5ca02ca6077</w:t>
       </w:r>
     </w:p>
     <w:p>
@@ -3418,7 +3467,7 @@
           <w:rFonts w:ascii="Consolas" w:hAnsi="Consolas"/>
           <w:sz w:val="16"/>
         </w:rPr>
-        <w:t>95803c5ffa1cb7cb42a619ac78bb8cc74766ddda1be32a448b14b2d5e4963c46</w:t>
+        <w:t>96021c11323fa9db76d9b2bb7d8ea4f0ee1699fac73f675dfecade849fd5447a</w:t>
       </w:r>
     </w:p>
     <w:p>
@@ -3754,7 +3803,7 @@
           <w:rFonts w:ascii="Consolas" w:hAnsi="Consolas"/>
           <w:sz w:val="16"/>
         </w:rPr>
-        <w:t>e53b536fb48bc324aff44773dc77e56dfd79298323d294f938586e729e50dc79</w:t>
+        <w:t>1e5c536c3fb44fd001a56177e714f5fd08b62280cbb814973c76005ad0d88c0d</w:t>
       </w:r>
     </w:p>
     <w:p>
@@ -3826,7 +3875,7 @@
           <w:rFonts w:ascii="Consolas" w:hAnsi="Consolas"/>
           <w:sz w:val="16"/>
         </w:rPr>
-        <w:t>110d8d7326f50b3a12a99f30ed3adac1aabf3d408c62c2ce52478a6e19bca4fc</w:t>
+        <w:t>d6ac3ffff0c50dbcbb98f0813db1ea47769f0fa8e1f2e9418381c6735cc09953</w:t>
       </w:r>
     </w:p>
     <w:p>
@@ -3850,7 +3899,7 @@
           <w:rFonts w:ascii="Consolas" w:hAnsi="Consolas"/>
           <w:sz w:val="16"/>
         </w:rPr>
-        <w:t>ec537909d3115a294a09d0bf2efc4b2af06e75d806aff2edfb07da72c95b89c6</w:t>
+        <w:t>e3659f88aee88537216fa8f7c6d1250d08954d2465ad2d6cde4e8b1960ef9f00</w:t>
       </w:r>
     </w:p>
     <w:p>

</xml_diff>

<commit_message>
Add target backup and restoration requirements for 05.20
</commit_message>
<xml_diff>
--- a/docs/guides/DPH_Engineering_Guide.docx
+++ b/docs/guides/DPH_Engineering_Guide.docx
@@ -1199,7 +1199,7 @@
         <w:rPr>
           <w:sz w:val="22"/>
         </w:rPr>
-        <w:t>Source and revision evidence</w:t>
+        <w:t>Maintain target backup and restoration evidence</w:t>
       </w:r>
       <w:r>
         <w:rPr>
@@ -1211,6 +1211,27 @@
     </w:p>
     <w:p>
       <w:pPr>
+        <w:spacing w:after="0" w:line="240" w:lineRule="auto"/>
+        <w:tabs>
+          <w:tab w:val="right" w:leader="dot" w:pos="9360"/>
+        </w:tabs>
+      </w:pPr>
+      <w:r>
+        <w:rPr>
+          <w:sz w:val="22"/>
+        </w:rPr>
+        <w:t>Source and revision evidence</w:t>
+      </w:r>
+      <w:r>
+        <w:rPr>
+          <w:sz w:val="22"/>
+        </w:rPr>
+        <w:tab/>
+        <w:t>32</w:t>
+      </w:r>
+    </w:p>
+    <w:p>
+      <w:pPr>
         <w:spacing w:before="0" w:after="0" w:line="20" w:lineRule="exact"/>
       </w:pPr>
       <w:r>
@@ -2663,6 +2684,34 @@
     <w:p>
       <w:r>
         <w:t>Run tools/build-data-quality.cmd elevated for real parsing/persistence, identity and invalid-save cases, immutable review/edit history, implementation/procedure/result links, native filtering/paging/draft guards, compact rendering, UTF-8/size/NUL rejection, report hashes, literal HTML, full handoff validation, unchanged source/catalog and actual background import. The worker test releases the test writer before opening the background writer. Knowledge, publishing, retention and actual application/FMX regressions cover shared paths. Fixed ignored bin/data-quality-validation holds controlled fixtures.</w:t>
+      </w:r>
+    </w:p>
+    <w:p>
+      <w:pPr>
+        <w:pStyle w:val="Heading1"/>
+      </w:pPr>
+      <w:r>
+        <w:t>Maintain target backup and restoration evidence</w:t>
+      </w:r>
+    </w:p>
+    <w:p>
+      <w:r>
+        <w:t>TDPHWorkspaceView provides the recovery template, typed metadata validation, recognition and readable attribution. record_type target_recovery and a stable GUID plan_id identify each plan independently of its editable body. TDPHKnowledgeStore.SaveKnowledge enforces the first heading, descriptive stable title, project business-rule and maintenance scope, unique identity and existing optimistic revisions. Named reviews and edits preserve exact prior bodies and evidence links; unknowns remain explicit.</w:t>
+      </w:r>
+    </w:p>
+    <w:p>
+      <w:r>
+        <w:t>TargetRecovery controls in DPH.UI.Main.fmx are serialized for IDE and Object Inspector editing. The register provides state and text filters, 250-row pages, labeled scrolling evidence, New/Open and the existing exact-link editor. It borrows saved Knowledge rows and clears them before replacement; it guards unsaved drafts. No helper unit, migration, runtime control construction or target backup/restore execution is introduced.</w:t>
+      </w:r>
+    </w:p>
+    <w:p>
+      <w:r>
+        <w:t>The controlled tests parse a real Recovery.dpr and RestoreOrders routine, persist requirements and attributed test measurements, exercise invalid/duplicate/stale saves, immutable review/edit history, source and exact procedure links, canonical and escaped HTML publication, full bundle validation, native editing/navigation/filtering/paging and compact layout. Knowledge, publishing and data-quality regression suites and the actual app/FMX baseline cover shared paths. Run tools/build-target-recovery.cmd elevated. Fixtures remain under fixed ignored bin/target-recovery-validation.</w:t>
+      </w:r>
+    </w:p>
+    <w:p>
+      <w:r>
+        <w:t>DPH portable database backup and selected-application recovery requirements are separate. Written measurements are contributor claims, and a stored hash does not authenticate their origin or prove recovery. Existing section links can pin a saved evidence revision. The embedded-NUL report rejection fixture uses an ordinary filename, embedded-nul.txt, to avoid Windows device-name behavior while testing the actual NUL bytes.</w:t>
       </w:r>
     </w:p>
     <w:p>
@@ -3323,7 +3372,7 @@
           <w:rFonts w:ascii="Consolas" w:hAnsi="Consolas"/>
           <w:sz w:val="16"/>
         </w:rPr>
-        <w:t>19a2c54d28475de14fc6419deb149cdc7df2d4503077049a542fe5ca02ca6077</w:t>
+        <w:t>da373dcd243a8eebe8d12c50575abb45cf72144360b3679451e0a8f877480915</w:t>
       </w:r>
     </w:p>
     <w:p>
@@ -3467,7 +3516,7 @@
           <w:rFonts w:ascii="Consolas" w:hAnsi="Consolas"/>
           <w:sz w:val="16"/>
         </w:rPr>
-        <w:t>96021c11323fa9db76d9b2bb7d8ea4f0ee1699fac73f675dfecade849fd5447a</w:t>
+        <w:t>3b861f396f8335c5a2fded6e1c15886ea6df4e59bcfc7aba34430e169a77993b</w:t>
       </w:r>
     </w:p>
     <w:p>
@@ -3803,7 +3852,7 @@
           <w:rFonts w:ascii="Consolas" w:hAnsi="Consolas"/>
           <w:sz w:val="16"/>
         </w:rPr>
-        <w:t>1e5c536c3fb44fd001a56177e714f5fd08b62280cbb814973c76005ad0d88c0d</w:t>
+        <w:t>0071616ba56c64eb56e19f04a535cd0cb70d4e5e4b87ce2a9885b91ffde3dd3c</w:t>
       </w:r>
     </w:p>
     <w:p>
@@ -3899,7 +3948,7 @@
           <w:rFonts w:ascii="Consolas" w:hAnsi="Consolas"/>
           <w:sz w:val="16"/>
         </w:rPr>
-        <w:t>e3659f88aee88537216fa8f7c6d1250d08954d2465ad2d6cde4e8b1960ef9f00</w:t>
+        <w:t>a3d40acc4c45734b68a66d0bc255f66a93298ba1843b8aa98eaa1bda4f2ef78e</w:t>
       </w:r>
     </w:p>
     <w:p>

</xml_diff>

<commit_message>
Add structured business process inventory for requirement 06.01
</commit_message>
<xml_diff>
--- a/docs/guides/DPH_Engineering_Guide.docx
+++ b/docs/guides/DPH_Engineering_Guide.docx
@@ -1220,7 +1220,7 @@
         <w:rPr>
           <w:sz w:val="22"/>
         </w:rPr>
-        <w:t>Source and revision evidence</w:t>
+        <w:t>Maintain structured business process records</w:t>
       </w:r>
       <w:r>
         <w:rPr>
@@ -1232,6 +1232,27 @@
     </w:p>
     <w:p>
       <w:pPr>
+        <w:spacing w:after="0" w:line="240" w:lineRule="auto"/>
+        <w:tabs>
+          <w:tab w:val="right" w:leader="dot" w:pos="9360"/>
+        </w:tabs>
+      </w:pPr>
+      <w:r>
+        <w:rPr>
+          <w:sz w:val="22"/>
+        </w:rPr>
+        <w:t>Source and revision evidence</w:t>
+      </w:r>
+      <w:r>
+        <w:rPr>
+          <w:sz w:val="22"/>
+        </w:rPr>
+        <w:tab/>
+        <w:t>33</w:t>
+      </w:r>
+    </w:p>
+    <w:p>
+      <w:pPr>
         <w:spacing w:before="0" w:after="0" w:line="20" w:lineRule="exact"/>
       </w:pPr>
       <w:r>
@@ -2712,6 +2733,34 @@
     <w:p>
       <w:r>
         <w:t>DPH portable database backup and selected-application recovery requirements are separate. Written measurements are contributor claims, and a stored hash does not authenticate their origin or prove recovery. Existing section links can pin a saved evidence revision. The embedded-NUL report rejection fixture uses an ordinary filename, embedded-nul.txt, to avoid Windows device-name behavior while testing the actual NUL bytes.</w:t>
+      </w:r>
+    </w:p>
+    <w:p>
+      <w:pPr>
+        <w:pStyle w:val="Heading1"/>
+      </w:pPr>
+      <w:r>
+        <w:t>Maintain structured business process records</w:t>
+      </w:r>
+    </w:p>
+    <w:p>
+      <w:r>
+        <w:t>TDPHWorkspaceView provides the typed business_process object with stable process_id GUID and eight string fields. Validation rejects missing, unexpected, non-text, empty and oversized fields, and an unspecified process name. SaveKnowledge enforces project business-rule maintenance scope, a name matching the stable title, a canonical generated body, unique identity and optimistic revisions. Existing metadata conversion/discard guards, immutable review/edit history and exact evidence links remain authoritative.</w:t>
+      </w:r>
+    </w:p>
+    <w:p>
+      <w:r>
+        <w:t>BusinessProcess controls and the Process fields editor are serialized in DPH.UI.Main.fmx for IDE and Object Inspector editing. A scrolling native field editor prepares the existing Knowledge draft rather than silently saving. Named contributor, draft guards, editable business fields, protected saved name, separate review, filters, 250-row paging, source explanation navigation and exact section revisions share the existing workflow. No helper unit, schema migration, runtime control construction or target execution is introduced.</w:t>
+      </w:r>
+    </w:p>
+    <w:p>
+      <w:r>
+        <w:t>Run tools/build-business-process.cmd elevated. The controlled fixture parses Operations.dpr and FulfilOrders, persists and reopens typed fields, tests malformed metadata, duplicate/changed identities, canonical-body divergence, stale saves, named review and immutable history, exact source/procedure links, canonical publication and full bundle validation. Actual native FMX editor/register renders cover normal and compact windows and the last field. Shared knowledge, publishing and data-quality suites and tools/build-wp0.cmd cover regressions. Fixtures use the fixed ignored bin/business-process-validation directory.</w:t>
+      </w:r>
+    </w:p>
+    <w:p>
+      <w:r>
+        <w:t>Business owner and contributor are distinct. Unknown is an explicit unresolved value rather than inferred business knowledge. Source links establish captured implementation evidence, not that a business step ran. Generic ordered step text in this inventory does not complete the separate departmental workflow or end-to-end process-diagram requirements.</w:t>
       </w:r>
     </w:p>
     <w:p>
@@ -3372,7 +3421,7 @@
           <w:rFonts w:ascii="Consolas" w:hAnsi="Consolas"/>
           <w:sz w:val="16"/>
         </w:rPr>
-        <w:t>da373dcd243a8eebe8d12c50575abb45cf72144360b3679451e0a8f877480915</w:t>
+        <w:t>e03b27e76dadb7417da560531a6fb3eaeb466b9586328d2be22f2c05021a73a6</w:t>
       </w:r>
     </w:p>
     <w:p>
@@ -3516,7 +3565,7 @@
           <w:rFonts w:ascii="Consolas" w:hAnsi="Consolas"/>
           <w:sz w:val="16"/>
         </w:rPr>
-        <w:t>3b861f396f8335c5a2fded6e1c15886ea6df4e59bcfc7aba34430e169a77993b</w:t>
+        <w:t>a430b042adc3b78834508660ca9d36d4ac2202b6dc66145a09d23f2cc418cc23</w:t>
       </w:r>
     </w:p>
     <w:p>
@@ -3852,7 +3901,7 @@
           <w:rFonts w:ascii="Consolas" w:hAnsi="Consolas"/>
           <w:sz w:val="16"/>
         </w:rPr>
-        <w:t>0071616ba56c64eb56e19f04a535cd0cb70d4e5e4b87ce2a9885b91ffde3dd3c</w:t>
+        <w:t>aa78ea686c664031df03303dd957e727aa6c190eaf8ad20dfef52a58ae3444e7</w:t>
       </w:r>
     </w:p>
     <w:p>
@@ -3948,7 +3997,7 @@
           <w:rFonts w:ascii="Consolas" w:hAnsi="Consolas"/>
           <w:sz w:val="16"/>
         </w:rPr>
-        <w:t>a3d40acc4c45734b68a66d0bc255f66a93298ba1843b8aa98eaa1bda4f2ef78e</w:t>
+        <w:t>ea04093fba24d7ca925c5a4ca0778c056cf3a4998df9b43614289664e5be26e7</w:t>
       </w:r>
     </w:p>
     <w:p>

</xml_diff>

<commit_message>
Add structured departmental workflows for requirement 06.02
</commit_message>
<xml_diff>
--- a/docs/guides/DPH_Engineering_Guide.docx
+++ b/docs/guides/DPH_Engineering_Guide.docx
@@ -1241,7 +1241,7 @@
         <w:rPr>
           <w:sz w:val="22"/>
         </w:rPr>
-        <w:t>Source and revision evidence</w:t>
+        <w:t>Maintain ordered departmental workflow evidence</w:t>
       </w:r>
       <w:r>
         <w:rPr>
@@ -1253,6 +1253,27 @@
     </w:p>
     <w:p>
       <w:pPr>
+        <w:spacing w:after="0" w:line="240" w:lineRule="auto"/>
+        <w:tabs>
+          <w:tab w:val="right" w:leader="dot" w:pos="9360"/>
+        </w:tabs>
+      </w:pPr>
+      <w:r>
+        <w:rPr>
+          <w:sz w:val="22"/>
+        </w:rPr>
+        <w:t>Source and revision evidence</w:t>
+      </w:r>
+      <w:r>
+        <w:rPr>
+          <w:sz w:val="22"/>
+        </w:rPr>
+        <w:tab/>
+        <w:t>33</w:t>
+      </w:r>
+    </w:p>
+    <w:p>
+      <w:pPr>
         <w:spacing w:before="0" w:after="0" w:line="20" w:lineRule="exact"/>
       </w:pPr>
       <w:r>
@@ -2761,6 +2782,39 @@
     <w:p>
       <w:r>
         <w:t>Business owner and contributor are distinct. Unknown is an explicit unresolved value rather than inferred business knowledge. Source links establish captured implementation evidence, not that a business step ran. Generic ordered step text in this inventory does not complete the separate departmental workflow or end-to-end process-diagram requirements.</w:t>
+      </w:r>
+    </w:p>
+    <w:p>
+      <w:pPr>
+        <w:pStyle w:val="Heading1"/>
+      </w:pPr>
+      <w:r>
+        <w:t>Maintain ordered departmental workflow evidence</w:t>
+      </w:r>
+    </w:p>
+    <w:p>
+      <w:r>
+        <w:t>TDPHWorkspaceView provides departmental_workflow metadata, canonical workflow GUID, five workflow fields and an ordered steps array. Each step has a canonical GUID, department, role, action, inputs, outputs, handoff, exception handling and exception destination. Validation rejects duplicate identities, dangling destinations, unknown shapes, invalid types, empty or oversized fields, unspecified actions, missing steps and exceeded limits. Normal authored order follows the array; exception identity remains stable across reordering.</w:t>
+      </w:r>
+    </w:p>
+    <w:p>
+      <w:r>
+        <w:t>SaveKnowledge requires project-scoped maintenance business-rule records, stable title matching the structured name, canonical generated body, unique workflow identity and optimistic revisions. Existing immutable save/review history, source invalidation, exact section/source links, named contributors and reviewers, publication and reopening apply. No new schema or helper unit is added. Human workflow content and named review do not establish target execution, business authorization or successful outcomes.</w:t>
+      </w:r>
+    </w:p>
+    <w:p>
+      <w:r>
+        <w:t>The register and workflow/step fields are native serialized controls in DPH.UI.Main.fmx. New/Edit create a local structured draft; Apply step modifies that draft; Apply workflow prepares Knowledge; Save persists it. Shared nonmodal editor guards prevent saving unapplied fields and bind edits to the original record. New/discarded Knowledge frees its workflow draft. Compact commands scroll horizontally and fields vertically. Array replacement/reordering uses the RTL TJSONArray.SetElements ownership contract while retaining or freeing element values appropriately.</w:t>
+      </w:r>
+    </w:p>
+    <w:p>
+      <w:r>
+        <w:t>Run tools/build-departmental-workflow.cmd elevated. The real parser, SQLite reopening, revision/review and canonical publication fixture covers ordered Sales/Warehouse steps, roles, handoff, recovery destination, malformed records, invalid identities, dangling/duplicate destinations, bounds, source/procedure links and unchanged source/catalog. Native FMX exercises add/apply/remove protection, reordering, dirty-step and unapplied-workflow guards, editor/register navigation and compact renders. Compatibility covers Knowledge, publishing, data quality and the business-process editor plus the actual application/FMX build. Fixtures remain in the fixed ignored bin/departmental-workflow-validation directory.</w:t>
+      </w:r>
+    </w:p>
+    <w:p>
+      <w:r>
+        <w:t>This implements departmental workflow capture. The separate end-to-end process-diagram requirement remains pending; technical code graphs are not substituted for business workflow diagrams.</w:t>
       </w:r>
     </w:p>
     <w:p>
@@ -3421,7 +3475,7 @@
           <w:rFonts w:ascii="Consolas" w:hAnsi="Consolas"/>
           <w:sz w:val="16"/>
         </w:rPr>
-        <w:t>e03b27e76dadb7417da560531a6fb3eaeb466b9586328d2be22f2c05021a73a6</w:t>
+        <w:t>ec6318b2608e97063f8f3ad7e404ededd1dc017c67540870b3c0e43ef286c852</w:t>
       </w:r>
     </w:p>
     <w:p>
@@ -3565,7 +3619,7 @@
           <w:rFonts w:ascii="Consolas" w:hAnsi="Consolas"/>
           <w:sz w:val="16"/>
         </w:rPr>
-        <w:t>a430b042adc3b78834508660ca9d36d4ac2202b6dc66145a09d23f2cc418cc23</w:t>
+        <w:t>d0d07d94b568cbbe1a51fb00d7eb6ba618a97fc4b1349cf5247e9a9f5ede49c0</w:t>
       </w:r>
     </w:p>
     <w:p>
@@ -3901,7 +3955,7 @@
           <w:rFonts w:ascii="Consolas" w:hAnsi="Consolas"/>
           <w:sz w:val="16"/>
         </w:rPr>
-        <w:t>aa78ea686c664031df03303dd957e727aa6c190eaf8ad20dfef52a58ae3444e7</w:t>
+        <w:t>be03c357c96bbdb828d63c347a6bd7d5bc5ba3ecbf161cf67853299a4aca23b5</w:t>
       </w:r>
     </w:p>
     <w:p>
@@ -3997,7 +4051,7 @@
           <w:rFonts w:ascii="Consolas" w:hAnsi="Consolas"/>
           <w:sz w:val="16"/>
         </w:rPr>
-        <w:t>ea04093fba24d7ca925c5a4ca0778c056cf3a4998df9b43614289664e5be26e7</w:t>
+        <w:t>e65647f974ea2b81593c20c5d15d49e7518e3092275709ad25aab12970158b7e</w:t>
       </w:r>
     </w:p>
     <w:p>

</xml_diff>

<commit_message>
Add end-to-end business process diagrams for requirement 06.03
</commit_message>
<xml_diff>
--- a/docs/guides/DPH_Engineering_Guide.docx
+++ b/docs/guides/DPH_Engineering_Guide.docx
@@ -1262,7 +1262,7 @@
         <w:rPr>
           <w:sz w:val="22"/>
         </w:rPr>
-        <w:t>Source and revision evidence</w:t>
+        <w:t>Maintain end-to-end process projections</w:t>
       </w:r>
       <w:r>
         <w:rPr>
@@ -1274,6 +1274,27 @@
     </w:p>
     <w:p>
       <w:pPr>
+        <w:spacing w:after="0" w:line="240" w:lineRule="auto"/>
+        <w:tabs>
+          <w:tab w:val="right" w:leader="dot" w:pos="9360"/>
+        </w:tabs>
+      </w:pPr>
+      <w:r>
+        <w:rPr>
+          <w:sz w:val="22"/>
+        </w:rPr>
+        <w:t>Source and revision evidence</w:t>
+      </w:r>
+      <w:r>
+        <w:rPr>
+          <w:sz w:val="22"/>
+        </w:rPr>
+        <w:tab/>
+        <w:t>34</w:t>
+      </w:r>
+    </w:p>
+    <w:p>
+      <w:pPr>
         <w:spacing w:before="0" w:after="0" w:line="20" w:lineRule="exact"/>
       </w:pPr>
       <w:r>
@@ -2814,7 +2835,35 @@
     </w:p>
     <w:p>
       <w:r>
-        <w:t>This implements departmental workflow capture. The separate end-to-end process-diagram requirement remains pending; technical code graphs are not substituted for business workflow diagrams.</w:t>
+        <w:t>This implements departmental workflow capture. End-to-end process diagrams now provide a distinct authored workflow projection; technical graphs retain their source-derived meaning.</w:t>
+      </w:r>
+    </w:p>
+    <w:p>
+      <w:pPr>
+        <w:pStyle w:val="Heading1"/>
+      </w:pPr>
+      <w:r>
+        <w:t>Maintain end-to-end process projections</w:t>
+      </w:r>
+    </w:p>
+    <w:p>
+      <w:r>
+        <w:t>TDPHGraphProjection.Workflow derives bounded ordered workflow-step nodes, one End node, explicit unresolved exception destinations, normal handoff edges and stable exception edges from a saved departmental_workflow record. No runtime trace, inferred step or invented process association is added. Links resolve against exact in-scope business-process history revisions and retain state, named reviewer and process identity.</w:t>
+      </w:r>
+    </w:p>
+    <w:p>
+      <w:r>
+        <w:t>TDPHGraphProjection.WorkflowSVG creates accessible, scrollable SVG with blue normal routes, orange exception gutters, escaped labels, full fields/routes and exact process revision links. The native serialized GraphPaint provides a scrollable fallback, separate arrow routing and step details. GraphCombo has an Object Inspector editable Business process choice, and Departmental workflows has a serialized Process diagram button. Knowledge replacement rebinds workflow rows before graphics refresh to avoid stale pointers.</w:t>
+      </w:r>
+    </w:p>
+    <w:p>
+      <w:r>
+        <w:t>The version 10 publication model derives process_diagram after audience, source and link scope filtering and redaction. HTML renders it within the workflow article. Canonical knowledge JSON and its existing index retain it. Validator recomputes the projection and rejects divergence or missing diagrams in current-template workflow records. Localization removes its containing knowledge records, so no unlocalized process projection survives a localized authored-body-only view.</w:t>
+      </w:r>
+    </w:p>
+    <w:p>
+      <w:r>
+        <w:t>Run tools/build-process-diagram.cmd elevated. Real parser/SQLite capture and reopening, exact reviewed process history links, canonical HTML and full bundle validation accompany native FMX navigation and graph/step details. Tests cover reordered stable exception destinations, self-return, End, Unknown, escaped script-like labels, all 64 steps and rejected overflow, audience scope, draft protection and replaced/cleared knowledge. Regression suites cover existing Knowledge, publication, workflow and technical graphs plus the actual application/FMX build. Fixtures use the fixed ignored bin/process-diagram-validation folder.</w:t>
       </w:r>
     </w:p>
     <w:p>
@@ -2875,7 +2924,7 @@
           <w:rFonts w:ascii="Consolas" w:hAnsi="Consolas"/>
           <w:sz w:val="16"/>
         </w:rPr>
-        <w:t>43244ca3544edffabbf8a52af92a5f8081794894db0fd88fdd67fd1dbab560fb</w:t>
+        <w:t>8e4a430daf51b5f1d5c0e4e8a939862dd8b80123bd7333597b949ad054f85f06</w:t>
       </w:r>
     </w:p>
     <w:p>
@@ -3379,7 +3428,7 @@
           <w:rFonts w:ascii="Consolas" w:hAnsi="Consolas"/>
           <w:sz w:val="16"/>
         </w:rPr>
-        <w:t>0a36aa00c6c9591521d53977e2a4985b4cb390dfa79c7dcbc337c74ff306c39e</w:t>
+        <w:t>ac49dff7e08016db2f8c720de3bac0749e52de82ccc4e7aa2b328f8032ceebe4</w:t>
       </w:r>
     </w:p>
     <w:p>
@@ -3403,7 +3452,7 @@
           <w:rFonts w:ascii="Consolas" w:hAnsi="Consolas"/>
           <w:sz w:val="16"/>
         </w:rPr>
-        <w:t>532727b11c1245adceaab9e43a6f16d4bce573cf1f31c148978a78457462039f</w:t>
+        <w:t>7068252c58364ae224e263ecc5fbf83bdb406943979f3ad752f4ca9f877de9d2</w:t>
       </w:r>
     </w:p>
     <w:p>
@@ -3619,7 +3668,7 @@
           <w:rFonts w:ascii="Consolas" w:hAnsi="Consolas"/>
           <w:sz w:val="16"/>
         </w:rPr>
-        <w:t>d0d07d94b568cbbe1a51fb00d7eb6ba618a97fc4b1349cf5247e9a9f5ede49c0</w:t>
+        <w:t>41b056a1db563ef504731a7fa647e8c45aa5c9334d5ce0805799b94998fb4be4</w:t>
       </w:r>
     </w:p>
     <w:p>
@@ -3883,7 +3932,7 @@
           <w:rFonts w:ascii="Consolas" w:hAnsi="Consolas"/>
           <w:sz w:val="16"/>
         </w:rPr>
-        <w:t>6fd8b84644df65a0746aaad3598dad9406fa2d55e637e1e30f2175cefd1be911</w:t>
+        <w:t>1d2985c6fa30e72a7ddb7c55f41a2a774e6e1517d5056507efb2666f18b47804</w:t>
       </w:r>
     </w:p>
     <w:p>
@@ -4051,7 +4100,7 @@
           <w:rFonts w:ascii="Consolas" w:hAnsi="Consolas"/>
           <w:sz w:val="16"/>
         </w:rPr>
-        <w:t>e65647f974ea2b81593c20c5d15d49e7518e3092275709ad25aab12970158b7e</w:t>
+        <w:t>a383ef8a6bc9a655629d8a19f73dd6dbfad80072b3430f42e9dfe92284d1a451</w:t>
       </w:r>
     </w:p>
     <w:p>

</xml_diff>

<commit_message>
Add reviewed business rule catalog for requirement 06.04
</commit_message>
<xml_diff>
--- a/docs/guides/DPH_Engineering_Guide.docx
+++ b/docs/guides/DPH_Engineering_Guide.docx
@@ -1283,7 +1283,7 @@
         <w:rPr>
           <w:sz w:val="22"/>
         </w:rPr>
-        <w:t>Source and revision evidence</w:t>
+        <w:t>Maintain the business rule catalog</w:t>
       </w:r>
       <w:r>
         <w:rPr>
@@ -1295,6 +1295,27 @@
     </w:p>
     <w:p>
       <w:pPr>
+        <w:spacing w:after="0" w:line="240" w:lineRule="auto"/>
+        <w:tabs>
+          <w:tab w:val="right" w:leader="dot" w:pos="9360"/>
+        </w:tabs>
+      </w:pPr>
+      <w:r>
+        <w:rPr>
+          <w:sz w:val="22"/>
+        </w:rPr>
+        <w:t>Source and revision evidence</w:t>
+      </w:r>
+      <w:r>
+        <w:rPr>
+          <w:sz w:val="22"/>
+        </w:rPr>
+        <w:tab/>
+        <w:t>34</w:t>
+      </w:r>
+    </w:p>
+    <w:p>
+      <w:pPr>
         <w:spacing w:before="0" w:after="0" w:line="20" w:lineRule="exact"/>
       </w:pPr>
       <w:r>
@@ -2864,6 +2885,34 @@
     <w:p>
       <w:r>
         <w:t>Run tools/build-process-diagram.cmd elevated. Real parser/SQLite capture and reopening, exact reviewed process history links, canonical HTML and full bundle validation accompany native FMX navigation and graph/step details. Tests cover reordered stable exception destinations, self-return, End, Unknown, escaped script-like labels, all 64 steps and rejected overflow, audience scope, draft protection and replaced/cleared knowledge. Regression suites cover existing Knowledge, publication, workflow and technical graphs plus the actual application/FMX build. Fixtures use the fixed ignored bin/process-diagram-validation folder.</w:t>
+      </w:r>
+    </w:p>
+    <w:p>
+      <w:pPr>
+        <w:pStyle w:val="Heading1"/>
+      </w:pPr>
+      <w:r>
+        <w:t>Maintain the business rule catalog</w:t>
+      </w:r>
+    </w:p>
+    <w:p>
+      <w:r>
+        <w:t>TDPHWorkspaceView.NewBusinessRule, ValidateBusinessRule and BusinessRuleBody define the existing-unit business_rule_definition contract: stable canonical rule_id GUID and nine bounded text fields. The human rule_code is required, 1 to 100 ASCII characters, with strict end matching; name is descriptive and at most 200 characters. Every text field is at most 4096 characters. Unknown remains an unresolved business value rather than inferred policy.</w:t>
+      </w:r>
+    </w:p>
+    <w:p>
+      <w:r>
+        <w:t>TDPHKnowledgeStore.SaveKnowledge validates project scope, business_rule kind, maintenance document, maintainer audience, title and canonical body. Identity and saved human rule code cannot change. Case-insensitive rule codes and GUIDs are unique within the selected project, including retired history. Existing revision guards, attributed review, immutable history and exact source/procedure links apply. No schema migration or helper unit was added.</w:t>
+      </w:r>
+    </w:p>
+    <w:p>
+      <w:r>
+        <w:t>BusinessRuleTab and BusinessRuleEditorTab are serialized FMX controls editable in the IDE. IsBusinessRule admits only typed rule definitions and original generic business_rule notes; typed process, workflow, data-quality and recovery records remain in their own registers. Generic notes keep their original attribution and body, with explicit Unstructured labeling. Structured conversion of an existing generic note is forbidden.</w:t>
+      </w:r>
+    </w:p>
+    <w:p>
+      <w:r>
+        <w:t>Run tools/build-business-rule.cmd elevated for real parser/SQLite, identifier collisions and immutability, malformed records, exact implementation/procedure links, named review/history, canonical publication and database reopening. Native normal and compact renders cover field editing, pending draft protection, filters, legacy notes and bounded paging. The fixed ignored bin/business-rule-validation fixture does not execute selected target code. Run tools/build-wp0.cmd for the actual application and FMX resource binding checks.</w:t>
       </w:r>
     </w:p>
     <w:p>
@@ -3524,7 +3573,7 @@
           <w:rFonts w:ascii="Consolas" w:hAnsi="Consolas"/>
           <w:sz w:val="16"/>
         </w:rPr>
-        <w:t>ec6318b2608e97063f8f3ad7e404ededd1dc017c67540870b3c0e43ef286c852</w:t>
+        <w:t>6d3fd07349ecba128a429784a068078eeb6a0c3a12caa5a73879c4af008fccc8</w:t>
       </w:r>
     </w:p>
     <w:p>
@@ -3668,7 +3717,7 @@
           <w:rFonts w:ascii="Consolas" w:hAnsi="Consolas"/>
           <w:sz w:val="16"/>
         </w:rPr>
-        <w:t>41b056a1db563ef504731a7fa647e8c45aa5c9334d5ce0805799b94998fb4be4</w:t>
+        <w:t>8e6d9444643479eac6fe9f1902be8c40439cd61988806f28bf53da9f2a776e76</w:t>
       </w:r>
     </w:p>
     <w:p>
@@ -4004,7 +4053,7 @@
           <w:rFonts w:ascii="Consolas" w:hAnsi="Consolas"/>
           <w:sz w:val="16"/>
         </w:rPr>
-        <w:t>be03c357c96bbdb828d63c347a6bd7d5bc5ba3ecbf161cf67853299a4aca23b5</w:t>
+        <w:t>b64efef8c916e772e0c39597eca056b5d892d4f3c7e68315d5b6250ad905643e</w:t>
       </w:r>
     </w:p>
     <w:p>
@@ -4100,7 +4149,7 @@
           <w:rFonts w:ascii="Consolas" w:hAnsi="Consolas"/>
           <w:sz w:val="16"/>
         </w:rPr>
-        <w:t>a383ef8a6bc9a655629d8a19f73dd6dbfad80072b3430f42e9dfe92284d1a451</w:t>
+        <w:t>38c763770038692796e73a1a0c0a793aa01db6bae96db716d4ec349b60550907</w:t>
       </w:r>
     </w:p>
     <w:p>

</xml_diff>

<commit_message>
Add captured calculations and reviewed formula definitions for 06.06
</commit_message>
<xml_diff>
--- a/docs/guides/DPH_Engineering_Guide.docx
+++ b/docs/guides/DPH_Engineering_Guide.docx
@@ -1304,7 +1304,7 @@
         <w:rPr>
           <w:sz w:val="22"/>
         </w:rPr>
-        <w:t>Source and revision evidence</w:t>
+        <w:t>Maintain calculation evidence and definitions</w:t>
       </w:r>
       <w:r>
         <w:rPr>
@@ -1316,6 +1316,27 @@
     </w:p>
     <w:p>
       <w:pPr>
+        <w:spacing w:after="0" w:line="240" w:lineRule="auto"/>
+        <w:tabs>
+          <w:tab w:val="right" w:leader="dot" w:pos="9360"/>
+        </w:tabs>
+      </w:pPr>
+      <w:r>
+        <w:rPr>
+          <w:sz w:val="22"/>
+        </w:rPr>
+        <w:t>Source and revision evidence</w:t>
+      </w:r>
+      <w:r>
+        <w:rPr>
+          <w:sz w:val="22"/>
+        </w:rPr>
+        <w:tab/>
+        <w:t>35</w:t>
+      </w:r>
+    </w:p>
+    <w:p>
+      <w:pPr>
         <w:spacing w:before="0" w:after="0" w:line="20" w:lineRule="exact"/>
       </w:pPr>
       <w:r>
@@ -2913,6 +2934,39 @@
     <w:p>
       <w:r>
         <w:t>Run tools/build-business-rule.cmd elevated for real parser/SQLite, identifier collisions and immutability, malformed records, exact implementation/procedure links, named review/history, canonical publication and database reopening. Native normal and compact renders cover field editing, pending draft protection, filters, legacy notes and bounded paging. The fixed ignored bin/business-rule-validation fixture does not execute selected target code. Run tools/build-wp0.cmd for the actual application and FMX resource binding checks.</w:t>
+      </w:r>
+    </w:p>
+    <w:p>
+      <w:pPr>
+        <w:pStyle w:val="Heading1"/>
+      </w:pPr>
+      <w:r>
+        <w:t>Maintain calculation evidence and definitions</w:t>
+      </w:r>
+    </w:p>
+    <w:p>
+      <w:r>
+        <w:t>TDPHWorkspaceView.Calculations projects captured syntax expression roots and constant declarations. Arithmetic, bitwise or boolean operators and recognized mathematical API spellings are lexical candidates, with quoted literals omitted before classification. A per-file routine-start map resolves ancestor routines within 128 parent hops. Source ranges, original capture hashes, generation and conditional context are retained. Rows are bounded to 10000, unavailable empty/long expressions are counted, and parser gaps remain qualified. No expression evaluator or target execution was added.</w:t>
+      </w:r>
+    </w:p>
+    <w:p>
+      <w:r>
+        <w:t>NewCalculation, ValidateCalculation and CalculationBody define calculation_definition with a canonical stable calculation_id GUID and twelve bounded text fields. Name is descriptive, at most 200 characters and stable after saving; every field is at most 4096 characters and must explicitly say Unknown when unresolved. Business meaning, formula, input/output definitions, units, rounding, assumptions, exceptions, worked examples and accountable owner remain separately reviewable.</w:t>
+      </w:r>
+    </w:p>
+    <w:p>
+      <w:r>
+        <w:t>TDPHKnowledgeStore.SaveKnowledge enforces business_rule kind, project scope, maintenance/maintainer metadata, canonical title/body, stable identity and unique GUIDs. Existing attribution, revision guards, immutable named review/history, exact source/procedure links and publication contracts apply. Formula text is data and cannot execute. No schema migration or helper unit was added.</w:t>
+      </w:r>
+    </w:p>
+    <w:p>
+      <w:r>
+        <w:t>Calculation evidence, Calculations and Calculation fields are serialized FMX pages listed in the header selector. Source navigation uses the existing generation/hash boundary. Candidate prefill preserves unresolved business meaning and units and cannot overwrite a pending draft. Source inventory is rebuilt from the loaded capture; authored definitions use the Knowledge database. The compact source list leaves the scrollable evidence memo readable.</w:t>
+      </w:r>
+    </w:p>
+    <w:p>
+      <w:r>
+        <w:t>Run tools/build-calculation.cmd elevated for real parser/SQLite, nested expression and literal handling, constant formulas, source hash/generation/owner, the 10000-row bound, native page navigation and definition editing, canonical validation, exact links, review/history, publication and reopening. Existing Knowledge, publishing, quality, business process, workflow, diagrams and rule catalog suites are regressed. Actual application and FMX checks use tools/build-wp0.cmd. Fixed ignored fixtures are under bin/calculation-validation; selected target code never executes.</w:t>
       </w:r>
     </w:p>
     <w:p>
@@ -3573,7 +3627,7 @@
           <w:rFonts w:ascii="Consolas" w:hAnsi="Consolas"/>
           <w:sz w:val="16"/>
         </w:rPr>
-        <w:t>6d3fd07349ecba128a429784a068078eeb6a0c3a12caa5a73879c4af008fccc8</w:t>
+        <w:t>eef95eb1502ac7aedee4186f29a026074d2d77fb3ca404d81531703c99e290e0</w:t>
       </w:r>
     </w:p>
     <w:p>
@@ -3717,7 +3771,7 @@
           <w:rFonts w:ascii="Consolas" w:hAnsi="Consolas"/>
           <w:sz w:val="16"/>
         </w:rPr>
-        <w:t>8e6d9444643479eac6fe9f1902be8c40439cd61988806f28bf53da9f2a776e76</w:t>
+        <w:t>b5cf95129ccd1ff91ecfbb88d31170f9ec2e35a3e34c0dd590854c0f3390a16b</w:t>
       </w:r>
     </w:p>
     <w:p>
@@ -4053,7 +4107,7 @@
           <w:rFonts w:ascii="Consolas" w:hAnsi="Consolas"/>
           <w:sz w:val="16"/>
         </w:rPr>
-        <w:t>b64efef8c916e772e0c39597eca056b5d892d4f3c7e68315d5b6250ad905643e</w:t>
+        <w:t>c478ad86dae6bf66107412e3f6728d31553f28c486798fdb6fc461f72e6333f1</w:t>
       </w:r>
     </w:p>
     <w:p>
@@ -4149,7 +4203,7 @@
           <w:rFonts w:ascii="Consolas" w:hAnsi="Consolas"/>
           <w:sz w:val="16"/>
         </w:rPr>
-        <w:t>38c763770038692796e73a1a0c0a793aa01db6bae96db716d4ec349b60550907</w:t>
+        <w:t>3b13700c44c5839710c306d02edf564500731508ee597c7e1cd459f2ca80f03c</w:t>
       </w:r>
     </w:p>
     <w:p>

</xml_diff>

<commit_message>
Rewrite learning guides and deliver the refocused desktop application
</commit_message>
<xml_diff>
--- a/docs/guides/DPH_Engineering_Guide.docx
+++ b/docs/guides/DPH_Engineering_Guide.docx
@@ -7,7 +7,7 @@
         <w:pStyle w:val="Title"/>
       </w:pPr>
       <w:r>
-        <w:t>DPH Engineering Guide</w:t>
+        <w:t>Delphi Project Handoff Engineering Guide</w:t>
       </w:r>
     </w:p>
     <w:p>
@@ -15,27 +15,22 @@
         <w:pStyle w:val="Subtitle"/>
       </w:pPr>
       <w:r>
-        <w:t>Delphi Project Handoff</w:t>
+        <w:t>Build maintain and validate the learning application</w:t>
       </w:r>
     </w:p>
     <w:p>
       <w:r>
-        <w:t>Windows desktop experimental software</w:t>
+        <w:t>Experimental Windows desktop software</w:t>
       </w:r>
     </w:p>
     <w:p>
       <w:r>
-        <w:t>Last changed 12 October 2026</w:t>
+        <w:t>Last changed 13 October 2026</w:t>
       </w:r>
     </w:p>
     <w:p>
       <w:r>
-        <w:t>For a Delphi developer building maintaining and validating DPH</w:t>
-      </w:r>
-    </w:p>
-    <w:p>
-      <w:r>
-        <w:t>This guide describes the implemented application and its evidence limits. Use the phase acceptance records for exact measured results and unresolved release gates.</w:t>
+        <w:t>Read in order for your first session. Later, use the contents to find a particular procedure.</w:t>
       </w:r>
     </w:p>
     <w:p>
@@ -52,1297 +47,138 @@
       </w:r>
     </w:p>
     <w:p>
-      <w:pPr>
-        <w:spacing w:before="0" w:after="0" w:line="20" w:lineRule="exact"/>
-      </w:pPr>
       <w:r>
-        <w:rPr>
-          <w:sz w:val="2"/>
-        </w:rPr>
         <w:fldChar w:fldCharType="begin"/>
         <w:instrText xml:space="preserve"> TOC \o "1-1" \h \z \u </w:instrText>
       </w:r>
     </w:p>
     <w:p>
-      <w:pPr>
-        <w:spacing w:before="0" w:after="0" w:line="20" w:lineRule="exact"/>
-      </w:pPr>
       <w:r>
-        <w:rPr>
-          <w:sz w:val="2"/>
-        </w:rPr>
         <w:fldChar w:fldCharType="separate"/>
       </w:r>
     </w:p>
     <w:p>
       <w:pPr>
-        <w:spacing w:after="0" w:line="240" w:lineRule="auto"/>
+        <w:spacing w:after="120"/>
         <w:tabs>
           <w:tab w:val="right" w:leader="dot" w:pos="9360"/>
         </w:tabs>
       </w:pPr>
       <w:r>
-        <w:rPr>
-          <w:sz w:val="22"/>
-        </w:rPr>
-        <w:t>Architecture and boundaries</w:t>
+        <w:t>Purpose and architecture</w:t>
       </w:r>
       <w:r>
-        <w:rPr>
-          <w:sz w:val="22"/>
-        </w:rPr>
+        <w:tab/>
+        <w:t>3</w:t>
+      </w:r>
+    </w:p>
+    <w:p>
+      <w:pPr>
+        <w:spacing w:after="120"/>
+        <w:tabs>
+          <w:tab w:val="right" w:leader="dot" w:pos="9360"/>
+        </w:tabs>
+      </w:pPr>
+      <w:r>
+        <w:t>Source and storage boundaries</w:t>
+      </w:r>
+      <w:r>
         <w:tab/>
         <w:t>4</w:t>
       </w:r>
     </w:p>
     <w:p>
       <w:pPr>
-        <w:spacing w:after="0" w:line="240" w:lineRule="auto"/>
+        <w:spacing w:after="120"/>
         <w:tabs>
           <w:tab w:val="right" w:leader="dot" w:pos="9360"/>
         </w:tabs>
       </w:pPr>
       <w:r>
-        <w:rPr>
-          <w:sz w:val="22"/>
-        </w:rPr>
-        <w:t>Rework and acceptance status</w:t>
+        <w:t>Native interface and lesson generation</w:t>
       </w:r>
       <w:r>
-        <w:rPr>
-          <w:sz w:val="22"/>
-        </w:rPr>
-        <w:tab/>
-        <w:t>4</w:t>
-      </w:r>
-    </w:p>
-    <w:p>
-      <w:pPr>
-        <w:spacing w:after="0" w:line="240" w:lineRule="auto"/>
-        <w:tabs>
-          <w:tab w:val="right" w:leader="dot" w:pos="9360"/>
-        </w:tabs>
-      </w:pPr>
-      <w:r>
-        <w:rPr>
-          <w:sz w:val="22"/>
-        </w:rPr>
-        <w:t>Build and deployment</w:t>
-      </w:r>
-      <w:r>
-        <w:rPr>
-          <w:sz w:val="22"/>
-        </w:rPr>
-        <w:tab/>
-        <w:t>4</w:t>
-      </w:r>
-    </w:p>
-    <w:p>
-      <w:pPr>
-        <w:spacing w:after="0" w:line="240" w:lineRule="auto"/>
-        <w:tabs>
-          <w:tab w:val="right" w:leader="dot" w:pos="9360"/>
-        </w:tabs>
-      </w:pPr>
-      <w:r>
-        <w:rPr>
-          <w:sz w:val="22"/>
-        </w:rPr>
-        <w:t>Input acquisition and project scope</w:t>
-      </w:r>
-      <w:r>
-        <w:rPr>
-          <w:sz w:val="22"/>
-        </w:rPr>
         <w:tab/>
         <w:t>5</w:t>
       </w:r>
     </w:p>
     <w:p>
       <w:pPr>
-        <w:spacing w:after="0" w:line="240" w:lineRule="auto"/>
+        <w:spacing w:after="120"/>
         <w:tabs>
           <w:tab w:val="right" w:leader="dot" w:pos="9360"/>
         </w:tabs>
       </w:pPr>
       <w:r>
-        <w:rPr>
-          <w:sz w:val="22"/>
-        </w:rPr>
-        <w:t>Syntax contracts and limits</w:t>
+        <w:t>Build and run DPH</w:t>
       </w:r>
       <w:r>
-        <w:rPr>
-          <w:sz w:val="22"/>
-        </w:rPr>
-        <w:tab/>
-        <w:t>5</w:t>
-      </w:r>
-    </w:p>
-    <w:p>
-      <w:pPr>
-        <w:spacing w:after="0" w:line="240" w:lineRule="auto"/>
-        <w:tabs>
-          <w:tab w:val="right" w:leader="dot" w:pos="9360"/>
-        </w:tabs>
-      </w:pPr>
-      <w:r>
-        <w:rPr>
-          <w:sz w:val="22"/>
-        </w:rPr>
-        <w:t>Symbols and typed relationships</w:t>
-      </w:r>
-      <w:r>
-        <w:rPr>
-          <w:sz w:val="22"/>
-        </w:rPr>
-        <w:tab/>
-        <w:t>5</w:t>
-      </w:r>
-    </w:p>
-    <w:p>
-      <w:pPr>
-        <w:spacing w:after="0" w:line="240" w:lineRule="auto"/>
-        <w:tabs>
-          <w:tab w:val="right" w:leader="dot" w:pos="9360"/>
-        </w:tabs>
-      </w:pPr>
-      <w:r>
-        <w:rPr>
-          <w:sz w:val="22"/>
-        </w:rPr>
-        <w:t>Control flow and impact</w:t>
-      </w:r>
-      <w:r>
-        <w:rPr>
-          <w:sz w:val="22"/>
-        </w:rPr>
         <w:tab/>
         <w:t>6</w:t>
       </w:r>
     </w:p>
     <w:p>
       <w:pPr>
-        <w:spacing w:after="0" w:line="240" w:lineRule="auto"/>
+        <w:spacing w:after="120"/>
         <w:tabs>
           <w:tab w:val="right" w:leader="dot" w:pos="9360"/>
         </w:tabs>
       </w:pPr>
       <w:r>
-        <w:rPr>
-          <w:sz w:val="22"/>
-        </w:rPr>
-        <w:t>SQLite generations and durability</w:t>
+        <w:t>Validate a change</w:t>
       </w:r>
       <w:r>
-        <w:rPr>
-          <w:sz w:val="22"/>
-        </w:rPr>
-        <w:tab/>
-        <w:t>6</w:t>
-      </w:r>
-    </w:p>
-    <w:p>
-      <w:pPr>
-        <w:spacing w:after="0" w:line="240" w:lineRule="auto"/>
-        <w:tabs>
-          <w:tab w:val="right" w:leader="dot" w:pos="9360"/>
-        </w:tabs>
-      </w:pPr>
-      <w:r>
-        <w:rPr>
-          <w:sz w:val="22"/>
-        </w:rPr>
-        <w:t>Evidence and immutable history</w:t>
-      </w:r>
-      <w:r>
-        <w:rPr>
-          <w:sz w:val="22"/>
-        </w:rPr>
-        <w:tab/>
-        <w:t>6</w:t>
-      </w:r>
-    </w:p>
-    <w:p>
-      <w:pPr>
-        <w:spacing w:after="0" w:line="240" w:lineRule="auto"/>
-        <w:tabs>
-          <w:tab w:val="right" w:leader="dot" w:pos="9360"/>
-        </w:tabs>
-      </w:pPr>
-      <w:r>
-        <w:rPr>
-          <w:sz w:val="22"/>
-        </w:rPr>
-        <w:t>Background coordination and cached views</w:t>
-      </w:r>
-      <w:r>
-        <w:rPr>
-          <w:sz w:val="22"/>
-        </w:rPr>
         <w:tab/>
         <w:t>7</w:t>
       </w:r>
     </w:p>
     <w:p>
       <w:pPr>
-        <w:spacing w:after="0" w:line="240" w:lineRule="auto"/>
+        <w:spacing w:after="120"/>
         <w:tabs>
           <w:tab w:val="right" w:leader="dot" w:pos="9360"/>
         </w:tabs>
       </w:pPr>
       <w:r>
-        <w:rPr>
-          <w:sz w:val="22"/>
-        </w:rPr>
-        <w:t>FMX navigation and visualization</w:t>
+        <w:t>Package and deploy</w:t>
       </w:r>
       <w:r>
-        <w:rPr>
-          <w:sz w:val="22"/>
-        </w:rPr>
-        <w:tab/>
-        <w:t>7</w:t>
-      </w:r>
-    </w:p>
-    <w:p>
-      <w:pPr>
-        <w:spacing w:after="0" w:line="240" w:lineRule="auto"/>
-        <w:tabs>
-          <w:tab w:val="right" w:leader="dot" w:pos="9360"/>
-        </w:tabs>
-      </w:pPr>
-      <w:r>
-        <w:rPr>
-          <w:sz w:val="22"/>
-        </w:rPr>
-        <w:t>Curated knowledge and review</w:t>
-      </w:r>
-      <w:r>
-        <w:rPr>
-          <w:sz w:val="22"/>
-        </w:rPr>
-        <w:tab/>
-        <w:t>7</w:t>
-      </w:r>
-    </w:p>
-    <w:p>
-      <w:pPr>
-        <w:spacing w:after="0" w:line="240" w:lineRule="auto"/>
-        <w:tabs>
-          <w:tab w:val="right" w:leader="dot" w:pos="9360"/>
-        </w:tabs>
-      </w:pPr>
-      <w:r>
-        <w:rPr>
-          <w:sz w:val="22"/>
-        </w:rPr>
-        <w:t>Canonical publication and privacy</w:t>
-      </w:r>
-      <w:r>
-        <w:rPr>
-          <w:sz w:val="22"/>
-        </w:rPr>
         <w:tab/>
         <w:t>8</w:t>
       </w:r>
     </w:p>
     <w:p>
       <w:pPr>
-        <w:spacing w:after="0" w:line="240" w:lineRule="auto"/>
+        <w:spacing w:after="120"/>
         <w:tabs>
           <w:tab w:val="right" w:leader="dot" w:pos="9360"/>
         </w:tabs>
       </w:pPr>
       <w:r>
-        <w:rPr>
-          <w:sz w:val="22"/>
-        </w:rPr>
-        <w:t>HTML guides and bundle validation</w:t>
+        <w:t>Publication and privacy</w:t>
       </w:r>
       <w:r>
-        <w:rPr>
-          <w:sz w:val="22"/>
-        </w:rPr>
-        <w:tab/>
-        <w:t>8</w:t>
-      </w:r>
-    </w:p>
-    <w:p>
-      <w:pPr>
-        <w:spacing w:after="0" w:line="240" w:lineRule="auto"/>
-        <w:tabs>
-          <w:tab w:val="right" w:leader="dot" w:pos="9360"/>
-        </w:tabs>
-      </w:pPr>
-      <w:r>
-        <w:rPr>
-          <w:sz w:val="22"/>
-        </w:rPr>
-        <w:t>Translation boundary</w:t>
-      </w:r>
-      <w:r>
-        <w:rPr>
-          <w:sz w:val="22"/>
-        </w:rPr>
         <w:tab/>
         <w:t>9</w:t>
       </w:r>
     </w:p>
     <w:p>
       <w:pPr>
-        <w:spacing w:after="0" w:line="240" w:lineRule="auto"/>
+        <w:spacing w:after="120"/>
         <w:tabs>
           <w:tab w:val="right" w:leader="dot" w:pos="9360"/>
         </w:tabs>
       </w:pPr>
       <w:r>
-        <w:rPr>
-          <w:sz w:val="22"/>
-        </w:rPr>
-        <w:t>Verification and release discipline</w:t>
+        <w:t>Maintain the learning product</w:t>
       </w:r>
       <w:r>
-        <w:rPr>
-          <w:sz w:val="22"/>
-        </w:rPr>
-        <w:tab/>
-        <w:t>9</w:t>
-      </w:r>
-    </w:p>
-    <w:p>
-      <w:pPr>
-        <w:spacing w:after="0" w:line="240" w:lineRule="auto"/>
-        <w:tabs>
-          <w:tab w:val="right" w:leader="dot" w:pos="9360"/>
-        </w:tabs>
-      </w:pPr>
-      <w:r>
-        <w:rPr>
-          <w:sz w:val="22"/>
-        </w:rPr>
-        <w:t>Current semantic cache and extended evidence</w:t>
-      </w:r>
-      <w:r>
-        <w:rPr>
-          <w:sz w:val="22"/>
-        </w:rPr>
-        <w:tab/>
-        <w:t>9</w:t>
-      </w:r>
-    </w:p>
-    <w:p>
-      <w:pPr>
-        <w:spacing w:after="0" w:line="240" w:lineRule="auto"/>
-        <w:tabs>
-          <w:tab w:val="right" w:leader="dot" w:pos="9360"/>
-        </w:tabs>
-      </w:pPr>
-      <w:r>
-        <w:rPr>
-          <w:sz w:val="22"/>
-        </w:rPr>
-        <w:t>Current schema and authored document contracts</w:t>
-      </w:r>
-      <w:r>
-        <w:rPr>
-          <w:sz w:val="22"/>
-        </w:rPr>
         <w:tab/>
         <w:t>10</w:t>
       </w:r>
     </w:p>
     <w:p>
-      <w:pPr>
-        <w:spacing w:after="0" w:line="240" w:lineRule="auto"/>
-        <w:tabs>
-          <w:tab w:val="right" w:leader="dot" w:pos="9360"/>
-        </w:tabs>
-      </w:pPr>
       <w:r>
-        <w:rPr>
-          <w:sz w:val="22"/>
-        </w:rPr>
-        <w:t>Native review and learning projections</w:t>
-      </w:r>
-      <w:r>
-        <w:rPr>
-          <w:sz w:val="22"/>
-        </w:rPr>
-        <w:tab/>
-        <w:t>10</w:t>
-      </w:r>
-    </w:p>
-    <w:p>
-      <w:pPr>
-        <w:spacing w:after="0" w:line="240" w:lineRule="auto"/>
-        <w:tabs>
-          <w:tab w:val="right" w:leader="dot" w:pos="9360"/>
-        </w:tabs>
-      </w:pPr>
-      <w:r>
-        <w:rPr>
-          <w:sz w:val="22"/>
-        </w:rPr>
-        <w:t>Saved observation persistence</w:t>
-      </w:r>
-      <w:r>
-        <w:rPr>
-          <w:sz w:val="22"/>
-        </w:rPr>
-        <w:tab/>
-        <w:t>10</w:t>
-      </w:r>
-    </w:p>
-    <w:p>
-      <w:pPr>
-        <w:spacing w:after="0" w:line="240" w:lineRule="auto"/>
-        <w:tabs>
-          <w:tab w:val="right" w:leader="dot" w:pos="9360"/>
-        </w:tabs>
-      </w:pPr>
-      <w:r>
-        <w:rPr>
-          <w:sz w:val="22"/>
-        </w:rPr>
-        <w:t>Regression commands and evidence</w:t>
-      </w:r>
-      <w:r>
-        <w:rPr>
-          <w:sz w:val="22"/>
-        </w:rPr>
-        <w:tab/>
-        <w:t>11</w:t>
-      </w:r>
-    </w:p>
-    <w:p>
-      <w:pPr>
-        <w:spacing w:after="0" w:line="240" w:lineRule="auto"/>
-        <w:tabs>
-          <w:tab w:val="right" w:leader="dot" w:pos="9360"/>
-        </w:tabs>
-      </w:pPr>
-      <w:r>
-        <w:rPr>
-          <w:sz w:val="22"/>
-        </w:rPr>
-        <w:t>Rebuild and inspect these manuals</w:t>
-      </w:r>
-      <w:r>
-        <w:rPr>
-          <w:sz w:val="22"/>
-        </w:rPr>
-        <w:tab/>
-        <w:t>11</w:t>
-      </w:r>
-    </w:p>
-    <w:p>
-      <w:pPr>
-        <w:spacing w:after="0" w:line="240" w:lineRule="auto"/>
-        <w:tabs>
-          <w:tab w:val="right" w:leader="dot" w:pos="9360"/>
-        </w:tabs>
-      </w:pPr>
-      <w:r>
-        <w:rPr>
-          <w:sz w:val="22"/>
-        </w:rPr>
-        <w:t>Business glossary implementation and checks</w:t>
-      </w:r>
-      <w:r>
-        <w:rPr>
-          <w:sz w:val="22"/>
-        </w:rPr>
-        <w:tab/>
-        <w:t>12</w:t>
-      </w:r>
-    </w:p>
-    <w:p>
-      <w:pPr>
-        <w:spacing w:after="0" w:line="240" w:lineRule="auto"/>
-        <w:tabs>
-          <w:tab w:val="right" w:leader="dot" w:pos="9360"/>
-        </w:tabs>
-      </w:pPr>
-      <w:r>
-        <w:rPr>
-          <w:sz w:val="22"/>
-        </w:rPr>
-        <w:t>Offline translation and localized publication</w:t>
-      </w:r>
-      <w:r>
-        <w:rPr>
-          <w:sz w:val="22"/>
-        </w:rPr>
-        <w:tab/>
-        <w:t>12</w:t>
-      </w:r>
-    </w:p>
-    <w:p>
-      <w:pPr>
-        <w:spacing w:after="0" w:line="240" w:lineRule="auto"/>
-        <w:tabs>
-          <w:tab w:val="right" w:leader="dot" w:pos="9360"/>
-        </w:tabs>
-      </w:pPr>
-      <w:r>
-        <w:rPr>
-          <w:sz w:val="22"/>
-        </w:rPr>
-        <w:t>Native validation and release evidence</w:t>
-      </w:r>
-      <w:r>
-        <w:rPr>
-          <w:sz w:val="22"/>
-        </w:rPr>
-        <w:tab/>
-        <w:t>13</w:t>
-      </w:r>
-    </w:p>
-    <w:p>
-      <w:pPr>
-        <w:spacing w:after="0" w:line="240" w:lineRule="auto"/>
-        <w:tabs>
-          <w:tab w:val="right" w:leader="dot" w:pos="9360"/>
-        </w:tabs>
-      </w:pPr>
-      <w:r>
-        <w:rPr>
-          <w:sz w:val="22"/>
-        </w:rPr>
-        <w:t>Structured project profile contract</w:t>
-      </w:r>
-      <w:r>
-        <w:rPr>
-          <w:sz w:val="22"/>
-        </w:rPr>
-        <w:tab/>
-        <w:t>13</w:t>
-      </w:r>
-    </w:p>
-    <w:p>
-      <w:pPr>
-        <w:spacing w:after="0" w:line="240" w:lineRule="auto"/>
-        <w:tabs>
-          <w:tab w:val="right" w:leader="dot" w:pos="9360"/>
-        </w:tabs>
-      </w:pPr>
-      <w:r>
-        <w:rPr>
-          <w:sz w:val="22"/>
-        </w:rPr>
-        <w:t>Quality analysis and revision comparison</w:t>
-      </w:r>
-      <w:r>
-        <w:rPr>
-          <w:sz w:val="22"/>
-        </w:rPr>
-        <w:tab/>
-        <w:t>14</w:t>
-      </w:r>
-    </w:p>
-    <w:p>
-      <w:pPr>
-        <w:spacing w:after="0" w:line="240" w:lineRule="auto"/>
-        <w:tabs>
-          <w:tab w:val="right" w:leader="dot" w:pos="9360"/>
-        </w:tabs>
-      </w:pPr>
-      <w:r>
-        <w:rPr>
-          <w:sz w:val="22"/>
-        </w:rPr>
-        <w:t>Keyboard inspector implementation and validation</w:t>
-      </w:r>
-      <w:r>
-        <w:rPr>
-          <w:sz w:val="22"/>
-        </w:rPr>
-        <w:tab/>
-        <w:t>14</w:t>
-      </w:r>
-    </w:p>
-    <w:p>
-      <w:pPr>
-        <w:pageBreakBefore/>
-        <w:spacing w:after="0" w:line="240" w:lineRule="auto"/>
-        <w:tabs>
-          <w:tab w:val="right" w:leader="dot" w:pos="9360"/>
-        </w:tabs>
-      </w:pPr>
-      <w:r>
-        <w:rPr>
-          <w:sz w:val="22"/>
-        </w:rPr>
-        <w:t>Command inventory implementation and validation</w:t>
-      </w:r>
-      <w:r>
-        <w:rPr>
-          <w:sz w:val="22"/>
-        </w:rPr>
-        <w:tab/>
-        <w:t>15</w:t>
-      </w:r>
-    </w:p>
-    <w:p>
-      <w:pPr>
-        <w:spacing w:after="0" w:line="240" w:lineRule="auto"/>
-        <w:tabs>
-          <w:tab w:val="right" w:leader="dot" w:pos="9360"/>
-        </w:tabs>
-      </w:pPr>
-      <w:r>
-        <w:rPr>
-          <w:sz w:val="22"/>
-        </w:rPr>
-        <w:t>Dynamic control relationships and validation</w:t>
-      </w:r>
-      <w:r>
-        <w:rPr>
-          <w:sz w:val="22"/>
-        </w:rPr>
-        <w:tab/>
-        <w:t>15</w:t>
-      </w:r>
-    </w:p>
-    <w:p>
-      <w:pPr>
-        <w:spacing w:after="0" w:line="240" w:lineRule="auto"/>
-        <w:tabs>
-          <w:tab w:val="right" w:leader="dot" w:pos="9360"/>
-        </w:tabs>
-      </w:pPr>
-      <w:r>
-        <w:rPr>
-          <w:sz w:val="22"/>
-        </w:rPr>
-        <w:t>Layout rule explanations and validation</w:t>
-      </w:r>
-      <w:r>
-        <w:rPr>
-          <w:sz w:val="22"/>
-        </w:rPr>
-        <w:tab/>
-        <w:t>15</w:t>
-      </w:r>
-    </w:p>
-    <w:p>
-      <w:pPr>
-        <w:spacing w:after="0" w:line="240" w:lineRule="auto"/>
-        <w:tabs>
-          <w:tab w:val="right" w:leader="dot" w:pos="9360"/>
-        </w:tabs>
-      </w:pPr>
-      <w:r>
-        <w:rPr>
-          <w:sz w:val="22"/>
-        </w:rPr>
-        <w:t>Component dependencies and attributed metadata</w:t>
-      </w:r>
-      <w:r>
-        <w:rPr>
-          <w:sz w:val="22"/>
-        </w:rPr>
-        <w:tab/>
-        <w:t>16</w:t>
-      </w:r>
-    </w:p>
-    <w:p>
-      <w:pPr>
-        <w:spacing w:after="0" w:line="240" w:lineRule="auto"/>
-        <w:tabs>
-          <w:tab w:val="right" w:leader="dot" w:pos="9360"/>
-        </w:tabs>
-      </w:pPr>
-      <w:r>
-        <w:rPr>
-          <w:sz w:val="22"/>
-        </w:rPr>
-        <w:t>Resolve form inheritance and frame overlays</w:t>
-      </w:r>
-      <w:r>
-        <w:rPr>
-          <w:sz w:val="22"/>
-        </w:rPr>
-        <w:tab/>
-        <w:t>17</w:t>
-      </w:r>
-    </w:p>
-    <w:p>
-      <w:pPr>
-        <w:spacing w:after="0" w:line="240" w:lineRule="auto"/>
-        <w:tabs>
-          <w:tab w:val="right" w:leader="dot" w:pos="9360"/>
-        </w:tabs>
-      </w:pPr>
-      <w:r>
-        <w:rPr>
-          <w:sz w:val="22"/>
-        </w:rPr>
-        <w:t>Store attributed action purpose mappings</w:t>
-      </w:r>
-      <w:r>
-        <w:rPr>
-          <w:sz w:val="22"/>
-        </w:rPr>
-        <w:tab/>
-        <w:t>17</w:t>
-      </w:r>
-    </w:p>
-    <w:p>
-      <w:pPr>
-        <w:spacing w:after="0" w:line="240" w:lineRule="auto"/>
-        <w:tabs>
-          <w:tab w:val="right" w:leader="dot" w:pos="9360"/>
-        </w:tabs>
-      </w:pPr>
-      <w:r>
-        <w:rPr>
-          <w:sz w:val="22"/>
-        </w:rPr>
-        <w:t>Compare attributed screen evidence and captured layouts</w:t>
-      </w:r>
-      <w:r>
-        <w:rPr>
-          <w:sz w:val="22"/>
-        </w:rPr>
-        <w:tab/>
-        <w:t>18</w:t>
-      </w:r>
-    </w:p>
-    <w:p>
-      <w:pPr>
-        <w:spacing w:after="0" w:line="240" w:lineRule="auto"/>
-        <w:tabs>
-          <w:tab w:val="right" w:leader="dot" w:pos="9360"/>
-        </w:tabs>
-      </w:pPr>
-      <w:r>
-        <w:rPr>
-          <w:sz w:val="22"/>
-        </w:rPr>
-        <w:t>Build a safe captured database connection inventory</w:t>
-      </w:r>
-      <w:r>
-        <w:rPr>
-          <w:sz w:val="22"/>
-        </w:rPr>
-        <w:tab/>
-        <w:t>18</w:t>
-      </w:r>
-    </w:p>
-    <w:p>
-      <w:pPr>
-        <w:spacing w:after="0" w:line="240" w:lineRule="auto"/>
-        <w:tabs>
-          <w:tab w:val="right" w:leader="dot" w:pos="9360"/>
-        </w:tabs>
-      </w:pPr>
-      <w:r>
-        <w:rPr>
-          <w:sz w:val="22"/>
-        </w:rPr>
-        <w:t>Derive captured database engine and version evidence</w:t>
-      </w:r>
-      <w:r>
-        <w:rPr>
-          <w:sz w:val="22"/>
-        </w:rPr>
-        <w:tab/>
-        <w:t>19</w:t>
-      </w:r>
-    </w:p>
-    <w:p>
-      <w:pPr>
-        <w:spacing w:after="0" w:line="240" w:lineRule="auto"/>
-        <w:tabs>
-          <w:tab w:val="right" w:leader="dot" w:pos="9360"/>
-        </w:tabs>
-      </w:pPr>
-      <w:r>
-        <w:rPr>
-          <w:sz w:val="22"/>
-        </w:rPr>
-        <w:t>Inspect captured database schema evidence</w:t>
-      </w:r>
-      <w:r>
-        <w:rPr>
-          <w:sz w:val="22"/>
-        </w:rPr>
-        <w:tab/>
-        <w:t>20</w:t>
-      </w:r>
-    </w:p>
-    <w:p>
-      <w:pPr>
-        <w:spacing w:after="0" w:line="240" w:lineRule="auto"/>
-        <w:tabs>
-          <w:tab w:val="right" w:leader="dot" w:pos="9360"/>
-        </w:tabs>
-      </w:pPr>
-      <w:r>
-        <w:rPr>
-          <w:sz w:val="22"/>
-        </w:rPr>
-        <w:t>Extract captured column declarations and constraint text</w:t>
-      </w:r>
-      <w:r>
-        <w:rPr>
-          <w:sz w:val="22"/>
-        </w:rPr>
-        <w:tab/>
-        <w:t>20</w:t>
-      </w:r>
-    </w:p>
-    <w:p>
-      <w:pPr>
-        <w:spacing w:after="0" w:line="240" w:lineRule="auto"/>
-        <w:tabs>
-          <w:tab w:val="right" w:leader="dot" w:pos="9360"/>
-        </w:tabs>
-      </w:pPr>
-      <w:r>
-        <w:rPr>
-          <w:sz w:val="22"/>
-        </w:rPr>
-        <w:t>Resolve captured key membership and references</w:t>
-      </w:r>
-      <w:r>
-        <w:rPr>
-          <w:sz w:val="22"/>
-        </w:rPr>
-        <w:tab/>
-        <w:t>21</w:t>
-      </w:r>
-    </w:p>
-    <w:p>
-      <w:pPr>
-        <w:spacing w:after="0" w:line="240" w:lineRule="auto"/>
-        <w:tabs>
-          <w:tab w:val="right" w:leader="dot" w:pos="9360"/>
-        </w:tabs>
-      </w:pPr>
-      <w:r>
-        <w:rPr>
-          <w:sz w:val="22"/>
-        </w:rPr>
-        <w:t>Capture index structures and SQL reference evidence</w:t>
-      </w:r>
-      <w:r>
-        <w:rPr>
-          <w:sz w:val="22"/>
-        </w:rPr>
-        <w:tab/>
-        <w:t>22</w:t>
-      </w:r>
-    </w:p>
-    <w:p>
-      <w:pPr>
-        <w:spacing w:after="0" w:line="240" w:lineRule="auto"/>
-        <w:tabs>
-          <w:tab w:val="right" w:leader="dot" w:pos="9360"/>
-        </w:tabs>
-      </w:pPr>
-      <w:r>
-        <w:rPr>
-          <w:sz w:val="22"/>
-        </w:rPr>
-        <w:t>Capture stored-object definitions and dependencies</w:t>
-      </w:r>
-      <w:r>
-        <w:rPr>
-          <w:sz w:val="22"/>
-        </w:rPr>
-        <w:tab/>
-        <w:t>23</w:t>
-      </w:r>
-    </w:p>
-    <w:p>
-      <w:pPr>
-        <w:spacing w:after="0" w:line="240" w:lineRule="auto"/>
-        <w:tabs>
-          <w:tab w:val="right" w:leader="dot" w:pos="9360"/>
-        </w:tabs>
-      </w:pPr>
-      <w:r>
-        <w:rPr>
-          <w:sz w:val="22"/>
-        </w:rPr>
-        <w:t>Project captured entity relationship metadata</w:t>
-      </w:r>
-      <w:r>
-        <w:rPr>
-          <w:sz w:val="22"/>
-        </w:rPr>
-        <w:tab/>
-        <w:t>24</w:t>
-      </w:r>
-    </w:p>
-    <w:p>
-      <w:pPr>
-        <w:spacing w:after="0" w:line="240" w:lineRule="auto"/>
-        <w:tabs>
-          <w:tab w:val="right" w:leader="dot" w:pos="9360"/>
-        </w:tabs>
-      </w:pPr>
-      <w:r>
-        <w:rPr>
-          <w:sz w:val="22"/>
-        </w:rPr>
-        <w:t>Maintain attributed schema dictionaries</w:t>
-      </w:r>
-      <w:r>
-        <w:rPr>
-          <w:sz w:val="22"/>
-        </w:rPr>
-        <w:tab/>
-        <w:t>25</w:t>
-      </w:r>
-    </w:p>
-    <w:p>
-      <w:pPr>
-        <w:spacing w:after="0" w:line="240" w:lineRule="auto"/>
-        <w:tabs>
-          <w:tab w:val="right" w:leader="dot" w:pos="9360"/>
-        </w:tabs>
-      </w:pPr>
-      <w:r>
-        <w:rPr>
-          <w:sz w:val="22"/>
-        </w:rPr>
-        <w:t>Resolve captured dataset and field bindings</w:t>
-      </w:r>
-      <w:r>
-        <w:rPr>
-          <w:sz w:val="22"/>
-        </w:rPr>
-        <w:tab/>
-        <w:t>26</w:t>
-      </w:r>
-    </w:p>
-    <w:p>
-      <w:pPr>
-        <w:spacing w:after="0" w:line="240" w:lineRule="auto"/>
-        <w:tabs>
-          <w:tab w:val="right" w:leader="dot" w:pos="9360"/>
-        </w:tabs>
-      </w:pPr>
-      <w:r>
-        <w:rPr>
-          <w:sz w:val="22"/>
-        </w:rPr>
-        <w:t>Recognize captured database operation requests</w:t>
-      </w:r>
-      <w:r>
-        <w:rPr>
-          <w:sz w:val="22"/>
-        </w:rPr>
-        <w:tab/>
-        <w:t>27</w:t>
-      </w:r>
-    </w:p>
-    <w:p>
-      <w:pPr>
-        <w:spacing w:after="0" w:line="240" w:lineRule="auto"/>
-        <w:tabs>
-          <w:tab w:val="right" w:leader="dot" w:pos="9360"/>
-        </w:tabs>
-      </w:pPr>
-      <w:r>
-        <w:rPr>
-          <w:sz w:val="22"/>
-        </w:rPr>
-        <w:t>Trace captured transaction boundaries</w:t>
-      </w:r>
-      <w:r>
-        <w:rPr>
-          <w:sz w:val="22"/>
-        </w:rPr>
-        <w:tab/>
-        <w:t>27</w:t>
-      </w:r>
-    </w:p>
-    <w:p>
-      <w:pPr>
-        <w:spacing w:after="0" w:line="240" w:lineRule="auto"/>
-        <w:tabs>
-          <w:tab w:val="right" w:leader="dot" w:pos="9360"/>
-        </w:tabs>
-      </w:pPr>
-      <w:r>
-        <w:rPr>
-          <w:sz w:val="22"/>
-        </w:rPr>
-        <w:t>Capture field validation and transformation evidence</w:t>
-      </w:r>
-      <w:r>
-        <w:rPr>
-          <w:sz w:val="22"/>
-        </w:rPr>
-        <w:tab/>
-        <w:t>28</w:t>
-      </w:r>
-    </w:p>
-    <w:p>
-      <w:pPr>
-        <w:spacing w:after="0" w:line="240" w:lineRule="auto"/>
-        <w:tabs>
-          <w:tab w:val="right" w:leader="dot" w:pos="9360"/>
-        </w:tabs>
-      </w:pPr>
-      <w:r>
-        <w:rPr>
-          <w:sz w:val="22"/>
-        </w:rPr>
-        <w:t>Connect source evidence into scoped lineage</w:t>
-      </w:r>
-      <w:r>
-        <w:rPr>
-          <w:sz w:val="22"/>
-        </w:rPr>
-        <w:tab/>
-        <w:t>28</w:t>
-      </w:r>
-    </w:p>
-    <w:p>
-      <w:pPr>
-        <w:spacing w:after="0" w:line="240" w:lineRule="auto"/>
-        <w:tabs>
-          <w:tab w:val="right" w:leader="dot" w:pos="9360"/>
-        </w:tabs>
-      </w:pPr>
-      <w:r>
-        <w:rPr>
-          <w:sz w:val="22"/>
-        </w:rPr>
-        <w:t>Project captured migration and version evidence</w:t>
-      </w:r>
-      <w:r>
-        <w:rPr>
-          <w:sz w:val="22"/>
-        </w:rPr>
-        <w:tab/>
-        <w:t>29</w:t>
-      </w:r>
-    </w:p>
-    <w:p>
-      <w:pPr>
-        <w:spacing w:after="0" w:line="240" w:lineRule="auto"/>
-        <w:tabs>
-          <w:tab w:val="right" w:leader="dot" w:pos="9360"/>
-        </w:tabs>
-      </w:pPr>
-      <w:r>
-        <w:rPr>
-          <w:sz w:val="22"/>
-        </w:rPr>
-        <w:t>Project captured file formats and contracts</w:t>
-      </w:r>
-      <w:r>
-        <w:rPr>
-          <w:sz w:val="22"/>
-        </w:rPr>
-        <w:tab/>
-        <w:t>30</w:t>
-      </w:r>
-    </w:p>
-    <w:p>
-      <w:pPr>
-        <w:spacing w:after="0" w:line="240" w:lineRule="auto"/>
-        <w:tabs>
-          <w:tab w:val="right" w:leader="dot" w:pos="9360"/>
-        </w:tabs>
-      </w:pPr>
-      <w:r>
-        <w:rPr>
-          <w:sz w:val="22"/>
-        </w:rPr>
-        <w:t>Maintain attributed target retention requirements</w:t>
-      </w:r>
-      <w:r>
-        <w:rPr>
-          <w:sz w:val="22"/>
-        </w:rPr>
-        <w:tab/>
-        <w:t>30</w:t>
-      </w:r>
-    </w:p>
-    <w:p>
-      <w:pPr>
-        <w:spacing w:after="0" w:line="240" w:lineRule="auto"/>
-        <w:tabs>
-          <w:tab w:val="right" w:leader="dot" w:pos="9360"/>
-        </w:tabs>
-      </w:pPr>
-      <w:r>
-        <w:rPr>
-          <w:sz w:val="22"/>
-        </w:rPr>
-        <w:t>Maintain target data quality evidence and report imports</w:t>
-      </w:r>
-      <w:r>
-        <w:rPr>
-          <w:sz w:val="22"/>
-        </w:rPr>
-        <w:tab/>
-        <w:t>31</w:t>
-      </w:r>
-    </w:p>
-    <w:p>
-      <w:pPr>
-        <w:spacing w:after="0" w:line="240" w:lineRule="auto"/>
-        <w:tabs>
-          <w:tab w:val="right" w:leader="dot" w:pos="9360"/>
-        </w:tabs>
-      </w:pPr>
-      <w:r>
-        <w:rPr>
-          <w:sz w:val="22"/>
-        </w:rPr>
-        <w:t>Maintain target backup and restoration evidence</w:t>
-      </w:r>
-      <w:r>
-        <w:rPr>
-          <w:sz w:val="22"/>
-        </w:rPr>
-        <w:tab/>
-        <w:t>32</w:t>
-      </w:r>
-    </w:p>
-    <w:p>
-      <w:pPr>
-        <w:spacing w:after="0" w:line="240" w:lineRule="auto"/>
-        <w:tabs>
-          <w:tab w:val="right" w:leader="dot" w:pos="9360"/>
-        </w:tabs>
-      </w:pPr>
-      <w:r>
-        <w:rPr>
-          <w:sz w:val="22"/>
-        </w:rPr>
-        <w:t>Maintain structured business process records</w:t>
-      </w:r>
-      <w:r>
-        <w:rPr>
-          <w:sz w:val="22"/>
-        </w:rPr>
-        <w:tab/>
-        <w:t>32</w:t>
-      </w:r>
-    </w:p>
-    <w:p>
-      <w:pPr>
-        <w:spacing w:after="0" w:line="240" w:lineRule="auto"/>
-        <w:tabs>
-          <w:tab w:val="right" w:leader="dot" w:pos="9360"/>
-        </w:tabs>
-      </w:pPr>
-      <w:r>
-        <w:rPr>
-          <w:sz w:val="22"/>
-        </w:rPr>
-        <w:t>Maintain ordered departmental workflow evidence</w:t>
-      </w:r>
-      <w:r>
-        <w:rPr>
-          <w:sz w:val="22"/>
-        </w:rPr>
-        <w:tab/>
-        <w:t>33</w:t>
-      </w:r>
-    </w:p>
-    <w:p>
-      <w:pPr>
-        <w:spacing w:after="0" w:line="240" w:lineRule="auto"/>
-        <w:tabs>
-          <w:tab w:val="right" w:leader="dot" w:pos="9360"/>
-        </w:tabs>
-      </w:pPr>
-      <w:r>
-        <w:rPr>
-          <w:sz w:val="22"/>
-        </w:rPr>
-        <w:t>Maintain end-to-end process projections</w:t>
-      </w:r>
-      <w:r>
-        <w:rPr>
-          <w:sz w:val="22"/>
-        </w:rPr>
-        <w:tab/>
-        <w:t>33</w:t>
-      </w:r>
-    </w:p>
-    <w:p>
-      <w:pPr>
-        <w:spacing w:after="0" w:line="240" w:lineRule="auto"/>
-        <w:tabs>
-          <w:tab w:val="right" w:leader="dot" w:pos="9360"/>
-        </w:tabs>
-      </w:pPr>
-      <w:r>
-        <w:rPr>
-          <w:sz w:val="22"/>
-        </w:rPr>
-        <w:t>Maintain the business rule catalog</w:t>
-      </w:r>
-      <w:r>
-        <w:rPr>
-          <w:sz w:val="22"/>
-        </w:rPr>
-        <w:tab/>
-        <w:t>34</w:t>
-      </w:r>
-    </w:p>
-    <w:p>
-      <w:pPr>
-        <w:spacing w:after="0" w:line="240" w:lineRule="auto"/>
-        <w:tabs>
-          <w:tab w:val="right" w:leader="dot" w:pos="9360"/>
-        </w:tabs>
-      </w:pPr>
-      <w:r>
-        <w:rPr>
-          <w:sz w:val="22"/>
-        </w:rPr>
-        <w:t>Maintain calculation evidence and definitions</w:t>
-      </w:r>
-      <w:r>
-        <w:rPr>
-          <w:sz w:val="22"/>
-        </w:rPr>
-        <w:tab/>
-        <w:t>34</w:t>
-      </w:r>
-    </w:p>
-    <w:p>
-      <w:pPr>
-        <w:spacing w:after="0" w:line="240" w:lineRule="auto"/>
-        <w:tabs>
-          <w:tab w:val="right" w:leader="dot" w:pos="9360"/>
-        </w:tabs>
-      </w:pPr>
-      <w:r>
-        <w:rPr>
-          <w:sz w:val="22"/>
-        </w:rPr>
-        <w:t>Source and revision evidence</w:t>
-      </w:r>
-      <w:r>
-        <w:rPr>
-          <w:sz w:val="22"/>
-        </w:rPr>
-        <w:tab/>
-        <w:t>35</w:t>
-      </w:r>
-    </w:p>
-    <w:p>
-      <w:pPr>
-        <w:spacing w:before="0" w:after="0" w:line="20" w:lineRule="exact"/>
-      </w:pPr>
-      <w:r>
-        <w:rPr>
-          <w:sz w:val="2"/>
-        </w:rPr>
         <w:fldChar w:fldCharType="end"/>
       </w:r>
     </w:p>
@@ -1352,3032 +188,613 @@
         <w:pageBreakBefore/>
       </w:pPr>
       <w:r>
-        <w:t>Architecture and boundaries</w:t>
+        <w:t>Purpose and architecture</w:t>
+      </w:r>
+    </w:p>
+    <w:p>
+      <w:pPr>
+        <w:pStyle w:val="Heading2"/>
+      </w:pPr>
+      <w:r>
+        <w:t>The learning contract</w:t>
       </w:r>
     </w:p>
     <w:p>
       <w:r>
-        <w:t>DPH is an independent Delphi FMX application. It has no converter runtime or build dependency. The pinned VCL2FMXConverter v6.0.0 corpus is test input only, at commit e1fd10b2d3b06f2fc3f726b8eb7f234a54faf63d. No converter source was copied into the current analyzer. Preserve the original planning documents and global agents.md byte for byte.</w:t>
+        <w:t>Delphi Project Handoff (DPH) is an independent FireMonkey desktop application for learning one selected Delphi application or project group. Its primary interface presents purpose, screens, actions, guided tasks and attributed answers. Source analysis supports that learning route. Preparation detail should answer a question or help produce reliable lessons.</w:t>
+      </w:r>
+    </w:p>
+    <w:p>
+      <w:pPr>
+        <w:pStyle w:val="Heading2"/>
+      </w:pPr>
+      <w:r>
+        <w:t>Main responsibilities</w:t>
       </w:r>
     </w:p>
     <w:p>
       <w:r>
-        <w:t>The pipeline is selected project, bounded inventory, read-only byte acquisition, lexical and conditional processing, Pascal and form IR, semantic relationships and control flow, revision-consistent SQLite capture, cached workspace projection, curated knowledge and derived publication. Contract data remains separate from FMX. Every unsupported construct or unavailable dependency must remain diagnosable rather than being promoted into false completeness.</w:t>
+        <w:t>DPH.UI.Main.pas and its .fmx resource own navigation and native editors. DPH.Workspace.Worker.pas performs background capture, opening, saving and publication. DPH.Project.Analysis.pas orchestrates bounded read-only inventory and parsing. DPH.Analysis.Symbols.pas resolves supported relationships. DPH.Storage.Database.pas persists coherent source generations and immutable authored revisions.</w:t>
       </w:r>
     </w:p>
     <w:p>
       <w:r>
-        <w:t>Application controls are serialized in DPH.UI.Main.fmx, DPH.UI.ProjectProfile.fmx and DPH.UI.Glossary.fmx and editable in the IDE. List contents and paint-box geometry are data projections. No scanned component class is instantiated. Avoid adding runtime-only controls, Pascal class helpers or an alternative authoritative store without explicit authorization.</w:t>
+        <w:t>DPH.Workspace.Model.pas provides the captured view and typed task contract. DPH.Analysis.Explanations.pas generates beginner topics and object explanations from selected facts. DPH.Publish.Model.pas builds scoped, redacted publication data. DPH.Publish.Export.pas renders learning pages, technical indexes and editable guides. DPH.Publish.BrowserPolicy.pas restricts local navigation.</w:t>
+      </w:r>
+    </w:p>
+    <w:p>
+      <w:pPr>
+        <w:pStyle w:val="Heading2"/>
+      </w:pPr>
+      <w:r>
+        <w:t>Data route</w:t>
+      </w:r>
+    </w:p>
+    <w:p>
+      <w:r>
+        <w:t>Selection leads to bounded input acquisition, syntax and relationship analysis, then coherent database publication. Captured facts and authored knowledge feed explanations. Native readers and exported pages use that material. Human instructions survive source reassessment.</w:t>
       </w:r>
     </w:p>
     <w:p>
       <w:pPr>
         <w:pStyle w:val="Heading1"/>
+        <w:pageBreakBefore/>
       </w:pPr>
       <w:r>
-        <w:t>Rework and acceptance status</w:t>
+        <w:t>Source and storage boundaries</w:t>
+      </w:r>
+    </w:p>
+    <w:p>
+      <w:pPr>
+        <w:pStyle w:val="Heading2"/>
+      </w:pPr>
+      <w:r>
+        <w:t>Read without executing the selected application</w:t>
       </w:r>
     </w:p>
     <w:p>
       <w:r>
-        <w:t>The owner rejected the earlier WP7 delivery as inadequate for learning and handoff. The statement that implementation through WP7 was complete has been withdrawn. docs/Rework_Requirements_Audit.txt compares the original plan with the implemented product and outstanding work. Historical WP reports remain historical evidence, not acceptance of the reworked experience.</w:t>
+        <w:t>Discovery follows the selected project and permitted dependencies. It reads source and form resources without compiling the target, loading its component classes, running scripts or contacting live services. Missing input and unsupported syntax produce diagnostics. Supported source relationships remain distinguishable from uncertain or inferred behavior.</w:t>
+      </w:r>
+    </w:p>
+    <w:p>
+      <w:pPr>
+        <w:pStyle w:val="Heading2"/>
+      </w:pPr>
+      <w:r>
+        <w:t>Persist reliable lessons</w:t>
       </w:r>
     </w:p>
     <w:p>
       <w:r>
-        <w:t>The rework adds a first-launch Getting started course, deterministic explanation engine, guided learning workspace, source-comment context, event traces, labeled and collapsed procedure-flow views, attributed screenshot imports and richer project-specific publication. Run tools/build-learning.cmd with an optional pinned reference database path for dedicated learning and real-WebView2 tests. The source-based first-time-programmer exercise still needs a human participant.</w:t>
+        <w:t>Each selected project has a .dphdb SQLite store accessed through FireDAC, with numbered migrations under migrations. The workspace catalog remembers locations and preferences separately. Managed .dphdb.views material travels beside its database. Generation publication is atomic; failure or interruption preserves the last usable generation.</w:t>
       </w:r>
     </w:p>
     <w:p>
       <w:r>
-        <w:t>The implementation tracker records expanded semantic reuse, resource interpretation and retention/continuity controls. Their documented bounds still apply. Source safety, privacy, attribution and exact generation links are retained. Do not turn an automated pass count into a claim that every requirement or the human onboarding goal is finished.</w:t>
+        <w:t>SaveKnowledge uses expected revision values to prevent stale editors overwriting newer content. Edits and reviews create immutable history. learning_lesson records have a stable identity, six named fields and ordered action/expected_result steps. Storage validates their canonical body, contributor, scope and identity. Legacy free text retains its original instructions.</w:t>
+      </w:r>
+    </w:p>
+    <w:p>
+      <w:pPr>
+        <w:pStyle w:val="Heading2"/>
+      </w:pPr>
+      <w:r>
+        <w:t>Retain truthful explanations</w:t>
+      </w:r>
+    </w:p>
+    <w:p>
+      <w:r>
+        <w:t>Hashes and source ranges identify evidence. They do not establish a successful run or a correct business rule. Rendering a lesson or hiding a page must not clear partial coverage. Preserve pending contributions and Unknown fields until someone supplies or verifies the missing knowledge.</w:t>
       </w:r>
     </w:p>
     <w:p>
       <w:pPr>
         <w:pStyle w:val="Heading1"/>
+        <w:pageBreakBefore/>
       </w:pPr>
       <w:r>
-        <w:t>Build and deployment</w:t>
+        <w:t>Native interface and lesson generation</w:t>
+      </w:r>
+    </w:p>
+    <w:p>
+      <w:pPr>
+        <w:pStyle w:val="Heading2"/>
+      </w:pPr>
+      <w:r>
+        <w:t>Keep forms editable</w:t>
       </w:r>
     </w:p>
     <w:p>
       <w:r>
-        <w:t>The installed compiler is RAD Studio 37.0.59082.6021. Load C:\Program Files (x86)\Embarcadero\Studio\37.0\bin\rsvars.bat before compiling. tools/build-wp0.cmd builds DelphiProjectHandoff.dproj with elevated MSBuild and runs the FMX resource smoke test. Output is bin/Win32/Debug, with DCUs in dcu/Win32/Debug. The initial executable target is Windows Win32.</w:t>
+        <w:t>Open DPH.UI.Main.fmx and dedicated dialog forms in RAD Studio. Change layout, captions, margins, fonts and control properties in the Object Inspector. Ordinary forms must use serialized controls. HTML is a generated view hosted by serialized browser controls, with native text where supported.</w:t>
+      </w:r>
+    </w:p>
+    <w:p>
+      <w:pPr>
+        <w:pStyle w:val="Heading2"/>
+      </w:pPr>
+      <w:r>
+        <w:t>Separate learning and preparation</w:t>
       </w:r>
     </w:p>
     <w:p>
       <w:r>
-        <w:t>Deploy the executable, all nine immutable migration files, and the architecture-matched WebView2Loader.dll. The reviewed Microsoft WebView2 SDK package is pinned to 1.0.4258.31; retain tools/WebView2/LICENSE.txt with binary redistribution. The browser loads the DLL by its absolute executable-folder path and activates Edge only when preview is requested. There is no intended IE fallback.</w:t>
+        <w:t>LessonPageCombo contains learner destinations. SetupTab holds preparation, with source settings collapsed in AnalysisSettingsExpander. WorkspacePageChange builds optional reports on demand. Opening lessons should not build every report for hidden pages.</w:t>
       </w:r>
     </w:p>
     <w:p>
       <w:r>
-        <w:t>The repository standard folders include bin, dcu, docs/guides, docs/pdf, export, help, images and icons, samples, source distributions and tools. Deploy help/index.html for first-launch education. Reference source and generated test databases remain ignored. Use the explicitly approved Python 3.13 executable for project tooling and the installed LibreOffice, never Microsoft Word.</w:t>
+        <w:t>TaskTab presents saved instructions one step at a time. TaskEditorTab holds fields and the ordered draft. Keep step accepts a step edit; Save task persists the whole record through the worker and returns to the reader. Protect drafts during opening and saving. A failed save must retain entered instructions.</w:t>
+      </w:r>
+    </w:p>
+    <w:p>
+      <w:pPr>
+        <w:pStyle w:val="Heading2"/>
+      </w:pPr>
+      <w:r>
+        <w:t>Generate from selected facts</w:t>
+      </w:r>
+    </w:p>
+    <w:p>
+      <w:r>
+        <w:t>LessonHTML supplies twelve topics. ObjectLessonHTML introduces the selected object, linked human purpose, actual choices and bounded next connections. The source walkthrough remains optional. The native text fallback uses the same lesson. Unlinked global notes must not masquerade as the purpose of every object.</w:t>
       </w:r>
     </w:p>
     <w:p>
       <w:pPr>
         <w:pStyle w:val="Heading1"/>
+        <w:pageBreakBefore/>
       </w:pPr>
       <w:r>
-        <w:t>Input acquisition and project scope</w:t>
+        <w:t>Build and run DPH</w:t>
+      </w:r>
+    </w:p>
+    <w:p>
+      <w:pPr>
+        <w:pStyle w:val="Heading2"/>
+      </w:pPr>
+      <w:r>
+        <w:t>Development requirements</w:t>
       </w:r>
     </w:p>
     <w:p>
       <w:r>
-        <w:t>DPH.Project.Inventory follows the selected project, explicit references, uses clauses, include paths and approved external roots. Project XML is passive: targets and imported build scripts are not executed. Canonical paths are project relative and normalized; traversal, ambiguous macros, reparse paths, cycles and oversized acquisition are rejected or diagnosed. A repository-wide count of Pascal files is not the build scope.</w:t>
+        <w:t>Use Windows, RAD Studio 37.0 with Delphi and FireMonkey, FireDAC SQLite support and Microsoft WebView2 Runtime for embedded pages. Build scripts initialize the compiler environment through rsvars.bat. Debug and Win32 is the validated desktop configuration; other builds need their own validation.</w:t>
+      </w:r>
+    </w:p>
+    <w:p>
+      <w:pPr>
+        <w:pStyle w:val="Heading2"/>
+      </w:pPr>
+      <w:r>
+        <w:t>Build from source</w:t>
+      </w:r>
+    </w:p>
+    <w:p>
+      <w:pPr>
+        <w:ind w:left="259" w:hanging="259"/>
+      </w:pPr>
+      <w:r>
+        <w:rPr>
+          <w:b/>
+        </w:rPr>
+        <w:t xml:space="preserve">1. </w:t>
+      </w:r>
+      <w:r>
+        <w:t>Open an elevated Windows command prompt so RAD Studio can read its environment settings.</w:t>
+      </w:r>
+    </w:p>
+    <w:p>
+      <w:pPr>
+        <w:ind w:left="259" w:hanging="259"/>
+      </w:pPr>
+      <w:r>
+        <w:rPr>
+          <w:b/>
+        </w:rPr>
+        <w:t xml:space="preserve">2. </w:t>
+      </w:r>
+      <w:r>
+        <w:t>Change to the DPH source root containing DelphiProjectHandoff.dproj and tools.</w:t>
+      </w:r>
+    </w:p>
+    <w:p>
+      <w:pPr>
+        <w:ind w:left="259" w:hanging="259"/>
+      </w:pPr>
+      <w:r>
+        <w:rPr>
+          <w:b/>
+        </w:rPr>
+        <w:t xml:space="preserve">3. </w:t>
+      </w:r>
+      <w:r>
+        <w:t>Run tools\build-wp0.cmd. It builds under bin\Win32\Debug and runs the serialized FMX resource and binding baseline.</w:t>
+      </w:r>
+    </w:p>
+    <w:p>
+      <w:pPr>
+        <w:ind w:left="259" w:hanging="259"/>
+      </w:pPr>
+      <w:r>
+        <w:rPr>
+          <w:b/>
+        </w:rPr>
+        <w:t xml:space="preserve">4. </w:t>
+      </w:r>
+      <w:r>
+        <w:t>Require a zero exit code and PASS WP0-TEST. Investigate the first error if compilation fails.</w:t>
+      </w:r>
+    </w:p>
+    <w:p>
+      <w:pPr>
+        <w:ind w:left="259" w:hanging="259"/>
+      </w:pPr>
+      <w:r>
+        <w:rPr>
+          <w:b/>
+        </w:rPr>
+        <w:t xml:space="preserve">5. </w:t>
+      </w:r>
+      <w:r>
+        <w:t>Start bin\Win32\Debug\DelphiProjectHandoff.exe from the source tree. Keep WebView2Loader.dll beside it; its migration search locates the supplied migrations folder.</w:t>
+      </w:r>
+    </w:p>
+    <w:p>
+      <w:pPr>
+        <w:pStyle w:val="Heading2"/>
+      </w:pPr>
+      <w:r>
+        <w:t>Use the IDE</w:t>
       </w:r>
     </w:p>
     <w:p>
       <w:r>
-        <w:t>DPH.Project.Source opens input read only, checks the final opened Windows handle path, captures bytes, records SHA256 and verifies decoding by round trip. Unicode byte offsets, line endings and explicit legacy encodings remain in the evidence contract. The maximum acquired source is 16 MiB. Binary forms are parsed as data; unsupported resources remain gaps.</w:t>
-      </w:r>
-    </w:p>
-    <w:p>
-      <w:r>
-        <w:t>A source viewer must re-acquire the live file and match the captured hash before using a cached range. Externally referenced sources use their explicit canonical inventory identity. Never invent a neighboring source path from a cached filename or execute input to fill an analysis gap.</w:t>
+        <w:t>Open DelphiProjectHandoff.dproj, select Debug and Win32 and inspect the main form before building. If a running DPH instance locks the output, check for unsaved edits, close that instance and rebuild. Do not close unrelated applications to solve a build failure.</w:t>
       </w:r>
     </w:p>
     <w:p>
       <w:pPr>
         <w:pStyle w:val="Heading1"/>
+        <w:pageBreakBefore/>
       </w:pPr>
       <w:r>
-        <w:t>Syntax contracts and limits</w:t>
+        <w:t>Validate a change</w:t>
+      </w:r>
+    </w:p>
+    <w:p>
+      <w:pPr>
+        <w:pStyle w:val="Heading2"/>
+      </w:pPr>
+      <w:r>
+        <w:t>Run meaningful checks</w:t>
       </w:r>
     </w:p>
     <w:p>
       <w:r>
-        <w:t>DPH.Parse.Model defines IR schema 1, analyzer DPH-WP2-6, token and node limits, source ranges and diagnostics. Lexing preserves original tokens and conditional information. Preprocessing evaluates supported expressions, explicit defines and includes while retaining uncertainty for unknown branches. An unavailable compiler symbol is not automatically a false condition.</w:t>
+        <w:t>Native regressions instantiate serialized forms and use real WebView2 rendering. Persistence checks use disposable databases. Test fixtures are copies or designated samples; selected application sources must remain unchanged. Automated checks do not constitute independent beginner acceptance.</w:t>
+      </w:r>
+    </w:p>
+    <w:p>
+      <w:pPr>
+        <w:ind w:left="259" w:hanging="259"/>
+      </w:pPr>
+      <w:r>
+        <w:rPr>
+          <w:b/>
+        </w:rPr>
+        <w:t xml:space="preserve">1. </w:t>
+      </w:r>
+      <w:r>
+        <w:t>Run tools\build-wp0.cmd for the application and form baseline.</w:t>
+      </w:r>
+    </w:p>
+    <w:p>
+      <w:pPr>
+        <w:ind w:left="259" w:hanging="259"/>
+      </w:pPr>
+      <w:r>
+        <w:rPr>
+          <w:b/>
+        </w:rPr>
+        <w:t xml:space="preserve">2. </w:t>
+      </w:r>
+      <w:r>
+        <w:t>Run tools\build-learning-refocus.cmd. Its optional argument is a prepared reference .dphdb; omit it for the small-fixture checks.</w:t>
+      </w:r>
+    </w:p>
+    <w:p>
+      <w:pPr>
+        <w:ind w:left="259" w:hanging="259"/>
+      </w:pPr>
+      <w:r>
+        <w:rPr>
+          <w:b/>
+        </w:rPr>
+        <w:t xml:space="preserve">3. </w:t>
+      </w:r>
+      <w:r>
+        <w:t>Run tools\build-guided-tasks.cmd followed by a new disposable database path outside the source fixture folder. It checks ordering, saving, reopening and task export.</w:t>
+      </w:r>
+    </w:p>
+    <w:p>
+      <w:pPr>
+        <w:ind w:left="259" w:hanging="259"/>
+      </w:pPr>
+      <w:r>
+        <w:rPr>
+          <w:b/>
+        </w:rPr>
+        <w:t xml:space="preserve">4. </w:t>
+      </w:r>
+      <w:r>
+        <w:t>Run tools\build-wp6.cmd for publication, redaction, navigation and integrity. Run tools\build-phase1.cmd when changing the project profile.</w:t>
+      </w:r>
+    </w:p>
+    <w:p>
+      <w:pPr>
+        <w:ind w:left="259" w:hanging="259"/>
+      </w:pPr>
+      <w:r>
+        <w:rPr>
+          <w:b/>
+        </w:rPr>
+        <w:t xml:space="preserve">5. </w:t>
+      </w:r>
+      <w:r>
+        <w:t>Read final PASS lines and process exit codes. Resolve failures before committing. Add the appropriate analyzer or storage suite when those contracts change.</w:t>
+      </w:r>
+    </w:p>
+    <w:p>
+      <w:pPr>
+        <w:pStyle w:val="Heading2"/>
+      </w:pPr>
+      <w:r>
+        <w:t>Check the learning route</w:t>
       </w:r>
     </w:p>
     <w:p>
       <w:r>
-        <w:t>The Pascal parser extracts declarations, routines, anonymous methods and supported statements into IR. Declaration and implementation occurrences remain distinguishable before semantic unification. The form parser accepts supported text and binary DFM/FMX structures without loading component packages. The inventory reads relevant project configuration and resources through bounded adapters.</w:t>
+        <w:t>Open a representative application. Read its purpose, follow a screen event, inspect a decision and read a prepared task. Save and reopen an answer. Export and follow the same object from learning.html. Check maximized and restored windows for readable labels, scrolling and expected results.</w:t>
+      </w:r>
+    </w:p>
+    <w:p>
+      <w:pPr>
+        <w:pStyle w:val="Heading2"/>
+      </w:pPr>
+      <w:r>
+        <w:t>Contain disposable output</w:t>
       </w:r>
     </w:p>
     <w:p>
       <w:r>
-        <w:t>Current bounds include 250000 tokens, 100000 IR nodes, nesting 128 and 10000 diagnostics. Opaque assembler, malformed syntax and unsupported grammar are partial. Tests use exact golden IR, encoding edge cases, cyclic includes, passive malicious imports and changed source. Maintain source byte ranges and diagnostics when extending support.</w:t>
+        <w:t>Keep validation output under bin in clearly designated folders. Retain failure evidence until diagnosed, then remove obsolete generated workspaces. Preserve one reusable reference cache where useful. Never delete source fixtures, owner databases or authored material while cleaning tests.</w:t>
       </w:r>
     </w:p>
     <w:p>
       <w:pPr>
         <w:pStyle w:val="Heading1"/>
+        <w:pageBreakBefore/>
       </w:pPr>
       <w:r>
-        <w:t>Symbols and typed relationships</w:t>
+        <w:t>Package and deploy</w:t>
+      </w:r>
+    </w:p>
+    <w:p>
+      <w:pPr>
+        <w:pStyle w:val="Heading2"/>
+      </w:pPr>
+      <w:r>
+        <w:t>Create the desktop folder</w:t>
       </w:r>
     </w:p>
     <w:p>
       <w:r>
-        <w:t>DPH.Analysis.Model defines semantic schema 1 and analyzer DPH-WP3-15. Stable symbol keys contain qualified identity, signature and conditional variant. DPH.Analysis.Symbols unifies supported routine prototypes and bodies, resolves cross-unit declarations, typed receivers and suitable overloads, associates form events and records anonymous callbacks.</w:t>
+        <w:t>The package needs DelphiProjectHandoff.exe, WebView2Loader.dll, migrations, help, current guides and Databases instructions. DPH.ValidateHandoff.exe is an included technical validation tool. Microsoft WebView2 Runtime is a system prerequisite separate from its loader DLL.</w:t>
+      </w:r>
+    </w:p>
+    <w:p>
+      <w:pPr>
+        <w:ind w:left="259" w:hanging="259"/>
+      </w:pPr>
+      <w:r>
+        <w:rPr>
+          <w:b/>
+        </w:rPr>
+        <w:t xml:space="preserve">1. </w:t>
+      </w:r>
+      <w:r>
+        <w:t>Build and validate the application and publication validator.</w:t>
+      </w:r>
+    </w:p>
+    <w:p>
+      <w:pPr>
+        <w:ind w:left="259" w:hanging="259"/>
+      </w:pPr>
+      <w:r>
+        <w:rPr>
+          <w:b/>
+        </w:rPr>
+        <w:t xml:space="preserve">2. </w:t>
+      </w:r>
+      <w:r>
+        <w:t>Run tools\package-dph.ps1 through PowerShell with ExecutionPolicy Bypass. It creates a new versioned staging folder and refuses an existing one.</w:t>
+      </w:r>
+    </w:p>
+    <w:p>
+      <w:pPr>
+        <w:ind w:left="259" w:hanging="259"/>
+      </w:pPr>
+      <w:r>
+        <w:rPr>
+          <w:b/>
+        </w:rPr>
+        <w:t xml:space="preserve">3. </w:t>
+      </w:r>
+      <w:r>
+        <w:t>Verify the checksum report and extract the ZIP into a different local folder.</w:t>
+      </w:r>
+    </w:p>
+    <w:p>
+      <w:pPr>
+        <w:ind w:left="259" w:hanging="259"/>
+      </w:pPr>
+      <w:r>
+        <w:rPr>
+          <w:b/>
+        </w:rPr>
+        <w:t xml:space="preserve">4. </w:t>
+      </w:r>
+      <w:r>
+        <w:t>Start the extracted executable and confirm Getting started, native controls and migration discovery. Use only a disposable database for this deployment check.</w:t>
+      </w:r>
+    </w:p>
+    <w:p>
+      <w:pPr>
+        <w:ind w:left="259" w:hanging="259"/>
+      </w:pPr>
+      <w:r>
+        <w:rPr>
+          <w:b/>
+        </w:rPr>
+        <w:t xml:space="preserve">5. </w:t>
+      </w:r>
+      <w:r>
+        <w:t>Check the package contains current guides and help, with no owner databases, private documents, development history or personal path references.</w:t>
+      </w:r>
+    </w:p>
+    <w:p>
+      <w:pPr>
+        <w:pStyle w:val="Heading2"/>
+      </w:pPr>
+      <w:r>
+        <w:t>Give recipients plain directions</w:t>
       </w:r>
     </w:p>
     <w:p>
       <w:r>
-        <w:t>Relationship certainty is confirmed_static, possible_dynamic, inferred, runtime_observed or unresolved. Passive scanning never claims runtime_observed. A uses dependency is not a call. Known lexical calls, serialized bindings and declared types carry derivation rules and source ranges. Recognized asynchronous API spelling can establish a possible scheduling relationship without proving execution order.</w:t>
-      </w:r>
-    </w:p>
-    <w:p>
-      <w:r>
-        <w:t>Method pointers, unresolved receivers, dynamic dispatch, generated types and framework behavior must retain uncertainty. Basic reads, writes, callback assignment, static SQL spelling and report-model rendering are conservative analyses. Renames are distinct identities until continuity is reviewed; offsets alone must not reassign knowledge.</w:t>
+        <w:t>Tell recipients to extract the package, open its folder and double-click DelphiProjectHandoff.exe. The User Guide describes deployed files and visible controls. Compiler configuration belongs in this Engineering Guide. Describe source locations with relative project paths.</w:t>
       </w:r>
     </w:p>
     <w:p>
       <w:pPr>
         <w:pStyle w:val="Heading1"/>
+        <w:pageBreakBefore/>
       </w:pPr>
       <w:r>
-        <w:t>Control flow and impact</w:t>
+        <w:t>Publication and privacy</w:t>
+      </w:r>
+    </w:p>
+    <w:p>
+      <w:pPr>
+        <w:pStyle w:val="Heading2"/>
+      </w:pPr>
+      <w:r>
+        <w:t>Publish learning first</w:t>
       </w:r>
     </w:p>
     <w:p>
       <w:r>
-        <w:t>DPH.Analysis.Flow builds per-routine control-flow nodes and typed edges for supported sequences, branches, loops, returns and exception/finally paths. Routine identity, source hash, range, node kind and expression remain available to inspectors and exports. Flow is bounded to 100000 nodes, 300000 edges and nesting 128.</w:t>
+        <w:t>learning.html combines twelve topics, supplied tasks, answers, images and business terms. Hash-named object pages begin with beginner explanations and retain optional source detail. index.html and JSONL files support technical inspection. Native Preview lessons opens learning.html.</w:t>
       </w:r>
     </w:p>
     <w:p>
       <w:r>
-        <w:t>Impact traversal is possible reachability through supported relationships. Do not label it proved runtime impact. The UI bounds a displayed graph to 120 nodes and 960 edges, while the stored semantic graph is the fuller evidence model. Uncertain edges remain visually distinct. Unsupported flow does not become a fabricated successful path.</w:t>
+        <w:t>Render from a scoped, redacted TDPHDocumentModel. Filter excluded files and unavailable links before rendering, and encode contributed prose as text. Screenshots remain contributor-supplied material. Source navigation and generated agent instructions require explicit options.</w:t>
+      </w:r>
+    </w:p>
+    <w:p>
+      <w:pPr>
+        <w:pStyle w:val="Heading2"/>
+      </w:pPr>
+      <w:r>
+        <w:t>Validate an edition</w:t>
+      </w:r>
+    </w:p>
+    <w:p>
+      <w:r>
+        <w:t>Run DPH.ValidateHandoff.exe with the edition folder and a separately retained trusted input fingerprint. The default rejects stale or partial material. --allow-stale permits historical integrity inspection without changing that status. The checksum index detects modifications; it does not authenticate an unknown author.</w:t>
+      </w:r>
+    </w:p>
+    <w:p>
+      <w:pPr>
+        <w:pStyle w:val="Heading2"/>
+      </w:pPr>
+      <w:r>
+        <w:t>Create PDF companions</w:t>
+      </w:r>
+    </w:p>
+    <w:p>
+      <w:r>
+        <w:t>tools\export-pdf.ps1 accepts -BundleDirectory for an edition. It uses LibreOffice, populates changeable contents fields and refreshes checksums. tools\build-guides.py rebuilds DPH's manuals and matching HTML help. Inspect every rendered page after a layout-sensitive edit.</w:t>
       </w:r>
     </w:p>
     <w:p>
       <w:pPr>
         <w:pStyle w:val="Heading1"/>
+        <w:pageBreakBefore/>
       </w:pPr>
       <w:r>
-        <w:t>SQLite generations and durability</w:t>
+        <w:t>Maintain the learning product</w:t>
+      </w:r>
+    </w:p>
+    <w:p>
+      <w:pPr>
+        <w:pStyle w:val="Heading2"/>
+      </w:pPr>
+      <w:r>
+        <w:t>Plan a focused change</w:t>
       </w:r>
     </w:p>
     <w:p>
       <w:r>
-        <w:t>TDPHKnowledgeStore owns one FireDAC SQLite connection on its creating thread and serializes writer access through a named mutex. Foreign keys and synchronous FULL are enabled. Default journal mode is DELETE; WAL is an explicit local-store option. Direct cross-thread writes are rejected. SQLite 3.42.0 with FTS5 was measured by the storage tests.</w:t>
+        <w:t>Begin with a learning problem: an unclear task, an unexplained control or an unanswered question. Locate the native form and responsible model. Reuse save and publication contracts rather than creating another administrative system. Keep the learner route concise and supporting detail optional.</w:t>
+      </w:r>
+    </w:p>
+    <w:p>
+      <w:pPr>
+        <w:pStyle w:val="Heading2"/>
+      </w:pPr>
+      <w:r>
+        <w:t>Protect the data</w:t>
       </w:r>
     </w:p>
     <w:p>
       <w:r>
-        <w:t>Schema 9 is created through nine checksum-verified migrations. Existing migration text is immutable. A newer incompatible schema is rejected safely. Failed upgrade DDL and ledger changes roll back, and an upgrade from an existing schema makes a recoverable pre-migration database backup. Interrupted running generations recover as failed, preserving the previous published head.</w:t>
+        <w:t>Take the required verified backup before approved changes and synchronize the configured Git repositories after validated commits. Development backup locations belong to the environment, not the User Guide. For storage or migration changes, verify old databases open and authored revisions survive.</w:t>
+      </w:r>
+    </w:p>
+    <w:p>
+      <w:pPr>
+        <w:pStyle w:val="Heading2"/>
+      </w:pPr>
+      <w:r>
+        <w:t>Investigate failures</w:t>
       </w:r>
     </w:p>
     <w:p>
       <w:r>
-        <w:t>ObserveManifest records current fingerprints independently of the capture. BeginGeneration freezes configuration and manifest identity. Syntax and semantic facts are staged in transactions. Before publication, inputs and configuration are revalidated. Only a coherent complete generation becomes the current head. Partial, failed or superseded captures cannot clear the exact-input stale state or overwrite a prior current head.</w:t>
+        <w:t>For preparation failure, inspect the first diagnostic, missing files, scope and intended defines. For a save conflict, reopen the latest revision and reconcile the contribution. For a browser failure, check WebView2 Runtime and loader availability and use native text. For broken sharing links, regenerate from the scoped model and validate the edition.</w:t>
       </w:r>
     </w:p>
     <w:p>
       <w:pPr>
-        <w:pStyle w:val="Heading1"/>
+        <w:pStyle w:val="Heading2"/>
       </w:pPr>
       <w:r>
-        <w:t>Evidence and immutable history</w:t>
+        <w:t>Maintain the manuals</w:t>
       </w:r>
     </w:p>
     <w:p>
       <w:r>
-        <w:t>Normalized tables include projects, configurations, source files, file revisions, generations, generation files, entities, entity versions, evidence, relationships, component properties, control-flow nodes and edges, knowledge records and revisions, links, review tasks, translations, artifacts, export jobs and audit events. Foreign keys tie evidence and relationships to their producing generation.</w:t>
-      </w:r>
-    </w:p>
-    <w:p>
-      <w:r>
-        <w:t>Triggers prevent mutation of terminal generations, source revisions, captured facts, configurations and authored knowledge revisions. Evidence ranges must fit the captured source bytes and use the generation analyzer version. Historical file and entity identities cannot be changed casually. A missing source is retained as missing; its historical annotations survive.</w:t>
-      </w:r>
-    </w:p>
-    <w:p>
-      <w:r>
-        <w:t>Modification detected, analysis stale, knowledge review needed, analysis failed and reassessment requested are separate persistent flags. A UI summary is a projection of these states, not a replacement for them. Parser success must not clear human review.</w:t>
-      </w:r>
-    </w:p>
-    <w:p>
-      <w:pPr>
-        <w:pStyle w:val="Heading1"/>
-      </w:pPr>
-      <w:r>
-        <w:t>Background coordination and cached views</w:t>
-      </w:r>
-    </w:p>
-    <w:p>
-      <w:r>
-        <w:t>DPH.Workspace.Worker is a persistent TThread with bounded request and response queues. It initializes COM for passive MSXML parsing, owns database operations in the worker, and retains analyzer instances across requests. FMX polls responses with a timer, avoiding queued closures that outlive the form.</w:t>
-      </w:r>
-    </w:p>
-    <w:p>
-      <w:r>
-        <w:t>A stopped Delphi queue can report success while returning an empty item. Poll checks both the wait result and a non-nil response; shutdown tests guard against a destructor loop. Cancellation is checked between stages and marks a staged running generation failed when appropriate. It is not a promise of interruption inside every parser loop.</w:t>
-      </w:r>
-    </w:p>
-    <w:p>
-      <w:r>
-        <w:t>Workspace projections are managed JSON files in database.dphdb.views named by SHA256 and registered in artifacts. Cached opening verifies the managed path, size, checksum and generation. Cached facts are delivered before automatic verification when the original source entry is available; unavailable source remains detached. Connected checks compare manifest fingerprints and selection identity every ten seconds. Syntax and routine semantic caches are bounded and binding-context aware; conservative postprocessing remains separate from reused routine facts.</w:t>
-      </w:r>
-    </w:p>
-    <w:p>
-      <w:pPr>
-        <w:pStyle w:val="Heading1"/>
-      </w:pPr>
-      <w:r>
-        <w:t>FMX navigation and visualization</w:t>
-      </w:r>
-    </w:p>
-    <w:p>
-      <w:r>
-        <w:t>DPH.UI.Main binds its published controls to the FMX resource. Explorer queries are paged at 250 rows; data filtering supports kind, text and qualified scope. History and bookmarks use canonical keys, with surviving same-project bookmarks retained across reassessment. Inspector output retains source metadata and serialized properties. Source memo navigation is permitted only after live hash validation.</w:t>
-      </w:r>
-    </w:p>
-    <w:p>
-      <w:r>
-        <w:t>OpenSelection queues a candidate without replacing the current database, source or workspace. PollTimer installs it only after the worker returns accepted captured evidence. The worker preflights source identity before creating a database; cached opens check captured XML ProjectGuid and Pascal program declarations before returning a view. Rejections retain the current workspace, and rejected startup caches show Getting started. Inventory identity also covers referenced project groups. DatabaseDialog.InitialDir is the design-time relative default; startup resolves it under the deployment root, creates that folder, and applies the same path to OpenCacheDialog. Distribution packaging copies only the Databases instructions, never its databases or views.</w:t>
-      </w:r>
-    </w:p>
-    <w:p>
-      <w:r>
-        <w:t>Graph paint boxes draw bounded evidence data with palette and geometry values supplied by design-time style rectangles. Screen reconstruction draws approximate source-derived rectangles without creating components. Its gallery is bounded to 60 forms. Runtime styles, custom painting and inherited resources are not silently fabricated.</w:t>
-      </w:r>
-    </w:p>
-    <w:p>
-      <w:r>
-        <w:t>Keep lifecycle and ownership explicit: the view owns its JSON document, UI arrays own their records, responses transfer document or knowledge ownership to the main form, and the worker frees unconsumed responses during shutdown. Guard unsaved authored text before changing projects or replacing editor state.</w:t>
-      </w:r>
-    </w:p>
-    <w:p>
-      <w:pPr>
-        <w:pStyle w:val="Heading1"/>
-      </w:pPr>
-      <w:r>
-        <w:t>Curated knowledge and review</w:t>
-      </w:r>
-    </w:p>
-    <w:p>
-      <w:r>
-        <w:t>SaveKnowledge requires title, body, a named author, a supported kind and a captured generation. Existing records require their expected revision and stable kind. Ordinary titles stay stable; structured glossary names can change while their identity and history remain intact. Each edit appends a needs_review revision, preserves links and opens a pending task. Knowledge bodies are bounded to 1 MiB. Authored text is never regenerated from parser output.</w:t>
-      </w:r>
-    </w:p>
-    <w:p>
-      <w:r>
-        <w:t>ReviewKnowledge requires the expected current revision, a named reviewer and a matching captured source/configuration. The connected worker observes current source before accepting a review. A missing linked entity cannot be verified under a replacement name. Verification, rejection or retirement appends a revision and records attribution; history remains append only.</w:t>
-      </w:r>
-    </w:p>
-    <w:p>
-      <w:r>
-        <w:t>Manifest and configuration changes conservatively invalidate active knowledge, derived artifacts and translations. A partial static capture may support review of an attributable statement against available evidence, but its partial coverage remains visible. Local names are not authenticated enterprise identities. Human verification and automatic static derivation remain different evidence categories.</w:t>
-      </w:r>
-    </w:p>
-    <w:p>
-      <w:pPr>
-        <w:pStyle w:val="Heading1"/>
-      </w:pPr>
-      <w:r>
-        <w:t>Canonical publication and privacy</w:t>
-      </w:r>
-    </w:p>
-    <w:p>
-      <w:r>
-        <w:t>DPH.Publish.Model constructs one versioned documentation model from a captured workspace and current curated knowledge. It carries generation, configuration, input/context fingerprints, detached/stale state, symbols, typed relationships, control flow, source references, human history, coverage and explicit unknowns. Full and task-scoped views share those facts.</w:t>
-      </w:r>
-    </w:p>
-    <w:p>
-      <w:r>
-        <w:t>Task scope selects the requested identities and complete direct incident context. It rejects missing or excluded seeds and rejects an oversized task rather than silently truncating a full export. External source roots and sensitive filename categories are excluded by default. Explicit relative prefix exclusions remove file-derived symbols and relationships. Source snapshots and generated AGENTS.md are absent by default.</w:t>
-      </w:r>
-    </w:p>
-    <w:p>
-      <w:r>
-        <w:t>Redaction recognizes common credential assignments, private keys, AWS access keys and JWT-shaped tokens throughout string data. It is defense in depth, not a guarantee that every project-specific secret format is recognizable. Require explicit exclusions and a disclosure review for sensitive content. No translation or AI provider is contacted by normal publishing.</w:t>
-      </w:r>
-    </w:p>
-    <w:p>
-      <w:pPr>
-        <w:pStyle w:val="Heading1"/>
-      </w:pPr>
-      <w:r>
-        <w:t>HTML guides and bundle validation</w:t>
-      </w:r>
-    </w:p>
-    <w:p>
-      <w:r>
-        <w:t>DPH.Publish.Export writes a new destination outside source. The offline HTML uses encoded imported text, local search and styles, internal anchors, print CSS and a restrictive content security policy. The default WebView2 policy permits only the authorized local index and about:blank; publication explicitly enables hash-named object pages in its managed objects folder. Help retains the index-only policy; learning explicitly permits content-hashed pages only inside its owned preview directory. There is no arbitrary native bridge. Data does not supply executable markup.</w:t>
-      </w:r>
-    </w:p>
-    <w:p>
-      <w:r>
-        <w:t>JSONL indexes contain symbols, relationships, forms/events, data usage, configuration, flow nodes, knowledge and evidence references. Manifest and checksum files accompany canonical.json. The validator checks filenames, hashes, expected input fingerprint, canonical identity, source hash/range, generation and cross-reference integrity. A stale manifest is rejected by default. Unsigned hashes establish integrity relative to the index, not author authenticity.</w:t>
-      </w:r>
-    </w:p>
-    <w:p>
-      <w:r>
-        <w:t>Editable engineering and user DOCX guides derive from the same sections and evidence model. They include title, last changed capture identity and a changeable TOC field. LibreOffice provides companion PDFs; the project rendering tool verifies cached page numbers and renders page images for layout inspection. Missing business procedures stay explicitly absent rather than being invented.</w:t>
-      </w:r>
-    </w:p>
-    <w:p>
-      <w:pPr>
-        <w:pStyle w:val="Heading1"/>
-      </w:pPr>
-      <w:r>
-        <w:t>Translation boundary</w:t>
-      </w:r>
-    </w:p>
-    <w:p>
-      <w:r>
-        <w:t>IDPHTranslationProvider exposes provider identity, version, external status and prose translation. Protected segments retain identifiers, SQL, paths, hashes and protocol keys byte for byte. Cache keys include source content, revision, source/target locales and provider/version. Changed prose produces a fresh pending entry; named review applies to the exact cached translation.</w:t>
-      </w:r>
-    </w:p>
-    <w:p>
-      <w:r>
-        <w:t>TDPHAtlasAdapter reads explicitly selected DAT JSON packs offline. The independent Apache-2.0 reader snapshot and license reside under dependencies\DelphiAppTranslation; VCL2FMX is unchanged and is not a build or runtime dependency. No network provider is configured. Tests exercise actual packs, persistent cache, terminology changes, source invalidation and exact-content named review. The offline GTranslate region is disabled, with local bilingual labels and sorting; do not activate network translation merely because a generic widget name appears in documentation.</w:t>
-      </w:r>
-    </w:p>
-    <w:p>
-      <w:pPr>
-        <w:pStyle w:val="Heading1"/>
-      </w:pPr>
-      <w:r>
-        <w:t>Verification and release discipline</w:t>
-      </w:r>
-    </w:p>
-    <w:p>
-      <w:r>
-        <w:t>Run the phase build/test scripts elevated with the installed toolchain. WP0 checks FMX resource ownership; WP1 checks storage, crash recovery and migrations; WP2 checks inventory, encoding, syntax and source safety; WP3 checks semantics and pinned reference traces; WP4 checks workspace/background behavior; WP5 checks immutable authored history and pending review; WP6 checks publication, exclusions, sanitization, hashes and translation protection.</w:t>
-      </w:r>
-    </w:p>
-    <w:p>
-      <w:r>
-        <w:t>Use exact input hashes before and after analysis, including failures. Preserve original reference and instruction files. Keep tests that demonstrate invariants rather than tests that merely mirror implementation. New source, validation failure or unresolved risk justifies another targeted test; a passing unchanged phase does not need endless repetition.</w:t>
-      </w:r>
-    </w:p>
-    <w:p>
-      <w:r>
-        <w:t>H: development backups are enabled. Allow at least 60 seconds for this USB drive to wake before assessing availability. Git remains enabled: review intended changes, commit validated work and push both public and private remotes without force or history rewriting. Remove a stale zero-byte index lock only after verifying no Git process runs. WP7 records measured performance, portability, security and explicit acceptance evidence. Independent first-time programmer acceptance and unknown historical business intent cannot be invented by automation.</w:t>
-      </w:r>
-    </w:p>
-    <w:p>
-      <w:r>
-        <w:t>In the historical pre-rework benchmark on the recorded Core i7-1165G7 host with eight logical processors and about 16 GB RAM, the pinned reference pipeline measured 82.6 seconds for full capture, 2.87 seconds for cached opening and 75.9 seconds for incremental reassessment. The message-pump maximum gap was 64 ms. Peak test-process working set was about 1.21 GiB, including repeated captures, JSON cloning and FMX/WebView2 tests. These are baseline measurements, not agreed hardware-independent budgets. Large syntax-cache fallback and conservative semantic recomputation explain the modest reassessment speedup. Formal acceptance retains independent complex-flow review, missing business/user content, AC-25 and performance-budget agreement as outstanding.</w:t>
-      </w:r>
-    </w:p>
-    <w:p>
-      <w:pPr>
-        <w:pStyle w:val="Heading1"/>
-      </w:pPr>
-      <w:r>
-        <w:t>Current semantic cache and extended evidence</w:t>
-      </w:r>
-    </w:p>
-    <w:p>
-      <w:r>
-        <w:t>The current analyzers are DPH-WP2-6 and DPH-WP3-15 with IR and semantic schema 1. Routine semantic cache reuse is bounded to 512 records and 32 MiB. Binding context hashes invalidate affected reuse. Synthetic startup and postprocessing occur after reusable routine facts, preserving their relationships to current identities. This is bounded evidence reuse; it is not a proof of an optimal incremental solver.</w:t>
-      </w:r>
-    </w:p>
-    <w:p>
-      <w:r>
-        <w:t>Supported extensions include typed aliases, inheritance and accessors, startup entry and unit phases, case/goto/with control flow, asynchronous operation handles and captures, cancellation and event waits, formal arguments and result producers, static SQL projection, output-writer lineage, lifetime and exception relationships, explicit test-call links, and qualified form navigation. Every relationship retains resolution, source range/hash and rule. Unsupported grammar, aliases and dynamic behavior remain diagnosed or qualified.</w:t>
-      </w:r>
-    </w:p>
-    <w:p>
-      <w:pPr>
-        <w:pStyle w:val="Heading1"/>
-      </w:pPr>
-      <w:r>
-        <w:t>Current schema and authored document contracts</w:t>
-      </w:r>
-    </w:p>
-    <w:p>
-      <w:r>
-        <w:t>Schema 9 uses checksum-verified migrations 001 through 009. document_section_versions associates immutable authored revisions with stable section ID, document kind, audience and source generation. knowledge_revision_links preserves ordinal, target kind/identity, captured generation, role and label. knowledge_questions preserves the exact deterministic question identity and captured JSON associated with a response record.</w:t>
-      </w:r>
-    </w:p>
-    <w:p>
-      <w:r>
-        <w:t>SaveKnowledge appends immutable text and link snapshots. Empty LinksJSON preserves the prior snapshot; an explicit JSON array replaces it. Entity, relationship and evidence targets remain tied to generation identities; screenshot targets reference managed artifacts; section targets pin an exact knowledge revision. Current reverse section references open review when their targets change. Verify rejects obsolete rich-link generations or target revisions.</w:t>
-      </w:r>
-    </w:p>
-    <w:p>
-      <w:r>
-        <w:t>Question identity hashes kind, entity key, range, source hash, prompt, rule and context fingerprint. Generation is retained separately, allowing unchanged evidence to keep its question identity across captures. An answer needs actual text after Answer. Only verified content with no pending task suppresses an exact question. Export converts question metadata to typed JSON before recursive redaction.</w:t>
-      </w:r>
-    </w:p>
-    <w:p>
-      <w:pPr>
-        <w:pStyle w:val="Heading1"/>
-      </w:pPr>
-      <w:r>
-        <w:t>Native review and learning projections</w:t>
-      </w:r>
-    </w:p>
-    <w:p>
-      <w:r>
-        <w:t>ReviewTasks provides bounded pending tasks, prior and current authored text, baseline/current configurations, affected object signatures, types, source hashes and relationship comparisons. A missing baseline is reported. Native controls invoke existing optimistic-revision and connected-source review checks; they do not create a separate approval authority.</w:t>
-      </w:r>
-    </w:p>
-    <w:p>
-      <w:r>
-        <w:t>RoutineLesson uses the routine CFG and an indexed outgoing-edge lookup. It explains source points, actual expressions and destination lines, with explicit loop, branch, early-return, cleanup and exceptional semantics. The same lesson is used by ObjectText and ObjectHTML; exported document prose and offline object pages therefore share its source interpretation. Its bounds are 60 points and eight outgoing paths per point.</w:t>
-      </w:r>
-    </w:p>
-    <w:p>
-      <w:r>
-        <w:t>Preview HTML files have immutable content-hashed names, tracked for cleanup. BrowserPolicy allows them only in the owned preview directory when explicitly enabled. This avoids rewriting a file held by WebView2. Arbitrary filenames and external navigation remain blocked. Native browser tests render the app pages; they do not execute the analyzed application.</w:t>
-      </w:r>
-    </w:p>
-    <w:p>
-      <w:pPr>
-        <w:pStyle w:val="Heading1"/>
-      </w:pPr>
-      <w:r>
-        <w:t>Saved observation persistence</w:t>
-      </w:r>
-    </w:p>
-    <w:p>
-      <w:r>
-        <w:t>ImportObservation accepts explicitly selected UTF-8 text extracts up to 256 KiB with named contributor and run context. It checks generation and optional entity existence, captures original byte SHA256 and linked file-revision SHA256, and stores content plus attribution in a managed hash-named JSON artifact of kind runtime_observation. No schema migration is needed for this artifact kind.</w:t>
-      </w:r>
-    </w:p>
-    <w:p>
-      <w:r>
-        <w:t>ObservationsJSON verifies managed identity, size, checksum and generation before returning the newest 50 records. The response owns the array until PollTimer transfers it to the form. LoadView clears old observation rows; historical records cannot navigate as current. Saved text stays in a native read-only memo rather than an executable browser surface.</w:t>
-      </w:r>
-    </w:p>
-    <w:p>
-      <w:r>
-        <w:t>ManagedArtifactPaths includes observations for explicit portable backup. Retention protects their associated captured views. Publication currently omits observations rather than automatically disclose potentially sensitive logs. Contributor claims do not set runtime_observed on static analysis or create an automated causal trace.</w:t>
-      </w:r>
-    </w:p>
-    <w:p>
-      <w:pPr>
-        <w:pStyle w:val="Heading1"/>
-      </w:pPr>
-      <w:r>
-        <w:t>Regression commands and evidence</w:t>
-      </w:r>
-    </w:p>
-    <w:p>
-      <w:r>
-        <w:t>Run commands from the project root in an elevated Command Prompt so RAD Studio can read its environment. tools\build-wp0.cmd builds the app and checks FMX bindings. tools\validate-completion-wp1.cmd serially builds app, catalog, lifecycle, workspace, knowledge, selection and startup tests, then removes recognized disposable fixture directories.</w:t>
-      </w:r>
-    </w:p>
-    <w:p>
-      <w:r>
-        <w:t>Run tools\build-wp1.cmd for 46 storage checks, tools\build-wp2.cmd no-report for discovery/resource checks, and tools\build-wp3.cmd to compile semantic tests. Then explicitly run bin\Win32\Debug\DPH.Tests.Semantics.exe "C:\New Delphi Projects\Delphi Project Handoff"; the build script alone does not run semantic assertions.</w:t>
-      </w:r>
-    </w:p>
-    <w:p>
-      <w:r>
-        <w:t>tools\build-learning.cmd exercises managed images, cached supplemental-evidence recovery, actual WebView2 rendering, source walkthroughs and collapsed CFGs. --no-ui isolates deterministic checks and is not native acceptance. tools\build-wp6.cmd checks canonical scope, redaction, link integrity, publication and translation protection. Use exact log files and current input hashes for claims; historical reports are not automatically refreshed acceptance.</w:t>
-      </w:r>
-    </w:p>
-    <w:p>
-      <w:r>
-        <w:t>A native-learning test once dereferenced an absent image array on a later background-verification response. It now checks the initial cached document/image response directly. Source attachment preserves supplemental-image warnings. Inspection disproved a proposed constructor race, and no worker thread-start change remains.</w:t>
-      </w:r>
-    </w:p>
-    <w:p>
-      <w:pPr>
-        <w:pStyle w:val="Heading1"/>
-      </w:pPr>
-      <w:r>
-        <w:t>Rebuild and inspect these manuals</w:t>
-      </w:r>
-    </w:p>
-    <w:p>
-      <w:r>
-        <w:t>tools\build-guides.py generates the two application manuals from maintained operating content and current implementation hashes. Use the approved Python executable C:\Users\marti\AppData\Local\Microsoft\WindowsApps\python.exe. tools\render-guides.ps1 renders with LibreOffice, populates cached page numbers in editable TOC fields, renders again and writes companion PDFs under docs\pdf.</w:t>
-      </w:r>
-    </w:p>
-    <w:p>
-      <w:r>
-        <w:t>Inspect every final page PNG under bin\guide-qa for clipping, broken headings, unreadable code and TOC page numbers before delivering a guide. Rendered PNGs are QA outputs, not a mock application UI. Actual included interface images are identified by their capture source and fixture; they do not establish runtime behavior of a selected project.</w:t>
-      </w:r>
-    </w:p>
-    <w:p>
-      <w:r>
-        <w:t>Regenerate manuals after later translation, handoff-contract or source-navigation changes. The source evidence appendix records inspected file hashes, while docs\guide-source-validation.json provides a machine-readable manifest. A successful generator run alone is not proof that the writing, current behavior or layout is correct.</w:t>
-      </w:r>
-    </w:p>
-    <w:p>
-      <w:pPr>
-        <w:pStyle w:val="Heading1"/>
-      </w:pPr>
-      <w:r>
-        <w:t>Business glossary implementation and checks</w:t>
-      </w:r>
-    </w:p>
-    <w:p>
-      <w:r>
-        <w:t>DPH.Knowledge.Glossary validates a business_glossary structured record with term, aliases, definition, examples and relevance/evidence context. Names normalize case and repeated whitespace. Terms/aliases are bounded to 128 characters, 32 aliases per term, definitions/examples to 16384 characters, context to 4096 characters and the record to 64 KiB. Unknown fields, duplicate fields and non-text aliases are rejected.</w:t>
-      </w:r>
-    </w:p>
-    <w:p>
-      <w:r>
-        <w:t>The existing migration 009 structured_json column stores the exact term fields on each immutable knowledge revision; no new migration is needed. SaveKnowledge enforces glossary kind, user document and all-reader audience, generated body agreement, project-local name uniqueness, type preservation and optimistic revision checks. Glossary titles can change while the knowledge ID and prior structured revisions remain intact. Retired records continue reserving their current names.</w:t>
-      </w:r>
-    </w:p>
-    <w:p>
-      <w:r>
-        <w:t>DPH.UI.Glossary.fmx defines every term editor control for the IDE/Object Inspector. DPH.UI.Main.fmx defines the glossary list, filter, detail memo and commands. Apply prepares a draft in the existing Knowledge pipeline. The modal editor retains a cloned saved revision so a background refresh cannot invalidate its input pointer. Current source links, explicit review, search and stale-source tracking use existing repository contracts.</w:t>
-      </w:r>
-    </w:p>
-    <w:p>
-      <w:r>
-        <w:t>DPH-LEARNING-8 publication emits a dedicated HTML glossary index and indexes/glossary.jsonl from the canonical knowledge records. Both user and engineering DOCX use those same records. Validate compares the glossary JSONL with the canonical glossary subset; recomputing the artifact hash cannot conceal divergent content. Older publication versions remain readable under their prior contract.</w:t>
-      </w:r>
-    </w:p>
-    <w:p>
-      <w:r>
-        <w:t>From an elevated Command Prompt run cd /d "C:\New Delphi Projects\Delphi Project Handoff", then tools\build-glossary.cmd. The suite uses the fixed ignored bin\glossary-validation directory and controlled fixtures. It checks field validation, normalized conflicts, persistence, rename, immutable revisions, stale edits/reviews, isolation, source-linked invalidation, search, publication agreement/exclusions/tampering and IDE-designed native form workflows at normal/minimum sizes. Native images are FMX PaintTo renders of actual instantiated controls; they are not screenshots of the analyzed target application.</w:t>
-      </w:r>
-    </w:p>
-    <w:p>
-      <w:r>
-        <w:t>Build the application with tools\build-wp0.cmd. Run tools\build-wp5.cmd for the existing knowledge/link/review regressions and tools\build-wp6.cmd for publishing/translation regressions. A FAIL or nonzero exit means the corresponding check failed. See docs\phase1-glossary-validation.json and the glossary completion note for actual current run evidence.</w:t>
-      </w:r>
-    </w:p>
-    <w:p>
-      <w:pPr>
-        <w:pStyle w:val="Heading1"/>
-      </w:pPr>
-      <w:r>
-        <w:t>Offline translation and localized publication</w:t>
-      </w:r>
-    </w:p>
-    <w:p>
-      <w:r>
-        <w:t>Migration 008 adds the persistent translation cache key and JSON record. Cache identity covers saved knowledge revision, requested locales, provider pack hash, source segments and terminology. SQL state overlays cached metadata so source invalidation remains authoritative after database reopen. Approval requires current source review, complete translated prose and a named reviewer; it never updates authoritative source text.</w:t>
-      </w:r>
-    </w:p>
-    <w:p>
-      <w:r>
-        <w:t>TDPHAtlasAdapter uses DAT.Runtime.LanguagePack plus its two copied core dependencies, original license and hashed snapshot provenance. Selected packs are bounded to 4 MiB, strictly UTF-8 and application scoped. Exact source phrase lookup and base-language fallback are explicit. Common code, SQL, paths and identifiers are protected during segmentation; unusual unmarked identifiers still need human review.</w:t>
-      </w:r>
-    </w:p>
-    <w:p>
-      <w:r>
-        <w:t>DPH-LEARNING-7 publication writes localization.json and, when a locale is requested, a hashed HTML page and Localized_Sections.docx. Verified exact-revision cache entries are eligible only while the canonical source section is reviewed and has no pending tasks. Redacted source bodies use source fallback. The supplementary document explicitly limits its scope to authored bodies.</w:t>
-      </w:r>
-    </w:p>
-    <w:p>
-      <w:r>
-        <w:t>Source navigation is separately opt-in. Only scoped captured text with matching source hashes is rendered as encoded, redacted HTML. Task masks use captured noncontainer ranges and original line starts. source-navigation.json records included line numbers and omission reasons. Validate checks scope, file identity, line order/counts, generations and disclosure metadata. No original source snapshot is shipped.</w:t>
-      </w:r>
-    </w:p>
-    <w:p>
-      <w:pPr>
-        <w:pStyle w:val="Heading1"/>
-      </w:pPr>
-      <w:r>
-        <w:t>Native validation and release evidence</w:t>
-      </w:r>
-    </w:p>
-    <w:p>
-      <w:r>
-        <w:t>The design-time Validate bundle controls dispatch validate_bundle to the worker before a database connection is required. The owner supplies an expected fingerprint independently. Stale rejection is default and historical inspection is an explicit qualification. Native reports distinguish integrity from human approval.</w:t>
-      </w:r>
-    </w:p>
-    <w:p>
-      <w:r>
-        <w:t>The Win32 project enables DCC_LargeAddressAware in its IDE project options. The hardening and learning harnesses use the equivalent PE flag. The expanded pinned corpus exposed an out-of-memory failure after repeated captures and native workspace loading under the former address limit. Keep memory measurements and actual large-corpus validation with this change; the linker flag does not make memory consumption unbounded or establish a release budget.</w:t>
-      </w:r>
-    </w:p>
-    <w:p>
-      <w:r>
-        <w:t>Run tools\validate-wp7.ps1 elevated for the pinned reference hardening suite and before/after hash proof. It reads the current schema constant rather than an obsolete hardcoded version. The suite measures full capture, cached open, reassessment, message-pump gaps and peak process working set on recorded hardware. Measurements require owner-agreed budgets before release acceptance.</w:t>
-      </w:r>
-    </w:p>
-    <w:p>
-      <w:r>
-        <w:t>The independent first-time programmer and source-review worksheet is docs\WP7_Maintenance_Exercise.txt. Preserve actual participant answers, source citations, uncertainty judgments, assistance, timings and defects. Do not substitute automated tests or prepared instructions for AC-25 or independent explanation review.</w:t>
-      </w:r>
-    </w:p>
-    <w:p>
-      <w:pPr>
-        <w:pStyle w:val="Heading1"/>
-      </w:pPr>
-      <w:r>
-        <w:t>Structured project profile contract</w:t>
-      </w:r>
-    </w:p>
-    <w:p>
-      <w:r>
-        <w:t>TDPHWorkspaceView.ProjectMembers projects captured syntax files into a selected-scope catalog without filesystem discovery. DPH.UI.Main.fmx defines separate Known databases and Selected project subpages, with a native list and evidence memo. Program, library and package declarations retain source references; project properties and references retain captured values and child conditions. Parent conditions may apply even when a child has none recorded. tests\DPH.Tests.ProjectCatalog.dpr checks a selected group, missing referenced project, output kinds, settings, native selection and input immutability.</w:t>
-      </w:r>
-    </w:p>
-    <w:p>
-      <w:r>
-        <w:t>Migration 009 adds an object-valued structured_json field to append-only knowledge revisions. TDPHProjectProfile validates 15 known text fields, required purpose and attribution, per-field bounds and a 64 KiB record bound. SaveKnowledge enforces stable project scope, title, kind and generated body, prevents ordinary-record conversion, duplicate profiles and loss of typed data, and preserves structured fields during named review and continuity revisions. Publication decodes typed metadata before recursive redaction, including revision history.</w:t>
-      </w:r>
-    </w:p>
-    <w:p>
-      <w:r>
-        <w:t>DPH.UI.ProjectProfile.fmx defines every editor control at design time. Apply returns an attributed draft to the existing Knowledge save pipeline. It does not bypass unsaved-edit guards or automatically approve information. tests\DPH.Tests.Phase1.dpr verifies persistence, review, stale editors, history, field bounds and native form behavior; publishing regressions check canonical, HTML and DOCX inclusion.</w:t>
-      </w:r>
-    </w:p>
-    <w:p>
-      <w:pPr>
-        <w:pStyle w:val="Heading1"/>
-      </w:pPr>
-      <w:r>
-        <w:t>Quality analysis and revision comparison</w:t>
-      </w:r>
-    </w:p>
-    <w:p>
-      <w:r>
-        <w:t>DPH.Analysis.Quality emits DPH-QUALITY-1 evidence during workspace capture. Routine metrics, eligible token-body equality, conservative missing-inbound and disconnected-CFG findings, and iterative call-graph strongly connected components use captured inputs only. The worker invalidates an older connected cache without this analyzer version. All findings remain qualified candidates.</w:t>
-      </w:r>
-    </w:p>
-    <w:p>
-      <w:r>
-        <w:t>DPH.Workspace.Comparison compares two hash-verified retained captures from the same project database. It rejects differing selection and syntax or semantic analyzer contracts. Deterministic identity indexes distinguish file changes, symbol additions or removals, captured structure changes and file-only changes. Routine-local flow numbering avoids global node-number shifts. Results use filtered 200-row pages; individual structure displays are limited to 4000 characters with full-content structure hashes and explicit truncation.</w:t>
-      </w:r>
-    </w:p>
-    <w:p>
-      <w:r>
-        <w:t>Comparison runs on the existing background worker. It reads retained database artifacts rather than current selected source files. Native comparison controls and evidence panes are declared in DPH.UI.Main.fmx. tests\DPH.Tests.Comparison.dpr checks literal-expression changes, unchanged neighboring routines, flow-edge rewiring, identity changes, contract rejection, pages, native panes, worker loading and missing caches.</w:t>
-      </w:r>
-    </w:p>
-    <w:p>
-      <w:r>
-        <w:t>The Phase 1 traceability ledger preserves the supplied requirements and limitations. Source comparison remains partial until optional historical source retention supports actual source-text differences; captured structural comparison must never be described as reconstructing those bytes. Human business answers and independent first-time-user acceptance remain separate evidence.</w:t>
-      </w:r>
-    </w:p>
-    <w:p>
-      <w:pPr>
-        <w:pStyle w:val="Heading1"/>
-      </w:pPr>
-      <w:r>
-        <w:t>Keyboard inspector implementation and validation</w:t>
-      </w:r>
-    </w:p>
-    <w:p>
-      <w:r>
-        <w:t>DPH.Workspace.Keyboard projects captured text and binary form IR into source-backed component records. A parent-property index avoids rescanning every node for every component. Rows retain generation, source SHA256, line and byte extents, original property values and explicit unknowns. Numeric shortcut conflicts normalize decimal and hexadecimal codes within each serialized form; sibling TabOrder conflicts stay parent-local. Unique local action declarations carry separate shortcut and source evidence; uncaptured custom, external or inherited actions remain unresolved.</w:t>
-      </w:r>
-    </w:p>
-    <w:p>
-      <w:r>
-        <w:t>DPH.UI.Main.fmx serializes every inspector control for the IDE and Object Inspector. The Keyboard and focus page filters readable evidence, sorts sibling TabOrder and uses 250-row pages. TDPHKeyboardInspector.ReadSource enforces matching generation, source identity, project containment, text availability and source hash before navigation. Binary forms expose byte evidence without applying it as text lines. No database migration or target execution is required.</w:t>
-      </w:r>
-    </w:p>
-    <w:p>
-      <w:r>
-        <w:t>Run tools\build-keyboard.cmd elevated for 55 checks covering actual DFM, FMX and binary parsing, action references, conflicts, unknown states, readable key names, source safeguards, pagination and instantiated FMX controls. The fixed bin/keyboard-validation fixture avoids new disposable test folders. Native PaintTo images in docs/phase1-keyboard-workspace.png and phase1-keyboard-compact.png are renders of running DPH controls, not target application screenshots. The suite checks the user catalog and selected fixture bytes remain unchanged. Runtime traversal and accessibility conformance require separate observed tests.</w:t>
-      </w:r>
-    </w:p>
-    <w:p>
-      <w:pPr>
-        <w:pStyle w:val="Heading1"/>
-      </w:pPr>
-      <w:r>
-        <w:t>Command inventory implementation and validation</w:t>
-      </w:r>
-    </w:p>
-    <w:p>
-      <w:r>
-        <w:t>DPH.Workspace.Commands builds command records from captured component properties in DPH.Workspace.Keyboard. It indexes parent paths and form-local names, distinguishes duplicate or incompatible references, and joins event properties by exact source and byte location to confirmed static semantic binds relationships. Every handler retains its own identity, relation, target symbol, range and source fingerprint. Action handlers and shortcuts remain separate from component declarations. Uncaptured inheritance, custom classes, external names and runtime dispatch remain qualified.</w:t>
-      </w:r>
-    </w:p>
-    <w:p>
-      <w:r>
-        <w:t>DPH.UI.Main.fmx serializes the Menus and commands controls for IDE editing. The page provides kind and text filters, 250-row pagination, independent handler selection and Explain navigation. Command and action source commands reuse the keyboard inspector generation, hash and containment checks. Loading a replacement capture clears stale command rows. No database migration or target execution is required.</w:t>
-      </w:r>
-    </w:p>
-    <w:p>
-      <w:r>
-        <w:t>Run tools\build-commands.cmd elevated for 62 focused checks using actual text DFM, binary DFM, FMX and semantic fixtures, including action execute/update, own click and popup handlers, unresolved references, pagination and native control bindings. Fixtures reuse bin/commands-validation. Source bytes and the user catalog are checked unchanged. PaintTo renders in docs/phase1-commands-workspace.png and phase1-commands-compact.png show running DPH controls, not screenshots of the target app. The keyboard suite remains a required regression because both inspectors share captured properties.</w:t>
-      </w:r>
-    </w:p>
-    <w:p>
-      <w:pPr>
-        <w:pStyle w:val="Heading1"/>
-      </w:pPr>
-      <w:r>
-        <w:t>Dynamic control relationships and validation</w:t>
-      </w:r>
-    </w:p>
-    <w:p>
-      <w:r>
-        <w:t>DPH.Analysis.Symbols captures constructor owner expressions and visual property assignments in reusable routine facts. VisualSites joins them to creation-site identities after cache reuse. Unique same-routine result handles support parent and event declaration references. Multiple constructors, intervening variable writes and assignments before construction prevent attribution and retain ambiguous evidence. Target declarations are inferred lexical references; no runtime binding or reaching-definition proof is claimed. DPHSemanticVersion is DPH-WP3-15 so older semantic captures are reassessed.</w:t>
-      </w:r>
-    </w:p>
-    <w:p>
-      <w:r>
-        <w:t>DPH.Workspace.DynamicControls indexes the new relationships and retains target symbols, source hashes, ranges, conditions and generation evidence. DPH.UI.Main.fmx serializes the filter, 250-row list, details, relationship selector and Explain controls for the IDE. Changing capture clears stale rows. Missing references disable Explain reference. Creation sites remain distinct from serialized form geometry and observed screenshot evidence. No database migration or runtime UI construction was introduced.</w:t>
-      </w:r>
-    </w:p>
-    <w:p>
-      <w:r>
-        <w:t>Run tools\build-dynamic-controls.cmd elevated for 51 focused checks, including owner/parent/event references, nil, reused and overwritten variables, pre-creation assignments, unresolved expressions, loop counts, exact fresh/cache equivalence, pagination and native form controls. Fixtures reuse bin/dynamic-validation. The 134-check semantic regression and 62-check command inventory regression pass, as does the actual app and FMX resource baseline. Historical phase evidence is preserved; current semantic evidence is docs/phase1-dynamic-semantics-regression.json. Native normal/compact PaintTo renders show running DPH controls, not target screenshots.</w:t>
-      </w:r>
-    </w:p>
-    <w:p>
-      <w:pPr>
-        <w:pStyle w:val="Heading1"/>
-      </w:pPr>
-      <w:r>
-        <w:t>Layout rule explanations and validation</w:t>
-      </w:r>
-    </w:p>
-    <w:p>
-      <w:r>
-        <w:t>DPH.Workspace.Keyboard retains captured layout properties from reusable form IR. DPH.Workspace.LayoutRules indexes serialized parents and their properties, preserving source ranges and fingerprints. Describe explains VCL and FMX alignment modes, exact anchor tokens, geometry, spacing, constraints, autosizing, wrapping, DPI and resize handlers. Missing values and inheritance are qualified rather than filled with assumed defaults. Contradictory captured minimum and maximum constraints produce a review candidate.</w:t>
-      </w:r>
-    </w:p>
-    <w:p>
-      <w:r>
-        <w:t>Educational numeric examples require explicit recognized anchors and Align=None on an ordinary child with a captured parent. Opposing edges change size by the parent delta; trailing edges change position; leading edges preserve position. Unanchored axes, active or unknown alignment, inherited and root objects suppress unsupported calculations. These are basic rule examples and never an evaluation of the VCL or FMX layout engine or final runtime geometry.</w:t>
-      </w:r>
-    </w:p>
-    <w:p>
-      <w:r>
-        <w:t>DPH.UI.Main.fmx serializes every new page control for IDE editing. The page provides full-text filtering, 250-row pagination, validated positive or negative deltas, source verification, a horizontal command bar and a resizable scrollable detail area. Replacing a capture clears stale rows. No target classes are instantiated and no database migration or analyzer-version change is needed.</w:t>
-      </w:r>
-    </w:p>
-    <w:p>
-      <w:r>
-        <w:t>Run tools\build-layout-rules.cmd elevated for 56 focused checks using real text DFM, binary DFM and FMX parsing and native form controls. Tests cover growth and shrinking, active alignment, inherited and missing rules, unknown anchors, constraints, parent properties, navigation guards, pagination, invalid and overflowing input and normal and compact layouts. Fixtures reuse bin/layout-validation. The shared keyboard suite passes 55 checks and dynamic controls passes 51. The actual application and FMX baseline pass. Native PaintTo renders show DPH controls rather than target screenshots.</w:t>
-      </w:r>
-    </w:p>
-    <w:p>
-      <w:pPr>
-        <w:pStyle w:val="Heading1"/>
-      </w:pPr>
-      <w:r>
-        <w:t>Component dependencies and attributed metadata</w:t>
-      </w:r>
-    </w:p>
-    <w:p>
-      <w:r>
-        <w:t>DPH.Workspace.ComponentDependencies indexes captured semantic class declarations by qualified and simple name, joins them to serialized component classes, and preserves declaration ranges, source hashes, conditions and generation context. Unique matches are inferred candidates rather than compiler binding proof. Ambiguous or absent matches remain explicit. Captured package declarations and unavailable inputs are context only; membership, installed versions and vendor origin are not inferred.</w:t>
-      </w:r>
-    </w:p>
-    <w:p>
-      <w:r>
-        <w:t>DPH.Knowledge.ComponentDependency validates bounded text fields for class identity, declaring unit, package/product, vendor, version/configuration, support and evidence. DPH.UI.ComponentDependency.fmx serializes the scrollable editor. The main page controls are serialized in DPH.UI.Main.fmx. Apply prepares a structured Knowledge draft; the existing worker saves it with attributed revision history. Storage enforces identity, canonical readable body, case-insensitive uniqueness, stale-edit protection and retention of structured fields. No schema migration or target component loading was added.</w:t>
-      </w:r>
-    </w:p>
-    <w:p>
-      <w:r>
-        <w:t>Saved dependency records participate in Knowledge search, engineering publication, evidence links and named review. Editing reopens review; retired class identities stay reserved. The native inspector refreshes saved metadata without changing source resolution, protects unsaved drafts, provides 250-row pagination, filtering, source guards and unique-candidate Explain navigation.</w:t>
-      </w:r>
-    </w:p>
-    <w:p>
-      <w:r>
-        <w:t>Run tools\build-component-dependencies.cmd elevated for the focused acceptance suite. It exercises real text/binary DFM and FMX parsing, unique/ambiguous/unresolved class candidates, captured packages and missing dependencies, SQLite reopen/history/review/search/publication, duplicate and stale edits, native editor round trips, navigation, pagination and compact layout. Fixtures reuse bin/component-dependencies-validation. Native PaintTo images show DPH controls rather than target screenshots. Shared Knowledge, glossary and layout regressions and the actual app/FMX baseline are also checked. See the current completion record for measured counts.</w:t>
-      </w:r>
-    </w:p>
-    <w:p>
-      <w:pPr>
-        <w:pStyle w:val="Heading1"/>
-      </w:pPr>
-      <w:r>
-        <w:t>Resolve form inheritance and frame overlays</w:t>
-      </w:r>
-    </w:p>
-    <w:p>
-      <w:r>
-        <w:t>DPH.Workspace.FormInheritance resolves an inherited root through its matching Pascal class and captured ancestor relationship to one captured base form. Class-to-form lookup uses the matching Pascal file stem and serialized root class. Qualified frame names disambiguate duplicate simple names. Custom resource mappings and aliases may remain unresolved. Conditional ancestry is not silently selected.</w:t>
-      </w:r>
-    </w:p>
-    <w:p>
-      <w:r>
-        <w:t>The resolver copies base trees, matches inherited children by parent-local name and class, appends local property histories and expands inline frames independently. Root renaming preserves base children. Properties and events retain exact source/hash/range, condition and generation origins. Collection bodies retain serialized history but collection-item merging is explicitly unresolved. Missing bases, duplicate matches, partial forms, incompatible/orphan overlays and cycles are diagnosed.</w:t>
-      </w:r>
-    </w:p>
-    <w:p>
-      <w:r>
-        <w:t>The IDE-editable main FMX page provides filter, 250-row pagination, an origin selector, source navigation and a scrollable explanation. Origin source uses the existing generation/fingerprint/root/text checks. Capture replacement clears borrowed rows and origin pointers. No storage schema changes, target instantiation or runtime UI construction were introduced. Existing form-design and other inspector qualifications remain in effect.</w:t>
-      </w:r>
-    </w:p>
-    <w:p>
-      <w:r>
-        <w:t>Run tools\build-form-inheritance.cmd elevated. Controlled fixtures reuse bin/form-inheritance-validation and exercise actual text/binary DFM and FMX parsing, three-level form inheritance, inherited and separately overridden frames, qualified ambiguity, event nil, conditional/missing ancestry, cycles, provenance, cache equivalence, source safeguards and native compact layout. Work is bounded to 64 levels, 200000 component visits and 100000 output rows; gaps are capped at 10000 per selected form. Exceeded work/output bounds reject the overlay operation explicitly. Native PaintTo renders show DPH controls, not target screenshots.</w:t>
-      </w:r>
-    </w:p>
-    <w:p>
-      <w:pPr>
-        <w:pStyle w:val="Heading1"/>
-      </w:pPr>
-      <w:r>
-        <w:t>Store attributed action purpose mappings</w:t>
-      </w:r>
-    </w:p>
-    <w:p>
-      <w:r>
-        <w:t>DPH.Workspace.ActionPurposes derives candidate targets from the captured source path and parent-local component path. A case-insensitive SHA256 identity is stable across parser node-number changes. Duplicate paths remain ambiguous and disable Edit and Explain. A unique captured component range supplies its semantic object key; no runtime action or business intent is inferred. Project tasks use a GUID identity and no object link. Unmatched saved UI targets remain historical or unresolved.</w:t>
-      </w:r>
-    </w:p>
-    <w:p>
-      <w:r>
-        <w:t>DPH.Knowledge.ActionPurpose validates twelve bounded string fields, requires the name, purpose, steps, outcome and evidence, and derives the readable Knowledge body. DPH.Storage.Database preserves the record type, stable target identity, object scope, user_help kind, user document and user audience. Duplicate target records are refused, including retired identities. Ordinary Knowledge editing cannot discard structured fields; stale saves and reviews retain the existing concurrency protections.</w:t>
-      </w:r>
-    </w:p>
-    <w:p>
-      <w:r>
-        <w:t>DPH.UI.ActionPurpose.fmx and the Action purposes tab in DPH.UI.Main.fmx serialize every native control for IDE editing. Apply prepares the existing Knowledge draft and preserves its exact evidence links; Save persists it. Named review appends a revision; subsequent edits reopen review. Search and publication use the same attributed Knowledge record. Existing storage migrations suffice; no new schema or runtime UI construction is required.</w:t>
-      </w:r>
-    </w:p>
-    <w:p>
-      <w:r>
-        <w:t>Run tools/build-action-purposes.cmd elevated for parser, binary DFM, FMX, identity and ambiguity checks, database persistence, duplicate and stale protection, named review, history, search, exported bundle validation, HTML and user DOCX text, native editor Apply/Cancel, task drafts, filtering, pagination and compact layout. Fixtures reuse bin/action-purposes-validation. Native PaintTo images show real DPH controls; they are not screenshots of the analyzed application.</w:t>
-      </w:r>
-    </w:p>
-    <w:p>
-      <w:pPr>
-        <w:pStyle w:val="Heading1"/>
-      </w:pPr>
-      <w:r>
-        <w:t>Compare attributed screen evidence and captured layouts</w:t>
-      </w:r>
-    </w:p>
-    <w:p>
-      <w:r>
-        <w:t>DPH.Workspace.ScreenHistory verifies managed PNG bytes against their saved image hashes, bounds each image and the union canvas to 16 million pixels with dimensions no greater than 8192 and encoded size no greater than 20 MiB, then decodes with the VCL PNG library on the worker. CPU bitmaps composite transparency on white and compare exact eight-bit RGB. No target form, class or executable is loaded. The report preserves image and metadata hashes, contributors, generation IDs, dimensions, counts and inclusive bounds; private managed paths are omitted.</w:t>
-      </w:r>
-    </w:p>
-    <w:p>
-      <w:r>
-        <w:t>The screen_history worker command resolves screenshot IDs through the existing checksum-validated store. Optional layout comparison loads each image generation from its retained workspace cache. Missing or incompatible layout evidence yields layout_gap without discarding verified images. Parent-local component paths match captured classes and sorted inspector properties; duplicate identities are refused. Source offsets alone do not count as a change. Comparison supports 5000 components per form; all changes remain in the paged list, while previews draw at most 300 rectangles per side.</w:t>
-      </w:r>
-    </w:p>
-    <w:p>
-      <w:r>
-        <w:t>DPH.UI.Main.fmx serializes the Screen history page, grid, image and paint controls, selectors, toolbar and details. Panels use client alignment in their grid cells. Source geometry is fitted on a common canvas in blue and orange. Request tokens plus the database identity prevent a late response from restoring evidence after a pair or path change. Processing and PNG comparison run in the existing worker; presentation uses FMX. No storage migration, runtime control construction or source mutation is required.</w:t>
-      </w:r>
-    </w:p>
-    <w:p>
-      <w:r>
-        <w:t>Run tools/build-screen-history.cmd elevated for 73 checks covering exact pixels/bounds, transparency, size changes, altered bytes, union limits, text and binary DFM, FMX, parser/selection incompatibility, persisted image attribution, missing retained captures, native Compare, late-response rejection, pagination/filtering, swap, visible geometry and compact layout. Fixtures reuse bin/screen-history-validation. The owner catalog is restored after exercising cached open. Native PaintTo renders show actual DPH controls; controlled synthetic images do not establish target-runtime observations.</w:t>
-      </w:r>
-    </w:p>
-    <w:p>
-      <w:pPr>
-        <w:pStyle w:val="Heading1"/>
-      </w:pPr>
-      <w:r>
-        <w:t>Build a safe captured database connection inventory</w:t>
-      </w:r>
-    </w:p>
-    <w:p>
-      <w:r>
-        <w:t>DPH.Workspace.DatabaseConnections projects captured text/binary DFM and FMX IR directly. A parent-property index joins database configuration and references to each candidate. An explicit class list covers common connection, dataset, data-source, transaction and session declarations; recognized property signals retain custom-class candidates without claiming vendor or runtime behavior. Existing component_field semantic relationships prevent duplicate Pascal field rows. Unmatched supported Pascal fields, variables and locals retain declaration evidence and unknown construction/configuration.</w:t>
-      </w:r>
-    </w:p>
-    <w:p>
-      <w:r>
-        <w:t>Resolution uses source-local root and parent paths, explicitly qualified cross-form paths, expected target roles and captured logical aliases. There is no global short-name guess. Duplicate targets remain ambiguous. Named ConnectionDefName references share a definition row with explicit unavailable contents. Each row retains generation, source hash and range; exact outgoing and reverse IDs drive native Follow reference navigation. Missing inherited values, runtime assignments, factories and external definitions remain unknown. A 10000-row bound prevents an unbounded inventory.</w:t>
-      </w:r>
-    </w:p>
-    <w:p>
-      <w:r>
-        <w:t>The projection never copies raw properties or source text into its configuration. Known parameter keys are retained with masked values; unknown keys use a generic label. Endpoints, credentials and entire connection strings remain masked. Only bounded identifiers for driver/protocol/dialect/charset/SSL, valid ports and explicit booleans are visible. Unsupported reference expressions are masked. Original captured source and caches are unchanged and may contain secrets; this feature is not a comprehensive secret-removal claim for the rest of DPH. No target driver, component class or database connection is created.</w:t>
-      </w:r>
-    </w:p>
-    <w:p>
-      <w:r>
-        <w:t>DPH.UI.Main.fmx serializes every page control for the IDE and Object Inspector: purpose, horizontally scrolling toolbar, kind/text filters, paging, link selector, Follow reference, resizable list, labeled memo and status. LoadView rebuilds the projection for the accepted generation; ClearWorkspace discards borrowed rows before releasing their owner. Follow selects the exact target page after clearing filters. Compact validation requires a visible evidence area. Existing storage schema and analyzer contracts suffice.</w:t>
-      </w:r>
-    </w:p>
-    <w:p>
-      <w:r>
-        <w:t>Run tools/build-database-connections.cmd elevated for 66 checks using real text/binary DFM, FMX and Pascal declarations, persisted/reopened captures, local/nested/cross-module links, aliases, duplicate and missing targets, sensitive canaries, validated settings, native paging/filtering/follow/empty states, capture replacement, compact layout and unchanged source/owner catalog. Fixtures reuse bin/database-connections-validation. Native PaintTo renders show DPH controls, not screenshots of an analyzed application. Regression evidence also covers 134 semantic/SQL and pinned-reference checks and 73 screen-history checks.</w:t>
-      </w:r>
-    </w:p>
-    <w:p>
-      <w:pPr>
-        <w:pStyle w:val="Heading1"/>
-      </w:pPr>
-      <w:r>
-        <w:t>Derive captured database engine and version evidence</w:t>
-      </w:r>
-    </w:p>
-    <w:p>
-      <w:r>
-        <w:t>TDPHDatabaseConnections.EvaluateEngines extends the existing bounded inventory. It maps recognized captured DriverID values only for TFDConnection declarations using the FireDAC driver contract; it does not infer engines from class families, SQL tokens, DLL names, ports or DPH internal SQLite. The mapping basis is Embarcadero Databases FireDAC documentation at https://docwiki.embarcadero.com/RADStudio/Sydney/en/Databases_(FireDAC). Supported IDs identify families, without deriving server release or compatibility. MySQL-compatible retains compatible-server uncertainty; unknown virtual drivers are not silently mapped.</w:t>
-      </w:r>
-    </w:p>
-    <w:p>
-      <w:r>
-        <w:t>Configuration permits bounded numeric ServerVersion, DatabaseVersion, ClientVersion and DriverVersion fields only. Server version aggregation preserves matching declarations, reports disagreement, and never promotes client or driver version evidence. Invalid values remain masked. Each engine fact carries its original source, line/range, source hash and captured generation. External definition contents, runtime overrides and live version measurements remain explicit unknowns. No driver or target database is opened.</w:t>
-      </w:r>
-    </w:p>
-    <w:p>
-      <w:r>
-        <w:t>A dictionary indexes existing row IDs. Three bounded passes propagate evidence through unique captured connection and dataset targets to datasets, transactions and data sources. Multiple target identities become conflicting; unresolved candidate paths suppress propagation. Original fact ownership remains on the connection even when a dependent row displays it. The existing storage and analyzer contracts suffice; persisted capture reopening deterministically rebuilds the same projection.</w:t>
-      </w:r>
-    </w:p>
-    <w:p>
-      <w:r>
-        <w:t>DPH.UI.Main.fmx retains IDE-editable controls and adds engine instructions and a concise evidence label. List rows summarize family and declared version. Details show engine results before qualifications, improving compact-window usability. The text filter searches evidence fields and safe configuration, excluding general boilerplate; navigation, pagination, capture replacement and credential masking continue to use the existing inventory.</w:t>
-      </w:r>
-    </w:p>
-    <w:p>
-      <w:r>
-        <w:t>Run tools/build-database-engines.cmd elevated for 66 focused checks covering all fourteen driver IDs, unknown and virtual drivers, conflicting engine/version declarations, client/server separation, unresolved and conflicting paths, text/binary DFM and FMX, persisted reopening, source hashes, sensitive canaries, native filtering/details and compact renders. Existing database inventory and screen-history suites add 139 regression checks. Actual app and FMX baseline build pass. Fixtures reuse bin/database-engines-validation; native PaintTo renders show DPH controls and controlled declarations, not observed target-runtime connections.</w:t>
-      </w:r>
-    </w:p>
-    <w:p>
-      <w:pPr>
-        <w:pStyle w:val="Heading1"/>
-      </w:pPr>
-      <w:r>
-        <w:t>Inspect captured database schema evidence</w:t>
-      </w:r>
-    </w:p>
-    <w:p>
-      <w:r>
-        <w:t>DPH.Workspace.DatabaseSchema projects captured SQL resource IR and existing semantic SQL-table references without storage migrations or target execution. A bounded lexer separates comments, quoted identifiers and string literals, preserves statement-start lines, and recognizes supported CREATE TABLE, VIEW and SCHEMA headers. Qualified names retain quoted spelling; two- and three-part names yield qualifier-reference rows. PostgreSQL CREATE TABLE, CREATE VIEW and CREATE SCHEMA documentation provides header references, not a cross-dialect grammar guarantee. Unsupported headers, ALTER and other statements remain explicit gaps.</w:t>
-      </w:r>
-    </w:p>
-    <w:p>
-      <w:r>
-        <w:t>The lexer limits each resource to 2 MiB characters and 100000 tokens, nested comments to 16 levels and the inventory to 10000 rows. Malformed lexical resources yield a gap instead of partially promoted declarations. Definitions omit comment and string contents and bound display length. Parenthesis balance and recognized headers do not validate body grammar, type or constraint semantics. Whole-resource byte extents and precise statement-start lines are labeled separately. Existing inferred references retain captured semantic ranges and use original relationship labels for object names.</w:t>
-      </w:r>
-    </w:p>
-    <w:p>
-      <w:r>
-        <w:t>Exact kind and spelling index duplicate declarations projectwide; every captured definition remains visible and migration order remains unresolved. The inspector neither normalizes dialect-dependent identifiers nor selects an effective production definition. References stay distinct from declarations; schema qualifiers stay distinct from explicit schema declarations. Missing resources and unsupported constructs cannot establish an empty live schema.</w:t>
-      </w:r>
-    </w:p>
-    <w:p>
-      <w:r>
-        <w:t>DPH.UI.Main.fmx serializes the Database schema page, toolbar, filters, list, divider, labeled memo and source command for the IDE. Main owns the projection and borrows only visible rows, clearing them before capture replacement or destruction. Filtering and paging show 250 rows. Open source reuses TDPHKeyboardInspector.ReadSource for generation, containment, identity, decoding and SHA256 guards. No runtime controls or additional navigation helper are introduced.</w:t>
-      </w:r>
-    </w:p>
-    <w:p>
-      <w:r>
-        <w:t>Run tools/build-database-schema.cmd elevated. Focused checks cover declarations, qualified and quoted names, comments/literals, duplicate definitions, unsupported and malformed resources, bounds, inferred references, SQLite persistence, source guards, unchanged workspace/catalog/source, native filters, pagination, capture replacement and normal/compact PaintTo renders. Run existing engine regression and tools/build-wp0.cmd for app and serialized FMX binding. Fixed ignored bin/database-schema-validation holds controlled practice data. No target SQL, database driver or application is executed.</w:t>
-      </w:r>
-    </w:p>
-    <w:p>
-      <w:pPr>
-        <w:pStyle w:val="Heading1"/>
-      </w:pPr>
-      <w:r>
-        <w:t>Extract captured column declarations and constraint text</w:t>
-      </w:r>
-    </w:p>
-    <w:p>
-      <w:r>
-        <w:t>TDPHDatabaseSchema.Inspect extends the existing resource-token projection. It splits CREATE TABLE body entries only at outer commas, retaining type precision, CHECK and default-function commas. Supported entries emit column rows with declared_type, nullability, default, constraints, table and declaration_id. Explicit table-level constraint entries emit captured constraint text rows. These facts describe captured syntax, not a validated live schema. PostgreSQL CREATE TABLE documentation supplies the reference structure; this bounded reader is not a full dialect grammar.</w:t>
-      </w:r>
-    </w:p>
-    <w:p>
-      <w:r>
-        <w:t>Type text accepts an identifier or qualified type, supported multiword suffixes, parenthesized parameters, time-zone qualifiers and array or unsigned suffixes. Clause extraction distinguishes DEFAULT NULL from explicit NULL, accepts bounded simple or parenthesized defaults, and captures supported named and inline constraints. String contents remain omitted. Token-aware formatting preserves quoted identifier spelling while presenting readable numeric and type evidence. Unsupported clauses, absent types, incomplete defaults, repeated defaults, conflicting NULL/NOT NULL and trailing empty entries remain gaps. A supported later entry does not inherit the preceding gap.</w:t>
-      </w:r>
-    </w:p>
-    <w:p>
-      <w:r>
-        <w:t>Each column and table-level constraint keeps a unique parent declaration ID plus original file, source SHA256, generation and entry-start line. Duplicate table declarations retain independent column facts instead of selecting an effective migration. Whole-resource byte extents remain explicitly labeled. Key relationships, domain/inheritance rules, expression evaluation, dialect validity and deployed enforcement are unverified. No analyzer schema migration, target driver connection or runtime control construction is introduced.</w:t>
-      </w:r>
-    </w:p>
-    <w:p>
-      <w:r>
-        <w:t>DPH.UI.Main.fmx adds column/constraint kinds and declared column/captured constraint states to existing Object Inspector editable selectors. Existing filter logic also searches declared type, explicit nullability and inline constraint text. Details lead with column type/nullability/default before long provenance explanations, improving compact-window use. Existing 250-row pages, capture replacement, labeled scrolling memo and guarded source navigation remain in use.</w:t>
-      </w:r>
-    </w:p>
-    <w:p>
-      <w:r>
-        <w:t>Run tools/build-database-columns.cmd elevated for 121 checks using actual controlled project/resource analysis, SQLite persisted reopening, native FMX filtering/details/paging and normal/compact PaintTo renders. Checks cover type precision, multiword and qualified/quoted types, defaults, NULL separation, named/inline/table constraint text, nested commas, unsupported entries, duplicate declaration ownership, literal canaries and unchanged source/catalog/workspace. Existing schema and engine suites add 123 regression checks. Actual application build and FMX baseline pass. Fixed ignored bin/database-columns-validation contains controlled practice data. No SQL or target application is executed.</w:t>
-      </w:r>
-    </w:p>
-    <w:p>
-      <w:pPr>
-        <w:pStyle w:val="Heading1"/>
-      </w:pPr>
-      <w:r>
-        <w:t>Resolve captured key membership and references</w:t>
-      </w:r>
-    </w:p>
-    <w:p>
-      <w:r>
-        <w:t>TDPHDatabaseSchema.Inspect emits key rows from supported captured CREATE TABLE entries. Each row preserves key_kind, constraint_name, ordered members, reference_table, ordered reference_columns, referential_actions, table, declaration_id and sanitized definition. Existing file, SHA256, generation and entry-start line provenance remain attached. Inline clauses are collected during column parsing and promoted only after the complete column entry passes its supported grammar, preventing an unsupported later clause from leaking a partial key.</w:t>
-      </w:r>
-    </w:p>
-    <w:p>
-      <w:r>
-        <w:t>Table constraints accept an optional CONSTRAINT name and PRIMARY KEY, UNIQUE or FOREIGN KEY with nonempty identifier lists. Foreign keys accept a qualified referenced table, optional referenced column list and bounded ON DELETE or ON UPDATE actions. Repeated members, expressions, malformed lists, unknown actions and unsupported tails yield key gaps. CHECK remains captured constraint text. Inline reference actions outside the existing column subset remain column gaps. Token and row bounds remain unchanged. PostgreSQL constraint documentation supplies the reference syntax: https://www.postgresql.org/docs/18/ddl-constraints.html. This source reader does not implement that complete dialect.</w:t>
-      </w:r>
-    </w:p>
-    <w:p>
-      <w:r>
-        <w:t>ResolveKeys builds exact table and declaration-owned column indexes with multiplicity counts. Each key receives ordered links containing role, reference, position, state and target_id only for unique captured matches. The owning table link uses the exact parent ID. Referenced columns resolve only after a unique referenced table is found. Missing or ambiguous evidence never chooses a first or last declaration. Omitted referenced columns and arity mismatches receive explicit notes; multiple primary keys and duplicate names receive conflict flags. Relationship status describes evidence completeness only, not semantic validity, target eligibility or enforcement.</w:t>
-      </w:r>
-    </w:p>
-    <w:p>
-      <w:r>
-        <w:t>DPH.UI.Main.fmx serializes the key kind and declared key state plus a relationship selector and Follow relationship button in the horizontally scrolling schema toolbar. Main owns target ID strings separately from borrowed projection rows. Selection and capture replacement clear those strings. Follow resets filters, locates the exact target ID, computes its 250-row page and selects it. Existing source guards handle direct key navigation. No runtime controls, new storage migrations or SQL execution are introduced.</w:t>
-      </w:r>
-    </w:p>
-    <w:p>
-      <w:r>
-        <w:t>Run tools/build-database-keys.cmd elevated for captured resource and SQLite reopening tests, composite order, named and anonymous inline keys, self references, missing or ambiguous members and tables, omitted target columns, arity differences, repeated columns, duplicate primary keys and names, unsupported syntax, literal omission, guarded source reading and native filters and relationship navigation. The suite also retains prior schema and column checks. Run column and schema regressions and tools/build-wp0.cmd for the actual executable and FMX baseline. Practice data stays in fixed ignored bin/database-keys-validation.</w:t>
-      </w:r>
-    </w:p>
-    <w:p>
-      <w:pPr>
-        <w:pStyle w:val="Heading1"/>
-      </w:pPr>
-      <w:r>
-        <w:t>Capture index structures and SQL reference evidence</w:t>
-      </w:r>
-    </w:p>
-    <w:p>
-      <w:r>
-        <w:t>TDPHDatabaseSchema.Inspect recognizes bounded CREATE INDEX declarations from already captured SQL resources. Supported headers retain explicit index names, optional UNIQUE, CLUSTERED or NONCLUSTERED, CONCURRENTLY, IF NOT EXISTS, ON ONLY and a qualified target table. Optional USING retains the declared method. The reference structure is PostgreSQL CREATE INDEX: https://www.postgresql.org/docs/18/sql-createindex.html. Clustering keywords also retain captured structure from the supported cross-dialect subset; DPH does not validate combinations against a selected database dialect.</w:t>
-      </w:r>
-    </w:p>
-    <w:p>
-      <w:r>
-        <w:t>Ordered members retain position, column when it is a plain identifier, sanitized expression text, explicit sort and null order. Parenthesized and simple function expressions remain unresolved dependencies. INCLUDE accepts distinct plain column identifiers. Optional unique null treatment, balanced WITH option text, TABLESPACE and balanced WHERE predicate text are retained without evaluation. Empty lists or expressions, malformed name/list structure, unsupported member options or clause tails, excessive nesting and unsupported predicate subqueries remain gaps. Existing lexical, resource-size, token and row bounds apply; index expression nesting is limited to 128.</w:t>
-      </w:r>
-    </w:p>
-    <w:p>
-      <w:r>
-        <w:t>The existing relationship projection indexes exact table names and declaration-owned columns, using multiplicity counts. Index links target only unique captured table/column evidence. Duplicate table targets, columns and same-table index names remain explicit ambiguities or conflicts. Index records retain source SHA256, generation, statement line, resource byte extent, exact name and table scope. Effective migration order and live schema remain unknown. No schema migration, driver connection, SQL execution or runtime UI construction is introduced.</w:t>
-      </w:r>
-    </w:p>
-    <w:p>
-      <w:r>
-        <w:t>A separate exact-name lookup groups existing supported SQL table-reference rows. Index records show total and displayed reference counts and link to those captured evidence rows, capped at 250 references per index and 10000 across the projection. These links are labeled index use unobserved. They do not imply column coverage, plan selection or measured benefit. Absent supported matches cannot establish an unused index; quoted names and case are not normalized across dialects.</w:t>
-      </w:r>
-    </w:p>
-    <w:p>
-      <w:r>
-        <w:t>DPH.UI.Main.fmx adds index and declared index to the existing Object Inspector editable selectors. Main reuses the relationship selector, exact-ID Follow relationship navigation, 250-row paging, capture lifecycle and source guards. Search includes target table, method, predicate, storage kind and options. Details lead with index facts and explain evidence limitations before an investigation of performance can be justified.</w:t>
-      </w:r>
-    </w:p>
-    <w:p>
-      <w:r>
-        <w:t>Run tools/build-database-indexes.cmd elevated for actual project/resource capture, ordered composite and expression members, uniqueness and optional structure, literal omission, missing or ambiguous target evidence, malformed/unsupported grammar, persisted SQLite reopening, unchanged source/catalog/workspace, guarded source reading and native filtering/follow/replacement/normal/compact renders. The suite retains prior schema, column and key checks. Run key and schema regressions and tools/build-wp0.cmd for the application and serialized FMX bindings. Controlled practice stays in fixed ignored bin/database-indexes-validation.</w:t>
-      </w:r>
-    </w:p>
-    <w:p>
-      <w:pPr>
-        <w:pStyle w:val="Heading1"/>
-      </w:pPr>
-      <w:r>
-        <w:t>Capture stored-object definitions and dependencies</w:t>
-      </w:r>
-    </w:p>
-    <w:p>
-      <w:r>
-        <w:t>TDPHDatabaseSchema.Inspect projects supported stored-object declarations from existing captured SQL IR into procedure, function and trigger rows. CREATE, CREATE OR REPLACE and CREATE OR ALTER retain their header operation; PROC normalizes to procedure. Explicit qualified and quoted names are retained without dialect case folding. Named parenthesized parameters and supported TSQL @parameter lists retain order, modes, declared type, sanitized defaults and source lines. Scalar/qualified type structure, numeric precision, supported multiword types and array suffixes are captured; unsupported structures remain extraction gaps.</w:t>
-      </w:r>
-    </w:p>
-    <w:p>
-      <w:r>
-        <w:t>Inline BEGIN/END blocks retain internal semicolons and nested BEGIN/CASE structure, with a 128 nesting limit. Their internal DDL is never promoted to a top-level table declaration. An unterminated block holds the remaining resource as a gap. Standalone GO client batch separators preserve following declarations. Single-quoted and dollar-quoted SQL or PLPGSQL bodies are lexed again for sanitized display and supported dependency evidence; comments and literal values remain omitted. Other quoted-body languages, unsupported tails, unnamed parameters, table-valued return structure and custom terminator directives remain gaps. Capturing a supported header/body extent does not validate body grammar.</w:t>
-      </w:r>
-    </w:p>
-    <w:p>
-      <w:r>
-        <w:t>Trigger structure retains supported BEFORE/AFTER/INSTEAD OF timing, INSERT/UPDATE/DELETE/TRUNCATE event lists, ON table, optional FOR EACH ROW/STATEMENT and parenthesized WHEN text. Supported bodies are inline blocks or explicit zero-argument EXECUTE FUNCTION/PROCEDURE calls; the latter names a trigger function. Other trigger dialect arrangements or call arguments remain explicit extraction gaps. Body text and WHEN are unevaluated.</w:t>
-      </w:r>
-    </w:p>
-    <w:p>
-      <w:r>
-        <w:t>Dependency extraction records supported FROM/JOIN/UPDATE and INSERT INTO literal table names, CALL/EXEC and EXECUTE PROCEDURE targets, plus event tables and explicit trigger functions. It is textual evidence with exact source lines, not a complete semantic SQL dependency graph. CTE/WITH scope, dynamic execution and complex table expressions retain unresolved evidence. No alias, expression-function call or column binding is invented. Projection-wide limits are 1000 dependency entries per stored object and 10000 total, alongside existing 2 MiB resource, 100000-token and 10000-row limits. Body display is limited to approximately 16000 characters and definition display to approximately 8000.</w:t>
-      </w:r>
-    </w:p>
-    <w:p>
-      <w:r>
-        <w:t>ResolveStored builds multiplicity indexes for captured table/view names and kind-specific routine names. Unique exact name matches receive target IDs with binding explicitly unverified. Missing or ambiguous declarations and overloads receive states without targets. Duplicate definitions remain separate and effective migration order remains unknown. Stored rows carry resource SHA256, generation, statement line and resource byte extent; parameter/dependency lines refer to that same captured resource. The captured workspace, source files and owner catalog remain unchanged.</w:t>
-      </w:r>
-    </w:p>
-    <w:p>
-      <w:r>
-        <w:t>The IDE-editable Database schema selectors add procedure/function/trigger and declared stored object. Existing exact-ID Follow relationship, paging, labeled scrolling details and source hash/generation guards are reused. Search includes parameter JSON text, language, returns, trigger facts and sanitized body. No runtime controls, driver connections, server SQL execution or new helper unit are introduced.</w:t>
-      </w:r>
-    </w:p>
-    <w:p>
-      <w:r>
-        <w:t>Run tools/build-database-stored-objects.cmd elevated for actual project/resource capture, parameters/defaults/types, quoted bodies, triggers, nested blocks, explicit calls, missing/ambiguous targets, overloads, literal omission, limits, batch boundaries, persistence, unchanged source/catalog/workspace, source guards and native navigation/filter/replacement/normal/compact renders. Run index and schema regressions and tools/build-wp0.cmd for the actual application and FMX resource bindings. Controlled fixtures stay in fixed ignored bin/database-stored-objects-validation.</w:t>
-      </w:r>
-    </w:p>
-    <w:p>
-      <w:r>
-        <w:t>Primary syntax references: PostgreSQL CREATE FUNCTION https://www.postgresql.org/docs/18/sql-createfunction.html, CREATE TRIGGER https://www.postgresql.org/docs/18/sql-createtrigger.html and Microsoft CREATE PROCEDURE https://learn.microsoft.com/en-us/sql/t-sql/statements/create-procedure-transact-sql. The parser implements a bounded captured-evidence subset; these references do not imply full dialect validation or deployed behavior.</w:t>
-      </w:r>
-    </w:p>
-    <w:p>
-      <w:pPr>
-        <w:pStyle w:val="Heading1"/>
-      </w:pPr>
-      <w:r>
-        <w:t>Project captured entity relationship metadata</w:t>
-      </w:r>
-    </w:p>
-    <w:p>
-      <w:r>
-        <w:t>TDPHDatabaseSchema.Diagram projects independent JSON from the existing captured schema inventory. Only declared table headers become nodes. IDs, exact ownership, source SHA256, generation and source ranges survive projection. Owned columns retain order, declared types, nullability and resolved local key membership badges. Duplicate badge kinds are condensed. No source, owner catalog or persisted workspace is changed.</w:t>
-      </w:r>
-    </w:p>
-    <w:p>
-      <w:r>
-        <w:t>Captured foreign keys become numbered edges with exact key, owner and referenced table IDs, ordered members and referenced columns, source provenance and relationship state. A solid blue line requires complete captured key links and both visible table endpoints. Unresolved captured links with available endpoints draw orange dashed lines. Missing targets receive no invented ID or ghost node. Relationships touching either visible endpoint remain in the evidence selector when the other endpoint is filtered or off page. Arrow direction runs from the referencing table to the referenced table; no crow-foot cardinality is inferred.</w:t>
-      </w:r>
-    </w:p>
-    <w:p>
-      <w:r>
-        <w:t>Focus uses the selected declaration ID and a one-hop incoming/outgoing neighbor set. It does not expand transitively. Text filtering applies after focus and stable inventory order is retained across pagination. Bounds require a nonnegative offset, 1 to 60 tables and 1 to 32 summarized columns; native page choices are 15, 30 and 60. The projection retains at most 120 related foreign keys with total and omitted counts. Duplicate names, owned gaps, unresolved keys, absent columns and truncated summaries mark node notes and orange card borders. Global qualification remains PARTIAL CAPTURED SCHEMA even for supported individual declarations.</w:t>
-      </w:r>
-    </w:p>
-    <w:p>
-      <w:r>
-        <w:t>DatabaseERTab and all command, scroll, memo and style controls are serialized in DPH.UI.Main.fmx for the IDE Object Inspector. The existing Main unit paints the data using a native canvas; it does not construct runtime controls or introduce a helper unit. Table size, header height, column row height, gutters, margins, fonts, colors and zoom controls are editable form properties. DatabaseERRect arranges stable table cards in a grid; orthogonal FK routes use outside-card gutters, arrowheads and selector numbers, including self links. The canvas resizes for content and magnification. Defaults summarize seven columns.</w:t>
-      </w:r>
-    </w:p>
-    <w:p>
-      <w:r>
-        <w:t>Table hit testing and FK selection retain exact evidence IDs. Open evidence clears schema filters and navigates to the correct 250-row inventory page. Focus accepts a selected table or the declaration owner of a column/key/gap. Capture loading rebuilds the projection and resets stale focus/evidence IDs; empty results explain recovery. Drawing and details scroll independently, commands scroll horizontally, and a serialized splitter adjusts evidence space. Open source remains subject to the existing generation/hash guards on the schema page.</w:t>
-      </w:r>
-    </w:p>
-    <w:p>
-      <w:r>
-        <w:t>Run tools/build-database-er.cmd elevated. The suite captures real project SQL resources and checks projection ownership, badge membership, provenance, stable order, limits, missing/duplicate/self targets, focus, filtering, paging, immutable source/catalog/workspace and SQLite reopening. Native tests exercise card selection, exact evidence navigation across pages, the serialized page selector, zoom, compact scrolling and capture replacement; screenshots include the full native canvas and actual window. Fixtures use the fixed ignored bin/database-er-validation folder. Run stored-object and key regressions and tools/build-wp0.cmd for the actual application/FMX resource baseline.</w:t>
-      </w:r>
-    </w:p>
-    <w:p>
-      <w:r>
-        <w:t>The visualization proves supported captured structure, not a live schema, SQL semantic validation or business meaning. Dialect validity, effective migration order, referenced uniqueness, type compatibility, cardinality and deployed enforcement remain unverified. Views and inferred usage references remain schema evidence rather than invented entities. Source gaps and display limits stay visible. No target SQL, target application or database server is executed.</w:t>
-      </w:r>
-    </w:p>
-    <w:p>
-      <w:pPr>
-        <w:pStyle w:val="Heading1"/>
-      </w:pPr>
-      <w:r>
-        <w:t>Maintain attributed schema dictionaries</w:t>
-      </w:r>
-    </w:p>
-    <w:p>
-      <w:r>
-        <w:t>TDPHDatabaseSchema provides NewDictionary, ValidateDictionary, DictionaryIdentity, DictionaryTitle, DictionaryBody and FindDictionary in the existing schema unit. A data_dictionary record contains fourteen bounded text fields. Its captured anchor retains the exact schema record ID, source SHA256, original capture generation, kind, name, owning table and statement line. Authored fields hold business definition, owner or steward, sensitivity/handling, evidence/unknowns and optional units/usage. Validation requires explicit content for the first four authored fields; Unknown is a legitimate attributed answer, not an inferred fact.</w:t>
-      </w:r>
-    </w:p>
-    <w:p>
-      <w:r>
-        <w:t>DPH.UI.DatabaseDictionary.pas and its FMX resource define a native structured editor. All labels, memo rows, dimensions, read-only states and Apply/Cancel controls are serialized and editable in the Object Inspector. Business fields appear first, captured identity below. DPH.UI.Main reuses the existing Knowledge draft/save flow, contributor, immutable revision history, optimistic revision checks, pending review and rejection/retirement commands. No new helper unit, runtime controls or database migration is introduced.</w:t>
-      </w:r>
-    </w:p>
-    <w:p>
-      <w:r>
-        <w:t>SaveKnowledge validates new anchors against the selected persisted workspace using the captured schema inventory. Forged object names or source lines are rejected. Scope, title, deterministic rendered body and target identity cannot be altered on an existing record. One dictionary per captured anchor is enforced, including retired records. Changes create a fresh needs_review revision. Contributor, editor and reviewer remain independent. Applying the native editor only prepares a draft and requires an explicit Save.</w:t>
-      </w:r>
-    </w:p>
-    <w:p>
-      <w:r>
-        <w:t>Database schema details show business meaning before captured technical facts. Its filter searches current authored dictionary bodies. Exact captured bytes are required for current lookup; old hash matches are reported as historical rather than moved onto a new source version. Unmatched historical records remain accessible in Knowledge. DPH.Publish.Model filters dictionary sections by included source files and matching SHA256, preserving existing publication redaction and attributed review state. Publisher version DPH-LEARNING-9 invalidates prior publication fingerprints.</w:t>
-      </w:r>
-    </w:p>
-    <w:p>
-      <w:r>
-        <w:t>Run tools/build-database-dictionary.cmd elevated. Its fixed ignored bin/database-dictionary-validation fixture captures real SQL resources, persists the workspace, checks required fields/types/bounds, forged/duplicate anchors, immutable identities, conflicting body rejection, contributor/review/revision history, stale review, table/column separation, historical lookup, export exclusions/hash mismatch, native serialized controls, modal Apply-to-draft flow, search, history navigation, compact renders and SQLite reopening. No selected application or SQL executes. Run ER, publishing and glossary regressions plus tools/build-wp0.cmd for the actual application and FMX baseline.</w:t>
-      </w:r>
-    </w:p>
-    <w:p>
-      <w:r>
-        <w:t>The editor implements an attributed dictionary workflow, not automatic knowledge of business meaning. Sensitivity is descriptive text, not an authorization mechanism. The captured schema remains partial and does not establish live deployment, SQL validity, migration order or business correctness. Human review and the source evidence must qualify every business assertion.</w:t>
-      </w:r>
-    </w:p>
-    <w:p>
-      <w:pPr>
-        <w:pStyle w:val="Heading1"/>
-      </w:pPr>
-      <w:r>
-        <w:t>Resolve captured dataset and field bindings</w:t>
-      </w:r>
-    </w:p>
-    <w:p>
-      <w:r>
-        <w:t>TDPHDatabaseConnections.Inspect extends the existing captured form inventory with known persistent TField classes, data-aware control property signals, TBindSourceDB and visual controls explicitly referenced by serialized binding Control properties. Only required reference/configuration metadata enters the projection; captions, credentials and connection values retain existing redaction. The source and persisted workspace remain unchanged.</w:t>
-      </w:r>
-    </w:p>
-    <w:p>
-      <w:r>
-        <w:t>Persistent field DataSet ownership is derived from its exact serialized parent path and resolved only to a unique dataset. Explicit LookupDataSet references remain distinct from ownership. ResolveFields indexes captured IDs and dataset-scoped case-insensitive FieldName values, then joins resolved control DataSource or BindSource, intermediary DataSet and persistent field identity. Multiple fields, incomplete or competing chains receive no target ID. Fields absent from captured declarations are not invented. Every property link retains its original property line and byte range; binary form evidence has byte positions rather than invented text lines.</w:t>
-      </w:r>
-    </w:p>
-    <w:p>
-      <w:r>
-        <w:t>The existing Follow reference workflow navigates outgoing and reverse references, resets filters and finds exact IDs across 250-row pages. Serialized kind choices add bound control, persistent field and binding control target. Binding explanations and field metadata appear before lengthy engine qualifications. No runtime controls, helper unit, target component loading or storage migration was introduced. Existing engine derivation remains unchanged.</w:t>
-      </w:r>
-    </w:p>
-    <w:p>
-      <w:r>
-        <w:t>The installed RAD Studio Data.Bind.Components source and official TLinkControlToField documentation establish the published DataSource, FieldName and Control contract. Data.Bind.DBScope supplies TBindSourceDB. Support describes serialized lexical candidates; it does not evaluate LiveBindings expressions or instantiate the target. General expression/factory/runtime/inherited behavior remains qualified rather than promoted to confirmed static binding.</w:t>
-      </w:r>
-    </w:p>
-    <w:p>
-      <w:r>
-        <w:t>Run tools/build-dataset-bindings.cmd elevated for 92 checks. Real text/binary DFM and FMX fixtures cover VCL and FMX field chains, parent ownership, reverse links, duplicate fields, missing/nil sources, lookup datasets, exact property evidence, native kind/text filters, follow navigation, compact layout, SQLite reopening and unchanged source/catalog. Connection and engine regressions each pass 66 checks. tools/build-wp0.cmd builds the actual application and verifies FMX resource bindings. Fixtures use fixed ignored bin/dataset-bindings-validation.</w:t>
-      </w:r>
-    </w:p>
-    <w:p>
-      <w:pPr>
-        <w:pStyle w:val="Heading1"/>
-      </w:pPr>
-      <w:r>
-        <w:t>Recognize captured database operation requests</w:t>
-      </w:r>
-    </w:p>
-    <w:p>
-      <w:r>
-        <w:t>TDPHSemanticAnalyzer.RoutineFacts emits database_operation relations for recognized methods on declared framework datasets or captured descendants. Receiver resolution and imported framework identity are checked; a local class shadowing TFDQuery and ordinary Delete methods are excluded. Captured inheritance is bounded to 32 steps. Within-with calls, factories, aliases, indexed receivers, unsupported providers and runtime dispatch remain unproved. DPHSemanticVersion DPH-WP3-15 invalidates older semantic caches.</w:t>
-      </w:r>
-    </w:p>
-    <w:p>
-      <w:r>
-        <w:t>TDPHDatabaseConnections.AppendOperations projects API calls, static_sql and dynamic_sql relations into existing database inventory rows. It preserves generation, condition, source SHA256 and line/byte range. Semantic component_field relationships connect operation receivers to serialized components by exact source location; ambiguous locations never choose an arbitrary target. Recognized custom dataset declarations receive their own navigable receiver row. SQL literal values are omitted. Single lexical CRUD families can be retained for complex SQL without inventing table or column bindings; dynamic or mixed batches remain unknown.</w:t>
-      </w:r>
-    </w:p>
-    <w:p>
-      <w:r>
-        <w:t>Effects distinguish record-buffer preparation, posting, cached-update application, deletion requests, SQL configuration and execution requests. Engine evidence follows captured receiver references. The database operation kind filter and Source button are serialized in DPH.UI.Main.fmx. Existing pagination, reverse references and source hash guards are reused. No helper unit, runtime control, storage migration, target execution or driver loading is introduced.</w:t>
-      </w:r>
-    </w:p>
-    <w:p>
-      <w:r>
-        <w:t>Run tools/build-database-operations.cmd elevated for 232 checks using the actual analyzer, persisted/reopened SQLite workspace and native FMX form. Fixtures cover CRUD requests, local/custom datasets, framework-name shadowing, SQL joins and mixed/dynamic SQL, operation effects, exact receiver/source identity, redaction, reverse navigation, detached-source refusal, compact layout and unchanged source/catalog. Binding regression passes 92, engine regression 66 and semantic regression 134 checks. tools/build-wp0.cmd builds the real application and verifies its FMX resource. Fixtures stay in fixed ignored bin/database-operations-validation.</w:t>
-      </w:r>
-    </w:p>
-    <w:p>
-      <w:pPr>
-        <w:pStyle w:val="Heading1"/>
-      </w:pPr>
-      <w:r>
-        <w:t>Trace captured transaction boundaries</w:t>
-      </w:r>
-    </w:p>
-    <w:p>
-      <w:r>
-        <w:t>DPHSemanticVersion DPH-WP3-15 invalidates older captures. RoutineFacts emits database_transaction relations for recognized FireDAC, ADO, dbExpress, BDE and IBX transaction APIs on declared imported framework types or captured descendants. IsDatabaseType shares the existing bounded ancestry and framework-name shadow checks with dataset operation recognition. The API list is provider-specific; ordinary methods and local classes sharing framework names are excluded. Parameter values and savepoint names do not enter the inventory. No target class, SQL or server is loaded or executed.</w:t>
-      </w:r>
-    </w:p>
-    <w:p>
-      <w:r>
-        <w:t>AttachTransactionPaths projects existing captured flow_nodes and flow_edges without evaluating expressions. Each boundary maps to the smallest containing statement range in the same routine and source. Separate finalizer copies retain their different pending transfers. Bounded traversal stops at the next boundary on the same declared semantic receiver or a normal/exception exit. Exception and conditional/loop flags stay separate. Multiple transaction calls in one expression receive no invented ordering. Receiver aliases and interprocedural transactions remain unproved.</w:t>
-      </w:r>
-    </w:p>
-    <w:p>
-      <w:r>
-        <w:t>Indexes group nodes by routine, outgoing edges by node and transaction boundaries by their statement. Limits are 10000 candidate CFG nodes per routine, 5000 states and 64 routes per boundary, and 1000000 states per inventory. Missing or bounded flow remains explicit. Routes expose node IDs and traversed edge-kind sets for comparison with the underlying CFG; they are not execution traces or path-feasibility proofs. Existing reference navigation links receivers, next boundaries and their reverse references. Controls remain serialized and IDE editable in DPH.UI.Main.fmx.</w:t>
-      </w:r>
-    </w:p>
-    <w:p>
-      <w:r>
-        <w:t>Calls immediately after try, except and finally now retain their no-parentheses statement-call recognition. Run tools/build-database-transactions.cmd elevated for 402 checks using actual analysis, persisted/reopened SQLite and native FMX controls. Fixtures cover normal/error commit and rollback paths, finalizers, conditional alternatives, missing boundaries, distinct receivers, retaining/savepoint variants, five framework families, captured descendants, local name shadows, unordered expressions, absent CFG, redaction, native navigation, compact layout and unchanged source/catalog. Regression suites cover 232 operation, 92 binding, 66 engine and 134 semantic checks. tools/build-wp0.cmd builds the actual application and checks the FMX resource. Tests reuse fixed ignored bin/database-transactions-validation.</w:t>
-      </w:r>
-    </w:p>
-    <w:p>
-      <w:pPr>
-        <w:pStyle w:val="Heading1"/>
-      </w:pPr>
-      <w:r>
-        <w:t>Capture field validation and transformation evidence</w:t>
-      </w:r>
-    </w:p>
-    <w:p>
-      <w:r>
-        <w:t>DPH-WP2-6 recognizes serialized BeforePost, BeforeInsert, BeforeEdit, BeforeDelete, BeforeCancel and BeforeOpen as event bindings in both text and binary forms. Existing own-form method resolution supplies handler relations; DPH-WP3-15 invalidates older semantic captures. Existing On-prefixed events retain their previous behavior. Missing or ambiguous method targets remain unresolved.</w:t>
-      </w:r>
-    </w:p>
-    <w:p>
-      <w:r>
-        <w:t>AppendDataRules in DPH.Workspace.DatabaseConnections indexes captured symbols, event bindings and routine CFG nodes. It projects persistent-field constraints, recognized field/dataset/input hooks and bounded handler statements. A transformation requires two direct expressions in the matching Pascal statement IR, rather than a semicolon heuristic. Conditions, raises and early exits remain distinct. Repeated finally copies are deduplicated by source location and context. Statement input/output links use captured lexical reads/writes within expression ranges, not reaching-definition or runtime-value claims. Literal strings, comments and character codes are omitted; supported custom/default expressions retain their structure without evaluation.</w:t>
-      </w:r>
-    </w:p>
-    <w:p>
-      <w:r>
-        <w:t>The combined inventory is bounded to 10000 rows; truncation is explicit in the model and native status. Source, SHA256, generation, context, handler, input/output and reverse references retain exact captured identity. Native data rule and rule declaration filters are serialized in the FMX resource. No new UI controls, helper unit, migration, target instance, driver or server execution is introduced. tools/build-data-rules.cmd checks real parser output, persisted/reopened captures, constraints, predicates, transformation inputs/outputs, missing handlers/syntax, semicolons in call literals, redaction, inventory limits, native navigation and normal/compact layouts. Explicit directions are in docs/guides/Data_Rules_Run_and_Test.txt.</w:t>
-      </w:r>
-    </w:p>
-    <w:p>
-      <w:pPr>
-        <w:pStyle w:val="Heading1"/>
-      </w:pPr>
-      <w:r>
-        <w:t>Connect source evidence into scoped lineage</w:t>
-      </w:r>
-    </w:p>
-    <w:p>
-      <w:r>
-        <w:t>TDPHDatabaseConnections.Lineage projects the captured workspace and database inventory without modifying either. Exact component_field source locations map semantic receivers to serialized inventory identity only when unique. Existing rule declarations retain their identity. Directed derives_from relations connect input candidates to dependent declarations and file output artifacts. Lexical rule inputs and outputs connect through the captured rule. Serialized bindings, handler context, reads/writes, rendering requests and database operation routines remain labeled context rather than reaching-definition evidence.</w:t>
-      </w:r>
-    </w:p>
-    <w:p>
-      <w:r>
-        <w:t>The projection indexes at most 50000 symbols and 100000 deduplicated edges, then performs bounded adjacency traversal. Each returned node retains its parent hop, kind, source, SHA256 and capture generation. Edges retain original range, source hash, condition, category and qualification. Both direction traversal includes context; Inputs and Destinations exclude broad procedure context and respect dependency direction. Cycles are deduplicated. Returned limits are 200 nodes, 800 edges and 12 hops. Missing targets, missing dataset declarations, unresolved handlers, scoped connection boundaries and limits remain explicit. Runtime values, aliases, server effects and final success remain unverified.</w:t>
-      </w:r>
-    </w:p>
-    <w:p>
-      <w:r>
-        <w:t>ResolveFields now treats any captured data-source chain without a dataset target as incomplete, including the case where another source chain resolves. It no longer invents a persistent-field target from the remaining valid branch. Existing exact-role and ambiguity checks remain in force. No analyzer version or schema migration is needed because lineage projects existing captures; older captures without a recognized event or relation still require Full reassessment.</w:t>
-      </w:r>
-    </w:p>
-    <w:p>
-      <w:r>
-        <w:t>The direction selector, Trace lineage and Lineage diagram buttons and Data lineage graph choice are serialized in DPH.UI.Main.fmx. Main form navigation reuses the inventory and explanation pages; graph grouping is disabled for lineage. GraphHTML renders the same evidence JSON with selectable nodes and unresolved breaks. Existing browser allowlisting and source hash guards remain in force. Tests use actual parsing, persisted and reopened SQLite captures, directional assignment chains, cyclic assignments, controlled file-writer evidence, redaction, incomplete bindings, trace limits and native FMX navigation/layout. No selected target, SQL, driver or production server is executed. Build with tools/build-data-lineage.cmd.</w:t>
-      </w:r>
-    </w:p>
-    <w:p>
-      <w:pPr>
-        <w:pStyle w:val="Heading1"/>
-      </w:pPr>
-      <w:r>
-        <w:t>Project captured migration and version evidence</w:t>
-      </w:r>
-    </w:p>
-    <w:p>
-      <w:r>
-        <w:t>TDPHDatabaseSchema.Inspect appends migration evidence after ordinary schema identities and links are resolved. Existing schema IDs remain stable. Each captured readable SQL resource becomes a migration candidate; unavailable literal SQL loader targets become migration gaps citing the Pascal loader range and fingerprint. The existing bounded project inventory discovers referenced files only. No unrelated directory scan, migration runner, target database or target application executes.</w:t>
-      </w:r>
-    </w:p>
-    <w:p>
-      <w:r>
-        <w:t>Leading numeric filenames are order candidates scoped to the captured source directory. Leading zeros normalize only for conflict detection; original filename digits remain visible. Captured loader configures relationships retain their source, line, fingerprint and enumeration label. Neither filename nor lexical-loader order becomes deployment precedence. Schema evidence links retain exact row IDs and are limited to 250 per script, with total and omission counts.</w:t>
-      </w:r>
-    </w:p>
-    <w:p>
-      <w:r>
-        <w:t>The existing SQL lexer separates comments and literal contents. Supported top-level PRAGMA user_version assignments capture nonnegative 32-bit integer values through equals or parentheses and preserve explicit schema qualifiers. Queries, engine schema_version counters, unsupported expressions, nested procedure blocks and comments cannot become application-version assignments. Multiple assignments remain ordered evidence rather than a selected final version. SQLite reference: https://www.sqlite.org/pragma.html#pragma_user_version. Supported verification request spelling captures integrity_check, quick_check and foreign_key_check without execution or invented results.</w:t>
-      </w:r>
-    </w:p>
-    <w:p>
-      <w:r>
-        <w:t>Existing SQL bounds are 2 MiB characters, 100000 tokens and 10000 combined schema rows. Migration detail bounds are 250 displayed version assignments, 8000 characters of verification requests and 1000 loader entries, with explicit truncation. IDE-editable kind/state selectors, paging, evidence memo, source guards and relationship navigation are reused. The focused tools/build-schema-history.cmd suite exercises actual parsing, persisted reopening, numeric-prefix conflicts, missing sources, version/counter distinctions, nested blocks, redaction, limits, native filters and navigation. Shared schema, ER, stored-object and lineage regressions verify the same projection remains compatible.</w:t>
-      </w:r>
-    </w:p>
-    <w:p>
-      <w:pPr>
-        <w:pStyle w:val="Heading1"/>
-      </w:pPr>
-      <w:r>
-        <w:t>Project captured file formats and contracts</w:t>
-      </w:r>
-    </w:p>
-    <w:p>
-      <w:r>
-        <w:t>TDPHWorkspaceView.FileFormats projects existing IR and semantic captures without a schema or analyzer change. Supported captured JSON, XML and INI resources show member shapes while omitting scalar values. Member names are bounded and unsafe names are omitted. Each resource shows at most 250 members and an explicit total/limit. The combined inventory is capped at 10000 rows with visible truncation.</w:t>
-      </w:r>
-    </w:p>
-    <w:p>
-      <w:r>
-        <w:t>Outer expression tokens identify dotted ReadAllText/Bytes/Lines, WriteAllText/Bytes/Lines, LoadFromFile and SaveToFile spellings. Quoted strings remain single tokens and comments do not become APIs. A supported literal first argument contributes only a safe filename extension. Explicit TEncoding argument spellings remain candidates; byte APIs remain binary candidates. Enclosing captured routine identity provides a producer or consumer link. Evidence retains source hash, generation and enclosing expression range; custom receivers and runtime dispatch are unverified.</w:t>
-      </w:r>
-    </w:p>
-    <w:p>
-      <w:r>
-        <w:t>DPH.UI.Main and its serialized FMX resource provide kind/text filters, 250-row paging, labeled evidence, guarded source opening, routine explanation and contract drafts. No runtime controls, helper unit or target execution is introduced. Deterministic contract titles include the exact row and source hash. Existing attributed Knowledge storage supplies immutable revision history and separate review. A contract draft includes encoding/BOM, schema and required fields, producer/consumer mappings, validation, compatibility, verification and remaining unknowns.</w:t>
-      </w:r>
-    </w:p>
-    <w:p>
-      <w:r>
-        <w:t>Run tools/build-file-formats.cmd elevated for the focused actual-parser, persistence and native FMX checks. It uses fixed ignored bin/file-formats-validation fixtures and verifies redaction, routine identity, explicit encoding candidates, resource/transfer distinctions, large shapes, paging, saved contracts, source-change and detached-source refusal, compact layout and unchanged captured source/catalog. Shared schema-history, lineage, Knowledge and publishing regressions and tools/build-wp0.cmd validate integration. Candidate evidence and authored contracts do not establish a formal schema, runtime transfer success or deployed compatibility.</w:t>
-      </w:r>
-    </w:p>
-    <w:p>
-      <w:pPr>
-        <w:pStyle w:val="Heading1"/>
-      </w:pPr>
-      <w:r>
-        <w:t>Maintain attributed target retention requirements</w:t>
-      </w:r>
-    </w:p>
-    <w:p>
-      <w:r>
-        <w:t>Requirement 05.18 is an attributed manual-capture workflow. TDPHWorkspaceView provides the target-policy template, typed-record recognition, metadata validation and readable evidence. Native DataRetention controls in DPH.UI.Main.fmx provide state/text filtering, bounded 250-row pages, labeled scrollable details, draft preparation and existing Knowledge/link navigation. Controls remain editable in the IDE. No helper unit, analyzer pass or storage migration is introduced.</w:t>
-      </w:r>
-    </w:p>
-    <w:p>
-      <w:r>
-        <w:t>Structured metadata contains record_type data_retention and a stable GUID policy_id. The existing attributed body remains editable; identity and kind stay protected. TDPHKnowledgeStore.SaveKnowledge validates metadata, rejects the default title, anonymous authors, removed heading, wrong business-rule/maintenance/maintainer scope, duplicate identities, identity changes and discarded structured metadata. Existing optimistic revisions, named review, immutable history and exact rich links remain authoritative. Unknown fields are deliberately permitted and visibly unresolved; policy prose is human evidence, not an inferred legal rule.</w:t>
-      </w:r>
-    </w:p>
-    <w:p>
-      <w:r>
-        <w:t>The register distinguishes original contributor from current revision editor and shows the named reviewer and explicit link count. Existing Knowledge links support captured semantic routines, evidence and exact procedure-section revisions. Publication includes these requirements and typed identities in maintenance/all-reader handoffs through existing audience and redaction rules. No source application, SQL, deletion or archive job executes. DPH snapshot controls are distinct from the selected application's retention requirements.</w:t>
-      </w:r>
-    </w:p>
-    <w:p>
-      <w:r>
-        <w:t>Run tools/build-data-retention.cmd elevated. The focused suite uses a real parsed controlled Retention.dpr capture, persisted attributed policies, metadata rejection cases, immutable review/edit history, routine and procedure links, canonical/HTML export and complete bundle validation, native paging/filtering, draft guards and compact rendering. Knowledge, publishing and file-format regressions and tools/build-wp0.cmd cover shared paths. Controlled outputs remain under ignored bin/data-retention-validation; no owner project source or catalog is modified.</w:t>
-      </w:r>
-    </w:p>
-    <w:p>
-      <w:pPr>
-        <w:pStyle w:val="Heading1"/>
-      </w:pPr>
-      <w:r>
-        <w:t>Maintain target data quality evidence and report imports</w:t>
-      </w:r>
-    </w:p>
-    <w:p>
-      <w:r>
-        <w:t>TDPHWorkspaceView provides NewDataQualityRule, typed record recognition, metadata validation and attributed details in the existing model unit. Stable record_type data_quality and GUID rule_id identify each rule or imported report. Native controls are serialized in DPH.UI.Main.fmx for IDE editing: state/text filters, 250-row pages, command bars, contributor/context inputs, labeled evidence, New/Open, implementation links and import. Main guards unsaved Knowledge drafts and reuses existing revision, review and rich-link workflows. No helper unit, storage migration or target execution is introduced.</w:t>
-      </w:r>
-    </w:p>
-    <w:p>
-      <w:r>
-        <w:t>TDPHKnowledgeStore.SaveKnowledge validates quality identity, heading, business-rule kind and project maintenance/maintainer scope, rejects placeholder titles, duplicate identities, changed identities and discarded structured metadata. The body remains editable and exact prior revisions remain in history. ImportDataQualityReport reads only explicitly selected .txt/.log/.json files, checks both before/after read sizes at 32 KiB, requires round-trip UTF-8 and rejects empty/NUL text. It hashes the original bytes and saves literal text with contributor, context, UTC, generation and an explicit unverified-claim qualification through SaveKnowledge.</w:t>
-      </w:r>
-    </w:p>
-    <w:p>
-      <w:r>
-        <w:t>The import_data_quality worker command opens the selected store using its actual source root, imports on the existing background writer and returns saved Knowledge. Report imports do not execute a parser for report commands, SQL, scripts or target code. Publication uses the normal maintenance scope and escapes report markup in HTML; imported measurements remain unverified even when hash-consistent. Exact section links associate rule, operator procedure and imported report revisions; entity/evidence links preserve captured implementation references. DPH storage integrity and selected-data quality remain distinct.</w:t>
-      </w:r>
-    </w:p>
-    <w:p>
-      <w:r>
-        <w:t>Run tools/build-data-quality.cmd elevated for real parsing/persistence, identity and invalid-save cases, immutable review/edit history, implementation/procedure/result links, native filtering/paging/draft guards, compact rendering, UTF-8/size/NUL rejection, report hashes, literal HTML, full handoff validation, unchanged source/catalog and actual background import. The worker test releases the test writer before opening the background writer. Knowledge, publishing, retention and actual application/FMX regressions cover shared paths. Fixed ignored bin/data-quality-validation holds controlled fixtures.</w:t>
-      </w:r>
-    </w:p>
-    <w:p>
-      <w:pPr>
-        <w:pStyle w:val="Heading1"/>
-      </w:pPr>
-      <w:r>
-        <w:t>Maintain target backup and restoration evidence</w:t>
-      </w:r>
-    </w:p>
-    <w:p>
-      <w:r>
-        <w:t>TDPHWorkspaceView provides the recovery template, typed metadata validation, recognition and readable attribution. record_type target_recovery and a stable GUID plan_id identify each plan independently of its editable body. TDPHKnowledgeStore.SaveKnowledge enforces the first heading, descriptive stable title, project business-rule and maintenance scope, unique identity and existing optimistic revisions. Named reviews and edits preserve exact prior bodies and evidence links; unknowns remain explicit.</w:t>
-      </w:r>
-    </w:p>
-    <w:p>
-      <w:r>
-        <w:t>TargetRecovery controls in DPH.UI.Main.fmx are serialized for IDE and Object Inspector editing. The register provides state and text filters, 250-row pages, labeled scrolling evidence, New/Open and the existing exact-link editor. It borrows saved Knowledge rows and clears them before replacement; it guards unsaved drafts. No helper unit, migration, runtime control construction or target backup/restore execution is introduced.</w:t>
-      </w:r>
-    </w:p>
-    <w:p>
-      <w:r>
-        <w:t>The controlled tests parse a real Recovery.dpr and RestoreOrders routine, persist requirements and attributed test measurements, exercise invalid/duplicate/stale saves, immutable review/edit history, source and exact procedure links, canonical and escaped HTML publication, full bundle validation, native editing/navigation/filtering/paging and compact layout. Knowledge, publishing and data-quality regression suites and the actual app/FMX baseline cover shared paths. Run tools/build-target-recovery.cmd elevated. Fixtures remain under fixed ignored bin/target-recovery-validation.</w:t>
-      </w:r>
-    </w:p>
-    <w:p>
-      <w:r>
-        <w:t>DPH portable database backup and selected-application recovery requirements are separate. Written measurements are contributor claims, and a stored hash does not authenticate their origin or prove recovery. Existing section links can pin a saved evidence revision. The embedded-NUL report rejection fixture uses an ordinary filename, embedded-nul.txt, to avoid Windows device-name behavior while testing the actual NUL bytes.</w:t>
-      </w:r>
-    </w:p>
-    <w:p>
-      <w:pPr>
-        <w:pStyle w:val="Heading1"/>
-      </w:pPr>
-      <w:r>
-        <w:t>Maintain structured business process records</w:t>
-      </w:r>
-    </w:p>
-    <w:p>
-      <w:r>
-        <w:t>TDPHWorkspaceView provides the typed business_process object with stable process_id GUID and eight string fields. Validation rejects missing, unexpected, non-text, empty and oversized fields, and an unspecified process name. SaveKnowledge enforces project business-rule maintenance scope, a name matching the stable title, a canonical generated body, unique identity and optimistic revisions. Existing metadata conversion/discard guards, immutable review/edit history and exact evidence links remain authoritative.</w:t>
-      </w:r>
-    </w:p>
-    <w:p>
-      <w:r>
-        <w:t>BusinessProcess controls and the Process fields editor are serialized in DPH.UI.Main.fmx for IDE and Object Inspector editing. A scrolling native field editor prepares the existing Knowledge draft rather than silently saving. Named contributor, draft guards, editable business fields, protected saved name, separate review, filters, 250-row paging, source explanation navigation and exact section revisions share the existing workflow. No helper unit, schema migration, runtime control construction or target execution is introduced.</w:t>
-      </w:r>
-    </w:p>
-    <w:p>
-      <w:r>
-        <w:t>Run tools/build-business-process.cmd elevated. The controlled fixture parses Operations.dpr and FulfilOrders, persists and reopens typed fields, tests malformed metadata, duplicate/changed identities, canonical-body divergence, stale saves, named review and immutable history, exact source/procedure links, canonical publication and full bundle validation. Actual native FMX editor/register renders cover normal and compact windows and the last field. Shared knowledge, publishing and data-quality suites and tools/build-wp0.cmd cover regressions. Fixtures use the fixed ignored bin/business-process-validation directory.</w:t>
-      </w:r>
-    </w:p>
-    <w:p>
-      <w:r>
-        <w:t>Business owner and contributor are distinct. Unknown is an explicit unresolved value rather than inferred business knowledge. Source links establish captured implementation evidence, not that a business step ran. Generic ordered step text in this inventory does not complete the separate departmental workflow or end-to-end process-diagram requirements.</w:t>
-      </w:r>
-    </w:p>
-    <w:p>
-      <w:pPr>
-        <w:pStyle w:val="Heading1"/>
-      </w:pPr>
-      <w:r>
-        <w:t>Maintain ordered departmental workflow evidence</w:t>
-      </w:r>
-    </w:p>
-    <w:p>
-      <w:r>
-        <w:t>TDPHWorkspaceView provides departmental_workflow metadata, canonical workflow GUID, five workflow fields and an ordered steps array. Each step has a canonical GUID, department, role, action, inputs, outputs, handoff, exception handling and exception destination. Validation rejects duplicate identities, dangling destinations, unknown shapes, invalid types, empty or oversized fields, unspecified actions, missing steps and exceeded limits. Normal authored order follows the array; exception identity remains stable across reordering.</w:t>
-      </w:r>
-    </w:p>
-    <w:p>
-      <w:r>
-        <w:t>SaveKnowledge requires project-scoped maintenance business-rule records, stable title matching the structured name, canonical generated body, unique workflow identity and optimistic revisions. Existing immutable save/review history, source invalidation, exact section/source links, named contributors and reviewers, publication and reopening apply. No new schema or helper unit is added. Human workflow content and named review do not establish target execution, business authorization or successful outcomes.</w:t>
-      </w:r>
-    </w:p>
-    <w:p>
-      <w:r>
-        <w:t>The register and workflow/step fields are native serialized controls in DPH.UI.Main.fmx. New/Edit create a local structured draft; Apply step modifies that draft; Apply workflow prepares Knowledge; Save persists it. Shared nonmodal editor guards prevent saving unapplied fields and bind edits to the original record. New/discarded Knowledge frees its workflow draft. Compact commands scroll horizontally and fields vertically. Array replacement/reordering uses the RTL TJSONArray.SetElements ownership contract while retaining or freeing element values appropriately.</w:t>
-      </w:r>
-    </w:p>
-    <w:p>
-      <w:r>
-        <w:t>Run tools/build-departmental-workflow.cmd elevated. The real parser, SQLite reopening, revision/review and canonical publication fixture covers ordered Sales/Warehouse steps, roles, handoff, recovery destination, malformed records, invalid identities, dangling/duplicate destinations, bounds, source/procedure links and unchanged source/catalog. Native FMX exercises add/apply/remove protection, reordering, dirty-step and unapplied-workflow guards, editor/register navigation and compact renders. Compatibility covers Knowledge, publishing, data quality and the business-process editor plus the actual application/FMX build. Fixtures remain in the fixed ignored bin/departmental-workflow-validation directory.</w:t>
-      </w:r>
-    </w:p>
-    <w:p>
-      <w:r>
-        <w:t>This implements departmental workflow capture. End-to-end process diagrams now provide a distinct authored workflow projection; technical graphs retain their source-derived meaning.</w:t>
-      </w:r>
-    </w:p>
-    <w:p>
-      <w:pPr>
-        <w:pStyle w:val="Heading1"/>
-      </w:pPr>
-      <w:r>
-        <w:t>Maintain end-to-end process projections</w:t>
-      </w:r>
-    </w:p>
-    <w:p>
-      <w:r>
-        <w:t>TDPHGraphProjection.Workflow derives bounded ordered workflow-step nodes, one End node, explicit unresolved exception destinations, normal handoff edges and stable exception edges from a saved departmental_workflow record. No runtime trace, inferred step or invented process association is added. Links resolve against exact in-scope business-process history revisions and retain state, named reviewer and process identity.</w:t>
-      </w:r>
-    </w:p>
-    <w:p>
-      <w:r>
-        <w:t>TDPHGraphProjection.WorkflowSVG creates accessible, scrollable SVG with blue normal routes, orange exception gutters, escaped labels, full fields/routes and exact process revision links. The native serialized GraphPaint provides a scrollable fallback, separate arrow routing and step details. GraphCombo has an Object Inspector editable Business process choice, and Departmental workflows has a serialized Process diagram button. Knowledge replacement rebinds workflow rows before graphics refresh to avoid stale pointers.</w:t>
-      </w:r>
-    </w:p>
-    <w:p>
-      <w:r>
-        <w:t>The version 10 publication model derives process_diagram after audience, source and link scope filtering and redaction. HTML renders it within the workflow article. Canonical knowledge JSON and its existing index retain it. Validator recomputes the projection and rejects divergence or missing diagrams in current-template workflow records. Localization removes its containing knowledge records, so no unlocalized process projection survives a localized authored-body-only view.</w:t>
-      </w:r>
-    </w:p>
-    <w:p>
-      <w:r>
-        <w:t>Run tools/build-process-diagram.cmd elevated. Real parser/SQLite capture and reopening, exact reviewed process history links, canonical HTML and full bundle validation accompany native FMX navigation and graph/step details. Tests cover reordered stable exception destinations, self-return, End, Unknown, escaped script-like labels, all 64 steps and rejected overflow, audience scope, draft protection and replaced/cleared knowledge. Regression suites cover existing Knowledge, publication, workflow and technical graphs plus the actual application/FMX build. Fixtures use the fixed ignored bin/process-diagram-validation folder.</w:t>
-      </w:r>
-    </w:p>
-    <w:p>
-      <w:pPr>
-        <w:pStyle w:val="Heading1"/>
-      </w:pPr>
-      <w:r>
-        <w:t>Maintain the business rule catalog</w:t>
-      </w:r>
-    </w:p>
-    <w:p>
-      <w:r>
-        <w:t>TDPHWorkspaceView.NewBusinessRule, ValidateBusinessRule and BusinessRuleBody define the existing-unit business_rule_definition contract: stable canonical rule_id GUID and nine bounded text fields. The human rule_code is required, 1 to 100 ASCII characters, with strict end matching; name is descriptive and at most 200 characters. Every text field is at most 4096 characters. Unknown remains an unresolved business value rather than inferred policy.</w:t>
-      </w:r>
-    </w:p>
-    <w:p>
-      <w:r>
-        <w:t>TDPHKnowledgeStore.SaveKnowledge validates project scope, business_rule kind, maintenance document, maintainer audience, title and canonical body. Identity and saved human rule code cannot change. Case-insensitive rule codes and GUIDs are unique within the selected project, including retired history. Existing revision guards, attributed review, immutable history and exact source/procedure links apply. No schema migration or helper unit was added.</w:t>
-      </w:r>
-    </w:p>
-    <w:p>
-      <w:r>
-        <w:t>BusinessRuleTab and BusinessRuleEditorTab are serialized FMX controls editable in the IDE. IsBusinessRule admits only typed rule definitions and original generic business_rule notes; typed process, workflow, data-quality and recovery records remain in their own registers. Generic notes keep their original attribution and body, with explicit Unstructured labeling. Structured conversion of an existing generic note is forbidden.</w:t>
-      </w:r>
-    </w:p>
-    <w:p>
-      <w:r>
-        <w:t>Run tools/build-business-rule.cmd elevated for real parser/SQLite, identifier collisions and immutability, malformed records, exact implementation/procedure links, named review/history, canonical publication and database reopening. Native normal and compact renders cover field editing, pending draft protection, filters, legacy notes and bounded paging. The fixed ignored bin/business-rule-validation fixture does not execute selected target code. Run tools/build-wp0.cmd for the actual application and FMX resource binding checks.</w:t>
-      </w:r>
-    </w:p>
-    <w:p>
-      <w:pPr>
-        <w:pStyle w:val="Heading1"/>
-      </w:pPr>
-      <w:r>
-        <w:t>Maintain calculation evidence and definitions</w:t>
-      </w:r>
-    </w:p>
-    <w:p>
-      <w:r>
-        <w:t>TDPHWorkspaceView.Calculations projects captured syntax expression roots and constant declarations. Arithmetic, bitwise or boolean operators and recognized mathematical API spellings are lexical candidates, with quoted literals omitted before classification. A per-file routine-start map resolves ancestor routines within 128 parent hops. Source ranges, original capture hashes, generation and conditional context are retained. Rows are bounded to 10000, unavailable empty/long expressions are counted, and parser gaps remain qualified. No expression evaluator or target execution was added.</w:t>
-      </w:r>
-    </w:p>
-    <w:p>
-      <w:r>
-        <w:t>NewCalculation, ValidateCalculation and CalculationBody define calculation_definition with a canonical stable calculation_id GUID and twelve bounded text fields. Name is descriptive, at most 200 characters and stable after saving; every field is at most 4096 characters and must explicitly say Unknown when unresolved. Business meaning, formula, input/output definitions, units, rounding, assumptions, exceptions, worked examples and accountable owner remain separately reviewable.</w:t>
-      </w:r>
-    </w:p>
-    <w:p>
-      <w:r>
-        <w:t>TDPHKnowledgeStore.SaveKnowledge enforces business_rule kind, project scope, maintenance/maintainer metadata, canonical title/body, stable identity and unique GUIDs. Existing attribution, revision guards, immutable named review/history, exact source/procedure links and publication contracts apply. Formula text is data and cannot execute. No schema migration or helper unit was added.</w:t>
-      </w:r>
-    </w:p>
-    <w:p>
-      <w:r>
-        <w:t>Calculation evidence, Calculations and Calculation fields are serialized FMX pages listed in the header selector. Source navigation uses the existing generation/hash boundary. Candidate prefill preserves unresolved business meaning and units and cannot overwrite a pending draft. Source inventory is rebuilt from the loaded capture; authored definitions use the Knowledge database. The compact source list leaves the scrollable evidence memo readable.</w:t>
-      </w:r>
-    </w:p>
-    <w:p>
-      <w:r>
-        <w:t>Run tools/build-calculation.cmd elevated for real parser/SQLite, nested expression and literal handling, constant formulas, source hash/generation/owner, the 10000-row bound, native page navigation and definition editing, canonical validation, exact links, review/history, publication and reopening. Existing Knowledge, publishing, quality, business process, workflow, diagrams and rule catalog suites are regressed. Actual application and FMX checks use tools/build-wp0.cmd. Fixed ignored fixtures are under bin/calculation-validation; selected target code never executes.</w:t>
-      </w:r>
-    </w:p>
-    <w:p>
-      <w:pPr>
-        <w:pStyle w:val="Heading1"/>
-      </w:pPr>
-      <w:r>
-        <w:t>Source and revision evidence</w:t>
-      </w:r>
-    </w:p>
-    <w:p>
-      <w:r>
-        <w:t>The following source files and resources define this guide. SHA256 values identify the inspected implementation. Rebuild the guides after validated changes and retain the associated acceptance evidence.</w:t>
-      </w:r>
-    </w:p>
-    <w:p>
-      <w:pPr>
-        <w:keepNext/>
-        <w:spacing w:after="0"/>
-      </w:pPr>
-      <w:r>
-        <w:rPr>
-          <w:sz w:val="18"/>
-        </w:rPr>
-        <w:t>DPH.Analysis.Async.pas</w:t>
-      </w:r>
-    </w:p>
-    <w:p>
-      <w:pPr>
-        <w:spacing w:after="20"/>
-      </w:pPr>
-      <w:r>
-        <w:rPr>
-          <w:rFonts w:ascii="Consolas" w:hAnsi="Consolas"/>
-          <w:sz w:val="16"/>
-        </w:rPr>
-        <w:t>876a836f25b3d323ac4d6f635701fb4e8e97955fdff39c964368aa62f1a4c153</w:t>
-      </w:r>
-    </w:p>
-    <w:p>
-      <w:pPr>
-        <w:keepNext/>
-        <w:spacing w:after="0"/>
-      </w:pPr>
-      <w:r>
-        <w:rPr>
-          <w:sz w:val="18"/>
-        </w:rPr>
-        <w:t>DPH.Analysis.Explanations.pas</w:t>
-      </w:r>
-    </w:p>
-    <w:p>
-      <w:pPr>
-        <w:spacing w:after="20"/>
-      </w:pPr>
-      <w:r>
-        <w:rPr>
-          <w:rFonts w:ascii="Consolas" w:hAnsi="Consolas"/>
-          <w:sz w:val="16"/>
-        </w:rPr>
-        <w:t>8e4a430daf51b5f1d5c0e4e8a939862dd8b80123bd7333597b949ad054f85f06</w:t>
-      </w:r>
-    </w:p>
-    <w:p>
-      <w:pPr>
-        <w:keepNext/>
-        <w:spacing w:after="0"/>
-      </w:pPr>
-      <w:r>
-        <w:rPr>
-          <w:sz w:val="18"/>
-        </w:rPr>
-        <w:t>DPH.Analysis.Flow.pas</w:t>
-      </w:r>
-    </w:p>
-    <w:p>
-      <w:pPr>
-        <w:spacing w:after="20"/>
-      </w:pPr>
-      <w:r>
-        <w:rPr>
-          <w:rFonts w:ascii="Consolas" w:hAnsi="Consolas"/>
-          <w:sz w:val="16"/>
-        </w:rPr>
-        <w:t>ee7610544411a64da399659f2af11e84408d285837a45205d610d2c37af8ef57</w:t>
-      </w:r>
-    </w:p>
-    <w:p>
-      <w:pPr>
-        <w:keepNext/>
-        <w:spacing w:after="0"/>
-      </w:pPr>
-      <w:r>
-        <w:rPr>
-          <w:sz w:val="18"/>
-        </w:rPr>
-        <w:t>DPH.Analysis.Model.pas</w:t>
-      </w:r>
-    </w:p>
-    <w:p>
-      <w:pPr>
-        <w:spacing w:after="20"/>
-      </w:pPr>
-      <w:r>
-        <w:rPr>
-          <w:rFonts w:ascii="Consolas" w:hAnsi="Consolas"/>
-          <w:sz w:val="16"/>
-        </w:rPr>
-        <w:t>93d7e969508ff4862a98f7e4d7b6cb690cf741792d5a0e4dbac9f012bc8c5035</w:t>
-      </w:r>
-    </w:p>
-    <w:p>
-      <w:pPr>
-        <w:keepNext/>
-        <w:spacing w:after="0"/>
-      </w:pPr>
-      <w:r>
-        <w:rPr>
-          <w:sz w:val="18"/>
-        </w:rPr>
-        <w:t>DPH.Analysis.Persistence.pas</w:t>
-      </w:r>
-    </w:p>
-    <w:p>
-      <w:pPr>
-        <w:spacing w:after="20"/>
-      </w:pPr>
-      <w:r>
-        <w:rPr>
-          <w:rFonts w:ascii="Consolas" w:hAnsi="Consolas"/>
-          <w:sz w:val="16"/>
-        </w:rPr>
-        <w:t>08609c3df54250a8f6712e22e991f7ad8d444352e7103ba0959d2feba4a2b3c7</w:t>
-      </w:r>
-    </w:p>
-    <w:p>
-      <w:pPr>
-        <w:keepNext/>
-        <w:spacing w:after="0"/>
-      </w:pPr>
-      <w:r>
-        <w:rPr>
-          <w:sz w:val="18"/>
-        </w:rPr>
-        <w:t>DPH.Analysis.Quality.pas</w:t>
-      </w:r>
-    </w:p>
-    <w:p>
-      <w:pPr>
-        <w:spacing w:after="20"/>
-      </w:pPr>
-      <w:r>
-        <w:rPr>
-          <w:rFonts w:ascii="Consolas" w:hAnsi="Consolas"/>
-          <w:sz w:val="16"/>
-        </w:rPr>
-        <w:t>50196d33a8d15cfeb52528dde93a2bfdc22b153e2533830b08e3ac097e14fd82</w:t>
-      </w:r>
-    </w:p>
-    <w:p>
-      <w:pPr>
-        <w:keepNext/>
-        <w:spacing w:after="0"/>
-      </w:pPr>
-      <w:r>
-        <w:rPr>
-          <w:sz w:val="18"/>
-        </w:rPr>
-        <w:t>DPH.Analysis.SQL.pas</w:t>
-      </w:r>
-    </w:p>
-    <w:p>
-      <w:pPr>
-        <w:spacing w:after="20"/>
-      </w:pPr>
-      <w:r>
-        <w:rPr>
-          <w:rFonts w:ascii="Consolas" w:hAnsi="Consolas"/>
-          <w:sz w:val="16"/>
-        </w:rPr>
-        <w:t>68ea587d47e2c7ebf660f85eed6b605f6076480ead3a461742b8290fec7a130e</w:t>
-      </w:r>
-    </w:p>
-    <w:p>
-      <w:pPr>
-        <w:keepNext/>
-        <w:spacing w:after="0"/>
-      </w:pPr>
-      <w:r>
-        <w:rPr>
-          <w:sz w:val="18"/>
-        </w:rPr>
-        <w:t>DPH.Analysis.Symbols.pas</w:t>
-      </w:r>
-    </w:p>
-    <w:p>
-      <w:pPr>
-        <w:spacing w:after="20"/>
-      </w:pPr>
-      <w:r>
-        <w:rPr>
-          <w:rFonts w:ascii="Consolas" w:hAnsi="Consolas"/>
-          <w:sz w:val="16"/>
-        </w:rPr>
-        <w:t>47c187a32ad1a040760bd9459e843d9c6fa7ced7b4ea5843280d2680127cc047</w:t>
-      </w:r>
-    </w:p>
-    <w:p>
-      <w:pPr>
-        <w:keepNext/>
-        <w:spacing w:after="0"/>
-      </w:pPr>
-      <w:r>
-        <w:rPr>
-          <w:sz w:val="18"/>
-        </w:rPr>
-        <w:t>DPH.Knowledge.ActionPurpose.pas</w:t>
-      </w:r>
-    </w:p>
-    <w:p>
-      <w:pPr>
-        <w:spacing w:after="20"/>
-      </w:pPr>
-      <w:r>
-        <w:rPr>
-          <w:rFonts w:ascii="Consolas" w:hAnsi="Consolas"/>
-          <w:sz w:val="16"/>
-        </w:rPr>
-        <w:t>bd548e1d5bbb886d3d3f2b5ba59d1cd86144a92877eba20596f956582740573f</w:t>
-      </w:r>
-    </w:p>
-    <w:p>
-      <w:pPr>
-        <w:keepNext/>
-        <w:spacing w:after="0"/>
-      </w:pPr>
-      <w:r>
-        <w:rPr>
-          <w:sz w:val="18"/>
-        </w:rPr>
-        <w:t>DPH.Knowledge.ComponentDependency.pas</w:t>
-      </w:r>
-    </w:p>
-    <w:p>
-      <w:pPr>
-        <w:spacing w:after="20"/>
-      </w:pPr>
-      <w:r>
-        <w:rPr>
-          <w:rFonts w:ascii="Consolas" w:hAnsi="Consolas"/>
-          <w:sz w:val="16"/>
-        </w:rPr>
-        <w:t>56bc1021fffa88f0a383a2a159b4c74328d735597f72c3ec279ef42ad2a2ccbe</w:t>
-      </w:r>
-    </w:p>
-    <w:p>
-      <w:pPr>
-        <w:keepNext/>
-        <w:spacing w:after="0"/>
-      </w:pPr>
-      <w:r>
-        <w:rPr>
-          <w:sz w:val="18"/>
-        </w:rPr>
-        <w:t>DPH.Knowledge.Glossary.pas</w:t>
-      </w:r>
-    </w:p>
-    <w:p>
-      <w:pPr>
-        <w:spacing w:after="20"/>
-      </w:pPr>
-      <w:r>
-        <w:rPr>
-          <w:rFonts w:ascii="Consolas" w:hAnsi="Consolas"/>
-          <w:sz w:val="16"/>
-        </w:rPr>
-        <w:t>9c50a06ccf405f786526e206e5e84ea956604eeb42e1a84b9f91c31cced70dcb</w:t>
-      </w:r>
-    </w:p>
-    <w:p>
-      <w:pPr>
-        <w:keepNext/>
-        <w:spacing w:after="0"/>
-      </w:pPr>
-      <w:r>
-        <w:rPr>
-          <w:sz w:val="18"/>
-        </w:rPr>
-        <w:t>DPH.Knowledge.ProjectProfile.pas</w:t>
-      </w:r>
-    </w:p>
-    <w:p>
-      <w:pPr>
-        <w:spacing w:after="20"/>
-      </w:pPr>
-      <w:r>
-        <w:rPr>
-          <w:rFonts w:ascii="Consolas" w:hAnsi="Consolas"/>
-          <w:sz w:val="16"/>
-        </w:rPr>
-        <w:t>e901a58b02c2aafe2cc21df4da7dced2807a9cc8840c325c72d9db64cedc44bd</w:t>
-      </w:r>
-    </w:p>
-    <w:p>
-      <w:pPr>
-        <w:keepNext/>
-        <w:spacing w:after="0"/>
-      </w:pPr>
-      <w:r>
-        <w:rPr>
-          <w:sz w:val="18"/>
-        </w:rPr>
-        <w:t>DPH.Parse.Forms.pas</w:t>
-      </w:r>
-    </w:p>
-    <w:p>
-      <w:pPr>
-        <w:spacing w:after="20"/>
-      </w:pPr>
-      <w:r>
-        <w:rPr>
-          <w:rFonts w:ascii="Consolas" w:hAnsi="Consolas"/>
-          <w:sz w:val="16"/>
-        </w:rPr>
-        <w:t>3cf7d49afd859e2d2749cb30e5fdd76120eaf05ef5223e8fb8bf6eb1a7fcd66c</w:t>
-      </w:r>
-    </w:p>
-    <w:p>
-      <w:pPr>
-        <w:keepNext/>
-        <w:spacing w:after="0"/>
-      </w:pPr>
-      <w:r>
-        <w:rPr>
-          <w:sz w:val="18"/>
-        </w:rPr>
-        <w:t>DPH.Parse.Lexer.pas</w:t>
-      </w:r>
-    </w:p>
-    <w:p>
-      <w:pPr>
-        <w:spacing w:after="20"/>
-      </w:pPr>
-      <w:r>
-        <w:rPr>
-          <w:rFonts w:ascii="Consolas" w:hAnsi="Consolas"/>
-          <w:sz w:val="16"/>
-        </w:rPr>
-        <w:t>6ce5bbc66f8170b17eaeda536b8e500ca9992131477c09bc8e1a33bb6dd1c7f0</w:t>
-      </w:r>
-    </w:p>
-    <w:p>
-      <w:pPr>
-        <w:keepNext/>
-        <w:spacing w:after="0"/>
-      </w:pPr>
-      <w:r>
-        <w:rPr>
-          <w:sz w:val="18"/>
-        </w:rPr>
-        <w:t>DPH.Parse.Model.pas</w:t>
-      </w:r>
-    </w:p>
-    <w:p>
-      <w:pPr>
-        <w:spacing w:after="20"/>
-      </w:pPr>
-      <w:r>
-        <w:rPr>
-          <w:rFonts w:ascii="Consolas" w:hAnsi="Consolas"/>
-          <w:sz w:val="16"/>
-        </w:rPr>
-        <w:t>bdecd758070044593a6a19bfd53b35f9a23286e2542194313222cdfee51d6557</w:t>
-      </w:r>
-    </w:p>
-    <w:p>
-      <w:pPr>
-        <w:keepNext/>
-        <w:spacing w:after="0"/>
-      </w:pPr>
-      <w:r>
-        <w:rPr>
-          <w:sz w:val="18"/>
-        </w:rPr>
-        <w:t>DPH.Parse.Pascal.pas</w:t>
-      </w:r>
-    </w:p>
-    <w:p>
-      <w:pPr>
-        <w:spacing w:after="20"/>
-      </w:pPr>
-      <w:r>
-        <w:rPr>
-          <w:rFonts w:ascii="Consolas" w:hAnsi="Consolas"/>
-          <w:sz w:val="16"/>
-        </w:rPr>
-        <w:t>016adbe9ba24b90d457455722782cdbbc657233bd1a07ba1bcdcd77f3340587e</w:t>
-      </w:r>
-    </w:p>
-    <w:p>
-      <w:pPr>
-        <w:keepNext/>
-        <w:spacing w:after="0"/>
-      </w:pPr>
-      <w:r>
-        <w:rPr>
-          <w:sz w:val="18"/>
-        </w:rPr>
-        <w:t>DPH.Parse.Preprocessor.pas</w:t>
-      </w:r>
-    </w:p>
-    <w:p>
-      <w:pPr>
-        <w:spacing w:after="20"/>
-      </w:pPr>
-      <w:r>
-        <w:rPr>
-          <w:rFonts w:ascii="Consolas" w:hAnsi="Consolas"/>
-          <w:sz w:val="16"/>
-        </w:rPr>
-        <w:t>34b7513019a41bc9911babfda72041addd563959ee54c54d0759b8cc9fa7fefc</w:t>
-      </w:r>
-    </w:p>
-    <w:p>
-      <w:pPr>
-        <w:keepNext/>
-        <w:spacing w:after="0"/>
-      </w:pPr>
-      <w:r>
-        <w:rPr>
-          <w:sz w:val="18"/>
-        </w:rPr>
-        <w:t>DPH.Parse.Resources.pas</w:t>
-      </w:r>
-    </w:p>
-    <w:p>
-      <w:pPr>
-        <w:spacing w:after="20"/>
-      </w:pPr>
-      <w:r>
-        <w:rPr>
-          <w:rFonts w:ascii="Consolas" w:hAnsi="Consolas"/>
-          <w:sz w:val="16"/>
-        </w:rPr>
-        <w:t>f63153edba8656b315956fdd8ccf52e45b1446d8192f9b84c96c153bf676258f</w:t>
-      </w:r>
-    </w:p>
-    <w:p>
-      <w:pPr>
-        <w:keepNext/>
-        <w:spacing w:after="0"/>
-      </w:pPr>
-      <w:r>
-        <w:rPr>
-          <w:sz w:val="18"/>
-        </w:rPr>
-        <w:t>DPH.Project.Analysis.pas</w:t>
-      </w:r>
-    </w:p>
-    <w:p>
-      <w:pPr>
-        <w:spacing w:after="20"/>
-      </w:pPr>
-      <w:r>
-        <w:rPr>
-          <w:rFonts w:ascii="Consolas" w:hAnsi="Consolas"/>
-          <w:sz w:val="16"/>
-        </w:rPr>
-        <w:t>5af3808df19a7c403b456342e45b9e2c8c63195368847b151f3c57ed461b5c2a</w:t>
-      </w:r>
-    </w:p>
-    <w:p>
-      <w:pPr>
-        <w:keepNext/>
-        <w:spacing w:after="0"/>
-      </w:pPr>
-      <w:r>
-        <w:rPr>
-          <w:sz w:val="18"/>
-        </w:rPr>
-        <w:t>DPH.Project.Inventory.pas</w:t>
-      </w:r>
-    </w:p>
-    <w:p>
-      <w:pPr>
-        <w:spacing w:after="20"/>
-      </w:pPr>
-      <w:r>
-        <w:rPr>
-          <w:rFonts w:ascii="Consolas" w:hAnsi="Consolas"/>
-          <w:sz w:val="16"/>
-        </w:rPr>
-        <w:t>061736891f0fab486996ff5d8132af1cf5e25a2f93a74fb3e03ad8fa04e2c266</w:t>
-      </w:r>
-    </w:p>
-    <w:p>
-      <w:pPr>
-        <w:keepNext/>
-        <w:spacing w:after="0"/>
-      </w:pPr>
-      <w:r>
-        <w:rPr>
-          <w:sz w:val="18"/>
-        </w:rPr>
-        <w:t>DPH.Project.Source.pas</w:t>
-      </w:r>
-    </w:p>
-    <w:p>
-      <w:pPr>
-        <w:spacing w:after="20"/>
-      </w:pPr>
-      <w:r>
-        <w:rPr>
-          <w:rFonts w:ascii="Consolas" w:hAnsi="Consolas"/>
-          <w:sz w:val="16"/>
-        </w:rPr>
-        <w:t>8efa444743f0e90831631df963f26a2542561efab63b26f1c5b41fff6b96994e</w:t>
-      </w:r>
-    </w:p>
-    <w:p>
-      <w:pPr>
-        <w:keepNext/>
-        <w:spacing w:after="0"/>
-      </w:pPr>
-      <w:r>
-        <w:rPr>
-          <w:sz w:val="18"/>
-        </w:rPr>
-        <w:t>DPH.Publish.BrowserPolicy.pas</w:t>
-      </w:r>
-    </w:p>
-    <w:p>
-      <w:pPr>
-        <w:spacing w:after="20"/>
-      </w:pPr>
-      <w:r>
-        <w:rPr>
-          <w:rFonts w:ascii="Consolas" w:hAnsi="Consolas"/>
-          <w:sz w:val="16"/>
-        </w:rPr>
-        <w:t>74d2f36c879f1b7b55133241c3e1abc28ce113c4d9f581a5123be83f94d705ce</w:t>
-      </w:r>
-    </w:p>
-    <w:p>
-      <w:pPr>
-        <w:keepNext/>
-        <w:spacing w:after="0"/>
-      </w:pPr>
-      <w:r>
-        <w:rPr>
-          <w:sz w:val="18"/>
-        </w:rPr>
-        <w:t>DPH.Publish.Export.pas</w:t>
-      </w:r>
-    </w:p>
-    <w:p>
-      <w:pPr>
-        <w:spacing w:after="20"/>
-      </w:pPr>
-      <w:r>
-        <w:rPr>
-          <w:rFonts w:ascii="Consolas" w:hAnsi="Consolas"/>
-          <w:sz w:val="16"/>
-        </w:rPr>
-        <w:t>ac49dff7e08016db2f8c720de3bac0749e52de82ccc4e7aa2b328f8032ceebe4</w:t>
-      </w:r>
-    </w:p>
-    <w:p>
-      <w:pPr>
-        <w:keepNext/>
-        <w:spacing w:after="0"/>
-      </w:pPr>
-      <w:r>
-        <w:rPr>
-          <w:sz w:val="18"/>
-        </w:rPr>
-        <w:t>DPH.Publish.Model.pas</w:t>
-      </w:r>
-    </w:p>
-    <w:p>
-      <w:pPr>
-        <w:spacing w:after="20"/>
-      </w:pPr>
-      <w:r>
-        <w:rPr>
-          <w:rFonts w:ascii="Consolas" w:hAnsi="Consolas"/>
-          <w:sz w:val="16"/>
-        </w:rPr>
-        <w:t>7068252c58364ae224e263ecc5fbf83bdb406943979f3ad752f4ca9f877de9d2</w:t>
-      </w:r>
-    </w:p>
-    <w:p>
-      <w:pPr>
-        <w:keepNext/>
-        <w:spacing w:after="0"/>
-      </w:pPr>
-      <w:r>
-        <w:rPr>
-          <w:sz w:val="18"/>
-        </w:rPr>
-        <w:t>DPH.Publish.Translation.pas</w:t>
-      </w:r>
-    </w:p>
-    <w:p>
-      <w:pPr>
-        <w:spacing w:after="20"/>
-      </w:pPr>
-      <w:r>
-        <w:rPr>
-          <w:rFonts w:ascii="Consolas" w:hAnsi="Consolas"/>
-          <w:sz w:val="16"/>
-        </w:rPr>
-        <w:t>978be4250a2332736f73cd4e56e85d5c2f0b0d3a6224a4db2f8f3b7b5f4cde20</w:t>
-      </w:r>
-    </w:p>
-    <w:p>
-      <w:pPr>
-        <w:keepNext/>
-        <w:spacing w:after="0"/>
-      </w:pPr>
-      <w:r>
-        <w:rPr>
-          <w:sz w:val="18"/>
-        </w:rPr>
-        <w:t>DPH.Storage.Backup.pas</w:t>
-      </w:r>
-    </w:p>
-    <w:p>
-      <w:pPr>
-        <w:spacing w:after="20"/>
-      </w:pPr>
-      <w:r>
-        <w:rPr>
-          <w:rFonts w:ascii="Consolas" w:hAnsi="Consolas"/>
-          <w:sz w:val="16"/>
-        </w:rPr>
-        <w:t>78e8c8de8af5120f8ce453793f947c5e2918e51dafc66f9e129c964fe28697bc</w:t>
-      </w:r>
-    </w:p>
-    <w:p>
-      <w:pPr>
-        <w:keepNext/>
-        <w:spacing w:after="0"/>
-      </w:pPr>
-      <w:r>
-        <w:rPr>
-          <w:sz w:val="18"/>
-        </w:rPr>
-        <w:t>DPH.Storage.Database.pas</w:t>
-      </w:r>
-    </w:p>
-    <w:p>
-      <w:pPr>
-        <w:spacing w:after="20"/>
-      </w:pPr>
-      <w:r>
-        <w:rPr>
-          <w:rFonts w:ascii="Consolas" w:hAnsi="Consolas"/>
-          <w:sz w:val="16"/>
-        </w:rPr>
-        <w:t>eef95eb1502ac7aedee4186f29a026074d2d77fb3ca404d81531703c99e290e0</w:t>
-      </w:r>
-    </w:p>
-    <w:p>
-      <w:pPr>
-        <w:keepNext/>
-        <w:spacing w:after="0"/>
-      </w:pPr>
-      <w:r>
-        <w:rPr>
-          <w:sz w:val="18"/>
-        </w:rPr>
-        <w:t>DPH.Storage.Types.pas</w:t>
-      </w:r>
-    </w:p>
-    <w:p>
-      <w:pPr>
-        <w:spacing w:after="20"/>
-      </w:pPr>
-      <w:r>
-        <w:rPr>
-          <w:rFonts w:ascii="Consolas" w:hAnsi="Consolas"/>
-          <w:sz w:val="16"/>
-        </w:rPr>
-        <w:t>1e83ccbe6868979ff9d763a4f2bf4d64691c2b2343de6717391f03e204d5d219</w:t>
-      </w:r>
-    </w:p>
-    <w:p>
-      <w:pPr>
-        <w:keepNext/>
-        <w:spacing w:after="0"/>
-      </w:pPr>
-      <w:r>
-        <w:rPr>
-          <w:sz w:val="18"/>
-        </w:rPr>
-        <w:t>DPH.UI.ActionPurpose.pas</w:t>
-      </w:r>
-    </w:p>
-    <w:p>
-      <w:pPr>
-        <w:spacing w:after="20"/>
-      </w:pPr>
-      <w:r>
-        <w:rPr>
-          <w:rFonts w:ascii="Consolas" w:hAnsi="Consolas"/>
-          <w:sz w:val="16"/>
-        </w:rPr>
-        <w:t>6016874bdc24964ce2371431d77babc68f03a50f045e8d20e222e4989bcbf79d</w:t>
-      </w:r>
-    </w:p>
-    <w:p>
-      <w:pPr>
-        <w:keepNext/>
-        <w:spacing w:after="0"/>
-      </w:pPr>
-      <w:r>
-        <w:rPr>
-          <w:sz w:val="18"/>
-        </w:rPr>
-        <w:t>DPH.UI.ComponentDependency.pas</w:t>
-      </w:r>
-    </w:p>
-    <w:p>
-      <w:pPr>
-        <w:spacing w:after="20"/>
-      </w:pPr>
-      <w:r>
-        <w:rPr>
-          <w:rFonts w:ascii="Consolas" w:hAnsi="Consolas"/>
-          <w:sz w:val="16"/>
-        </w:rPr>
-        <w:t>dc711088afbccd032f4511b9fe3da95b89640b505edb1868ee7b47c7e2a64682</w:t>
-      </w:r>
-    </w:p>
-    <w:p>
-      <w:pPr>
-        <w:keepNext/>
-        <w:spacing w:after="0"/>
-      </w:pPr>
-      <w:r>
-        <w:rPr>
-          <w:sz w:val="18"/>
-        </w:rPr>
-        <w:t>DPH.UI.DatabaseDictionary.pas</w:t>
-      </w:r>
-    </w:p>
-    <w:p>
-      <w:pPr>
-        <w:spacing w:after="20"/>
-      </w:pPr>
-      <w:r>
-        <w:rPr>
-          <w:rFonts w:ascii="Consolas" w:hAnsi="Consolas"/>
-          <w:sz w:val="16"/>
-        </w:rPr>
-        <w:t>c55bc57ac98df6caa84f29c5b775b4915c8afaf3837859f3e197f8b1fffbf90b</w:t>
-      </w:r>
-    </w:p>
-    <w:p>
-      <w:pPr>
-        <w:keepNext/>
-        <w:spacing w:after="0"/>
-      </w:pPr>
-      <w:r>
-        <w:rPr>
-          <w:sz w:val="18"/>
-        </w:rPr>
-        <w:t>DPH.UI.Glossary.pas</w:t>
-      </w:r>
-    </w:p>
-    <w:p>
-      <w:pPr>
-        <w:spacing w:after="20"/>
-      </w:pPr>
-      <w:r>
-        <w:rPr>
-          <w:rFonts w:ascii="Consolas" w:hAnsi="Consolas"/>
-          <w:sz w:val="16"/>
-        </w:rPr>
-        <w:t>fb15295b29a9bbb9caa05cea723e737c81b2418a271f59fb6071dbffe37f8741</w:t>
-      </w:r>
-    </w:p>
-    <w:p>
-      <w:pPr>
-        <w:keepNext/>
-        <w:spacing w:after="0"/>
-      </w:pPr>
-      <w:r>
-        <w:rPr>
-          <w:sz w:val="18"/>
-        </w:rPr>
-        <w:t>DPH.UI.Main.pas</w:t>
-      </w:r>
-    </w:p>
-    <w:p>
-      <w:pPr>
-        <w:spacing w:after="20"/>
-      </w:pPr>
-      <w:r>
-        <w:rPr>
-          <w:rFonts w:ascii="Consolas" w:hAnsi="Consolas"/>
-          <w:sz w:val="16"/>
-        </w:rPr>
-        <w:t>b5cf95129ccd1ff91ecfbb88d31170f9ec2e35a3e34c0dd590854c0f3390a16b</w:t>
-      </w:r>
-    </w:p>
-    <w:p>
-      <w:pPr>
-        <w:keepNext/>
-        <w:spacing w:after="0"/>
-      </w:pPr>
-      <w:r>
-        <w:rPr>
-          <w:sz w:val="18"/>
-        </w:rPr>
-        <w:t>DPH.UI.ProjectProfile.pas</w:t>
-      </w:r>
-    </w:p>
-    <w:p>
-      <w:pPr>
-        <w:spacing w:after="20"/>
-      </w:pPr>
-      <w:r>
-        <w:rPr>
-          <w:rFonts w:ascii="Consolas" w:hAnsi="Consolas"/>
-          <w:sz w:val="16"/>
-        </w:rPr>
-        <w:t>f3fe7ed94987e956999e7449887cd8ca259f009b3d4ac934c1e8e09b8e9fab59</w:t>
-      </w:r>
-    </w:p>
-    <w:p>
-      <w:pPr>
-        <w:keepNext/>
-        <w:spacing w:after="0"/>
-      </w:pPr>
-      <w:r>
-        <w:rPr>
-          <w:sz w:val="18"/>
-        </w:rPr>
-        <w:t>DPH.Workspace.ActionPurposes.pas</w:t>
-      </w:r>
-    </w:p>
-    <w:p>
-      <w:pPr>
-        <w:spacing w:after="20"/>
-      </w:pPr>
-      <w:r>
-        <w:rPr>
-          <w:rFonts w:ascii="Consolas" w:hAnsi="Consolas"/>
-          <w:sz w:val="16"/>
-        </w:rPr>
-        <w:t>e720b935f3d9f38f07348bead5f21c9c9e3ec89ad102f4dae0c6e902c0a101e4</w:t>
-      </w:r>
-    </w:p>
-    <w:p>
-      <w:pPr>
-        <w:keepNext/>
-        <w:spacing w:after="0"/>
-      </w:pPr>
-      <w:r>
-        <w:rPr>
-          <w:sz w:val="18"/>
-        </w:rPr>
-        <w:t>DPH.Workspace.Catalog.pas</w:t>
-      </w:r>
-    </w:p>
-    <w:p>
-      <w:pPr>
-        <w:spacing w:after="20"/>
-      </w:pPr>
-      <w:r>
-        <w:rPr>
-          <w:rFonts w:ascii="Consolas" w:hAnsi="Consolas"/>
-          <w:sz w:val="16"/>
-        </w:rPr>
-        <w:t>5fed34d1919dfd5b34216be36f92fc1764847a65d62112613b2a0e1d44a05940</w:t>
-      </w:r>
-    </w:p>
-    <w:p>
-      <w:pPr>
-        <w:keepNext/>
-        <w:spacing w:after="0"/>
-      </w:pPr>
-      <w:r>
-        <w:rPr>
-          <w:sz w:val="18"/>
-        </w:rPr>
-        <w:t>DPH.Workspace.Commands.pas</w:t>
-      </w:r>
-    </w:p>
-    <w:p>
-      <w:pPr>
-        <w:spacing w:after="20"/>
-      </w:pPr>
-      <w:r>
-        <w:rPr>
-          <w:rFonts w:ascii="Consolas" w:hAnsi="Consolas"/>
-          <w:sz w:val="16"/>
-        </w:rPr>
-        <w:t>9d737351356cf30b1f5bd6d2dee5c514bcafe16c6fcafe24be82b2f06c1a3d28</w:t>
-      </w:r>
-    </w:p>
-    <w:p>
-      <w:pPr>
-        <w:keepNext/>
-        <w:spacing w:after="0"/>
-      </w:pPr>
-      <w:r>
-        <w:rPr>
-          <w:sz w:val="18"/>
-        </w:rPr>
-        <w:t>DPH.Workspace.Comparison.pas</w:t>
-      </w:r>
-    </w:p>
-    <w:p>
-      <w:pPr>
-        <w:spacing w:after="20"/>
-      </w:pPr>
-      <w:r>
-        <w:rPr>
-          <w:rFonts w:ascii="Consolas" w:hAnsi="Consolas"/>
-          <w:sz w:val="16"/>
-        </w:rPr>
-        <w:t>d4953d401b70fbe65b8b9b9fe387431cb7e2c84afc5dab5c9170deafe9ceacce</w:t>
-      </w:r>
-    </w:p>
-    <w:p>
-      <w:pPr>
-        <w:keepNext/>
-        <w:spacing w:after="0"/>
-      </w:pPr>
-      <w:r>
-        <w:rPr>
-          <w:sz w:val="18"/>
-        </w:rPr>
-        <w:t>DPH.Workspace.ComponentDependencies.pas</w:t>
-      </w:r>
-    </w:p>
-    <w:p>
-      <w:pPr>
-        <w:spacing w:after="20"/>
-      </w:pPr>
-      <w:r>
-        <w:rPr>
-          <w:rFonts w:ascii="Consolas" w:hAnsi="Consolas"/>
-          <w:sz w:val="16"/>
-        </w:rPr>
-        <w:t>7d57eb7884d6e521414379a24ce9e64aa2816beca6de650b86828a16fc33af2b</w:t>
-      </w:r>
-    </w:p>
-    <w:p>
-      <w:pPr>
-        <w:keepNext/>
-        <w:spacing w:after="0"/>
-      </w:pPr>
-      <w:r>
-        <w:rPr>
-          <w:sz w:val="18"/>
-        </w:rPr>
-        <w:t>DPH.Workspace.DatabaseConnections.pas</w:t>
-      </w:r>
-    </w:p>
-    <w:p>
-      <w:pPr>
-        <w:spacing w:after="20"/>
-      </w:pPr>
-      <w:r>
-        <w:rPr>
-          <w:rFonts w:ascii="Consolas" w:hAnsi="Consolas"/>
-          <w:sz w:val="16"/>
-        </w:rPr>
-        <w:t>37fecd28b258661a57eb1ff955a2bf1f22757508b3925b98daedc0d6b789e1ce</w:t>
-      </w:r>
-    </w:p>
-    <w:p>
-      <w:pPr>
-        <w:keepNext/>
-        <w:spacing w:after="0"/>
-      </w:pPr>
-      <w:r>
-        <w:rPr>
-          <w:sz w:val="18"/>
-        </w:rPr>
-        <w:t>DPH.Workspace.DatabaseSchema.pas</w:t>
-      </w:r>
-    </w:p>
-    <w:p>
-      <w:pPr>
-        <w:spacing w:after="20"/>
-      </w:pPr>
-      <w:r>
-        <w:rPr>
-          <w:rFonts w:ascii="Consolas" w:hAnsi="Consolas"/>
-          <w:sz w:val="16"/>
-        </w:rPr>
-        <w:t>988548013d7465e7a95b4b1729c0fec5938f5d866afda932bfeab22639160bda</w:t>
-      </w:r>
-    </w:p>
-    <w:p>
-      <w:pPr>
-        <w:keepNext/>
-        <w:spacing w:after="0"/>
-      </w:pPr>
-      <w:r>
-        <w:rPr>
-          <w:sz w:val="18"/>
-        </w:rPr>
-        <w:t>DPH.Workspace.DynamicControls.pas</w:t>
-      </w:r>
-    </w:p>
-    <w:p>
-      <w:pPr>
-        <w:spacing w:after="20"/>
-      </w:pPr>
-      <w:r>
-        <w:rPr>
-          <w:rFonts w:ascii="Consolas" w:hAnsi="Consolas"/>
-          <w:sz w:val="16"/>
-        </w:rPr>
-        <w:t>abd5350eab05058b885b95e0c947a1badd54eba33877cbe9a448cac194db25ed</w:t>
-      </w:r>
-    </w:p>
-    <w:p>
-      <w:pPr>
-        <w:keepNext/>
-        <w:spacing w:after="0"/>
-      </w:pPr>
-      <w:r>
-        <w:rPr>
-          <w:sz w:val="18"/>
-        </w:rPr>
-        <w:t>DPH.Workspace.FormInheritance.pas</w:t>
-      </w:r>
-    </w:p>
-    <w:p>
-      <w:pPr>
-        <w:spacing w:after="20"/>
-      </w:pPr>
-      <w:r>
-        <w:rPr>
-          <w:rFonts w:ascii="Consolas" w:hAnsi="Consolas"/>
-          <w:sz w:val="16"/>
-        </w:rPr>
-        <w:t>b771383670720f9503454dc17f7d5e72ddd986a642fc526bc6aeeab6122129f8</w:t>
-      </w:r>
-    </w:p>
-    <w:p>
-      <w:pPr>
-        <w:keepNext/>
-        <w:spacing w:after="0"/>
-      </w:pPr>
-      <w:r>
-        <w:rPr>
-          <w:sz w:val="18"/>
-        </w:rPr>
-        <w:t>DPH.Workspace.Graphs.pas</w:t>
-      </w:r>
-    </w:p>
-    <w:p>
-      <w:pPr>
-        <w:spacing w:after="20"/>
-      </w:pPr>
-      <w:r>
-        <w:rPr>
-          <w:rFonts w:ascii="Consolas" w:hAnsi="Consolas"/>
-          <w:sz w:val="16"/>
-        </w:rPr>
-        <w:t>1d2985c6fa30e72a7ddb7c55f41a2a774e6e1517d5056507efb2666f18b47804</w:t>
-      </w:r>
-    </w:p>
-    <w:p>
-      <w:pPr>
-        <w:keepNext/>
-        <w:spacing w:after="0"/>
-      </w:pPr>
-      <w:r>
-        <w:rPr>
-          <w:sz w:val="18"/>
-        </w:rPr>
-        <w:t>DPH.Workspace.Keyboard.pas</w:t>
-      </w:r>
-    </w:p>
-    <w:p>
-      <w:pPr>
-        <w:spacing w:after="20"/>
-      </w:pPr>
-      <w:r>
-        <w:rPr>
-          <w:rFonts w:ascii="Consolas" w:hAnsi="Consolas"/>
-          <w:sz w:val="16"/>
-        </w:rPr>
-        <w:t>6e854d724e8360e3d5015d63077744636cf88f33eed5c9fcff175ef01e0f9923</w:t>
-      </w:r>
-    </w:p>
-    <w:p>
-      <w:pPr>
-        <w:keepNext/>
-        <w:spacing w:after="0"/>
-      </w:pPr>
-      <w:r>
-        <w:rPr>
-          <w:sz w:val="18"/>
-        </w:rPr>
-        <w:t>DPH.Workspace.LayoutRules.pas</w:t>
-      </w:r>
-    </w:p>
-    <w:p>
-      <w:pPr>
-        <w:spacing w:after="20"/>
-      </w:pPr>
-      <w:r>
-        <w:rPr>
-          <w:rFonts w:ascii="Consolas" w:hAnsi="Consolas"/>
-          <w:sz w:val="16"/>
-        </w:rPr>
-        <w:t>02dcd1a040fc209a557281fe8150bd40a59291a18a08fa48d5e07065dbac1c49</w:t>
-      </w:r>
-    </w:p>
-    <w:p>
-      <w:pPr>
-        <w:keepNext/>
-        <w:spacing w:after="0"/>
-      </w:pPr>
-      <w:r>
-        <w:rPr>
-          <w:sz w:val="18"/>
-        </w:rPr>
-        <w:t>DPH.Workspace.Model.pas</w:t>
-      </w:r>
-    </w:p>
-    <w:p>
-      <w:pPr>
-        <w:spacing w:after="20"/>
-      </w:pPr>
-      <w:r>
-        <w:rPr>
-          <w:rFonts w:ascii="Consolas" w:hAnsi="Consolas"/>
-          <w:sz w:val="16"/>
-        </w:rPr>
-        <w:t>c478ad86dae6bf66107412e3f6728d31553f28c486798fdb6fc461f72e6333f1</w:t>
-      </w:r>
-    </w:p>
-    <w:p>
-      <w:pPr>
-        <w:keepNext/>
-        <w:spacing w:after="0"/>
-      </w:pPr>
-      <w:r>
-        <w:rPr>
-          <w:sz w:val="18"/>
-        </w:rPr>
-        <w:t>DPH.Workspace.Screen.pas</w:t>
-      </w:r>
-    </w:p>
-    <w:p>
-      <w:pPr>
-        <w:spacing w:after="20"/>
-      </w:pPr>
-      <w:r>
-        <w:rPr>
-          <w:rFonts w:ascii="Consolas" w:hAnsi="Consolas"/>
-          <w:sz w:val="16"/>
-        </w:rPr>
-        <w:t>68305e6ec36664e76d05b8c9af21416dd51a32116d47ea55156977b4c10855de</w:t>
-      </w:r>
-    </w:p>
-    <w:p>
-      <w:pPr>
-        <w:keepNext/>
-        <w:spacing w:after="0"/>
-      </w:pPr>
-      <w:r>
-        <w:rPr>
-          <w:sz w:val="18"/>
-        </w:rPr>
-        <w:t>DPH.Workspace.ScreenHistory.pas</w:t>
-      </w:r>
-    </w:p>
-    <w:p>
-      <w:pPr>
-        <w:spacing w:after="20"/>
-      </w:pPr>
-      <w:r>
-        <w:rPr>
-          <w:rFonts w:ascii="Consolas" w:hAnsi="Consolas"/>
-          <w:sz w:val="16"/>
-        </w:rPr>
-        <w:t>bd05a76dcae7b4c872345021a56eab0b8b0108d954c1a5c35686321852082161</w:t>
-      </w:r>
-    </w:p>
-    <w:p>
-      <w:pPr>
-        <w:keepNext/>
-        <w:spacing w:after="0"/>
-      </w:pPr>
-      <w:r>
-        <w:rPr>
-          <w:sz w:val="18"/>
-        </w:rPr>
-        <w:t>DPH.Workspace.Worker.pas</w:t>
-      </w:r>
-    </w:p>
-    <w:p>
-      <w:pPr>
-        <w:spacing w:after="20"/>
-      </w:pPr>
-      <w:r>
-        <w:rPr>
-          <w:rFonts w:ascii="Consolas" w:hAnsi="Consolas"/>
-          <w:sz w:val="16"/>
-        </w:rPr>
-        <w:t>d6ac3ffff0c50dbcbb98f0813db1ea47769f0fa8e1f2e9418381c6735cc09953</w:t>
-      </w:r>
-    </w:p>
-    <w:p>
-      <w:pPr>
-        <w:keepNext/>
-        <w:spacing w:after="0"/>
-      </w:pPr>
-      <w:r>
-        <w:rPr>
-          <w:sz w:val="18"/>
-        </w:rPr>
-        <w:t>DPH.UI.Main.fmx</w:t>
-      </w:r>
-    </w:p>
-    <w:p>
-      <w:pPr>
-        <w:spacing w:after="20"/>
-      </w:pPr>
-      <w:r>
-        <w:rPr>
-          <w:rFonts w:ascii="Consolas" w:hAnsi="Consolas"/>
-          <w:sz w:val="16"/>
-        </w:rPr>
-        <w:t>3b13700c44c5839710c306d02edf564500731508ee597c7e1cd459f2ca80f03c</w:t>
-      </w:r>
-    </w:p>
-    <w:p>
-      <w:pPr>
-        <w:keepNext/>
-        <w:spacing w:after="0"/>
-      </w:pPr>
-      <w:r>
-        <w:rPr>
-          <w:sz w:val="18"/>
-        </w:rPr>
-        <w:t>DPH.UI.ProjectProfile.fmx</w:t>
-      </w:r>
-    </w:p>
-    <w:p>
-      <w:pPr>
-        <w:spacing w:after="20"/>
-      </w:pPr>
-      <w:r>
-        <w:rPr>
-          <w:rFonts w:ascii="Consolas" w:hAnsi="Consolas"/>
-          <w:sz w:val="16"/>
-        </w:rPr>
-        <w:t>62e7fef97972fdb29f1a878e70a99d8284b6f7d8cfbddb9f625bb535728c2142</w:t>
-      </w:r>
-    </w:p>
-    <w:p>
-      <w:pPr>
-        <w:keepNext/>
-        <w:spacing w:after="0"/>
-      </w:pPr>
-      <w:r>
-        <w:rPr>
-          <w:sz w:val="18"/>
-        </w:rPr>
-        <w:t>DPH.UI.Glossary.fmx</w:t>
-      </w:r>
-    </w:p>
-    <w:p>
-      <w:pPr>
-        <w:spacing w:after="20"/>
-      </w:pPr>
-      <w:r>
-        <w:rPr>
-          <w:rFonts w:ascii="Consolas" w:hAnsi="Consolas"/>
-          <w:sz w:val="16"/>
-        </w:rPr>
-        <w:t>3334c41ac643daa3596f1a5c9cb8fb65c3447daf77cf00006d6a0ca7a9d517d5</w:t>
-      </w:r>
-    </w:p>
-    <w:p>
-      <w:pPr>
-        <w:keepNext/>
-        <w:spacing w:after="0"/>
-      </w:pPr>
-      <w:r>
-        <w:rPr>
-          <w:sz w:val="18"/>
-        </w:rPr>
-        <w:t>DPH.UI.ComponentDependency.fmx</w:t>
-      </w:r>
-    </w:p>
-    <w:p>
-      <w:pPr>
-        <w:spacing w:after="20"/>
-      </w:pPr>
-      <w:r>
-        <w:rPr>
-          <w:rFonts w:ascii="Consolas" w:hAnsi="Consolas"/>
-          <w:sz w:val="16"/>
-        </w:rPr>
-        <w:t>3b604fcf033e37ebda4aa6968e1a9e6ffe11bf40416fac5fbdd39fa2599d7862</w:t>
-      </w:r>
-    </w:p>
-    <w:p>
-      <w:pPr>
-        <w:keepNext/>
-        <w:spacing w:after="0"/>
-      </w:pPr>
-      <w:r>
-        <w:rPr>
-          <w:sz w:val="18"/>
-        </w:rPr>
-        <w:t>DPH.UI.ActionPurpose.fmx</w:t>
-      </w:r>
-    </w:p>
-    <w:p>
-      <w:pPr>
-        <w:spacing w:after="20"/>
-      </w:pPr>
-      <w:r>
-        <w:rPr>
-          <w:rFonts w:ascii="Consolas" w:hAnsi="Consolas"/>
-          <w:sz w:val="16"/>
-        </w:rPr>
-        <w:t>9eb57da0310277432db54c9a80d8d03be09aa6163acd8895f04fa21f176f8e15</w:t>
-      </w:r>
-    </w:p>
-    <w:p>
-      <w:pPr>
-        <w:keepNext/>
-        <w:spacing w:after="0"/>
-      </w:pPr>
-      <w:r>
-        <w:rPr>
-          <w:sz w:val="18"/>
-        </w:rPr>
-        <w:t>DPH.UI.DatabaseDictionary.fmx</w:t>
-      </w:r>
-    </w:p>
-    <w:p>
-      <w:pPr>
-        <w:spacing w:after="20"/>
-      </w:pPr>
-      <w:r>
-        <w:rPr>
-          <w:rFonts w:ascii="Consolas" w:hAnsi="Consolas"/>
-          <w:sz w:val="16"/>
-        </w:rPr>
-        <w:t>5b40f12073d093c4e0b7f708440dd125662dc8e76a0b3c3bf30a4c749c69484e</w:t>
-      </w:r>
-    </w:p>
-    <w:p>
-      <w:pPr>
-        <w:keepNext/>
-        <w:spacing w:after="0"/>
-      </w:pPr>
-      <w:r>
-        <w:rPr>
-          <w:sz w:val="18"/>
-        </w:rPr>
-        <w:t>DelphiProjectHandoff.dpr</w:t>
-      </w:r>
-    </w:p>
-    <w:p>
-      <w:pPr>
-        <w:spacing w:after="20"/>
-      </w:pPr>
-      <w:r>
-        <w:rPr>
-          <w:rFonts w:ascii="Consolas" w:hAnsi="Consolas"/>
-          <w:sz w:val="16"/>
-        </w:rPr>
-        <w:t>2b922d5561c2ab3e2b65590583f646e29fc12c8b5c36a08fe401a6ebed90d3f9</w:t>
-      </w:r>
-    </w:p>
-    <w:p>
-      <w:pPr>
-        <w:keepNext/>
-        <w:spacing w:after="0"/>
-      </w:pPr>
-      <w:r>
-        <w:rPr>
-          <w:sz w:val="18"/>
-        </w:rPr>
-        <w:t>DelphiProjectHandoff.dproj</w:t>
-      </w:r>
-    </w:p>
-    <w:p>
-      <w:pPr>
-        <w:spacing w:after="20"/>
-      </w:pPr>
-      <w:r>
-        <w:rPr>
-          <w:rFonts w:ascii="Consolas" w:hAnsi="Consolas"/>
-          <w:sz w:val="16"/>
-        </w:rPr>
-        <w:t>fc131b87384bc80f6d391db9c015b7aaa41c098ff8b96d53abfcdb67ced18e8d</w:t>
+        <w:t>Update instructions from serialized controls, source and observed behavior. Use real screenshots with clear example captions. Remove obsolete names and personal paths. Refresh the contents and PDF, inspect every page and package only current guides. Keep requirement audits and test history separate from end-user instruction.</w:t>
       </w:r>
     </w:p>
     <w:sectPr>
       <w:footerReference w:type="default" ns2:id="rId9"/>
       <w:pgSz w:w="12240" w:h="15840"/>
-      <w:pgMar w:top="1152" w:right="1224" w:bottom="1152" w:left="1224" w:header="720" w:footer="720" w:gutter="0"/>
+      <w:pgMar w:top="1080" w:right="1152" w:bottom="1080" w:left="1152" w:header="720" w:footer="720" w:gutter="0"/>
       <w:cols w:space="720"/>
       <w:docGrid w:linePitch="360"/>
     </w:sectPr>
@@ -4392,7 +809,7 @@
       <w:pStyle w:val="Footer"/>
     </w:pPr>
     <w:r>
-      <w:t xml:space="preserve">DPH experimental software    </w:t>
+      <w:t xml:space="preserve">Delphi Project Handoff    </w:t>
     </w:r>
     <w:r>
       <w:fldChar w:fldCharType="begin"/>
@@ -4775,7 +1192,7 @@
     <w:qFormat/>
     <w:rsid w:val="00FC693F"/>
     <w:pPr>
-      <w:spacing w:after="140" w:line="264" w:lineRule="auto"/>
+      <w:spacing w:after="140" w:line="259" w:lineRule="auto"/>
     </w:pPr>
     <w:rPr>
       <w:rFonts w:ascii="Calibri" w:hAnsi="Calibri"/>
@@ -4838,7 +1255,7 @@
     <w:pPr>
       <w:keepNext/>
       <w:keepLines/>
-      <w:spacing w:before="300" w:after="0"/>
+      <w:spacing w:before="240" w:after="0"/>
       <w:outlineLvl w:val="0"/>
     </w:pPr>
     <w:rPr>
@@ -4846,7 +1263,7 @@
       <w:b/>
       <w:bCs/>
       <w:color w:val="000000"/>
-      <w:sz w:val="32"/>
+      <w:sz w:val="38"/>
       <w:szCs w:val="28"/>
     </w:rPr>
   </w:style>
@@ -4862,7 +1279,7 @@
     <w:pPr>
       <w:keepNext/>
       <w:keepLines/>
-      <w:spacing w:before="200" w:after="0"/>
+      <w:spacing w:before="240" w:after="0"/>
       <w:outlineLvl w:val="1"/>
     </w:pPr>
     <w:rPr>
@@ -5132,7 +1549,7 @@
       <w:color w:val="000000"/>
       <w:spacing w:val="5"/>
       <w:kern w:val="28"/>
-      <w:sz w:val="52"/>
+      <w:sz w:val="60"/>
       <w:szCs w:val="52"/>
     </w:rPr>
   </w:style>
@@ -5170,7 +1587,7 @@
       <w:iCs/>
       <w:color w:val="000000"/>
       <w:spacing w:val="15"/>
-      <w:sz w:val="24"/>
+      <w:sz w:val="28"/>
       <w:szCs w:val="24"/>
     </w:rPr>
   </w:style>
@@ -5570,10 +1987,11 @@
       <w:spacing w:line="240" w:lineRule="auto"/>
     </w:pPr>
     <w:rPr>
+      <w:rFonts w:ascii="Calibri" w:hAnsi="Calibri"/>
       <w:b/>
       <w:bCs/>
-      <w:color w:val="4F81BD" w:themeColor="accent1"/>
-      <w:sz w:val="18"/>
+      <w:color w:val="000000"/>
+      <w:sz w:val="20"/>
       <w:szCs w:val="18"/>
     </w:rPr>
   </w:style>

</xml_diff>

<commit_message>
Complete beginner learning paths, teaching library, picture callouts and practice lessons
</commit_message>
<xml_diff>
--- a/docs/guides/DPH_Engineering_Guide.docx
+++ b/docs/guides/DPH_Engineering_Guide.docx
@@ -227,6 +227,24 @@
         <w:pStyle w:val="Heading2"/>
       </w:pPr>
       <w:r>
+        <w:t>Maintain the supplied practice lessons</w:t>
+      </w:r>
+    </w:p>
+    <w:p>
+      <w:r>
+        <w:t>samples\OrderPractice contains a deliberately small FMX application and its prepared lessons. Try practice example reads this source and imports the packaged nineteen attributed records into its own database. It never runs the example. The first import checks every declared source and picture hash and resolves each requested source link to exactly one captured object. Reopening uses the saved database and preserves edited lessons.</w:t>
+      </w:r>
+    </w:p>
+    <w:p>
+      <w:r>
+        <w:t>DPH.Tests.OrderSample validates the example calculation and captures the actual native form. DPH.Tests.Practice exercises the beginner route through DPH, the four ordered tasks, fourteen explanations, two images, source links, progress and shared edition. Only the designated sample test runs sample code; passive discovery remains read-only.</w:t>
+      </w:r>
+    </w:p>
+    <w:p>
+      <w:pPr>
+        <w:pStyle w:val="Heading2"/>
+      </w:pPr>
+      <w:r>
         <w:t>Data route</w:t>
       </w:r>
     </w:p>
@@ -273,6 +291,16 @@
     <w:p>
       <w:r>
         <w:t>SaveKnowledge uses expected revision values to prevent stale editors overwriting newer content. Edits and reviews create immutable history. learning_lesson records have a stable identity, six named fields and ordered action/expected_result steps. Storage validates their canonical body, contributor, scope and identity. Legacy free text retains its original instructions.</w:t>
+      </w:r>
+    </w:p>
+    <w:p>
+      <w:r>
+        <w:t>A lesson may include a learning object with role, path and integer order. The native reader filters by role/path and sorts the prepared sequence. Personal checked-step progress lives in the separate workspace catalog, keyed by database, learner, lesson identity and exact authored revision. A new instruction revision cannot inherit completion.</w:t>
+      </w:r>
+    </w:p>
+    <w:p>
+      <w:r>
+        <w:t>learning_card records contain a stable card identity, a teaching category and seven named fields. A canonical body agrees with those fields. Optional picture metadata identifies a previously imported image and a point normalized from 0 to 10000 on each axis. Save rejects nonexistent project pictures and out-of-bounds points. Native and HTML overlays preserve the original PNG bytes.</w:t>
       </w:r>
     </w:p>
     <w:p>
@@ -329,6 +357,11 @@
       </w:r>
     </w:p>
     <w:p>
+      <w:r>
+        <w:t>CardLibraryTab reads and searches teaching explanations; CardEditorTab edits their seven instructional fields. Save explanation persists a complete record through the same worker. ScreenshotMarkers draws numbered callouts using the serialized marker style. TaskContextExpander keeps prerequisites available while leaving room for the current action and result in a compact window.</w:t>
+      </w:r>
+    </w:p>
+    <w:p>
       <w:pPr>
         <w:pStyle w:val="Heading2"/>
       </w:pPr>
@@ -373,6 +406,7 @@
     </w:p>
     <w:p>
       <w:pPr>
+        <w:keepNext/>
         <w:ind w:left="259" w:hanging="259"/>
       </w:pPr>
       <w:r>
@@ -387,6 +421,7 @@
     </w:p>
     <w:p>
       <w:pPr>
+        <w:keepNext/>
         <w:ind w:left="259" w:hanging="259"/>
       </w:pPr>
       <w:r>
@@ -401,6 +436,7 @@
     </w:p>
     <w:p>
       <w:pPr>
+        <w:keepNext/>
         <w:ind w:left="259" w:hanging="259"/>
       </w:pPr>
       <w:r>
@@ -415,6 +451,7 @@
     </w:p>
     <w:p>
       <w:pPr>
+        <w:keepNext/>
         <w:ind w:left="259" w:hanging="259"/>
       </w:pPr>
       <w:r>
@@ -429,6 +466,7 @@
     </w:p>
     <w:p>
       <w:pPr>
+        <w:keepNext w:val="0"/>
         <w:ind w:left="259" w:hanging="259"/>
       </w:pPr>
       <w:r>
@@ -478,6 +516,7 @@
     </w:p>
     <w:p>
       <w:pPr>
+        <w:keepNext/>
         <w:ind w:left="259" w:hanging="259"/>
       </w:pPr>
       <w:r>
@@ -492,6 +531,7 @@
     </w:p>
     <w:p>
       <w:pPr>
+        <w:keepNext/>
         <w:ind w:left="259" w:hanging="259"/>
       </w:pPr>
       <w:r>
@@ -506,6 +546,7 @@
     </w:p>
     <w:p>
       <w:pPr>
+        <w:keepNext/>
         <w:ind w:left="259" w:hanging="259"/>
       </w:pPr>
       <w:r>
@@ -520,6 +561,7 @@
     </w:p>
     <w:p>
       <w:pPr>
+        <w:keepNext/>
         <w:ind w:left="259" w:hanging="259"/>
       </w:pPr>
       <w:r>
@@ -534,6 +576,7 @@
     </w:p>
     <w:p>
       <w:pPr>
+        <w:keepNext w:val="0"/>
         <w:ind w:left="259" w:hanging="259"/>
       </w:pPr>
       <w:r>
@@ -591,11 +634,12 @@
     </w:p>
     <w:p>
       <w:r>
-        <w:t>The package needs DelphiProjectHandoff.exe, WebView2Loader.dll, migrations, help, current guides and Databases instructions. DPH.ValidateHandoff.exe is an included technical validation tool. Microsoft WebView2 Runtime is a system prerequisite separate from its loader DLL.</w:t>
+        <w:t>The package needs DelphiProjectHandoff.exe, WebView2Loader.dll, migrations, help, current guides, Databases instructions and samples\OrderPractice with its lesson pack and pictures. DPH.ValidateHandoff.exe is an included technical validation tool. Microsoft WebView2 Runtime is a system prerequisite separate from its loader DLL.</w:t>
       </w:r>
     </w:p>
     <w:p>
       <w:pPr>
+        <w:keepNext/>
         <w:ind w:left="259" w:hanging="259"/>
       </w:pPr>
       <w:r>
@@ -610,6 +654,7 @@
     </w:p>
     <w:p>
       <w:pPr>
+        <w:keepNext/>
         <w:ind w:left="259" w:hanging="259"/>
       </w:pPr>
       <w:r>
@@ -624,6 +669,7 @@
     </w:p>
     <w:p>
       <w:pPr>
+        <w:keepNext/>
         <w:ind w:left="259" w:hanging="259"/>
       </w:pPr>
       <w:r>
@@ -638,6 +684,7 @@
     </w:p>
     <w:p>
       <w:pPr>
+        <w:keepNext/>
         <w:ind w:left="259" w:hanging="259"/>
       </w:pPr>
       <w:r>
@@ -652,6 +699,7 @@
     </w:p>
     <w:p>
       <w:pPr>
+        <w:keepNext w:val="0"/>
         <w:ind w:left="259" w:hanging="259"/>
       </w:pPr>
       <w:r>

</xml_diff>

<commit_message>
Revise professional DPH user and engineering manuals
</commit_message>
<xml_diff>
--- a/docs/guides/DPH_Engineering_Guide.docx
+++ b/docs/guides/DPH_Engineering_Guide.docx
@@ -15,12 +15,12 @@
         <w:pStyle w:val="Subtitle"/>
       </w:pPr>
       <w:r>
-        <w:t>Detailed Windows desktop manual</w:t>
-      </w:r>
-    </w:p>
-    <w:p>
-      <w:r>
-        <w:t>Guide edition 42</w:t>
+        <w:t>Architecture, data contracts, validation and maintenance</w:t>
+      </w:r>
+    </w:p>
+    <w:p>
+      <w:r>
+        <w:t>Guide edition 43</w:t>
       </w:r>
     </w:p>
     <w:p>
@@ -30,7 +30,7 @@
     </w:p>
     <w:p>
       <w:r>
-        <w:t>From architecture and data ownership to source analysis storage testing and release</w:t>
+        <w:t>From architecture and data ownership to source analysis, storage, testing and release</w:t>
       </w:r>
     </w:p>
     <w:p>
@@ -75,7 +75,7 @@
         </w:tabs>
       </w:pPr>
       <w:r>
-        <w:t>Part I Product contracts and architecture</w:t>
+        <w:t>PART 1: Product contracts and architecture</w:t>
       </w:r>
       <w:r>
         <w:tab/>
@@ -90,7 +90,7 @@
         </w:tabs>
       </w:pPr>
       <w:r>
-        <w:t>1 Engineering purpose and reading map</w:t>
+        <w:t>1. Engineering purpose and reading map</w:t>
       </w:r>
       <w:r>
         <w:tab/>
@@ -105,7 +105,7 @@
         </w:tabs>
       </w:pPr>
       <w:r>
-        <w:t>2 System boundaries and design rules</w:t>
+        <w:t>2. System boundaries and design rules</w:t>
       </w:r>
       <w:r>
         <w:tab/>
@@ -120,7 +120,7 @@
         </w:tabs>
       </w:pPr>
       <w:r>
-        <w:t>3 Layer and responsibility map</w:t>
+        <w:t>3. Layer and responsibility map</w:t>
       </w:r>
       <w:r>
         <w:tab/>
@@ -135,7 +135,7 @@
         </w:tabs>
       </w:pPr>
       <w:r>
-        <w:t>4 Startup and application lifecycle</w:t>
+        <w:t>4. Startup and application lifecycle</w:t>
       </w:r>
       <w:r>
         <w:tab/>
@@ -150,7 +150,7 @@
         </w:tabs>
       </w:pPr>
       <w:r>
-        <w:t>5 Background request and response protocol</w:t>
+        <w:t>5. Background request and response protocol</w:t>
       </w:r>
       <w:r>
         <w:tab/>
@@ -165,7 +165,7 @@
         </w:tabs>
       </w:pPr>
       <w:r>
-        <w:t>6 End to end flows an engineer must preserve</w:t>
+        <w:t>6. End-to-end flows an engineer must preserve</w:t>
       </w:r>
       <w:r>
         <w:tab/>
@@ -180,11 +180,11 @@
         </w:tabs>
       </w:pPr>
       <w:r>
-        <w:t>Part II Source acquisition syntax and semantics</w:t>
+        <w:t>PART 2: Source acquisition, syntax, and semantics</w:t>
       </w:r>
       <w:r>
         <w:tab/>
-        <w:t>10</w:t>
+        <w:t>9</w:t>
       </w:r>
     </w:p>
     <w:p>
@@ -195,11 +195,11 @@
         </w:tabs>
       </w:pPr>
       <w:r>
-        <w:t>7 Source bytes ranges and safe acquisition</w:t>
+        <w:t>7. Source bytes, ranges, and safe acquisition</w:t>
       </w:r>
       <w:r>
         <w:tab/>
-        <w:t>10</w:t>
+        <w:t>9</w:t>
       </w:r>
     </w:p>
     <w:p>
@@ -210,11 +210,11 @@
         </w:tabs>
       </w:pPr>
       <w:r>
-        <w:t>8 Project inventory and reading configuration</w:t>
+        <w:t>8. Project inventory and reading configuration</w:t>
       </w:r>
       <w:r>
         <w:tab/>
-        <w:t>11</w:t>
+        <w:t>10</w:t>
       </w:r>
     </w:p>
     <w:p>
@@ -225,11 +225,11 @@
         </w:tabs>
       </w:pPr>
       <w:r>
-        <w:t>9 Lexer preprocessing and intermediate representation</w:t>
+        <w:t>9. Lexer, preprocessing, and intermediate representation</w:t>
       </w:r>
       <w:r>
         <w:tab/>
-        <w:t>12</w:t>
+        <w:t>11</w:t>
       </w:r>
     </w:p>
     <w:p>
@@ -240,7 +240,7 @@
         </w:tabs>
       </w:pPr>
       <w:r>
-        <w:t>10 Pascal forms and resource parsing</w:t>
+        <w:t>10. Pascal, forms, and resource parsing</w:t>
       </w:r>
       <w:r>
         <w:tab/>
@@ -255,7 +255,7 @@
         </w:tabs>
       </w:pPr>
       <w:r>
-        <w:t>11 Symbols resolution control flow and focused analyses</w:t>
+        <w:t>11. Symbols, resolution, control flow, and focused analyses</w:t>
       </w:r>
       <w:r>
         <w:tab/>
@@ -270,11 +270,11 @@
         </w:tabs>
       </w:pPr>
       <w:r>
-        <w:t>Part III Persistence authored knowledge and native presentation</w:t>
+        <w:t>PART 3: Persistence, authored knowledge, and native presentation</w:t>
       </w:r>
       <w:r>
         <w:tab/>
-        <w:t>15</w:t>
+        <w:t>14</w:t>
       </w:r>
     </w:p>
     <w:p>
@@ -285,11 +285,11 @@
         </w:tabs>
       </w:pPr>
       <w:r>
-        <w:t>12 SQLite store ownership migrations and transactions</w:t>
+        <w:t>12. SQLite store ownership, migrations, and transactions</w:t>
       </w:r>
       <w:r>
         <w:tab/>
-        <w:t>15</w:t>
+        <w:t>14</w:t>
       </w:r>
     </w:p>
     <w:p>
@@ -300,11 +300,11 @@
         </w:tabs>
       </w:pPr>
       <w:r>
-        <w:t>13 Generations source identity and cached views</w:t>
+        <w:t>13. Generations, source identity, and cached views</w:t>
       </w:r>
       <w:r>
         <w:tab/>
-        <w:t>16</w:t>
+        <w:t>15</w:t>
       </w:r>
     </w:p>
     <w:p>
@@ -315,11 +315,11 @@
         </w:tabs>
       </w:pPr>
       <w:r>
-        <w:t>14 Authored revisions links and review state</w:t>
+        <w:t>14. Authored revisions, links, and review state</w:t>
       </w:r>
       <w:r>
         <w:tab/>
-        <w:t>17</w:t>
+        <w:t>16</w:t>
       </w:r>
     </w:p>
     <w:p>
@@ -330,11 +330,11 @@
         </w:tabs>
       </w:pPr>
       <w:r>
-        <w:t>15 Structured tasks teaching cards and personal progress</w:t>
+        <w:t>15. Structured tasks, teaching cards, and personal progress</w:t>
       </w:r>
       <w:r>
         <w:tab/>
-        <w:t>18</w:t>
+        <w:t>17</w:t>
       </w:r>
     </w:p>
     <w:p>
@@ -345,11 +345,11 @@
         </w:tabs>
       </w:pPr>
       <w:r>
-        <w:t>16 Pictures artifacts and anchored callouts</w:t>
+        <w:t>16. Pictures, artifacts, and anchored callouts</w:t>
       </w:r>
       <w:r>
         <w:tab/>
-        <w:t>20</w:t>
+        <w:t>19</w:t>
       </w:r>
     </w:p>
     <w:p>
@@ -360,11 +360,11 @@
         </w:tabs>
       </w:pPr>
       <w:r>
-        <w:t>17 Learner projections and native binding</w:t>
+        <w:t>17. Learner projections and native binding</w:t>
       </w:r>
       <w:r>
         <w:tab/>
-        <w:t>21</w:t>
+        <w:t>20</w:t>
       </w:r>
     </w:p>
     <w:p>
@@ -375,11 +375,11 @@
         </w:tabs>
       </w:pPr>
       <w:r>
-        <w:t>Part IV Publication search and operational safety</w:t>
+        <w:t>PART 4: Publication, search, and operational safety</w:t>
       </w:r>
       <w:r>
         <w:tab/>
-        <w:t>23</w:t>
+        <w:t>21</w:t>
       </w:r>
     </w:p>
     <w:p>
@@ -390,11 +390,11 @@
         </w:tabs>
       </w:pPr>
       <w:r>
-        <w:t>18 Publication model and export contract</w:t>
+        <w:t>18. Publication model and export contract</w:t>
       </w:r>
       <w:r>
         <w:tab/>
-        <w:t>23</w:t>
+        <w:t>21</w:t>
       </w:r>
     </w:p>
     <w:p>
@@ -405,11 +405,11 @@
         </w:tabs>
       </w:pPr>
       <w:r>
-        <w:t>19 Search browser navigation and supporting integrations</w:t>
+        <w:t>19. Search, browser navigation, and supporting integrations</w:t>
       </w:r>
       <w:r>
         <w:tab/>
-        <w:t>24</w:t>
+        <w:t>23</w:t>
       </w:r>
     </w:p>
     <w:p>
@@ -420,11 +420,11 @@
         </w:tabs>
       </w:pPr>
       <w:r>
-        <w:t>Part V Build test diagnose and release</w:t>
+        <w:t>PART 5: Building, testing, diagnosis, and release</w:t>
       </w:r>
       <w:r>
         <w:tab/>
-        <w:t>26</w:t>
+        <w:t>24</w:t>
       </w:r>
     </w:p>
     <w:p>
@@ -435,11 +435,11 @@
         </w:tabs>
       </w:pPr>
       <w:r>
-        <w:t>20 Build environment and source layout</w:t>
+        <w:t>20. Build environment and source layout</w:t>
       </w:r>
       <w:r>
         <w:tab/>
-        <w:t>26</w:t>
+        <w:t>24</w:t>
       </w:r>
     </w:p>
     <w:p>
@@ -450,11 +450,11 @@
         </w:tabs>
       </w:pPr>
       <w:r>
-        <w:t>21 Meaningful test selection and execution</w:t>
+        <w:t>21. Meaningful test selection and execution</w:t>
       </w:r>
       <w:r>
         <w:tab/>
-        <w:t>27</w:t>
+        <w:t>25</w:t>
       </w:r>
     </w:p>
     <w:p>
@@ -465,11 +465,11 @@
         </w:tabs>
       </w:pPr>
       <w:r>
-        <w:t>22 Package deploy and verify extracted copies</w:t>
+        <w:t>22. Package, deploy, and verify extracted copies</w:t>
       </w:r>
       <w:r>
         <w:tab/>
-        <w:t>28</w:t>
+        <w:t>26</w:t>
       </w:r>
     </w:p>
     <w:p>
@@ -480,11 +480,11 @@
         </w:tabs>
       </w:pPr>
       <w:r>
-        <w:t>23 Diagnose failures at their owning layer</w:t>
+        <w:t>23. Diagnose failures at their owning layer</w:t>
       </w:r>
       <w:r>
         <w:tab/>
-        <w:t>30</w:t>
+        <w:t>28</w:t>
       </w:r>
     </w:p>
     <w:p>
@@ -495,11 +495,11 @@
         </w:tabs>
       </w:pPr>
       <w:r>
-        <w:t>24 Maintain documentation as an engineering artifact</w:t>
+        <w:t>24. Maintain documentation as an engineering artifact</w:t>
       </w:r>
       <w:r>
         <w:tab/>
-        <w:t>31</w:t>
+        <w:t>29</w:t>
       </w:r>
     </w:p>
     <w:p>
@@ -510,11 +510,11 @@
         </w:tabs>
       </w:pPr>
       <w:r>
-        <w:t>Part VI Technical reference</w:t>
+        <w:t>PART 6: Technical reference</w:t>
       </w:r>
       <w:r>
         <w:tab/>
-        <w:t>33</w:t>
+        <w:t>30</w:t>
       </w:r>
     </w:p>
     <w:p>
@@ -525,11 +525,11 @@
         </w:tabs>
       </w:pPr>
       <w:r>
-        <w:t>25 Source units and public contracts</w:t>
+        <w:t>25. Source units and public contracts</w:t>
       </w:r>
       <w:r>
         <w:tab/>
-        <w:t>33</w:t>
+        <w:t>30</w:t>
       </w:r>
     </w:p>
     <w:p>
@@ -540,11 +540,11 @@
         </w:tabs>
       </w:pPr>
       <w:r>
-        <w:t>26 Persisted schema and migration reference</w:t>
+        <w:t>26. Persisted schema and migration reference</w:t>
       </w:r>
       <w:r>
         <w:tab/>
-        <w:t>51</w:t>
+        <w:t>48</w:t>
       </w:r>
     </w:p>
     <w:p>
@@ -555,11 +555,11 @@
         </w:tabs>
       </w:pPr>
       <w:r>
-        <w:t>27 Engineering change and release checklists</w:t>
+        <w:t>27. Engineering change and release checklists</w:t>
       </w:r>
       <w:r>
         <w:tab/>
-        <w:t>58</w:t>
+        <w:t>56</w:t>
       </w:r>
     </w:p>
     <w:p>
@@ -571,9 +571,10 @@
       <w:pPr>
         <w:pStyle w:val="Heading1"/>
         <w:pageBreakBefore/>
-      </w:pPr>
-      <w:r>
-        <w:t>Part I Product contracts and architecture</w:t>
+        <w:spacing w:before="480"/>
+      </w:pPr>
+      <w:r>
+        <w:t>PART 1: Product contracts and architecture</w:t>
       </w:r>
     </w:p>
     <w:p>
@@ -583,7 +584,7 @@
         <w:spacing w:before="260"/>
       </w:pPr>
       <w:r>
-        <w:t>1 Engineering purpose and reading map</w:t>
+        <w:t>1. Engineering purpose and reading map</w:t>
       </w:r>
     </w:p>
     <w:p>
@@ -591,7 +592,7 @@
         <w:pStyle w:val="Heading3"/>
       </w:pPr>
       <w:r>
-        <w:t>1.1 The system being maintained</w:t>
+        <w:t>1.1. The system being maintained</w:t>
       </w:r>
     </w:p>
     <w:p>
@@ -614,7 +615,7 @@
         <w:pStyle w:val="Heading3"/>
       </w:pPr>
       <w:r>
-        <w:t>1.2 Three independent kinds of truth</w:t>
+        <w:t>1.2. Three independent kinds of truth</w:t>
       </w:r>
     </w:p>
     <w:p>
@@ -632,7 +633,7 @@
         <w:pStyle w:val="Heading3"/>
       </w:pPr>
       <w:r>
-        <w:t>1.3 How to use the technical references</w:t>
+        <w:t>1.3. How to use the technical references</w:t>
       </w:r>
     </w:p>
     <w:p>
@@ -652,7 +653,7 @@
         <w:spacing w:before="440"/>
       </w:pPr>
       <w:r>
-        <w:t>2 System boundaries and design rules</w:t>
+        <w:t>2. System boundaries and design rules</w:t>
       </w:r>
     </w:p>
     <w:p>
@@ -660,7 +661,7 @@
         <w:pStyle w:val="Heading3"/>
       </w:pPr>
       <w:r>
-        <w:t>2.1 Inputs outputs and side effects</w:t>
+        <w:t>2.1. Inputs outputs and side effects</w:t>
       </w:r>
     </w:p>
     <w:p>
@@ -675,7 +676,7 @@
     </w:p>
     <w:p>
       <w:r>
-        <w:t>The selected target is not compiled or run during ordinary analysis. DPH's own test programs and designated practice sample may be executed as explicit development validation. Keep those operations separate from claims about an arbitrary target application's runtime behavior.</w:t>
+        <w:t>The selected target is not compiled or run during ordinary analysis. DPH's own test programs and developer fixtures may be executed as explicit development validation. Keep those operations separate from claims about an arbitrary target application's runtime behavior.</w:t>
       </w:r>
     </w:p>
     <w:p>
@@ -683,7 +684,7 @@
         <w:pStyle w:val="Heading3"/>
       </w:pPr>
       <w:r>
-        <w:t>2.2 Native forms are serialized assets</w:t>
+        <w:t>2.2. Native forms are serialized assets</w:t>
       </w:r>
     </w:p>
     <w:p>
@@ -701,7 +702,7 @@
         <w:pStyle w:val="Heading3"/>
       </w:pPr>
       <w:r>
-        <w:t>2.3 Local storage is not a target business database</w:t>
+        <w:t>2.3. Local storage is not a target business database</w:t>
       </w:r>
     </w:p>
     <w:p>
@@ -719,7 +720,7 @@
         <w:pStyle w:val="Heading3"/>
       </w:pPr>
       <w:r>
-        <w:t>2.4 Scope and evidence limits</w:t>
+        <w:t>2.4. Scope and evidence limits</w:t>
       </w:r>
     </w:p>
     <w:p>
@@ -739,7 +740,7 @@
         <w:spacing w:before="440"/>
       </w:pPr>
       <w:r>
-        <w:t>3 Layer and responsibility map</w:t>
+        <w:t>3. Layer and responsibility map</w:t>
       </w:r>
     </w:p>
     <w:p>
@@ -747,7 +748,7 @@
         <w:pStyle w:val="Heading3"/>
       </w:pPr>
       <w:r>
-        <w:t>3.1 Acquisition and syntax layers</w:t>
+        <w:t>3.1. Acquisition and syntax layers</w:t>
       </w:r>
     </w:p>
     <w:p>
@@ -765,7 +766,7 @@
         <w:pStyle w:val="Heading3"/>
       </w:pPr>
       <w:r>
-        <w:t>3.2 Semantic and projection layers</w:t>
+        <w:t>3.2. Semantic and projection layers</w:t>
       </w:r>
     </w:p>
     <w:p>
@@ -783,7 +784,7 @@
         <w:pStyle w:val="Heading3"/>
       </w:pPr>
       <w:r>
-        <w:t>3.3 Storage orchestration and presentation</w:t>
+        <w:t>3.3. Storage orchestration and presentation</w:t>
       </w:r>
     </w:p>
     <w:p>
@@ -801,7 +802,7 @@
         <w:pStyle w:val="Heading3"/>
       </w:pPr>
       <w:r>
-        <w:t>3.4 A responsibility test for a proposed change</w:t>
+        <w:t>3.4. A responsibility test for a proposed change</w:t>
       </w:r>
     </w:p>
     <w:p>
@@ -819,7 +820,7 @@
         <w:pStyle w:val="Heading3"/>
       </w:pPr>
       <w:r>
-        <w:t>3.5 Read the data and ownership path</w:t>
+        <w:t>3.5. Read the data and ownership path</w:t>
       </w:r>
     </w:p>
     <w:p>
@@ -1038,7 +1039,7 @@
         <w:spacing w:before="440"/>
       </w:pPr>
       <w:r>
-        <w:t>4 Startup and application lifecycle</w:t>
+        <w:t>4. Startup and application lifecycle</w:t>
       </w:r>
     </w:p>
     <w:p>
@@ -1046,7 +1047,7 @@
         <w:pStyle w:val="Heading3"/>
       </w:pPr>
       <w:r>
-        <w:t>4.1 Program entry and resource instantiation</w:t>
+        <w:t>4.1. Program entry and resource instantiation</w:t>
       </w:r>
     </w:p>
     <w:p>
@@ -1064,7 +1065,7 @@
         <w:pStyle w:val="Heading3"/>
       </w:pPr>
       <w:r>
-        <w:t>4.2 Locating bundled assets</w:t>
+        <w:t>4.2. Locating bundled assets</w:t>
       </w:r>
     </w:p>
     <w:p>
@@ -1074,7 +1075,7 @@
     </w:p>
     <w:p>
       <w:r>
-        <w:t>A desktop package must preserve that structure. A successful source-tree run does not prove a package contains the same files. Extract the binary ZIP elsewhere and test migration discovery, practice-pack resolution and browser-loader availability from the extracted location.</w:t>
+        <w:t>A desktop package must preserve that structure. A successful source-tree run does not prove a package contains the same files. Extract the binary ZIP elsewhere and test migration discovery, local help, current guide availability and browser-loader availability from the extracted location.</w:t>
       </w:r>
     </w:p>
     <w:p>
@@ -1082,7 +1083,7 @@
         <w:pStyle w:val="Heading3"/>
       </w:pPr>
       <w:r>
-        <w:t>4.3 Preferences and local catalog</w:t>
+        <w:t>4.3. Preferences and local catalog</w:t>
       </w:r>
     </w:p>
     <w:p>
@@ -1100,7 +1101,7 @@
         <w:pStyle w:val="Heading3"/>
       </w:pPr>
       <w:r>
-        <w:t>4.4 Closing and cancellation boundaries</w:t>
+        <w:t>4.4. Closing and cancellation boundaries</w:t>
       </w:r>
     </w:p>
     <w:p>
@@ -1120,7 +1121,7 @@
         <w:spacing w:before="440"/>
       </w:pPr>
       <w:r>
-        <w:t>5 Background request and response protocol</w:t>
+        <w:t>5. Background request and response protocol</w:t>
       </w:r>
     </w:p>
     <w:p>
@@ -1128,7 +1129,7 @@
         <w:pStyle w:val="Heading3"/>
       </w:pPr>
       <w:r>
-        <w:t>5.1 Request structure</w:t>
+        <w:t>5.1. Request structure</w:t>
       </w:r>
     </w:p>
     <w:p>
@@ -1146,7 +1147,7 @@
         <w:pStyle w:val="Heading3"/>
       </w:pPr>
       <w:r>
-        <w:t>5.2 Worker thread lifetime and COM</w:t>
+        <w:t>5.2. Worker thread lifetime and COM</w:t>
       </w:r>
     </w:p>
     <w:p>
@@ -1164,7 +1165,7 @@
         <w:pStyle w:val="Heading3"/>
       </w:pPr>
       <w:r>
-        <w:t>5.3 Response ownership and stale result guards</w:t>
+        <w:t>5.3. Response ownership and stale result guards</w:t>
       </w:r>
     </w:p>
     <w:p>
@@ -1182,7 +1183,7 @@
         <w:pStyle w:val="Heading3"/>
       </w:pPr>
       <w:r>
-        <w:t>5.4 Draft state across asynchronous save</w:t>
+        <w:t>5.4. Draft state across asynchronous save</w:t>
       </w:r>
     </w:p>
     <w:p>
@@ -1202,7 +1203,7 @@
         <w:spacing w:before="440"/>
       </w:pPr>
       <w:r>
-        <w:t>6 End to end flows an engineer must preserve</w:t>
+        <w:t>6. End-to-end flows an engineer must preserve</w:t>
       </w:r>
     </w:p>
     <w:p>
@@ -1210,7 +1211,7 @@
         <w:pStyle w:val="Heading3"/>
       </w:pPr>
       <w:r>
-        <w:t>6.1 First source attachment</w:t>
+        <w:t>6.1. First source attachment</w:t>
       </w:r>
     </w:p>
     <w:p>
@@ -1228,7 +1229,7 @@
         <w:pStyle w:val="Heading3"/>
       </w:pPr>
       <w:r>
-        <w:t>6.2 Opening cached lessons</w:t>
+        <w:t>6.2. Opening cached lessons</w:t>
       </w:r>
     </w:p>
     <w:p>
@@ -1246,7 +1247,7 @@
         <w:pStyle w:val="Heading3"/>
       </w:pPr>
       <w:r>
-        <w:t>6.3 Saving and reviewing knowledge</w:t>
+        <w:t>6.3. Saving and reviewing knowledge</w:t>
       </w:r>
     </w:p>
     <w:p>
@@ -1264,7 +1265,7 @@
         <w:pStyle w:val="Heading3"/>
       </w:pPr>
       <w:r>
-        <w:t>6.4 Publishing a learning edition</w:t>
+        <w:t>6.4. Publishing a learning edition</w:t>
       </w:r>
     </w:p>
     <w:p>
@@ -1280,10 +1281,11 @@
     <w:p>
       <w:pPr>
         <w:pStyle w:val="Heading1"/>
-        <w:pageBreakBefore/>
-      </w:pPr>
-      <w:r>
-        <w:t>Part II Source acquisition syntax and semantics</w:t>
+        <w:pageBreakBefore w:val="0"/>
+        <w:spacing w:before="480"/>
+      </w:pPr>
+      <w:r>
+        <w:t>PART 2: Source acquisition, syntax, and semantics</w:t>
       </w:r>
     </w:p>
     <w:p>
@@ -1293,7 +1295,7 @@
         <w:spacing w:before="260"/>
       </w:pPr>
       <w:r>
-        <w:t>7 Source bytes ranges and safe acquisition</w:t>
+        <w:t>7. Source bytes, ranges, and safe acquisition</w:t>
       </w:r>
     </w:p>
     <w:p>
@@ -1301,7 +1303,7 @@
         <w:pStyle w:val="Heading3"/>
       </w:pPr>
       <w:r>
-        <w:t>7.1 TDPHSource is the byte to text boundary</w:t>
+        <w:t>7.1. TDPHSource is the byte to text boundary</w:t>
       </w:r>
     </w:p>
     <w:p>
@@ -1319,7 +1321,7 @@
         <w:pStyle w:val="Heading3"/>
       </w:pPr>
       <w:r>
-        <w:t>7.2 Encoding precedence</w:t>
+        <w:t>7.2. Encoding precedence</w:t>
       </w:r>
     </w:p>
     <w:p>
@@ -1337,7 +1339,7 @@
         <w:pStyle w:val="Heading3"/>
       </w:pPr>
       <w:r>
-        <w:t>7.3 Byte offsets and Unicode</w:t>
+        <w:t>7.3. Byte offsets and Unicode</w:t>
       </w:r>
     </w:p>
     <w:p>
@@ -1355,7 +1357,7 @@
         <w:pStyle w:val="Heading3"/>
       </w:pPr>
       <w:r>
-        <w:t>7.4 Path safety is part of correctness</w:t>
+        <w:t>7.4. Path safety is part of correctness</w:t>
       </w:r>
     </w:p>
     <w:p>
@@ -1375,7 +1377,7 @@
         <w:spacing w:before="440"/>
       </w:pPr>
       <w:r>
-        <w:t>8 Project inventory and reading configuration</w:t>
+        <w:t>8. Project inventory and reading configuration</w:t>
       </w:r>
     </w:p>
     <w:p>
@@ -1383,7 +1385,7 @@
         <w:pStyle w:val="Heading3"/>
       </w:pPr>
       <w:r>
-        <w:t>8.1 Entry files and reachable members</w:t>
+        <w:t>8.1. Entry files and reachable members</w:t>
       </w:r>
     </w:p>
     <w:p>
@@ -1401,7 +1403,7 @@
         <w:pStyle w:val="Heading3"/>
       </w:pPr>
       <w:r>
-        <w:t>8.2 Configuration identity and macros</w:t>
+        <w:t>8.2. Configuration identity and macros</w:t>
       </w:r>
     </w:p>
     <w:p>
@@ -1419,7 +1421,7 @@
         <w:pStyle w:val="Heading3"/>
       </w:pPr>
       <w:r>
-        <w:t>8.3 Unavailable files and incomplete inventories</w:t>
+        <w:t>8.3. Unavailable files and incomplete inventories</w:t>
       </w:r>
     </w:p>
     <w:p>
@@ -1437,7 +1439,7 @@
         <w:pStyle w:val="Heading3"/>
       </w:pPr>
       <w:r>
-        <w:t>8.4 Revalidate before publication</w:t>
+        <w:t>8.4. Revalidate before publication</w:t>
       </w:r>
     </w:p>
     <w:p>
@@ -1457,7 +1459,7 @@
         <w:spacing w:before="440"/>
       </w:pPr>
       <w:r>
-        <w:t>9 Lexer preprocessing and intermediate representation</w:t>
+        <w:t>9. Lexer, preprocessing, and intermediate representation</w:t>
       </w:r>
     </w:p>
     <w:p>
@@ -1465,7 +1467,7 @@
         <w:pStyle w:val="Heading3"/>
       </w:pPr>
       <w:r>
-        <w:t>9.1 Token acquisition</w:t>
+        <w:t>9.1. Token acquisition</w:t>
       </w:r>
     </w:p>
     <w:p>
@@ -1483,7 +1485,7 @@
         <w:pStyle w:val="Heading3"/>
       </w:pPr>
       <w:r>
-        <w:t>9.2 Conditional preprocessing</w:t>
+        <w:t>9.2. Conditional preprocessing</w:t>
       </w:r>
     </w:p>
     <w:p>
@@ -1501,7 +1503,7 @@
         <w:pStyle w:val="Heading3"/>
       </w:pPr>
       <w:r>
-        <w:t>9.3 TDPHIRNode and TDPHParseResult</w:t>
+        <w:t>9.3. TDPHIRNode and TDPHParseResult</w:t>
       </w:r>
     </w:p>
     <w:p>
@@ -1519,7 +1521,7 @@
         <w:pStyle w:val="Heading3"/>
       </w:pPr>
       <w:r>
-        <w:t>9.4 Opaque syntax and diagnostics</w:t>
+        <w:t>9.4. Opaque syntax and diagnostics</w:t>
       </w:r>
     </w:p>
     <w:p>
@@ -1539,7 +1541,7 @@
         <w:spacing w:before="440"/>
       </w:pPr>
       <w:r>
-        <w:t>10 Pascal forms and resource parsing</w:t>
+        <w:t>10. Pascal, forms, and resource parsing</w:t>
       </w:r>
     </w:p>
     <w:p>
@@ -1547,7 +1549,7 @@
         <w:pStyle w:val="Heading3"/>
       </w:pPr>
       <w:r>
-        <w:t>10.1 Pascal declarations and bodies</w:t>
+        <w:t>10.1. Pascal declarations and bodies</w:t>
       </w:r>
     </w:p>
     <w:p>
@@ -1565,7 +1567,7 @@
         <w:pStyle w:val="Heading3"/>
       </w:pPr>
       <w:r>
-        <w:t>10.2 Form definitions</w:t>
+        <w:t>10.2. Form definitions</w:t>
       </w:r>
     </w:p>
     <w:p>
@@ -1583,7 +1585,7 @@
         <w:pStyle w:val="Heading3"/>
       </w:pPr>
       <w:r>
-        <w:t>10.3 Resources and includes</w:t>
+        <w:t>10.3. Resources and includes</w:t>
       </w:r>
     </w:p>
     <w:p>
@@ -1601,7 +1603,7 @@
         <w:pStyle w:val="Heading3"/>
       </w:pPr>
       <w:r>
-        <w:t>10.4 Analysis coordination</w:t>
+        <w:t>10.4. Analysis coordination</w:t>
       </w:r>
     </w:p>
     <w:p>
@@ -1621,7 +1623,7 @@
         <w:spacing w:before="440"/>
       </w:pPr>
       <w:r>
-        <w:t>11 Symbols resolution control flow and focused analyses</w:t>
+        <w:t>11. Symbols, resolution, control flow, and focused analyses</w:t>
       </w:r>
     </w:p>
     <w:p>
@@ -1629,7 +1631,7 @@
         <w:pStyle w:val="Heading3"/>
       </w:pPr>
       <w:r>
-        <w:t>11.1 Semantic model</w:t>
+        <w:t>11.1. Semantic model</w:t>
       </w:r>
     </w:p>
     <w:p>
@@ -1647,7 +1649,7 @@
         <w:pStyle w:val="Heading3"/>
       </w:pPr>
       <w:r>
-        <w:t>11.2 Routine summary caching</w:t>
+        <w:t>11.2. Routine summary caching</w:t>
       </w:r>
     </w:p>
     <w:p>
@@ -1665,7 +1667,7 @@
         <w:pStyle w:val="Heading3"/>
       </w:pPr>
       <w:r>
-        <w:t>11.3 Control flow construction</w:t>
+        <w:t>11.3. Control flow construction</w:t>
       </w:r>
     </w:p>
     <w:p>
@@ -1683,7 +1685,7 @@
         <w:pStyle w:val="Heading3"/>
       </w:pPr>
       <w:r>
-        <w:t>11.4 Bounded graph contracts</w:t>
+        <w:t>11.4. Bounded graph contracts</w:t>
       </w:r>
     </w:p>
     <w:p>
@@ -1701,7 +1703,7 @@
         <w:pStyle w:val="Heading3"/>
       </w:pPr>
       <w:r>
-        <w:t>11.5 Focused analysis modules</w:t>
+        <w:t>11.5. Focused analysis modules</w:t>
       </w:r>
     </w:p>
     <w:p>
@@ -1717,10 +1719,11 @@
     <w:p>
       <w:pPr>
         <w:pStyle w:val="Heading1"/>
-        <w:pageBreakBefore/>
-      </w:pPr>
-      <w:r>
-        <w:t>Part III Persistence authored knowledge and native presentation</w:t>
+        <w:pageBreakBefore w:val="0"/>
+        <w:spacing w:before="480"/>
+      </w:pPr>
+      <w:r>
+        <w:t>PART 3: Persistence, authored knowledge, and native presentation</w:t>
       </w:r>
     </w:p>
     <w:p>
@@ -1730,7 +1733,7 @@
         <w:spacing w:before="260"/>
       </w:pPr>
       <w:r>
-        <w:t>12 SQLite store ownership migrations and transactions</w:t>
+        <w:t>12. SQLite store ownership, migrations, and transactions</w:t>
       </w:r>
     </w:p>
     <w:p>
@@ -1738,7 +1741,7 @@
         <w:pStyle w:val="Heading3"/>
       </w:pPr>
       <w:r>
-        <w:t>12.1 Connection contract</w:t>
+        <w:t>12.1. Connection contract</w:t>
       </w:r>
     </w:p>
     <w:p>
@@ -1756,7 +1759,7 @@
         <w:pStyle w:val="Heading3"/>
       </w:pPr>
       <w:r>
-        <w:t>12.2 Single writer mutex</w:t>
+        <w:t>12.2. Single writer mutex</w:t>
       </w:r>
     </w:p>
     <w:p>
@@ -1774,7 +1777,7 @@
         <w:pStyle w:val="Heading3"/>
       </w:pPr>
       <w:r>
-        <w:t>12.3 Schema migration</w:t>
+        <w:t>12.3. Schema migration</w:t>
       </w:r>
     </w:p>
     <w:p>
@@ -1792,7 +1795,7 @@
         <w:pStyle w:val="Heading3"/>
       </w:pPr>
       <w:r>
-        <w:t>12.4 Interrupted generation recovery</w:t>
+        <w:t>12.4. Interrupted generation recovery</w:t>
       </w:r>
     </w:p>
     <w:p>
@@ -1812,7 +1815,7 @@
         <w:spacing w:before="440"/>
       </w:pPr>
       <w:r>
-        <w:t>13 Generations source identity and cached views</w:t>
+        <w:t>13. Generations, source identity, and cached views</w:t>
       </w:r>
     </w:p>
     <w:p>
@@ -1820,7 +1823,7 @@
         <w:pStyle w:val="Heading3"/>
       </w:pPr>
       <w:r>
-        <w:t>13.1 The persisted graph of records</w:t>
+        <w:t>13.1. The persisted graph of records</w:t>
       </w:r>
     </w:p>
     <w:p>
@@ -1838,7 +1841,7 @@
         <w:pStyle w:val="Heading3"/>
       </w:pPr>
       <w:r>
-        <w:t>13.2 Stage commit and publish are separate</w:t>
+        <w:t>13.2. Stage commit and publish are separate</w:t>
       </w:r>
     </w:p>
     <w:p>
@@ -1856,7 +1859,7 @@
         <w:pStyle w:val="Heading3"/>
       </w:pPr>
       <w:r>
-        <w:t>13.3 Stable identity and changed objects</w:t>
+        <w:t>13.3. Stable identity and changed objects</w:t>
       </w:r>
     </w:p>
     <w:p>
@@ -1874,7 +1877,7 @@
         <w:pStyle w:val="Heading3"/>
       </w:pPr>
       <w:r>
-        <w:t>13.4 Cached workspace views</w:t>
+        <w:t>13.4. Cached workspace views</w:t>
       </w:r>
     </w:p>
     <w:p>
@@ -1892,7 +1895,7 @@
         <w:pStyle w:val="Heading3"/>
       </w:pPr>
       <w:r>
-        <w:t>13.5 Relocation contract</w:t>
+        <w:t>13.5. Relocation contract</w:t>
       </w:r>
     </w:p>
     <w:p>
@@ -1912,7 +1915,7 @@
         <w:spacing w:before="440"/>
       </w:pPr>
       <w:r>
-        <w:t>14 Authored revisions links and review state</w:t>
+        <w:t>14. Authored revisions, links, and review state</w:t>
       </w:r>
     </w:p>
     <w:p>
@@ -1920,7 +1923,7 @@
         <w:pStyle w:val="Heading3"/>
       </w:pPr>
       <w:r>
-        <w:t>14.1 SaveKnowledge contract</w:t>
+        <w:t>14.1. SaveKnowledge contract</w:t>
       </w:r>
     </w:p>
     <w:p>
@@ -1938,7 +1941,7 @@
         <w:pStyle w:val="Heading3"/>
       </w:pPr>
       <w:r>
-        <w:t>14.2 Structured text and typed metadata agree</w:t>
+        <w:t>14.2. Structured text and typed metadata agree</w:t>
       </w:r>
     </w:p>
     <w:p>
@@ -1956,7 +1959,7 @@
         <w:pStyle w:val="Heading3"/>
       </w:pPr>
       <w:r>
-        <w:t>14.3 Links have precise targets</w:t>
+        <w:t>14.3. Links have precise targets</w:t>
       </w:r>
     </w:p>
     <w:p>
@@ -1974,7 +1977,7 @@
         <w:pStyle w:val="Heading3"/>
       </w:pPr>
       <w:r>
-        <w:t>14.4 Review lifecycle</w:t>
+        <w:t>14.4. Review lifecycle</w:t>
       </w:r>
     </w:p>
     <w:p>
@@ -1992,7 +1995,7 @@
         <w:pStyle w:val="Heading3"/>
       </w:pPr>
       <w:r>
-        <w:t>14.5 Document sections and questions</w:t>
+        <w:t>14.5. Document sections and questions</w:t>
       </w:r>
     </w:p>
     <w:p>
@@ -2012,7 +2015,7 @@
         <w:spacing w:before="440"/>
       </w:pPr>
       <w:r>
-        <w:t>15 Structured tasks teaching cards and personal progress</w:t>
+        <w:t>15. Structured tasks, teaching cards, and personal progress</w:t>
       </w:r>
     </w:p>
     <w:p>
@@ -2020,7 +2023,7 @@
         <w:pStyle w:val="Heading3"/>
       </w:pPr>
       <w:r>
-        <w:t>15.1 Learning lesson schema</w:t>
+        <w:t>15.1. Learning lesson schema</w:t>
       </w:r>
     </w:p>
     <w:p>
@@ -2038,7 +2041,7 @@
         <w:pStyle w:val="Heading3"/>
       </w:pPr>
       <w:r>
-        <w:t>15.2 Task editing and reading states</w:t>
+        <w:t>15.2. Task editing and reading states</w:t>
       </w:r>
     </w:p>
     <w:p>
@@ -2056,7 +2059,7 @@
         <w:pStyle w:val="Heading3"/>
       </w:pPr>
       <w:r>
-        <w:t>15.3 Valid task metadata example</w:t>
+        <w:t>15.3. Valid task metadata example</w:t>
       </w:r>
     </w:p>
     <w:p>
@@ -2121,67 +2124,67 @@
           <w:rFonts w:ascii="Consolas" w:hAnsi="Consolas"/>
           <w:sz w:val="18"/>
         </w:rPr>
-        <w:t xml:space="preserve">    "name": "Predict the sample subtotal",</w:t>
-      </w:r>
-    </w:p>
-    <w:p>
-      <w:pPr>
-        <w:spacing w:after="40" w:line="247" w:lineRule="auto"/>
-      </w:pPr>
-      <w:r>
-        <w:rPr>
-          <w:rFonts w:ascii="Consolas" w:hAnsi="Consolas"/>
-          <w:sz w:val="18"/>
-        </w:rPr>
-        <w:t xml:space="preserve">    "purpose": "Explain how quantity and unit price combine.",</w:t>
-      </w:r>
-    </w:p>
-    <w:p>
-      <w:pPr>
-        <w:spacing w:after="40" w:line="247" w:lineRule="auto"/>
-      </w:pPr>
-      <w:r>
-        <w:rPr>
-          <w:rFonts w:ascii="Consolas" w:hAnsi="Consolas"/>
-          <w:sz w:val="18"/>
-        </w:rPr>
-        <w:t xml:space="preserve">    "prerequisites": "Read the practice application's purpose.",</w:t>
-      </w:r>
-    </w:p>
-    <w:p>
-      <w:pPr>
-        <w:spacing w:after="40" w:line="247" w:lineRule="auto"/>
-      </w:pPr>
-      <w:r>
-        <w:rPr>
-          <w:rFonts w:ascii="Consolas" w:hAnsi="Consolas"/>
-          <w:sz w:val="18"/>
-        </w:rPr>
-        <w:t xml:space="preserve">    "expected_result": "The learner predicts 20.00.",</w:t>
-      </w:r>
-    </w:p>
-    <w:p>
-      <w:pPr>
-        <w:spacing w:after="40" w:line="247" w:lineRule="auto"/>
-      </w:pPr>
-      <w:r>
-        <w:rPr>
-          <w:rFonts w:ascii="Consolas" w:hAnsi="Consolas"/>
-          <w:sz w:val="18"/>
-        </w:rPr>
-        <w:t xml:space="preserve">    "troubleshooting": "Recheck quantity 2 and unit price 10.00.",</w:t>
-      </w:r>
-    </w:p>
-    <w:p>
-      <w:pPr>
-        <w:spacing w:after="40" w:line="247" w:lineRule="auto"/>
-      </w:pPr>
-      <w:r>
-        <w:rPr>
-          <w:rFonts w:ascii="Consolas" w:hAnsi="Consolas"/>
-          <w:sz w:val="18"/>
-        </w:rPr>
-        <w:t xml:space="preserve">    "practice": "Predict 3 times 5.00. Expected answer: 15.00."</w:t>
+        <w:t xml:space="preserve">    "name": "Find a customer record",</w:t>
+      </w:r>
+    </w:p>
+    <w:p>
+      <w:pPr>
+        <w:spacing w:after="40" w:line="247" w:lineRule="auto"/>
+      </w:pPr>
+      <w:r>
+        <w:rPr>
+          <w:rFonts w:ascii="Consolas" w:hAnsi="Consolas"/>
+          <w:sz w:val="18"/>
+        </w:rPr>
+        <w:t xml:space="preserve">    "purpose": "Locate a record from an approved search screen.",</w:t>
+      </w:r>
+    </w:p>
+    <w:p>
+      <w:pPr>
+        <w:spacing w:after="40" w:line="247" w:lineRule="auto"/>
+      </w:pPr>
+      <w:r>
+        <w:rPr>
+          <w:rFonts w:ascii="Consolas" w:hAnsi="Consolas"/>
+          <w:sz w:val="18"/>
+        </w:rPr>
+        <w:t xml:space="preserve">    "prerequisites": "Read the selected application's purpose.",</w:t>
+      </w:r>
+    </w:p>
+    <w:p>
+      <w:pPr>
+        <w:spacing w:after="40" w:line="247" w:lineRule="auto"/>
+      </w:pPr>
+      <w:r>
+        <w:rPr>
+          <w:rFonts w:ascii="Consolas" w:hAnsi="Consolas"/>
+          <w:sz w:val="18"/>
+        </w:rPr>
+        <w:t xml:space="preserve">    "expected_result": "The matching record is shown.",</w:t>
+      </w:r>
+    </w:p>
+    <w:p>
+      <w:pPr>
+        <w:spacing w:after="40" w:line="247" w:lineRule="auto"/>
+      </w:pPr>
+      <w:r>
+        <w:rPr>
+          <w:rFonts w:ascii="Consolas" w:hAnsi="Consolas"/>
+          <w:sz w:val="18"/>
+        </w:rPr>
+        <w:t xml:space="preserve">    "troubleshooting": "Check the search value and ask the owner about access rules.",</w:t>
+      </w:r>
+    </w:p>
+    <w:p>
+      <w:pPr>
+        <w:spacing w:after="40" w:line="247" w:lineRule="auto"/>
+      </w:pPr>
+      <w:r>
+        <w:rPr>
+          <w:rFonts w:ascii="Consolas" w:hAnsi="Consolas"/>
+          <w:sz w:val="18"/>
+        </w:rPr>
+        <w:t xml:space="preserve">    "practice": "Explain which result identifies the intended record."</w:t>
       </w:r>
     </w:p>
     <w:p>
@@ -2229,19 +2232,19 @@
           <w:rFonts w:ascii="Consolas" w:hAnsi="Consolas"/>
           <w:sz w:val="18"/>
         </w:rPr>
-        <w:t xml:space="preserve">      "action": "Multiply quantity 2 by unit price 10.00.",</w:t>
-      </w:r>
-    </w:p>
-    <w:p>
-      <w:pPr>
-        <w:spacing w:after="40" w:line="247" w:lineRule="auto"/>
-      </w:pPr>
-      <w:r>
-        <w:rPr>
-          <w:rFonts w:ascii="Consolas" w:hAnsi="Consolas"/>
-          <w:sz w:val="18"/>
-        </w:rPr>
-        <w:t xml:space="preserve">      "expected_result": "The subtotal is 20.00."</w:t>
+        <w:t xml:space="preserve">      "action": "Enter an owner-approved search value and choose Search.",</w:t>
+      </w:r>
+    </w:p>
+    <w:p>
+      <w:pPr>
+        <w:spacing w:after="40" w:line="247" w:lineRule="auto"/>
+      </w:pPr>
+      <w:r>
+        <w:rPr>
+          <w:rFonts w:ascii="Consolas" w:hAnsi="Consolas"/>
+          <w:sz w:val="18"/>
+        </w:rPr>
+        <w:t xml:space="preserve">      "expected_result": "A matching record appears in the result list."</w:t>
       </w:r>
     </w:p>
     <w:p>
@@ -2277,7 +2280,7 @@
           <w:rFonts w:ascii="Consolas" w:hAnsi="Consolas"/>
           <w:sz w:val="18"/>
         </w:rPr>
-        <w:t xml:space="preserve">  "learning": {"role": "New learner", "path": "First day", "order": 2}</w:t>
+        <w:t xml:space="preserve">  "learning": {"role": "New learner", "path": "Customer lookup", "order": 2}</w:t>
       </w:r>
     </w:p>
     <w:p>
@@ -2297,7 +2300,7 @@
         <w:pStyle w:val="Heading3"/>
       </w:pPr>
       <w:r>
-        <w:t>15.4 Teaching card schema</w:t>
+        <w:t>15.4. Teaching card schema</w:t>
       </w:r>
     </w:p>
     <w:p>
@@ -2315,7 +2318,7 @@
         <w:pStyle w:val="Heading3"/>
       </w:pPr>
       <w:r>
-        <w:t>15.5 Valid teaching card metadata example</w:t>
+        <w:t>15.5. Valid teaching card metadata example</w:t>
       </w:r>
     </w:p>
     <w:p>
@@ -2496,7 +2499,7 @@
         <w:pStyle w:val="Heading3"/>
       </w:pPr>
       <w:r>
-        <w:t>15.6 Progress key and semantics</w:t>
+        <w:t>15.6. Progress key and semantics</w:t>
       </w:r>
     </w:p>
     <w:p>
@@ -2514,7 +2517,7 @@
         <w:pStyle w:val="Heading3"/>
       </w:pPr>
       <w:r>
-        <w:t>15.7 Progress is not authentication or mastery</w:t>
+        <w:t>15.7. Progress is not authentication or mastery</w:t>
       </w:r>
     </w:p>
     <w:p>
@@ -2534,7 +2537,7 @@
         <w:spacing w:before="440"/>
       </w:pPr>
       <w:r>
-        <w:t>16 Pictures artifacts and anchored callouts</w:t>
+        <w:t>16. Pictures, artifacts, and anchored callouts</w:t>
       </w:r>
     </w:p>
     <w:p>
@@ -2542,7 +2545,7 @@
         <w:pStyle w:val="Heading3"/>
       </w:pPr>
       <w:r>
-        <w:t>16.1 Import and managed storage</w:t>
+        <w:t>16.1. Import and managed storage</w:t>
       </w:r>
     </w:p>
     <w:p>
@@ -2560,7 +2563,7 @@
         <w:pStyle w:val="Heading3"/>
       </w:pPr>
       <w:r>
-        <w:t>16.2 Normalized coordinates</w:t>
+        <w:t>16.2. Normalized coordinates</w:t>
       </w:r>
     </w:p>
     <w:p>
@@ -2578,7 +2581,7 @@
         <w:pStyle w:val="Heading3"/>
       </w:pPr>
       <w:r>
-        <w:t>16.3 Native style and interaction</w:t>
+        <w:t>16.3. Native style and interaction</w:t>
       </w:r>
     </w:p>
     <w:p>
@@ -2596,7 +2599,7 @@
         <w:pStyle w:val="Heading3"/>
       </w:pPr>
       <w:r>
-        <w:t>16.4 Offline presentation</w:t>
+        <w:t>16.4. Offline presentation</w:t>
       </w:r>
     </w:p>
     <w:p>
@@ -2616,7 +2619,7 @@
         <w:spacing w:before="440"/>
       </w:pPr>
       <w:r>
-        <w:t>17 Learner projections and native binding</w:t>
+        <w:t>17. Learner projections and native binding</w:t>
       </w:r>
     </w:p>
     <w:p>
@@ -2624,7 +2627,7 @@
         <w:pStyle w:val="Heading3"/>
       </w:pPr>
       <w:r>
-        <w:t>17.1 TDPHWorkspaceView</w:t>
+        <w:t>17.1. TDPHWorkspaceView</w:t>
       </w:r>
     </w:p>
     <w:p>
@@ -2642,17 +2645,17 @@
         <w:pStyle w:val="Heading3"/>
       </w:pPr>
       <w:r>
-        <w:t>17.2 Beginner explanation model</w:t>
-      </w:r>
-    </w:p>
-    <w:p>
-      <w:r>
-        <w:t>TDPHExplanationModel generates twelve lesson topics and object-specific explanations from selected facts and attributed knowledge. ObjectLessonHTML introduces role and relevant purpose, actual conditions and bounded next connections, then keeps the deeper code walkthrough optional. ObjectText provides a native text route from the same explanatory model.</w:t>
-      </w:r>
-    </w:p>
-    <w:p>
-      <w:r>
-        <w:t>The lesson renderer must not turn an unlinked application-wide note into every object's purpose. It must exclude rejected/retired content and preserve unresolved questions. Authored task walkthroughs use prepared learning order and include the retained task set, while source examples may be bounded for readability.</w:t>
+        <w:t>17.2. Beginner explanation model</w:t>
+      </w:r>
+    </w:p>
+    <w:p>
+      <w:r>
+        <w:t>TDPHExplanationModel.ApplicationRouteHTML generates four primary pages for the selected application: Meet this app, Learn a real task, Explore related tasks and Resolve unknowns. It combines source-derived forms and action links with that application's attributed profile, structured tasks, teaching cards and open author questions. Its task order uses saved learning order, then path and title. Absent instructions remain explicit gaps; an event binding alone is never presented as a verified task. The older generic LessonHTML topics remain supporting code, not the main learner route.</w:t>
+      </w:r>
+    </w:p>
+    <w:p>
+      <w:r>
+        <w:t>ObjectLessonHTML introduces role and relevant purpose, actual conditions and bounded next connections, then keeps the deeper code walkthrough optional. ObjectText provides a native text route from the same explanatory model. The renderer must not turn an unlinked application-wide note into every object's purpose. It must exclude rejected or retired content and preserve unresolved questions. The native list of four routes is serialized in DPH.UI.Main.fmx so ordinary labels remain IDE-editable.</w:t>
       </w:r>
     </w:p>
     <w:p>
@@ -2660,7 +2663,7 @@
         <w:pStyle w:val="Heading3"/>
       </w:pPr>
       <w:r>
-        <w:t>17.3 Lazy optional reports</w:t>
+        <w:t>17.3. Lazy optional reports</w:t>
       </w:r>
     </w:p>
     <w:p>
@@ -2678,7 +2681,7 @@
         <w:pStyle w:val="Heading3"/>
       </w:pPr>
       <w:r>
-        <w:t>17.4 Layout state and compact windows</w:t>
+        <w:t>17.4. Layout state and compact windows</w:t>
       </w:r>
     </w:p>
     <w:p>
@@ -2694,10 +2697,11 @@
     <w:p>
       <w:pPr>
         <w:pStyle w:val="Heading1"/>
-        <w:pageBreakBefore/>
-      </w:pPr>
-      <w:r>
-        <w:t>Part IV Publication search and operational safety</w:t>
+        <w:pageBreakBefore w:val="0"/>
+        <w:spacing w:before="480"/>
+      </w:pPr>
+      <w:r>
+        <w:t>PART 4: Publication, search, and operational safety</w:t>
       </w:r>
     </w:p>
     <w:p>
@@ -2707,7 +2711,7 @@
         <w:spacing w:before="260"/>
       </w:pPr>
       <w:r>
-        <w:t>18 Publication model and export contract</w:t>
+        <w:t>18. Publication model and export contract</w:t>
       </w:r>
     </w:p>
     <w:p>
@@ -2715,7 +2719,7 @@
         <w:pStyle w:val="Heading3"/>
       </w:pPr>
       <w:r>
-        <w:t>18.1 Canonical scoped model</w:t>
+        <w:t>18.1. Canonical scoped model</w:t>
       </w:r>
     </w:p>
     <w:p>
@@ -2733,7 +2737,7 @@
         <w:pStyle w:val="Heading3"/>
       </w:pPr>
       <w:r>
-        <w:t>18.2 Scoping before rendering</w:t>
+        <w:t>18.2. Scoping before rendering</w:t>
       </w:r>
     </w:p>
     <w:p>
@@ -2751,7 +2755,7 @@
         <w:pStyle w:val="Heading3"/>
       </w:pPr>
       <w:r>
-        <w:t>18.3 Redaction and encoding</w:t>
+        <w:t>18.3. Redaction and encoding</w:t>
       </w:r>
     </w:p>
     <w:p>
@@ -2769,12 +2773,12 @@
         <w:pStyle w:val="Heading3"/>
       </w:pPr>
       <w:r>
-        <w:t>18.4 Export files and atomic destination</w:t>
-      </w:r>
-    </w:p>
-    <w:p>
-      <w:r>
-        <w:t>TDPHPublisher.Export writes a new destination and refuses an existing one. learning.html presents the twelve-topic learner route, authored tasks, examples, questions, terms and supplied images. Hash-named object pages provide linked explanations with optional source detail. index.html and JSONL technical indexes support deeper inspection and validation.</w:t>
+        <w:t>18.4. Export files and atomic destination</w:t>
+      </w:r>
+    </w:p>
+    <w:p>
+      <w:r>
+        <w:t>TDPHPublisher.Export writes a new destination and refuses an existing one. learning.html presents the selected application's four-part learner route, authored tasks, examples, questions, terms and supplied images. The generated User Guide follows those same four parts. Hash-named object pages provide linked explanations with optional source detail. index.html and JSONL technical indexes support deeper inspection and validation.</w:t>
       </w:r>
     </w:p>
     <w:p>
@@ -2787,7 +2791,7 @@
         <w:pStyle w:val="Heading3"/>
       </w:pPr>
       <w:r>
-        <w:t>18.5 Validation trust boundary</w:t>
+        <w:t>18.5. Validation trust boundary</w:t>
       </w:r>
     </w:p>
     <w:p>
@@ -2807,7 +2811,7 @@
         <w:spacing w:before="440"/>
       </w:pPr>
       <w:r>
-        <w:t>19 Search browser navigation and supporting integrations</w:t>
+        <w:t>19. Search, browser navigation, and supporting integrations</w:t>
       </w:r>
     </w:p>
     <w:p>
@@ -2815,7 +2819,7 @@
         <w:pStyle w:val="Heading3"/>
       </w:pPr>
       <w:r>
-        <w:t>19.1 Persistent project search</w:t>
+        <w:t>19.1. Persistent project search</w:t>
       </w:r>
     </w:p>
     <w:p>
@@ -2833,7 +2837,7 @@
         <w:pStyle w:val="Heading3"/>
       </w:pPr>
       <w:r>
-        <w:t>19.2 Embedded browser policy</w:t>
+        <w:t>19.2. Embedded browser policy</w:t>
       </w:r>
     </w:p>
     <w:p>
@@ -2851,7 +2855,7 @@
         <w:pStyle w:val="Heading3"/>
       </w:pPr>
       <w:r>
-        <w:t>19.3 Runtime observations and data-quality imports</w:t>
+        <w:t>19.3. Runtime observations and data-quality imports</w:t>
       </w:r>
     </w:p>
     <w:p>
@@ -2869,7 +2873,7 @@
         <w:pStyle w:val="Heading3"/>
       </w:pPr>
       <w:r>
-        <w:t>19.4 Translation dependency</w:t>
+        <w:t>19.4. Translation dependency</w:t>
       </w:r>
     </w:p>
     <w:p>
@@ -2885,10 +2889,11 @@
     <w:p>
       <w:pPr>
         <w:pStyle w:val="Heading1"/>
-        <w:pageBreakBefore/>
-      </w:pPr>
-      <w:r>
-        <w:t>Part V Build test diagnose and release</w:t>
+        <w:pageBreakBefore w:val="0"/>
+        <w:spacing w:before="480"/>
+      </w:pPr>
+      <w:r>
+        <w:t>PART 5: Building, testing, diagnosis, and release</w:t>
       </w:r>
     </w:p>
     <w:p>
@@ -2898,7 +2903,7 @@
         <w:spacing w:before="260"/>
       </w:pPr>
       <w:r>
-        <w:t>20 Build environment and source layout</w:t>
+        <w:t>20. Build environment and source layout</w:t>
       </w:r>
     </w:p>
     <w:p>
@@ -2906,7 +2911,7 @@
         <w:pStyle w:val="Heading3"/>
       </w:pPr>
       <w:r>
-        <w:t>20.1 Required engineering tools</w:t>
+        <w:t>20.1. Required engineering tools</w:t>
       </w:r>
     </w:p>
     <w:p>
@@ -2941,7 +2946,7 @@
         <w:pStyle w:val="Heading3"/>
       </w:pPr>
       <w:r>
-        <w:t>20.2 Directory responsibilities</w:t>
+        <w:t>20.2. Directory responsibilities</w:t>
       </w:r>
     </w:p>
     <w:p>
@@ -2951,7 +2956,7 @@
     </w:p>
     <w:p>
       <w:r>
-        <w:t>samples holds the small OrderPractice teaching application, translation fixtures and optional locally pinned reference material. tools holds build, packaging, documentation and validation tools. migrations holds the ordered SQL schema. dependencies holds pinned third-party source. Databases is the default suggested lesson-store area; user stores must not be committed or packaged.</w:t>
+        <w:t>samples holds developer fixtures and optional locally pinned reference material; OrderPractice remains a parser/form fixture without imported learner lessons. tools holds build, packaging, documentation and validation tools. migrations holds the ordered SQL schema. dependencies holds pinned third-party source. Databases is the default suggested lesson-store area; user stores must not be committed or packaged.</w:t>
       </w:r>
     </w:p>
     <w:p>
@@ -2959,7 +2964,7 @@
         <w:pStyle w:val="Heading3"/>
       </w:pPr>
       <w:r>
-        <w:t>20.3 Build the application and form baseline</w:t>
+        <w:t>20.3. Build the application and form baseline</w:t>
       </w:r>
     </w:p>
     <w:p>
@@ -3047,7 +3052,7 @@
         <w:pStyle w:val="Heading3"/>
       </w:pPr>
       <w:r>
-        <w:t>20.4 Build the publication validator</w:t>
+        <w:t>20.4. Build the publication validator</w:t>
       </w:r>
     </w:p>
     <w:p>
@@ -3067,7 +3072,7 @@
         <w:spacing w:before="440"/>
       </w:pPr>
       <w:r>
-        <w:t>21 Meaningful test selection and execution</w:t>
+        <w:t>21. Meaningful test selection and execution</w:t>
       </w:r>
     </w:p>
     <w:p>
@@ -3075,12 +3080,12 @@
         <w:pStyle w:val="Heading3"/>
       </w:pPr>
       <w:r>
-        <w:t>21.1 Select tests by the changed contract</w:t>
-      </w:r>
-    </w:p>
-    <w:p>
-      <w:r>
-        <w:t>Form layout or event-binding changes require the baseline and relevant native UI checks. Task/card changes require GuidedTasks, Catalog and Practice. Knowledge persistence changes require Knowledge and Storage. Publication changes require Publishing and the applicable hardening/privacy checks. Analyzer changes require their focused parser/semantic fixtures and relevant reference/incremental checks.</w:t>
+        <w:t>21.1. Select tests by the changed contract</w:t>
+      </w:r>
+    </w:p>
+    <w:p>
+      <w:r>
+        <w:t>Form layout or event-binding changes require the baseline and relevant native UI checks. Task/card changes require GuidedTasks, Catalog and the selected-application learning test. Knowledge persistence changes require Knowledge and Storage. Publication changes require Publishing and the applicable hardening/privacy checks. Analyzer changes require their focused parser/semantic fixtures and relevant reference/incremental checks.</w:t>
       </w:r>
     </w:p>
     <w:p>
@@ -3093,7 +3098,7 @@
         <w:pStyle w:val="Heading3"/>
       </w:pPr>
       <w:r>
-        <w:t>21.2 Current learning test commands</w:t>
+        <w:t>21.2. Current learning test commands</w:t>
       </w:r>
     </w:p>
     <w:p>
@@ -3141,18 +3146,6 @@
           <w:rFonts w:ascii="Consolas" w:hAnsi="Consolas"/>
           <w:sz w:val="18"/>
         </w:rPr>
-        <w:t>tools\build-practice.cmd "&lt;new disposable practice workspace&gt;"</w:t>
-      </w:r>
-    </w:p>
-    <w:p>
-      <w:pPr>
-        <w:spacing w:after="40" w:line="247" w:lineRule="auto"/>
-      </w:pPr>
-      <w:r>
-        <w:rPr>
-          <w:rFonts w:ascii="Consolas" w:hAnsi="Consolas"/>
-          <w:sz w:val="18"/>
-        </w:rPr>
         <w:t>tools\build-order-sample.cmd</w:t>
       </w:r>
     </w:p>
@@ -3183,17 +3176,17 @@
         <w:pStyle w:val="Heading3"/>
       </w:pPr>
       <w:r>
-        <w:t>21.3 Practice test as an integration route</w:t>
-      </w:r>
-    </w:p>
-    <w:p>
-      <w:r>
-        <w:t>DPH.Tests.Practice opens the actual native form, invokes the supplied-practice route and checks prepared path order, task purpose, worked result, saved progress, field guidance, contextual source links, FAQ content, sample-output callouts, compact layout and persisted records. It also publishes the example and checks the shared learning route and original source/image hashes.</w:t>
-      </w:r>
-    </w:p>
-    <w:p>
-      <w:r>
-        <w:t>DPH.Tests.OrderSample validates the designated example's actual calculation behavior and captures its native pictures. These two tests establish different contracts: the sample's behavior and DPH's ability to teach it. Neither proves that an arbitrary selected target was executed or understood completely.</w:t>
+        <w:t>21.3. Selected-application learning integration</w:t>
+      </w:r>
+    </w:p>
+    <w:p>
+      <w:r>
+        <w:t>DPH.Tests.LearningRefocus creates a disposable selected-project capture, verifies that the four main pages use that project's own forms and action links, and confirms that no OrderPractice lessons are imported. Its native WebView2 path checks the route title, internal links, text fallback and compact layout. The test writes screenshots into its disposable workspace so validation does not overwrite the published manuals' images.</w:t>
+      </w:r>
+    </w:p>
+    <w:p>
+      <w:r>
+        <w:t>DPH.Tests.GuidedTasks checks structured task validation, ordered steps, revision-specific progress, teaching cards, picture callouts and publication of selected-app instructions. DPH.Tests.OrderSample still tests a developer fixture's calculation behavior; it is not a default learner path. None of these tests proves that an arbitrary selected application ran or that its unwritten business rules are known.</w:t>
       </w:r>
     </w:p>
     <w:p>
@@ -3201,7 +3194,7 @@
         <w:pStyle w:val="Heading3"/>
       </w:pPr>
       <w:r>
-        <w:t>21.4 Full and incremental reference checks</w:t>
+        <w:t>21.4. Full and incremental reference checks</w:t>
       </w:r>
     </w:p>
     <w:p>
@@ -3219,7 +3212,7 @@
         <w:pStyle w:val="Heading3"/>
       </w:pPr>
       <w:r>
-        <w:t>21.5 Isolate local preferences and artifacts</w:t>
+        <w:t>21.5. Isolate local preferences and artifacts</w:t>
       </w:r>
     </w:p>
     <w:p>
@@ -3239,7 +3232,7 @@
         <w:spacing w:before="440"/>
       </w:pPr>
       <w:r>
-        <w:t>22 Package deploy and verify extracted copies</w:t>
+        <w:t>22. Package, deploy, and verify extracted copies</w:t>
       </w:r>
     </w:p>
     <w:p>
@@ -3247,17 +3240,17 @@
         <w:pStyle w:val="Heading3"/>
       </w:pPr>
       <w:r>
-        <w:t>22.1 Binary package contents</w:t>
-      </w:r>
-    </w:p>
-    <w:p>
-      <w:r>
-        <w:t>The desktop package contains DelphiProjectHandoff.exe, DPH.ValidateHandoff.exe, WebView2Loader.dll, migrations, help, current guides and directions, Databases instructions, licenses and the eight OrderPractice lesson/source/image files. It deliberately contains no owner .dphdb, private document copies or reference-project working stores.</w:t>
-      </w:r>
-    </w:p>
-    <w:p>
-      <w:r>
-        <w:t>The supplied practice lesson pack includes source_hashes for the four source/project files and two PNG images. Preserve these exact bytes through packaging and source control. The repository's .gitattributes disables text normalization for those sample files so a checkout does not invalidate the prepared identity.</w:t>
+        <w:t>22.1. Binary package contents</w:t>
+      </w:r>
+    </w:p>
+    <w:p>
+      <w:r>
+        <w:t>The desktop package is intended to contain DelphiProjectHandoff.exe, DPH.ValidateHandoff.exe, WebView2Loader.dll, migrations, help, current guides and directions, Databases instructions and required licenses. It does not include the OrderPractice developer fixture, an owner .dphdb, private document copies or reference-project working stores. A previously created package remains a historical build; rebuild only after its documentation and executable agree.</w:t>
+      </w:r>
+    </w:p>
+    <w:p>
+      <w:r>
+        <w:t>The source archive may include developer fixtures and tests for reproducibility. Their presence does not authorize the application to offer a generic practice lesson or imply that a fixture's behavior applies to the selected target.</w:t>
       </w:r>
     </w:p>
     <w:p>
@@ -3265,7 +3258,7 @@
         <w:pStyle w:val="Heading3"/>
       </w:pPr>
       <w:r>
-        <w:t>22.2 Run the packager deliberately</w:t>
+        <w:t>22.2. Run the packager deliberately</w:t>
       </w:r>
     </w:p>
     <w:p>
@@ -3353,12 +3346,12 @@
         <w:pStyle w:val="Heading3"/>
       </w:pPr>
       <w:r>
-        <w:t>22.3 Verify the binary extraction</w:t>
-      </w:r>
-    </w:p>
-    <w:p>
-      <w:r>
-        <w:t>Extract the binary ZIP to a new writable location. Verify every SHA256.json entry against extracted bytes. Check required migrations, current manuals, local help, loader and practice-pack files. Start the extracted actual executable, confirm a responsive native window and normal close, then run the practice route against disposable lesson storage.</w:t>
+        <w:t>22.3. Verify the binary extraction</w:t>
+      </w:r>
+    </w:p>
+    <w:p>
+      <w:r>
+        <w:t>Extract the binary ZIP to a new writable location. Verify every SHA256.json entry against extracted bytes. Check required migrations, current manuals, local help and loader. Start the extracted executable, confirm a responsive native window and normal close, then select a disposable Delphi project and verify that its four-part route names that project without importing unrelated lessons.</w:t>
       </w:r>
     </w:p>
     <w:p>
@@ -3371,7 +3364,7 @@
         <w:pStyle w:val="Heading3"/>
       </w:pPr>
       <w:r>
-        <w:t>22.4 Verify the source extraction</w:t>
+        <w:t>22.4. Verify the source extraction</w:t>
       </w:r>
     </w:p>
     <w:p>
@@ -3381,7 +3374,7 @@
     </w:p>
     <w:p>
       <w:r>
-        <w:t>The source archive intentionally excludes personal owner data and locally pinned reference source. A reference-only test may require separately supplied reference material, while the ordinary application and bundled small-sample tests must remain reproducible from shipped source.</w:t>
+        <w:t>The source archive intentionally excludes personal owner data and locally pinned reference source. A reference-only test may require separately supplied reference material, while the ordinary application and included developer-fixture tests must remain reproducible from shipped source.</w:t>
       </w:r>
     </w:p>
     <w:p>
@@ -3389,7 +3382,7 @@
         <w:pStyle w:val="Heading3"/>
       </w:pPr>
       <w:r>
-        <w:t>22.5 Release record and repositories</w:t>
+        <w:t>22.5. Release record and repositories</w:t>
       </w:r>
     </w:p>
     <w:p>
@@ -3409,7 +3402,7 @@
         <w:spacing w:before="440"/>
       </w:pPr>
       <w:r>
-        <w:t>23 Diagnose failures at their owning layer</w:t>
+        <w:t>23. Diagnose failures at their owning layer</w:t>
       </w:r>
     </w:p>
     <w:p>
@@ -3417,7 +3410,7 @@
         <w:pStyle w:val="Heading3"/>
       </w:pPr>
       <w:r>
-        <w:t>23.1 Acquisition and inventory failure</w:t>
+        <w:t>23.1. Acquisition and inventory failure</w:t>
       </w:r>
     </w:p>
     <w:p>
@@ -3435,7 +3428,7 @@
         <w:pStyle w:val="Heading3"/>
       </w:pPr>
       <w:r>
-        <w:t>23.2 Parsing or semantic mismatch</w:t>
+        <w:t>23.2. Parsing or semantic mismatch</w:t>
       </w:r>
     </w:p>
     <w:p>
@@ -3453,7 +3446,7 @@
         <w:pStyle w:val="Heading3"/>
       </w:pPr>
       <w:r>
-        <w:t>23.3 Store open or migration failure</w:t>
+        <w:t>23.3. Store open or migration failure</w:t>
       </w:r>
     </w:p>
     <w:p>
@@ -3471,7 +3464,7 @@
         <w:pStyle w:val="Heading3"/>
       </w:pPr>
       <w:r>
-        <w:t>23.4 Save conflict or lost draft report</w:t>
+        <w:t>23.4. Save conflict or lost draft report</w:t>
       </w:r>
     </w:p>
     <w:p>
@@ -3489,7 +3482,7 @@
         <w:pStyle w:val="Heading3"/>
       </w:pPr>
       <w:r>
-        <w:t>23.5 Export or navigation failure</w:t>
+        <w:t>23.5. Export or navigation failure</w:t>
       </w:r>
     </w:p>
     <w:p>
@@ -3507,7 +3500,7 @@
         <w:pStyle w:val="Heading3"/>
       </w:pPr>
       <w:r>
-        <w:t>23.6 Native layout or browser display failure</w:t>
+        <w:t>23.6. Native layout or browser display failure</w:t>
       </w:r>
     </w:p>
     <w:p>
@@ -3527,7 +3520,7 @@
         <w:spacing w:before="440"/>
       </w:pPr>
       <w:r>
-        <w:t>24 Maintain documentation as an engineering artifact</w:t>
+        <w:t>24. Maintain documentation as an engineering artifact</w:t>
       </w:r>
     </w:p>
     <w:p>
@@ -3535,7 +3528,7 @@
         <w:pStyle w:val="Heading3"/>
       </w:pPr>
       <w:r>
-        <w:t>24.1 Source for the current manuals</w:t>
+        <w:t>24.1. Source for the current manuals</w:t>
       </w:r>
     </w:p>
     <w:p>
@@ -3553,7 +3546,7 @@
         <w:pStyle w:val="Heading3"/>
       </w:pPr>
       <w:r>
-        <w:t>24.2 Editable contents and companion PDFs</w:t>
+        <w:t>24.2. Editable contents and companion PDFs</w:t>
       </w:r>
     </w:p>
     <w:p>
@@ -3571,12 +3564,12 @@
         <w:pStyle w:val="Heading3"/>
       </w:pPr>
       <w:r>
-        <w:t>24.3 Review depth and instructional completeness</w:t>
-      </w:r>
-    </w:p>
-    <w:p>
-      <w:r>
-        <w:t>For the User Guide, verify that a person can extract, open, identify controls, complete the supplied learning path, save progress, choose another application, interpret source connections, prepare each contribution type, review it and share it. Include exact actions, examples, expected results, field limits and recovery instructions where applicable.</w:t>
+        <w:t>24.3. Review depth and instructional completeness</w:t>
+      </w:r>
+    </w:p>
+    <w:p>
+      <w:r>
+        <w:t>For the User Guide, verify that a person can extract, open, choose an unfamiliar application, follow its four-part route, identify an authored task or a missing explanation, save progress, choose another application, interpret source connections, prepare each contribution type, review it and share it. Include exact actions, examples, expected results, field limits and recovery instructions where applicable.</w:t>
       </w:r>
     </w:p>
     <w:p>
@@ -3589,7 +3582,7 @@
         <w:pStyle w:val="Heading3"/>
       </w:pPr>
       <w:r>
-        <w:t>24.4 Visual and privacy checks</w:t>
+        <w:t>24.4. Visual and privacy checks</w:t>
       </w:r>
     </w:p>
     <w:p>
@@ -3605,10 +3598,11 @@
     <w:p>
       <w:pPr>
         <w:pStyle w:val="Heading1"/>
-        <w:pageBreakBefore/>
-      </w:pPr>
-      <w:r>
-        <w:t>Part VI Technical reference</w:t>
+        <w:pageBreakBefore w:val="0"/>
+        <w:spacing w:before="480"/>
+      </w:pPr>
+      <w:r>
+        <w:t>PART 6: Technical reference</w:t>
       </w:r>
     </w:p>
     <w:p>
@@ -3618,7 +3612,7 @@
         <w:spacing w:before="260"/>
       </w:pPr>
       <w:r>
-        <w:t>25 Source units and public contracts</w:t>
+        <w:t>25. Source units and public contracts</w:t>
       </w:r>
     </w:p>
     <w:p>
@@ -3626,7 +3620,7 @@
         <w:pStyle w:val="Heading3"/>
       </w:pPr>
       <w:r>
-        <w:t>25.1 Reading the generated unit reference</w:t>
+        <w:t>25.1. Reading the generated unit reference</w:t>
       </w:r>
     </w:p>
     <w:p>
@@ -3644,7 +3638,7 @@
         <w:pStyle w:val="Heading3"/>
       </w:pPr>
       <w:r>
-        <w:t>25.2 Analysis.Async</w:t>
+        <w:t>25.2. Analysis.Async</w:t>
       </w:r>
     </w:p>
     <w:p>
@@ -3674,7 +3668,7 @@
         <w:pStyle w:val="Heading3"/>
       </w:pPr>
       <w:r>
-        <w:t>25.3 Analysis.Explanations</w:t>
+        <w:t>25.3. Analysis.Explanations</w:t>
       </w:r>
     </w:p>
     <w:p>
@@ -3816,6 +3810,18 @@
           <w:rFonts w:ascii="Consolas" w:hAnsi="Consolas"/>
           <w:sz w:val="18"/>
         </w:rPr>
+        <w:t>function ApplicationRouteHTML(AIndex: Integer): string;</w:t>
+      </w:r>
+    </w:p>
+    <w:p>
+      <w:pPr>
+        <w:spacing w:after="40" w:line="247" w:lineRule="auto"/>
+      </w:pPr>
+      <w:r>
+        <w:rPr>
+          <w:rFonts w:ascii="Consolas" w:hAnsi="Consolas"/>
+          <w:sz w:val="18"/>
+        </w:rPr>
         <w:t>function FlowSVG(const AKey: string): string;</w:t>
       </w:r>
     </w:p>
@@ -3869,10 +3875,22 @@
     </w:p>
     <w:p>
       <w:pPr>
+        <w:spacing w:after="40" w:line="247" w:lineRule="auto"/>
+      </w:pPr>
+      <w:r>
+        <w:rPr>
+          <w:rFonts w:ascii="Consolas" w:hAnsi="Consolas"/>
+          <w:sz w:val="18"/>
+        </w:rPr>
+        <w:t>class function ApplicationRouteTitle(AIndex: Integer): string;</w:t>
+      </w:r>
+    </w:p>
+    <w:p>
+      <w:pPr>
         <w:pStyle w:val="Heading3"/>
       </w:pPr>
       <w:r>
-        <w:t>25.4 Analysis.Flow</w:t>
+        <w:t>25.4. Analysis.Flow</w:t>
       </w:r>
     </w:p>
     <w:p>
@@ -3914,7 +3932,7 @@
         <w:pStyle w:val="Heading3"/>
       </w:pPr>
       <w:r>
-        <w:t>25.5 Analysis.Model</w:t>
+        <w:t>25.5. Analysis.Model</w:t>
       </w:r>
     </w:p>
     <w:p>
@@ -4076,7 +4094,7 @@
         <w:pStyle w:val="Heading3"/>
       </w:pPr>
       <w:r>
-        <w:t>25.6 Analysis.Persistence</w:t>
+        <w:t>25.6. Analysis.Persistence</w:t>
       </w:r>
     </w:p>
     <w:p>
@@ -4142,7 +4160,7 @@
         <w:pStyle w:val="Heading3"/>
       </w:pPr>
       <w:r>
-        <w:t>25.7 Analysis.Quality</w:t>
+        <w:t>25.7. Analysis.Quality</w:t>
       </w:r>
     </w:p>
     <w:p>
@@ -4172,7 +4190,7 @@
         <w:pStyle w:val="Heading3"/>
       </w:pPr>
       <w:r>
-        <w:t>25.8 Analysis.SQL</w:t>
+        <w:t>25.8. Analysis.SQL</w:t>
       </w:r>
     </w:p>
     <w:p>
@@ -4202,7 +4220,7 @@
         <w:pStyle w:val="Heading3"/>
       </w:pPr>
       <w:r>
-        <w:t>25.9 Analysis.Symbols</w:t>
+        <w:t>25.9. Analysis.Symbols</w:t>
       </w:r>
     </w:p>
     <w:p>
@@ -4256,7 +4274,7 @@
         <w:pStyle w:val="Heading3"/>
       </w:pPr>
       <w:r>
-        <w:t>25.10 Knowledge.ActionPurpose</w:t>
+        <w:t>25.10. Knowledge.ActionPurpose</w:t>
       </w:r>
     </w:p>
     <w:p>
@@ -4317,7 +4335,7 @@
         <w:pStyle w:val="Heading3"/>
       </w:pPr>
       <w:r>
-        <w:t>25.11 Knowledge.ComponentDependency</w:t>
+        <w:t>25.11. Knowledge.ComponentDependency</w:t>
       </w:r>
     </w:p>
     <w:p>
@@ -4366,7 +4384,7 @@
         <w:pStyle w:val="Heading3"/>
       </w:pPr>
       <w:r>
-        <w:t>25.12 Knowledge.Glossary</w:t>
+        <w:t>25.12. Knowledge.Glossary</w:t>
       </w:r>
     </w:p>
     <w:p>
@@ -4432,7 +4450,7 @@
         <w:pStyle w:val="Heading3"/>
       </w:pPr>
       <w:r>
-        <w:t>25.13 Knowledge.ProjectProfile</w:t>
+        <w:t>25.13. Knowledge.ProjectProfile</w:t>
       </w:r>
     </w:p>
     <w:p>
@@ -4474,7 +4492,7 @@
         <w:pStyle w:val="Heading3"/>
       </w:pPr>
       <w:r>
-        <w:t>25.14 Parse.Forms</w:t>
+        <w:t>25.14. Parse.Forms</w:t>
       </w:r>
     </w:p>
     <w:p>
@@ -4504,7 +4522,7 @@
         <w:pStyle w:val="Heading3"/>
       </w:pPr>
       <w:r>
-        <w:t>25.15 Parse.Lexer</w:t>
+        <w:t>25.15. Parse.Lexer</w:t>
       </w:r>
     </w:p>
     <w:p>
@@ -4534,7 +4552,7 @@
         <w:pStyle w:val="Heading3"/>
       </w:pPr>
       <w:r>
-        <w:t>25.16 Parse.Model</w:t>
+        <w:t>25.16. Parse.Model</w:t>
       </w:r>
     </w:p>
     <w:p>
@@ -4624,7 +4642,7 @@
         <w:pStyle w:val="Heading3"/>
       </w:pPr>
       <w:r>
-        <w:t>25.17 Parse.Pascal</w:t>
+        <w:t>25.17. Parse.Pascal</w:t>
       </w:r>
     </w:p>
     <w:p>
@@ -4654,7 +4672,7 @@
         <w:pStyle w:val="Heading3"/>
       </w:pPr>
       <w:r>
-        <w:t>25.18 Parse.Preprocessor</w:t>
+        <w:t>25.18. Parse.Preprocessor</w:t>
       </w:r>
     </w:p>
     <w:p>
@@ -4780,7 +4798,7 @@
         <w:pStyle w:val="Heading3"/>
       </w:pPr>
       <w:r>
-        <w:t>25.19 Parse.Resources</w:t>
+        <w:t>25.19. Parse.Resources</w:t>
       </w:r>
     </w:p>
     <w:p>
@@ -4810,7 +4828,7 @@
         <w:pStyle w:val="Heading3"/>
       </w:pPr>
       <w:r>
-        <w:t>25.20 Project.Analysis</w:t>
+        <w:t>25.20. Project.Analysis</w:t>
       </w:r>
     </w:p>
     <w:p>
@@ -4972,7 +4990,7 @@
         <w:pStyle w:val="Heading3"/>
       </w:pPr>
       <w:r>
-        <w:t>25.21 Project.Inventory</w:t>
+        <w:t>25.21. Project.Inventory</w:t>
       </w:r>
     </w:p>
     <w:p>
@@ -5074,7 +5092,7 @@
         <w:pStyle w:val="Heading3"/>
       </w:pPr>
       <w:r>
-        <w:t>25.22 Project.Source</w:t>
+        <w:t>25.22. Project.Source</w:t>
       </w:r>
     </w:p>
     <w:p>
@@ -5128,7 +5146,7 @@
         <w:pStyle w:val="Heading3"/>
       </w:pPr>
       <w:r>
-        <w:t>25.23 Publish.BrowserPolicy</w:t>
+        <w:t>25.23. Publish.BrowserPolicy</w:t>
       </w:r>
     </w:p>
     <w:p>
@@ -5165,7 +5183,7 @@
         <w:pStyle w:val="Heading3"/>
       </w:pPr>
       <w:r>
-        <w:t>25.24 Publish.Export</w:t>
+        <w:t>25.24. Publish.Export</w:t>
       </w:r>
     </w:p>
     <w:p>
@@ -5267,7 +5285,7 @@
         <w:pStyle w:val="Heading3"/>
       </w:pPr>
       <w:r>
-        <w:t>25.25 Publish.Model</w:t>
+        <w:t>25.25. Publish.Model</w:t>
       </w:r>
     </w:p>
     <w:p>
@@ -5393,7 +5411,7 @@
         <w:pStyle w:val="Heading3"/>
       </w:pPr>
       <w:r>
-        <w:t>25.26 Publish.Translation</w:t>
+        <w:t>25.26. Publish.Translation</w:t>
       </w:r>
     </w:p>
     <w:p>
@@ -5639,7 +5657,7 @@
         <w:pStyle w:val="Heading3"/>
       </w:pPr>
       <w:r>
-        <w:t>25.27 Storage.Backup</w:t>
+        <w:t>25.27. Storage.Backup</w:t>
       </w:r>
     </w:p>
     <w:p>
@@ -5681,7 +5699,7 @@
         <w:pStyle w:val="Heading3"/>
       </w:pPr>
       <w:r>
-        <w:t>25.28 Storage.Database</w:t>
+        <w:t>25.28. Storage.Database</w:t>
       </w:r>
     </w:p>
     <w:p>
@@ -6659,7 +6677,7 @@
         <w:pStyle w:val="Heading3"/>
       </w:pPr>
       <w:r>
-        <w:t>25.29 Storage.Types</w:t>
+        <w:t>25.29. Storage.Types</w:t>
       </w:r>
     </w:p>
     <w:p>
@@ -6682,7 +6700,7 @@
         <w:pStyle w:val="Heading3"/>
       </w:pPr>
       <w:r>
-        <w:t>25.30 UI.ActionPurpose</w:t>
+        <w:t>25.30. UI.ActionPurpose</w:t>
       </w:r>
     </w:p>
     <w:p>
@@ -6736,7 +6754,7 @@
         <w:pStyle w:val="Heading3"/>
       </w:pPr>
       <w:r>
-        <w:t>25.31 UI.ComponentDependency</w:t>
+        <w:t>25.31. UI.ComponentDependency</w:t>
       </w:r>
     </w:p>
     <w:p>
@@ -6790,7 +6808,7 @@
         <w:pStyle w:val="Heading3"/>
       </w:pPr>
       <w:r>
-        <w:t>25.32 UI.DatabaseDictionary</w:t>
+        <w:t>25.32. UI.DatabaseDictionary</w:t>
       </w:r>
     </w:p>
     <w:p>
@@ -6844,7 +6862,7 @@
         <w:pStyle w:val="Heading3"/>
       </w:pPr>
       <w:r>
-        <w:t>25.33 UI.Glossary</w:t>
+        <w:t>25.33. UI.Glossary</w:t>
       </w:r>
     </w:p>
     <w:p>
@@ -6898,7 +6916,7 @@
         <w:pStyle w:val="Heading3"/>
       </w:pPr>
       <w:r>
-        <w:t>25.34 UI.Main</w:t>
+        <w:t>25.34. UI.Main</w:t>
       </w:r>
     </w:p>
     <w:p>
@@ -8780,18 +8798,6 @@
           <w:rFonts w:ascii="Consolas" w:hAnsi="Consolas"/>
           <w:sz w:val="18"/>
         </w:rPr>
-        <w:t>procedure PracticeClick(Sender:TObject);</w:t>
-      </w:r>
-    </w:p>
-    <w:p>
-      <w:pPr>
-        <w:spacing w:after="40" w:line="247" w:lineRule="auto"/>
-      </w:pPr>
-      <w:r>
-        <w:rPr>
-          <w:rFonts w:ascii="Consolas" w:hAnsi="Consolas"/>
-          <w:sz w:val="18"/>
-        </w:rPr>
         <w:t>procedure CardFilterChange(Sender:TObject);</w:t>
       </w:r>
     </w:p>
@@ -9548,7 +9554,7 @@
           <w:rFonts w:ascii="Consolas" w:hAnsi="Consolas"/>
           <w:sz w:val="18"/>
         </w:rPr>
-        <w:t>procedure OpenSelection(const AEntry,ADatabase: string;APractice:Boolean=False);</w:t>
+        <w:t>procedure OpenSelection(const AEntry,ADatabase: string);</w:t>
       </w:r>
     </w:p>
     <w:p>
@@ -9652,7 +9658,7 @@
         <w:pStyle w:val="Heading3"/>
       </w:pPr>
       <w:r>
-        <w:t>25.35 UI.ProjectProfile</w:t>
+        <w:t>25.35. UI.ProjectProfile</w:t>
       </w:r>
     </w:p>
     <w:p>
@@ -9706,7 +9712,7 @@
         <w:pStyle w:val="Heading3"/>
       </w:pPr>
       <w:r>
-        <w:t>25.36 Workspace.ActionPurposes</w:t>
+        <w:t>25.36. Workspace.ActionPurposes</w:t>
       </w:r>
     </w:p>
     <w:p>
@@ -9779,7 +9785,7 @@
         <w:pStyle w:val="Heading3"/>
       </w:pPr>
       <w:r>
-        <w:t>25.37 Workspace.Catalog</w:t>
+        <w:t>25.37. Workspace.Catalog</w:t>
       </w:r>
     </w:p>
     <w:p>
@@ -9929,7 +9935,7 @@
         <w:pStyle w:val="Heading3"/>
       </w:pPr>
       <w:r>
-        <w:t>25.38 Workspace.Commands</w:t>
+        <w:t>25.38. Workspace.Commands</w:t>
       </w:r>
     </w:p>
     <w:p>
@@ -9971,7 +9977,7 @@
         <w:pStyle w:val="Heading3"/>
       </w:pPr>
       <w:r>
-        <w:t>25.39 Workspace.Comparison</w:t>
+        <w:t>25.39. Workspace.Comparison</w:t>
       </w:r>
     </w:p>
     <w:p>
@@ -10025,7 +10031,7 @@
         <w:pStyle w:val="Heading3"/>
       </w:pPr>
       <w:r>
-        <w:t>25.40 Workspace.ComponentDependencies</w:t>
+        <w:t>25.40. Workspace.ComponentDependencies</w:t>
       </w:r>
     </w:p>
     <w:p>
@@ -10074,7 +10080,7 @@
         <w:pStyle w:val="Heading3"/>
       </w:pPr>
       <w:r>
-        <w:t>25.41 Workspace.DatabaseConnections</w:t>
+        <w:t>25.41. Workspace.DatabaseConnections</w:t>
       </w:r>
     </w:p>
     <w:p>
@@ -10152,7 +10158,7 @@
         <w:pStyle w:val="Heading3"/>
       </w:pPr>
       <w:r>
-        <w:t>25.42 Workspace.DatabaseSchema</w:t>
+        <w:t>25.42. Workspace.DatabaseSchema</w:t>
       </w:r>
     </w:p>
     <w:p>
@@ -10297,7 +10303,7 @@
         <w:pStyle w:val="Heading3"/>
       </w:pPr>
       <w:r>
-        <w:t>25.43 Workspace.DynamicControls</w:t>
+        <w:t>25.43. Workspace.DynamicControls</w:t>
       </w:r>
     </w:p>
     <w:p>
@@ -10339,7 +10345,7 @@
         <w:pStyle w:val="Heading3"/>
       </w:pPr>
       <w:r>
-        <w:t>25.44 Workspace.FormInheritance</w:t>
+        <w:t>25.44. Workspace.FormInheritance</w:t>
       </w:r>
     </w:p>
     <w:p>
@@ -10381,7 +10387,7 @@
         <w:pStyle w:val="Heading3"/>
       </w:pPr>
       <w:r>
-        <w:t>25.45 Workspace.Graphs</w:t>
+        <w:t>25.45. Workspace.Graphs</w:t>
       </w:r>
     </w:p>
     <w:p>
@@ -10459,7 +10465,7 @@
         <w:pStyle w:val="Heading3"/>
       </w:pPr>
       <w:r>
-        <w:t>25.46 Workspace.Keyboard</w:t>
+        <w:t>25.46. Workspace.Keyboard</w:t>
       </w:r>
     </w:p>
     <w:p>
@@ -10525,7 +10531,7 @@
         <w:pStyle w:val="Heading3"/>
       </w:pPr>
       <w:r>
-        <w:t>25.47 Workspace.LayoutRules</w:t>
+        <w:t>25.47. Workspace.LayoutRules</w:t>
       </w:r>
     </w:p>
     <w:p>
@@ -10567,7 +10573,7 @@
         <w:pStyle w:val="Heading3"/>
       </w:pPr>
       <w:r>
-        <w:t>25.48 Workspace.Model</w:t>
+        <w:t>25.48. Workspace.Model</w:t>
       </w:r>
     </w:p>
     <w:p>
@@ -11389,7 +11395,7 @@
         <w:pStyle w:val="Heading3"/>
       </w:pPr>
       <w:r>
-        <w:t>25.49 Workspace.Screen</w:t>
+        <w:t>25.49. Workspace.Screen</w:t>
       </w:r>
     </w:p>
     <w:p>
@@ -11431,7 +11437,7 @@
         <w:pStyle w:val="Heading3"/>
       </w:pPr>
       <w:r>
-        <w:t>25.50 Workspace.ScreenHistory</w:t>
+        <w:t>25.50. Workspace.ScreenHistory</w:t>
       </w:r>
     </w:p>
     <w:p>
@@ -11504,7 +11510,7 @@
         <w:pStyle w:val="Heading3"/>
       </w:pPr>
       <w:r>
-        <w:t>25.51 Workspace.Worker</w:t>
+        <w:t>25.51. Workspace.Worker</w:t>
       </w:r>
     </w:p>
     <w:p>
@@ -11596,7 +11602,7 @@
         <w:spacing w:before="440"/>
       </w:pPr>
       <w:r>
-        <w:t>26 Persisted schema and migration reference</w:t>
+        <w:t>26. Persisted schema and migration reference</w:t>
       </w:r>
     </w:p>
     <w:p>
@@ -11604,7 +11610,7 @@
         <w:pStyle w:val="Heading3"/>
       </w:pPr>
       <w:r>
-        <w:t>26.1 How to read a table definition</w:t>
+        <w:t>26.1. How to read a table definition</w:t>
       </w:r>
     </w:p>
     <w:p>
@@ -11622,7 +11628,7 @@
         <w:pStyle w:val="Heading3"/>
       </w:pPr>
       <w:r>
-        <w:t>26.2 Migration 001 foundation</w:t>
+        <w:t>26.2. Migration 001 foundation</w:t>
       </w:r>
     </w:p>
     <w:p>
@@ -13920,7 +13926,7 @@
         <w:pStyle w:val="Heading3"/>
       </w:pPr>
       <w:r>
-        <w:t>26.3 Migration 002 constraints</w:t>
+        <w:t>26.3. Migration 002 constraints</w:t>
       </w:r>
     </w:p>
     <w:p>
@@ -14591,7 +14597,7 @@
         <w:pStyle w:val="Heading3"/>
       </w:pPr>
       <w:r>
-        <w:t>26.4 Migration 003 lifecycle</w:t>
+        <w:t>26.4. Migration 003 lifecycle</w:t>
       </w:r>
     </w:p>
     <w:p>
@@ -14748,7 +14754,7 @@
         <w:pStyle w:val="Heading3"/>
       </w:pPr>
       <w:r>
-        <w:t>26.5 Migration 004 search</w:t>
+        <w:t>26.5. Migration 004 search</w:t>
       </w:r>
     </w:p>
     <w:p>
@@ -14970,7 +14976,7 @@
         <w:pStyle w:val="Heading3"/>
       </w:pPr>
       <w:r>
-        <w:t>26.6 Migration 005 document sections</w:t>
+        <w:t>26.6. Migration 005 document sections</w:t>
       </w:r>
     </w:p>
     <w:p>
@@ -15079,7 +15085,7 @@
         <w:pStyle w:val="Heading3"/>
       </w:pPr>
       <w:r>
-        <w:t>26.7 Migration 006 revision links</w:t>
+        <w:t>26.7. Migration 006 revision links</w:t>
       </w:r>
     </w:p>
     <w:p>
@@ -15229,7 +15235,7 @@
         <w:pStyle w:val="Heading3"/>
       </w:pPr>
       <w:r>
-        <w:t>26.8 Migration 007 author questions</w:t>
+        <w:t>26.8. Migration 007 author questions</w:t>
       </w:r>
     </w:p>
     <w:p>
@@ -15319,7 +15325,7 @@
         <w:pStyle w:val="Heading3"/>
       </w:pPr>
       <w:r>
-        <w:t>26.9 Migration 008 translation cache</w:t>
+        <w:t>26.9. Migration 008 translation cache</w:t>
       </w:r>
     </w:p>
     <w:p>
@@ -15373,7 +15379,7 @@
         <w:pStyle w:val="Heading3"/>
       </w:pPr>
       <w:r>
-        <w:t>26.10 Migration 009 structured knowledge</w:t>
+        <w:t>26.10. Migration 009 structured knowledge</w:t>
       </w:r>
     </w:p>
     <w:p>
@@ -15412,7 +15418,7 @@
         <w:spacing w:before="440"/>
       </w:pPr>
       <w:r>
-        <w:t>27 Engineering change and release checklists</w:t>
+        <w:t>27. Engineering change and release checklists</w:t>
       </w:r>
     </w:p>
     <w:p>
@@ -15420,7 +15426,7 @@
         <w:pStyle w:val="Heading3"/>
       </w:pPr>
       <w:r>
-        <w:t>27.1 Before changing a contract</w:t>
+        <w:t>27.1. Before changing a contract</w:t>
       </w:r>
     </w:p>
     <w:p>
@@ -15503,7 +15509,7 @@
         <w:pStyle w:val="Heading3"/>
       </w:pPr>
       <w:r>
-        <w:t>27.2 Before declaring the change validated</w:t>
+        <w:t>27.2. Before declaring the change validated</w:t>
       </w:r>
     </w:p>
     <w:p>
@@ -15601,7 +15607,7 @@
         <w:pStyle w:val="Heading3"/>
       </w:pPr>
       <w:r>
-        <w:t>27.3 Before delivering a release</w:t>
+        <w:t>27.3. Before delivering a release</w:t>
       </w:r>
     </w:p>
     <w:p>
@@ -15631,7 +15637,7 @@
         <w:t xml:space="preserve">2. </w:t>
       </w:r>
       <w:r>
-        <w:t>Package required files only, including the exact supplied practice pack and current guides.</w:t>
+        <w:t>Package required files only, including current guides and help. Exclude developer-only lesson fixtures and owner data from the desktop delivery.</w:t>
       </w:r>
     </w:p>
     <w:p>
@@ -15646,7 +15652,7 @@
         <w:t xml:space="preserve">3. </w:t>
       </w:r>
       <w:r>
-        <w:t>Verify extracted binary checksums and actual native startup. Exercise the supplied learner route in a disposable copy.</w:t>
+        <w:t>Verify extracted binary checksums and actual native startup. Exercise a disposable selected application's learner route in the extracted copy.</w:t>
       </w:r>
     </w:p>
     <w:p>
@@ -15719,7 +15725,7 @@
       <w:pStyle w:val="Footer"/>
     </w:pPr>
     <w:r>
-      <w:t xml:space="preserve">Guide 42  |  13 October 2026                                    Page </w:t>
+      <w:t xml:space="preserve">Guide 43  |  13 October 2026                                    Page </w:t>
     </w:r>
     <w:r>
       <w:fldChar w:fldCharType="begin"/>

</xml_diff>

<commit_message>
Rewrite DPH User Guide for clear first-time learning
</commit_message>
<xml_diff>
--- a/docs/guides/DPH_Engineering_Guide.docx
+++ b/docs/guides/DPH_Engineering_Guide.docx
@@ -20,7 +20,7 @@
     </w:p>
     <w:p>
       <w:r>
-        <w:t>Guide edition 43</w:t>
+        <w:t>Guide edition 44</w:t>
       </w:r>
     </w:p>
     <w:p>
@@ -15725,7 +15725,7 @@
       <w:pStyle w:val="Footer"/>
     </w:pPr>
     <w:r>
-      <w:t xml:space="preserve">Guide 43  |  13 October 2026                                    Page </w:t>
+      <w:t xml:space="preserve">Guide 44  |  13 October 2026                                    Page </w:t>
     </w:r>
     <w:r>
       <w:fldChar w:fldCharType="begin"/>

</xml_diff>

<commit_message>
Refresh learning documentation and source release readiness
</commit_message>
<xml_diff>
--- a/docs/guides/DPH_Engineering_Guide.docx
+++ b/docs/guides/DPH_Engineering_Guide.docx
@@ -20,12 +20,12 @@
     </w:p>
     <w:p>
       <w:r>
-        <w:t>Guide edition 44</w:t>
-      </w:r>
-    </w:p>
-    <w:p>
-      <w:r>
-        <w:t>Last changed 13 October 2026</w:t>
+        <w:t>Guide edition 45</w:t>
+      </w:r>
+    </w:p>
+    <w:p>
+      <w:r>
+        <w:t>Last changed 14 October 2026</w:t>
       </w:r>
     </w:p>
     <w:p>
@@ -40,7 +40,7 @@
     </w:p>
     <w:p>
       <w:r>
-        <w:t>This manual describes Delphi Project Handoff. Lessons about a selected Delphi application are separate material displayed and published by the program.</w:t>
+        <w:t>This manual describes Delphi Project Handoff. Information about a selected Delphi application is presented separately by the program.</w:t>
       </w:r>
     </w:p>
     <w:p>
@@ -139,7 +139,7 @@
       </w:r>
       <w:r>
         <w:tab/>
-        <w:t>6</w:t>
+        <w:t>7</w:t>
       </w:r>
     </w:p>
     <w:p>
@@ -154,7 +154,7 @@
       </w:r>
       <w:r>
         <w:tab/>
-        <w:t>7</w:t>
+        <w:t>8</w:t>
       </w:r>
     </w:p>
     <w:p>
@@ -169,7 +169,7 @@
       </w:r>
       <w:r>
         <w:tab/>
-        <w:t>8</w:t>
+        <w:t>9</w:t>
       </w:r>
     </w:p>
     <w:p>
@@ -184,7 +184,7 @@
       </w:r>
       <w:r>
         <w:tab/>
-        <w:t>9</w:t>
+        <w:t>10</w:t>
       </w:r>
     </w:p>
     <w:p>
@@ -199,7 +199,7 @@
       </w:r>
       <w:r>
         <w:tab/>
-        <w:t>9</w:t>
+        <w:t>10</w:t>
       </w:r>
     </w:p>
     <w:p>
@@ -214,7 +214,7 @@
       </w:r>
       <w:r>
         <w:tab/>
-        <w:t>10</w:t>
+        <w:t>11</w:t>
       </w:r>
     </w:p>
     <w:p>
@@ -229,7 +229,7 @@
       </w:r>
       <w:r>
         <w:tab/>
-        <w:t>11</w:t>
+        <w:t>12</w:t>
       </w:r>
     </w:p>
     <w:p>
@@ -274,7 +274,7 @@
       </w:r>
       <w:r>
         <w:tab/>
-        <w:t>14</w:t>
+        <w:t>15</w:t>
       </w:r>
     </w:p>
     <w:p>
@@ -289,7 +289,7 @@
       </w:r>
       <w:r>
         <w:tab/>
-        <w:t>14</w:t>
+        <w:t>15</w:t>
       </w:r>
     </w:p>
     <w:p>
@@ -304,7 +304,7 @@
       </w:r>
       <w:r>
         <w:tab/>
-        <w:t>15</w:t>
+        <w:t>16</w:t>
       </w:r>
     </w:p>
     <w:p>
@@ -319,7 +319,7 @@
       </w:r>
       <w:r>
         <w:tab/>
-        <w:t>16</w:t>
+        <w:t>17</w:t>
       </w:r>
     </w:p>
     <w:p>
@@ -334,7 +334,7 @@
       </w:r>
       <w:r>
         <w:tab/>
-        <w:t>17</w:t>
+        <w:t>18</w:t>
       </w:r>
     </w:p>
     <w:p>
@@ -349,7 +349,7 @@
       </w:r>
       <w:r>
         <w:tab/>
-        <w:t>19</w:t>
+        <w:t>20</w:t>
       </w:r>
     </w:p>
     <w:p>
@@ -364,7 +364,7 @@
       </w:r>
       <w:r>
         <w:tab/>
-        <w:t>20</w:t>
+        <w:t>21</w:t>
       </w:r>
     </w:p>
     <w:p>
@@ -379,7 +379,7 @@
       </w:r>
       <w:r>
         <w:tab/>
-        <w:t>21</w:t>
+        <w:t>22</w:t>
       </w:r>
     </w:p>
     <w:p>
@@ -394,7 +394,7 @@
       </w:r>
       <w:r>
         <w:tab/>
-        <w:t>21</w:t>
+        <w:t>22</w:t>
       </w:r>
     </w:p>
     <w:p>
@@ -454,7 +454,7 @@
       </w:r>
       <w:r>
         <w:tab/>
-        <w:t>25</w:t>
+        <w:t>26</w:t>
       </w:r>
     </w:p>
     <w:p>
@@ -469,7 +469,7 @@
       </w:r>
       <w:r>
         <w:tab/>
-        <w:t>26</w:t>
+        <w:t>27</w:t>
       </w:r>
     </w:p>
     <w:p>
@@ -514,7 +514,7 @@
       </w:r>
       <w:r>
         <w:tab/>
-        <w:t>30</w:t>
+        <w:t>31</w:t>
       </w:r>
     </w:p>
     <w:p>
@@ -529,7 +529,7 @@
       </w:r>
       <w:r>
         <w:tab/>
-        <w:t>30</w:t>
+        <w:t>31</w:t>
       </w:r>
     </w:p>
     <w:p>
@@ -544,7 +544,7 @@
       </w:r>
       <w:r>
         <w:tab/>
-        <w:t>48</w:t>
+        <w:t>49</w:t>
       </w:r>
     </w:p>
     <w:p>
@@ -559,7 +559,7 @@
       </w:r>
       <w:r>
         <w:tab/>
-        <w:t>56</w:t>
+        <w:t>57</w:t>
       </w:r>
     </w:p>
     <w:p>
@@ -611,6 +611,11 @@
       </w:r>
     </w:p>
     <w:p>
+      <w:r>
+        <w:t>The visible learner workflow has six tabs: Getting started, Learn the project, Learning library, Project map, Screenshots, and Application diagrams. Open application starts a source capture; Open saved project restores a .dphdb and its adjacent .views folder. Older authoring, lesson, and specialist controls remain serialized or implemented for compatibility, but must not be described as visible first-use commands.</w:t>
+      </w:r>
+    </w:p>
+    <w:p>
       <w:pPr>
         <w:pStyle w:val="Heading3"/>
       </w:pPr>
@@ -734,6 +739,11 @@
       </w:r>
     </w:p>
     <w:p>
+      <w:r>
+        <w:t>DPH.Learning.Discovery scans eligible documents only within the selected project directory. It bounds traversal and samples documents and logs before building Learning library entries. The text-quality filter must count Unicode letters, not only ASCII Latin letters; otherwise readable Arabic, CJK, Cyrillic, and other guides disappear even though DPH's interface has offline language packs. A discovered file with no usable text should carry a visible reason. PDF and older word-processing extraction depends on LibreOffice at the standard Windows path; DOCX and supported text formats are processed directly. Referenced public HTTPS pages may be contacted when Internet access is available, so release directions must disclose that optional network behavior.</w:t>
+      </w:r>
+    </w:p>
+    <w:p>
       <w:pPr>
         <w:pStyle w:val="Heading2"/>
         <w:pageBreakBefore w:val="0"/>
@@ -3181,7 +3191,7 @@
     </w:p>
     <w:p>
       <w:r>
-        <w:t>DPH.Tests.LearningRefocus creates a disposable selected-project capture, verifies that the four main pages use that project's own forms and action links, and confirms that no OrderPractice lessons are imported. Its native WebView2 path checks the route title, internal links, text fallback and compact layout. The test writes screenshots into its disposable workspace so validation does not overwrite the published manuals' images.</w:t>
+        <w:t>DPH.Tests.LearningRefocus creates a disposable selected-project capture, verifies that the main learner views use that project's own forms and action links, and confirms that no OrderPractice lessons are imported. Its native WebView2 path checks the route title, internal links, text fallback and compact layout. The test writes screenshots into its disposable workspace and publishes selected current-interface captures for the manuals only after all checks pass.</w:t>
       </w:r>
     </w:p>
     <w:p>
@@ -3245,12 +3255,12 @@
     </w:p>
     <w:p>
       <w:r>
-        <w:t>The desktop package is intended to contain DelphiProjectHandoff.exe, DPH.ValidateHandoff.exe, WebView2Loader.dll, migrations, help, current guides and directions, Databases instructions and required licenses. It does not include the OrderPractice developer fixture, an owner .dphdb, private document copies or reference-project working stores. A previously created package remains a historical build; rebuild only after its documentation and executable agree.</w:t>
-      </w:r>
-    </w:p>
-    <w:p>
-      <w:r>
-        <w:t>The source archive may include developer fixtures and tests for reproducibility. Their presence does not authorize the application to offer a generic practice lesson or imply that a fixture's behavior applies to the selected target.</w:t>
+        <w:t>The optional desktop package contains the Win32 and Win64 DelphiProjectHandoff.exe builds, a WebView2Loader.dll beside each, offline language packs, migrations, help, current guides, directions, and required licenses. It does not include an owner .dphdb, private document copies, or reference-project working stores. A previously created package is a historical build and must not be presented as the current executable.</w:t>
+      </w:r>
+    </w:p>
+    <w:p>
+      <w:r>
+        <w:t>The editable source distribution is the primary public delivery. It includes the project and forms, source, pinned translation dependency, guides and their source and illustrations, tests, and the OrderPractice example. That example is for reproducible development checks; it is not an imported lesson for an arbitrary selected application.</w:t>
       </w:r>
     </w:p>
     <w:p>
@@ -3273,7 +3283,7 @@
         <w:t xml:space="preserve">1. </w:t>
       </w:r>
       <w:r>
-        <w:t>Complete the relevant code/document validation and build current application and validator executables.</w:t>
+        <w:t>Complete the code and document validation and build current Win32 and Win64 Debug and Release executables.</w:t>
       </w:r>
     </w:p>
     <w:p>
@@ -3288,7 +3298,7 @@
         <w:t xml:space="preserve">2. </w:t>
       </w:r>
       <w:r>
-        <w:t>Stage the intended new source/sample/guide files. The source packager enumerates git ls-files, so unstaged new files are otherwise absent from that list.</w:t>
+        <w:t>Review the exact source files and guide illustrations to distribute. Run tools\package-source-distribution.ps1 with a fresh semantic Version value. It verifies every source file hash and refuses an existing archive name.</w:t>
       </w:r>
     </w:p>
     <w:p>
@@ -3303,7 +3313,7 @@
         <w:t xml:space="preserve">3. </w:t>
       </w:r>
       <w:r>
-        <w:t>Run tools\package-dph.ps1 with a fresh semantic Version value through PowerShell. It refuses an existing staging directory or ZIP.</w:t>
+        <w:t>Extract the source ZIP into a fresh directory and build it. Check that the example, documentation source, 35 language packs, form resources, and guide illustrations are present.</w:t>
       </w:r>
     </w:p>
     <w:p>
@@ -3318,22 +3328,7 @@
         <w:t xml:space="preserve">4. </w:t>
       </w:r>
       <w:r>
-        <w:t>Read docs/validation/reports/learning-distribution-validation.json and verify the recorded ZIP hashes and extracted-file checks.</w:t>
-      </w:r>
-    </w:p>
-    <w:p>
-      <w:pPr>
-        <w:keepLines/>
-        <w:ind w:left="317" w:hanging="317"/>
-      </w:pPr>
-      <w:r>
-        <w:rPr>
-          <w:b/>
-        </w:rPr>
-        <w:t xml:space="preserve">5. </w:t>
-      </w:r>
-      <w:r>
-        <w:t>Retain the ready-to-run folder under bin\distribution and the binary ZIP under export. Keep the source ZIP under source distributions.</w:t>
+        <w:t>If a ready-to-run experimental Windows package is also offered, run tools\package-dph.ps1 with the same version after the source and executable agree. Verify its extraction, hashes, and launch separately. Never label an older binary ZIP as the current source edition.</w:t>
       </w:r>
     </w:p>
     <w:p>
@@ -3351,7 +3346,7 @@
     </w:p>
     <w:p>
       <w:r>
-        <w:t>Extract the binary ZIP to a new writable location. Verify every SHA256.json entry against extracted bytes. Check required migrations, current manuals, local help and loader. Start the extracted executable, confirm a responsive native window and normal close, then select a disposable Delphi project and verify that its four-part route names that project without importing unrelated lessons.</w:t>
+        <w:t>Extract a newly made binary ZIP to a new writable location. Verify every SHA256.json entry against extracted bytes. Check required migrations, current manuals, local help and loader. Start the extracted executable, confirm a responsive native window and normal close, then select a disposable Delphi project and verify that Learn the project names it and the other five tabs open the corresponding findings.</w:t>
       </w:r>
     </w:p>
     <w:p>
@@ -3369,7 +3364,7 @@
     </w:p>
     <w:p>
       <w:r>
-        <w:t>Extract the source ZIP into a different new directory and run its application build/baseline there. This demonstrates that source, forms, project file, dependencies and tools required for the build are actually included. Preserve the build log and exact archive hash.</w:t>
+        <w:t>Extract the source ZIP into a different new directory and run its application build/baseline there. This demonstrates that source, forms, project file, dependencies and tools required for the build are actually included. Preserve the build log and exact archive hash. Check the source ZIP's SHA256.txt entries against extracted files.</w:t>
       </w:r>
     </w:p>
     <w:p>
@@ -3569,7 +3564,7 @@
     </w:p>
     <w:p>
       <w:r>
-        <w:t>For the User Guide, verify that a person can extract, open, choose an unfamiliar application, follow its four-part route, identify an authored task or a missing explanation, save progress, choose another application, interpret source connections, prepare each contribution type, review it and share it. Include exact actions, examples, expected results, field limits and recovery instructions where applicable.</w:t>
+        <w:t>For the User Guide, verify that a first-time reader can build and open DPH, select an unfamiliar application, follow its starting point, read a project document, inspect a source-linked object, examine a generated blank screen, understand a diagram, and reopen the saved .dphdb. Keep screenshots from the current DPH build and label form reconstructions accurately. Do not direct readers to hidden legacy authoring pages.</w:t>
       </w:r>
     </w:p>
     <w:p>
@@ -3822,6 +3817,18 @@
           <w:rFonts w:ascii="Consolas" w:hAnsi="Consolas"/>
           <w:sz w:val="18"/>
         </w:rPr>
+        <w:t>function ProjectMapHTML: string;</w:t>
+      </w:r>
+    </w:p>
+    <w:p>
+      <w:pPr>
+        <w:spacing w:after="40" w:line="247" w:lineRule="auto"/>
+      </w:pPr>
+      <w:r>
+        <w:rPr>
+          <w:rFonts w:ascii="Consolas" w:hAnsi="Consolas"/>
+          <w:sz w:val="18"/>
+        </w:rPr>
         <w:t>function FlowSVG(const AKey: string): string;</w:t>
       </w:r>
     </w:p>
@@ -4492,7 +4499,37 @@
         <w:pStyle w:val="Heading3"/>
       </w:pPr>
       <w:r>
-        <w:t>25.14. Parse.Forms</w:t>
+        <w:t>25.14. Learning.Discovery</w:t>
+      </w:r>
+    </w:p>
+    <w:p>
+      <w:r>
+        <w:t>Source file: DPH.Learning.Discovery.pas. Finds project-local documents, logs, saved screens, startup forms and referenced public websites. Retain source paths, bounded scanning, original-language text and explicit extraction status.</w:t>
+      </w:r>
+    </w:p>
+    <w:p>
+      <w:r>
+        <w:t>Principal public types: TDPHLearningDiscovery.</w:t>
+      </w:r>
+    </w:p>
+    <w:p>
+      <w:pPr>
+        <w:spacing w:after="40" w:line="247" w:lineRule="auto"/>
+      </w:pPr>
+      <w:r>
+        <w:rPr>
+          <w:rFonts w:ascii="Consolas" w:hAnsi="Consolas"/>
+          <w:sz w:val="18"/>
+        </w:rPr>
+        <w:t>class procedure AddEvidence(AFacts, AWorkspace: TJSONObject);</w:t>
+      </w:r>
+    </w:p>
+    <w:p>
+      <w:pPr>
+        <w:pStyle w:val="Heading3"/>
+      </w:pPr>
+      <w:r>
+        <w:t>25.15. Parse.Forms</w:t>
       </w:r>
     </w:p>
     <w:p>
@@ -4522,7 +4559,7 @@
         <w:pStyle w:val="Heading3"/>
       </w:pPr>
       <w:r>
-        <w:t>25.15. Parse.Lexer</w:t>
+        <w:t>25.16. Parse.Lexer</w:t>
       </w:r>
     </w:p>
     <w:p>
@@ -4552,7 +4589,7 @@
         <w:pStyle w:val="Heading3"/>
       </w:pPr>
       <w:r>
-        <w:t>25.16. Parse.Model</w:t>
+        <w:t>25.17. Parse.Model</w:t>
       </w:r>
     </w:p>
     <w:p>
@@ -4642,7 +4679,7 @@
         <w:pStyle w:val="Heading3"/>
       </w:pPr>
       <w:r>
-        <w:t>25.17. Parse.Pascal</w:t>
+        <w:t>25.18. Parse.Pascal</w:t>
       </w:r>
     </w:p>
     <w:p>
@@ -4672,7 +4709,7 @@
         <w:pStyle w:val="Heading3"/>
       </w:pPr>
       <w:r>
-        <w:t>25.18. Parse.Preprocessor</w:t>
+        <w:t>25.19. Parse.Preprocessor</w:t>
       </w:r>
     </w:p>
     <w:p>
@@ -4798,7 +4835,7 @@
         <w:pStyle w:val="Heading3"/>
       </w:pPr>
       <w:r>
-        <w:t>25.19. Parse.Resources</w:t>
+        <w:t>25.20. Parse.Resources</w:t>
       </w:r>
     </w:p>
     <w:p>
@@ -4828,7 +4865,7 @@
         <w:pStyle w:val="Heading3"/>
       </w:pPr>
       <w:r>
-        <w:t>25.20. Project.Analysis</w:t>
+        <w:t>25.21. Project.Analysis</w:t>
       </w:r>
     </w:p>
     <w:p>
@@ -4990,7 +5027,7 @@
         <w:pStyle w:val="Heading3"/>
       </w:pPr>
       <w:r>
-        <w:t>25.21. Project.Inventory</w:t>
+        <w:t>25.22. Project.Inventory</w:t>
       </w:r>
     </w:p>
     <w:p>
@@ -5092,7 +5129,7 @@
         <w:pStyle w:val="Heading3"/>
       </w:pPr>
       <w:r>
-        <w:t>25.22. Project.Source</w:t>
+        <w:t>25.23. Project.Source</w:t>
       </w:r>
     </w:p>
     <w:p>
@@ -5146,7 +5183,7 @@
         <w:pStyle w:val="Heading3"/>
       </w:pPr>
       <w:r>
-        <w:t>25.23. Publish.BrowserPolicy</w:t>
+        <w:t>25.24. Publish.BrowserPolicy</w:t>
       </w:r>
     </w:p>
     <w:p>
@@ -5183,7 +5220,7 @@
         <w:pStyle w:val="Heading3"/>
       </w:pPr>
       <w:r>
-        <w:t>25.24. Publish.Export</w:t>
+        <w:t>25.25. Publish.Export</w:t>
       </w:r>
     </w:p>
     <w:p>
@@ -5285,7 +5322,7 @@
         <w:pStyle w:val="Heading3"/>
       </w:pPr>
       <w:r>
-        <w:t>25.25. Publish.Model</w:t>
+        <w:t>25.26. Publish.Model</w:t>
       </w:r>
     </w:p>
     <w:p>
@@ -5411,7 +5448,7 @@
         <w:pStyle w:val="Heading3"/>
       </w:pPr>
       <w:r>
-        <w:t>25.26. Publish.Translation</w:t>
+        <w:t>25.27. Publish.Translation</w:t>
       </w:r>
     </w:p>
     <w:p>
@@ -5657,7 +5694,7 @@
         <w:pStyle w:val="Heading3"/>
       </w:pPr>
       <w:r>
-        <w:t>25.27. Storage.Backup</w:t>
+        <w:t>25.28. Storage.Backup</w:t>
       </w:r>
     </w:p>
     <w:p>
@@ -5699,7 +5736,7 @@
         <w:pStyle w:val="Heading3"/>
       </w:pPr>
       <w:r>
-        <w:t>25.28. Storage.Database</w:t>
+        <w:t>25.29. Storage.Database</w:t>
       </w:r>
     </w:p>
     <w:p>
@@ -6677,7 +6714,7 @@
         <w:pStyle w:val="Heading3"/>
       </w:pPr>
       <w:r>
-        <w:t>25.29. Storage.Types</w:t>
+        <w:t>25.30. Storage.Types</w:t>
       </w:r>
     </w:p>
     <w:p>
@@ -6700,7 +6737,7 @@
         <w:pStyle w:val="Heading3"/>
       </w:pPr>
       <w:r>
-        <w:t>25.30. UI.ActionPurpose</w:t>
+        <w:t>25.31. UI.ActionPurpose</w:t>
       </w:r>
     </w:p>
     <w:p>
@@ -6754,7 +6791,7 @@
         <w:pStyle w:val="Heading3"/>
       </w:pPr>
       <w:r>
-        <w:t>25.31. UI.ComponentDependency</w:t>
+        <w:t>25.32. UI.ComponentDependency</w:t>
       </w:r>
     </w:p>
     <w:p>
@@ -6808,7 +6845,7 @@
         <w:pStyle w:val="Heading3"/>
       </w:pPr>
       <w:r>
-        <w:t>25.32. UI.DatabaseDictionary</w:t>
+        <w:t>25.33. UI.DatabaseDictionary</w:t>
       </w:r>
     </w:p>
     <w:p>
@@ -6862,7 +6899,7 @@
         <w:pStyle w:val="Heading3"/>
       </w:pPr>
       <w:r>
-        <w:t>25.33. UI.Glossary</w:t>
+        <w:t>25.34. UI.Glossary</w:t>
       </w:r>
     </w:p>
     <w:p>
@@ -6916,7 +6953,7 @@
         <w:pStyle w:val="Heading3"/>
       </w:pPr>
       <w:r>
-        <w:t>25.34. UI.Main</w:t>
+        <w:t>25.35. UI.Main</w:t>
       </w:r>
     </w:p>
     <w:p>
@@ -7550,6 +7587,18 @@
           <w:rFonts w:ascii="Consolas" w:hAnsi="Consolas"/>
           <w:sz w:val="18"/>
         </w:rPr>
+        <w:t>procedure LearnerTabClick(Sender: TObject);</w:t>
+      </w:r>
+    </w:p>
+    <w:p>
+      <w:pPr>
+        <w:spacing w:after="40" w:line="247" w:lineRule="auto"/>
+      </w:pPr>
+      <w:r>
+        <w:rPr>
+          <w:rFonts w:ascii="Consolas" w:hAnsi="Consolas"/>
+          <w:sz w:val="18"/>
+        </w:rPr>
         <w:t>procedure WholeProgramGraphClick(Sender: TObject);</w:t>
       </w:r>
     </w:p>
@@ -9074,18 +9123,6 @@
           <w:rFonts w:ascii="Consolas" w:hAnsi="Consolas"/>
           <w:sz w:val="18"/>
         </w:rPr>
-        <w:t>procedure FullScanClick(Sender: TObject);</w:t>
-      </w:r>
-    </w:p>
-    <w:p>
-      <w:pPr>
-        <w:spacing w:after="40" w:line="247" w:lineRule="auto"/>
-      </w:pPr>
-      <w:r>
-        <w:rPr>
-          <w:rFonts w:ascii="Consolas" w:hAnsi="Consolas"/>
-          <w:sz w:val="18"/>
-        </w:rPr>
         <w:t>procedure PollTimerTimer(Sender: TObject);</w:t>
       </w:r>
     </w:p>
@@ -9554,6 +9591,30 @@
           <w:rFonts w:ascii="Consolas" w:hAnsi="Consolas"/>
           <w:sz w:val="18"/>
         </w:rPr>
+        <w:t xml:space="preserve">procedure LanguageChanged(Sender: TObject; const AOldLanguage, ANewLanguage: string; const </w:t>
+      </w:r>
+    </w:p>
+    <w:p>
+      <w:pPr>
+        <w:spacing w:after="40" w:line="247" w:lineRule="auto"/>
+      </w:pPr>
+      <w:r>
+        <w:rPr>
+          <w:rFonts w:ascii="Consolas" w:hAnsi="Consolas"/>
+          <w:sz w:val="18"/>
+        </w:rPr>
+        <w:t>AGeneration: Cardinal);</w:t>
+      </w:r>
+    </w:p>
+    <w:p>
+      <w:pPr>
+        <w:spacing w:after="40" w:line="247" w:lineRule="auto"/>
+      </w:pPr>
+      <w:r>
+        <w:rPr>
+          <w:rFonts w:ascii="Consolas" w:hAnsi="Consolas"/>
+          <w:sz w:val="18"/>
+        </w:rPr>
         <w:t>procedure OpenSelection(const AEntry,ADatabase: string);</w:t>
       </w:r>
     </w:p>
@@ -9566,7 +9627,7 @@
           <w:rFonts w:ascii="Consolas" w:hAnsi="Consolas"/>
           <w:sz w:val="18"/>
         </w:rPr>
-        <w:t>procedure LoadView(ADocument: TJSONObject);</w:t>
+        <w:t>procedure LoadView(ADocument: TJSONObject; AScreenshots: TJSONArray = nil);</w:t>
       </w:r>
     </w:p>
     <w:p>
@@ -9658,7 +9719,7 @@
         <w:pStyle w:val="Heading3"/>
       </w:pPr>
       <w:r>
-        <w:t>25.35. UI.ProjectProfile</w:t>
+        <w:t>25.36. UI.ProjectProfile</w:t>
       </w:r>
     </w:p>
     <w:p>
@@ -9712,7 +9773,7 @@
         <w:pStyle w:val="Heading3"/>
       </w:pPr>
       <w:r>
-        <w:t>25.36. Workspace.ActionPurposes</w:t>
+        <w:t>25.37. Workspace.ActionPurposes</w:t>
       </w:r>
     </w:p>
     <w:p>
@@ -9785,7 +9846,7 @@
         <w:pStyle w:val="Heading3"/>
       </w:pPr>
       <w:r>
-        <w:t>25.37. Workspace.Catalog</w:t>
+        <w:t>25.38. Workspace.Catalog</w:t>
       </w:r>
     </w:p>
     <w:p>
@@ -9935,7 +9996,7 @@
         <w:pStyle w:val="Heading3"/>
       </w:pPr>
       <w:r>
-        <w:t>25.38. Workspace.Commands</w:t>
+        <w:t>25.39. Workspace.Commands</w:t>
       </w:r>
     </w:p>
     <w:p>
@@ -9977,7 +10038,7 @@
         <w:pStyle w:val="Heading3"/>
       </w:pPr>
       <w:r>
-        <w:t>25.39. Workspace.Comparison</w:t>
+        <w:t>25.40. Workspace.Comparison</w:t>
       </w:r>
     </w:p>
     <w:p>
@@ -10031,7 +10092,7 @@
         <w:pStyle w:val="Heading3"/>
       </w:pPr>
       <w:r>
-        <w:t>25.40. Workspace.ComponentDependencies</w:t>
+        <w:t>25.41. Workspace.ComponentDependencies</w:t>
       </w:r>
     </w:p>
     <w:p>
@@ -10080,7 +10141,7 @@
         <w:pStyle w:val="Heading3"/>
       </w:pPr>
       <w:r>
-        <w:t>25.41. Workspace.DatabaseConnections</w:t>
+        <w:t>25.42. Workspace.DatabaseConnections</w:t>
       </w:r>
     </w:p>
     <w:p>
@@ -10158,7 +10219,7 @@
         <w:pStyle w:val="Heading3"/>
       </w:pPr>
       <w:r>
-        <w:t>25.42. Workspace.DatabaseSchema</w:t>
+        <w:t>25.43. Workspace.DatabaseSchema</w:t>
       </w:r>
     </w:p>
     <w:p>
@@ -10303,7 +10364,7 @@
         <w:pStyle w:val="Heading3"/>
       </w:pPr>
       <w:r>
-        <w:t>25.43. Workspace.DynamicControls</w:t>
+        <w:t>25.44. Workspace.DynamicControls</w:t>
       </w:r>
     </w:p>
     <w:p>
@@ -10345,7 +10406,7 @@
         <w:pStyle w:val="Heading3"/>
       </w:pPr>
       <w:r>
-        <w:t>25.44. Workspace.FormInheritance</w:t>
+        <w:t>25.45. Workspace.FormInheritance</w:t>
       </w:r>
     </w:p>
     <w:p>
@@ -10387,7 +10448,7 @@
         <w:pStyle w:val="Heading3"/>
       </w:pPr>
       <w:r>
-        <w:t>25.45. Workspace.Graphs</w:t>
+        <w:t>25.46. Workspace.Graphs</w:t>
       </w:r>
     </w:p>
     <w:p>
@@ -10465,7 +10526,7 @@
         <w:pStyle w:val="Heading3"/>
       </w:pPr>
       <w:r>
-        <w:t>25.46. Workspace.Keyboard</w:t>
+        <w:t>25.47. Workspace.Keyboard</w:t>
       </w:r>
     </w:p>
     <w:p>
@@ -10531,7 +10592,7 @@
         <w:pStyle w:val="Heading3"/>
       </w:pPr>
       <w:r>
-        <w:t>25.47. Workspace.LayoutRules</w:t>
+        <w:t>25.48. Workspace.LayoutRules</w:t>
       </w:r>
     </w:p>
     <w:p>
@@ -10573,7 +10634,7 @@
         <w:pStyle w:val="Heading3"/>
       </w:pPr>
       <w:r>
-        <w:t>25.48. Workspace.Model</w:t>
+        <w:t>25.49. Workspace.Model</w:t>
       </w:r>
     </w:p>
     <w:p>
@@ -11395,7 +11456,7 @@
         <w:pStyle w:val="Heading3"/>
       </w:pPr>
       <w:r>
-        <w:t>25.49. Workspace.Screen</w:t>
+        <w:t>25.50. Workspace.Screen</w:t>
       </w:r>
     </w:p>
     <w:p>
@@ -11417,7 +11478,19 @@
           <w:rFonts w:ascii="Consolas" w:hAnsi="Consolas"/>
           <w:sz w:val="18"/>
         </w:rPr>
-        <w:t>class function Reconstruct(AView: TDPHWorkspaceView; const AFile: string): TJSONObject;</w:t>
+        <w:t xml:space="preserve">class function Reconstruct(AView: TDPHWorkspaceView; const AFile: string; AIncludeKeys: </w:t>
+      </w:r>
+    </w:p>
+    <w:p>
+      <w:pPr>
+        <w:spacing w:after="40" w:line="247" w:lineRule="auto"/>
+      </w:pPr>
+      <w:r>
+        <w:rPr>
+          <w:rFonts w:ascii="Consolas" w:hAnsi="Consolas"/>
+          <w:sz w:val="18"/>
+        </w:rPr>
+        <w:t>Boolean = True): TJSONObject;</w:t>
       </w:r>
     </w:p>
     <w:p>
@@ -11437,7 +11510,7 @@
         <w:pStyle w:val="Heading3"/>
       </w:pPr>
       <w:r>
-        <w:t>25.50. Workspace.ScreenHistory</w:t>
+        <w:t>25.51. Workspace.ScreenHistory</w:t>
       </w:r>
     </w:p>
     <w:p>
@@ -11510,7 +11583,7 @@
         <w:pStyle w:val="Heading3"/>
       </w:pPr>
       <w:r>
-        <w:t>25.51. Workspace.Worker</w:t>
+        <w:t>25.52. Workspace.Worker</w:t>
       </w:r>
     </w:p>
     <w:p>
@@ -15725,7 +15798,7 @@
       <w:pStyle w:val="Footer"/>
     </w:pPr>
     <w:r>
-      <w:t xml:space="preserve">Guide 44  |  13 October 2026                                    Page </w:t>
+      <w:t xml:space="preserve">Guide 45  |  14 October 2026                                    Page </w:t>
     </w:r>
     <w:r>
       <w:fldChar w:fldCharType="begin"/>

</xml_diff>

<commit_message>
Harden learning discovery and refresh experimental 0.6.12 distributions
</commit_message>
<xml_diff>
--- a/docs/guides/DPH_Engineering_Guide.docx
+++ b/docs/guides/DPH_Engineering_Guide.docx
@@ -20,12 +20,12 @@
     </w:p>
     <w:p>
       <w:r>
-        <w:t>Guide edition 45</w:t>
-      </w:r>
-    </w:p>
-    <w:p>
-      <w:r>
-        <w:t>Last changed 14 October 2026</w:t>
+        <w:t>Guide edition 46</w:t>
+      </w:r>
+    </w:p>
+    <w:p>
+      <w:r>
+        <w:t>Last changed 15 October 2026</w:t>
       </w:r>
     </w:p>
     <w:p>
@@ -740,7 +740,7 @@
     </w:p>
     <w:p>
       <w:r>
-        <w:t>DPH.Learning.Discovery scans eligible documents only within the selected project directory. It bounds traversal and samples documents and logs before building Learning library entries. The text-quality filter must count Unicode letters, not only ASCII Latin letters; otherwise readable Arabic, CJK, Cyrillic, and other guides disappear even though DPH's interface has offline language packs. A discovered file with no usable text should carry a visible reason. PDF and older word-processing extraction depends on LibreOffice at the standard Windows path; DOCX and supported text formats are processed directly. Referenced public HTTPS pages may be contacted when Internet access is available, so release directions must disclose that optional network behavior.</w:t>
+        <w:t>DPH.Learning.Discovery scans eligible documents only within the selected project directory. It bounds traversal and samples documents and logs before building Learning library entries. The text-quality filter must count Unicode letters, not only ASCII Latin letters; otherwise readable Arabic, CJK, Cyrillic, and other guides disappear even though DPH's interface has offline language packs. A discovered file with no usable text should carry a visible reason. PDF and older word-processing extraction depends on LibreOffice at the standard Windows path; DOCX and supported text formats are processed directly. Referenced public HTTPS pages may be contacted only when Read public websites is enabled. Discovery rejects private IPv4 resolutions, disables redirects, and writes responses through a 128 KiB bounded stream. The DNS answer can change between validation and connection, so the optional setting is not a complete network isolation guarantee.</w:t>
       </w:r>
     </w:p>
     <w:p>
@@ -3255,7 +3255,7 @@
     </w:p>
     <w:p>
       <w:r>
-        <w:t>The optional desktop package contains the Win32 and Win64 DelphiProjectHandoff.exe builds, a WebView2Loader.dll beside each, offline language packs, migrations, help, current guides, directions, and required licenses. It does not include an owner .dphdb, private document copies, or reference-project working stores. A previously created package is a historical build and must not be presented as the current executable.</w:t>
+        <w:t>The experimental desktop package contains the Win32 and Win64 DelphiProjectHandoff.exe builds, a WebView2Loader.dll beside each, offline language packs, the German trial model, migrations, help, current guides, directions, DPH's Apache 2.0 license, and third-party notices. It does not include an owner .dphdb, private document copies, or reference-project working stores. A previously created package is a historical build and must not be presented as the current executable. The unmodified Bergamot model is attributed under CC BY-SA 4.0, with its license text and indexed file hashes included in the package.</w:t>
       </w:r>
     </w:p>
     <w:p>
@@ -4521,7 +4521,7 @@
           <w:rFonts w:ascii="Consolas" w:hAnsi="Consolas"/>
           <w:sz w:val="18"/>
         </w:rPr>
-        <w:t>class procedure AddEvidence(AFacts, AWorkspace: TJSONObject);</w:t>
+        <w:t>class procedure AddEvidence(AFacts, AWorkspace: TJSONObject; AAllowInternet: Boolean);</w:t>
       </w:r>
     </w:p>
     <w:p>
@@ -5448,7 +5448,85 @@
         <w:pStyle w:val="Heading3"/>
       </w:pPr>
       <w:r>
-        <w:t>25.27. Publish.Translation</w:t>
+        <w:t>25.27. Publish.OfflinePreview</w:t>
+      </w:r>
+    </w:p>
+    <w:p>
+      <w:r>
+        <w:t>Source file: DPH.Publish.OfflinePreview.pas. Serves the local preview and bundled German translation assets over loopback. It must not expose the selected project to an external network interface.</w:t>
+      </w:r>
+    </w:p>
+    <w:p>
+      <w:r>
+        <w:t>Principal public types: TDPHOfflinePreview.</w:t>
+      </w:r>
+    </w:p>
+    <w:p>
+      <w:pPr>
+        <w:spacing w:after="40" w:line="247" w:lineRule="auto"/>
+      </w:pPr>
+      <w:r>
+        <w:rPr>
+          <w:rFonts w:ascii="Consolas" w:hAnsi="Consolas"/>
+          <w:sz w:val="18"/>
+        </w:rPr>
+        <w:t>constructor Create(const APagesDirectory, AAssetsDirectory: string);</w:t>
+      </w:r>
+    </w:p>
+    <w:p>
+      <w:pPr>
+        <w:spacing w:after="40" w:line="247" w:lineRule="auto"/>
+      </w:pPr>
+      <w:r>
+        <w:rPr>
+          <w:rFonts w:ascii="Consolas" w:hAnsi="Consolas"/>
+          <w:sz w:val="18"/>
+        </w:rPr>
+        <w:t>destructor Destroy;</w:t>
+      </w:r>
+    </w:p>
+    <w:p>
+      <w:pPr>
+        <w:spacing w:after="40" w:line="247" w:lineRule="auto"/>
+      </w:pPr>
+      <w:r>
+        <w:rPr>
+          <w:rFonts w:ascii="Consolas" w:hAnsi="Consolas"/>
+          <w:sz w:val="18"/>
+        </w:rPr>
+        <w:t>function URLForPage(const APagePath: string): string;</w:t>
+      </w:r>
+    </w:p>
+    <w:p>
+      <w:pPr>
+        <w:spacing w:after="40" w:line="247" w:lineRule="auto"/>
+      </w:pPr>
+      <w:r>
+        <w:rPr>
+          <w:rFonts w:ascii="Consolas" w:hAnsi="Consolas"/>
+          <w:sz w:val="18"/>
+        </w:rPr>
+        <w:t>function ScriptURL: string;</w:t>
+      </w:r>
+    </w:p>
+    <w:p>
+      <w:pPr>
+        <w:spacing w:after="40" w:line="247" w:lineRule="auto"/>
+      </w:pPr>
+      <w:r>
+        <w:rPr>
+          <w:rFonts w:ascii="Consolas" w:hAnsi="Consolas"/>
+          <w:sz w:val="18"/>
+        </w:rPr>
+        <w:t>function Allows(const AURL, APageDirectory: string): Boolean;</w:t>
+      </w:r>
+    </w:p>
+    <w:p>
+      <w:pPr>
+        <w:pStyle w:val="Heading3"/>
+      </w:pPr>
+      <w:r>
+        <w:t>25.28. Publish.Translation</w:t>
       </w:r>
     </w:p>
     <w:p>
@@ -5694,7 +5772,7 @@
         <w:pStyle w:val="Heading3"/>
       </w:pPr>
       <w:r>
-        <w:t>25.28. Storage.Backup</w:t>
+        <w:t>25.29. Storage.Backup</w:t>
       </w:r>
     </w:p>
     <w:p>
@@ -5736,7 +5814,7 @@
         <w:pStyle w:val="Heading3"/>
       </w:pPr>
       <w:r>
-        <w:t>25.29. Storage.Database</w:t>
+        <w:t>25.30. Storage.Database</w:t>
       </w:r>
     </w:p>
     <w:p>
@@ -6714,7 +6792,7 @@
         <w:pStyle w:val="Heading3"/>
       </w:pPr>
       <w:r>
-        <w:t>25.30. Storage.Types</w:t>
+        <w:t>25.31. Storage.Types</w:t>
       </w:r>
     </w:p>
     <w:p>
@@ -6737,7 +6815,7 @@
         <w:pStyle w:val="Heading3"/>
       </w:pPr>
       <w:r>
-        <w:t>25.31. UI.ActionPurpose</w:t>
+        <w:t>25.32. UI.ActionPurpose</w:t>
       </w:r>
     </w:p>
     <w:p>
@@ -6791,7 +6869,7 @@
         <w:pStyle w:val="Heading3"/>
       </w:pPr>
       <w:r>
-        <w:t>25.32. UI.ComponentDependency</w:t>
+        <w:t>25.33. UI.ComponentDependency</w:t>
       </w:r>
     </w:p>
     <w:p>
@@ -6845,7 +6923,7 @@
         <w:pStyle w:val="Heading3"/>
       </w:pPr>
       <w:r>
-        <w:t>25.33. UI.DatabaseDictionary</w:t>
+        <w:t>25.34. UI.DatabaseDictionary</w:t>
       </w:r>
     </w:p>
     <w:p>
@@ -6899,7 +6977,7 @@
         <w:pStyle w:val="Heading3"/>
       </w:pPr>
       <w:r>
-        <w:t>25.34. UI.Glossary</w:t>
+        <w:t>25.35. UI.Glossary</w:t>
       </w:r>
     </w:p>
     <w:p>
@@ -6953,7 +7031,7 @@
         <w:pStyle w:val="Heading3"/>
       </w:pPr>
       <w:r>
-        <w:t>25.35. UI.Main</w:t>
+        <w:t>25.36. UI.Main</w:t>
       </w:r>
     </w:p>
     <w:p>
@@ -9123,6 +9201,30 @@
           <w:rFonts w:ascii="Consolas" w:hAnsi="Consolas"/>
           <w:sz w:val="18"/>
         </w:rPr>
+        <w:t>procedure CloseButtonClick(Sender: TObject);</w:t>
+      </w:r>
+    </w:p>
+    <w:p>
+      <w:pPr>
+        <w:spacing w:after="40" w:line="247" w:lineRule="auto"/>
+      </w:pPr>
+      <w:r>
+        <w:rPr>
+          <w:rFonts w:ascii="Consolas" w:hAnsi="Consolas"/>
+          <w:sz w:val="18"/>
+        </w:rPr>
+        <w:t>procedure AllowInternetChange(Sender: TObject);</w:t>
+      </w:r>
+    </w:p>
+    <w:p>
+      <w:pPr>
+        <w:spacing w:after="40" w:line="247" w:lineRule="auto"/>
+      </w:pPr>
+      <w:r>
+        <w:rPr>
+          <w:rFonts w:ascii="Consolas" w:hAnsi="Consolas"/>
+          <w:sz w:val="18"/>
+        </w:rPr>
         <w:t>procedure PollTimerTimer(Sender: TObject);</w:t>
       </w:r>
     </w:p>
@@ -9719,7 +9821,7 @@
         <w:pStyle w:val="Heading3"/>
       </w:pPr>
       <w:r>
-        <w:t>25.36. UI.ProjectProfile</w:t>
+        <w:t>25.37. UI.ProjectProfile</w:t>
       </w:r>
     </w:p>
     <w:p>
@@ -9773,7 +9875,7 @@
         <w:pStyle w:val="Heading3"/>
       </w:pPr>
       <w:r>
-        <w:t>25.37. Workspace.ActionPurposes</w:t>
+        <w:t>25.38. Workspace.ActionPurposes</w:t>
       </w:r>
     </w:p>
     <w:p>
@@ -9846,7 +9948,7 @@
         <w:pStyle w:val="Heading3"/>
       </w:pPr>
       <w:r>
-        <w:t>25.38. Workspace.Catalog</w:t>
+        <w:t>25.39. Workspace.Catalog</w:t>
       </w:r>
     </w:p>
     <w:p>
@@ -9996,7 +10098,7 @@
         <w:pStyle w:val="Heading3"/>
       </w:pPr>
       <w:r>
-        <w:t>25.39. Workspace.Commands</w:t>
+        <w:t>25.40. Workspace.Commands</w:t>
       </w:r>
     </w:p>
     <w:p>
@@ -10038,7 +10140,7 @@
         <w:pStyle w:val="Heading3"/>
       </w:pPr>
       <w:r>
-        <w:t>25.40. Workspace.Comparison</w:t>
+        <w:t>25.41. Workspace.Comparison</w:t>
       </w:r>
     </w:p>
     <w:p>
@@ -10092,7 +10194,7 @@
         <w:pStyle w:val="Heading3"/>
       </w:pPr>
       <w:r>
-        <w:t>25.41. Workspace.ComponentDependencies</w:t>
+        <w:t>25.42. Workspace.ComponentDependencies</w:t>
       </w:r>
     </w:p>
     <w:p>
@@ -10141,7 +10243,7 @@
         <w:pStyle w:val="Heading3"/>
       </w:pPr>
       <w:r>
-        <w:t>25.42. Workspace.DatabaseConnections</w:t>
+        <w:t>25.43. Workspace.DatabaseConnections</w:t>
       </w:r>
     </w:p>
     <w:p>
@@ -10219,7 +10321,7 @@
         <w:pStyle w:val="Heading3"/>
       </w:pPr>
       <w:r>
-        <w:t>25.43. Workspace.DatabaseSchema</w:t>
+        <w:t>25.44. Workspace.DatabaseSchema</w:t>
       </w:r>
     </w:p>
     <w:p>
@@ -10364,7 +10466,7 @@
         <w:pStyle w:val="Heading3"/>
       </w:pPr>
       <w:r>
-        <w:t>25.44. Workspace.DynamicControls</w:t>
+        <w:t>25.45. Workspace.DynamicControls</w:t>
       </w:r>
     </w:p>
     <w:p>
@@ -10406,7 +10508,7 @@
         <w:pStyle w:val="Heading3"/>
       </w:pPr>
       <w:r>
-        <w:t>25.45. Workspace.FormInheritance</w:t>
+        <w:t>25.46. Workspace.FormInheritance</w:t>
       </w:r>
     </w:p>
     <w:p>
@@ -10448,7 +10550,7 @@
         <w:pStyle w:val="Heading3"/>
       </w:pPr>
       <w:r>
-        <w:t>25.46. Workspace.Graphs</w:t>
+        <w:t>25.47. Workspace.Graphs</w:t>
       </w:r>
     </w:p>
     <w:p>
@@ -10526,7 +10628,7 @@
         <w:pStyle w:val="Heading3"/>
       </w:pPr>
       <w:r>
-        <w:t>25.47. Workspace.Keyboard</w:t>
+        <w:t>25.48. Workspace.Keyboard</w:t>
       </w:r>
     </w:p>
     <w:p>
@@ -10592,7 +10694,7 @@
         <w:pStyle w:val="Heading3"/>
       </w:pPr>
       <w:r>
-        <w:t>25.48. Workspace.LayoutRules</w:t>
+        <w:t>25.49. Workspace.LayoutRules</w:t>
       </w:r>
     </w:p>
     <w:p>
@@ -10634,7 +10736,7 @@
         <w:pStyle w:val="Heading3"/>
       </w:pPr>
       <w:r>
-        <w:t>25.49. Workspace.Model</w:t>
+        <w:t>25.50. Workspace.Model</w:t>
       </w:r>
     </w:p>
     <w:p>
@@ -11456,7 +11558,7 @@
         <w:pStyle w:val="Heading3"/>
       </w:pPr>
       <w:r>
-        <w:t>25.50. Workspace.Screen</w:t>
+        <w:t>25.51. Workspace.Screen</w:t>
       </w:r>
     </w:p>
     <w:p>
@@ -11510,7 +11612,7 @@
         <w:pStyle w:val="Heading3"/>
       </w:pPr>
       <w:r>
-        <w:t>25.51. Workspace.ScreenHistory</w:t>
+        <w:t>25.52. Workspace.ScreenHistory</w:t>
       </w:r>
     </w:p>
     <w:p>
@@ -11583,7 +11685,7 @@
         <w:pStyle w:val="Heading3"/>
       </w:pPr>
       <w:r>
-        <w:t>25.52. Workspace.Worker</w:t>
+        <w:t>25.53. Workspace.Worker</w:t>
       </w:r>
     </w:p>
     <w:p>
@@ -15771,11 +15873,6 @@
       </w:r>
       <w:r>
         <w:t>Commit intended changes, push every configured repository and verify remote branch identities.</w:t>
-      </w:r>
-    </w:p>
-    <w:p>
-      <w:r>
-        <w:t>Expected result: the delivered files are reproducible, usable as learning material and supported by evidence that applies to the exact package. Independent learner acceptance remains a separate observed result and should be reported honestly when not performed.</w:t>
       </w:r>
     </w:p>
     <w:sectPr>
@@ -15798,7 +15895,7 @@
       <w:pStyle w:val="Footer"/>
     </w:pPr>
     <w:r>
-      <w:t xml:space="preserve">Guide 45  |  14 October 2026                                    Page </w:t>
+      <w:t xml:space="preserve">Guide 46  |  15 October 2026                                    Page </w:t>
     </w:r>
     <w:r>
       <w:fldChar w:fldCharType="begin"/>

</xml_diff>

<commit_message>
Refocus DPH around evidence-based handoff dossier
</commit_message>
<xml_diff>
--- a/docs/guides/DPH_Engineering_Guide.docx
+++ b/docs/guides/DPH_Engineering_Guide.docx
@@ -20,12 +20,12 @@
     </w:p>
     <w:p>
       <w:r>
-        <w:t>Guide edition 46</w:t>
-      </w:r>
-    </w:p>
-    <w:p>
-      <w:r>
-        <w:t>Last changed 15 October 2026</w:t>
+        <w:t>Guide edition 47</w:t>
+      </w:r>
+    </w:p>
+    <w:p>
+      <w:r>
+        <w:t>Last changed 16 October 2026</w:t>
       </w:r>
     </w:p>
     <w:p>
@@ -499,7 +499,7 @@
       </w:r>
       <w:r>
         <w:tab/>
-        <w:t>29</w:t>
+        <w:t>30</w:t>
       </w:r>
     </w:p>
     <w:p>
@@ -544,7 +544,7 @@
       </w:r>
       <w:r>
         <w:tab/>
-        <w:t>49</w:t>
+        <w:t>50</w:t>
       </w:r>
     </w:p>
     <w:p>
@@ -597,7 +597,7 @@
     </w:p>
     <w:p>
       <w:r>
-        <w:t>Delphi Project Handoff, abbreviated DPH, is a Windows desktop application implemented with Delphi and FireMonkey. Its product responsibility is to help a beginner understand one unfamiliar Delphi application. It reads project, source and form material; persists captured facts and attributed knowledge; presents understandable learning routes; and publishes a portable reading edition. The target application's source is input to this process, not a workspace that DPH rewrites or executes.</w:t>
+        <w:t>Delphi Project Handoff, abbreviated DPH, is a Windows desktop application implemented with Delphi and FireMonkey. Its product responsibility is to prepare an evidence-based maintenance handoff for one unfamiliar Delphi application. It reads project, source and form material; persists captured facts and attributed knowledge; presents a handoff dossier and specialist views; and publishes a portable reading edition. The target application's source is input to this process, not a workspace that DPH rewrites or executes.</w:t>
       </w:r>
     </w:p>
     <w:p>
@@ -612,7 +612,7 @@
     </w:p>
     <w:p>
       <w:r>
-        <w:t>The visible learner workflow has six tabs: Getting started, Learn the project, Learning library, Project map, Screenshots, and Application diagrams. Open application starts a source capture; Open saved project restores a .dphdb and its adjacent .views folder. Older authoring, lesson, and specialist controls remain serialized or implemented for compatibility, but must not be described as visible first-use commands.</w:t>
+        <w:t>The visible workflow has six tabs: Getting started, Handoff dossier, Learning library, Project map, Screenshots, and Application diagrams. Open application starts a source capture; Open saved project restores a .dphdb and its adjacent .views folder. DPH.Handoff.Dossier renders the four dossier sections from the selected publication model; the renderer does not execute source or turn an inferred relationship into an observed result. Form-preview generation is deferred until Screenshots is opened to reduce the cost of restoring a saved project. Older authoring, lesson, and specialist controls remain serialized or implemented for compatibility, but must not be described as visible first-use commands.</w:t>
       </w:r>
     </w:p>
     <w:p>
@@ -1231,7 +1231,7 @@
     </w:p>
     <w:p>
       <w:r>
-        <w:t>The analyzer parses supported inputs, the semantic analyzer builds the graph, facts are staged in a generation and source is revalidated before publication. A workspace view is saved and returned. The native learner route is then rendered from that captured view and current knowledge. A failure before publication must leave the earlier published head available.</w:t>
+        <w:t>The analyzer parses supported inputs, the semantic analyzer builds the graph, facts are staged in a generation and source is revalidated before publication. A workspace view is saved and returned. The native Handoff dossier is then rendered from that captured view and current knowledge. A failure before publication must leave the earlier published head available.</w:t>
       </w:r>
     </w:p>
     <w:p>
@@ -1285,7 +1285,7 @@
     </w:p>
     <w:p>
       <w:r>
-        <w:t>The native preview opens learning.html, the same learner route recipients should begin with. A consistent technical index does not establish human instructional quality. Test a supplied task, a picture and an object explanation in the independent export as well as the native reader.</w:t>
+        <w:t>The portable edition now includes handoff-0.html through handoff-3.html from the same scoped, redacted document model as the older learning.html. The native export preview still opens the older learning page, so its default preview flow remains to be aligned with the dossier. A consistent technical index does not establish human instructional quality. Test the handoff, a supplied task, a picture and an object explanation in the independent export as well as the native reader.</w:t>
       </w:r>
     </w:p>
     <w:p>
@@ -2655,17 +2655,17 @@
         <w:pStyle w:val="Heading3"/>
       </w:pPr>
       <w:r>
-        <w:t>17.2. Beginner explanation model</w:t>
-      </w:r>
-    </w:p>
-    <w:p>
-      <w:r>
-        <w:t>TDPHExplanationModel.ApplicationRouteHTML generates four primary pages for the selected application: Meet this app, Learn a real task, Explore related tasks and Resolve unknowns. It combines source-derived forms and action links with that application's attributed profile, structured tasks, teaching cards and open author questions. Its task order uses saved learning order, then path and title. Absent instructions remain explicit gaps; an event binding alone is never presented as a verified task. The older generic LessonHTML topics remain supporting code, not the main learner route.</w:t>
-      </w:r>
-    </w:p>
-    <w:p>
-      <w:r>
-        <w:t>ObjectLessonHTML introduces role and relevant purpose, actual conditions and bounded next connections, then keeps the deeper code walkthrough optional. ObjectText provides a native text route from the same explanatory model. The renderer must not turn an unlinked application-wide note into every object's purpose. It must exclude rejected or retired content and preserve unresolved questions. The native list of four routes is serialized in DPH.UI.Main.fmx so ordinary labels remain IDE-editable.</w:t>
+        <w:t>17.2. Handoff dossier and legacy explanations</w:t>
+      </w:r>
+    </w:p>
+    <w:p>
+      <w:r>
+        <w:t>TDPHHandoffDossier.Render produces four native handoff pages from the selected, locally displayed document model: Handoff overview, Commands and workflows, Data and operations, and Risks and open questions. The renderer bounds each list, escapes source text, links to captured objects and records, and marks unreviewed or stale facts. It presents form registration and event bindings as static evidence, not observed user workflows. DPH.UI.Main.fmx serializes the native page labels so they remain IDE-editable.</w:t>
+      </w:r>
+    </w:p>
+    <w:p>
+      <w:r>
+        <w:t>TDPHExplanationModel.ApplicationRouteHTML still produces the older four-part learning edition used by export and several specialist views. It is retained for compatibility beside the exported handoff pages. Its authored tasks and teaching cards remain accessible; the Handoff dossier does not reclassify them as verified behavior. ObjectLessonHTML introduces role and relevant purpose, actual conditions and bounded next connections, then keeps the deeper code walkthrough optional. It must exclude rejected or retired content and preserve unresolved questions.</w:t>
       </w:r>
     </w:p>
     <w:p>
@@ -2678,7 +2678,7 @@
     </w:p>
     <w:p>
       <w:r>
-        <w:t>WorkspacePageChange chooses the active projection. Report generation for hidden specialist tabs should not delay opening the ordinary learner route. Refresh routines must distinguish loading the base view from building graphs, quality reports or screen-history comparisons on demand.</w:t>
+        <w:t>WorkspacePageChange chooses the active projection. Report generation for hidden specialist tabs should not delay opening the Handoff dossier. Refresh routines must distinguish loading the base view from building graphs, generated form previews, quality reports or screen-history comparisons on demand.</w:t>
       </w:r>
     </w:p>
     <w:p>
@@ -2788,7 +2788,7 @@
     </w:p>
     <w:p>
       <w:r>
-        <w:t>TDPHPublisher.Export writes a new destination and refuses an existing one. learning.html presents the selected application's four-part learner route, authored tasks, examples, questions, terms and supplied images. The generated User Guide follows those same four parts. Hash-named object pages provide linked explanations with optional source detail. index.html and JSONL technical indexes support deeper inspection and validation.</w:t>
+        <w:t>TDPHPublisher.Export writes a new destination and refuses an existing one. The four handoff-N.html pages are generated from the scoped publication model and link to included object pages and the technical index. learning.html retains the earlier four-part learner route, authored tasks, examples, questions, terms and supplied images. The index and README direct recipients to the handoff first. Hash-named object pages provide linked explanations with optional source detail; JSONL technical indexes support deeper inspection and validation.</w:t>
       </w:r>
     </w:p>
     <w:p>
@@ -3346,7 +3346,7 @@
     </w:p>
     <w:p>
       <w:r>
-        <w:t>Extract a newly made binary ZIP to a new writable location. Verify every SHA256.json entry against extracted bytes. Check required migrations, current manuals, local help and loader. Start the extracted executable, confirm a responsive native window and normal close, then select a disposable Delphi project and verify that Learn the project names it and the other five tabs open the corresponding findings.</w:t>
+        <w:t>Extract a newly made binary ZIP to a new writable location. Verify every SHA256.json entry against extracted bytes. Check required migrations, current manuals, local help and loader. Start the extracted executable, confirm a responsive native window and normal close, then select a disposable Delphi project and verify that Handoff dossier names it, labels uncertainty, and links to source. Check that the other five tabs open their findings and that Screenshots generates previews when selected.</w:t>
       </w:r>
     </w:p>
     <w:p>
@@ -4281,7 +4281,37 @@
         <w:pStyle w:val="Heading3"/>
       </w:pPr>
       <w:r>
-        <w:t>25.10. Knowledge.ActionPurpose</w:t>
+        <w:t>25.10. Handoff.Dossier</w:t>
+      </w:r>
+    </w:p>
+    <w:p>
+      <w:r>
+        <w:t>Source file: DPH.Handoff.Dossier.pas. Renders the selected capture as a four-part, source-linked maintenance handoff. Distinguish extracted facts, author statements, reading guidance and unresolved questions.</w:t>
+      </w:r>
+    </w:p>
+    <w:p>
+      <w:r>
+        <w:t>Principal public types: TDPHHandoffDossier.</w:t>
+      </w:r>
+    </w:p>
+    <w:p>
+      <w:pPr>
+        <w:spacing w:after="40" w:line="247" w:lineRule="auto"/>
+      </w:pPr>
+      <w:r>
+        <w:rPr>
+          <w:rFonts w:ascii="Consolas" w:hAnsi="Consolas"/>
+          <w:sz w:val="18"/>
+        </w:rPr>
+        <w:t>class function Render(AFacts: TJSONObject; APage: Integer; AExport: Boolean = False): string;</w:t>
+      </w:r>
+    </w:p>
+    <w:p>
+      <w:pPr>
+        <w:pStyle w:val="Heading3"/>
+      </w:pPr>
+      <w:r>
+        <w:t>25.11. Knowledge.ActionPurpose</w:t>
       </w:r>
     </w:p>
     <w:p>
@@ -4342,7 +4372,7 @@
         <w:pStyle w:val="Heading3"/>
       </w:pPr>
       <w:r>
-        <w:t>25.11. Knowledge.ComponentDependency</w:t>
+        <w:t>25.12. Knowledge.ComponentDependency</w:t>
       </w:r>
     </w:p>
     <w:p>
@@ -4391,7 +4421,7 @@
         <w:pStyle w:val="Heading3"/>
       </w:pPr>
       <w:r>
-        <w:t>25.12. Knowledge.Glossary</w:t>
+        <w:t>25.13. Knowledge.Glossary</w:t>
       </w:r>
     </w:p>
     <w:p>
@@ -4457,7 +4487,7 @@
         <w:pStyle w:val="Heading3"/>
       </w:pPr>
       <w:r>
-        <w:t>25.13. Knowledge.ProjectProfile</w:t>
+        <w:t>25.14. Knowledge.ProjectProfile</w:t>
       </w:r>
     </w:p>
     <w:p>
@@ -4499,7 +4529,7 @@
         <w:pStyle w:val="Heading3"/>
       </w:pPr>
       <w:r>
-        <w:t>25.14. Learning.Discovery</w:t>
+        <w:t>25.15. Learning.Discovery</w:t>
       </w:r>
     </w:p>
     <w:p>
@@ -4529,7 +4559,7 @@
         <w:pStyle w:val="Heading3"/>
       </w:pPr>
       <w:r>
-        <w:t>25.15. Parse.Forms</w:t>
+        <w:t>25.16. Parse.Forms</w:t>
       </w:r>
     </w:p>
     <w:p>
@@ -4559,7 +4589,7 @@
         <w:pStyle w:val="Heading3"/>
       </w:pPr>
       <w:r>
-        <w:t>25.16. Parse.Lexer</w:t>
+        <w:t>25.17. Parse.Lexer</w:t>
       </w:r>
     </w:p>
     <w:p>
@@ -4589,7 +4619,7 @@
         <w:pStyle w:val="Heading3"/>
       </w:pPr>
       <w:r>
-        <w:t>25.17. Parse.Model</w:t>
+        <w:t>25.18. Parse.Model</w:t>
       </w:r>
     </w:p>
     <w:p>
@@ -4679,7 +4709,7 @@
         <w:pStyle w:val="Heading3"/>
       </w:pPr>
       <w:r>
-        <w:t>25.18. Parse.Pascal</w:t>
+        <w:t>25.19. Parse.Pascal</w:t>
       </w:r>
     </w:p>
     <w:p>
@@ -4709,7 +4739,7 @@
         <w:pStyle w:val="Heading3"/>
       </w:pPr>
       <w:r>
-        <w:t>25.19. Parse.Preprocessor</w:t>
+        <w:t>25.20. Parse.Preprocessor</w:t>
       </w:r>
     </w:p>
     <w:p>
@@ -4835,7 +4865,7 @@
         <w:pStyle w:val="Heading3"/>
       </w:pPr>
       <w:r>
-        <w:t>25.20. Parse.Resources</w:t>
+        <w:t>25.21. Parse.Resources</w:t>
       </w:r>
     </w:p>
     <w:p>
@@ -4865,7 +4895,7 @@
         <w:pStyle w:val="Heading3"/>
       </w:pPr>
       <w:r>
-        <w:t>25.21. Project.Analysis</w:t>
+        <w:t>25.22. Project.Analysis</w:t>
       </w:r>
     </w:p>
     <w:p>
@@ -5027,7 +5057,7 @@
         <w:pStyle w:val="Heading3"/>
       </w:pPr>
       <w:r>
-        <w:t>25.22. Project.Inventory</w:t>
+        <w:t>25.23. Project.Inventory</w:t>
       </w:r>
     </w:p>
     <w:p>
@@ -5129,7 +5159,7 @@
         <w:pStyle w:val="Heading3"/>
       </w:pPr>
       <w:r>
-        <w:t>25.23. Project.Source</w:t>
+        <w:t>25.24. Project.Source</w:t>
       </w:r>
     </w:p>
     <w:p>
@@ -5183,7 +5213,7 @@
         <w:pStyle w:val="Heading3"/>
       </w:pPr>
       <w:r>
-        <w:t>25.24. Publish.BrowserPolicy</w:t>
+        <w:t>25.25. Publish.BrowserPolicy</w:t>
       </w:r>
     </w:p>
     <w:p>
@@ -5220,7 +5250,7 @@
         <w:pStyle w:val="Heading3"/>
       </w:pPr>
       <w:r>
-        <w:t>25.25. Publish.Export</w:t>
+        <w:t>25.26. Publish.Export</w:t>
       </w:r>
     </w:p>
     <w:p>
@@ -5322,7 +5352,7 @@
         <w:pStyle w:val="Heading3"/>
       </w:pPr>
       <w:r>
-        <w:t>25.26. Publish.Model</w:t>
+        <w:t>25.27. Publish.Model</w:t>
       </w:r>
     </w:p>
     <w:p>
@@ -5448,7 +5478,7 @@
         <w:pStyle w:val="Heading3"/>
       </w:pPr>
       <w:r>
-        <w:t>25.27. Publish.OfflinePreview</w:t>
+        <w:t>25.28. Publish.OfflinePreview</w:t>
       </w:r>
     </w:p>
     <w:p>
@@ -5526,7 +5556,7 @@
         <w:pStyle w:val="Heading3"/>
       </w:pPr>
       <w:r>
-        <w:t>25.28. Publish.Translation</w:t>
+        <w:t>25.29. Publish.Translation</w:t>
       </w:r>
     </w:p>
     <w:p>
@@ -5772,7 +5802,7 @@
         <w:pStyle w:val="Heading3"/>
       </w:pPr>
       <w:r>
-        <w:t>25.29. Storage.Backup</w:t>
+        <w:t>25.30. Storage.Backup</w:t>
       </w:r>
     </w:p>
     <w:p>
@@ -5814,7 +5844,7 @@
         <w:pStyle w:val="Heading3"/>
       </w:pPr>
       <w:r>
-        <w:t>25.30. Storage.Database</w:t>
+        <w:t>25.31. Storage.Database</w:t>
       </w:r>
     </w:p>
     <w:p>
@@ -6792,7 +6822,7 @@
         <w:pStyle w:val="Heading3"/>
       </w:pPr>
       <w:r>
-        <w:t>25.31. Storage.Types</w:t>
+        <w:t>25.32. Storage.Types</w:t>
       </w:r>
     </w:p>
     <w:p>
@@ -6815,7 +6845,7 @@
         <w:pStyle w:val="Heading3"/>
       </w:pPr>
       <w:r>
-        <w:t>25.32. UI.ActionPurpose</w:t>
+        <w:t>25.33. UI.ActionPurpose</w:t>
       </w:r>
     </w:p>
     <w:p>
@@ -6869,7 +6899,7 @@
         <w:pStyle w:val="Heading3"/>
       </w:pPr>
       <w:r>
-        <w:t>25.33. UI.ComponentDependency</w:t>
+        <w:t>25.34. UI.ComponentDependency</w:t>
       </w:r>
     </w:p>
     <w:p>
@@ -6923,7 +6953,7 @@
         <w:pStyle w:val="Heading3"/>
       </w:pPr>
       <w:r>
-        <w:t>25.34. UI.DatabaseDictionary</w:t>
+        <w:t>25.35. UI.DatabaseDictionary</w:t>
       </w:r>
     </w:p>
     <w:p>
@@ -6977,7 +7007,7 @@
         <w:pStyle w:val="Heading3"/>
       </w:pPr>
       <w:r>
-        <w:t>25.35. UI.Glossary</w:t>
+        <w:t>25.36. UI.Glossary</w:t>
       </w:r>
     </w:p>
     <w:p>
@@ -7031,7 +7061,7 @@
         <w:pStyle w:val="Heading3"/>
       </w:pPr>
       <w:r>
-        <w:t>25.36. UI.Main</w:t>
+        <w:t>25.37. UI.Main</w:t>
       </w:r>
     </w:p>
     <w:p>
@@ -7917,6 +7947,18 @@
           <w:rFonts w:ascii="Consolas" w:hAnsi="Consolas"/>
           <w:sz w:val="18"/>
         </w:rPr>
+        <w:t>procedure ScreenshotReturnClick(Sender: TObject);</w:t>
+      </w:r>
+    </w:p>
+    <w:p>
+      <w:pPr>
+        <w:spacing w:after="40" w:line="247" w:lineRule="auto"/>
+      </w:pPr>
+      <w:r>
+        <w:rPr>
+          <w:rFonts w:ascii="Consolas" w:hAnsi="Consolas"/>
+          <w:sz w:val="18"/>
+        </w:rPr>
         <w:t>procedure DatabaseERFilterChange(Sender:TObject);</w:t>
       </w:r>
     </w:p>
@@ -9821,7 +9863,7 @@
         <w:pStyle w:val="Heading3"/>
       </w:pPr>
       <w:r>
-        <w:t>25.37. UI.ProjectProfile</w:t>
+        <w:t>25.38. UI.ProjectProfile</w:t>
       </w:r>
     </w:p>
     <w:p>
@@ -9875,7 +9917,7 @@
         <w:pStyle w:val="Heading3"/>
       </w:pPr>
       <w:r>
-        <w:t>25.38. Workspace.ActionPurposes</w:t>
+        <w:t>25.39. Workspace.ActionPurposes</w:t>
       </w:r>
     </w:p>
     <w:p>
@@ -9948,7 +9990,7 @@
         <w:pStyle w:val="Heading3"/>
       </w:pPr>
       <w:r>
-        <w:t>25.39. Workspace.Catalog</w:t>
+        <w:t>25.40. Workspace.Catalog</w:t>
       </w:r>
     </w:p>
     <w:p>
@@ -10098,7 +10140,7 @@
         <w:pStyle w:val="Heading3"/>
       </w:pPr>
       <w:r>
-        <w:t>25.40. Workspace.Commands</w:t>
+        <w:t>25.41. Workspace.Commands</w:t>
       </w:r>
     </w:p>
     <w:p>
@@ -10140,7 +10182,7 @@
         <w:pStyle w:val="Heading3"/>
       </w:pPr>
       <w:r>
-        <w:t>25.41. Workspace.Comparison</w:t>
+        <w:t>25.42. Workspace.Comparison</w:t>
       </w:r>
     </w:p>
     <w:p>
@@ -10194,7 +10236,7 @@
         <w:pStyle w:val="Heading3"/>
       </w:pPr>
       <w:r>
-        <w:t>25.42. Workspace.ComponentDependencies</w:t>
+        <w:t>25.43. Workspace.ComponentDependencies</w:t>
       </w:r>
     </w:p>
     <w:p>
@@ -10243,7 +10285,7 @@
         <w:pStyle w:val="Heading3"/>
       </w:pPr>
       <w:r>
-        <w:t>25.43. Workspace.DatabaseConnections</w:t>
+        <w:t>25.44. Workspace.DatabaseConnections</w:t>
       </w:r>
     </w:p>
     <w:p>
@@ -10321,7 +10363,7 @@
         <w:pStyle w:val="Heading3"/>
       </w:pPr>
       <w:r>
-        <w:t>25.44. Workspace.DatabaseSchema</w:t>
+        <w:t>25.45. Workspace.DatabaseSchema</w:t>
       </w:r>
     </w:p>
     <w:p>
@@ -10466,7 +10508,7 @@
         <w:pStyle w:val="Heading3"/>
       </w:pPr>
       <w:r>
-        <w:t>25.45. Workspace.DynamicControls</w:t>
+        <w:t>25.46. Workspace.DynamicControls</w:t>
       </w:r>
     </w:p>
     <w:p>
@@ -10508,7 +10550,7 @@
         <w:pStyle w:val="Heading3"/>
       </w:pPr>
       <w:r>
-        <w:t>25.46. Workspace.FormInheritance</w:t>
+        <w:t>25.47. Workspace.FormInheritance</w:t>
       </w:r>
     </w:p>
     <w:p>
@@ -10550,7 +10592,7 @@
         <w:pStyle w:val="Heading3"/>
       </w:pPr>
       <w:r>
-        <w:t>25.47. Workspace.Graphs</w:t>
+        <w:t>25.48. Workspace.Graphs</w:t>
       </w:r>
     </w:p>
     <w:p>
@@ -10628,7 +10670,7 @@
         <w:pStyle w:val="Heading3"/>
       </w:pPr>
       <w:r>
-        <w:t>25.48. Workspace.Keyboard</w:t>
+        <w:t>25.49. Workspace.Keyboard</w:t>
       </w:r>
     </w:p>
     <w:p>
@@ -10694,7 +10736,7 @@
         <w:pStyle w:val="Heading3"/>
       </w:pPr>
       <w:r>
-        <w:t>25.49. Workspace.LayoutRules</w:t>
+        <w:t>25.50. Workspace.LayoutRules</w:t>
       </w:r>
     </w:p>
     <w:p>
@@ -10736,7 +10778,7 @@
         <w:pStyle w:val="Heading3"/>
       </w:pPr>
       <w:r>
-        <w:t>25.50. Workspace.Model</w:t>
+        <w:t>25.51. Workspace.Model</w:t>
       </w:r>
     </w:p>
     <w:p>
@@ -11558,7 +11600,7 @@
         <w:pStyle w:val="Heading3"/>
       </w:pPr>
       <w:r>
-        <w:t>25.51. Workspace.Screen</w:t>
+        <w:t>25.52. Workspace.Screen</w:t>
       </w:r>
     </w:p>
     <w:p>
@@ -11612,7 +11654,7 @@
         <w:pStyle w:val="Heading3"/>
       </w:pPr>
       <w:r>
-        <w:t>25.52. Workspace.ScreenHistory</w:t>
+        <w:t>25.53. Workspace.ScreenHistory</w:t>
       </w:r>
     </w:p>
     <w:p>
@@ -11685,7 +11727,7 @@
         <w:pStyle w:val="Heading3"/>
       </w:pPr>
       <w:r>
-        <w:t>25.53. Workspace.Worker</w:t>
+        <w:t>25.54. Workspace.Worker</w:t>
       </w:r>
     </w:p>
     <w:p>
@@ -15895,7 +15937,7 @@
       <w:pStyle w:val="Footer"/>
     </w:pPr>
     <w:r>
-      <w:t xml:space="preserve">Guide 46  |  15 October 2026                                    Page </w:t>
+      <w:t xml:space="preserve">Guide 47  |  16 October 2026                                    Page </w:t>
     </w:r>
     <w:r>
       <w:fldChar w:fldCharType="begin"/>

</xml_diff>

<commit_message>
Ask before saving newly explored projects
</commit_message>
<xml_diff>
--- a/docs/guides/DPH_Engineering_Guide.docx
+++ b/docs/guides/DPH_Engineering_Guide.docx
@@ -612,7 +612,7 @@
     </w:p>
     <w:p>
       <w:r>
-        <w:t>The visible workflow has six tabs: Getting started, Handoff dossier, Learning library, Project map, Screenshots, and Application diagrams. Open application starts a source capture; Open saved project restores a .dphdb and its adjacent .views folder. DPH.Handoff.Dossier renders the four dossier sections from the selected publication model; the renderer does not execute source or turn an inferred relationship into an observed result. Form-preview generation is deferred until Screenshots is opened to reduce the cost of restoring a saved project. Older authoring, lesson, and specialist controls remain serialized or implemented for compatibility, but must not be described as visible first-use commands.</w:t>
+        <w:t>The visible workflow has six tabs: Getting started, Handoff dossier, Learning library, Project map, Screenshots, and Application diagrams. Open application starts a temporary source capture; closing or changing projects offers Save, Discard, and Cancel before a permanent .dphdb is created. Open saved project restores a .dphdb and its adjacent .views folder. DPH.Handoff.Dossier renders the four dossier sections from the selected publication model; the renderer does not execute source or turn an inferred relationship into an observed result. Form-preview generation is deferred until Screenshots is opened to reduce the cost of restoring a saved project. Older authoring, lesson, and specialist controls remain serialized or implemented for compatibility, but must not be described as visible first-use commands.</w:t>
       </w:r>
     </w:p>
     <w:p>
@@ -9759,19 +9759,31 @@
           <w:rFonts w:ascii="Consolas" w:hAnsi="Consolas"/>
           <w:sz w:val="18"/>
         </w:rPr>
-        <w:t>procedure OpenSelection(const AEntry,ADatabase: string);</w:t>
-      </w:r>
-    </w:p>
-    <w:p>
-      <w:pPr>
-        <w:spacing w:after="40" w:line="247" w:lineRule="auto"/>
-      </w:pPr>
-      <w:r>
-        <w:rPr>
-          <w:rFonts w:ascii="Consolas" w:hAnsi="Consolas"/>
-          <w:sz w:val="18"/>
-        </w:rPr>
-        <w:t>procedure LoadView(ADocument: TJSONObject; AScreenshots: TJSONArray = nil);</w:t>
+        <w:t>procedure OpenSelection(const AEntry,ADatabase: string; AUnsaved: Boolean = False);</w:t>
+      </w:r>
+    </w:p>
+    <w:p>
+      <w:pPr>
+        <w:spacing w:after="40" w:line="247" w:lineRule="auto"/>
+      </w:pPr>
+      <w:r>
+        <w:rPr>
+          <w:rFonts w:ascii="Consolas" w:hAnsi="Consolas"/>
+          <w:sz w:val="18"/>
+        </w:rPr>
+        <w:t xml:space="preserve">procedure LoadView(ADocument: TJSONObject; AScreenshots: TJSONArray = nil; ADeferLearning: </w:t>
+      </w:r>
+    </w:p>
+    <w:p>
+      <w:pPr>
+        <w:spacing w:after="40" w:line="247" w:lineRule="auto"/>
+      </w:pPr>
+      <w:r>
+        <w:rPr>
+          <w:rFonts w:ascii="Consolas" w:hAnsi="Consolas"/>
+          <w:sz w:val="18"/>
+        </w:rPr>
+        <w:t>Boolean = False);</w:t>
       </w:r>
     </w:p>
     <w:p>

</xml_diff>

<commit_message>
Refresh current guides and explain capture verification
</commit_message>
<xml_diff>
--- a/docs/guides/DPH_Engineering_Guide.docx
+++ b/docs/guides/DPH_Engineering_Guide.docx
@@ -20,7 +20,7 @@
     </w:p>
     <w:p>
       <w:r>
-        <w:t>Guide edition 47</w:t>
+        <w:t>Guide edition 48</w:t>
       </w:r>
     </w:p>
     <w:p>
@@ -244,7 +244,7 @@
       </w:r>
       <w:r>
         <w:tab/>
-        <w:t>12</w:t>
+        <w:t>13</w:t>
       </w:r>
     </w:p>
     <w:p>
@@ -259,7 +259,7 @@
       </w:r>
       <w:r>
         <w:tab/>
-        <w:t>13</w:t>
+        <w:t>14</w:t>
       </w:r>
     </w:p>
     <w:p>
@@ -409,7 +409,7 @@
       </w:r>
       <w:r>
         <w:tab/>
-        <w:t>23</w:t>
+        <w:t>24</w:t>
       </w:r>
     </w:p>
     <w:p>
@@ -424,7 +424,7 @@
       </w:r>
       <w:r>
         <w:tab/>
-        <w:t>24</w:t>
+        <w:t>25</w:t>
       </w:r>
     </w:p>
     <w:p>
@@ -439,7 +439,7 @@
       </w:r>
       <w:r>
         <w:tab/>
-        <w:t>24</w:t>
+        <w:t>25</w:t>
       </w:r>
     </w:p>
     <w:p>
@@ -484,7 +484,7 @@
       </w:r>
       <w:r>
         <w:tab/>
-        <w:t>28</w:t>
+        <w:t>29</w:t>
       </w:r>
     </w:p>
     <w:p>
@@ -1249,7 +1249,20 @@
     </w:p>
     <w:p>
       <w:r>
-        <w:t>Opening a cache is not equivalent to a full scan. It should not perform every expensive optional report merely because the form has serialized tabs for them. Build deeper projections on demand for their active destination.</w:t>
+        <w:t>Opening a cache is not equivalent to a full scan. If the recorded source entry is still available under the recorded root, the worker verifies its manifest and analyzer/discovery versions in the background; a changed fingerprint or version triggers an incremental scan. If unchanged, it reports verification without scanning again. Opening the source entry with Open application uses the same incremental comparison. It should not perform every expensive optional report merely because the form has serialized tabs for them. Build deeper projections on demand for their active destination.</w:t>
+      </w:r>
+    </w:p>
+    <w:p>
+      <w:pPr>
+        <w:pStyle w:val="Heading3"/>
+      </w:pPr>
+      <w:r>
+        <w:t>6.2.1. What the dossier STALE label means</w:t>
+      </w:r>
+    </w:p>
+    <w:p>
+      <w:r>
+        <w:t>RefreshLearning passes the inverse of analysis_complete into the document model stale field. analysis_complete is true only when both syntax and semantic passes are complete. Thus the dossier can say STALE capture for a newly captured but incomplete analysis; the captured timestamp alone does not set the label. DPH.Handoff.Dossier renders Static inspection only for every capture because it never executes the selected application. After a source verification or incremental scan, inspect the captured diagnostics and missing inputs when the banner persists. Do not promise that reopening will clear it: unsupported syntax, unresolved connections, or missing material may continue to make analysis incomplete. The store separately tracks analysis_stale for source changes, interrupted generations and reassessment; publication clears that state only after a successful current generation.</w:t>
       </w:r>
     </w:p>
     <w:p>
@@ -15949,7 +15962,7 @@
       <w:pStyle w:val="Footer"/>
     </w:pPr>
     <w:r>
-      <w:t xml:space="preserve">Guide 47  |  16 October 2026                                    Page </w:t>
+      <w:t xml:space="preserve">Guide 48  |  16 October 2026                                    Page </w:t>
     </w:r>
     <w:r>
       <w:fldChar w:fldCharType="begin"/>

</xml_diff>

<commit_message>
Open generated screens at readable native size
</commit_message>
<xml_diff>
--- a/docs/guides/DPH_Engineering_Guide.docx
+++ b/docs/guides/DPH_Engineering_Guide.docx
@@ -20,7 +20,7 @@
     </w:p>
     <w:p>
       <w:r>
-        <w:t>Guide edition 48</w:t>
+        <w:t>Guide edition 49</w:t>
       </w:r>
     </w:p>
     <w:p>
@@ -2614,7 +2614,7 @@
     </w:p>
     <w:p>
       <w:r>
-        <w:t>ScreenshotMarkerPaint draws numbered markers using the current image extent, while the legend presents attributed teaching content. Fit, native-pixel and custom zoom modes change the display transform. Test markers near boundaries and after zoom/resize so a correct stored point does not become a misplaced visual label.</w:t>
+        <w:t>ScreenshotMarkerPaint draws numbered markers using the current image extent, while the legend presents attributed teaching content. The serialized ScreenshotModeCombo starts in Native pixels; Fit and custom zoom change the display transform. The lower evidence memo uses a compact height and does not repeat the help text above the image. Test markers near boundaries and after zoom/resize so a correct stored point does not become a misplaced visual label.</w:t>
       </w:r>
     </w:p>
     <w:p>
@@ -15962,7 +15962,7 @@
       <w:pStyle w:val="Footer"/>
     </w:pPr>
     <w:r>
-      <w:t xml:space="preserve">Guide 48  |  16 October 2026                                    Page </w:t>
+      <w:t xml:space="preserve">Guide 49  |  16 October 2026                                    Page </w:t>
     </w:r>
     <w:r>
       <w:fldChar w:fldCharType="begin"/>

</xml_diff>

<commit_message>
Release DPH 0.8.0.1 experimental packages and guides
</commit_message>
<xml_diff>
--- a/docs/guides/DPH_Engineering_Guide.docx
+++ b/docs/guides/DPH_Engineering_Guide.docx
@@ -20,7 +20,7 @@
     </w:p>
     <w:p>
       <w:r>
-        <w:t>Guide edition 49</w:t>
+        <w:t>Experimental release 0.8.0.1  |  Guide edition 50</w:t>
       </w:r>
     </w:p>
     <w:p>
@@ -3268,7 +3268,7 @@
     </w:p>
     <w:p>
       <w:r>
-        <w:t>The experimental desktop package contains the Win32 and Win64 DelphiProjectHandoff.exe builds, a WebView2Loader.dll beside each, offline language packs, the German trial model, migrations, help, current guides, directions, DPH's Apache 2.0 license, and third-party notices. It does not include an owner .dphdb, private document copies, or reference-project working stores. A previously created package is a historical build and must not be presented as the current executable. The unmodified Bergamot model is attributed under CC BY-SA 4.0, with its license text and indexed file hashes included in the package.</w:t>
+        <w:t>The 0.8.0.1 experimental desktop package contains the Win32 and Win64 Release DelphiProjectHandoff.exe builds, a WebView2Loader.dll beside each, offline language packs, the German trial model, migrations, help, current guides, directions, DPH's Apache 2.0 license, and third-party notices. It does not include an owner .dphdb, private document copies, or reference-project working stores. A previously created package is a historical build and must not be presented as the current executable. The unmodified Bergamot model is attributed under CC BY-SA 4.0, with its license text and indexed file hashes included in the package.</w:t>
       </w:r>
     </w:p>
     <w:p>
@@ -3311,7 +3311,7 @@
         <w:t xml:space="preserve">2. </w:t>
       </w:r>
       <w:r>
-        <w:t>Review the exact source files and guide illustrations to distribute. Run tools\package-source-distribution.ps1 with a fresh semantic Version value. It verifies every source file hash and refuses an existing archive name.</w:t>
+        <w:t>Review the exact source files and guide illustrations to distribute. Run tools\package-source-distribution.ps1 with a fresh version value, including four-component experimental versions such as 0.8.0.1. It verifies every source file hash and refuses an existing archive name.</w:t>
       </w:r>
     </w:p>
     <w:p>
@@ -15962,7 +15962,7 @@
       <w:pStyle w:val="Footer"/>
     </w:pPr>
     <w:r>
-      <w:t xml:space="preserve">Guide 49  |  16 October 2026                                    Page </w:t>
+      <w:t xml:space="preserve">Guide 50  |  16 October 2026                                    Page </w:t>
     </w:r>
     <w:r>
       <w:fldChar w:fldCharType="begin"/>

</xml_diff>

<commit_message>
Release experimental 0.8.0.2 with startup and preview fixes
</commit_message>
<xml_diff>
--- a/docs/guides/DPH_Engineering_Guide.docx
+++ b/docs/guides/DPH_Engineering_Guide.docx
@@ -20,7 +20,7 @@
     </w:p>
     <w:p>
       <w:r>
-        <w:t>Experimental release 0.8.0.1  |  Guide edition 50</w:t>
+        <w:t>Experimental release 0.8.0.2  |  Guide edition 51</w:t>
       </w:r>
     </w:p>
     <w:p>
@@ -1249,7 +1249,7 @@
     </w:p>
     <w:p>
       <w:r>
-        <w:t>Opening a cache is not equivalent to a full scan. If the recorded source entry is still available under the recorded root, the worker verifies its manifest and analyzer/discovery versions in the background; a changed fingerprint or version triggers an incremental scan. If unchanged, it reports verification without scanning again. Opening the source entry with Open application uses the same incremental comparison. It should not perform every expensive optional report merely because the form has serialized tabs for them. Build deeper projections on demand for their active destination.</w:t>
+        <w:t>Opening a cache is not equivalent to a full scan. A normal launch opens Getting started without loading the last database; only an explicit selection or .dphdb command-line argument opens a saved capture. If the recorded source entry is still available under the recorded root, the worker verifies its manifest, stale flag, and analyzer/discovery versions in the background; a stale flag, changed fingerprint, or changed version triggers an incremental scan. If unchanged, it reports verification without scanning again. Opening the source entry with Open application uses the same incremental comparison. It should not perform every expensive optional report merely because the form has serialized tabs for them. Build deeper projections on demand for their active destination.</w:t>
       </w:r>
     </w:p>
     <w:p>
@@ -1262,7 +1262,7 @@
     </w:p>
     <w:p>
       <w:r>
-        <w:t>RefreshLearning passes the inverse of analysis_complete into the document model stale field. analysis_complete is true only when both syntax and semantic passes are complete. Thus the dossier can say STALE capture for a newly captured but incomplete analysis; the captured timestamp alone does not set the label. DPH.Handoff.Dossier renders Static inspection only for every capture because it never executes the selected application. After a source verification or incremental scan, inspect the captured diagnostics and missing inputs when the banner persists. Do not promise that reopening will clear it: unsupported syntax, unresolved connections, or missing material may continue to make analysis incomplete. The store separately tracks analysis_stale for source changes, interrupted generations and reassessment; publication clears that state only after a successful current generation.</w:t>
+        <w:t>RefreshLearning marks the document model stale when its source is detached. An attached capture with analysis_complete false is PARTIAL, not STALE; analysis_complete is true only when both syntax and semantic passes complete. DPH.Handoff.Dossier renders Static inspection only for every capture because it never executes the selected application. The store separately tracks analysis_stale for source changes, interrupted generations and reassessment. On an explicit saved-project open with source available, the worker now includes that flag in its background rescan decision; a successful current generation clears it. Unsupported syntax, unresolved connections, or missing material may still leave a refreshed capture PARTIAL. A detached saved capture remains marked STALE until its source can be verified.</w:t>
       </w:r>
     </w:p>
     <w:p>
@@ -1600,7 +1600,7 @@
     </w:p>
     <w:p>
       <w:r>
-        <w:t>Use the saved hierarchy to teach names and relationships. Label generated form designs as reconstructions. Keep imported screenshots in their distinct channel with contributor, caption and image identity. Replacing that distinction with a generic screenshot caption misstates what was observed.</w:t>
+        <w:t>Use the saved hierarchy to teach names and relationships. The form preview renderer separates each saved TTabItem into its own design preview and normalizes that tab's offset before painting descendants. An unselected tab is still part of the saved design; IsSelected must not hide it from reconstruction. Label generated form designs as reconstructions. Keep imported screenshots in their distinct channel with contributor, caption and image identity. Replacing that distinction with a generic screenshot caption misstates what was observed.</w:t>
       </w:r>
     </w:p>
     <w:p>
@@ -3268,7 +3268,7 @@
     </w:p>
     <w:p>
       <w:r>
-        <w:t>The 0.8.0.1 experimental desktop package contains the Win32 and Win64 Release DelphiProjectHandoff.exe builds, a WebView2Loader.dll beside each, offline language packs, the German trial model, migrations, help, current guides, directions, DPH's Apache 2.0 license, and third-party notices. It does not include an owner .dphdb, private document copies, or reference-project working stores. A previously created package is a historical build and must not be presented as the current executable. The unmodified Bergamot model is attributed under CC BY-SA 4.0, with its license text and indexed file hashes included in the package.</w:t>
+        <w:t>The 0.8.0.2 experimental desktop package contains the Win32 and Win64 Release DelphiProjectHandoff.exe builds, a WebView2Loader.dll beside each, offline language packs, the German trial model, migrations, help, current guides, directions, DPH's Apache 2.0 license, and third-party notices. It does not include an owner .dphdb, private document copies, or reference-project working stores. A previously created package is a historical build and must not be presented as the current executable. The unmodified Bergamot model is attributed under CC BY-SA 4.0, with its license text and indexed file hashes included in the package.</w:t>
       </w:r>
     </w:p>
     <w:p>
@@ -3311,7 +3311,7 @@
         <w:t xml:space="preserve">2. </w:t>
       </w:r>
       <w:r>
-        <w:t>Review the exact source files and guide illustrations to distribute. Run tools\package-source-distribution.ps1 with a fresh version value, including four-component experimental versions such as 0.8.0.1. It verifies every source file hash and refuses an existing archive name.</w:t>
+        <w:t>Review the exact source files and guide illustrations to distribute. Run tools\package-source-distribution.ps1 with a fresh version value, including four-component experimental versions such as 0.8.0.2. It verifies every source file hash and refuses an existing archive name.</w:t>
       </w:r>
     </w:p>
     <w:p>
@@ -15962,7 +15962,7 @@
       <w:pStyle w:val="Footer"/>
     </w:pPr>
     <w:r>
-      <w:t xml:space="preserve">Guide 50  |  16 October 2026                                    Page </w:t>
+      <w:t xml:space="preserve">Guide 51  |  16 October 2026                                    Page </w:t>
     </w:r>
     <w:r>
       <w:fldChar w:fldCharType="begin"/>

</xml_diff>

<commit_message>
Release experimental 0.8.0.3 with saved-open fix
</commit_message>
<xml_diff>
--- a/docs/guides/DPH_Engineering_Guide.docx
+++ b/docs/guides/DPH_Engineering_Guide.docx
@@ -20,7 +20,7 @@
     </w:p>
     <w:p>
       <w:r>
-        <w:t>Experimental release 0.8.0.2  |  Guide edition 51</w:t>
+        <w:t>Experimental release 0.8.0.3  |  Guide edition 52</w:t>
       </w:r>
     </w:p>
     <w:p>
@@ -1910,6 +1910,11 @@
     </w:p>
     <w:p>
       <w:r>
+        <w:t>Opening a saved project verifies the cached artifact and compares its captured manifest fingerprint, analyzer and discovery versions, and reading selection with the attached source. A partial capture remains marked stale for interpretation, but that flag alone must not cause an identical expensive scan on every open. Explicit reassessment, changed inputs, versions, or selection start a new scan. Preserve the partial qualification in the learner interface and exported evidence.</w:t>
+      </w:r>
+    </w:p>
+    <w:p>
+      <w:r>
         <w:t>Retention removes eligible older cached views while preserving protected generations and linked evidence under the implemented policy. It does not delete the immutable analysis fact history or human knowledge merely because an older view file is eligible. Backup must include managed images and observations, not only cache JSON.</w:t>
       </w:r>
     </w:p>
@@ -3268,7 +3273,7 @@
     </w:p>
     <w:p>
       <w:r>
-        <w:t>The 0.8.0.2 experimental desktop package contains the Win32 and Win64 Release DelphiProjectHandoff.exe builds, a WebView2Loader.dll beside each, offline language packs, the German trial model, migrations, help, current guides, directions, DPH's Apache 2.0 license, and third-party notices. It does not include an owner .dphdb, private document copies, or reference-project working stores. A previously created package is a historical build and must not be presented as the current executable. The unmodified Bergamot model is attributed under CC BY-SA 4.0, with its license text and indexed file hashes included in the package.</w:t>
+        <w:t>The 0.8.0.3 experimental desktop package contains the Win32 and Win64 Release DelphiProjectHandoff.exe builds, a WebView2Loader.dll beside each, offline language packs, the German trial model, migrations, help, current guides, directions, DPH's Apache 2.0 license, and third-party notices. It does not include an owner .dphdb, private document copies, or reference-project working stores. A previously created package is a historical build and must not be presented as the current executable. The unmodified Bergamot model is attributed under CC BY-SA 4.0, with its license text and indexed file hashes included in the package.</w:t>
       </w:r>
     </w:p>
     <w:p>
@@ -3311,7 +3316,7 @@
         <w:t xml:space="preserve">2. </w:t>
       </w:r>
       <w:r>
-        <w:t>Review the exact source files and guide illustrations to distribute. Run tools\package-source-distribution.ps1 with a fresh version value, including four-component experimental versions such as 0.8.0.2. It verifies every source file hash and refuses an existing archive name.</w:t>
+        <w:t>Review the exact source files and guide illustrations to distribute. Run tools\package-source-distribution.ps1 with a fresh version value, including four-component experimental versions such as 0.8.0.3. It verifies every source file hash and refuses an existing archive name.</w:t>
       </w:r>
     </w:p>
     <w:p>
@@ -6335,7 +6340,19 @@
           <w:rFonts w:ascii="Consolas" w:hAnsi="Consolas"/>
           <w:sz w:val="18"/>
         </w:rPr>
-        <w:t>function LoadWorkspaceView(AGenerationID: Int64 = 0): string;</w:t>
+        <w:t xml:space="preserve">function LoadWorkspaceView(AGenerationID: Int64 = 0; ASkipGenerationParse: Boolean = False): </w:t>
+      </w:r>
+    </w:p>
+    <w:p>
+      <w:pPr>
+        <w:spacing w:after="40" w:line="247" w:lineRule="auto"/>
+      </w:pPr>
+      <w:r>
+        <w:rPr>
+          <w:rFonts w:ascii="Consolas" w:hAnsi="Consolas"/>
+          <w:sz w:val="18"/>
+        </w:rPr>
+        <w:t>string;</w:t>
       </w:r>
     </w:p>
     <w:p>
@@ -9808,7 +9825,7 @@
           <w:rFonts w:ascii="Consolas" w:hAnsi="Consolas"/>
           <w:sz w:val="18"/>
         </w:rPr>
-        <w:t>procedure LoadKnowledge(ARows: TJSONArray);</w:t>
+        <w:t>procedure LoadKnowledge(ARows: TJSONArray; ADeferInitialViews: Boolean = False);</w:t>
       </w:r>
     </w:p>
     <w:p>
@@ -15962,7 +15979,7 @@
       <w:pStyle w:val="Footer"/>
     </w:pPr>
     <w:r>
-      <w:t xml:space="preserve">Guide 51  |  16 October 2026                                    Page </w:t>
+      <w:t xml:space="preserve">Guide 52  |  16 October 2026                                    Page </w:t>
     </w:r>
     <w:r>
       <w:fldChar w:fldCharType="begin"/>

</xml_diff>

<commit_message>
Restore real saved-project dossier and release 0.8.0.4
</commit_message>
<xml_diff>
--- a/docs/guides/DPH_Engineering_Guide.docx
+++ b/docs/guides/DPH_Engineering_Guide.docx
@@ -20,7 +20,7 @@
     </w:p>
     <w:p>
       <w:r>
-        <w:t>Experimental release 0.8.0.3  |  Guide edition 52</w:t>
+        <w:t>Experimental release 0.8.0.4  |  Guide edition 53</w:t>
       </w:r>
     </w:p>
     <w:p>
@@ -379,7 +379,7 @@
       </w:r>
       <w:r>
         <w:tab/>
-        <w:t>22</w:t>
+        <w:t>23</w:t>
       </w:r>
     </w:p>
     <w:p>
@@ -394,7 +394,7 @@
       </w:r>
       <w:r>
         <w:tab/>
-        <w:t>22</w:t>
+        <w:t>23</w:t>
       </w:r>
     </w:p>
     <w:p>
@@ -469,7 +469,7 @@
       </w:r>
       <w:r>
         <w:tab/>
-        <w:t>27</w:t>
+        <w:t>28</w:t>
       </w:r>
     </w:p>
     <w:p>
@@ -559,7 +559,7 @@
       </w:r>
       <w:r>
         <w:tab/>
-        <w:t>57</w:t>
+        <w:t>58</w:t>
       </w:r>
     </w:p>
     <w:p>
@@ -2696,7 +2696,7 @@
     </w:p>
     <w:p>
       <w:r>
-        <w:t>WorkspacePageChange chooses the active projection. Report generation for hidden specialist tabs should not delay opening the Handoff dossier. Refresh routines must distinguish loading the base view from building graphs, generated form previews, quality reports or screen-history comparisons on demand.</w:t>
+        <w:t>WorkspacePageChange chooses the active projection. Saved open builds the actual Handoff dossier from the captured view and current knowledge, then clears preparation after its browser document loads. It does not substitute a short placeholder for the dossier. Report generation for hidden specialist tabs should not delay this page; graphs, generated form previews, quality reports and screen-history comparisons load when requested. The browser lifecycle must preserve the form's requested visibility after translation handling.</w:t>
       </w:r>
     </w:p>
     <w:p>
@@ -3273,7 +3273,7 @@
     </w:p>
     <w:p>
       <w:r>
-        <w:t>The 0.8.0.3 experimental desktop package contains the Win32 and Win64 Release DelphiProjectHandoff.exe builds, a WebView2Loader.dll beside each, offline language packs, the German trial model, migrations, help, current guides, directions, DPH's Apache 2.0 license, and third-party notices. It does not include an owner .dphdb, private document copies, or reference-project working stores. A previously created package is a historical build and must not be presented as the current executable. The unmodified Bergamot model is attributed under CC BY-SA 4.0, with its license text and indexed file hashes included in the package.</w:t>
+        <w:t>The 0.8.0.4 experimental desktop package contains the Win32 and Win64 Release DelphiProjectHandoff.exe builds, a WebView2Loader.dll beside each, offline language packs, the German trial model, migrations, help, current guides, directions, DPH's Apache 2.0 license, and third-party notices. It does not include an owner .dphdb, private document copies, or reference-project working stores. A previously created package is a historical build and must not be presented as the current executable. The unmodified Bergamot model is attributed under CC BY-SA 4.0, with its license text and indexed file hashes included in the package.</w:t>
       </w:r>
     </w:p>
     <w:p>
@@ -3316,7 +3316,7 @@
         <w:t xml:space="preserve">2. </w:t>
       </w:r>
       <w:r>
-        <w:t>Review the exact source files and guide illustrations to distribute. Run tools\package-source-distribution.ps1 with a fresh version value, including four-component experimental versions such as 0.8.0.3. It verifies every source file hash and refuses an existing archive name.</w:t>
+        <w:t>Review the exact source files and guide illustrations to distribute. Run tools\package-source-distribution.ps1 with a fresh version value, including four-component experimental versions such as 0.8.0.4. It verifies every source file hash and refuses an existing archive name.</w:t>
       </w:r>
     </w:p>
     <w:p>
@@ -8950,6 +8950,18 @@
           <w:sz w:val="18"/>
         </w:rPr>
         <w:t>procedure LearningShouldLoad(Sender: TObject; const AURL: string; var ACancel: Boolean);</w:t>
+      </w:r>
+    </w:p>
+    <w:p>
+      <w:pPr>
+        <w:spacing w:after="40" w:line="247" w:lineRule="auto"/>
+      </w:pPr>
+      <w:r>
+        <w:rPr>
+          <w:rFonts w:ascii="Consolas" w:hAnsi="Consolas"/>
+          <w:sz w:val="18"/>
+        </w:rPr>
+        <w:t>procedure LearningBrowserDidFinishLoad(Sender: TObject);</w:t>
       </w:r>
     </w:p>
     <w:p>
@@ -15979,7 +15991,7 @@
       <w:pStyle w:val="Footer"/>
     </w:pPr>
     <w:r>
-      <w:t xml:space="preserve">Guide 52  |  16 October 2026                                    Page </w:t>
+      <w:t xml:space="preserve">Guide 53  |  16 October 2026                                    Page </w:t>
     </w:r>
     <w:r>
       <w:fldChar w:fldCharType="begin"/>

</xml_diff>

<commit_message>
Render empty dossier as HTML and recover saved SQLite journals
</commit_message>
<xml_diff>
--- a/docs/guides/DPH_Engineering_Guide.docx
+++ b/docs/guides/DPH_Engineering_Guide.docx
@@ -20,7 +20,7 @@
     </w:p>
     <w:p>
       <w:r>
-        <w:t>Experimental release 0.8.0.4  |  Guide edition 53</w:t>
+        <w:t>Experimental release 0.8.0.5  |  Guide edition 54</w:t>
       </w:r>
     </w:p>
     <w:p>
@@ -334,7 +334,7 @@
       </w:r>
       <w:r>
         <w:tab/>
-        <w:t>18</w:t>
+        <w:t>19</w:t>
       </w:r>
     </w:p>
     <w:p>
@@ -349,7 +349,7 @@
       </w:r>
       <w:r>
         <w:tab/>
-        <w:t>20</w:t>
+        <w:t>21</w:t>
       </w:r>
     </w:p>
     <w:p>
@@ -364,7 +364,7 @@
       </w:r>
       <w:r>
         <w:tab/>
-        <w:t>21</w:t>
+        <w:t>22</w:t>
       </w:r>
     </w:p>
     <w:p>
@@ -1253,6 +1253,11 @@
       </w:r>
     </w:p>
     <w:p>
+      <w:r>
+        <w:t>The dossier's no-project state is an HTML document in the existing WebView2 control, with its content kept under help/dossier-start.html. Opening a saved project replaces that introduction with TDPHHandoffDossier's source-backed HTML only after the document and knowledge response are ready; a plain memo is not used as the dossier. ProjectRoot opens an existing SQLite database for read and write because even its first SELECT may need to recover a hot rollback journal left by an interrupted writer. It checks that the database already exists before opening and does not create a new store during this lookup. Keep the database, rollback journal, and managed .views folder together through recovery. Test recovery on a disposable copy of owner data.</w:t>
+      </w:r>
+    </w:p>
+    <w:p>
       <w:pPr>
         <w:pStyle w:val="Heading3"/>
       </w:pPr>
@@ -3209,7 +3214,7 @@
     </w:p>
     <w:p>
       <w:r>
-        <w:t>DPH.Tests.LearningRefocus creates a disposable selected-project capture, verifies that the main learner views use that project's own forms and action links, and confirms that no OrderPractice lessons are imported. Its native WebView2 path checks the route title, internal links, text fallback and compact layout. The test writes screenshots into its disposable workspace and publishes selected current-interface captures for the manuals only after all checks pass.</w:t>
+        <w:t>DPH.Tests.LearningRefocus creates a disposable selected-project capture, verifies that the main learner views use that project's own forms and action links, and confirms that no OrderPractice lessons are imported. Its native WebView2 path checks the HTML dossier before and after opening a project, internal links and compact layout. With a separately supplied disposable large reference cache, it also exercises the full saved-project command and measures the time to a rendered dossier. DPH.Tests.Storage verifies that the initial project-root lookup recovers an interrupted SQLite journal. The learning test writes screenshots into its disposable workspace and publishes selected current-interface captures for the manuals only after all checks pass.</w:t>
       </w:r>
     </w:p>
     <w:p>
@@ -3273,7 +3278,7 @@
     </w:p>
     <w:p>
       <w:r>
-        <w:t>The 0.8.0.4 experimental desktop package contains the Win32 and Win64 Release DelphiProjectHandoff.exe builds, a WebView2Loader.dll beside each, offline language packs, the German trial model, migrations, help, current guides, directions, DPH's Apache 2.0 license, and third-party notices. It does not include an owner .dphdb, private document copies, or reference-project working stores. A previously created package is a historical build and must not be presented as the current executable. The unmodified Bergamot model is attributed under CC BY-SA 4.0, with its license text and indexed file hashes included in the package.</w:t>
+        <w:t>The 0.8.0.5 experimental desktop package contains the Win32 and Win64 Release DelphiProjectHandoff.exe builds, a WebView2Loader.dll beside each, offline language packs, the German trial model, migrations, help, current guides, directions, DPH's Apache 2.0 license, and third-party notices. It does not include an owner .dphdb, private document copies, or reference-project working stores. A previously created package is a historical build and must not be presented as the current executable. The unmodified Bergamot model is attributed under CC BY-SA 4.0, with its license text and indexed file hashes included in the package.</w:t>
       </w:r>
     </w:p>
     <w:p>
@@ -3316,7 +3321,7 @@
         <w:t xml:space="preserve">2. </w:t>
       </w:r>
       <w:r>
-        <w:t>Review the exact source files and guide illustrations to distribute. Run tools\package-source-distribution.ps1 with a fresh version value, including four-component experimental versions such as 0.8.0.4. It verifies every source file hash and refuses an existing archive name.</w:t>
+        <w:t>Review the exact source files and guide illustrations to distribute. Run tools\package-source-distribution.ps1 with a fresh version value, including four-component experimental versions such as 0.8.0.5. It verifies every source file hash and refuses an existing archive name.</w:t>
       </w:r>
     </w:p>
     <w:p>
@@ -15991,7 +15996,7 @@
       <w:pStyle w:val="Footer"/>
     </w:pPr>
     <w:r>
-      <w:t xml:space="preserve">Guide 53  |  16 October 2026                                    Page </w:t>
+      <w:t xml:space="preserve">Guide 54  |  16 October 2026                                    Page </w:t>
     </w:r>
     <w:r>
       <w:fldChar w:fldCharType="begin"/>

</xml_diff>

<commit_message>
Scope project documents and restore fast screen and diagram views
</commit_message>
<xml_diff>
--- a/docs/guides/DPH_Engineering_Guide.docx
+++ b/docs/guides/DPH_Engineering_Guide.docx
@@ -20,7 +20,7 @@
     </w:p>
     <w:p>
       <w:r>
-        <w:t>Experimental release 0.8.0.5  |  Guide edition 54</w:t>
+        <w:t>Experimental release 0.8.0.6  |  Guide edition 55</w:t>
       </w:r>
     </w:p>
     <w:p>
@@ -740,7 +740,7 @@
     </w:p>
     <w:p>
       <w:r>
-        <w:t>DPH.Learning.Discovery scans eligible documents only within the selected project directory. It bounds traversal and samples documents and logs before building Learning library entries. The text-quality filter must count Unicode letters, not only ASCII Latin letters; otherwise readable Arabic, CJK, Cyrillic, and other guides disappear even though DPH's interface has offline language packs. A discovered file with no usable text should carry a visible reason. PDF and older word-processing extraction depends on LibreOffice at the standard Windows path; DOCX and supported text formats are processed directly. Referenced public HTTPS pages may be contacted only when Read public websites is enabled. Discovery rejects private IPv4 resolutions and uses WinHTTP's request-level hostname-resolution override to pin the connection to the checked public IPv4 address while retaining the original host for TLS verification. It uses no proxy, disables redirects, cookies, and authentication, and caps responses at 128 KiB. If the Windows 10 21H1-or-later override is unavailable, the request fails closed. Network isolation still needs controlled adversarial testing before a production release.</w:t>
+        <w:t>DPH.Learning.Discovery reads eligible document files directly in the selected project's source directory. It does not recurse into nested docs, help, release, or archive directories for Learning library documents; its limited image traversal is separate. An older saved document list is cleared before display when the discovery version changes, then rebuilt from the selected source directory. The text-quality filter must count Unicode letters, not only ASCII Latin letters; otherwise readable Arabic, CJK, Cyrillic, and other guides disappear even though DPH's interface has offline language packs. A discovered file with no usable text should carry a visible reason. PDF and older word-processing extraction depends on LibreOffice at the standard Windows path; DOCX and supported text formats are processed directly. Referenced public HTTPS pages may be contacted only when Read public websites is enabled. Discovery rejects private IPv4 resolutions and uses WinHTTP's request-level hostname-resolution override to pin the connection to the checked public IPv4 address while retaining the original host for TLS verification. It uses no proxy, disables redirects, cookies, and authentication, and caps responses at 128 KiB. If the Windows 10 21H1-or-later override is unavailable, the request fails closed. Network isolation still needs controlled adversarial testing before a production release.</w:t>
       </w:r>
     </w:p>
     <w:p>
@@ -1605,7 +1605,7 @@
     </w:p>
     <w:p>
       <w:r>
-        <w:t>Use the saved hierarchy to teach names and relationships. The form preview renderer separates each saved TTabItem into its own design preview and normalizes that tab's offset before painting descendants. An unselected tab is still part of the saved design; IsSelected must not hide it from reconstruction. Label generated form designs as reconstructions. Keep imported screenshots in their distinct channel with contributor, caption and image identity. Replacing that distinction with a generic screenshot caption misstates what was observed.</w:t>
+        <w:t>Use the saved hierarchy to teach names and relationships. The form preview renderer includes the main screen with its initial tab and separates each saved TTabItem into its own design preview. It places a client-aligned panel below earlier top-aligned siblings and respects saved margins and padding before painting descendants. An unselected tab is still part of the saved design; IsSelected must not hide it from reconstruction. Label generated form designs as reconstructions. Keep imported screenshots in their distinct channel with contributor, caption and image identity. Replacing that distinction with a generic screenshot caption misstates what was observed.</w:t>
       </w:r>
     </w:p>
     <w:p>
@@ -3278,7 +3278,7 @@
     </w:p>
     <w:p>
       <w:r>
-        <w:t>The 0.8.0.5 experimental desktop package contains the Win32 and Win64 Release DelphiProjectHandoff.exe builds, a WebView2Loader.dll beside each, offline language packs, the German trial model, migrations, help, current guides, directions, DPH's Apache 2.0 license, and third-party notices. It does not include an owner .dphdb, private document copies, or reference-project working stores. A previously created package is a historical build and must not be presented as the current executable. The unmodified Bergamot model is attributed under CC BY-SA 4.0, with its license text and indexed file hashes included in the package.</w:t>
+        <w:t>The 0.8.0.6 experimental desktop package contains the Win32 and Win64 Release DelphiProjectHandoff.exe builds, a WebView2Loader.dll beside each, offline language packs, the German trial model, migrations, help, current guides, directions, DPH's Apache 2.0 license, and third-party notices. It does not include an owner .dphdb, private document copies, or reference-project working stores. A previously created package is a historical build and must not be presented as the current executable. The unmodified Bergamot model is attributed under CC BY-SA 4.0, with its license text and indexed file hashes included in the package.</w:t>
       </w:r>
     </w:p>
     <w:p>
@@ -3321,7 +3321,7 @@
         <w:t xml:space="preserve">2. </w:t>
       </w:r>
       <w:r>
-        <w:t>Review the exact source files and guide illustrations to distribute. Run tools\package-source-distribution.ps1 with a fresh version value, including four-component experimental versions such as 0.8.0.5. It verifies every source file hash and refuses an existing archive name.</w:t>
+        <w:t>Review the exact source files and guide illustrations to distribute. Run tools\package-source-distribution.ps1 with a fresh version value, including four-component experimental versions such as 0.8.0.6. It verifies every source file hash and refuses an existing archive name.</w:t>
       </w:r>
     </w:p>
     <w:p>
@@ -3708,7 +3708,7 @@
           <w:rFonts w:ascii="Consolas" w:hAnsi="Consolas"/>
           <w:sz w:val="18"/>
         </w:rPr>
-        <w:t>constructor Create(AFacts: TJSONObject);</w:t>
+        <w:t>constructor Create(AFacts: TJSONObject; AIndexFacts: Boolean = True);</w:t>
       </w:r>
     </w:p>
     <w:p>
@@ -15996,7 +15996,7 @@
       <w:pStyle w:val="Footer"/>
     </w:pPr>
     <w:r>
-      <w:t xml:space="preserve">Guide 54  |  16 October 2026                                    Page </w:t>
+      <w:t xml:space="preserve">Guide 55  |  16 October 2026                                    Page </w:t>
     </w:r>
     <w:r>
       <w:fldChar w:fldCharType="begin"/>

</xml_diff>

<commit_message>
Improve large-project loading and project evidence in 0.8.0.7
</commit_message>
<xml_diff>
--- a/docs/guides/DPH_Engineering_Guide.docx
+++ b/docs/guides/DPH_Engineering_Guide.docx
@@ -20,7 +20,7 @@
     </w:p>
     <w:p>
       <w:r>
-        <w:t>Experimental release 0.8.0.6  |  Guide edition 55</w:t>
+        <w:t>Experimental release 0.8.0.7  |  Guide edition 56</w:t>
       </w:r>
     </w:p>
     <w:p>
@@ -740,7 +740,7 @@
     </w:p>
     <w:p>
       <w:r>
-        <w:t>DPH.Learning.Discovery reads eligible document files directly in the selected project's source directory. It does not recurse into nested docs, help, release, or archive directories for Learning library documents; its limited image traversal is separate. An older saved document list is cleared before display when the discovery version changes, then rebuilt from the selected source directory. The text-quality filter must count Unicode letters, not only ASCII Latin letters; otherwise readable Arabic, CJK, Cyrillic, and other guides disappear even though DPH's interface has offline language packs. A discovered file with no usable text should carry a visible reason. PDF and older word-processing extraction depends on LibreOffice at the standard Windows path; DOCX and supported text formats are processed directly. Referenced public HTTPS pages may be contacted only when Read public websites is enabled. Discovery rejects private IPv4 resolutions and uses WinHTTP's request-level hostname-resolution override to pin the connection to the checked public IPv4 address while retaining the original host for TLS verification. It uses no proxy, disables redirects, cookies, and authentication, and caps responses at 128 KiB. If the Windows 10 21H1-or-later override is unavailable, the request fails closed. Network isolation still needs controlled adversarial testing before a production release.</w:t>
+        <w:t>DPH.Learning.Discovery reads a selected project's root README and named guides, documents directly under docs, and documents under docs/guides, docs/pdf, and docs/notes. It does not descend into separate release, help, or archive directories; its limited image traversal is separate. It excludes unrelated root instructions and filters explicitly versioned document names when the root README identifies the current major version. An older saved document list is cleared before display when the discovery version changes, then rebuilt from the selected project. The text-quality filter must count Unicode letters, not only ASCII Latin letters; otherwise readable Arabic, CJK, Cyrillic, and other guides disappear even though DPH's interface has offline language packs. A discovered file with no usable text should carry a visible reason. PDF and older word-processing extraction depends on LibreOffice at the standard Windows path; DOCX and supported text formats are processed directly. Eligible public HTTPS pages from the selected project's sitemap.txt or documents may be contacted only when Read public websites is enabled; successfully fetched text is shown in the Learning library. Discovery rejects private IPv4 resolutions and uses WinHTTP's request-level hostname-resolution override to pin the connection to the checked public IPv4 address while retaining the original host for TLS verification. It uses no proxy, disables redirects, cookies, and authentication, and caps responses at 128 KiB. If the Windows 10 21H1-or-later override is unavailable, the request fails closed. Network isolation still needs controlled adversarial testing before a production release.</w:t>
       </w:r>
     </w:p>
     <w:p>
@@ -1235,6 +1235,11 @@
       </w:r>
     </w:p>
     <w:p>
+      <w:r>
+        <w:t>The IDE-editable ProjectPreparationLayout centers a message, a time expectation, a progress bar, and a numeric percentage while the worker runs. TDPHSemanticPersistence.Stage reports completed symbol, relationship, and flow records to TDPHWorkspaceWorker, which carries percentages in TDPHWorkspaceResponse. TDPHUI.Main updates the serialized label and bar when responses arrive. The storage writer caches the active generation check and file-revision lookup only inside a fact transaction, then clears that state at commit or rollback; never reuse those cached facts across generations. A fresh v7 test capture on 16 October 2026 finished in 66.6 seconds with 24 local documents and three public pages; timing depends on hardware and selected content.</w:t>
+      </w:r>
+    </w:p>
+    <w:p>
       <w:pPr>
         <w:pStyle w:val="Heading3"/>
       </w:pPr>
@@ -2624,7 +2629,7 @@
     </w:p>
     <w:p>
       <w:r>
-        <w:t>ScreenshotMarkerPaint draws numbered markers using the current image extent, while the legend presents attributed teaching content. The serialized ScreenshotModeCombo starts in Native pixels; Fit and custom zoom change the display transform. The lower evidence memo uses a compact height and does not repeat the help text above the image. Test markers near boundaries and after zoom/resize so a correct stored point does not become a misplaced visual label.</w:t>
+        <w:t>ScreenshotMarkerPaint draws numbered markers using the current image extent, while the legend presents attributed teaching content. The serialized ScreenshotModeCombo starts at Custom zoom with ScreenshotZoom set to 90 percent; Fit and Native pixels remain available. The lower evidence memo uses a compact height and does not repeat the help text above the image. Test markers near boundaries and after zoom/resize so a correct stored point does not become a misplaced visual label.</w:t>
       </w:r>
     </w:p>
     <w:p>
@@ -3278,7 +3283,7 @@
     </w:p>
     <w:p>
       <w:r>
-        <w:t>The 0.8.0.6 experimental desktop package contains the Win32 and Win64 Release DelphiProjectHandoff.exe builds, a WebView2Loader.dll beside each, offline language packs, the German trial model, migrations, help, current guides, directions, DPH's Apache 2.0 license, and third-party notices. It does not include an owner .dphdb, private document copies, or reference-project working stores. A previously created package is a historical build and must not be presented as the current executable. The unmodified Bergamot model is attributed under CC BY-SA 4.0, with its license text and indexed file hashes included in the package.</w:t>
+        <w:t>The 0.8.0.7 experimental desktop package contains the Win32 and Win64 Release DelphiProjectHandoff.exe builds, a WebView2Loader.dll beside each, offline language packs, the German trial model, migrations, help, current guides, directions, DPH's Apache 2.0 license, and third-party notices. It does not include an owner .dphdb, private document copies, or reference-project working stores. A previously created package is a historical build and must not be presented as the current executable. The unmodified Bergamot model is attributed under CC BY-SA 4.0, with its license text and indexed file hashes included in the package.</w:t>
       </w:r>
     </w:p>
     <w:p>
@@ -3321,7 +3326,7 @@
         <w:t xml:space="preserve">2. </w:t>
       </w:r>
       <w:r>
-        <w:t>Review the exact source files and guide illustrations to distribute. Run tools\package-source-distribution.ps1 with a fresh version value, including four-component experimental versions such as 0.8.0.6. It verifies every source file hash and refuses an existing archive name.</w:t>
+        <w:t>Review the exact source files and guide illustrations to distribute. Run tools\package-source-distribution.ps1 with a fresh version value, including four-component experimental versions such as 0.8.0.7. It verifies every source file hash and refuses an existing archive name.</w:t>
       </w:r>
     </w:p>
     <w:p>
@@ -4158,7 +4163,7 @@
           <w:rFonts w:ascii="Consolas" w:hAnsi="Consolas"/>
           <w:sz w:val="18"/>
         </w:rPr>
-        <w:t>AConfiguration: Int64): Int64;</w:t>
+        <w:t>AConfiguration: Int64; AProgress: TProc&lt;Integer,Integer&gt; = nil): Int64;</w:t>
       </w:r>
     </w:p>
     <w:p>
@@ -15996,7 +16001,7 @@
       <w:pStyle w:val="Footer"/>
     </w:pPr>
     <w:r>
-      <w:t xml:space="preserve">Guide 55  |  16 October 2026                                    Page </w:t>
+      <w:t xml:space="preserve">Guide 56  |  16 October 2026                                    Page </w:t>
     </w:r>
     <w:r>
       <w:fldChar w:fldCharType="begin"/>

</xml_diff>

<commit_message>
Release 0.8.0.8 with visible progress and save control
</commit_message>
<xml_diff>
--- a/docs/guides/DPH_Engineering_Guide.docx
+++ b/docs/guides/DPH_Engineering_Guide.docx
@@ -20,7 +20,7 @@
     </w:p>
     <w:p>
       <w:r>
-        <w:t>Experimental release 0.8.0.7  |  Guide edition 56</w:t>
+        <w:t>Experimental release 0.8.0.8  |  Guide edition 56</w:t>
       </w:r>
     </w:p>
     <w:p>
@@ -544,7 +544,7 @@
       </w:r>
       <w:r>
         <w:tab/>
-        <w:t>50</w:t>
+        <w:t>51</w:t>
       </w:r>
     </w:p>
     <w:p>
@@ -612,7 +612,7 @@
     </w:p>
     <w:p>
       <w:r>
-        <w:t>The visible workflow has six tabs: Getting started, Handoff dossier, Learning library, Project map, Screenshots, and Application diagrams. Open application starts a temporary source capture; closing or changing projects offers Save, Discard, and Cancel before a permanent .dphdb is created. Open saved project restores a .dphdb and its adjacent .views folder. DPH.Handoff.Dossier renders the four dossier sections from the selected publication model; the renderer does not execute source or turn an inferred relationship into an observed result. Form-preview generation is deferred until Screenshots is opened to reduce the cost of restoring a saved project. Older authoring, lesson, and specialist controls remain serialized or implemented for compatibility, but must not be described as visible first-use commands.</w:t>
+        <w:t>The visible workflow has six tabs: Getting started, Handoff dossier, Learning library, Project map, Screenshots, and Application diagrams. Open application starts a temporary source capture. Save project lets the user create a permanent .dphdb at any time; closing or changing projects still offers Save, Discard, and Cancel while the capture remains temporary. Open saved project restores a .dphdb and its adjacent .views folder. DPH.Handoff.Dossier renders the four dossier sections from the selected publication model; the renderer does not execute source or turn an inferred relationship into an observed result. Form-preview generation is deferred until Screenshots is opened to reduce the cost of restoring a saved project. Older authoring, lesson, and specialist controls remain serialized or implemented for compatibility, but must not be described as visible first-use commands.</w:t>
       </w:r>
     </w:p>
     <w:p>
@@ -1236,7 +1236,7 @@
     </w:p>
     <w:p>
       <w:r>
-        <w:t>The IDE-editable ProjectPreparationLayout centers a message, a time expectation, a progress bar, and a numeric percentage while the worker runs. TDPHSemanticPersistence.Stage reports completed symbol, relationship, and flow records to TDPHWorkspaceWorker, which carries percentages in TDPHWorkspaceResponse. TDPHUI.Main updates the serialized label and bar when responses arrive. The storage writer caches the active generation check and file-revision lookup only inside a fact transaction, then clears that state at commit or rollback; never reuse those cached facts across generations. A fresh v7 test capture on 16 October 2026 finished in 66.6 seconds with 24 local documents and three public pages; timing depends on hardware and selected content.</w:t>
+        <w:t>The IDE-editable DPHProgressForm is a separate centered FMX window with a message, a time expectation, a progress bar, and a numeric percentage while the worker runs. The main form retains the preparation state controls and synchronizes them to the window on each worker response. TDPHSemanticPersistence.Stage reports completed symbol, relationship, and flow records to TDPHWorkspaceWorker, which carries percentages in TDPHWorkspaceResponse. TDPHUI.Main updates the serialized label and bar when responses arrive. The storage writer caches the active generation check and file-revision lookup only inside a fact transaction, then clears that state at commit or rollback; never reuse those cached facts across generations. A fresh v7 test capture on 16 October 2026 finished in 66.6 seconds with 24 local documents and three public pages; timing depends on hardware and selected content.</w:t>
       </w:r>
     </w:p>
     <w:p>
@@ -3283,7 +3283,7 @@
     </w:p>
     <w:p>
       <w:r>
-        <w:t>The 0.8.0.7 experimental desktop package contains the Win32 and Win64 Release DelphiProjectHandoff.exe builds, a WebView2Loader.dll beside each, offline language packs, the German trial model, migrations, help, current guides, directions, DPH's Apache 2.0 license, and third-party notices. It does not include an owner .dphdb, private document copies, or reference-project working stores. A previously created package is a historical build and must not be presented as the current executable. The unmodified Bergamot model is attributed under CC BY-SA 4.0, with its license text and indexed file hashes included in the package.</w:t>
+        <w:t>The 0.8.0.8 experimental desktop package contains the Win32 and Win64 Release DelphiProjectHandoff.exe builds, a WebView2Loader.dll beside each, offline language packs, the German trial model, migrations, help, current guides, directions, DPH's Apache 2.0 license, and third-party notices. It does not include an owner .dphdb, private document copies, or reference-project working stores. A previously created package is a historical build and must not be presented as the current executable. The unmodified Bergamot model is attributed under CC BY-SA 4.0, with its license text and indexed file hashes included in the package.</w:t>
       </w:r>
     </w:p>
     <w:p>
@@ -3326,7 +3326,7 @@
         <w:t xml:space="preserve">2. </w:t>
       </w:r>
       <w:r>
-        <w:t>Review the exact source files and guide illustrations to distribute. Run tools\package-source-distribution.ps1 with a fresh version value, including four-component experimental versions such as 0.8.0.7. It verifies every source file hash and refuses an existing archive name.</w:t>
+        <w:t>Review the exact source files and guide illustrations to distribute. Run tools\package-source-distribution.ps1 with a fresh version value, including four-component experimental versions such as 0.8.0.8. It verifies every source file hash and refuses an existing archive name.</w:t>
       </w:r>
     </w:p>
     <w:p>
@@ -9307,6 +9307,18 @@
           <w:rFonts w:ascii="Consolas" w:hAnsi="Consolas"/>
           <w:sz w:val="18"/>
         </w:rPr>
+        <w:t>procedure SaveProjectClick(Sender: TObject);</w:t>
+      </w:r>
+    </w:p>
+    <w:p>
+      <w:pPr>
+        <w:spacing w:after="40" w:line="247" w:lineRule="auto"/>
+      </w:pPr>
+      <w:r>
+        <w:rPr>
+          <w:rFonts w:ascii="Consolas" w:hAnsi="Consolas"/>
+          <w:sz w:val="18"/>
+        </w:rPr>
         <w:t>procedure AllowInternetChange(Sender: TObject);</w:t>
       </w:r>
     </w:p>
@@ -9927,7 +9939,30 @@
         <w:pStyle w:val="Heading3"/>
       </w:pPr>
       <w:r>
-        <w:t>25.38. UI.ProjectProfile</w:t>
+        <w:t>25.38. UI.Progress</w:t>
+      </w:r>
+    </w:p>
+    <w:p>
+      <w:r>
+        <w:t>Source file: DPH.UI.Progress.pas. Defines the IDE-editable centered preparation window. The main form updates its stage message, progress bar and percentage from worker responses.</w:t>
+      </w:r>
+    </w:p>
+    <w:p>
+      <w:r>
+        <w:t>Principal public types: TDPHProgressForm.</w:t>
+      </w:r>
+    </w:p>
+    <w:p>
+      <w:r>
+        <w:t>This unit exposes shared data types/constants; inspect its declarations for the exact fields and current version values.</w:t>
+      </w:r>
+    </w:p>
+    <w:p>
+      <w:pPr>
+        <w:pStyle w:val="Heading3"/>
+      </w:pPr>
+      <w:r>
+        <w:t>25.39. UI.ProjectProfile</w:t>
       </w:r>
     </w:p>
     <w:p>
@@ -9981,7 +10016,7 @@
         <w:pStyle w:val="Heading3"/>
       </w:pPr>
       <w:r>
-        <w:t>25.39. Workspace.ActionPurposes</w:t>
+        <w:t>25.40. Workspace.ActionPurposes</w:t>
       </w:r>
     </w:p>
     <w:p>
@@ -10054,7 +10089,7 @@
         <w:pStyle w:val="Heading3"/>
       </w:pPr>
       <w:r>
-        <w:t>25.40. Workspace.Catalog</w:t>
+        <w:t>25.41. Workspace.Catalog</w:t>
       </w:r>
     </w:p>
     <w:p>
@@ -10204,7 +10239,7 @@
         <w:pStyle w:val="Heading3"/>
       </w:pPr>
       <w:r>
-        <w:t>25.41. Workspace.Commands</w:t>
+        <w:t>25.42. Workspace.Commands</w:t>
       </w:r>
     </w:p>
     <w:p>
@@ -10246,7 +10281,7 @@
         <w:pStyle w:val="Heading3"/>
       </w:pPr>
       <w:r>
-        <w:t>25.42. Workspace.Comparison</w:t>
+        <w:t>25.43. Workspace.Comparison</w:t>
       </w:r>
     </w:p>
     <w:p>
@@ -10300,7 +10335,7 @@
         <w:pStyle w:val="Heading3"/>
       </w:pPr>
       <w:r>
-        <w:t>25.43. Workspace.ComponentDependencies</w:t>
+        <w:t>25.44. Workspace.ComponentDependencies</w:t>
       </w:r>
     </w:p>
     <w:p>
@@ -10349,7 +10384,7 @@
         <w:pStyle w:val="Heading3"/>
       </w:pPr>
       <w:r>
-        <w:t>25.44. Workspace.DatabaseConnections</w:t>
+        <w:t>25.45. Workspace.DatabaseConnections</w:t>
       </w:r>
     </w:p>
     <w:p>
@@ -10427,7 +10462,7 @@
         <w:pStyle w:val="Heading3"/>
       </w:pPr>
       <w:r>
-        <w:t>25.45. Workspace.DatabaseSchema</w:t>
+        <w:t>25.46. Workspace.DatabaseSchema</w:t>
       </w:r>
     </w:p>
     <w:p>
@@ -10572,7 +10607,7 @@
         <w:pStyle w:val="Heading3"/>
       </w:pPr>
       <w:r>
-        <w:t>25.46. Workspace.DynamicControls</w:t>
+        <w:t>25.47. Workspace.DynamicControls</w:t>
       </w:r>
     </w:p>
     <w:p>
@@ -10614,7 +10649,7 @@
         <w:pStyle w:val="Heading3"/>
       </w:pPr>
       <w:r>
-        <w:t>25.47. Workspace.FormInheritance</w:t>
+        <w:t>25.48. Workspace.FormInheritance</w:t>
       </w:r>
     </w:p>
     <w:p>
@@ -10656,7 +10691,7 @@
         <w:pStyle w:val="Heading3"/>
       </w:pPr>
       <w:r>
-        <w:t>25.48. Workspace.Graphs</w:t>
+        <w:t>25.49. Workspace.Graphs</w:t>
       </w:r>
     </w:p>
     <w:p>
@@ -10734,7 +10769,7 @@
         <w:pStyle w:val="Heading3"/>
       </w:pPr>
       <w:r>
-        <w:t>25.49. Workspace.Keyboard</w:t>
+        <w:t>25.50. Workspace.Keyboard</w:t>
       </w:r>
     </w:p>
     <w:p>
@@ -10800,7 +10835,7 @@
         <w:pStyle w:val="Heading3"/>
       </w:pPr>
       <w:r>
-        <w:t>25.50. Workspace.LayoutRules</w:t>
+        <w:t>25.51. Workspace.LayoutRules</w:t>
       </w:r>
     </w:p>
     <w:p>
@@ -10842,7 +10877,7 @@
         <w:pStyle w:val="Heading3"/>
       </w:pPr>
       <w:r>
-        <w:t>25.51. Workspace.Model</w:t>
+        <w:t>25.52. Workspace.Model</w:t>
       </w:r>
     </w:p>
     <w:p>
@@ -11664,7 +11699,7 @@
         <w:pStyle w:val="Heading3"/>
       </w:pPr>
       <w:r>
-        <w:t>25.52. Workspace.Screen</w:t>
+        <w:t>25.53. Workspace.Screen</w:t>
       </w:r>
     </w:p>
     <w:p>
@@ -11718,7 +11753,7 @@
         <w:pStyle w:val="Heading3"/>
       </w:pPr>
       <w:r>
-        <w:t>25.53. Workspace.ScreenHistory</w:t>
+        <w:t>25.54. Workspace.ScreenHistory</w:t>
       </w:r>
     </w:p>
     <w:p>
@@ -11791,7 +11826,7 @@
         <w:pStyle w:val="Heading3"/>
       </w:pPr>
       <w:r>
-        <w:t>25.54. Workspace.Worker</w:t>
+        <w:t>25.55. Workspace.Worker</w:t>
       </w:r>
     </w:p>
     <w:p>

</xml_diff>

<commit_message>
Release 0.8.0.9 with project rescan and coherent localization
</commit_message>
<xml_diff>
--- a/docs/guides/DPH_Engineering_Guide.docx
+++ b/docs/guides/DPH_Engineering_Guide.docx
@@ -20,7 +20,7 @@
     </w:p>
     <w:p>
       <w:r>
-        <w:t>Experimental release 0.8.0.8  |  Guide edition 56</w:t>
+        <w:t>Experimental release 0.8.0.9  |  Guide edition 57</w:t>
       </w:r>
     </w:p>
     <w:p>
@@ -319,7 +319,7 @@
       </w:r>
       <w:r>
         <w:tab/>
-        <w:t>17</w:t>
+        <w:t>18</w:t>
       </w:r>
     </w:p>
     <w:p>
@@ -454,7 +454,7 @@
       </w:r>
       <w:r>
         <w:tab/>
-        <w:t>26</w:t>
+        <w:t>27</w:t>
       </w:r>
     </w:p>
     <w:p>
@@ -499,7 +499,7 @@
       </w:r>
       <w:r>
         <w:tab/>
-        <w:t>30</w:t>
+        <w:t>31</w:t>
       </w:r>
     </w:p>
     <w:p>
@@ -514,7 +514,7 @@
       </w:r>
       <w:r>
         <w:tab/>
-        <w:t>31</w:t>
+        <w:t>32</w:t>
       </w:r>
     </w:p>
     <w:p>
@@ -529,7 +529,7 @@
       </w:r>
       <w:r>
         <w:tab/>
-        <w:t>31</w:t>
+        <w:t>32</w:t>
       </w:r>
     </w:p>
     <w:p>
@@ -559,7 +559,7 @@
       </w:r>
       <w:r>
         <w:tab/>
-        <w:t>58</w:t>
+        <w:t>59</w:t>
       </w:r>
     </w:p>
     <w:p>
@@ -1450,6 +1450,16 @@
       </w:r>
     </w:p>
     <w:p>
+      <w:r>
+        <w:t>The IDE-editable Rescan project button sends an incremental worker request for the attached entry and current selection. The worker compares the manifest, analyzer versions and selection hash, reuses unchanged findings, and rebuilds changed analysis. The centered progress form remains visible during the request. Rescan is disabled for detached captures and while work is in progress.</w:t>
+      </w:r>
+    </w:p>
+    <w:p>
+      <w:r>
+        <w:t>The publication model copies the selected .dproj path properties DCC_UnitSearchPath, DCC_IncludePath, DCC_ResourcePath, DCC_Namespace, DCC_UnitOutputDir and DCC_ExeOutput into project_build_paths with source lines. The dossier derives a relative directory map from captured files. These are source declarations, not proof that Delphi IDE global Library or Browsing paths, vendor packages or client libraries are installed on another machine. A maintainer must confirm those external prerequisites.</w:t>
+      </w:r>
+    </w:p>
+    <w:p>
       <w:pPr>
         <w:pStyle w:val="Heading3"/>
       </w:pPr>
@@ -2711,6 +2721,11 @@
     </w:p>
     <w:p>
       <w:r>
+        <w:t>The overview also links to Component dependencies, where serialized controls, captured class candidates and package references are qualified without guessing vendor or version. Data and operations links to Database connections and schema, shows starter FireDAC connection templates for InterBase, SQL Server and SQLite without real credentials, and lists captured unit-level variables. A declaration is not a measured runtime value or a successful connection. DAT's HTML translator now requires an exact translation for each prose node; it leaves an unmatched node whole instead of replacing isolated words. The Getting started page supplies complete German prose and coherent English fallback for other locales until reviewed full-page translations exist.</w:t>
+      </w:r>
+    </w:p>
+    <w:p>
+      <w:r>
         <w:t>When adding a learner destination, define what question it answers and reuse the existing model. Do not expose every serialized tab simply to make the selector appear comprehensive. A learner's information hierarchy and the repository's technical module hierarchy serve different readers.</w:t>
       </w:r>
     </w:p>
@@ -3283,7 +3298,7 @@
     </w:p>
     <w:p>
       <w:r>
-        <w:t>The 0.8.0.8 experimental desktop package contains the Win32 and Win64 Release DelphiProjectHandoff.exe builds, a WebView2Loader.dll beside each, offline language packs, the German trial model, migrations, help, current guides, directions, DPH's Apache 2.0 license, and third-party notices. It does not include an owner .dphdb, private document copies, or reference-project working stores. A previously created package is a historical build and must not be presented as the current executable. The unmodified Bergamot model is attributed under CC BY-SA 4.0, with its license text and indexed file hashes included in the package.</w:t>
+        <w:t>The 0.8.0.9 experimental desktop package contains the Win32 and Win64 Release DelphiProjectHandoff.exe builds, a WebView2Loader.dll beside each, offline language packs, the German trial model, migrations, help, current guides, directions, DPH's Apache 2.0 license, and third-party notices. It does not include an owner .dphdb, private document copies, or reference-project working stores. A previously created package is a historical build and must not be presented as the current executable. The unmodified Bergamot model is attributed under CC BY-SA 4.0, with its license text and indexed file hashes included in the package.</w:t>
       </w:r>
     </w:p>
     <w:p>
@@ -3326,7 +3341,7 @@
         <w:t xml:space="preserve">2. </w:t>
       </w:r>
       <w:r>
-        <w:t>Review the exact source files and guide illustrations to distribute. Run tools\package-source-distribution.ps1 with a fresh version value, including four-component experimental versions such as 0.8.0.8. It verifies every source file hash and refuses an existing archive name.</w:t>
+        <w:t>Review the exact source files and guide illustrations to distribute. Run tools\package-source-distribution.ps1 with a fresh version value, including four-component experimental versions such as 0.8.0.9. It verifies every source file hash and refuses an existing archive name.</w:t>
       </w:r>
     </w:p>
     <w:p>
@@ -9308,6 +9323,18 @@
           <w:sz w:val="18"/>
         </w:rPr>
         <w:t>procedure SaveProjectClick(Sender: TObject);</w:t>
+      </w:r>
+    </w:p>
+    <w:p>
+      <w:pPr>
+        <w:spacing w:after="40" w:line="247" w:lineRule="auto"/>
+      </w:pPr>
+      <w:r>
+        <w:rPr>
+          <w:rFonts w:ascii="Consolas" w:hAnsi="Consolas"/>
+          <w:sz w:val="18"/>
+        </w:rPr>
+        <w:t>procedure RescanProjectClick(Sender: TObject);</w:t>
       </w:r>
     </w:p>
     <w:p>
@@ -16036,7 +16063,7 @@
       <w:pStyle w:val="Footer"/>
     </w:pPr>
     <w:r>
-      <w:t xml:space="preserve">Guide 56  |  16 October 2026                                    Page </w:t>
+      <w:t xml:space="preserve">Guide 57  |  16 October 2026                                    Page </w:t>
     </w:r>
     <w:r>
       <w:fldChar w:fldCharType="begin"/>

</xml_diff>

<commit_message>
Clarify incomplete project analysis notice
</commit_message>
<xml_diff>
--- a/docs/guides/DPH_Engineering_Guide.docx
+++ b/docs/guides/DPH_Engineering_Guide.docx
@@ -20,12 +20,12 @@
     </w:p>
     <w:p>
       <w:r>
-        <w:t>Experimental release 0.8.0.9  |  Guide edition 57</w:t>
-      </w:r>
-    </w:p>
-    <w:p>
-      <w:r>
-        <w:t>Last changed 16 October 2026</w:t>
+        <w:t>Experimental release 0.8.0.10  |  Guide edition 58</w:t>
+      </w:r>
+    </w:p>
+    <w:p>
+      <w:r>
+        <w:t>Last changed 17 October 2026</w:t>
       </w:r>
     </w:p>
     <w:p>
@@ -3298,7 +3298,7 @@
     </w:p>
     <w:p>
       <w:r>
-        <w:t>The 0.8.0.9 experimental desktop package contains the Win32 and Win64 Release DelphiProjectHandoff.exe builds, a WebView2Loader.dll beside each, offline language packs, the German trial model, migrations, help, current guides, directions, DPH's Apache 2.0 license, and third-party notices. It does not include an owner .dphdb, private document copies, or reference-project working stores. A previously created package is a historical build and must not be presented as the current executable. The unmodified Bergamot model is attributed under CC BY-SA 4.0, with its license text and indexed file hashes included in the package.</w:t>
+        <w:t>The 0.8.0.10 experimental desktop package contains the Win32 and Win64 Release DelphiProjectHandoff.exe builds, a WebView2Loader.dll beside each, offline language packs, the German trial model, migrations, help, current guides, directions, DPH's Apache 2.0 license, and third-party notices. It does not include an owner .dphdb, private document copies, or reference-project working stores. A previously created package is a historical build and must not be presented as the current executable. The unmodified Bergamot model is attributed under CC BY-SA 4.0, with its license text and indexed file hashes included in the package.</w:t>
       </w:r>
     </w:p>
     <w:p>
@@ -3341,7 +3341,7 @@
         <w:t xml:space="preserve">2. </w:t>
       </w:r>
       <w:r>
-        <w:t>Review the exact source files and guide illustrations to distribute. Run tools\package-source-distribution.ps1 with a fresh version value, including four-component experimental versions such as 0.8.0.9. It verifies every source file hash and refuses an existing archive name.</w:t>
+        <w:t>Review the exact source files and guide illustrations to distribute. Run tools\package-source-distribution.ps1 with a fresh version value, including four-component experimental versions such as 0.8.0.10. It verifies every source file hash and refuses an existing archive name.</w:t>
       </w:r>
     </w:p>
     <w:p>
@@ -16063,7 +16063,7 @@
       <w:pStyle w:val="Footer"/>
     </w:pPr>
     <w:r>
-      <w:t xml:space="preserve">Guide 57  |  16 October 2026                                    Page </w:t>
+      <w:t xml:space="preserve">Guide 58  |  17 October 2026                                    Page </w:t>
     </w:r>
     <w:r>
       <w:fldChar w:fldCharType="begin"/>

</xml_diff>

<commit_message>
Fix project save feedback and mixed translated content
</commit_message>
<xml_diff>
--- a/docs/guides/DPH_Engineering_Guide.docx
+++ b/docs/guides/DPH_Engineering_Guide.docx
@@ -184,7 +184,7 @@
       </w:r>
       <w:r>
         <w:tab/>
-        <w:t>10</w:t>
+        <w:t>11</w:t>
       </w:r>
     </w:p>
     <w:p>
@@ -199,7 +199,7 @@
       </w:r>
       <w:r>
         <w:tab/>
-        <w:t>10</w:t>
+        <w:t>11</w:t>
       </w:r>
     </w:p>
     <w:p>
@@ -214,7 +214,7 @@
       </w:r>
       <w:r>
         <w:tab/>
-        <w:t>11</w:t>
+        <w:t>12</w:t>
       </w:r>
     </w:p>
     <w:p>
@@ -229,7 +229,7 @@
       </w:r>
       <w:r>
         <w:tab/>
-        <w:t>12</w:t>
+        <w:t>13</w:t>
       </w:r>
     </w:p>
     <w:p>
@@ -244,7 +244,7 @@
       </w:r>
       <w:r>
         <w:tab/>
-        <w:t>13</w:t>
+        <w:t>14</w:t>
       </w:r>
     </w:p>
     <w:p>
@@ -259,7 +259,7 @@
       </w:r>
       <w:r>
         <w:tab/>
-        <w:t>14</w:t>
+        <w:t>15</w:t>
       </w:r>
     </w:p>
     <w:p>
@@ -274,7 +274,7 @@
       </w:r>
       <w:r>
         <w:tab/>
-        <w:t>15</w:t>
+        <w:t>16</w:t>
       </w:r>
     </w:p>
     <w:p>
@@ -289,7 +289,7 @@
       </w:r>
       <w:r>
         <w:tab/>
-        <w:t>15</w:t>
+        <w:t>16</w:t>
       </w:r>
     </w:p>
     <w:p>
@@ -304,7 +304,7 @@
       </w:r>
       <w:r>
         <w:tab/>
-        <w:t>16</w:t>
+        <w:t>17</w:t>
       </w:r>
     </w:p>
     <w:p>
@@ -379,7 +379,7 @@
       </w:r>
       <w:r>
         <w:tab/>
-        <w:t>23</w:t>
+        <w:t>24</w:t>
       </w:r>
     </w:p>
     <w:p>
@@ -394,7 +394,7 @@
       </w:r>
       <w:r>
         <w:tab/>
-        <w:t>23</w:t>
+        <w:t>24</w:t>
       </w:r>
     </w:p>
     <w:p>
@@ -409,7 +409,7 @@
       </w:r>
       <w:r>
         <w:tab/>
-        <w:t>24</w:t>
+        <w:t>25</w:t>
       </w:r>
     </w:p>
     <w:p>
@@ -424,7 +424,7 @@
       </w:r>
       <w:r>
         <w:tab/>
-        <w:t>25</w:t>
+        <w:t>26</w:t>
       </w:r>
     </w:p>
     <w:p>
@@ -439,7 +439,7 @@
       </w:r>
       <w:r>
         <w:tab/>
-        <w:t>25</w:t>
+        <w:t>26</w:t>
       </w:r>
     </w:p>
     <w:p>
@@ -469,7 +469,7 @@
       </w:r>
       <w:r>
         <w:tab/>
-        <w:t>28</w:t>
+        <w:t>29</w:t>
       </w:r>
     </w:p>
     <w:p>
@@ -484,7 +484,7 @@
       </w:r>
       <w:r>
         <w:tab/>
-        <w:t>29</w:t>
+        <w:t>30</w:t>
       </w:r>
     </w:p>
     <w:p>
@@ -544,7 +544,7 @@
       </w:r>
       <w:r>
         <w:tab/>
-        <w:t>51</w:t>
+        <w:t>52</w:t>
       </w:r>
     </w:p>
     <w:p>
@@ -612,7 +612,7 @@
     </w:p>
     <w:p>
       <w:r>
-        <w:t>The visible workflow has six tabs: Getting started, Handoff dossier, Learning library, Project map, Screenshots, and Application diagrams. Open application starts a temporary source capture. Save project lets the user create a permanent .dphdb at any time; closing or changing projects still offers Save, Discard, and Cancel while the capture remains temporary. Open saved project restores a .dphdb and its adjacent .views folder. DPH.Handoff.Dossier renders the four dossier sections from the selected publication model; the renderer does not execute source or turn an inferred relationship into an observed result. Form-preview generation is deferred until Screenshots is opened to reduce the cost of restoring a saved project. Older authoring, lesson, and specialist controls remain serialized or implemented for compatibility, but must not be described as visible first-use commands.</w:t>
+        <w:t>The visible workflow has six tabs: Getting started, Handoff dossier, Learning library, Project map, Screenshots, and Application diagrams. Open application starts a temporary source capture. Save project lets the user create a permanent .dphdb at any time; its dialog defaults to the application's databases folder and suggests a dated filename when the original name is already used. The save flow verifies the new database and managed-view manifest before discarding the temporary capture, then displays the complete destination path. A failed save leaves the temporary capture available; an existing saved file is not overwritten. Closing or changing projects still offers Save, Discard, and Cancel while the capture remains temporary. Open saved project restores a .dphdb and its adjacent .views folder. DPH.Handoff.Dossier renders the four dossier sections from the selected publication model; the renderer does not execute source or turn an inferred relationship into an observed result. Form-preview generation is deferred until Screenshots is opened to reduce the cost of restoring a saved project. Older authoring, lesson, and specialist controls remain serialized or implemented for compatibility, but must not be described as visible first-use commands.</w:t>
       </w:r>
     </w:p>
     <w:p>
@@ -2969,7 +2969,7 @@
     </w:p>
     <w:p>
       <w:r>
-        <w:t>The project uses RAD Studio 37.0 for the installed Windows toolchain. rsvars.bat initializes BDS and compiler/library environment. dcc32 builds the current Win32 application and console tests, while the application project build script invokes MSBuild with Debug and Win32. Use the configured RAD Studio path in your environment rather than copying a personal workstation path into end-user directions.</w:t>
+        <w:t>The project uses RAD Studio 37.0 for the installed Windows toolchain. Before opening the main form in the designer, install export/DAT-component-kit/DelphiProjectHandoff/DesignPackages/Win32/Release/DATLanguageManagerFMXDesign.bpl through Component &gt; Install Packages &gt; Add. Keep its runtime BPLs beside it. The checked-in DPROJ already includes dependencies/DelphiAppTranslation/source in its compiler search path; no separate dependency preparation command is required. rsvars.bat initializes BDS and compiler/library environment. dcc32 builds the Win32 console tests, while MSBuild builds the application configurations. Use the configured RAD Studio path in your environment rather than copying a personal workstation path into end-user directions.</w:t>
       </w:r>
     </w:p>
     <w:p>

</xml_diff>

<commit_message>
Extend offline project prose translation to nine languages
</commit_message>
<xml_diff>
--- a/docs/guides/DPH_Engineering_Guide.docx
+++ b/docs/guides/DPH_Engineering_Guide.docx
@@ -20,12 +20,12 @@
     </w:p>
     <w:p>
       <w:r>
-        <w:t>Experimental release 0.8.0.10  |  Guide edition 58</w:t>
-      </w:r>
-    </w:p>
-    <w:p>
-      <w:r>
-        <w:t>Last changed 17 October 2026</w:t>
+        <w:t>Source guide edition 59  |  Packaged release 0.8.0.10</w:t>
+      </w:r>
+    </w:p>
+    <w:p>
+      <w:r>
+        <w:t>Last changed 18 October 2026</w:t>
       </w:r>
     </w:p>
     <w:p>
@@ -2721,7 +2721,7 @@
     </w:p>
     <w:p>
       <w:r>
-        <w:t>The overview also links to Component dependencies, where serialized controls, captured class candidates and package references are qualified without guessing vendor or version. Data and operations links to Database connections and schema, shows starter FireDAC connection templates for InterBase, SQL Server and SQLite without real credentials, and lists captured unit-level variables. A declaration is not a measured runtime value or a successful connection. DAT's HTML translator now requires an exact translation for each prose node; it leaves an unmatched node whole instead of replacing isolated words. The Getting started page supplies complete German prose and coherent English fallback for other locales until reviewed full-page translations exist.</w:t>
+        <w:t>The overview also links to Component dependencies, where serialized controls, captured class candidates and package references are qualified without guessing vendor or version. Data and operations links to Database connections and schema, shows starter FireDAC connection templates for InterBase, SQL Server and SQLite without real credentials, and lists captured unit-level variables. A declaration is not a measured runtime value or a successful connection. DAT's HTML translator now requires an exact translation for each prose node; it leaves an unmatched node whole instead of replacing isolated words. The Getting started page supplies complete German and Spanish prose and coherent English fallback for other locales until reviewed full-page translations exist. The current source bundles nine local project-prose models; only marked prose is translated, while Pascal code, paths, identifiers, and original evidence remain unchanged. The 0.8.0.10 Windows package retains the earlier German-only trial.</w:t>
       </w:r>
     </w:p>
     <w:p>
@@ -5285,7 +5285,7 @@
           <w:rFonts w:ascii="Consolas" w:hAnsi="Consolas"/>
           <w:sz w:val="18"/>
         </w:rPr>
-        <w:t>AHashedPages: Boolean = False): Boolean;</w:t>
+        <w:t>AHashedPages: Boolean = False; ADocumentPages: Boolean = False): Boolean;</w:t>
       </w:r>
     </w:p>
     <w:p>
@@ -6353,7 +6353,19 @@
           <w:rFonts w:ascii="Consolas" w:hAnsi="Consolas"/>
           <w:sz w:val="18"/>
         </w:rPr>
-        <w:t>procedure SaveWorkspaceView(AGenerationID: Int64; const AJSON: string);</w:t>
+        <w:t xml:space="preserve">procedure SaveWorkspaceView(AGenerationID: Int64; const AJSON: string; </w:t>
+      </w:r>
+    </w:p>
+    <w:p>
+      <w:pPr>
+        <w:spacing w:after="40" w:line="247" w:lineRule="auto"/>
+      </w:pPr>
+      <w:r>
+        <w:rPr>
+          <w:rFonts w:ascii="Consolas" w:hAnsi="Consolas"/>
+          <w:sz w:val="18"/>
+        </w:rPr>
+        <w:t>ARefreshCapturedDocuments: Boolean = False);</w:t>
       </w:r>
     </w:p>
     <w:p>
@@ -16063,7 +16075,7 @@
       <w:pStyle w:val="Footer"/>
     </w:pPr>
     <w:r>
-      <w:t xml:space="preserve">Guide 58  |  17 October 2026                                    Page </w:t>
+      <w:t xml:space="preserve">Guide 59  |  18 October 2026                                    Page </w:t>
     </w:r>
     <w:r>
       <w:fldChar w:fldCharType="begin"/>

</xml_diff>

<commit_message>
Restore pre-experiment translation build
</commit_message>
<xml_diff>
--- a/docs/guides/DPH_Engineering_Guide.docx
+++ b/docs/guides/DPH_Engineering_Guide.docx
@@ -20,12 +20,12 @@
     </w:p>
     <w:p>
       <w:r>
-        <w:t>Source guide edition 59  |  Packaged release 0.8.0.10</w:t>
-      </w:r>
-    </w:p>
-    <w:p>
-      <w:r>
-        <w:t>Last changed 18 October 2026</w:t>
+        <w:t>Experimental release 0.8.0.10  |  Guide edition 58</w:t>
+      </w:r>
+    </w:p>
+    <w:p>
+      <w:r>
+        <w:t>Last changed 17 October 2026</w:t>
       </w:r>
     </w:p>
     <w:p>
@@ -2721,7 +2721,7 @@
     </w:p>
     <w:p>
       <w:r>
-        <w:t>The overview also links to Component dependencies, where serialized controls, captured class candidates and package references are qualified without guessing vendor or version. Data and operations links to Database connections and schema, shows starter FireDAC connection templates for InterBase, SQL Server and SQLite without real credentials, and lists captured unit-level variables. A declaration is not a measured runtime value or a successful connection. DAT's HTML translator now requires an exact translation for each prose node; it leaves an unmatched node whole instead of replacing isolated words. The Getting started page supplies complete German and Spanish prose and coherent English fallback for other locales until reviewed full-page translations exist. The current source bundles nine local project-prose models; only marked prose is translated, while Pascal code, paths, identifiers, and original evidence remain unchanged. The 0.8.0.10 Windows package retains the earlier German-only trial.</w:t>
+        <w:t>The overview also links to Component dependencies, where serialized controls, captured class candidates and package references are qualified without guessing vendor or version. Data and operations links to Database connections and schema, shows starter FireDAC connection templates for InterBase, SQL Server and SQLite without real credentials, and lists captured unit-level variables. A declaration is not a measured runtime value or a successful connection. DAT's HTML translator now requires an exact translation for each prose node; it leaves an unmatched node whole instead of replacing isolated words. The Getting started page supplies complete German prose and coherent English fallback for other locales until reviewed full-page translations exist.</w:t>
       </w:r>
     </w:p>
     <w:p>
@@ -5285,7 +5285,7 @@
           <w:rFonts w:ascii="Consolas" w:hAnsi="Consolas"/>
           <w:sz w:val="18"/>
         </w:rPr>
-        <w:t>AHashedPages: Boolean = False; ADocumentPages: Boolean = False): Boolean;</w:t>
+        <w:t>AHashedPages: Boolean = False): Boolean;</w:t>
       </w:r>
     </w:p>
     <w:p>
@@ -6353,19 +6353,7 @@
           <w:rFonts w:ascii="Consolas" w:hAnsi="Consolas"/>
           <w:sz w:val="18"/>
         </w:rPr>
-        <w:t xml:space="preserve">procedure SaveWorkspaceView(AGenerationID: Int64; const AJSON: string; </w:t>
-      </w:r>
-    </w:p>
-    <w:p>
-      <w:pPr>
-        <w:spacing w:after="40" w:line="247" w:lineRule="auto"/>
-      </w:pPr>
-      <w:r>
-        <w:rPr>
-          <w:rFonts w:ascii="Consolas" w:hAnsi="Consolas"/>
-          <w:sz w:val="18"/>
-        </w:rPr>
-        <w:t>ARefreshCapturedDocuments: Boolean = False);</w:t>
+        <w:t>procedure SaveWorkspaceView(AGenerationID: Int64; const AJSON: string);</w:t>
       </w:r>
     </w:p>
     <w:p>
@@ -16075,7 +16063,7 @@
       <w:pStyle w:val="Footer"/>
     </w:pPr>
     <w:r>
-      <w:t xml:space="preserve">Guide 59  |  18 October 2026                                    Page </w:t>
+      <w:t xml:space="preserve">Guide 58  |  17 October 2026                                    Page </w:t>
     </w:r>
     <w:r>
       <w:fldChar w:fldCharType="begin"/>

</xml_diff>

<commit_message>
Refresh 0.8.0.10 packages and release documentation
</commit_message>
<xml_diff>
--- a/docs/guides/DPH_Engineering_Guide.docx
+++ b/docs/guides/DPH_Engineering_Guide.docx
@@ -20,12 +20,12 @@
     </w:p>
     <w:p>
       <w:r>
-        <w:t>Experimental release 0.8.0.10  |  Guide edition 58</w:t>
-      </w:r>
-    </w:p>
-    <w:p>
-      <w:r>
-        <w:t>Last changed 17 October 2026</w:t>
+        <w:t>Experimental release 0.8.0.10  |  Guide edition 59</w:t>
+      </w:r>
+    </w:p>
+    <w:p>
+      <w:r>
+        <w:t>Last changed 19 October 2026</w:t>
       </w:r>
     </w:p>
     <w:p>
@@ -5285,7 +5285,7 @@
           <w:rFonts w:ascii="Consolas" w:hAnsi="Consolas"/>
           <w:sz w:val="18"/>
         </w:rPr>
-        <w:t>AHashedPages: Boolean = False): Boolean;</w:t>
+        <w:t>AHashedPages: Boolean = False; ADocumentPages: Boolean = False): Boolean;</w:t>
       </w:r>
     </w:p>
     <w:p>
@@ -6353,7 +6353,19 @@
           <w:rFonts w:ascii="Consolas" w:hAnsi="Consolas"/>
           <w:sz w:val="18"/>
         </w:rPr>
-        <w:t>procedure SaveWorkspaceView(AGenerationID: Int64; const AJSON: string);</w:t>
+        <w:t xml:space="preserve">procedure SaveWorkspaceView(AGenerationID: Int64; const AJSON: string; </w:t>
+      </w:r>
+    </w:p>
+    <w:p>
+      <w:pPr>
+        <w:spacing w:after="40" w:line="247" w:lineRule="auto"/>
+      </w:pPr>
+      <w:r>
+        <w:rPr>
+          <w:rFonts w:ascii="Consolas" w:hAnsi="Consolas"/>
+          <w:sz w:val="18"/>
+        </w:rPr>
+        <w:t>ARefreshCapturedDocuments: Boolean = False);</w:t>
       </w:r>
     </w:p>
     <w:p>
@@ -16063,7 +16075,7 @@
       <w:pStyle w:val="Footer"/>
     </w:pPr>
     <w:r>
-      <w:t xml:space="preserve">Guide 58  |  17 October 2026                                    Page </w:t>
+      <w:t xml:space="preserve">Guide 59  |  19 October 2026                                    Page </w:t>
     </w:r>
     <w:r>
       <w:fldChar w:fldCharType="begin"/>

</xml_diff>

<commit_message>
Release 0.8.0.19 Change Guide beta for both Windows editions
</commit_message>
<xml_diff>
--- a/docs/guides/DPH_Engineering_Guide.docx
+++ b/docs/guides/DPH_Engineering_Guide.docx
@@ -20,12 +20,12 @@
     </w:p>
     <w:p>
       <w:r>
-        <w:t>Experimental release 0.8.0.10  |  Guide edition 59</w:t>
-      </w:r>
-    </w:p>
-    <w:p>
-      <w:r>
-        <w:t>Last changed 19 October 2026</w:t>
+        <w:t>Experimental release 0.8.0.19  |  Guide edition 60</w:t>
+      </w:r>
+    </w:p>
+    <w:p>
+      <w:r>
+        <w:t>Last changed 23 October 2026</w:t>
       </w:r>
     </w:p>
     <w:p>
@@ -454,7 +454,7 @@
       </w:r>
       <w:r>
         <w:tab/>
-        <w:t>27</w:t>
+        <w:t>28</w:t>
       </w:r>
     </w:p>
     <w:p>
@@ -484,7 +484,7 @@
       </w:r>
       <w:r>
         <w:tab/>
-        <w:t>30</w:t>
+        <w:t>31</w:t>
       </w:r>
     </w:p>
     <w:p>
@@ -499,7 +499,7 @@
       </w:r>
       <w:r>
         <w:tab/>
-        <w:t>31</w:t>
+        <w:t>32</w:t>
       </w:r>
     </w:p>
     <w:p>
@@ -514,7 +514,7 @@
       </w:r>
       <w:r>
         <w:tab/>
-        <w:t>32</w:t>
+        <w:t>33</w:t>
       </w:r>
     </w:p>
     <w:p>
@@ -529,7 +529,7 @@
       </w:r>
       <w:r>
         <w:tab/>
-        <w:t>32</w:t>
+        <w:t>33</w:t>
       </w:r>
     </w:p>
     <w:p>
@@ -559,7 +559,7 @@
       </w:r>
       <w:r>
         <w:tab/>
-        <w:t>59</w:t>
+        <w:t>60</w:t>
       </w:r>
     </w:p>
     <w:p>
@@ -2707,6 +2707,16 @@
       </w:r>
     </w:p>
     <w:p>
+      <w:r>
+        <w:t>ChangeGuideHTML builds the English-language beta Change Guide from the selected object key in the existing explanation model. It starts with the captured declaration and attributions, lists up to 12 incoming relationships, traverses direct and one further downstream relationship level up to 24 distinct linked objects, and names the distinct source files reached. It includes linked contributor knowledge only for the selected exact entity key or canonical link and shows review state. Suggested checks follow captured UI, data, output, asynchronous, or conditional relationships; no check is marked complete. Source names, evidence and contributor text are HTML-escaped. Missing selections and missing relationships are described without inventing a route. Preserve bounded traversal, qualification and ownership when extending this projection.</w:t>
+      </w:r>
+    </w:p>
+    <w:p>
+      <w:r>
+        <w:t>The serialized Project map toolbar owns the Change Guide, Return to map, View source code and Change impact controls. Source and diagram views have serialized Return to guide buttons. FChangeGuideMode changes the explanation renderer while FSelected keeps the selected source object; changing projects clears the mode. DATTranslateHtmlText applies the installed language pack to matching authored nodes, and all six new native button instances have catalog entries in the 35 runtime packs. The generated guide narrative itself remains an English-language beta; do not describe it as fully localized. Project-supplied content and citations remain local and original. The guide is an investigation aid, not a change plan or runtime trace.</w:t>
+      </w:r>
+    </w:p>
+    <w:p>
       <w:pPr>
         <w:pStyle w:val="Heading3"/>
       </w:pPr>
@@ -3187,6 +3197,18 @@
           <w:rFonts w:ascii="Consolas" w:hAnsi="Consolas"/>
           <w:sz w:val="18"/>
         </w:rPr>
+        <w:t>tools\build-ui-translation.cmd</w:t>
+      </w:r>
+    </w:p>
+    <w:p>
+      <w:pPr>
+        <w:spacing w:after="40" w:line="247" w:lineRule="auto"/>
+      </w:pPr>
+      <w:r>
+        <w:rPr>
+          <w:rFonts w:ascii="Consolas" w:hAnsi="Consolas"/>
+          <w:sz w:val="18"/>
+        </w:rPr>
         <w:t>tools\build-guided-tasks.cmd "&lt;new disposable task workspace&gt;"</w:t>
       </w:r>
     </w:p>
@@ -3217,6 +3239,11 @@
     <w:p>
       <w:r>
         <w:t>Read the script before using an optional argument. Use a fresh disposable workspace outside source fixtures when a test writes a database or exported edition. Some scripts accept a reference database; others create their own temporary paths. A command's mere presence in this list is not authorization to run it against an owner store.</w:t>
+      </w:r>
+    </w:p>
+    <w:p>
+      <w:r>
+        <w:t>For the Change Guide, compile and run tests\DPH.Tests.ChangeGuide.dpr against DPH.Analysis.Explanations.pas. It checks the introduction, source citation, HTML escaping, incoming and bounded downstream relationships, linked contributor guidance, qualifications, and unavailable selections. Run the existing layout and learning tests when changing the serialized Project map or navigation. The UI translation check must still load all 35 packs after every form-text change.</w:t>
       </w:r>
     </w:p>
     <w:p>
@@ -3298,12 +3325,12 @@
     </w:p>
     <w:p>
       <w:r>
-        <w:t>The 0.8.0.10 experimental desktop package contains the Win32 and Win64 Release DelphiProjectHandoff.exe builds, a WebView2Loader.dll beside each, offline language packs, the German trial model, migrations, help, current guides, directions, DPH's Apache 2.0 license, and third-party notices. It does not include an owner .dphdb, private document copies, or reference-project working stores. A previously created package is a historical build and must not be presented as the current executable. The unmodified Bergamot model is attributed under CC BY-SA 4.0, with its license text and indexed file hashes included in the package.</w:t>
-      </w:r>
-    </w:p>
-    <w:p>
-      <w:r>
-        <w:t>The editable source distribution is the primary public delivery. It includes the project and forms, source, pinned translation dependency, guides and their source and illustrations, tests, and the OrderPractice example. That example is for reproducible development checks; it is not an imported lesson for an arbitrary selected application.</w:t>
+        <w:t>The 0.8.0.19 experimental release has separate complete Win64 and Win32 ZIPs. Each contains one Release executable, its adjacent WebView2Loader.dll, 35 offline runtime language packs, the bundled German trial model, migrations, local help, current guides including Change_Guide.txt, directions, DPH's Apache 2.0 license, and third-party notices. Neither ZIP needs the other to run. Neither includes an owner .dphdb, private document copies, or reference-project working stores. The unmodified Bergamot model is attributed under CC BY-SA 4.0 with its license and indexed hashes.</w:t>
+      </w:r>
+    </w:p>
+    <w:p>
+      <w:r>
+        <w:t>The build-ready source ZIP includes the editable project and forms, source, pinned translation dependency and DAT design package, guides and their source and illustrations, 35 runtime language packs, tests, and the OrderPractice example. It builds both platforms without either Windows ZIP or the optional translation-authoring ZIP. The fourth ZIP holds 35 Localization/Development projects for contributors who edit language packs; extract it into the source folder only when needed. The example is a reproducible development fixture, not an imported lesson for an arbitrary selected application.</w:t>
       </w:r>
     </w:p>
     <w:p>
@@ -3326,7 +3353,7 @@
         <w:t xml:space="preserve">1. </w:t>
       </w:r>
       <w:r>
-        <w:t>Complete the code and document validation and build current Win32 and Win64 Debug and Release executables.</w:t>
+        <w:t>Complete focused Change Guide, layout, learning, and 35-language validation; build the current Win32 and Win64 Release executables after final source and form edits.</w:t>
       </w:r>
     </w:p>
     <w:p>
@@ -3341,7 +3368,7 @@
         <w:t xml:space="preserve">2. </w:t>
       </w:r>
       <w:r>
-        <w:t>Review the exact source files and guide illustrations to distribute. Run tools\package-source-distribution.ps1 with a fresh version value, including four-component experimental versions such as 0.8.0.10. It verifies every source file hash and refuses an existing archive name.</w:t>
+        <w:t>Review the exact source files and guide illustrations to distribute. Run tools\package-source-distribution.ps1 with a fresh four-component version such as 0.8.0.19. It creates the complete build-ready source ZIP and a separate optional translation-authoring ZIP, verifies every source file hash, and refuses an existing archive name.</w:t>
       </w:r>
     </w:p>
     <w:p>
@@ -3356,7 +3383,7 @@
         <w:t xml:space="preserve">3. </w:t>
       </w:r>
       <w:r>
-        <w:t>Extract the source ZIP into a fresh directory and build it. Check that the example, documentation source, 35 language packs, form resources, and guide illustrations are present.</w:t>
+        <w:t>Extract the source ZIP into a fresh directory and build both platforms. Check that the example, current DOCX/PDF guides, Change_Guide.txt, HTML help, 35 runtime language packs, form resources, and illustrations are present. Extract the optional authoring ZIP over a copy only if editing language packs; its checksum manifest has a separate filename.</w:t>
       </w:r>
     </w:p>
     <w:p>
@@ -3371,7 +3398,7 @@
         <w:t xml:space="preserve">4. </w:t>
       </w:r>
       <w:r>
-        <w:t>If a ready-to-run experimental Windows package is also offered, run tools\package-dph.ps1 with the same version after the source and executable agree. Verify its extraction, hashes, and launch separately. Never label an older binary ZIP as the current source edition.</w:t>
+        <w:t>Run tools\package-dph.ps1 with the same version after source and executables agree. It creates separate Win64 and Win32 ZIPs; verify each extraction, file hashes, Change Guide entry point, and launch independently. Never label an older binary ZIP as the current source edition.</w:t>
       </w:r>
     </w:p>
     <w:p>
@@ -3389,7 +3416,7 @@
     </w:p>
     <w:p>
       <w:r>
-        <w:t>Extract a newly made binary ZIP to a new writable location. Verify every SHA256.json entry against extracted bytes. Check required migrations, current manuals, local help and loader. Start the extracted executable, confirm a responsive native window and normal close, then select a disposable Delphi project and verify that Handoff dossier names it, labels uncertainty, and links to source. Check that the other five tabs open their findings and that Screenshots generates previews when selected.</w:t>
+        <w:t>Extract each new Windows ZIP to its own writable location. Verify its SHA256.json entries against extracted bytes. Check migrations, current manuals, Change_Guide.txt, local help, 35 language packs and the loader beside the sole edition's executable. Start each extracted executable, confirm a responsive native window and normal close, then select a disposable Delphi project and verify that Handoff dossier names it, labels uncertainty, and links to source. In Project map, open Change Guide for a control or routine, follow a cited connection, visit source and impact, and return to the same guide. Check that the other main tabs open their findings and that Screenshots generates previews when selected.</w:t>
       </w:r>
     </w:p>
     <w:p>
@@ -3407,7 +3434,7 @@
     </w:p>
     <w:p>
       <w:r>
-        <w:t>Extract the source ZIP into a different new directory and run its application build/baseline there. This demonstrates that source, forms, project file, dependencies and tools required for the build are actually included. Preserve the build log and exact archive hash. Check the source ZIP's SHA256.txt entries against extracted files.</w:t>
+        <w:t>Extract the source ZIP into a different new directory and build both platforms there. This demonstrates that source, forms, project file, dependencies and tools required for the build are included. Preserve the build log and exact archive hash. Check SHA256.txt against extracted files. The optional authoring ZIP has TRANSLATION_AUTHORING_SHA256.txt and must not replace the runtime Localization/Languages packs.</w:t>
       </w:r>
     </w:p>
     <w:p>
@@ -3711,7 +3738,7 @@
     </w:p>
     <w:p>
       <w:r>
-        <w:t>Source file: DPH.Analysis.Explanations.pas. Builds learner topics and object explanations from source facts and relevant attributed knowledge. Keep meaning first and deeper code optional.</w:t>
+        <w:t>Source file: DPH.Analysis.Explanations.pas. Builds learner topics, object explanations, and the bounded Change Guide from source facts and relevant attributed knowledge. Keep meaning first, qualify static links, and leave deeper code optional.</w:t>
       </w:r>
     </w:p>
     <w:p>
@@ -3872,6 +3899,18 @@
           <w:rFonts w:ascii="Consolas" w:hAnsi="Consolas"/>
           <w:sz w:val="18"/>
         </w:rPr>
+        <w:t>function ChangeGuideHTML(const AKey: string): string;</w:t>
+      </w:r>
+    </w:p>
+    <w:p>
+      <w:pPr>
+        <w:spacing w:after="40" w:line="247" w:lineRule="auto"/>
+      </w:pPr>
+      <w:r>
+        <w:rPr>
+          <w:rFonts w:ascii="Consolas" w:hAnsi="Consolas"/>
+          <w:sz w:val="18"/>
+        </w:rPr>
         <w:t>function FlowSVG(const AKey: string): string;</w:t>
       </w:r>
     </w:p>
@@ -7133,7 +7172,7 @@
     </w:p>
     <w:p>
       <w:r>
-        <w:t>Source file: DPH.UI.Main.pas. Binds serialized FireMonkey controls to worker requests and owned models. Preserve pending drafts, busy state, selection identity and close guards.</w:t>
+        <w:t>Source file: DPH.UI.Main.pas. Binds serialized FireMonkey controls to worker requests and owned models. Preserve pending drafts, busy state, Change Guide navigation, selection identity and close guards.</w:t>
       </w:r>
     </w:p>
     <w:p>
@@ -9490,6 +9529,66 @@
           <w:rFonts w:ascii="Consolas" w:hAnsi="Consolas"/>
           <w:sz w:val="18"/>
         </w:rPr>
+        <w:t>procedure OpenChangeGuideClick(Sender: TObject);</w:t>
+      </w:r>
+    </w:p>
+    <w:p>
+      <w:pPr>
+        <w:spacing w:after="40" w:line="247" w:lineRule="auto"/>
+      </w:pPr>
+      <w:r>
+        <w:rPr>
+          <w:rFonts w:ascii="Consolas" w:hAnsi="Consolas"/>
+          <w:sz w:val="18"/>
+        </w:rPr>
+        <w:t>procedure ReturnToMapClick(Sender: TObject);</w:t>
+      </w:r>
+    </w:p>
+    <w:p>
+      <w:pPr>
+        <w:spacing w:after="40" w:line="247" w:lineRule="auto"/>
+      </w:pPr>
+      <w:r>
+        <w:rPr>
+          <w:rFonts w:ascii="Consolas" w:hAnsi="Consolas"/>
+          <w:sz w:val="18"/>
+        </w:rPr>
+        <w:t>procedure ReturnToChangeGuideClick(Sender: TObject);</w:t>
+      </w:r>
+    </w:p>
+    <w:p>
+      <w:pPr>
+        <w:spacing w:after="40" w:line="247" w:lineRule="auto"/>
+      </w:pPr>
+      <w:r>
+        <w:rPr>
+          <w:rFonts w:ascii="Consolas" w:hAnsi="Consolas"/>
+          <w:sz w:val="18"/>
+        </w:rPr>
+        <w:t>procedure ChangeGuideSourceClick(Sender: TObject);</w:t>
+      </w:r>
+    </w:p>
+    <w:p>
+      <w:pPr>
+        <w:spacing w:after="40" w:line="247" w:lineRule="auto"/>
+      </w:pPr>
+      <w:r>
+        <w:rPr>
+          <w:rFonts w:ascii="Consolas" w:hAnsi="Consolas"/>
+          <w:sz w:val="18"/>
+        </w:rPr>
+        <w:t>procedure ChangeGuideImpactClick(Sender: TObject);</w:t>
+      </w:r>
+    </w:p>
+    <w:p>
+      <w:pPr>
+        <w:spacing w:after="40" w:line="247" w:lineRule="auto"/>
+      </w:pPr>
+      <w:r>
+        <w:rPr>
+          <w:rFonts w:ascii="Consolas" w:hAnsi="Consolas"/>
+          <w:sz w:val="18"/>
+        </w:rPr>
         <w:t>procedure ParentClick(Sender: TObject);</w:t>
       </w:r>
     </w:p>
@@ -10055,7 +10154,30 @@
         <w:pStyle w:val="Heading3"/>
       </w:pPr>
       <w:r>
-        <w:t>25.40. Workspace.ActionPurposes</w:t>
+        <w:t>25.40. UI.SavePrompt</w:t>
+      </w:r>
+    </w:p>
+    <w:p>
+      <w:r>
+        <w:t>Source file: DPH.UI.SavePrompt.pas. Defines the IDE-editable save, discard, and cancel prompt used when a temporary capture would be replaced or closed.</w:t>
+      </w:r>
+    </w:p>
+    <w:p>
+      <w:r>
+        <w:t>Principal public types: TDPHSavePromptForm.</w:t>
+      </w:r>
+    </w:p>
+    <w:p>
+      <w:r>
+        <w:t>This unit exposes shared data types/constants; inspect its declarations for the exact fields and current version values.</w:t>
+      </w:r>
+    </w:p>
+    <w:p>
+      <w:pPr>
+        <w:pStyle w:val="Heading3"/>
+      </w:pPr>
+      <w:r>
+        <w:t>25.41. Workspace.ActionPurposes</w:t>
       </w:r>
     </w:p>
     <w:p>
@@ -10128,7 +10250,7 @@
         <w:pStyle w:val="Heading3"/>
       </w:pPr>
       <w:r>
-        <w:t>25.41. Workspace.Catalog</w:t>
+        <w:t>25.42. Workspace.Catalog</w:t>
       </w:r>
     </w:p>
     <w:p>
@@ -10278,7 +10400,7 @@
         <w:pStyle w:val="Heading3"/>
       </w:pPr>
       <w:r>
-        <w:t>25.42. Workspace.Commands</w:t>
+        <w:t>25.43. Workspace.Commands</w:t>
       </w:r>
     </w:p>
     <w:p>
@@ -10320,7 +10442,7 @@
         <w:pStyle w:val="Heading3"/>
       </w:pPr>
       <w:r>
-        <w:t>25.43. Workspace.Comparison</w:t>
+        <w:t>25.44. Workspace.Comparison</w:t>
       </w:r>
     </w:p>
     <w:p>
@@ -10374,7 +10496,7 @@
         <w:pStyle w:val="Heading3"/>
       </w:pPr>
       <w:r>
-        <w:t>25.44. Workspace.ComponentDependencies</w:t>
+        <w:t>25.45. Workspace.ComponentDependencies</w:t>
       </w:r>
     </w:p>
     <w:p>
@@ -10423,7 +10545,7 @@
         <w:pStyle w:val="Heading3"/>
       </w:pPr>
       <w:r>
-        <w:t>25.45. Workspace.DatabaseConnections</w:t>
+        <w:t>25.46. Workspace.DatabaseConnections</w:t>
       </w:r>
     </w:p>
     <w:p>
@@ -10501,7 +10623,7 @@
         <w:pStyle w:val="Heading3"/>
       </w:pPr>
       <w:r>
-        <w:t>25.46. Workspace.DatabaseSchema</w:t>
+        <w:t>25.47. Workspace.DatabaseSchema</w:t>
       </w:r>
     </w:p>
     <w:p>
@@ -10646,7 +10768,7 @@
         <w:pStyle w:val="Heading3"/>
       </w:pPr>
       <w:r>
-        <w:t>25.47. Workspace.DynamicControls</w:t>
+        <w:t>25.48. Workspace.DynamicControls</w:t>
       </w:r>
     </w:p>
     <w:p>
@@ -10688,7 +10810,7 @@
         <w:pStyle w:val="Heading3"/>
       </w:pPr>
       <w:r>
-        <w:t>25.48. Workspace.FormInheritance</w:t>
+        <w:t>25.49. Workspace.FormInheritance</w:t>
       </w:r>
     </w:p>
     <w:p>
@@ -10730,7 +10852,7 @@
         <w:pStyle w:val="Heading3"/>
       </w:pPr>
       <w:r>
-        <w:t>25.49. Workspace.Graphs</w:t>
+        <w:t>25.50. Workspace.Graphs</w:t>
       </w:r>
     </w:p>
     <w:p>
@@ -10808,7 +10930,7 @@
         <w:pStyle w:val="Heading3"/>
       </w:pPr>
       <w:r>
-        <w:t>25.50. Workspace.Keyboard</w:t>
+        <w:t>25.51. Workspace.Keyboard</w:t>
       </w:r>
     </w:p>
     <w:p>
@@ -10874,7 +10996,7 @@
         <w:pStyle w:val="Heading3"/>
       </w:pPr>
       <w:r>
-        <w:t>25.51. Workspace.LayoutRules</w:t>
+        <w:t>25.52. Workspace.LayoutRules</w:t>
       </w:r>
     </w:p>
     <w:p>
@@ -10916,7 +11038,7 @@
         <w:pStyle w:val="Heading3"/>
       </w:pPr>
       <w:r>
-        <w:t>25.52. Workspace.Model</w:t>
+        <w:t>25.53. Workspace.Model</w:t>
       </w:r>
     </w:p>
     <w:p>
@@ -11738,7 +11860,7 @@
         <w:pStyle w:val="Heading3"/>
       </w:pPr>
       <w:r>
-        <w:t>25.53. Workspace.Screen</w:t>
+        <w:t>25.54. Workspace.Screen</w:t>
       </w:r>
     </w:p>
     <w:p>
@@ -11792,7 +11914,7 @@
         <w:pStyle w:val="Heading3"/>
       </w:pPr>
       <w:r>
-        <w:t>25.54. Workspace.ScreenHistory</w:t>
+        <w:t>25.55. Workspace.ScreenHistory</w:t>
       </w:r>
     </w:p>
     <w:p>
@@ -11865,7 +11987,7 @@
         <w:pStyle w:val="Heading3"/>
       </w:pPr>
       <w:r>
-        <w:t>25.55. Workspace.Worker</w:t>
+        <w:t>25.56. Workspace.Worker</w:t>
       </w:r>
     </w:p>
     <w:p>
@@ -16075,7 +16197,7 @@
       <w:pStyle w:val="Footer"/>
     </w:pPr>
     <w:r>
-      <w:t xml:space="preserve">Guide 59  |  19 October 2026                                    Page </w:t>
+      <w:t xml:space="preserve">Guide 60  |  23 October 2026                                    Page </w:t>
     </w:r>
     <w:r>
       <w:fldChar w:fldCharType="begin"/>

</xml_diff>

<commit_message>
Release DPH 0.8.0.20 with Change Guide toolbar fix
</commit_message>
<xml_diff>
--- a/docs/guides/DPH_Engineering_Guide.docx
+++ b/docs/guides/DPH_Engineering_Guide.docx
@@ -20,7 +20,7 @@
     </w:p>
     <w:p>
       <w:r>
-        <w:t>Experimental release 0.8.0.19  |  Guide edition 60</w:t>
+        <w:t>Experimental release 0.8.0.20  |  Guide edition 61</w:t>
       </w:r>
     </w:p>
     <w:p>
@@ -3325,7 +3325,7 @@
     </w:p>
     <w:p>
       <w:r>
-        <w:t>The 0.8.0.19 experimental release has separate complete Win64 and Win32 ZIPs. Each contains one Release executable, its adjacent WebView2Loader.dll, 35 offline runtime language packs, the bundled German trial model, migrations, local help, current guides including Change_Guide.txt, directions, DPH's Apache 2.0 license, and third-party notices. Neither ZIP needs the other to run. Neither includes an owner .dphdb, private document copies, or reference-project working stores. The unmodified Bergamot model is attributed under CC BY-SA 4.0 with its license and indexed hashes.</w:t>
+        <w:t>The 0.8.0.20 experimental release has separate complete Win64 and Win32 ZIPs. Each contains one Release executable, its adjacent WebView2Loader.dll, 35 offline runtime language packs, the bundled German trial model, migrations, local help, current guides including Change_Guide.txt, directions, DPH's Apache 2.0 license, and third-party notices. Neither ZIP needs the other to run. Neither includes an owner .dphdb, private document copies, or reference-project working stores. The unmodified Bergamot model is attributed under CC BY-SA 4.0 with its license and indexed hashes.</w:t>
       </w:r>
     </w:p>
     <w:p>
@@ -3368,7 +3368,7 @@
         <w:t xml:space="preserve">2. </w:t>
       </w:r>
       <w:r>
-        <w:t>Review the exact source files and guide illustrations to distribute. Run tools\package-source-distribution.ps1 with a fresh four-component version such as 0.8.0.19. It creates the complete build-ready source ZIP and a separate optional translation-authoring ZIP, verifies every source file hash, and refuses an existing archive name.</w:t>
+        <w:t>Review the exact source files and guide illustrations to distribute. Run tools\package-source-distribution.ps1 with a fresh four-component version such as 0.8.0.20. It creates the complete build-ready source ZIP and a separate optional translation-authoring ZIP, verifies every source file hash, and refuses an existing archive name.</w:t>
       </w:r>
     </w:p>
     <w:p>
@@ -16197,7 +16197,7 @@
       <w:pStyle w:val="Footer"/>
     </w:pPr>
     <w:r>
-      <w:t xml:space="preserve">Guide 60  |  23 October 2026                                    Page </w:t>
+      <w:t xml:space="preserve">Guide 61  |  23 October 2026                                    Page </w:t>
     </w:r>
     <w:r>
       <w:fldChar w:fldCharType="begin"/>
@@ -28286,7 +28286,7 @@
   <w:style w:type="paragraph" w:customStyle="1" w:styleId="TOC1">
     <w:name w:val="TOC 1"/>
     <w:pPr>
-      <w:spacing w:after="40" w:line="240" w:lineRule="auto"/>
+      <w:spacing w:after="60" w:line="264" w:lineRule="auto"/>
     </w:pPr>
     <w:rPr>
       <w:rFonts w:ascii="Calibri" w:hAnsi="Calibri"/>
@@ -28297,7 +28297,7 @@
   <w:style w:type="paragraph" w:customStyle="1" w:styleId="TOC2">
     <w:name w:val="TOC 2"/>
     <w:pPr>
-      <w:spacing w:after="40" w:line="240" w:lineRule="auto"/>
+      <w:spacing w:after="60" w:line="264" w:lineRule="auto"/>
       <w:ind w:left="259"/>
     </w:pPr>
     <w:rPr>

</xml_diff>

<commit_message>
Clarify beta downloads and exclude development fixtures from release packages
</commit_message>
<xml_diff>
--- a/docs/guides/DPH_Engineering_Guide.docx
+++ b/docs/guides/DPH_Engineering_Guide.docx
@@ -20,7 +20,7 @@
     </w:p>
     <w:p>
       <w:r>
-        <w:t>Experimental release 0.8.0.20  |  Guide edition 61</w:t>
+        <w:t>Experimental release 0.8.0.21  |  Guide edition 62</w:t>
       </w:r>
     </w:p>
     <w:p>
@@ -3325,12 +3325,12 @@
     </w:p>
     <w:p>
       <w:r>
-        <w:t>The 0.8.0.20 experimental release has separate complete Win64 and Win32 ZIPs. Each contains one Release executable, its adjacent WebView2Loader.dll, 35 offline runtime language packs, the bundled German trial model, migrations, local help, current guides including Change_Guide.txt, directions, DPH's Apache 2.0 license, and third-party notices. Neither ZIP needs the other to run. Neither includes an owner .dphdb, private document copies, or reference-project working stores. The unmodified Bergamot model is attributed under CC BY-SA 4.0 with its license and indexed hashes.</w:t>
-      </w:r>
-    </w:p>
-    <w:p>
-      <w:r>
-        <w:t>The build-ready source ZIP includes the editable project and forms, source, pinned translation dependency and DAT design package, guides and their source and illustrations, 35 runtime language packs, tests, and the OrderPractice example. It builds both platforms without either Windows ZIP or the optional translation-authoring ZIP. The fourth ZIP holds 35 Localization/Development projects for contributors who edit language packs; extract it into the source folder only when needed. The example is a reproducible development fixture, not an imported lesson for an arbitrary selected application.</w:t>
+        <w:t>The 0.8.0.21 experimental release has separate complete Win64 and Win32 ZIPs. Each contains one Release executable, its adjacent WebView2Loader.dll, 35 offline runtime language packs, the bundled German trial model, migrations, local help, current guides including Change_Guide.txt, directions, DPH's Apache 2.0 license, and third-party notices. Neither ZIP needs the other to run. Neither includes an owner .dphdb, private document copies, or reference-project working stores. The unmodified Bergamot model is attributed under CC BY-SA 4.0 with its license and indexed hashes.</w:t>
+      </w:r>
+    </w:p>
+    <w:p>
+      <w:r>
+        <w:t>The build-ready source ZIP includes the editable project and forms, source, pinned translation dependency and DAT design package, guides and their source and illustrations, and 35 runtime language packs. It excludes test fixtures and unrelated example projects, which remain available in the full Git repository. It builds both platforms without either Windows ZIP or the optional translation-authoring ZIP. The fourth ZIP holds 35 Localization/Development projects for contributors who edit language packs; extract it into the source folder only when needed.</w:t>
       </w:r>
     </w:p>
     <w:p>
@@ -3368,7 +3368,7 @@
         <w:t xml:space="preserve">2. </w:t>
       </w:r>
       <w:r>
-        <w:t>Review the exact source files and guide illustrations to distribute. Run tools\package-source-distribution.ps1 with a fresh four-component version such as 0.8.0.20. It creates the complete build-ready source ZIP and a separate optional translation-authoring ZIP, verifies every source file hash, and refuses an existing archive name.</w:t>
+        <w:t>Review the exact source files and guide illustrations to distribute. Run tools\package-source-distribution.ps1 with a fresh four-component version such as 0.8.0.21. It creates the complete build-ready source ZIP and a separate optional translation-authoring ZIP, verifies every source file hash, and refuses an existing archive name.</w:t>
       </w:r>
     </w:p>
     <w:p>
@@ -3383,7 +3383,7 @@
         <w:t xml:space="preserve">3. </w:t>
       </w:r>
       <w:r>
-        <w:t>Extract the source ZIP into a fresh directory and build both platforms. Check that the example, current DOCX/PDF guides, Change_Guide.txt, HTML help, 35 runtime language packs, form resources, and illustrations are present. Extract the optional authoring ZIP over a copy only if editing language packs; its checksum manifest has a separate filename.</w:t>
+        <w:t>Extract the source ZIP into a fresh directory and build both platforms. Check that the current DOCX/PDF guides, Change_Guide.txt, HTML help, 35 runtime language packs, form resources, and illustrations are present and that no test-fixture or example project is present. Extract the optional authoring ZIP over a copy only if editing language packs; its checksum manifest has a separate filename.</w:t>
       </w:r>
     </w:p>
     <w:p>
@@ -3439,7 +3439,7 @@
     </w:p>
     <w:p>
       <w:r>
-        <w:t>The source archive intentionally excludes personal owner data and locally pinned reference source. A reference-only test may require separately supplied reference material, while the ordinary application and included developer-fixture tests must remain reproducible from shipped source.</w:t>
+        <w:t>The source archive intentionally excludes personal owner data, locally pinned reference source, and development test fixtures. Tests in the full Git repository may require their own fixtures or separately supplied reference material; they are not prerequisites for the ordinary application build.</w:t>
       </w:r>
     </w:p>
     <w:p>
@@ -16197,7 +16197,7 @@
       <w:pStyle w:val="Footer"/>
     </w:pPr>
     <w:r>
-      <w:t xml:space="preserve">Guide 61  |  23 October 2026                                    Page </w:t>
+      <w:t xml:space="preserve">Guide 62  |  23 October 2026                                    Page </w:t>
     </w:r>
     <w:r>
       <w:fldChar w:fldCharType="begin"/>

</xml_diff>